<commit_message>
docs(cantine-connect): synchronise le manuel régénéré et corrige la procédure de génération
Rafraîchit docs/from-labs/livraison/ suite à la régénération complète du
manuel utilisateur côté klem-labs-repository (nouvelles fonctionnalités,
captures d'écran recapturées, corrections d'affichage PDF/DOCX). Étend la
règle 5 du CLAUDE.md avec les écueils découverts cette session : le
redimensionnement CSS des <img> n'est pas fiable avec ce moteur (résoudre en
redimensionnant les fichiers sources), le style de tableau doit être posé en
inline sur <table>/<th>/<td> pour le PDF autant que pour le DOCX (une note
précédente affirmait à tort que le PDF n'avait pas cette limite), et les
emoji couleur sont invisibles dans cet environnement (utiliser ✓/✗ ou du
texte brut).

Co-Authored-By: Claude Sonnet 5 <noreply@anthropic.com>
</commit_message>
<xml_diff>
--- a/apps/web-app/cantine-connect/docs/from-labs/livraison/manuel-utilisateur.docx
+++ b/apps/web-app/cantine-connect/docs/from-labs/livraison/manuel-utilisateur.docx
@@ -120,14 +120,14 @@
         <w:rPr/>
         <w:drawing>
           <wp:inline distB="0" distL="0" distR="0" distT="0">
-            <wp:extent cx="6502400" cy="4064000"/>
+            <wp:extent cx="5715000" cy="3571875"/>
             <wp:effectExtent b="0" l="0" r="0" t="0"/>
-            <wp:docPr id="1" name="image-8zxl2FASyYFHQJ_9Ek1x9.png"/>
+            <wp:docPr id="1" name="image-p1AJEuRU1Epi87VqGWRJD.png"/>
             <a:graphic>
               <a:graphicData uri="http://schemas.openxmlformats.org/drawingml/2006/picture">
                 <pic:pic>
                   <pic:nvPicPr>
-                    <pic:cNvPr id="1" name="image-8zxl2FASyYFHQJ_9Ek1x9.png" descr="Écran de connexion"/>
+                    <pic:cNvPr id="1" name="image-p1AJEuRU1Epi87VqGWRJD.png" descr="Écran de connexion"/>
                     <pic:cNvPicPr/>
                   </pic:nvPicPr>
                   <pic:blipFill>
@@ -140,7 +140,7 @@
                   <pic:spPr>
                     <a:xfrm>
                       <a:off x="0" y="0"/>
-                      <a:ext cx="6502400" cy="4064000"/>
+                      <a:ext cx="5715000" cy="3571875"/>
                     </a:xfrm>
                     <a:prstGeom prst="rect"/>
                   </pic:spPr>
@@ -176,7 +176,7 @@
       </w:r>
       <w:r>
         <w:rPr/>
-        <w:t xml:space="preserve"> (icône palette 🎨, visible une fois connecté, en haut de l'écran) permet de choisir entre trois présentations visuelles : </w:t>
+        <w:t xml:space="preserve"> (icône palette, visible une fois connecté, en haut de l'écran) permet de choisir entre trois présentations visuelles : </w:t>
       </w:r>
       <w:r>
         <w:rPr>
@@ -217,14 +217,14 @@
         <w:rPr/>
         <w:drawing>
           <wp:inline distB="0" distL="0" distR="0" distT="0">
-            <wp:extent cx="6502400" cy="4064000"/>
+            <wp:extent cx="5715000" cy="3571875"/>
             <wp:effectExtent b="0" l="0" r="0" t="0"/>
-            <wp:docPr id="2" name="image-16giY3hle65JiVRYCg0X_.png"/>
+            <wp:docPr id="2" name="image-1kK-g37K7WQwTv2KewUm7.png"/>
             <a:graphic>
               <a:graphicData uri="http://schemas.openxmlformats.org/drawingml/2006/picture">
                 <pic:pic>
                   <pic:nvPicPr>
-                    <pic:cNvPr id="2" name="image-16giY3hle65JiVRYCg0X_.png" descr="Sélecteur d'habillage"/>
+                    <pic:cNvPr id="2" name="image-1kK-g37K7WQwTv2KewUm7.png" descr="Sélecteur d'habillage"/>
                     <pic:cNvPicPr/>
                   </pic:nvPicPr>
                   <pic:blipFill>
@@ -237,7 +237,7 @@
                   <pic:spPr>
                     <a:xfrm>
                       <a:off x="0" y="0"/>
-                      <a:ext cx="6502400" cy="4064000"/>
+                      <a:ext cx="5715000" cy="3571875"/>
                     </a:xfrm>
                     <a:prstGeom prst="rect"/>
                   </pic:spPr>
@@ -251,14 +251,14 @@
         <w:rPr/>
         <w:drawing>
           <wp:inline distB="0" distL="0" distR="0" distT="0">
-            <wp:extent cx="6502400" cy="4064000"/>
+            <wp:extent cx="5715000" cy="3571875"/>
             <wp:effectExtent b="0" l="0" r="0" t="0"/>
-            <wp:docPr id="3" name="image--_aCEkKcx0ncfz8SIvO6G.png"/>
+            <wp:docPr id="3" name="image-ddbsgOwIKWbPWClSQDnk-.png"/>
             <a:graphic>
               <a:graphicData uri="http://schemas.openxmlformats.org/drawingml/2006/picture">
                 <pic:pic>
                   <pic:nvPicPr>
-                    <pic:cNvPr id="3" name="image--_aCEkKcx0ncfz8SIvO6G.png" descr="Exemple d'habillage Corporatif"/>
+                    <pic:cNvPr id="3" name="image-ddbsgOwIKWbPWClSQDnk-.png" descr="Exemple d'habillage Corporatif"/>
                     <pic:cNvPicPr/>
                   </pic:nvPicPr>
                   <pic:blipFill>
@@ -271,7 +271,7 @@
                   <pic:spPr>
                     <a:xfrm>
                       <a:off x="0" y="0"/>
-                      <a:ext cx="6502400" cy="4064000"/>
+                      <a:ext cx="5715000" cy="3571875"/>
                     </a:xfrm>
                     <a:prstGeom prst="rect"/>
                   </pic:spPr>
@@ -295,12 +295,12 @@
     <w:tbl>
       <w:tblPr>
         <w:tblBorders>
-          <w:top w:val="single" w:sz="8" w:space="0" w:color="B85400"/>
-          <w:bottom w:val="single" w:sz="8" w:space="0" w:color="B85400"/>
-          <w:left w:val="single" w:sz="8" w:space="0" w:color="B85400"/>
-          <w:right w:val="single" w:sz="8" w:space="0" w:color="B85400"/>
-          <w:insideV w:val="single" w:sz="8" w:space="0" w:color="B85400"/>
-          <w:insideH w:val="single" w:sz="8" w:space="0" w:color="B85400"/>
+          <w:top w:val="single" w:sz="2" w:space="0" w:color="000000"/>
+          <w:bottom w:val="single" w:sz="2" w:space="0" w:color="000000"/>
+          <w:left w:val="single" w:sz="2" w:space="0" w:color="000000"/>
+          <w:right w:val="single" w:sz="2" w:space="0" w:color="000000"/>
+          <w:insideV w:val="single" w:sz="2" w:space="0" w:color="000000"/>
+          <w:insideH w:val="single" w:sz="2" w:space="0" w:color="000000"/>
         </w:tblBorders>
         <w:tblCellSpacing w:w="0" w:type="dxa"/>
         <w:tblW w:type="dxa" w:w="10240"/>
@@ -325,10 +325,10 @@
           <w:tcPr>
             <w:shd w:val="clear" w:fill="E8720C"/>
             <w:tcBorders>
-              <w:top w:val="single" w:sz="8" w:space="0" w:color="B85400"/>
-              <w:left w:val="single" w:sz="8" w:space="0" w:color="B85400"/>
-              <w:bottom w:val="single" w:sz="8" w:space="0" w:color="B85400"/>
-              <w:right w:val="single" w:sz="8" w:space="0" w:color="B85400"/>
+              <w:top w:val="single" w:sz="8" w:space="0" w:color="000000"/>
+              <w:left w:val="single" w:sz="8" w:space="0" w:color="000000"/>
+              <w:bottom w:val="single" w:sz="8" w:space="0" w:color="000000"/>
+              <w:right w:val="single" w:sz="8" w:space="0" w:color="000000"/>
             </w:tcBorders>
           </w:tcPr>
           <w:p>
@@ -348,10 +348,10 @@
           <w:tcPr>
             <w:shd w:val="clear" w:fill="E8720C"/>
             <w:tcBorders>
-              <w:top w:val="single" w:sz="8" w:space="0" w:color="B85400"/>
-              <w:left w:val="single" w:sz="8" w:space="0" w:color="B85400"/>
-              <w:bottom w:val="single" w:sz="8" w:space="0" w:color="B85400"/>
-              <w:right w:val="single" w:sz="8" w:space="0" w:color="B85400"/>
+              <w:top w:val="single" w:sz="8" w:space="0" w:color="000000"/>
+              <w:left w:val="single" w:sz="8" w:space="0" w:color="000000"/>
+              <w:bottom w:val="single" w:sz="8" w:space="0" w:color="000000"/>
+              <w:right w:val="single" w:sz="8" w:space="0" w:color="000000"/>
             </w:tcBorders>
           </w:tcPr>
           <w:p>
@@ -371,10 +371,10 @@
           <w:tcPr>
             <w:shd w:val="clear" w:fill="E8720C"/>
             <w:tcBorders>
-              <w:top w:val="single" w:sz="8" w:space="0" w:color="B85400"/>
-              <w:left w:val="single" w:sz="8" w:space="0" w:color="B85400"/>
-              <w:bottom w:val="single" w:sz="8" w:space="0" w:color="B85400"/>
-              <w:right w:val="single" w:sz="8" w:space="0" w:color="B85400"/>
+              <w:top w:val="single" w:sz="8" w:space="0" w:color="000000"/>
+              <w:left w:val="single" w:sz="8" w:space="0" w:color="000000"/>
+              <w:bottom w:val="single" w:sz="8" w:space="0" w:color="000000"/>
+              <w:right w:val="single" w:sz="8" w:space="0" w:color="000000"/>
             </w:tcBorders>
           </w:tcPr>
           <w:p>
@@ -404,10 +404,10 @@
           <w:tcPr>
             <w:shd w:val="clear" w:fill="FFFFFF"/>
             <w:tcBorders>
-              <w:top w:val="single" w:sz="8" w:space="0" w:color="D9CFC0"/>
-              <w:left w:val="single" w:sz="8" w:space="0" w:color="D9CFC0"/>
-              <w:bottom w:val="single" w:sz="8" w:space="0" w:color="D9CFC0"/>
-              <w:right w:val="single" w:sz="8" w:space="0" w:color="D9CFC0"/>
+              <w:top w:val="single" w:sz="8" w:space="0" w:color="000000"/>
+              <w:left w:val="single" w:sz="8" w:space="0" w:color="000000"/>
+              <w:bottom w:val="single" w:sz="8" w:space="0" w:color="000000"/>
+              <w:right w:val="single" w:sz="8" w:space="0" w:color="000000"/>
             </w:tcBorders>
           </w:tcPr>
           <w:p>
@@ -425,10 +425,10 @@
           <w:tcPr>
             <w:shd w:val="clear" w:fill="FFFFFF"/>
             <w:tcBorders>
-              <w:top w:val="single" w:sz="8" w:space="0" w:color="D9CFC0"/>
-              <w:left w:val="single" w:sz="8" w:space="0" w:color="D9CFC0"/>
-              <w:bottom w:val="single" w:sz="8" w:space="0" w:color="D9CFC0"/>
-              <w:right w:val="single" w:sz="8" w:space="0" w:color="D9CFC0"/>
+              <w:top w:val="single" w:sz="8" w:space="0" w:color="000000"/>
+              <w:left w:val="single" w:sz="8" w:space="0" w:color="000000"/>
+              <w:bottom w:val="single" w:sz="8" w:space="0" w:color="000000"/>
+              <w:right w:val="single" w:sz="8" w:space="0" w:color="000000"/>
             </w:tcBorders>
           </w:tcPr>
           <w:p>
@@ -448,10 +448,10 @@
           <w:tcPr>
             <w:shd w:val="clear" w:fill="FFFFFF"/>
             <w:tcBorders>
-              <w:top w:val="single" w:sz="8" w:space="0" w:color="D9CFC0"/>
-              <w:left w:val="single" w:sz="8" w:space="0" w:color="D9CFC0"/>
-              <w:bottom w:val="single" w:sz="8" w:space="0" w:color="D9CFC0"/>
-              <w:right w:val="single" w:sz="8" w:space="0" w:color="D9CFC0"/>
+              <w:top w:val="single" w:sz="8" w:space="0" w:color="000000"/>
+              <w:left w:val="single" w:sz="8" w:space="0" w:color="000000"/>
+              <w:bottom w:val="single" w:sz="8" w:space="0" w:color="000000"/>
+              <w:right w:val="single" w:sz="8" w:space="0" w:color="000000"/>
             </w:tcBorders>
           </w:tcPr>
           <w:p>
@@ -476,10 +476,10 @@
           <w:tcPr>
             <w:shd w:val="clear" w:fill="FFF9F2"/>
             <w:tcBorders>
-              <w:top w:val="single" w:sz="8" w:space="0" w:color="D9CFC0"/>
-              <w:left w:val="single" w:sz="8" w:space="0" w:color="D9CFC0"/>
-              <w:bottom w:val="single" w:sz="8" w:space="0" w:color="D9CFC0"/>
-              <w:right w:val="single" w:sz="8" w:space="0" w:color="D9CFC0"/>
+              <w:top w:val="single" w:sz="8" w:space="0" w:color="000000"/>
+              <w:left w:val="single" w:sz="8" w:space="0" w:color="000000"/>
+              <w:bottom w:val="single" w:sz="8" w:space="0" w:color="000000"/>
+              <w:right w:val="single" w:sz="8" w:space="0" w:color="000000"/>
             </w:tcBorders>
           </w:tcPr>
           <w:p>
@@ -497,10 +497,10 @@
           <w:tcPr>
             <w:shd w:val="clear" w:fill="FFF9F2"/>
             <w:tcBorders>
-              <w:top w:val="single" w:sz="8" w:space="0" w:color="D9CFC0"/>
-              <w:left w:val="single" w:sz="8" w:space="0" w:color="D9CFC0"/>
-              <w:bottom w:val="single" w:sz="8" w:space="0" w:color="D9CFC0"/>
-              <w:right w:val="single" w:sz="8" w:space="0" w:color="D9CFC0"/>
+              <w:top w:val="single" w:sz="8" w:space="0" w:color="000000"/>
+              <w:left w:val="single" w:sz="8" w:space="0" w:color="000000"/>
+              <w:bottom w:val="single" w:sz="8" w:space="0" w:color="000000"/>
+              <w:right w:val="single" w:sz="8" w:space="0" w:color="000000"/>
             </w:tcBorders>
           </w:tcPr>
           <w:p>
@@ -520,10 +520,10 @@
           <w:tcPr>
             <w:shd w:val="clear" w:fill="FFF9F2"/>
             <w:tcBorders>
-              <w:top w:val="single" w:sz="8" w:space="0" w:color="D9CFC0"/>
-              <w:left w:val="single" w:sz="8" w:space="0" w:color="D9CFC0"/>
-              <w:bottom w:val="single" w:sz="8" w:space="0" w:color="D9CFC0"/>
-              <w:right w:val="single" w:sz="8" w:space="0" w:color="D9CFC0"/>
+              <w:top w:val="single" w:sz="8" w:space="0" w:color="000000"/>
+              <w:left w:val="single" w:sz="8" w:space="0" w:color="000000"/>
+              <w:bottom w:val="single" w:sz="8" w:space="0" w:color="000000"/>
+              <w:right w:val="single" w:sz="8" w:space="0" w:color="000000"/>
             </w:tcBorders>
           </w:tcPr>
           <w:p>
@@ -548,10 +548,10 @@
           <w:tcPr>
             <w:shd w:val="clear" w:fill="FFFFFF"/>
             <w:tcBorders>
-              <w:top w:val="single" w:sz="8" w:space="0" w:color="D9CFC0"/>
-              <w:left w:val="single" w:sz="8" w:space="0" w:color="D9CFC0"/>
-              <w:bottom w:val="single" w:sz="8" w:space="0" w:color="D9CFC0"/>
-              <w:right w:val="single" w:sz="8" w:space="0" w:color="D9CFC0"/>
+              <w:top w:val="single" w:sz="8" w:space="0" w:color="000000"/>
+              <w:left w:val="single" w:sz="8" w:space="0" w:color="000000"/>
+              <w:bottom w:val="single" w:sz="8" w:space="0" w:color="000000"/>
+              <w:right w:val="single" w:sz="8" w:space="0" w:color="000000"/>
             </w:tcBorders>
           </w:tcPr>
           <w:p>
@@ -569,10 +569,10 @@
           <w:tcPr>
             <w:shd w:val="clear" w:fill="FFFFFF"/>
             <w:tcBorders>
-              <w:top w:val="single" w:sz="8" w:space="0" w:color="D9CFC0"/>
-              <w:left w:val="single" w:sz="8" w:space="0" w:color="D9CFC0"/>
-              <w:bottom w:val="single" w:sz="8" w:space="0" w:color="D9CFC0"/>
-              <w:right w:val="single" w:sz="8" w:space="0" w:color="D9CFC0"/>
+              <w:top w:val="single" w:sz="8" w:space="0" w:color="000000"/>
+              <w:left w:val="single" w:sz="8" w:space="0" w:color="000000"/>
+              <w:bottom w:val="single" w:sz="8" w:space="0" w:color="000000"/>
+              <w:right w:val="single" w:sz="8" w:space="0" w:color="000000"/>
             </w:tcBorders>
           </w:tcPr>
           <w:p>
@@ -592,10 +592,10 @@
           <w:tcPr>
             <w:shd w:val="clear" w:fill="FFFFFF"/>
             <w:tcBorders>
-              <w:top w:val="single" w:sz="8" w:space="0" w:color="D9CFC0"/>
-              <w:left w:val="single" w:sz="8" w:space="0" w:color="D9CFC0"/>
-              <w:bottom w:val="single" w:sz="8" w:space="0" w:color="D9CFC0"/>
-              <w:right w:val="single" w:sz="8" w:space="0" w:color="D9CFC0"/>
+              <w:top w:val="single" w:sz="8" w:space="0" w:color="000000"/>
+              <w:left w:val="single" w:sz="8" w:space="0" w:color="000000"/>
+              <w:bottom w:val="single" w:sz="8" w:space="0" w:color="000000"/>
+              <w:right w:val="single" w:sz="8" w:space="0" w:color="000000"/>
             </w:tcBorders>
           </w:tcPr>
           <w:p>
@@ -620,10 +620,10 @@
           <w:tcPr>
             <w:shd w:val="clear" w:fill="FFF9F2"/>
             <w:tcBorders>
-              <w:top w:val="single" w:sz="8" w:space="0" w:color="D9CFC0"/>
-              <w:left w:val="single" w:sz="8" w:space="0" w:color="D9CFC0"/>
-              <w:bottom w:val="single" w:sz="8" w:space="0" w:color="D9CFC0"/>
-              <w:right w:val="single" w:sz="8" w:space="0" w:color="D9CFC0"/>
+              <w:top w:val="single" w:sz="8" w:space="0" w:color="000000"/>
+              <w:left w:val="single" w:sz="8" w:space="0" w:color="000000"/>
+              <w:bottom w:val="single" w:sz="8" w:space="0" w:color="000000"/>
+              <w:right w:val="single" w:sz="8" w:space="0" w:color="000000"/>
             </w:tcBorders>
           </w:tcPr>
           <w:p>
@@ -641,10 +641,10 @@
           <w:tcPr>
             <w:shd w:val="clear" w:fill="FFF9F2"/>
             <w:tcBorders>
-              <w:top w:val="single" w:sz="8" w:space="0" w:color="D9CFC0"/>
-              <w:left w:val="single" w:sz="8" w:space="0" w:color="D9CFC0"/>
-              <w:bottom w:val="single" w:sz="8" w:space="0" w:color="D9CFC0"/>
-              <w:right w:val="single" w:sz="8" w:space="0" w:color="D9CFC0"/>
+              <w:top w:val="single" w:sz="8" w:space="0" w:color="000000"/>
+              <w:left w:val="single" w:sz="8" w:space="0" w:color="000000"/>
+              <w:bottom w:val="single" w:sz="8" w:space="0" w:color="000000"/>
+              <w:right w:val="single" w:sz="8" w:space="0" w:color="000000"/>
             </w:tcBorders>
           </w:tcPr>
           <w:p>
@@ -664,10 +664,10 @@
           <w:tcPr>
             <w:shd w:val="clear" w:fill="FFF9F2"/>
             <w:tcBorders>
-              <w:top w:val="single" w:sz="8" w:space="0" w:color="D9CFC0"/>
-              <w:left w:val="single" w:sz="8" w:space="0" w:color="D9CFC0"/>
-              <w:bottom w:val="single" w:sz="8" w:space="0" w:color="D9CFC0"/>
-              <w:right w:val="single" w:sz="8" w:space="0" w:color="D9CFC0"/>
+              <w:top w:val="single" w:sz="8" w:space="0" w:color="000000"/>
+              <w:left w:val="single" w:sz="8" w:space="0" w:color="000000"/>
+              <w:bottom w:val="single" w:sz="8" w:space="0" w:color="000000"/>
+              <w:right w:val="single" w:sz="8" w:space="0" w:color="000000"/>
             </w:tcBorders>
           </w:tcPr>
           <w:p>
@@ -974,12 +974,12 @@
     <w:tbl>
       <w:tblPr>
         <w:tblBorders>
-          <w:top w:val="single" w:sz="8" w:space="0" w:color="B85400"/>
-          <w:bottom w:val="single" w:sz="8" w:space="0" w:color="B85400"/>
-          <w:left w:val="single" w:sz="8" w:space="0" w:color="B85400"/>
-          <w:right w:val="single" w:sz="8" w:space="0" w:color="B85400"/>
-          <w:insideV w:val="single" w:sz="8" w:space="0" w:color="B85400"/>
-          <w:insideH w:val="single" w:sz="8" w:space="0" w:color="B85400"/>
+          <w:top w:val="single" w:sz="2" w:space="0" w:color="000000"/>
+          <w:bottom w:val="single" w:sz="2" w:space="0" w:color="000000"/>
+          <w:left w:val="single" w:sz="2" w:space="0" w:color="000000"/>
+          <w:right w:val="single" w:sz="2" w:space="0" w:color="000000"/>
+          <w:insideV w:val="single" w:sz="2" w:space="0" w:color="000000"/>
+          <w:insideH w:val="single" w:sz="2" w:space="0" w:color="000000"/>
         </w:tblBorders>
         <w:tblCellSpacing w:w="0" w:type="dxa"/>
         <w:tblW w:type="dxa" w:w="10240"/>
@@ -1006,10 +1006,10 @@
           <w:tcPr>
             <w:shd w:val="clear" w:fill="E8720C"/>
             <w:tcBorders>
-              <w:top w:val="single" w:sz="8" w:space="0" w:color="B85400"/>
-              <w:left w:val="single" w:sz="8" w:space="0" w:color="B85400"/>
-              <w:bottom w:val="single" w:sz="8" w:space="0" w:color="B85400"/>
-              <w:right w:val="single" w:sz="8" w:space="0" w:color="B85400"/>
+              <w:top w:val="single" w:sz="8" w:space="0" w:color="000000"/>
+              <w:left w:val="single" w:sz="8" w:space="0" w:color="000000"/>
+              <w:bottom w:val="single" w:sz="8" w:space="0" w:color="000000"/>
+              <w:right w:val="single" w:sz="8" w:space="0" w:color="000000"/>
             </w:tcBorders>
           </w:tcPr>
           <w:p>
@@ -1029,10 +1029,10 @@
           <w:tcPr>
             <w:shd w:val="clear" w:fill="E8720C"/>
             <w:tcBorders>
-              <w:top w:val="single" w:sz="8" w:space="0" w:color="B85400"/>
-              <w:left w:val="single" w:sz="8" w:space="0" w:color="B85400"/>
-              <w:bottom w:val="single" w:sz="8" w:space="0" w:color="B85400"/>
-              <w:right w:val="single" w:sz="8" w:space="0" w:color="B85400"/>
+              <w:top w:val="single" w:sz="8" w:space="0" w:color="000000"/>
+              <w:left w:val="single" w:sz="8" w:space="0" w:color="000000"/>
+              <w:bottom w:val="single" w:sz="8" w:space="0" w:color="000000"/>
+              <w:right w:val="single" w:sz="8" w:space="0" w:color="000000"/>
             </w:tcBorders>
           </w:tcPr>
           <w:p>
@@ -1052,10 +1052,10 @@
           <w:tcPr>
             <w:shd w:val="clear" w:fill="E8720C"/>
             <w:tcBorders>
-              <w:top w:val="single" w:sz="8" w:space="0" w:color="B85400"/>
-              <w:left w:val="single" w:sz="8" w:space="0" w:color="B85400"/>
-              <w:bottom w:val="single" w:sz="8" w:space="0" w:color="B85400"/>
-              <w:right w:val="single" w:sz="8" w:space="0" w:color="B85400"/>
+              <w:top w:val="single" w:sz="8" w:space="0" w:color="000000"/>
+              <w:left w:val="single" w:sz="8" w:space="0" w:color="000000"/>
+              <w:bottom w:val="single" w:sz="8" w:space="0" w:color="000000"/>
+              <w:right w:val="single" w:sz="8" w:space="0" w:color="000000"/>
             </w:tcBorders>
           </w:tcPr>
           <w:p>
@@ -1075,10 +1075,10 @@
           <w:tcPr>
             <w:shd w:val="clear" w:fill="E8720C"/>
             <w:tcBorders>
-              <w:top w:val="single" w:sz="8" w:space="0" w:color="B85400"/>
-              <w:left w:val="single" w:sz="8" w:space="0" w:color="B85400"/>
-              <w:bottom w:val="single" w:sz="8" w:space="0" w:color="B85400"/>
-              <w:right w:val="single" w:sz="8" w:space="0" w:color="B85400"/>
+              <w:top w:val="single" w:sz="8" w:space="0" w:color="000000"/>
+              <w:left w:val="single" w:sz="8" w:space="0" w:color="000000"/>
+              <w:bottom w:val="single" w:sz="8" w:space="0" w:color="000000"/>
+              <w:right w:val="single" w:sz="8" w:space="0" w:color="000000"/>
             </w:tcBorders>
           </w:tcPr>
           <w:p>
@@ -1098,10 +1098,10 @@
           <w:tcPr>
             <w:shd w:val="clear" w:fill="E8720C"/>
             <w:tcBorders>
-              <w:top w:val="single" w:sz="8" w:space="0" w:color="B85400"/>
-              <w:left w:val="single" w:sz="8" w:space="0" w:color="B85400"/>
-              <w:bottom w:val="single" w:sz="8" w:space="0" w:color="B85400"/>
-              <w:right w:val="single" w:sz="8" w:space="0" w:color="B85400"/>
+              <w:top w:val="single" w:sz="8" w:space="0" w:color="000000"/>
+              <w:left w:val="single" w:sz="8" w:space="0" w:color="000000"/>
+              <w:bottom w:val="single" w:sz="8" w:space="0" w:color="000000"/>
+              <w:right w:val="single" w:sz="8" w:space="0" w:color="000000"/>
             </w:tcBorders>
           </w:tcPr>
           <w:p>
@@ -1133,10 +1133,10 @@
           <w:tcPr>
             <w:shd w:val="clear" w:fill="FFFFFF"/>
             <w:tcBorders>
-              <w:top w:val="single" w:sz="8" w:space="0" w:color="D9CFC0"/>
-              <w:left w:val="single" w:sz="8" w:space="0" w:color="D9CFC0"/>
-              <w:bottom w:val="single" w:sz="8" w:space="0" w:color="D9CFC0"/>
-              <w:right w:val="single" w:sz="8" w:space="0" w:color="D9CFC0"/>
+              <w:top w:val="single" w:sz="8" w:space="0" w:color="000000"/>
+              <w:left w:val="single" w:sz="8" w:space="0" w:color="000000"/>
+              <w:bottom w:val="single" w:sz="8" w:space="0" w:color="000000"/>
+              <w:right w:val="single" w:sz="8" w:space="0" w:color="000000"/>
             </w:tcBorders>
           </w:tcPr>
           <w:p>
@@ -1154,10 +1154,10 @@
           <w:tcPr>
             <w:shd w:val="clear" w:fill="FFFFFF"/>
             <w:tcBorders>
-              <w:top w:val="single" w:sz="8" w:space="0" w:color="D9CFC0"/>
-              <w:left w:val="single" w:sz="8" w:space="0" w:color="D9CFC0"/>
-              <w:bottom w:val="single" w:sz="8" w:space="0" w:color="D9CFC0"/>
-              <w:right w:val="single" w:sz="8" w:space="0" w:color="D9CFC0"/>
+              <w:top w:val="single" w:sz="8" w:space="0" w:color="000000"/>
+              <w:left w:val="single" w:sz="8" w:space="0" w:color="000000"/>
+              <w:bottom w:val="single" w:sz="8" w:space="0" w:color="000000"/>
+              <w:right w:val="single" w:sz="8" w:space="0" w:color="000000"/>
             </w:tcBorders>
           </w:tcPr>
           <w:p>
@@ -1167,7 +1167,7 @@
             </w:pPr>
             <w:r>
               <w:rPr/>
-              <w:t xml:space="preserve">✅</w:t>
+              <w:t xml:space="preserve">✓</w:t>
             </w:r>
           </w:p>
         </w:tc>
@@ -1175,10 +1175,10 @@
           <w:tcPr>
             <w:shd w:val="clear" w:fill="FFFFFF"/>
             <w:tcBorders>
-              <w:top w:val="single" w:sz="8" w:space="0" w:color="D9CFC0"/>
-              <w:left w:val="single" w:sz="8" w:space="0" w:color="D9CFC0"/>
-              <w:bottom w:val="single" w:sz="8" w:space="0" w:color="D9CFC0"/>
-              <w:right w:val="single" w:sz="8" w:space="0" w:color="D9CFC0"/>
+              <w:top w:val="single" w:sz="8" w:space="0" w:color="000000"/>
+              <w:left w:val="single" w:sz="8" w:space="0" w:color="000000"/>
+              <w:bottom w:val="single" w:sz="8" w:space="0" w:color="000000"/>
+              <w:right w:val="single" w:sz="8" w:space="0" w:color="000000"/>
             </w:tcBorders>
           </w:tcPr>
           <w:p>
@@ -1188,7 +1188,7 @@
             </w:pPr>
             <w:r>
               <w:rPr/>
-              <w:t xml:space="preserve">✅</w:t>
+              <w:t xml:space="preserve">✓</w:t>
             </w:r>
           </w:p>
         </w:tc>
@@ -1196,10 +1196,10 @@
           <w:tcPr>
             <w:shd w:val="clear" w:fill="FFFFFF"/>
             <w:tcBorders>
-              <w:top w:val="single" w:sz="8" w:space="0" w:color="D9CFC0"/>
-              <w:left w:val="single" w:sz="8" w:space="0" w:color="D9CFC0"/>
-              <w:bottom w:val="single" w:sz="8" w:space="0" w:color="D9CFC0"/>
-              <w:right w:val="single" w:sz="8" w:space="0" w:color="D9CFC0"/>
+              <w:top w:val="single" w:sz="8" w:space="0" w:color="000000"/>
+              <w:left w:val="single" w:sz="8" w:space="0" w:color="000000"/>
+              <w:bottom w:val="single" w:sz="8" w:space="0" w:color="000000"/>
+              <w:right w:val="single" w:sz="8" w:space="0" w:color="000000"/>
             </w:tcBorders>
           </w:tcPr>
           <w:p>
@@ -1209,7 +1209,7 @@
             </w:pPr>
             <w:r>
               <w:rPr/>
-              <w:t xml:space="preserve">✅</w:t>
+              <w:t xml:space="preserve">✓</w:t>
             </w:r>
           </w:p>
         </w:tc>
@@ -1217,10 +1217,10 @@
           <w:tcPr>
             <w:shd w:val="clear" w:fill="FFFFFF"/>
             <w:tcBorders>
-              <w:top w:val="single" w:sz="8" w:space="0" w:color="D9CFC0"/>
-              <w:left w:val="single" w:sz="8" w:space="0" w:color="D9CFC0"/>
-              <w:bottom w:val="single" w:sz="8" w:space="0" w:color="D9CFC0"/>
-              <w:right w:val="single" w:sz="8" w:space="0" w:color="D9CFC0"/>
+              <w:top w:val="single" w:sz="8" w:space="0" w:color="000000"/>
+              <w:left w:val="single" w:sz="8" w:space="0" w:color="000000"/>
+              <w:bottom w:val="single" w:sz="8" w:space="0" w:color="000000"/>
+              <w:right w:val="single" w:sz="8" w:space="0" w:color="000000"/>
             </w:tcBorders>
           </w:tcPr>
           <w:p>
@@ -1230,7 +1230,7 @@
             </w:pPr>
             <w:r>
               <w:rPr/>
-              <w:t xml:space="preserve">✅</w:t>
+              <w:t xml:space="preserve">✓</w:t>
             </w:r>
           </w:p>
         </w:tc>
@@ -1243,10 +1243,10 @@
           <w:tcPr>
             <w:shd w:val="clear" w:fill="FFF9F2"/>
             <w:tcBorders>
-              <w:top w:val="single" w:sz="8" w:space="0" w:color="D9CFC0"/>
-              <w:left w:val="single" w:sz="8" w:space="0" w:color="D9CFC0"/>
-              <w:bottom w:val="single" w:sz="8" w:space="0" w:color="D9CFC0"/>
-              <w:right w:val="single" w:sz="8" w:space="0" w:color="D9CFC0"/>
+              <w:top w:val="single" w:sz="8" w:space="0" w:color="000000"/>
+              <w:left w:val="single" w:sz="8" w:space="0" w:color="000000"/>
+              <w:bottom w:val="single" w:sz="8" w:space="0" w:color="000000"/>
+              <w:right w:val="single" w:sz="8" w:space="0" w:color="000000"/>
             </w:tcBorders>
           </w:tcPr>
           <w:p>
@@ -1264,10 +1264,10 @@
           <w:tcPr>
             <w:shd w:val="clear" w:fill="FFF9F2"/>
             <w:tcBorders>
-              <w:top w:val="single" w:sz="8" w:space="0" w:color="D9CFC0"/>
-              <w:left w:val="single" w:sz="8" w:space="0" w:color="D9CFC0"/>
-              <w:bottom w:val="single" w:sz="8" w:space="0" w:color="D9CFC0"/>
-              <w:right w:val="single" w:sz="8" w:space="0" w:color="D9CFC0"/>
+              <w:top w:val="single" w:sz="8" w:space="0" w:color="000000"/>
+              <w:left w:val="single" w:sz="8" w:space="0" w:color="000000"/>
+              <w:bottom w:val="single" w:sz="8" w:space="0" w:color="000000"/>
+              <w:right w:val="single" w:sz="8" w:space="0" w:color="000000"/>
             </w:tcBorders>
           </w:tcPr>
           <w:p>
@@ -1277,7 +1277,7 @@
             </w:pPr>
             <w:r>
               <w:rPr/>
-              <w:t xml:space="preserve">✅</w:t>
+              <w:t xml:space="preserve">✓</w:t>
             </w:r>
           </w:p>
         </w:tc>
@@ -1285,10 +1285,10 @@
           <w:tcPr>
             <w:shd w:val="clear" w:fill="FFF9F2"/>
             <w:tcBorders>
-              <w:top w:val="single" w:sz="8" w:space="0" w:color="D9CFC0"/>
-              <w:left w:val="single" w:sz="8" w:space="0" w:color="D9CFC0"/>
-              <w:bottom w:val="single" w:sz="8" w:space="0" w:color="D9CFC0"/>
-              <w:right w:val="single" w:sz="8" w:space="0" w:color="D9CFC0"/>
+              <w:top w:val="single" w:sz="8" w:space="0" w:color="000000"/>
+              <w:left w:val="single" w:sz="8" w:space="0" w:color="000000"/>
+              <w:bottom w:val="single" w:sz="8" w:space="0" w:color="000000"/>
+              <w:right w:val="single" w:sz="8" w:space="0" w:color="000000"/>
             </w:tcBorders>
           </w:tcPr>
           <w:p>
@@ -1298,7 +1298,7 @@
             </w:pPr>
             <w:r>
               <w:rPr/>
-              <w:t xml:space="preserve">✅</w:t>
+              <w:t xml:space="preserve">✓</w:t>
             </w:r>
           </w:p>
         </w:tc>
@@ -1306,10 +1306,10 @@
           <w:tcPr>
             <w:shd w:val="clear" w:fill="FFF9F2"/>
             <w:tcBorders>
-              <w:top w:val="single" w:sz="8" w:space="0" w:color="D9CFC0"/>
-              <w:left w:val="single" w:sz="8" w:space="0" w:color="D9CFC0"/>
-              <w:bottom w:val="single" w:sz="8" w:space="0" w:color="D9CFC0"/>
-              <w:right w:val="single" w:sz="8" w:space="0" w:color="D9CFC0"/>
+              <w:top w:val="single" w:sz="8" w:space="0" w:color="000000"/>
+              <w:left w:val="single" w:sz="8" w:space="0" w:color="000000"/>
+              <w:bottom w:val="single" w:sz="8" w:space="0" w:color="000000"/>
+              <w:right w:val="single" w:sz="8" w:space="0" w:color="000000"/>
             </w:tcBorders>
           </w:tcPr>
           <w:p>
@@ -1319,7 +1319,7 @@
             </w:pPr>
             <w:r>
               <w:rPr/>
-              <w:t xml:space="preserve">✅</w:t>
+              <w:t xml:space="preserve">✓</w:t>
             </w:r>
           </w:p>
         </w:tc>
@@ -1327,10 +1327,10 @@
           <w:tcPr>
             <w:shd w:val="clear" w:fill="FFF9F2"/>
             <w:tcBorders>
-              <w:top w:val="single" w:sz="8" w:space="0" w:color="D9CFC0"/>
-              <w:left w:val="single" w:sz="8" w:space="0" w:color="D9CFC0"/>
-              <w:bottom w:val="single" w:sz="8" w:space="0" w:color="D9CFC0"/>
-              <w:right w:val="single" w:sz="8" w:space="0" w:color="D9CFC0"/>
+              <w:top w:val="single" w:sz="8" w:space="0" w:color="000000"/>
+              <w:left w:val="single" w:sz="8" w:space="0" w:color="000000"/>
+              <w:bottom w:val="single" w:sz="8" w:space="0" w:color="000000"/>
+              <w:right w:val="single" w:sz="8" w:space="0" w:color="000000"/>
             </w:tcBorders>
           </w:tcPr>
           <w:p>
@@ -1340,7 +1340,7 @@
             </w:pPr>
             <w:r>
               <w:rPr/>
-              <w:t xml:space="preserve">❌ masqué</w:t>
+              <w:t xml:space="preserve">✗ masqué</w:t>
             </w:r>
           </w:p>
         </w:tc>
@@ -1353,10 +1353,10 @@
           <w:tcPr>
             <w:shd w:val="clear" w:fill="FFFFFF"/>
             <w:tcBorders>
-              <w:top w:val="single" w:sz="8" w:space="0" w:color="D9CFC0"/>
-              <w:left w:val="single" w:sz="8" w:space="0" w:color="D9CFC0"/>
-              <w:bottom w:val="single" w:sz="8" w:space="0" w:color="D9CFC0"/>
-              <w:right w:val="single" w:sz="8" w:space="0" w:color="D9CFC0"/>
+              <w:top w:val="single" w:sz="8" w:space="0" w:color="000000"/>
+              <w:left w:val="single" w:sz="8" w:space="0" w:color="000000"/>
+              <w:bottom w:val="single" w:sz="8" w:space="0" w:color="000000"/>
+              <w:right w:val="single" w:sz="8" w:space="0" w:color="000000"/>
             </w:tcBorders>
           </w:tcPr>
           <w:p>
@@ -1374,10 +1374,10 @@
           <w:tcPr>
             <w:shd w:val="clear" w:fill="FFFFFF"/>
             <w:tcBorders>
-              <w:top w:val="single" w:sz="8" w:space="0" w:color="D9CFC0"/>
-              <w:left w:val="single" w:sz="8" w:space="0" w:color="D9CFC0"/>
-              <w:bottom w:val="single" w:sz="8" w:space="0" w:color="D9CFC0"/>
-              <w:right w:val="single" w:sz="8" w:space="0" w:color="D9CFC0"/>
+              <w:top w:val="single" w:sz="8" w:space="0" w:color="000000"/>
+              <w:left w:val="single" w:sz="8" w:space="0" w:color="000000"/>
+              <w:bottom w:val="single" w:sz="8" w:space="0" w:color="000000"/>
+              <w:right w:val="single" w:sz="8" w:space="0" w:color="000000"/>
             </w:tcBorders>
           </w:tcPr>
           <w:p>
@@ -1387,7 +1387,7 @@
             </w:pPr>
             <w:r>
               <w:rPr/>
-              <w:t xml:space="preserve">✅</w:t>
+              <w:t xml:space="preserve">✓</w:t>
             </w:r>
           </w:p>
         </w:tc>
@@ -1395,10 +1395,10 @@
           <w:tcPr>
             <w:shd w:val="clear" w:fill="FFFFFF"/>
             <w:tcBorders>
-              <w:top w:val="single" w:sz="8" w:space="0" w:color="D9CFC0"/>
-              <w:left w:val="single" w:sz="8" w:space="0" w:color="D9CFC0"/>
-              <w:bottom w:val="single" w:sz="8" w:space="0" w:color="D9CFC0"/>
-              <w:right w:val="single" w:sz="8" w:space="0" w:color="D9CFC0"/>
+              <w:top w:val="single" w:sz="8" w:space="0" w:color="000000"/>
+              <w:left w:val="single" w:sz="8" w:space="0" w:color="000000"/>
+              <w:bottom w:val="single" w:sz="8" w:space="0" w:color="000000"/>
+              <w:right w:val="single" w:sz="8" w:space="0" w:color="000000"/>
             </w:tcBorders>
           </w:tcPr>
           <w:p>
@@ -1408,7 +1408,7 @@
             </w:pPr>
             <w:r>
               <w:rPr/>
-              <w:t xml:space="preserve">✅</w:t>
+              <w:t xml:space="preserve">✓</w:t>
             </w:r>
           </w:p>
         </w:tc>
@@ -1416,10 +1416,10 @@
           <w:tcPr>
             <w:shd w:val="clear" w:fill="FFFFFF"/>
             <w:tcBorders>
-              <w:top w:val="single" w:sz="8" w:space="0" w:color="D9CFC0"/>
-              <w:left w:val="single" w:sz="8" w:space="0" w:color="D9CFC0"/>
-              <w:bottom w:val="single" w:sz="8" w:space="0" w:color="D9CFC0"/>
-              <w:right w:val="single" w:sz="8" w:space="0" w:color="D9CFC0"/>
+              <w:top w:val="single" w:sz="8" w:space="0" w:color="000000"/>
+              <w:left w:val="single" w:sz="8" w:space="0" w:color="000000"/>
+              <w:bottom w:val="single" w:sz="8" w:space="0" w:color="000000"/>
+              <w:right w:val="single" w:sz="8" w:space="0" w:color="000000"/>
             </w:tcBorders>
           </w:tcPr>
           <w:p>
@@ -1429,7 +1429,7 @@
             </w:pPr>
             <w:r>
               <w:rPr/>
-              <w:t xml:space="preserve">✅</w:t>
+              <w:t xml:space="preserve">✓</w:t>
             </w:r>
           </w:p>
         </w:tc>
@@ -1437,10 +1437,10 @@
           <w:tcPr>
             <w:shd w:val="clear" w:fill="FFFFFF"/>
             <w:tcBorders>
-              <w:top w:val="single" w:sz="8" w:space="0" w:color="D9CFC0"/>
-              <w:left w:val="single" w:sz="8" w:space="0" w:color="D9CFC0"/>
-              <w:bottom w:val="single" w:sz="8" w:space="0" w:color="D9CFC0"/>
-              <w:right w:val="single" w:sz="8" w:space="0" w:color="D9CFC0"/>
+              <w:top w:val="single" w:sz="8" w:space="0" w:color="000000"/>
+              <w:left w:val="single" w:sz="8" w:space="0" w:color="000000"/>
+              <w:bottom w:val="single" w:sz="8" w:space="0" w:color="000000"/>
+              <w:right w:val="single" w:sz="8" w:space="0" w:color="000000"/>
             </w:tcBorders>
           </w:tcPr>
           <w:p>
@@ -1450,7 +1450,7 @@
             </w:pPr>
             <w:r>
               <w:rPr/>
-              <w:t xml:space="preserve">❌ masqué</w:t>
+              <w:t xml:space="preserve">✗ masqué</w:t>
             </w:r>
           </w:p>
         </w:tc>
@@ -1463,10 +1463,10 @@
           <w:tcPr>
             <w:shd w:val="clear" w:fill="FFF9F2"/>
             <w:tcBorders>
-              <w:top w:val="single" w:sz="8" w:space="0" w:color="D9CFC0"/>
-              <w:left w:val="single" w:sz="8" w:space="0" w:color="D9CFC0"/>
-              <w:bottom w:val="single" w:sz="8" w:space="0" w:color="D9CFC0"/>
-              <w:right w:val="single" w:sz="8" w:space="0" w:color="D9CFC0"/>
+              <w:top w:val="single" w:sz="8" w:space="0" w:color="000000"/>
+              <w:left w:val="single" w:sz="8" w:space="0" w:color="000000"/>
+              <w:bottom w:val="single" w:sz="8" w:space="0" w:color="000000"/>
+              <w:right w:val="single" w:sz="8" w:space="0" w:color="000000"/>
             </w:tcBorders>
           </w:tcPr>
           <w:p>
@@ -1496,10 +1496,10 @@
           <w:tcPr>
             <w:shd w:val="clear" w:fill="FFF9F2"/>
             <w:tcBorders>
-              <w:top w:val="single" w:sz="8" w:space="0" w:color="D9CFC0"/>
-              <w:left w:val="single" w:sz="8" w:space="0" w:color="D9CFC0"/>
-              <w:bottom w:val="single" w:sz="8" w:space="0" w:color="D9CFC0"/>
-              <w:right w:val="single" w:sz="8" w:space="0" w:color="D9CFC0"/>
+              <w:top w:val="single" w:sz="8" w:space="0" w:color="000000"/>
+              <w:left w:val="single" w:sz="8" w:space="0" w:color="000000"/>
+              <w:bottom w:val="single" w:sz="8" w:space="0" w:color="000000"/>
+              <w:right w:val="single" w:sz="8" w:space="0" w:color="000000"/>
             </w:tcBorders>
           </w:tcPr>
           <w:p>
@@ -1517,10 +1517,10 @@
           <w:tcPr>
             <w:shd w:val="clear" w:fill="FFF9F2"/>
             <w:tcBorders>
-              <w:top w:val="single" w:sz="8" w:space="0" w:color="D9CFC0"/>
-              <w:left w:val="single" w:sz="8" w:space="0" w:color="D9CFC0"/>
-              <w:bottom w:val="single" w:sz="8" w:space="0" w:color="D9CFC0"/>
-              <w:right w:val="single" w:sz="8" w:space="0" w:color="D9CFC0"/>
+              <w:top w:val="single" w:sz="8" w:space="0" w:color="000000"/>
+              <w:left w:val="single" w:sz="8" w:space="0" w:color="000000"/>
+              <w:bottom w:val="single" w:sz="8" w:space="0" w:color="000000"/>
+              <w:right w:val="single" w:sz="8" w:space="0" w:color="000000"/>
             </w:tcBorders>
           </w:tcPr>
           <w:p>
@@ -1538,10 +1538,10 @@
           <w:tcPr>
             <w:shd w:val="clear" w:fill="FFF9F2"/>
             <w:tcBorders>
-              <w:top w:val="single" w:sz="8" w:space="0" w:color="D9CFC0"/>
-              <w:left w:val="single" w:sz="8" w:space="0" w:color="D9CFC0"/>
-              <w:bottom w:val="single" w:sz="8" w:space="0" w:color="D9CFC0"/>
-              <w:right w:val="single" w:sz="8" w:space="0" w:color="D9CFC0"/>
+              <w:top w:val="single" w:sz="8" w:space="0" w:color="000000"/>
+              <w:left w:val="single" w:sz="8" w:space="0" w:color="000000"/>
+              <w:bottom w:val="single" w:sz="8" w:space="0" w:color="000000"/>
+              <w:right w:val="single" w:sz="8" w:space="0" w:color="000000"/>
             </w:tcBorders>
           </w:tcPr>
           <w:p>
@@ -1559,10 +1559,10 @@
           <w:tcPr>
             <w:shd w:val="clear" w:fill="FFF9F2"/>
             <w:tcBorders>
-              <w:top w:val="single" w:sz="8" w:space="0" w:color="D9CFC0"/>
-              <w:left w:val="single" w:sz="8" w:space="0" w:color="D9CFC0"/>
-              <w:bottom w:val="single" w:sz="8" w:space="0" w:color="D9CFC0"/>
-              <w:right w:val="single" w:sz="8" w:space="0" w:color="D9CFC0"/>
+              <w:top w:val="single" w:sz="8" w:space="0" w:color="000000"/>
+              <w:left w:val="single" w:sz="8" w:space="0" w:color="000000"/>
+              <w:bottom w:val="single" w:sz="8" w:space="0" w:color="000000"/>
+              <w:right w:val="single" w:sz="8" w:space="0" w:color="000000"/>
             </w:tcBorders>
           </w:tcPr>
           <w:p>
@@ -1572,7 +1572,7 @@
             </w:pPr>
             <w:r>
               <w:rPr/>
-              <w:t xml:space="preserve">✅</w:t>
+              <w:t xml:space="preserve">✓</w:t>
             </w:r>
           </w:p>
         </w:tc>
@@ -1585,10 +1585,10 @@
           <w:tcPr>
             <w:shd w:val="clear" w:fill="FFFFFF"/>
             <w:tcBorders>
-              <w:top w:val="single" w:sz="8" w:space="0" w:color="D9CFC0"/>
-              <w:left w:val="single" w:sz="8" w:space="0" w:color="D9CFC0"/>
-              <w:bottom w:val="single" w:sz="8" w:space="0" w:color="D9CFC0"/>
-              <w:right w:val="single" w:sz="8" w:space="0" w:color="D9CFC0"/>
+              <w:top w:val="single" w:sz="8" w:space="0" w:color="000000"/>
+              <w:left w:val="single" w:sz="8" w:space="0" w:color="000000"/>
+              <w:bottom w:val="single" w:sz="8" w:space="0" w:color="000000"/>
+              <w:right w:val="single" w:sz="8" w:space="0" w:color="000000"/>
             </w:tcBorders>
           </w:tcPr>
           <w:p>
@@ -1606,10 +1606,10 @@
           <w:tcPr>
             <w:shd w:val="clear" w:fill="FFFFFF"/>
             <w:tcBorders>
-              <w:top w:val="single" w:sz="8" w:space="0" w:color="D9CFC0"/>
-              <w:left w:val="single" w:sz="8" w:space="0" w:color="D9CFC0"/>
-              <w:bottom w:val="single" w:sz="8" w:space="0" w:color="D9CFC0"/>
-              <w:right w:val="single" w:sz="8" w:space="0" w:color="D9CFC0"/>
+              <w:top w:val="single" w:sz="8" w:space="0" w:color="000000"/>
+              <w:left w:val="single" w:sz="8" w:space="0" w:color="000000"/>
+              <w:bottom w:val="single" w:sz="8" w:space="0" w:color="000000"/>
+              <w:right w:val="single" w:sz="8" w:space="0" w:color="000000"/>
             </w:tcBorders>
           </w:tcPr>
           <w:p>
@@ -1619,7 +1619,7 @@
             </w:pPr>
             <w:r>
               <w:rPr/>
-              <w:t xml:space="preserve">✅ (tous)</w:t>
+              <w:t xml:space="preserve">✓ (tous)</w:t>
             </w:r>
           </w:p>
         </w:tc>
@@ -1627,10 +1627,10 @@
           <w:tcPr>
             <w:shd w:val="clear" w:fill="FFFFFF"/>
             <w:tcBorders>
-              <w:top w:val="single" w:sz="8" w:space="0" w:color="D9CFC0"/>
-              <w:left w:val="single" w:sz="8" w:space="0" w:color="D9CFC0"/>
-              <w:bottom w:val="single" w:sz="8" w:space="0" w:color="D9CFC0"/>
-              <w:right w:val="single" w:sz="8" w:space="0" w:color="D9CFC0"/>
+              <w:top w:val="single" w:sz="8" w:space="0" w:color="000000"/>
+              <w:left w:val="single" w:sz="8" w:space="0" w:color="000000"/>
+              <w:bottom w:val="single" w:sz="8" w:space="0" w:color="000000"/>
+              <w:right w:val="single" w:sz="8" w:space="0" w:color="000000"/>
             </w:tcBorders>
           </w:tcPr>
           <w:p>
@@ -1640,7 +1640,7 @@
             </w:pPr>
             <w:r>
               <w:rPr/>
-              <w:t xml:space="preserve">✅ (tous)</w:t>
+              <w:t xml:space="preserve">✓ (tous)</w:t>
             </w:r>
           </w:p>
         </w:tc>
@@ -1648,10 +1648,10 @@
           <w:tcPr>
             <w:shd w:val="clear" w:fill="FFFFFF"/>
             <w:tcBorders>
-              <w:top w:val="single" w:sz="8" w:space="0" w:color="D9CFC0"/>
-              <w:left w:val="single" w:sz="8" w:space="0" w:color="D9CFC0"/>
-              <w:bottom w:val="single" w:sz="8" w:space="0" w:color="D9CFC0"/>
-              <w:right w:val="single" w:sz="8" w:space="0" w:color="D9CFC0"/>
+              <w:top w:val="single" w:sz="8" w:space="0" w:color="000000"/>
+              <w:left w:val="single" w:sz="8" w:space="0" w:color="000000"/>
+              <w:bottom w:val="single" w:sz="8" w:space="0" w:color="000000"/>
+              <w:right w:val="single" w:sz="8" w:space="0" w:color="000000"/>
             </w:tcBorders>
           </w:tcPr>
           <w:p>
@@ -1661,7 +1661,7 @@
             </w:pPr>
             <w:r>
               <w:rPr/>
-              <w:t xml:space="preserve">✅ (tous)</w:t>
+              <w:t xml:space="preserve">✓ (tous)</w:t>
             </w:r>
           </w:p>
         </w:tc>
@@ -1669,10 +1669,10 @@
           <w:tcPr>
             <w:shd w:val="clear" w:fill="FFFFFF"/>
             <w:tcBorders>
-              <w:top w:val="single" w:sz="8" w:space="0" w:color="D9CFC0"/>
-              <w:left w:val="single" w:sz="8" w:space="0" w:color="D9CFC0"/>
-              <w:bottom w:val="single" w:sz="8" w:space="0" w:color="D9CFC0"/>
-              <w:right w:val="single" w:sz="8" w:space="0" w:color="D9CFC0"/>
+              <w:top w:val="single" w:sz="8" w:space="0" w:color="000000"/>
+              <w:left w:val="single" w:sz="8" w:space="0" w:color="000000"/>
+              <w:bottom w:val="single" w:sz="8" w:space="0" w:color="000000"/>
+              <w:right w:val="single" w:sz="8" w:space="0" w:color="000000"/>
             </w:tcBorders>
           </w:tcPr>
           <w:p>
@@ -1682,7 +1682,7 @@
             </w:pPr>
             <w:r>
               <w:rPr/>
-              <w:t xml:space="preserve">✅ (</w:t>
+              <w:t xml:space="preserve">✓ (</w:t>
             </w:r>
           </w:p>
           <w:p>
@@ -1717,10 +1717,10 @@
           <w:tcPr>
             <w:shd w:val="clear" w:fill="FFF9F2"/>
             <w:tcBorders>
-              <w:top w:val="single" w:sz="8" w:space="0" w:color="D9CFC0"/>
-              <w:left w:val="single" w:sz="8" w:space="0" w:color="D9CFC0"/>
-              <w:bottom w:val="single" w:sz="8" w:space="0" w:color="D9CFC0"/>
-              <w:right w:val="single" w:sz="8" w:space="0" w:color="D9CFC0"/>
+              <w:top w:val="single" w:sz="8" w:space="0" w:color="000000"/>
+              <w:left w:val="single" w:sz="8" w:space="0" w:color="000000"/>
+              <w:bottom w:val="single" w:sz="8" w:space="0" w:color="000000"/>
+              <w:right w:val="single" w:sz="8" w:space="0" w:color="000000"/>
             </w:tcBorders>
           </w:tcPr>
           <w:p>
@@ -1738,10 +1738,10 @@
           <w:tcPr>
             <w:shd w:val="clear" w:fill="FFF9F2"/>
             <w:tcBorders>
-              <w:top w:val="single" w:sz="8" w:space="0" w:color="D9CFC0"/>
-              <w:left w:val="single" w:sz="8" w:space="0" w:color="D9CFC0"/>
-              <w:bottom w:val="single" w:sz="8" w:space="0" w:color="D9CFC0"/>
-              <w:right w:val="single" w:sz="8" w:space="0" w:color="D9CFC0"/>
+              <w:top w:val="single" w:sz="8" w:space="0" w:color="000000"/>
+              <w:left w:val="single" w:sz="8" w:space="0" w:color="000000"/>
+              <w:bottom w:val="single" w:sz="8" w:space="0" w:color="000000"/>
+              <w:right w:val="single" w:sz="8" w:space="0" w:color="000000"/>
             </w:tcBorders>
           </w:tcPr>
           <w:p>
@@ -1751,7 +1751,7 @@
             </w:pPr>
             <w:r>
               <w:rPr/>
-              <w:t xml:space="preserve">✅</w:t>
+              <w:t xml:space="preserve">✓</w:t>
             </w:r>
           </w:p>
         </w:tc>
@@ -1759,10 +1759,10 @@
           <w:tcPr>
             <w:shd w:val="clear" w:fill="FFF9F2"/>
             <w:tcBorders>
-              <w:top w:val="single" w:sz="8" w:space="0" w:color="D9CFC0"/>
-              <w:left w:val="single" w:sz="8" w:space="0" w:color="D9CFC0"/>
-              <w:bottom w:val="single" w:sz="8" w:space="0" w:color="D9CFC0"/>
-              <w:right w:val="single" w:sz="8" w:space="0" w:color="D9CFC0"/>
+              <w:top w:val="single" w:sz="8" w:space="0" w:color="000000"/>
+              <w:left w:val="single" w:sz="8" w:space="0" w:color="000000"/>
+              <w:bottom w:val="single" w:sz="8" w:space="0" w:color="000000"/>
+              <w:right w:val="single" w:sz="8" w:space="0" w:color="000000"/>
             </w:tcBorders>
           </w:tcPr>
           <w:p>
@@ -1772,7 +1772,7 @@
             </w:pPr>
             <w:r>
               <w:rPr/>
-              <w:t xml:space="preserve">❌</w:t>
+              <w:t xml:space="preserve">✗</w:t>
             </w:r>
           </w:p>
         </w:tc>
@@ -1780,10 +1780,10 @@
           <w:tcPr>
             <w:shd w:val="clear" w:fill="FFF9F2"/>
             <w:tcBorders>
-              <w:top w:val="single" w:sz="8" w:space="0" w:color="D9CFC0"/>
-              <w:left w:val="single" w:sz="8" w:space="0" w:color="D9CFC0"/>
-              <w:bottom w:val="single" w:sz="8" w:space="0" w:color="D9CFC0"/>
-              <w:right w:val="single" w:sz="8" w:space="0" w:color="D9CFC0"/>
+              <w:top w:val="single" w:sz="8" w:space="0" w:color="000000"/>
+              <w:left w:val="single" w:sz="8" w:space="0" w:color="000000"/>
+              <w:bottom w:val="single" w:sz="8" w:space="0" w:color="000000"/>
+              <w:right w:val="single" w:sz="8" w:space="0" w:color="000000"/>
             </w:tcBorders>
           </w:tcPr>
           <w:p>
@@ -1793,7 +1793,7 @@
             </w:pPr>
             <w:r>
               <w:rPr/>
-              <w:t xml:space="preserve">❌</w:t>
+              <w:t xml:space="preserve">✗</w:t>
             </w:r>
           </w:p>
         </w:tc>
@@ -1801,10 +1801,10 @@
           <w:tcPr>
             <w:shd w:val="clear" w:fill="FFF9F2"/>
             <w:tcBorders>
-              <w:top w:val="single" w:sz="8" w:space="0" w:color="D9CFC0"/>
-              <w:left w:val="single" w:sz="8" w:space="0" w:color="D9CFC0"/>
-              <w:bottom w:val="single" w:sz="8" w:space="0" w:color="D9CFC0"/>
-              <w:right w:val="single" w:sz="8" w:space="0" w:color="D9CFC0"/>
+              <w:top w:val="single" w:sz="8" w:space="0" w:color="000000"/>
+              <w:left w:val="single" w:sz="8" w:space="0" w:color="000000"/>
+              <w:bottom w:val="single" w:sz="8" w:space="0" w:color="000000"/>
+              <w:right w:val="single" w:sz="8" w:space="0" w:color="000000"/>
             </w:tcBorders>
           </w:tcPr>
           <w:p>
@@ -1814,7 +1814,7 @@
             </w:pPr>
             <w:r>
               <w:rPr/>
-              <w:t xml:space="preserve">❌</w:t>
+              <w:t xml:space="preserve">✗</w:t>
             </w:r>
           </w:p>
         </w:tc>
@@ -1827,10 +1827,10 @@
           <w:tcPr>
             <w:shd w:val="clear" w:fill="FFFFFF"/>
             <w:tcBorders>
-              <w:top w:val="single" w:sz="8" w:space="0" w:color="D9CFC0"/>
-              <w:left w:val="single" w:sz="8" w:space="0" w:color="D9CFC0"/>
-              <w:bottom w:val="single" w:sz="8" w:space="0" w:color="D9CFC0"/>
-              <w:right w:val="single" w:sz="8" w:space="0" w:color="D9CFC0"/>
+              <w:top w:val="single" w:sz="8" w:space="0" w:color="000000"/>
+              <w:left w:val="single" w:sz="8" w:space="0" w:color="000000"/>
+              <w:bottom w:val="single" w:sz="8" w:space="0" w:color="000000"/>
+              <w:right w:val="single" w:sz="8" w:space="0" w:color="000000"/>
             </w:tcBorders>
           </w:tcPr>
           <w:p>
@@ -1848,10 +1848,10 @@
           <w:tcPr>
             <w:shd w:val="clear" w:fill="FFFFFF"/>
             <w:tcBorders>
-              <w:top w:val="single" w:sz="8" w:space="0" w:color="D9CFC0"/>
-              <w:left w:val="single" w:sz="8" w:space="0" w:color="D9CFC0"/>
-              <w:bottom w:val="single" w:sz="8" w:space="0" w:color="D9CFC0"/>
-              <w:right w:val="single" w:sz="8" w:space="0" w:color="D9CFC0"/>
+              <w:top w:val="single" w:sz="8" w:space="0" w:color="000000"/>
+              <w:left w:val="single" w:sz="8" w:space="0" w:color="000000"/>
+              <w:bottom w:val="single" w:sz="8" w:space="0" w:color="000000"/>
+              <w:right w:val="single" w:sz="8" w:space="0" w:color="000000"/>
             </w:tcBorders>
           </w:tcPr>
           <w:p>
@@ -1861,7 +1861,7 @@
             </w:pPr>
             <w:r>
               <w:rPr/>
-              <w:t xml:space="preserve">✅</w:t>
+              <w:t xml:space="preserve">✓</w:t>
             </w:r>
           </w:p>
         </w:tc>
@@ -1869,10 +1869,10 @@
           <w:tcPr>
             <w:shd w:val="clear" w:fill="FFFFFF"/>
             <w:tcBorders>
-              <w:top w:val="single" w:sz="8" w:space="0" w:color="D9CFC0"/>
-              <w:left w:val="single" w:sz="8" w:space="0" w:color="D9CFC0"/>
-              <w:bottom w:val="single" w:sz="8" w:space="0" w:color="D9CFC0"/>
-              <w:right w:val="single" w:sz="8" w:space="0" w:color="D9CFC0"/>
+              <w:top w:val="single" w:sz="8" w:space="0" w:color="000000"/>
+              <w:left w:val="single" w:sz="8" w:space="0" w:color="000000"/>
+              <w:bottom w:val="single" w:sz="8" w:space="0" w:color="000000"/>
+              <w:right w:val="single" w:sz="8" w:space="0" w:color="000000"/>
             </w:tcBorders>
           </w:tcPr>
           <w:p>
@@ -1882,7 +1882,7 @@
             </w:pPr>
             <w:r>
               <w:rPr/>
-              <w:t xml:space="preserve">✅</w:t>
+              <w:t xml:space="preserve">✓</w:t>
             </w:r>
           </w:p>
         </w:tc>
@@ -1890,10 +1890,10 @@
           <w:tcPr>
             <w:shd w:val="clear" w:fill="FFFFFF"/>
             <w:tcBorders>
-              <w:top w:val="single" w:sz="8" w:space="0" w:color="D9CFC0"/>
-              <w:left w:val="single" w:sz="8" w:space="0" w:color="D9CFC0"/>
-              <w:bottom w:val="single" w:sz="8" w:space="0" w:color="D9CFC0"/>
-              <w:right w:val="single" w:sz="8" w:space="0" w:color="D9CFC0"/>
+              <w:top w:val="single" w:sz="8" w:space="0" w:color="000000"/>
+              <w:left w:val="single" w:sz="8" w:space="0" w:color="000000"/>
+              <w:bottom w:val="single" w:sz="8" w:space="0" w:color="000000"/>
+              <w:right w:val="single" w:sz="8" w:space="0" w:color="000000"/>
             </w:tcBorders>
           </w:tcPr>
           <w:p>
@@ -1903,7 +1903,7 @@
             </w:pPr>
             <w:r>
               <w:rPr/>
-              <w:t xml:space="preserve">✅</w:t>
+              <w:t xml:space="preserve">✓</w:t>
             </w:r>
           </w:p>
         </w:tc>
@@ -1911,10 +1911,10 @@
           <w:tcPr>
             <w:shd w:val="clear" w:fill="FFFFFF"/>
             <w:tcBorders>
-              <w:top w:val="single" w:sz="8" w:space="0" w:color="D9CFC0"/>
-              <w:left w:val="single" w:sz="8" w:space="0" w:color="D9CFC0"/>
-              <w:bottom w:val="single" w:sz="8" w:space="0" w:color="D9CFC0"/>
-              <w:right w:val="single" w:sz="8" w:space="0" w:color="D9CFC0"/>
+              <w:top w:val="single" w:sz="8" w:space="0" w:color="000000"/>
+              <w:left w:val="single" w:sz="8" w:space="0" w:color="000000"/>
+              <w:bottom w:val="single" w:sz="8" w:space="0" w:color="000000"/>
+              <w:right w:val="single" w:sz="8" w:space="0" w:color="000000"/>
             </w:tcBorders>
           </w:tcPr>
           <w:p>
@@ -1924,7 +1924,7 @@
             </w:pPr>
             <w:r>
               <w:rPr/>
-              <w:t xml:space="preserve">❌ masqué</w:t>
+              <w:t xml:space="preserve">✗ masqué</w:t>
             </w:r>
           </w:p>
         </w:tc>
@@ -1937,10 +1937,10 @@
           <w:tcPr>
             <w:shd w:val="clear" w:fill="FFF9F2"/>
             <w:tcBorders>
-              <w:top w:val="single" w:sz="8" w:space="0" w:color="D9CFC0"/>
-              <w:left w:val="single" w:sz="8" w:space="0" w:color="D9CFC0"/>
-              <w:bottom w:val="single" w:sz="8" w:space="0" w:color="D9CFC0"/>
-              <w:right w:val="single" w:sz="8" w:space="0" w:color="D9CFC0"/>
+              <w:top w:val="single" w:sz="8" w:space="0" w:color="000000"/>
+              <w:left w:val="single" w:sz="8" w:space="0" w:color="000000"/>
+              <w:bottom w:val="single" w:sz="8" w:space="0" w:color="000000"/>
+              <w:right w:val="single" w:sz="8" w:space="0" w:color="000000"/>
             </w:tcBorders>
           </w:tcPr>
           <w:p>
@@ -1958,10 +1958,10 @@
           <w:tcPr>
             <w:shd w:val="clear" w:fill="FFF9F2"/>
             <w:tcBorders>
-              <w:top w:val="single" w:sz="8" w:space="0" w:color="D9CFC0"/>
-              <w:left w:val="single" w:sz="8" w:space="0" w:color="D9CFC0"/>
-              <w:bottom w:val="single" w:sz="8" w:space="0" w:color="D9CFC0"/>
-              <w:right w:val="single" w:sz="8" w:space="0" w:color="D9CFC0"/>
+              <w:top w:val="single" w:sz="8" w:space="0" w:color="000000"/>
+              <w:left w:val="single" w:sz="8" w:space="0" w:color="000000"/>
+              <w:bottom w:val="single" w:sz="8" w:space="0" w:color="000000"/>
+              <w:right w:val="single" w:sz="8" w:space="0" w:color="000000"/>
             </w:tcBorders>
           </w:tcPr>
           <w:p>
@@ -1971,7 +1971,7 @@
             </w:pPr>
             <w:r>
               <w:rPr/>
-              <w:t xml:space="preserve">✅ (tous)</w:t>
+              <w:t xml:space="preserve">✓ (tous)</w:t>
             </w:r>
           </w:p>
         </w:tc>
@@ -1979,10 +1979,10 @@
           <w:tcPr>
             <w:shd w:val="clear" w:fill="FFF9F2"/>
             <w:tcBorders>
-              <w:top w:val="single" w:sz="8" w:space="0" w:color="D9CFC0"/>
-              <w:left w:val="single" w:sz="8" w:space="0" w:color="D9CFC0"/>
-              <w:bottom w:val="single" w:sz="8" w:space="0" w:color="D9CFC0"/>
-              <w:right w:val="single" w:sz="8" w:space="0" w:color="D9CFC0"/>
+              <w:top w:val="single" w:sz="8" w:space="0" w:color="000000"/>
+              <w:left w:val="single" w:sz="8" w:space="0" w:color="000000"/>
+              <w:bottom w:val="single" w:sz="8" w:space="0" w:color="000000"/>
+              <w:right w:val="single" w:sz="8" w:space="0" w:color="000000"/>
             </w:tcBorders>
           </w:tcPr>
           <w:p>
@@ -1992,7 +1992,7 @@
             </w:pPr>
             <w:r>
               <w:rPr/>
-              <w:t xml:space="preserve">✅ (tous)</w:t>
+              <w:t xml:space="preserve">✓ (tous)</w:t>
             </w:r>
           </w:p>
         </w:tc>
@@ -2000,10 +2000,10 @@
           <w:tcPr>
             <w:shd w:val="clear" w:fill="FFF9F2"/>
             <w:tcBorders>
-              <w:top w:val="single" w:sz="8" w:space="0" w:color="D9CFC0"/>
-              <w:left w:val="single" w:sz="8" w:space="0" w:color="D9CFC0"/>
-              <w:bottom w:val="single" w:sz="8" w:space="0" w:color="D9CFC0"/>
-              <w:right w:val="single" w:sz="8" w:space="0" w:color="D9CFC0"/>
+              <w:top w:val="single" w:sz="8" w:space="0" w:color="000000"/>
+              <w:left w:val="single" w:sz="8" w:space="0" w:color="000000"/>
+              <w:bottom w:val="single" w:sz="8" w:space="0" w:color="000000"/>
+              <w:right w:val="single" w:sz="8" w:space="0" w:color="000000"/>
             </w:tcBorders>
           </w:tcPr>
           <w:p>
@@ -2013,7 +2013,7 @@
             </w:pPr>
             <w:r>
               <w:rPr/>
-              <w:t xml:space="preserve">✅ (tous)</w:t>
+              <w:t xml:space="preserve">✓ (tous)</w:t>
             </w:r>
           </w:p>
         </w:tc>
@@ -2021,10 +2021,10 @@
           <w:tcPr>
             <w:shd w:val="clear" w:fill="FFF9F2"/>
             <w:tcBorders>
-              <w:top w:val="single" w:sz="8" w:space="0" w:color="D9CFC0"/>
-              <w:left w:val="single" w:sz="8" w:space="0" w:color="D9CFC0"/>
-              <w:bottom w:val="single" w:sz="8" w:space="0" w:color="D9CFC0"/>
-              <w:right w:val="single" w:sz="8" w:space="0" w:color="D9CFC0"/>
+              <w:top w:val="single" w:sz="8" w:space="0" w:color="000000"/>
+              <w:left w:val="single" w:sz="8" w:space="0" w:color="000000"/>
+              <w:bottom w:val="single" w:sz="8" w:space="0" w:color="000000"/>
+              <w:right w:val="single" w:sz="8" w:space="0" w:color="000000"/>
             </w:tcBorders>
           </w:tcPr>
           <w:p>
@@ -2034,7 +2034,7 @@
             </w:pPr>
             <w:r>
               <w:rPr/>
-              <w:t xml:space="preserve">✅ (</w:t>
+              <w:t xml:space="preserve">✓ (</w:t>
             </w:r>
           </w:p>
           <w:p>
@@ -2069,10 +2069,10 @@
           <w:tcPr>
             <w:shd w:val="clear" w:fill="FFFFFF"/>
             <w:tcBorders>
-              <w:top w:val="single" w:sz="8" w:space="0" w:color="D9CFC0"/>
-              <w:left w:val="single" w:sz="8" w:space="0" w:color="D9CFC0"/>
-              <w:bottom w:val="single" w:sz="8" w:space="0" w:color="D9CFC0"/>
-              <w:right w:val="single" w:sz="8" w:space="0" w:color="D9CFC0"/>
+              <w:top w:val="single" w:sz="8" w:space="0" w:color="000000"/>
+              <w:left w:val="single" w:sz="8" w:space="0" w:color="000000"/>
+              <w:bottom w:val="single" w:sz="8" w:space="0" w:color="000000"/>
+              <w:right w:val="single" w:sz="8" w:space="0" w:color="000000"/>
             </w:tcBorders>
           </w:tcPr>
           <w:p>
@@ -2090,10 +2090,10 @@
           <w:tcPr>
             <w:shd w:val="clear" w:fill="FFFFFF"/>
             <w:tcBorders>
-              <w:top w:val="single" w:sz="8" w:space="0" w:color="D9CFC0"/>
-              <w:left w:val="single" w:sz="8" w:space="0" w:color="D9CFC0"/>
-              <w:bottom w:val="single" w:sz="8" w:space="0" w:color="D9CFC0"/>
-              <w:right w:val="single" w:sz="8" w:space="0" w:color="D9CFC0"/>
+              <w:top w:val="single" w:sz="8" w:space="0" w:color="000000"/>
+              <w:left w:val="single" w:sz="8" w:space="0" w:color="000000"/>
+              <w:bottom w:val="single" w:sz="8" w:space="0" w:color="000000"/>
+              <w:right w:val="single" w:sz="8" w:space="0" w:color="000000"/>
             </w:tcBorders>
           </w:tcPr>
           <w:p>
@@ -2103,7 +2103,7 @@
             </w:pPr>
             <w:r>
               <w:rPr/>
-              <w:t xml:space="preserve">✅</w:t>
+              <w:t xml:space="preserve">✓</w:t>
             </w:r>
           </w:p>
         </w:tc>
@@ -2111,10 +2111,10 @@
           <w:tcPr>
             <w:shd w:val="clear" w:fill="FFFFFF"/>
             <w:tcBorders>
-              <w:top w:val="single" w:sz="8" w:space="0" w:color="D9CFC0"/>
-              <w:left w:val="single" w:sz="8" w:space="0" w:color="D9CFC0"/>
-              <w:bottom w:val="single" w:sz="8" w:space="0" w:color="D9CFC0"/>
-              <w:right w:val="single" w:sz="8" w:space="0" w:color="D9CFC0"/>
+              <w:top w:val="single" w:sz="8" w:space="0" w:color="000000"/>
+              <w:left w:val="single" w:sz="8" w:space="0" w:color="000000"/>
+              <w:bottom w:val="single" w:sz="8" w:space="0" w:color="000000"/>
+              <w:right w:val="single" w:sz="8" w:space="0" w:color="000000"/>
             </w:tcBorders>
           </w:tcPr>
           <w:p>
@@ -2124,7 +2124,7 @@
             </w:pPr>
             <w:r>
               <w:rPr/>
-              <w:t xml:space="preserve">✅</w:t>
+              <w:t xml:space="preserve">✓</w:t>
             </w:r>
           </w:p>
         </w:tc>
@@ -2132,10 +2132,10 @@
           <w:tcPr>
             <w:shd w:val="clear" w:fill="FFFFFF"/>
             <w:tcBorders>
-              <w:top w:val="single" w:sz="8" w:space="0" w:color="D9CFC0"/>
-              <w:left w:val="single" w:sz="8" w:space="0" w:color="D9CFC0"/>
-              <w:bottom w:val="single" w:sz="8" w:space="0" w:color="D9CFC0"/>
-              <w:right w:val="single" w:sz="8" w:space="0" w:color="D9CFC0"/>
+              <w:top w:val="single" w:sz="8" w:space="0" w:color="000000"/>
+              <w:left w:val="single" w:sz="8" w:space="0" w:color="000000"/>
+              <w:bottom w:val="single" w:sz="8" w:space="0" w:color="000000"/>
+              <w:right w:val="single" w:sz="8" w:space="0" w:color="000000"/>
             </w:tcBorders>
           </w:tcPr>
           <w:p>
@@ -2145,7 +2145,7 @@
             </w:pPr>
             <w:r>
               <w:rPr/>
-              <w:t xml:space="preserve">✅</w:t>
+              <w:t xml:space="preserve">✓</w:t>
             </w:r>
           </w:p>
         </w:tc>
@@ -2153,10 +2153,10 @@
           <w:tcPr>
             <w:shd w:val="clear" w:fill="FFFFFF"/>
             <w:tcBorders>
-              <w:top w:val="single" w:sz="8" w:space="0" w:color="D9CFC0"/>
-              <w:left w:val="single" w:sz="8" w:space="0" w:color="D9CFC0"/>
-              <w:bottom w:val="single" w:sz="8" w:space="0" w:color="D9CFC0"/>
-              <w:right w:val="single" w:sz="8" w:space="0" w:color="D9CFC0"/>
+              <w:top w:val="single" w:sz="8" w:space="0" w:color="000000"/>
+              <w:left w:val="single" w:sz="8" w:space="0" w:color="000000"/>
+              <w:bottom w:val="single" w:sz="8" w:space="0" w:color="000000"/>
+              <w:right w:val="single" w:sz="8" w:space="0" w:color="000000"/>
             </w:tcBorders>
           </w:tcPr>
           <w:p>
@@ -2166,7 +2166,7 @@
             </w:pPr>
             <w:r>
               <w:rPr/>
-              <w:t xml:space="preserve">❌ masqué</w:t>
+              <w:t xml:space="preserve">✗ masqué</w:t>
             </w:r>
           </w:p>
         </w:tc>
@@ -2179,10 +2179,10 @@
           <w:tcPr>
             <w:shd w:val="clear" w:fill="FFF9F2"/>
             <w:tcBorders>
-              <w:top w:val="single" w:sz="8" w:space="0" w:color="D9CFC0"/>
-              <w:left w:val="single" w:sz="8" w:space="0" w:color="D9CFC0"/>
-              <w:bottom w:val="single" w:sz="8" w:space="0" w:color="D9CFC0"/>
-              <w:right w:val="single" w:sz="8" w:space="0" w:color="D9CFC0"/>
+              <w:top w:val="single" w:sz="8" w:space="0" w:color="000000"/>
+              <w:left w:val="single" w:sz="8" w:space="0" w:color="000000"/>
+              <w:bottom w:val="single" w:sz="8" w:space="0" w:color="000000"/>
+              <w:right w:val="single" w:sz="8" w:space="0" w:color="000000"/>
             </w:tcBorders>
           </w:tcPr>
           <w:p>
@@ -2200,10 +2200,10 @@
           <w:tcPr>
             <w:shd w:val="clear" w:fill="FFF9F2"/>
             <w:tcBorders>
-              <w:top w:val="single" w:sz="8" w:space="0" w:color="D9CFC0"/>
-              <w:left w:val="single" w:sz="8" w:space="0" w:color="D9CFC0"/>
-              <w:bottom w:val="single" w:sz="8" w:space="0" w:color="D9CFC0"/>
-              <w:right w:val="single" w:sz="8" w:space="0" w:color="D9CFC0"/>
+              <w:top w:val="single" w:sz="8" w:space="0" w:color="000000"/>
+              <w:left w:val="single" w:sz="8" w:space="0" w:color="000000"/>
+              <w:bottom w:val="single" w:sz="8" w:space="0" w:color="000000"/>
+              <w:right w:val="single" w:sz="8" w:space="0" w:color="000000"/>
             </w:tcBorders>
           </w:tcPr>
           <w:p>
@@ -2213,7 +2213,7 @@
             </w:pPr>
             <w:r>
               <w:rPr/>
-              <w:t xml:space="preserve">✅</w:t>
+              <w:t xml:space="preserve">✓</w:t>
             </w:r>
           </w:p>
         </w:tc>
@@ -2221,10 +2221,10 @@
           <w:tcPr>
             <w:shd w:val="clear" w:fill="FFF9F2"/>
             <w:tcBorders>
-              <w:top w:val="single" w:sz="8" w:space="0" w:color="D9CFC0"/>
-              <w:left w:val="single" w:sz="8" w:space="0" w:color="D9CFC0"/>
-              <w:bottom w:val="single" w:sz="8" w:space="0" w:color="D9CFC0"/>
-              <w:right w:val="single" w:sz="8" w:space="0" w:color="D9CFC0"/>
+              <w:top w:val="single" w:sz="8" w:space="0" w:color="000000"/>
+              <w:left w:val="single" w:sz="8" w:space="0" w:color="000000"/>
+              <w:bottom w:val="single" w:sz="8" w:space="0" w:color="000000"/>
+              <w:right w:val="single" w:sz="8" w:space="0" w:color="000000"/>
             </w:tcBorders>
           </w:tcPr>
           <w:p>
@@ -2234,7 +2234,7 @@
             </w:pPr>
             <w:r>
               <w:rPr/>
-              <w:t xml:space="preserve">❌</w:t>
+              <w:t xml:space="preserve">✗</w:t>
             </w:r>
           </w:p>
         </w:tc>
@@ -2242,10 +2242,10 @@
           <w:tcPr>
             <w:shd w:val="clear" w:fill="FFF9F2"/>
             <w:tcBorders>
-              <w:top w:val="single" w:sz="8" w:space="0" w:color="D9CFC0"/>
-              <w:left w:val="single" w:sz="8" w:space="0" w:color="D9CFC0"/>
-              <w:bottom w:val="single" w:sz="8" w:space="0" w:color="D9CFC0"/>
-              <w:right w:val="single" w:sz="8" w:space="0" w:color="D9CFC0"/>
+              <w:top w:val="single" w:sz="8" w:space="0" w:color="000000"/>
+              <w:left w:val="single" w:sz="8" w:space="0" w:color="000000"/>
+              <w:bottom w:val="single" w:sz="8" w:space="0" w:color="000000"/>
+              <w:right w:val="single" w:sz="8" w:space="0" w:color="000000"/>
             </w:tcBorders>
           </w:tcPr>
           <w:p>
@@ -2255,7 +2255,7 @@
             </w:pPr>
             <w:r>
               <w:rPr/>
-              <w:t xml:space="preserve">❌</w:t>
+              <w:t xml:space="preserve">✗</w:t>
             </w:r>
           </w:p>
         </w:tc>
@@ -2263,10 +2263,10 @@
           <w:tcPr>
             <w:shd w:val="clear" w:fill="FFF9F2"/>
             <w:tcBorders>
-              <w:top w:val="single" w:sz="8" w:space="0" w:color="D9CFC0"/>
-              <w:left w:val="single" w:sz="8" w:space="0" w:color="D9CFC0"/>
-              <w:bottom w:val="single" w:sz="8" w:space="0" w:color="D9CFC0"/>
-              <w:right w:val="single" w:sz="8" w:space="0" w:color="D9CFC0"/>
+              <w:top w:val="single" w:sz="8" w:space="0" w:color="000000"/>
+              <w:left w:val="single" w:sz="8" w:space="0" w:color="000000"/>
+              <w:bottom w:val="single" w:sz="8" w:space="0" w:color="000000"/>
+              <w:right w:val="single" w:sz="8" w:space="0" w:color="000000"/>
             </w:tcBorders>
           </w:tcPr>
           <w:p>
@@ -2276,7 +2276,7 @@
             </w:pPr>
             <w:r>
               <w:rPr/>
-              <w:t xml:space="preserve">❌</w:t>
+              <w:t xml:space="preserve">✗</w:t>
             </w:r>
           </w:p>
         </w:tc>
@@ -2289,10 +2289,10 @@
           <w:tcPr>
             <w:shd w:val="clear" w:fill="FFFFFF"/>
             <w:tcBorders>
-              <w:top w:val="single" w:sz="8" w:space="0" w:color="D9CFC0"/>
-              <w:left w:val="single" w:sz="8" w:space="0" w:color="D9CFC0"/>
-              <w:bottom w:val="single" w:sz="8" w:space="0" w:color="D9CFC0"/>
-              <w:right w:val="single" w:sz="8" w:space="0" w:color="D9CFC0"/>
+              <w:top w:val="single" w:sz="8" w:space="0" w:color="000000"/>
+              <w:left w:val="single" w:sz="8" w:space="0" w:color="000000"/>
+              <w:bottom w:val="single" w:sz="8" w:space="0" w:color="000000"/>
+              <w:right w:val="single" w:sz="8" w:space="0" w:color="000000"/>
             </w:tcBorders>
           </w:tcPr>
           <w:p>
@@ -2310,10 +2310,10 @@
           <w:tcPr>
             <w:shd w:val="clear" w:fill="FFFFFF"/>
             <w:tcBorders>
-              <w:top w:val="single" w:sz="8" w:space="0" w:color="D9CFC0"/>
-              <w:left w:val="single" w:sz="8" w:space="0" w:color="D9CFC0"/>
-              <w:bottom w:val="single" w:sz="8" w:space="0" w:color="D9CFC0"/>
-              <w:right w:val="single" w:sz="8" w:space="0" w:color="D9CFC0"/>
+              <w:top w:val="single" w:sz="8" w:space="0" w:color="000000"/>
+              <w:left w:val="single" w:sz="8" w:space="0" w:color="000000"/>
+              <w:bottom w:val="single" w:sz="8" w:space="0" w:color="000000"/>
+              <w:right w:val="single" w:sz="8" w:space="0" w:color="000000"/>
             </w:tcBorders>
           </w:tcPr>
           <w:p>
@@ -2323,7 +2323,7 @@
             </w:pPr>
             <w:r>
               <w:rPr/>
-              <w:t xml:space="preserve">✅</w:t>
+              <w:t xml:space="preserve">✓</w:t>
             </w:r>
           </w:p>
         </w:tc>
@@ -2331,10 +2331,10 @@
           <w:tcPr>
             <w:shd w:val="clear" w:fill="FFFFFF"/>
             <w:tcBorders>
-              <w:top w:val="single" w:sz="8" w:space="0" w:color="D9CFC0"/>
-              <w:left w:val="single" w:sz="8" w:space="0" w:color="D9CFC0"/>
-              <w:bottom w:val="single" w:sz="8" w:space="0" w:color="D9CFC0"/>
-              <w:right w:val="single" w:sz="8" w:space="0" w:color="D9CFC0"/>
+              <w:top w:val="single" w:sz="8" w:space="0" w:color="000000"/>
+              <w:left w:val="single" w:sz="8" w:space="0" w:color="000000"/>
+              <w:bottom w:val="single" w:sz="8" w:space="0" w:color="000000"/>
+              <w:right w:val="single" w:sz="8" w:space="0" w:color="000000"/>
             </w:tcBorders>
           </w:tcPr>
           <w:p>
@@ -2344,7 +2344,7 @@
             </w:pPr>
             <w:r>
               <w:rPr/>
-              <w:t xml:space="preserve">❌</w:t>
+              <w:t xml:space="preserve">✗</w:t>
             </w:r>
           </w:p>
         </w:tc>
@@ -2352,10 +2352,10 @@
           <w:tcPr>
             <w:shd w:val="clear" w:fill="FFFFFF"/>
             <w:tcBorders>
-              <w:top w:val="single" w:sz="8" w:space="0" w:color="D9CFC0"/>
-              <w:left w:val="single" w:sz="8" w:space="0" w:color="D9CFC0"/>
-              <w:bottom w:val="single" w:sz="8" w:space="0" w:color="D9CFC0"/>
-              <w:right w:val="single" w:sz="8" w:space="0" w:color="D9CFC0"/>
+              <w:top w:val="single" w:sz="8" w:space="0" w:color="000000"/>
+              <w:left w:val="single" w:sz="8" w:space="0" w:color="000000"/>
+              <w:bottom w:val="single" w:sz="8" w:space="0" w:color="000000"/>
+              <w:right w:val="single" w:sz="8" w:space="0" w:color="000000"/>
             </w:tcBorders>
           </w:tcPr>
           <w:p>
@@ -2365,7 +2365,7 @@
             </w:pPr>
             <w:r>
               <w:rPr/>
-              <w:t xml:space="preserve">❌</w:t>
+              <w:t xml:space="preserve">✗</w:t>
             </w:r>
           </w:p>
         </w:tc>
@@ -2373,10 +2373,10 @@
           <w:tcPr>
             <w:shd w:val="clear" w:fill="FFFFFF"/>
             <w:tcBorders>
-              <w:top w:val="single" w:sz="8" w:space="0" w:color="D9CFC0"/>
-              <w:left w:val="single" w:sz="8" w:space="0" w:color="D9CFC0"/>
-              <w:bottom w:val="single" w:sz="8" w:space="0" w:color="D9CFC0"/>
-              <w:right w:val="single" w:sz="8" w:space="0" w:color="D9CFC0"/>
+              <w:top w:val="single" w:sz="8" w:space="0" w:color="000000"/>
+              <w:left w:val="single" w:sz="8" w:space="0" w:color="000000"/>
+              <w:bottom w:val="single" w:sz="8" w:space="0" w:color="000000"/>
+              <w:right w:val="single" w:sz="8" w:space="0" w:color="000000"/>
             </w:tcBorders>
           </w:tcPr>
           <w:p>
@@ -2386,7 +2386,7 @@
             </w:pPr>
             <w:r>
               <w:rPr/>
-              <w:t xml:space="preserve">❌</w:t>
+              <w:t xml:space="preserve">✗</w:t>
             </w:r>
           </w:p>
         </w:tc>
@@ -2399,10 +2399,10 @@
           <w:tcPr>
             <w:shd w:val="clear" w:fill="FFF9F2"/>
             <w:tcBorders>
-              <w:top w:val="single" w:sz="8" w:space="0" w:color="D9CFC0"/>
-              <w:left w:val="single" w:sz="8" w:space="0" w:color="D9CFC0"/>
-              <w:bottom w:val="single" w:sz="8" w:space="0" w:color="D9CFC0"/>
-              <w:right w:val="single" w:sz="8" w:space="0" w:color="D9CFC0"/>
+              <w:top w:val="single" w:sz="8" w:space="0" w:color="000000"/>
+              <w:left w:val="single" w:sz="8" w:space="0" w:color="000000"/>
+              <w:bottom w:val="single" w:sz="8" w:space="0" w:color="000000"/>
+              <w:right w:val="single" w:sz="8" w:space="0" w:color="000000"/>
             </w:tcBorders>
           </w:tcPr>
           <w:p>
@@ -2432,10 +2432,10 @@
           <w:tcPr>
             <w:shd w:val="clear" w:fill="FFF9F2"/>
             <w:tcBorders>
-              <w:top w:val="single" w:sz="8" w:space="0" w:color="D9CFC0"/>
-              <w:left w:val="single" w:sz="8" w:space="0" w:color="D9CFC0"/>
-              <w:bottom w:val="single" w:sz="8" w:space="0" w:color="D9CFC0"/>
-              <w:right w:val="single" w:sz="8" w:space="0" w:color="D9CFC0"/>
+              <w:top w:val="single" w:sz="8" w:space="0" w:color="000000"/>
+              <w:left w:val="single" w:sz="8" w:space="0" w:color="000000"/>
+              <w:bottom w:val="single" w:sz="8" w:space="0" w:color="000000"/>
+              <w:right w:val="single" w:sz="8" w:space="0" w:color="000000"/>
             </w:tcBorders>
           </w:tcPr>
           <w:p>
@@ -2445,7 +2445,7 @@
             </w:pPr>
             <w:r>
               <w:rPr/>
-              <w:t xml:space="preserve">✅</w:t>
+              <w:t xml:space="preserve">✓</w:t>
             </w:r>
           </w:p>
         </w:tc>
@@ -2453,10 +2453,10 @@
           <w:tcPr>
             <w:shd w:val="clear" w:fill="FFF9F2"/>
             <w:tcBorders>
-              <w:top w:val="single" w:sz="8" w:space="0" w:color="D9CFC0"/>
-              <w:left w:val="single" w:sz="8" w:space="0" w:color="D9CFC0"/>
-              <w:bottom w:val="single" w:sz="8" w:space="0" w:color="D9CFC0"/>
-              <w:right w:val="single" w:sz="8" w:space="0" w:color="D9CFC0"/>
+              <w:top w:val="single" w:sz="8" w:space="0" w:color="000000"/>
+              <w:left w:val="single" w:sz="8" w:space="0" w:color="000000"/>
+              <w:bottom w:val="single" w:sz="8" w:space="0" w:color="000000"/>
+              <w:right w:val="single" w:sz="8" w:space="0" w:color="000000"/>
             </w:tcBorders>
           </w:tcPr>
           <w:p>
@@ -2466,7 +2466,7 @@
             </w:pPr>
             <w:r>
               <w:rPr/>
-              <w:t xml:space="preserve">❌</w:t>
+              <w:t xml:space="preserve">✗</w:t>
             </w:r>
           </w:p>
         </w:tc>
@@ -2474,10 +2474,10 @@
           <w:tcPr>
             <w:shd w:val="clear" w:fill="FFF9F2"/>
             <w:tcBorders>
-              <w:top w:val="single" w:sz="8" w:space="0" w:color="D9CFC0"/>
-              <w:left w:val="single" w:sz="8" w:space="0" w:color="D9CFC0"/>
-              <w:bottom w:val="single" w:sz="8" w:space="0" w:color="D9CFC0"/>
-              <w:right w:val="single" w:sz="8" w:space="0" w:color="D9CFC0"/>
+              <w:top w:val="single" w:sz="8" w:space="0" w:color="000000"/>
+              <w:left w:val="single" w:sz="8" w:space="0" w:color="000000"/>
+              <w:bottom w:val="single" w:sz="8" w:space="0" w:color="000000"/>
+              <w:right w:val="single" w:sz="8" w:space="0" w:color="000000"/>
             </w:tcBorders>
           </w:tcPr>
           <w:p>
@@ -2487,7 +2487,7 @@
             </w:pPr>
             <w:r>
               <w:rPr/>
-              <w:t xml:space="preserve">❌</w:t>
+              <w:t xml:space="preserve">✗</w:t>
             </w:r>
           </w:p>
         </w:tc>
@@ -2495,10 +2495,10 @@
           <w:tcPr>
             <w:shd w:val="clear" w:fill="FFF9F2"/>
             <w:tcBorders>
-              <w:top w:val="single" w:sz="8" w:space="0" w:color="D9CFC0"/>
-              <w:left w:val="single" w:sz="8" w:space="0" w:color="D9CFC0"/>
-              <w:bottom w:val="single" w:sz="8" w:space="0" w:color="D9CFC0"/>
-              <w:right w:val="single" w:sz="8" w:space="0" w:color="D9CFC0"/>
+              <w:top w:val="single" w:sz="8" w:space="0" w:color="000000"/>
+              <w:left w:val="single" w:sz="8" w:space="0" w:color="000000"/>
+              <w:bottom w:val="single" w:sz="8" w:space="0" w:color="000000"/>
+              <w:right w:val="single" w:sz="8" w:space="0" w:color="000000"/>
             </w:tcBorders>
           </w:tcPr>
           <w:p>
@@ -2508,7 +2508,7 @@
             </w:pPr>
             <w:r>
               <w:rPr/>
-              <w:t xml:space="preserve">❌</w:t>
+              <w:t xml:space="preserve">✗</w:t>
             </w:r>
           </w:p>
         </w:tc>
@@ -2521,10 +2521,10 @@
           <w:tcPr>
             <w:shd w:val="clear" w:fill="FFFFFF"/>
             <w:tcBorders>
-              <w:top w:val="single" w:sz="8" w:space="0" w:color="D9CFC0"/>
-              <w:left w:val="single" w:sz="8" w:space="0" w:color="D9CFC0"/>
-              <w:bottom w:val="single" w:sz="8" w:space="0" w:color="D9CFC0"/>
-              <w:right w:val="single" w:sz="8" w:space="0" w:color="D9CFC0"/>
+              <w:top w:val="single" w:sz="8" w:space="0" w:color="000000"/>
+              <w:left w:val="single" w:sz="8" w:space="0" w:color="000000"/>
+              <w:bottom w:val="single" w:sz="8" w:space="0" w:color="000000"/>
+              <w:right w:val="single" w:sz="8" w:space="0" w:color="000000"/>
             </w:tcBorders>
           </w:tcPr>
           <w:p>
@@ -2542,10 +2542,10 @@
           <w:tcPr>
             <w:shd w:val="clear" w:fill="FFFFFF"/>
             <w:tcBorders>
-              <w:top w:val="single" w:sz="8" w:space="0" w:color="D9CFC0"/>
-              <w:left w:val="single" w:sz="8" w:space="0" w:color="D9CFC0"/>
-              <w:bottom w:val="single" w:sz="8" w:space="0" w:color="D9CFC0"/>
-              <w:right w:val="single" w:sz="8" w:space="0" w:color="D9CFC0"/>
+              <w:top w:val="single" w:sz="8" w:space="0" w:color="000000"/>
+              <w:left w:val="single" w:sz="8" w:space="0" w:color="000000"/>
+              <w:bottom w:val="single" w:sz="8" w:space="0" w:color="000000"/>
+              <w:right w:val="single" w:sz="8" w:space="0" w:color="000000"/>
             </w:tcBorders>
           </w:tcPr>
           <w:p>
@@ -2555,7 +2555,7 @@
             </w:pPr>
             <w:r>
               <w:rPr/>
-              <w:t xml:space="preserve">✅</w:t>
+              <w:t xml:space="preserve">✓</w:t>
             </w:r>
           </w:p>
         </w:tc>
@@ -2563,10 +2563,10 @@
           <w:tcPr>
             <w:shd w:val="clear" w:fill="FFFFFF"/>
             <w:tcBorders>
-              <w:top w:val="single" w:sz="8" w:space="0" w:color="D9CFC0"/>
-              <w:left w:val="single" w:sz="8" w:space="0" w:color="D9CFC0"/>
-              <w:bottom w:val="single" w:sz="8" w:space="0" w:color="D9CFC0"/>
-              <w:right w:val="single" w:sz="8" w:space="0" w:color="D9CFC0"/>
+              <w:top w:val="single" w:sz="8" w:space="0" w:color="000000"/>
+              <w:left w:val="single" w:sz="8" w:space="0" w:color="000000"/>
+              <w:bottom w:val="single" w:sz="8" w:space="0" w:color="000000"/>
+              <w:right w:val="single" w:sz="8" w:space="0" w:color="000000"/>
             </w:tcBorders>
           </w:tcPr>
           <w:p>
@@ -2576,7 +2576,7 @@
             </w:pPr>
             <w:r>
               <w:rPr/>
-              <w:t xml:space="preserve">❌</w:t>
+              <w:t xml:space="preserve">✗</w:t>
             </w:r>
           </w:p>
         </w:tc>
@@ -2584,10 +2584,10 @@
           <w:tcPr>
             <w:shd w:val="clear" w:fill="FFFFFF"/>
             <w:tcBorders>
-              <w:top w:val="single" w:sz="8" w:space="0" w:color="D9CFC0"/>
-              <w:left w:val="single" w:sz="8" w:space="0" w:color="D9CFC0"/>
-              <w:bottom w:val="single" w:sz="8" w:space="0" w:color="D9CFC0"/>
-              <w:right w:val="single" w:sz="8" w:space="0" w:color="D9CFC0"/>
+              <w:top w:val="single" w:sz="8" w:space="0" w:color="000000"/>
+              <w:left w:val="single" w:sz="8" w:space="0" w:color="000000"/>
+              <w:bottom w:val="single" w:sz="8" w:space="0" w:color="000000"/>
+              <w:right w:val="single" w:sz="8" w:space="0" w:color="000000"/>
             </w:tcBorders>
           </w:tcPr>
           <w:p>
@@ -2597,7 +2597,7 @@
             </w:pPr>
             <w:r>
               <w:rPr/>
-              <w:t xml:space="preserve">❌</w:t>
+              <w:t xml:space="preserve">✗</w:t>
             </w:r>
           </w:p>
         </w:tc>
@@ -2605,10 +2605,10 @@
           <w:tcPr>
             <w:shd w:val="clear" w:fill="FFFFFF"/>
             <w:tcBorders>
-              <w:top w:val="single" w:sz="8" w:space="0" w:color="D9CFC0"/>
-              <w:left w:val="single" w:sz="8" w:space="0" w:color="D9CFC0"/>
-              <w:bottom w:val="single" w:sz="8" w:space="0" w:color="D9CFC0"/>
-              <w:right w:val="single" w:sz="8" w:space="0" w:color="D9CFC0"/>
+              <w:top w:val="single" w:sz="8" w:space="0" w:color="000000"/>
+              <w:left w:val="single" w:sz="8" w:space="0" w:color="000000"/>
+              <w:bottom w:val="single" w:sz="8" w:space="0" w:color="000000"/>
+              <w:right w:val="single" w:sz="8" w:space="0" w:color="000000"/>
             </w:tcBorders>
           </w:tcPr>
           <w:p>
@@ -2618,7 +2618,7 @@
             </w:pPr>
             <w:r>
               <w:rPr/>
-              <w:t xml:space="preserve">❌</w:t>
+              <w:t xml:space="preserve">✗</w:t>
             </w:r>
           </w:p>
         </w:tc>
@@ -2659,14 +2659,14 @@
         <w:rPr/>
         <w:drawing>
           <wp:inline distB="0" distL="0" distR="0" distT="0">
-            <wp:extent cx="6502400" cy="4064000"/>
+            <wp:extent cx="5715000" cy="3571875"/>
             <wp:effectExtent b="0" l="0" r="0" t="0"/>
-            <wp:docPr id="4" name="image-zJozfuE3pxOMk6GHcs0ic.png"/>
+            <wp:docPr id="4" name="image-QGiGy1aYTcPtoaHvbePwB.png"/>
             <a:graphic>
               <a:graphicData uri="http://schemas.openxmlformats.org/drawingml/2006/picture">
                 <pic:pic>
                   <pic:nvPicPr>
-                    <pic:cNvPr id="4" name="image-zJozfuE3pxOMk6GHcs0ic.png" descr="Tableau de bord"/>
+                    <pic:cNvPr id="4" name="image-QGiGy1aYTcPtoaHvbePwB.png" descr="Tableau de bord"/>
                     <pic:cNvPicPr/>
                   </pic:nvPicPr>
                   <pic:blipFill>
@@ -2679,7 +2679,7 @@
                   <pic:spPr>
                     <a:xfrm>
                       <a:off x="0" y="0"/>
-                      <a:ext cx="6502400" cy="4064000"/>
+                      <a:ext cx="5715000" cy="3571875"/>
                     </a:xfrm>
                     <a:prstGeom prst="rect"/>
                   </pic:spPr>
@@ -2693,14 +2693,14 @@
         <w:rPr/>
         <w:drawing>
           <wp:inline distB="0" distL="0" distR="0" distT="0">
-            <wp:extent cx="6502400" cy="4064000"/>
+            <wp:extent cx="5715000" cy="3571875"/>
             <wp:effectExtent b="0" l="0" r="0" t="0"/>
-            <wp:docPr id="5" name="image-HuuxXbQRNd2gOpuer7wkB.png"/>
+            <wp:docPr id="5" name="image-YXhTZg8tmVqh36J6tOpRM.png"/>
             <a:graphic>
               <a:graphicData uri="http://schemas.openxmlformats.org/drawingml/2006/picture">
                 <pic:pic>
                   <pic:nvPicPr>
-                    <pic:cNvPr id="5" name="image-HuuxXbQRNd2gOpuer7wkB.png" descr="Tableau de bord — habillage Premium"/>
+                    <pic:cNvPr id="5" name="image-YXhTZg8tmVqh36J6tOpRM.png" descr="Tableau de bord — habillage Premium"/>
                     <pic:cNvPicPr/>
                   </pic:nvPicPr>
                   <pic:blipFill>
@@ -2713,7 +2713,7 @@
                   <pic:spPr>
                     <a:xfrm>
                       <a:off x="0" y="0"/>
-                      <a:ext cx="6502400" cy="4064000"/>
+                      <a:ext cx="5715000" cy="3571875"/>
                     </a:xfrm>
                     <a:prstGeom prst="rect"/>
                   </pic:spPr>
@@ -2730,7 +2730,55 @@
       </w:pPr>
       <w:r>
         <w:rPr/>
-        <w:t xml:space="preserve">Vue d'ensemble à l'ouverture de l'application : nombre d'élèves, répartition par statut d'accès, paiements récents, résumé des passages du jour. Le même écran s'affiche pour tous les rôles connectés (le contenu s'adapte selon ce que le rôle est autorisé à voir).</w:t>
+        <w:t xml:space="preserve">Vue d'ensemble à l'ouverture de l'application : nombre d'élèves, répartition par statut d'accès, paiements récents, résumé des passages du jour.</w:t>
+      </w:r>
+    </w:p>
+    <w:p>
+      <w:pPr>
+        <w:numPr>
+          <w:ilvl w:val="0"/>
+          <w:numId w:val="5"/>
+        </w:numPr>
+        <w:spacing w:lineRule="auto"/>
+      </w:pPr>
+      <w:r>
+        <w:rPr>
+          <w:b/>
+        </w:rPr>
+        <w:t xml:space="preserve">Administrateur / gestionnaire / caissier</w:t>
+      </w:r>
+      <w:r>
+        <w:rPr/>
+        <w:t xml:space="preserve"> : les chiffres portent sur l'ensemble des élèves.</w:t>
+      </w:r>
+    </w:p>
+    <w:p>
+      <w:pPr>
+        <w:numPr>
+          <w:ilvl w:val="0"/>
+          <w:numId w:val="5"/>
+        </w:numPr>
+        <w:spacing w:lineRule="auto"/>
+      </w:pPr>
+      <w:r>
+        <w:rPr>
+          <w:b/>
+        </w:rPr>
+        <w:t xml:space="preserve">Parent</w:t>
+      </w:r>
+      <w:r>
+        <w:rPr/>
+        <w:t xml:space="preserve"> : les mêmes indicateurs (établissements, élèves, statuts, passages, paiements) portent uniquement sur </w:t>
+      </w:r>
+      <w:r>
+        <w:rPr>
+          <w:b/>
+        </w:rPr>
+        <w:t xml:space="preserve">ses propres enfants</w:t>
+      </w:r>
+      <w:r>
+        <w:rPr/>
+        <w:t xml:space="preserve"> — un parent d'un seul enfant verra par exemple « 1 élève », pas le total de l'établissement. Un parent qui n'a encore aucun enfant rattaché voit des indicateurs à zéro.</w:t>
       </w:r>
     </w:p>
     <w:p>
@@ -2751,14 +2799,14 @@
         <w:rPr/>
         <w:drawing>
           <wp:inline distB="0" distL="0" distR="0" distT="0">
-            <wp:extent cx="6502400" cy="4064000"/>
+            <wp:extent cx="5715000" cy="3571875"/>
             <wp:effectExtent b="0" l="0" r="0" t="0"/>
-            <wp:docPr id="6" name="image-txTkoTDhOP-bev-JbvJwa.png"/>
+            <wp:docPr id="6" name="image-lKD5c_Ag2nr3OygUBKqei.png"/>
             <a:graphic>
               <a:graphicData uri="http://schemas.openxmlformats.org/drawingml/2006/picture">
                 <pic:pic>
                   <pic:nvPicPr>
-                    <pic:cNvPr id="6" name="image-txTkoTDhOP-bev-JbvJwa.png" descr="Liste des établissements"/>
+                    <pic:cNvPr id="6" name="image-lKD5c_Ag2nr3OygUBKqei.png" descr="Liste des établissements"/>
                     <pic:cNvPicPr/>
                   </pic:nvPicPr>
                   <pic:blipFill>
@@ -2771,7 +2819,7 @@
                   <pic:spPr>
                     <a:xfrm>
                       <a:off x="0" y="0"/>
-                      <a:ext cx="6502400" cy="4064000"/>
+                      <a:ext cx="5715000" cy="3571875"/>
                     </a:xfrm>
                     <a:prstGeom prst="rect"/>
                   </pic:spPr>
@@ -2786,7 +2834,7 @@
       <w:pPr>
         <w:numPr>
           <w:ilvl w:val="0"/>
-          <w:numId w:val="5"/>
+          <w:numId w:val="6"/>
         </w:numPr>
         <w:spacing w:lineRule="auto"/>
       </w:pPr>
@@ -2799,7 +2847,7 @@
       <w:pPr>
         <w:numPr>
           <w:ilvl w:val="0"/>
-          <w:numId w:val="5"/>
+          <w:numId w:val="6"/>
         </w:numPr>
         <w:spacing w:lineRule="auto"/>
       </w:pPr>
@@ -2820,7 +2868,7 @@
       <w:pPr>
         <w:numPr>
           <w:ilvl w:val="0"/>
-          <w:numId w:val="5"/>
+          <w:numId w:val="6"/>
         </w:numPr>
         <w:spacing w:lineRule="auto"/>
       </w:pPr>
@@ -2839,7 +2887,7 @@
       <w:pPr>
         <w:numPr>
           <w:ilvl w:val="0"/>
-          <w:numId w:val="5"/>
+          <w:numId w:val="6"/>
         </w:numPr>
         <w:spacing w:lineRule="auto"/>
       </w:pPr>
@@ -2866,14 +2914,14 @@
         <w:rPr/>
         <w:drawing>
           <wp:inline distB="0" distL="0" distR="0" distT="0">
-            <wp:extent cx="6502400" cy="4064000"/>
+            <wp:extent cx="5715000" cy="3571875"/>
             <wp:effectExtent b="0" l="0" r="0" t="0"/>
-            <wp:docPr id="7" name="image-4HMAN9R6yvWwWRl7ulr64.png"/>
+            <wp:docPr id="7" name="image-al8BPPPeQ5m42H3GOtiVp.png"/>
             <a:graphic>
               <a:graphicData uri="http://schemas.openxmlformats.org/drawingml/2006/picture">
                 <pic:pic>
                   <pic:nvPicPr>
-                    <pic:cNvPr id="7" name="image-4HMAN9R6yvWwWRl7ulr64.png" descr="Liste des élèves"/>
+                    <pic:cNvPr id="7" name="image-al8BPPPeQ5m42H3GOtiVp.png" descr="Liste des élèves"/>
                     <pic:cNvPicPr/>
                   </pic:nvPicPr>
                   <pic:blipFill>
@@ -2886,7 +2934,7 @@
                   <pic:spPr>
                     <a:xfrm>
                       <a:off x="0" y="0"/>
-                      <a:ext cx="6502400" cy="4064000"/>
+                      <a:ext cx="5715000" cy="3571875"/>
                     </a:xfrm>
                     <a:prstGeom prst="rect"/>
                   </pic:spPr>
@@ -2901,7 +2949,7 @@
       <w:pPr>
         <w:numPr>
           <w:ilvl w:val="0"/>
-          <w:numId w:val="6"/>
+          <w:numId w:val="7"/>
         </w:numPr>
         <w:spacing w:lineRule="auto"/>
       </w:pPr>
@@ -2914,7 +2962,7 @@
       <w:pPr>
         <w:numPr>
           <w:ilvl w:val="0"/>
-          <w:numId w:val="6"/>
+          <w:numId w:val="7"/>
         </w:numPr>
         <w:spacing w:lineRule="auto"/>
       </w:pPr>
@@ -2933,7 +2981,7 @@
       <w:pPr>
         <w:numPr>
           <w:ilvl w:val="0"/>
-          <w:numId w:val="6"/>
+          <w:numId w:val="7"/>
         </w:numPr>
         <w:spacing w:lineRule="auto"/>
       </w:pPr>
@@ -2952,7 +3000,7 @@
       <w:pPr>
         <w:numPr>
           <w:ilvl w:val="0"/>
-          <w:numId w:val="6"/>
+          <w:numId w:val="7"/>
         </w:numPr>
         <w:spacing w:lineRule="auto"/>
       </w:pPr>
@@ -2969,14 +3017,14 @@
         <w:rPr/>
         <w:drawing>
           <wp:inline distB="0" distL="0" distR="0" distT="0">
-            <wp:extent cx="6502400" cy="4064000"/>
+            <wp:extent cx="5715000" cy="3571875"/>
             <wp:effectExtent b="0" l="0" r="0" t="0"/>
-            <wp:docPr id="8" name="image-r9QiuVLOkV8d7ILGw66Hj.png"/>
+            <wp:docPr id="8" name="image-uuPSNdc6cGFUdYEuNpPRS.png"/>
             <a:graphic>
               <a:graphicData uri="http://schemas.openxmlformats.org/drawingml/2006/picture">
                 <pic:pic>
                   <pic:nvPicPr>
-                    <pic:cNvPr id="8" name="image-r9QiuVLOkV8d7ILGw66Hj.png" descr="Fiche élève — Informations générales"/>
+                    <pic:cNvPr id="8" name="image-uuPSNdc6cGFUdYEuNpPRS.png" descr="Fiche élève — Informations générales"/>
                     <pic:cNvPicPr/>
                   </pic:nvPicPr>
                   <pic:blipFill>
@@ -2989,7 +3037,7 @@
                   <pic:spPr>
                     <a:xfrm>
                       <a:off x="0" y="0"/>
-                      <a:ext cx="6502400" cy="4064000"/>
+                      <a:ext cx="5715000" cy="3571875"/>
                     </a:xfrm>
                     <a:prstGeom prst="rect"/>
                   </pic:spPr>
@@ -3003,14 +3051,14 @@
         <w:rPr/>
         <w:drawing>
           <wp:inline distB="0" distL="0" distR="0" distT="0">
-            <wp:extent cx="6502400" cy="4064000"/>
+            <wp:extent cx="5715000" cy="3571875"/>
             <wp:effectExtent b="0" l="0" r="0" t="0"/>
-            <wp:docPr id="9" name="image-vrdhaigpZFkt10tm17-He.png"/>
+            <wp:docPr id="9" name="image-M1j3S2vyLCgMGmvo1HutI.png"/>
             <a:graphic>
               <a:graphicData uri="http://schemas.openxmlformats.org/drawingml/2006/picture">
                 <pic:pic>
                   <pic:nvPicPr>
-                    <pic:cNvPr id="9" name="image-vrdhaigpZFkt10tm17-He.png" descr="Fiche élève — Cantine et affectation"/>
+                    <pic:cNvPr id="9" name="image-M1j3S2vyLCgMGmvo1HutI.png" descr="Fiche élève — Cantine et affectation"/>
                     <pic:cNvPicPr/>
                   </pic:nvPicPr>
                   <pic:blipFill>
@@ -3023,7 +3071,7 @@
                   <pic:spPr>
                     <a:xfrm>
                       <a:off x="0" y="0"/>
-                      <a:ext cx="6502400" cy="4064000"/>
+                      <a:ext cx="5715000" cy="3571875"/>
                     </a:xfrm>
                     <a:prstGeom prst="rect"/>
                   </pic:spPr>
@@ -3037,14 +3085,14 @@
         <w:rPr/>
         <w:drawing>
           <wp:inline distB="0" distL="0" distR="0" distT="0">
-            <wp:extent cx="6502400" cy="4064000"/>
+            <wp:extent cx="5715000" cy="3571875"/>
             <wp:effectExtent b="0" l="0" r="0" t="0"/>
-            <wp:docPr id="10" name="image-1lUmHYsXgmA_MRF6ljYgn.png"/>
+            <wp:docPr id="10" name="image-CEbJePa9ak7505ueXhWA7.png"/>
             <a:graphic>
               <a:graphicData uri="http://schemas.openxmlformats.org/drawingml/2006/picture">
                 <pic:pic>
                   <pic:nvPicPr>
-                    <pic:cNvPr id="10" name="image-1lUmHYsXgmA_MRF6ljYgn.png" descr="Fiche élève — Contacts et allergies"/>
+                    <pic:cNvPr id="10" name="image-CEbJePa9ak7505ueXhWA7.png" descr="Fiche élève — Contacts et allergies"/>
                     <pic:cNvPicPr/>
                   </pic:nvPicPr>
                   <pic:blipFill>
@@ -3057,7 +3105,7 @@
                   <pic:spPr>
                     <a:xfrm>
                       <a:off x="0" y="0"/>
-                      <a:ext cx="6502400" cy="4064000"/>
+                      <a:ext cx="5715000" cy="3571875"/>
                     </a:xfrm>
                     <a:prstGeom prst="rect"/>
                   </pic:spPr>
@@ -3072,49 +3120,13 @@
       <w:pPr>
         <w:numPr>
           <w:ilvl w:val="0"/>
-          <w:numId w:val="7"/>
+          <w:numId w:val="8"/>
         </w:numPr>
         <w:spacing w:lineRule="auto"/>
       </w:pPr>
       <w:r>
         <w:rPr/>
         <w:t xml:space="preserve">Chaque élève dispose d'un QR Code personnel : consultable, copiable, imprimable — c'est ce même QR Code qui est destiné à être imprimé sur un badge plastifié remis à l'élève (voir l'offre commerciale pour la fabrication des badges).</w:t>
-      </w:r>
-    </w:p>
-    <w:p>
-      <w:pPr>
-        <w:numPr>
-          <w:ilvl w:val="0"/>
-          <w:numId w:val="7"/>
-        </w:numPr>
-        <w:spacing w:lineRule="auto"/>
-      </w:pPr>
-      <w:r>
-        <w:rPr/>
-        <w:t xml:space="preserve">La suppression d'un élève est réservée à l'administrateur.</w:t>
-      </w:r>
-    </w:p>
-    <w:p>
-      <w:pPr>
-        <w:numPr>
-          <w:ilvl w:val="0"/>
-          <w:numId w:val="7"/>
-        </w:numPr>
-        <w:spacing w:lineRule="auto"/>
-      </w:pPr>
-      <w:r>
-        <w:rPr/>
-        <w:t xml:space="preserve">Ce menu n'est pas accessible à un parent (le parent ajoute ses propres enfants depuis « Mes enfants », §8).</w:t>
-      </w:r>
-    </w:p>
-    <w:p>
-      <w:pPr>
-        <w:pStyle w:val="Heading3"/>
-        <w:spacing w:lineRule="auto"/>
-      </w:pPr>
-      <w:r>
-        <w:rPr/>
-        <w:t xml:space="preserve">Allergies et certificat médical</w:t>
       </w:r>
     </w:p>
     <w:p>
@@ -3127,6 +3139,42 @@
       </w:pPr>
       <w:r>
         <w:rPr/>
+        <w:t xml:space="preserve">La suppression d'un élève est réservée à l'administrateur.</w:t>
+      </w:r>
+    </w:p>
+    <w:p>
+      <w:pPr>
+        <w:numPr>
+          <w:ilvl w:val="0"/>
+          <w:numId w:val="8"/>
+        </w:numPr>
+        <w:spacing w:lineRule="auto"/>
+      </w:pPr>
+      <w:r>
+        <w:rPr/>
+        <w:t xml:space="preserve">Ce menu n'est pas accessible à un parent (le parent ajoute ses propres enfants depuis « Mes enfants », §8).</w:t>
+      </w:r>
+    </w:p>
+    <w:p>
+      <w:pPr>
+        <w:pStyle w:val="Heading3"/>
+        <w:spacing w:lineRule="auto"/>
+      </w:pPr>
+      <w:r>
+        <w:rPr/>
+        <w:t xml:space="preserve">Allergies et certificat médical</w:t>
+      </w:r>
+    </w:p>
+    <w:p>
+      <w:pPr>
+        <w:numPr>
+          <w:ilvl w:val="0"/>
+          <w:numId w:val="9"/>
+        </w:numPr>
+        <w:spacing w:lineRule="auto"/>
+      </w:pPr>
+      <w:r>
+        <w:rPr/>
         <w:t xml:space="preserve">Le champ </w:t>
       </w:r>
       <w:r>
@@ -3154,7 +3202,7 @@
       <w:pPr>
         <w:numPr>
           <w:ilvl w:val="0"/>
-          <w:numId w:val="8"/>
+          <w:numId w:val="9"/>
         </w:numPr>
         <w:spacing w:lineRule="auto"/>
       </w:pPr>
@@ -3187,7 +3235,7 @@
       <w:pPr>
         <w:numPr>
           <w:ilvl w:val="0"/>
-          <w:numId w:val="8"/>
+          <w:numId w:val="9"/>
         </w:numPr>
         <w:spacing w:lineRule="auto"/>
       </w:pPr>
@@ -3219,7 +3267,7 @@
       <w:pPr>
         <w:numPr>
           <w:ilvl w:val="0"/>
-          <w:numId w:val="9"/>
+          <w:numId w:val="10"/>
         </w:numPr>
         <w:spacing w:lineRule="auto"/>
       </w:pPr>
@@ -3238,7 +3286,7 @@
       <w:pPr>
         <w:numPr>
           <w:ilvl w:val="0"/>
-          <w:numId w:val="9"/>
+          <w:numId w:val="10"/>
         </w:numPr>
         <w:spacing w:lineRule="auto"/>
       </w:pPr>
@@ -3257,7 +3305,7 @@
       <w:pPr>
         <w:numPr>
           <w:ilvl w:val="0"/>
-          <w:numId w:val="9"/>
+          <w:numId w:val="10"/>
         </w:numPr>
         <w:spacing w:lineRule="auto"/>
       </w:pPr>
@@ -3280,7 +3328,7 @@
       <w:pPr>
         <w:numPr>
           <w:ilvl w:val="0"/>
-          <w:numId w:val="9"/>
+          <w:numId w:val="10"/>
         </w:numPr>
         <w:spacing w:lineRule="auto"/>
       </w:pPr>
@@ -3317,14 +3365,14 @@
         <w:rPr/>
         <w:drawing>
           <wp:inline distB="0" distL="0" distR="0" distT="0">
-            <wp:extent cx="6502400" cy="4064000"/>
+            <wp:extent cx="5715000" cy="3571875"/>
             <wp:effectExtent b="0" l="0" r="0" t="0"/>
-            <wp:docPr id="11" name="image-NxhmA0LdMt6_Fq-eSyRyV.png"/>
+            <wp:docPr id="11" name="image-Sdl1-NCTiH_T5Ty_o5pZO.png"/>
             <a:graphic>
               <a:graphicData uri="http://schemas.openxmlformats.org/drawingml/2006/picture">
                 <pic:pic>
                   <pic:nvPicPr>
-                    <pic:cNvPr id="11" name="image-NxhmA0LdMt6_Fq-eSyRyV.png" descr="Écran des paiements"/>
+                    <pic:cNvPr id="11" name="image-Sdl1-NCTiH_T5Ty_o5pZO.png" descr="Écran des paiements"/>
                     <pic:cNvPicPr/>
                   </pic:nvPicPr>
                   <pic:blipFill>
@@ -3337,7 +3385,7 @@
                   <pic:spPr>
                     <a:xfrm>
                       <a:off x="0" y="0"/>
-                      <a:ext cx="6502400" cy="4064000"/>
+                      <a:ext cx="5715000" cy="3571875"/>
                     </a:xfrm>
                     <a:prstGeom prst="rect"/>
                   </pic:spPr>
@@ -3352,7 +3400,7 @@
       <w:pPr>
         <w:numPr>
           <w:ilvl w:val="0"/>
-          <w:numId w:val="10"/>
+          <w:numId w:val="11"/>
         </w:numPr>
         <w:spacing w:lineRule="auto"/>
       </w:pPr>
@@ -3371,7 +3419,7 @@
       <w:pPr>
         <w:numPr>
           <w:ilvl w:val="0"/>
-          <w:numId w:val="10"/>
+          <w:numId w:val="11"/>
         </w:numPr>
         <w:spacing w:lineRule="auto"/>
       </w:pPr>
@@ -3390,7 +3438,7 @@
       <w:pPr>
         <w:numPr>
           <w:ilvl w:val="0"/>
-          <w:numId w:val="10"/>
+          <w:numId w:val="11"/>
         </w:numPr>
         <w:spacing w:lineRule="auto"/>
       </w:pPr>
@@ -3419,7 +3467,7 @@
       <w:pPr>
         <w:numPr>
           <w:ilvl w:val="0"/>
-          <w:numId w:val="10"/>
+          <w:numId w:val="11"/>
         </w:numPr>
         <w:spacing w:lineRule="auto"/>
       </w:pPr>
@@ -3432,7 +3480,7 @@
       <w:pPr>
         <w:numPr>
           <w:ilvl w:val="0"/>
-          <w:numId w:val="10"/>
+          <w:numId w:val="11"/>
         </w:numPr>
         <w:spacing w:lineRule="auto"/>
       </w:pPr>
@@ -3451,7 +3499,7 @@
       <w:pPr>
         <w:numPr>
           <w:ilvl w:val="0"/>
-          <w:numId w:val="10"/>
+          <w:numId w:val="11"/>
         </w:numPr>
         <w:spacing w:lineRule="auto"/>
       </w:pPr>
@@ -3470,7 +3518,7 @@
       <w:pPr>
         <w:numPr>
           <w:ilvl w:val="0"/>
-          <w:numId w:val="10"/>
+          <w:numId w:val="11"/>
         </w:numPr>
         <w:spacing w:lineRule="auto"/>
       </w:pPr>
@@ -3518,14 +3566,14 @@
         <w:rPr/>
         <w:drawing>
           <wp:inline distB="0" distL="0" distR="0" distT="0">
-            <wp:extent cx="6502400" cy="4064000"/>
+            <wp:extent cx="5715000" cy="3571875"/>
             <wp:effectExtent b="0" l="0" r="0" t="0"/>
-            <wp:docPr id="12" name="image-nFVznAVYe7xgi7Vzv7OXf.png"/>
+            <wp:docPr id="12" name="image-q2eM7HaXIg7OgaAg0PHcY.png"/>
             <a:graphic>
               <a:graphicData uri="http://schemas.openxmlformats.org/drawingml/2006/picture">
                 <pic:pic>
                   <pic:nvPicPr>
-                    <pic:cNvPr id="12" name="image-nFVznAVYe7xgi7Vzv7OXf.png" descr="Écran de contrôle d'accès"/>
+                    <pic:cNvPr id="12" name="image-q2eM7HaXIg7OgaAg0PHcY.png" descr="Écran de contrôle d'accès"/>
                     <pic:cNvPicPr/>
                   </pic:nvPicPr>
                   <pic:blipFill>
@@ -3538,7 +3586,7 @@
                   <pic:spPr>
                     <a:xfrm>
                       <a:off x="0" y="0"/>
-                      <a:ext cx="6502400" cy="4064000"/>
+                      <a:ext cx="5715000" cy="3571875"/>
                     </a:xfrm>
                     <a:prstGeom prst="rect"/>
                   </pic:spPr>
@@ -3553,20 +3601,20 @@
       <w:pPr>
         <w:numPr>
           <w:ilvl w:val="0"/>
-          <w:numId w:val="11"/>
+          <w:numId w:val="12"/>
         </w:numPr>
         <w:spacing w:lineRule="auto"/>
       </w:pPr>
       <w:r>
         <w:rPr/>
-        <w:t xml:space="preserve">La lecture du QR Code d'un élève à l'entrée de la cantine confirme l'accès en moins d'une seconde : ✅ accès accordé ou ❌ accès refusé (avec le motif affiché).</w:t>
+        <w:t xml:space="preserve">La lecture du QR Code d'un élève à l'entrée de la cantine confirme l'accès en moins d'une seconde : ✓ accès accordé ou ✗ accès refusé (avec le motif affiché).</w:t>
       </w:r>
     </w:p>
     <w:p>
       <w:pPr>
         <w:numPr>
           <w:ilvl w:val="0"/>
-          <w:numId w:val="11"/>
+          <w:numId w:val="12"/>
         </w:numPr>
         <w:spacing w:lineRule="auto"/>
       </w:pPr>
@@ -3589,7 +3637,7 @@
       <w:pPr>
         <w:numPr>
           <w:ilvl w:val="0"/>
-          <w:numId w:val="11"/>
+          <w:numId w:val="12"/>
         </w:numPr>
         <w:spacing w:lineRule="auto"/>
       </w:pPr>
@@ -3602,7 +3650,7 @@
       <w:pPr>
         <w:numPr>
           <w:ilvl w:val="0"/>
-          <w:numId w:val="11"/>
+          <w:numId w:val="12"/>
         </w:numPr>
         <w:spacing w:lineRule="auto"/>
       </w:pPr>
@@ -3615,7 +3663,7 @@
       <w:pPr>
         <w:numPr>
           <w:ilvl w:val="0"/>
-          <w:numId w:val="11"/>
+          <w:numId w:val="12"/>
         </w:numPr>
         <w:spacing w:lineRule="auto"/>
       </w:pPr>
@@ -3642,14 +3690,14 @@
         <w:rPr/>
         <w:drawing>
           <wp:inline distB="0" distL="0" distR="0" distT="0">
-            <wp:extent cx="6502400" cy="4064000"/>
+            <wp:extent cx="5715000" cy="3571875"/>
             <wp:effectExtent b="0" l="0" r="0" t="0"/>
-            <wp:docPr id="13" name="image-DkZRdkn9JXI2vNksRCBRz.png"/>
+            <wp:docPr id="13" name="image-gG-67ZLvjR20PAVBfPwEz.png"/>
             <a:graphic>
               <a:graphicData uri="http://schemas.openxmlformats.org/drawingml/2006/picture">
                 <pic:pic>
                   <pic:nvPicPr>
-                    <pic:cNvPr id="13" name="image-DkZRdkn9JXI2vNksRCBRz.png" descr="Historique des passages"/>
+                    <pic:cNvPr id="13" name="image-gG-67ZLvjR20PAVBfPwEz.png" descr="Historique des passages"/>
                     <pic:cNvPicPr/>
                   </pic:nvPicPr>
                   <pic:blipFill>
@@ -3662,7 +3710,7 @@
                   <pic:spPr>
                     <a:xfrm>
                       <a:off x="0" y="0"/>
-                      <a:ext cx="6502400" cy="4064000"/>
+                      <a:ext cx="5715000" cy="3571875"/>
                     </a:xfrm>
                     <a:prstGeom prst="rect"/>
                   </pic:spPr>
@@ -3677,7 +3725,7 @@
       <w:pPr>
         <w:numPr>
           <w:ilvl w:val="0"/>
-          <w:numId w:val="12"/>
+          <w:numId w:val="13"/>
         </w:numPr>
         <w:spacing w:lineRule="auto"/>
       </w:pPr>
@@ -3696,7 +3744,7 @@
       <w:pPr>
         <w:numPr>
           <w:ilvl w:val="0"/>
-          <w:numId w:val="12"/>
+          <w:numId w:val="13"/>
         </w:numPr>
         <w:spacing w:lineRule="auto"/>
       </w:pPr>
@@ -3708,7 +3756,7 @@
       </w:r>
       <w:r>
         <w:rPr/>
-        <w:t xml:space="preserve"> : ne voit que les passages de ses propres enfants ; le filtre par établissement est masqué (non utile pour un parent).</w:t>
+        <w:t xml:space="preserve"> : ne voit que les passages de ses propres enfants ; le filtre par établissement et la colonne « Établissement » du tableau sont masqués (non utiles pour un parent).</w:t>
       </w:r>
     </w:p>
     <w:p>
@@ -3729,14 +3777,14 @@
         <w:rPr/>
         <w:drawing>
           <wp:inline distB="0" distL="0" distR="0" distT="0">
-            <wp:extent cx="6502400" cy="4064000"/>
+            <wp:extent cx="5715000" cy="3571875"/>
             <wp:effectExtent b="0" l="0" r="0" t="0"/>
-            <wp:docPr id="14" name="image-PFSTdHSWz46V-6is8jcPv.png"/>
+            <wp:docPr id="14" name="image-hwlYTC1wziJPNldMA4WZd.png"/>
             <a:graphic>
               <a:graphicData uri="http://schemas.openxmlformats.org/drawingml/2006/picture">
                 <pic:pic>
                   <pic:nvPicPr>
-                    <pic:cNvPr id="14" name="image-PFSTdHSWz46V-6is8jcPv.png" descr="Liste des comptes utilisateurs"/>
+                    <pic:cNvPr id="14" name="image-hwlYTC1wziJPNldMA4WZd.png" descr="Liste des comptes utilisateurs"/>
                     <pic:cNvPicPr/>
                   </pic:nvPicPr>
                   <pic:blipFill>
@@ -3749,7 +3797,7 @@
                   <pic:spPr>
                     <a:xfrm>
                       <a:off x="0" y="0"/>
-                      <a:ext cx="6502400" cy="4064000"/>
+                      <a:ext cx="5715000" cy="3571875"/>
                     </a:xfrm>
                     <a:prstGeom prst="rect"/>
                   </pic:spPr>
@@ -3764,7 +3812,7 @@
       <w:pPr>
         <w:numPr>
           <w:ilvl w:val="0"/>
-          <w:numId w:val="13"/>
+          <w:numId w:val="14"/>
         </w:numPr>
         <w:spacing w:lineRule="auto"/>
       </w:pPr>
@@ -3787,7 +3835,7 @@
       <w:pPr>
         <w:numPr>
           <w:ilvl w:val="0"/>
-          <w:numId w:val="13"/>
+          <w:numId w:val="14"/>
         </w:numPr>
         <w:spacing w:lineRule="auto"/>
       </w:pPr>
@@ -3800,7 +3848,7 @@
       <w:pPr>
         <w:numPr>
           <w:ilvl w:val="0"/>
-          <w:numId w:val="13"/>
+          <w:numId w:val="14"/>
         </w:numPr>
         <w:spacing w:lineRule="auto"/>
       </w:pPr>
@@ -3813,7 +3861,7 @@
       <w:pPr>
         <w:numPr>
           <w:ilvl w:val="0"/>
-          <w:numId w:val="13"/>
+          <w:numId w:val="14"/>
         </w:numPr>
         <w:spacing w:lineRule="auto"/>
       </w:pPr>
@@ -3826,7 +3874,7 @@
       <w:pPr>
         <w:numPr>
           <w:ilvl w:val="0"/>
-          <w:numId w:val="13"/>
+          <w:numId w:val="14"/>
         </w:numPr>
         <w:spacing w:lineRule="auto"/>
       </w:pPr>
@@ -3855,7 +3903,7 @@
       <w:pPr>
         <w:numPr>
           <w:ilvl w:val="0"/>
-          <w:numId w:val="14"/>
+          <w:numId w:val="15"/>
         </w:numPr>
         <w:spacing w:lineRule="auto"/>
       </w:pPr>
@@ -3868,7 +3916,7 @@
       <w:pPr>
         <w:numPr>
           <w:ilvl w:val="0"/>
-          <w:numId w:val="14"/>
+          <w:numId w:val="15"/>
         </w:numPr>
         <w:spacing w:lineRule="auto"/>
       </w:pPr>
@@ -3887,7 +3935,7 @@
       <w:pPr>
         <w:numPr>
           <w:ilvl w:val="0"/>
-          <w:numId w:val="14"/>
+          <w:numId w:val="15"/>
         </w:numPr>
         <w:spacing w:lineRule="auto"/>
       </w:pPr>
@@ -3906,7 +3954,7 @@
       <w:pPr>
         <w:numPr>
           <w:ilvl w:val="0"/>
-          <w:numId w:val="14"/>
+          <w:numId w:val="15"/>
         </w:numPr>
         <w:spacing w:lineRule="auto"/>
       </w:pPr>
@@ -3919,7 +3967,7 @@
       <w:pPr>
         <w:numPr>
           <w:ilvl w:val="0"/>
-          <w:numId w:val="14"/>
+          <w:numId w:val="15"/>
         </w:numPr>
         <w:spacing w:lineRule="auto"/>
       </w:pPr>
@@ -3969,7 +4017,7 @@
       <w:pPr>
         <w:numPr>
           <w:ilvl w:val="0"/>
-          <w:numId w:val="15"/>
+          <w:numId w:val="16"/>
         </w:numPr>
         <w:spacing w:lineRule="auto"/>
       </w:pPr>
@@ -3992,7 +4040,7 @@
       <w:pPr>
         <w:numPr>
           <w:ilvl w:val="0"/>
-          <w:numId w:val="15"/>
+          <w:numId w:val="16"/>
         </w:numPr>
         <w:spacing w:lineRule="auto"/>
       </w:pPr>
@@ -4005,7 +4053,7 @@
       <w:pPr>
         <w:numPr>
           <w:ilvl w:val="1"/>
-          <w:numId w:val="16"/>
+          <w:numId w:val="17"/>
         </w:numPr>
         <w:spacing w:lineRule="auto"/>
       </w:pPr>
@@ -4024,7 +4072,7 @@
       <w:pPr>
         <w:numPr>
           <w:ilvl w:val="1"/>
-          <w:numId w:val="16"/>
+          <w:numId w:val="17"/>
         </w:numPr>
         <w:spacing w:lineRule="auto"/>
       </w:pPr>
@@ -4043,7 +4091,7 @@
       <w:pPr>
         <w:numPr>
           <w:ilvl w:val="1"/>
-          <w:numId w:val="16"/>
+          <w:numId w:val="17"/>
         </w:numPr>
         <w:spacing w:lineRule="auto"/>
       </w:pPr>
@@ -4062,7 +4110,7 @@
       <w:pPr>
         <w:numPr>
           <w:ilvl w:val="0"/>
-          <w:numId w:val="15"/>
+          <w:numId w:val="16"/>
         </w:numPr>
         <w:spacing w:lineRule="auto"/>
       </w:pPr>
@@ -4081,7 +4129,7 @@
       <w:pPr>
         <w:numPr>
           <w:ilvl w:val="0"/>
-          <w:numId w:val="15"/>
+          <w:numId w:val="16"/>
         </w:numPr>
         <w:spacing w:lineRule="auto"/>
       </w:pPr>
@@ -4100,7 +4148,7 @@
       <w:pPr>
         <w:numPr>
           <w:ilvl w:val="0"/>
-          <w:numId w:val="15"/>
+          <w:numId w:val="16"/>
         </w:numPr>
         <w:spacing w:lineRule="auto"/>
       </w:pPr>
@@ -4127,14 +4175,14 @@
         <w:rPr/>
         <w:drawing>
           <wp:inline distB="0" distL="0" distR="0" distT="0">
-            <wp:extent cx="6502400" cy="4064000"/>
+            <wp:extent cx="5715000" cy="3571875"/>
             <wp:effectExtent b="0" l="0" r="0" t="0"/>
-            <wp:docPr id="15" name="image-oJHiv-oo1IoYwM33EjuuG.png"/>
+            <wp:docPr id="15" name="image-Vb3Ot8yI1eoPEjWkxjzSD.png"/>
             <a:graphic>
               <a:graphicData uri="http://schemas.openxmlformats.org/drawingml/2006/picture">
                 <pic:pic>
                   <pic:nvPicPr>
-                    <pic:cNvPr id="15" name="image-oJHiv-oo1IoYwM33EjuuG.png" descr="Écran des paramètres"/>
+                    <pic:cNvPr id="15" name="image-Vb3Ot8yI1eoPEjWkxjzSD.png" descr="Écran des paramètres"/>
                     <pic:cNvPicPr/>
                   </pic:nvPicPr>
                   <pic:blipFill>
@@ -4147,7 +4195,7 @@
                   <pic:spPr>
                     <a:xfrm>
                       <a:off x="0" y="0"/>
-                      <a:ext cx="6502400" cy="4064000"/>
+                      <a:ext cx="5715000" cy="3571875"/>
                     </a:xfrm>
                     <a:prstGeom prst="rect"/>
                   </pic:spPr>
@@ -4160,9 +4208,18 @@
     </w:p>
     <w:p>
       <w:pPr>
+        <w:spacing w:lineRule="auto"/>
+      </w:pPr>
+      <w:r>
+        <w:rPr/>
+        <w:t xml:space="preserve">Les réglages sont regroupés par thème dans des blocs dépliables (Contrôle d'accès cantine, Notifications, Paiements, Apparence, Organisation) — cliquer sur l'intitulé d'un bloc l'ouvre ou le referme.</w:t>
+      </w:r>
+    </w:p>
+    <w:p>
+      <w:pPr>
         <w:numPr>
           <w:ilvl w:val="0"/>
-          <w:numId w:val="17"/>
+          <w:numId w:val="18"/>
         </w:numPr>
         <w:spacing w:lineRule="auto"/>
       </w:pPr>
@@ -4175,7 +4232,7 @@
       <w:pPr>
         <w:numPr>
           <w:ilvl w:val="0"/>
-          <w:numId w:val="17"/>
+          <w:numId w:val="18"/>
         </w:numPr>
         <w:spacing w:lineRule="auto"/>
       </w:pPr>
@@ -4188,7 +4245,7 @@
       <w:pPr>
         <w:numPr>
           <w:ilvl w:val="0"/>
-          <w:numId w:val="17"/>
+          <w:numId w:val="18"/>
         </w:numPr>
         <w:spacing w:lineRule="auto"/>
       </w:pPr>
@@ -4221,58 +4278,13 @@
       <w:pPr>
         <w:numPr>
           <w:ilvl w:val="0"/>
-          <w:numId w:val="17"/>
+          <w:numId w:val="18"/>
         </w:numPr>
         <w:spacing w:lineRule="auto"/>
       </w:pPr>
       <w:r>
         <w:rPr/>
         <w:t xml:space="preserve">Délai de grâce par défaut (7 jours), qui peut être ajusté établissement par établissement (§6).</w:t>
-      </w:r>
-    </w:p>
-    <w:p>
-      <w:pPr>
-        <w:numPr>
-          <w:ilvl w:val="0"/>
-          <w:numId w:val="17"/>
-        </w:numPr>
-        <w:spacing w:lineRule="auto"/>
-      </w:pPr>
-      <w:r>
-        <w:rPr/>
-        <w:t xml:space="preserve">Service de paiement actif.</w:t>
-      </w:r>
-    </w:p>
-    <w:p>
-      <w:pPr>
-        <w:numPr>
-          <w:ilvl w:val="0"/>
-          <w:numId w:val="17"/>
-        </w:numPr>
-        <w:spacing w:lineRule="auto"/>
-      </w:pPr>
-      <w:r>
-        <w:rPr/>
-        <w:t xml:space="preserve">Image de fond personnalisée pour l'écran de connexion.</w:t>
-      </w:r>
-    </w:p>
-    <w:p>
-      <w:pPr>
-        <w:pStyle w:val="Heading3"/>
-        <w:spacing w:lineRule="auto"/>
-      </w:pPr>
-      <w:r>
-        <w:rPr/>
-        <w:t xml:space="preserve">Personnalisation par établissement (image, nom, coordonnées)</w:t>
-      </w:r>
-    </w:p>
-    <w:p>
-      <w:pPr>
-        <w:spacing w:lineRule="auto"/>
-      </w:pPr>
-      <w:r>
-        <w:rPr/>
-        <w:t xml:space="preserve">Une section « Organisation » permet d'adapter l'application à l'identité du client :</w:t>
       </w:r>
     </w:p>
     <w:p>
@@ -4284,6 +4296,51 @@
         <w:spacing w:lineRule="auto"/>
       </w:pPr>
       <w:r>
+        <w:rPr/>
+        <w:t xml:space="preserve">Service de paiement actif.</w:t>
+      </w:r>
+    </w:p>
+    <w:p>
+      <w:pPr>
+        <w:numPr>
+          <w:ilvl w:val="0"/>
+          <w:numId w:val="18"/>
+        </w:numPr>
+        <w:spacing w:lineRule="auto"/>
+      </w:pPr>
+      <w:r>
+        <w:rPr/>
+        <w:t xml:space="preserve">Image de fond personnalisée pour l'écran de connexion.</w:t>
+      </w:r>
+    </w:p>
+    <w:p>
+      <w:pPr>
+        <w:pStyle w:val="Heading3"/>
+        <w:spacing w:lineRule="auto"/>
+      </w:pPr>
+      <w:r>
+        <w:rPr/>
+        <w:t xml:space="preserve">Personnalisation par établissement (image, nom, coordonnées)</w:t>
+      </w:r>
+    </w:p>
+    <w:p>
+      <w:pPr>
+        <w:spacing w:lineRule="auto"/>
+      </w:pPr>
+      <w:r>
+        <w:rPr/>
+        <w:t xml:space="preserve">Une section « Organisation » permet d'adapter l'application à l'identité du client :</w:t>
+      </w:r>
+    </w:p>
+    <w:p>
+      <w:pPr>
+        <w:numPr>
+          <w:ilvl w:val="0"/>
+          <w:numId w:val="19"/>
+        </w:numPr>
+        <w:spacing w:lineRule="auto"/>
+      </w:pPr>
+      <w:r>
         <w:rPr>
           <w:b/>
         </w:rPr>
@@ -4298,7 +4355,7 @@
       <w:pPr>
         <w:numPr>
           <w:ilvl w:val="0"/>
-          <w:numId w:val="18"/>
+          <w:numId w:val="19"/>
         </w:numPr>
         <w:spacing w:lineRule="auto"/>
       </w:pPr>
@@ -4317,7 +4374,7 @@
       <w:pPr>
         <w:numPr>
           <w:ilvl w:val="0"/>
-          <w:numId w:val="18"/>
+          <w:numId w:val="19"/>
         </w:numPr>
         <w:spacing w:lineRule="auto"/>
       </w:pPr>
@@ -4356,7 +4413,7 @@
       <w:pPr>
         <w:numPr>
           <w:ilvl w:val="0"/>
-          <w:numId w:val="18"/>
+          <w:numId w:val="19"/>
         </w:numPr>
         <w:spacing w:lineRule="auto"/>
       </w:pPr>
@@ -4377,7 +4434,7 @@
       </w:pPr>
       <w:r>
         <w:rPr/>
-        <w:t xml:space="preserve">Tant qu'aucune de ces informations n'est renseignée, l'application garde son apparence par défaut (icône 🍽️ et nom « Cantine Connect »).</w:t>
+        <w:t xml:space="preserve">Tant qu'aucune de ces informations n'est renseignée, l'application garde son apparence par défaut (icône par défaut et nom « Cantine Connect »).</w:t>
       </w:r>
     </w:p>
     <w:p>
@@ -4394,7 +4451,7 @@
       <w:pPr>
         <w:numPr>
           <w:ilvl w:val="0"/>
-          <w:numId w:val="19"/>
+          <w:numId w:val="20"/>
         </w:numPr>
         <w:spacing w:lineRule="auto"/>
       </w:pPr>
@@ -4413,7 +4470,7 @@
       <w:pPr>
         <w:numPr>
           <w:ilvl w:val="0"/>
-          <w:numId w:val="19"/>
+          <w:numId w:val="20"/>
         </w:numPr>
         <w:spacing w:lineRule="auto"/>
       </w:pPr>
@@ -4432,7 +4489,7 @@
       <w:pPr>
         <w:numPr>
           <w:ilvl w:val="0"/>
-          <w:numId w:val="19"/>
+          <w:numId w:val="20"/>
         </w:numPr>
         <w:spacing w:lineRule="auto"/>
       </w:pPr>
@@ -4465,14 +4522,14 @@
         <w:rPr/>
         <w:drawing>
           <wp:inline distB="0" distL="0" distR="0" distT="0">
-            <wp:extent cx="6502400" cy="4064000"/>
+            <wp:extent cx="5715000" cy="3571875"/>
             <wp:effectExtent b="0" l="0" r="0" t="0"/>
-            <wp:docPr id="16" name="image--AxtecrAVVfPiMYT48UYf.png"/>
+            <wp:docPr id="16" name="image-aV4rMg6TlD80tSd8QqIwY.png"/>
             <a:graphic>
               <a:graphicData uri="http://schemas.openxmlformats.org/drawingml/2006/picture">
                 <pic:pic>
                   <pic:nvPicPr>
-                    <pic:cNvPr id="16" name="image--AxtecrAVVfPiMYT48UYf.png" descr="Fenêtre « À propos »"/>
+                    <pic:cNvPr id="16" name="image-aV4rMg6TlD80tSd8QqIwY.png" descr="Fenêtre « À propos »"/>
                     <pic:cNvPicPr/>
                   </pic:nvPicPr>
                   <pic:blipFill>
@@ -4485,7 +4542,7 @@
                   <pic:spPr>
                     <a:xfrm>
                       <a:off x="0" y="0"/>
-                      <a:ext cx="6502400" cy="4064000"/>
+                      <a:ext cx="5715000" cy="3571875"/>
                     </a:xfrm>
                     <a:prstGeom prst="rect"/>
                   </pic:spPr>
@@ -4517,7 +4574,7 @@
       </w:r>
       <w:r>
         <w:rPr/>
-        <w:t xml:space="preserve"> — 📞 +225 07 58 89 24 77 · 📧 </w:t>
+        <w:t xml:space="preserve"> — Téléphone : +225 07 58 89 24 77 · Email : </w:t>
       </w:r>
       <w:hyperlink r:id="rId22">
         <w:r>
@@ -6707,6 +6764,128 @@
     </w:lvl>
   </w:abstractNum>
   <w:abstractNum w:abstractNumId="19">
+    <w:lvl w:ilvl="0">
+      <w:start w:val="1"/>
+      <w:numFmt w:val="bullet"/>
+      <w:lvlText w:val=""/>
+      <w:lvlJc w:val="left"/>
+      <w:pPr>
+        <w:tabs>
+          <w:tab w:val="num" w:pos="720"/>
+        </w:tabs>
+        <w:ind w:left="720" w:hanging="360"/>
+      </w:pPr>
+      <w:rPr>
+        <w:rFonts w:ascii="Symbol" w:hAnsi="Symbol" w:hint="default"/>
+      </w:rPr>
+    </w:lvl>
+    <w:lvl w:ilvl="1">
+      <w:start w:val="1"/>
+      <w:numFmt w:val="bullet"/>
+      <w:lvlText w:val=""/>
+      <w:lvlJc w:val="left"/>
+      <w:pPr>
+        <w:tabs>
+          <w:tab w:val="num" w:pos="1440"/>
+        </w:tabs>
+        <w:ind w:left="1440" w:hanging="360"/>
+      </w:pPr>
+      <w:rPr>
+        <w:rFonts w:ascii="Symbol" w:hAnsi="Symbol" w:hint="default"/>
+      </w:rPr>
+    </w:lvl>
+    <w:lvl w:ilvl="2">
+      <w:start w:val="1"/>
+      <w:numFmt w:val="bullet"/>
+      <w:lvlText w:val=""/>
+      <w:lvlJc w:val="left"/>
+      <w:pPr>
+        <w:tabs>
+          <w:tab w:val="num" w:pos="2160"/>
+        </w:tabs>
+        <w:ind w:left="2160" w:hanging="360"/>
+      </w:pPr>
+      <w:rPr>
+        <w:rFonts w:ascii="Symbol" w:hAnsi="Symbol" w:hint="default"/>
+      </w:rPr>
+    </w:lvl>
+    <w:lvl w:ilvl="3">
+      <w:start w:val="1"/>
+      <w:numFmt w:val="bullet"/>
+      <w:lvlText w:val=""/>
+      <w:lvlJc w:val="left"/>
+      <w:pPr>
+        <w:tabs>
+          <w:tab w:val="num" w:pos="2880"/>
+        </w:tabs>
+        <w:ind w:left="2880" w:hanging="360"/>
+      </w:pPr>
+      <w:rPr>
+        <w:rFonts w:ascii="Symbol" w:hAnsi="Symbol" w:hint="default"/>
+      </w:rPr>
+    </w:lvl>
+    <w:lvl w:ilvl="4">
+      <w:start w:val="1"/>
+      <w:numFmt w:val="bullet"/>
+      <w:lvlText w:val=""/>
+      <w:lvlJc w:val="left"/>
+      <w:pPr>
+        <w:tabs>
+          <w:tab w:val="num" w:pos="3600"/>
+        </w:tabs>
+        <w:ind w:left="3600" w:hanging="360"/>
+      </w:pPr>
+      <w:rPr>
+        <w:rFonts w:ascii="Symbol" w:hAnsi="Symbol" w:hint="default"/>
+      </w:rPr>
+    </w:lvl>
+    <w:lvl w:ilvl="5">
+      <w:start w:val="1"/>
+      <w:numFmt w:val="bullet"/>
+      <w:lvlText w:val=""/>
+      <w:lvlJc w:val="left"/>
+      <w:pPr>
+        <w:tabs>
+          <w:tab w:val="num" w:pos="4320"/>
+        </w:tabs>
+        <w:ind w:left="4320" w:hanging="360"/>
+      </w:pPr>
+      <w:rPr>
+        <w:rFonts w:ascii="Symbol" w:hAnsi="Symbol" w:hint="default"/>
+      </w:rPr>
+    </w:lvl>
+    <w:lvl w:ilvl="6">
+      <w:start w:val="1"/>
+      <w:numFmt w:val="bullet"/>
+      <w:lvlText w:val=""/>
+      <w:lvlJc w:val="left"/>
+      <w:pPr>
+        <w:tabs>
+          <w:tab w:val="num" w:pos="5040"/>
+        </w:tabs>
+        <w:ind w:left="5040" w:hanging="360"/>
+      </w:pPr>
+      <w:rPr>
+        <w:rFonts w:ascii="Symbol" w:hAnsi="Symbol" w:hint="default"/>
+      </w:rPr>
+    </w:lvl>
+    <w:lvl w:ilvl="7">
+      <w:start w:val="1"/>
+      <w:numFmt w:val="bullet"/>
+      <w:lvlText w:val=""/>
+      <w:lvlJc w:val="left"/>
+      <w:pPr>
+        <w:tabs>
+          <w:tab w:val="num" w:pos="5760"/>
+        </w:tabs>
+        <w:ind w:left="5760" w:hanging="360"/>
+      </w:pPr>
+      <w:rPr>
+        <w:rFonts w:ascii="Symbol" w:hAnsi="Symbol" w:hint="default"/>
+      </w:rPr>
+    </w:lvl>
+  </w:abstractNum>
+  <w:abstractNum w:abstractNumId="20">
     <w:lvl w:ilvl="0">
       <w:start w:val="1"/>
       <w:numFmt w:val="bullet"/>
@@ -6884,6 +7063,9 @@
   </w:num>
   <w:num w:numId="19">
     <w:abstractNumId w:val="19"/>
+  </w:num>
+  <w:num w:numId="20">
+    <w:abstractNumId w:val="20"/>
   </w:num>
 </w:numbering>
 </file>

</xml_diff>

<commit_message>
docs(cantine-connect): synchronise le manuel illustré (Demande d'accès, Mes enfants)
Rafraîchit docs/from-labs/livraison/ suite à l'ajout des captures d'écran et
descriptions de processus pour "Demande d'accès" et "Mes enfants" côté
klem-labs-repository.

Co-Authored-By: Claude Sonnet 5 <noreply@anthropic.com>
</commit_message>
<xml_diff>
--- a/apps/web-app/cantine-connect/docs/from-labs/livraison/manuel-utilisateur.docx
+++ b/apps/web-app/cantine-connect/docs/from-labs/livraison/manuel-utilisateur.docx
@@ -122,12 +122,12 @@
           <wp:inline distB="0" distL="0" distR="0" distT="0">
             <wp:extent cx="5715000" cy="3571875"/>
             <wp:effectExtent b="0" l="0" r="0" t="0"/>
-            <wp:docPr id="1" name="image-p1AJEuRU1Epi87VqGWRJD.png"/>
+            <wp:docPr id="1" name="image-MCBjsMLmN3S-KWflkZcdA.png"/>
             <a:graphic>
               <a:graphicData uri="http://schemas.openxmlformats.org/drawingml/2006/picture">
                 <pic:pic>
                   <pic:nvPicPr>
-                    <pic:cNvPr id="1" name="image-p1AJEuRU1Epi87VqGWRJD.png" descr="Écran de connexion"/>
+                    <pic:cNvPr id="1" name="image-MCBjsMLmN3S-KWflkZcdA.png" descr="Écran de connexion"/>
                     <pic:cNvPicPr/>
                   </pic:nvPicPr>
                   <pic:blipFill>
@@ -219,12 +219,12 @@
           <wp:inline distB="0" distL="0" distR="0" distT="0">
             <wp:extent cx="5715000" cy="3571875"/>
             <wp:effectExtent b="0" l="0" r="0" t="0"/>
-            <wp:docPr id="2" name="image-1kK-g37K7WQwTv2KewUm7.png"/>
+            <wp:docPr id="2" name="image-rFOmagL7ACZqUo6kfgJB7.png"/>
             <a:graphic>
               <a:graphicData uri="http://schemas.openxmlformats.org/drawingml/2006/picture">
                 <pic:pic>
                   <pic:nvPicPr>
-                    <pic:cNvPr id="2" name="image-1kK-g37K7WQwTv2KewUm7.png" descr="Sélecteur d'habillage"/>
+                    <pic:cNvPr id="2" name="image-rFOmagL7ACZqUo6kfgJB7.png" descr="Sélecteur d'habillage"/>
                     <pic:cNvPicPr/>
                   </pic:nvPicPr>
                   <pic:blipFill>
@@ -253,12 +253,12 @@
           <wp:inline distB="0" distL="0" distR="0" distT="0">
             <wp:extent cx="5715000" cy="3571875"/>
             <wp:effectExtent b="0" l="0" r="0" t="0"/>
-            <wp:docPr id="3" name="image-ddbsgOwIKWbPWClSQDnk-.png"/>
+            <wp:docPr id="3" name="image-YDq2koF2BWxKEzDVf0xD5.png"/>
             <a:graphic>
               <a:graphicData uri="http://schemas.openxmlformats.org/drawingml/2006/picture">
                 <pic:pic>
                   <pic:nvPicPr>
-                    <pic:cNvPr id="3" name="image-ddbsgOwIKWbPWClSQDnk-.png" descr="Exemple d'habillage Corporatif"/>
+                    <pic:cNvPr id="3" name="image-YDq2koF2BWxKEzDVf0xD5.png" descr="Exemple d'habillage Corporatif"/>
                     <pic:cNvPicPr/>
                   </pic:nvPicPr>
                   <pic:blipFill>
@@ -728,7 +728,46 @@
       </w:pPr>
       <w:r>
         <w:rPr/>
-        <w:t xml:space="preserve">Un parent qui n'a pas encore de compte peut faire une demande depuis la page « Demande d'accès » (formulaire en plusieurs étapes) :</w:t>
+        <w:t xml:space="preserve">Un parent qui n'a pas encore de compte peut faire une demande depuis la page « Demande d'accès », accessible depuis la page d'accueil ou l'écran de connexion. C'est un formulaire simple en trois petites étapes, avec une barre de progression en haut pour savoir où on en est :</w:t>
+      </w:r>
+    </w:p>
+    <w:p>
+      <w:pPr>
+        <w:spacing w:lineRule="auto"/>
+      </w:pPr>
+      <w:r>
+        <w:rPr/>
+        <w:drawing>
+          <wp:inline distB="0" distL="0" distR="0" distT="0">
+            <wp:extent cx="5715000" cy="3571875"/>
+            <wp:effectExtent b="0" l="0" r="0" t="0"/>
+            <wp:docPr id="4" name="image-eM05WmXpuTbDJdZKSsCEm.png"/>
+            <a:graphic>
+              <a:graphicData uri="http://schemas.openxmlformats.org/drawingml/2006/picture">
+                <pic:pic>
+                  <pic:nvPicPr>
+                    <pic:cNvPr id="4" name="image-eM05WmXpuTbDJdZKSsCEm.png" descr="Demande d'accès — étape 1 : identité"/>
+                    <pic:cNvPicPr/>
+                  </pic:nvPicPr>
+                  <pic:blipFill>
+                    <a:blip r:embed="rId9" cstate="print"/>
+                    <a:srcRect b="0" l="0" r="0" t="0"/>
+                    <a:stretch>
+                      <a:fillRect/>
+                    </a:stretch>
+                  </pic:blipFill>
+                  <pic:spPr>
+                    <a:xfrm>
+                      <a:off x="0" y="0"/>
+                      <a:ext cx="5715000" cy="3571875"/>
+                    </a:xfrm>
+                    <a:prstGeom prst="rect"/>
+                  </pic:spPr>
+                </pic:pic>
+              </a:graphicData>
+            </a:graphic>
+          </wp:inline>
+        </w:drawing>
       </w:r>
     </w:p>
     <w:p>
@@ -747,14 +786,53 @@
       </w:r>
       <w:r>
         <w:rPr/>
-        <w:t xml:space="preserve"> : nom, prénom, fonction (facultatif)</w:t>
+        <w:t xml:space="preserve"> : nom, prénom, fonction (facultatif — par exemple « Maman », « Tuteur »).</w:t>
+      </w:r>
+    </w:p>
+    <w:p>
+      <w:pPr>
+        <w:spacing w:lineRule="auto"/>
+      </w:pPr>
+      <w:r>
+        <w:rPr/>
+        <w:drawing>
+          <wp:inline distB="0" distL="0" distR="0" distT="0">
+            <wp:extent cx="5715000" cy="3571875"/>
+            <wp:effectExtent b="0" l="0" r="0" t="0"/>
+            <wp:docPr id="5" name="image-6ByJh0ajp84QUSy9Y9Wxr.png"/>
+            <a:graphic>
+              <a:graphicData uri="http://schemas.openxmlformats.org/drawingml/2006/picture">
+                <pic:pic>
+                  <pic:nvPicPr>
+                    <pic:cNvPr id="5" name="image-6ByJh0ajp84QUSy9Y9Wxr.png" descr="Demande d'accès — étape 2 : contact"/>
+                    <pic:cNvPicPr/>
+                  </pic:nvPicPr>
+                  <pic:blipFill>
+                    <a:blip r:embed="rId10" cstate="print"/>
+                    <a:srcRect b="0" l="0" r="0" t="0"/>
+                    <a:stretch>
+                      <a:fillRect/>
+                    </a:stretch>
+                  </pic:blipFill>
+                  <pic:spPr>
+                    <a:xfrm>
+                      <a:off x="0" y="0"/>
+                      <a:ext cx="5715000" cy="3571875"/>
+                    </a:xfrm>
+                    <a:prstGeom prst="rect"/>
+                  </pic:spPr>
+                </pic:pic>
+              </a:graphicData>
+            </a:graphic>
+          </wp:inline>
+        </w:drawing>
       </w:r>
     </w:p>
     <w:p>
       <w:pPr>
         <w:numPr>
           <w:ilvl w:val="0"/>
-          <w:numId w:val="2"/>
+          <w:numId w:val="3"/>
         </w:numPr>
         <w:spacing w:lineRule="auto"/>
       </w:pPr>
@@ -771,9 +849,48 @@
     </w:p>
     <w:p>
       <w:pPr>
+        <w:spacing w:lineRule="auto"/>
+      </w:pPr>
+      <w:r>
+        <w:rPr/>
+        <w:drawing>
+          <wp:inline distB="0" distL="0" distR="0" distT="0">
+            <wp:extent cx="5715000" cy="3571875"/>
+            <wp:effectExtent b="0" l="0" r="0" t="0"/>
+            <wp:docPr id="6" name="image-DqhgLwQ7vZWU7IC0KTlCZ.png"/>
+            <a:graphic>
+              <a:graphicData uri="http://schemas.openxmlformats.org/drawingml/2006/picture">
+                <pic:pic>
+                  <pic:nvPicPr>
+                    <pic:cNvPr id="6" name="image-DqhgLwQ7vZWU7IC0KTlCZ.png" descr="Demande d'accès — étape 3 : résidence"/>
+                    <pic:cNvPicPr/>
+                  </pic:nvPicPr>
+                  <pic:blipFill>
+                    <a:blip r:embed="rId11" cstate="print"/>
+                    <a:srcRect b="0" l="0" r="0" t="0"/>
+                    <a:stretch>
+                      <a:fillRect/>
+                    </a:stretch>
+                  </pic:blipFill>
+                  <pic:spPr>
+                    <a:xfrm>
+                      <a:off x="0" y="0"/>
+                      <a:ext cx="5715000" cy="3571875"/>
+                    </a:xfrm>
+                    <a:prstGeom prst="rect"/>
+                  </pic:spPr>
+                </pic:pic>
+              </a:graphicData>
+            </a:graphic>
+          </wp:inline>
+        </w:drawing>
+      </w:r>
+    </w:p>
+    <w:p>
+      <w:pPr>
         <w:numPr>
           <w:ilvl w:val="0"/>
-          <w:numId w:val="2"/>
+          <w:numId w:val="4"/>
         </w:numPr>
         <w:spacing w:lineRule="auto"/>
       </w:pPr>
@@ -785,7 +902,7 @@
       </w:r>
       <w:r>
         <w:rPr/>
-        <w:t xml:space="preserve"> : ville, commune (obligatoires), quartier (facultatif)</w:t>
+        <w:t xml:space="preserve"> : ville, commune (obligatoires), quartier (facultatif).</w:t>
       </w:r>
     </w:p>
     <w:p>
@@ -819,13 +936,57 @@
       </w:pPr>
       <w:r>
         <w:rPr/>
-        <w:t xml:space="preserve">Une fois la demande envoyée, un écran de confirmation s'affiche : </w:t>
-      </w:r>
+        <w:t xml:space="preserve">Une fois les trois étapes remplies, un bouton « Envoyer ma demande » termine le processus et un écran de confirmation s'affiche :</w:t>
+      </w:r>
+    </w:p>
+    <w:p>
+      <w:pPr>
+        <w:spacing w:lineRule="auto"/>
+      </w:pPr>
+      <w:r>
+        <w:rPr/>
+        <w:drawing>
+          <wp:inline distB="0" distL="0" distR="0" distT="0">
+            <wp:extent cx="5715000" cy="3571875"/>
+            <wp:effectExtent b="0" l="0" r="0" t="0"/>
+            <wp:docPr id="7" name="image-lzCrLnpttglrrl3Q3-jN-.png"/>
+            <a:graphic>
+              <a:graphicData uri="http://schemas.openxmlformats.org/drawingml/2006/picture">
+                <pic:pic>
+                  <pic:nvPicPr>
+                    <pic:cNvPr id="7" name="image-lzCrLnpttglrrl3Q3-jN-.png" descr="Demande d'accès — confirmation"/>
+                    <pic:cNvPicPr/>
+                  </pic:nvPicPr>
+                  <pic:blipFill>
+                    <a:blip r:embed="rId12" cstate="print"/>
+                    <a:srcRect b="0" l="0" r="0" t="0"/>
+                    <a:stretch>
+                      <a:fillRect/>
+                    </a:stretch>
+                  </pic:blipFill>
+                  <pic:spPr>
+                    <a:xfrm>
+                      <a:off x="0" y="0"/>
+                      <a:ext cx="5715000" cy="3571875"/>
+                    </a:xfrm>
+                    <a:prstGeom prst="rect"/>
+                  </pic:spPr>
+                </pic:pic>
+              </a:graphicData>
+            </a:graphic>
+          </wp:inline>
+        </w:drawing>
+      </w:r>
+    </w:p>
+    <w:p>
+      <w:pPr>
+        <w:spacing w:lineRule="auto"/>
+      </w:pPr>
       <w:r>
         <w:rPr>
           <w:b/>
         </w:rPr>
-        <w:t xml:space="preserve">aucun compte n'est créé tout de suite</w:t>
+        <w:t xml:space="preserve">Aucun compte n'est créé tout de suite</w:t>
       </w:r>
       <w:r>
         <w:rPr/>
@@ -865,7 +1026,7 @@
       <w:pPr>
         <w:numPr>
           <w:ilvl w:val="0"/>
-          <w:numId w:val="3"/>
+          <w:numId w:val="5"/>
         </w:numPr>
         <w:spacing w:lineRule="auto"/>
       </w:pPr>
@@ -894,7 +1055,7 @@
       <w:pPr>
         <w:numPr>
           <w:ilvl w:val="1"/>
-          <w:numId w:val="4"/>
+          <w:numId w:val="6"/>
         </w:numPr>
         <w:spacing w:lineRule="auto"/>
       </w:pPr>
@@ -917,7 +1078,7 @@
       <w:pPr>
         <w:numPr>
           <w:ilvl w:val="0"/>
-          <w:numId w:val="3"/>
+          <w:numId w:val="5"/>
         </w:numPr>
         <w:spacing w:lineRule="auto"/>
       </w:pPr>
@@ -2661,370 +2822,12 @@
           <wp:inline distB="0" distL="0" distR="0" distT="0">
             <wp:extent cx="5715000" cy="3571875"/>
             <wp:effectExtent b="0" l="0" r="0" t="0"/>
-            <wp:docPr id="4" name="image-QGiGy1aYTcPtoaHvbePwB.png"/>
+            <wp:docPr id="8" name="image-bR1_eiiuHFEGRbAtg1AWB.png"/>
             <a:graphic>
               <a:graphicData uri="http://schemas.openxmlformats.org/drawingml/2006/picture">
                 <pic:pic>
                   <pic:nvPicPr>
-                    <pic:cNvPr id="4" name="image-QGiGy1aYTcPtoaHvbePwB.png" descr="Tableau de bord"/>
-                    <pic:cNvPicPr/>
-                  </pic:nvPicPr>
-                  <pic:blipFill>
-                    <a:blip r:embed="rId9" cstate="print"/>
-                    <a:srcRect b="0" l="0" r="0" t="0"/>
-                    <a:stretch>
-                      <a:fillRect/>
-                    </a:stretch>
-                  </pic:blipFill>
-                  <pic:spPr>
-                    <a:xfrm>
-                      <a:off x="0" y="0"/>
-                      <a:ext cx="5715000" cy="3571875"/>
-                    </a:xfrm>
-                    <a:prstGeom prst="rect"/>
-                  </pic:spPr>
-                </pic:pic>
-              </a:graphicData>
-            </a:graphic>
-          </wp:inline>
-        </w:drawing>
-      </w:r>
-      <w:r>
-        <w:rPr/>
-        <w:drawing>
-          <wp:inline distB="0" distL="0" distR="0" distT="0">
-            <wp:extent cx="5715000" cy="3571875"/>
-            <wp:effectExtent b="0" l="0" r="0" t="0"/>
-            <wp:docPr id="5" name="image-YXhTZg8tmVqh36J6tOpRM.png"/>
-            <a:graphic>
-              <a:graphicData uri="http://schemas.openxmlformats.org/drawingml/2006/picture">
-                <pic:pic>
-                  <pic:nvPicPr>
-                    <pic:cNvPr id="5" name="image-YXhTZg8tmVqh36J6tOpRM.png" descr="Tableau de bord — habillage Premium"/>
-                    <pic:cNvPicPr/>
-                  </pic:nvPicPr>
-                  <pic:blipFill>
-                    <a:blip r:embed="rId10" cstate="print"/>
-                    <a:srcRect b="0" l="0" r="0" t="0"/>
-                    <a:stretch>
-                      <a:fillRect/>
-                    </a:stretch>
-                  </pic:blipFill>
-                  <pic:spPr>
-                    <a:xfrm>
-                      <a:off x="0" y="0"/>
-                      <a:ext cx="5715000" cy="3571875"/>
-                    </a:xfrm>
-                    <a:prstGeom prst="rect"/>
-                  </pic:spPr>
-                </pic:pic>
-              </a:graphicData>
-            </a:graphic>
-          </wp:inline>
-        </w:drawing>
-      </w:r>
-    </w:p>
-    <w:p>
-      <w:pPr>
-        <w:spacing w:lineRule="auto"/>
-      </w:pPr>
-      <w:r>
-        <w:rPr/>
-        <w:t xml:space="preserve">Vue d'ensemble à l'ouverture de l'application : nombre d'élèves, répartition par statut d'accès, paiements récents, résumé des passages du jour.</w:t>
-      </w:r>
-    </w:p>
-    <w:p>
-      <w:pPr>
-        <w:numPr>
-          <w:ilvl w:val="0"/>
-          <w:numId w:val="5"/>
-        </w:numPr>
-        <w:spacing w:lineRule="auto"/>
-      </w:pPr>
-      <w:r>
-        <w:rPr>
-          <w:b/>
-        </w:rPr>
-        <w:t xml:space="preserve">Administrateur / gestionnaire / caissier</w:t>
-      </w:r>
-      <w:r>
-        <w:rPr/>
-        <w:t xml:space="preserve"> : les chiffres portent sur l'ensemble des élèves.</w:t>
-      </w:r>
-    </w:p>
-    <w:p>
-      <w:pPr>
-        <w:numPr>
-          <w:ilvl w:val="0"/>
-          <w:numId w:val="5"/>
-        </w:numPr>
-        <w:spacing w:lineRule="auto"/>
-      </w:pPr>
-      <w:r>
-        <w:rPr>
-          <w:b/>
-        </w:rPr>
-        <w:t xml:space="preserve">Parent</w:t>
-      </w:r>
-      <w:r>
-        <w:rPr/>
-        <w:t xml:space="preserve"> : les mêmes indicateurs (établissements, élèves, statuts, passages, paiements) portent uniquement sur </w:t>
-      </w:r>
-      <w:r>
-        <w:rPr>
-          <w:b/>
-        </w:rPr>
-        <w:t xml:space="preserve">ses propres enfants</w:t>
-      </w:r>
-      <w:r>
-        <w:rPr/>
-        <w:t xml:space="preserve"> — un parent d'un seul enfant verra par exemple « 1 élève », pas le total de l'établissement. Un parent qui n'a encore aucun enfant rattaché voit des indicateurs à zéro.</w:t>
-      </w:r>
-    </w:p>
-    <w:p>
-      <w:pPr>
-        <w:pStyle w:val="Heading2"/>
-        <w:spacing w:lineRule="auto"/>
-      </w:pPr>
-      <w:r>
-        <w:rPr/>
-        <w:t xml:space="preserve">6. Établissements (administrateur / gestionnaire / caissier)</w:t>
-      </w:r>
-    </w:p>
-    <w:p>
-      <w:pPr>
-        <w:spacing w:lineRule="auto"/>
-      </w:pPr>
-      <w:r>
-        <w:rPr/>
-        <w:drawing>
-          <wp:inline distB="0" distL="0" distR="0" distT="0">
-            <wp:extent cx="5715000" cy="3571875"/>
-            <wp:effectExtent b="0" l="0" r="0" t="0"/>
-            <wp:docPr id="6" name="image-lKD5c_Ag2nr3OygUBKqei.png"/>
-            <a:graphic>
-              <a:graphicData uri="http://schemas.openxmlformats.org/drawingml/2006/picture">
-                <pic:pic>
-                  <pic:nvPicPr>
-                    <pic:cNvPr id="6" name="image-lKD5c_Ag2nr3OygUBKqei.png" descr="Liste des établissements"/>
-                    <pic:cNvPicPr/>
-                  </pic:nvPicPr>
-                  <pic:blipFill>
-                    <a:blip r:embed="rId11" cstate="print"/>
-                    <a:srcRect b="0" l="0" r="0" t="0"/>
-                    <a:stretch>
-                      <a:fillRect/>
-                    </a:stretch>
-                  </pic:blipFill>
-                  <pic:spPr>
-                    <a:xfrm>
-                      <a:off x="0" y="0"/>
-                      <a:ext cx="5715000" cy="3571875"/>
-                    </a:xfrm>
-                    <a:prstGeom prst="rect"/>
-                  </pic:spPr>
-                </pic:pic>
-              </a:graphicData>
-            </a:graphic>
-          </wp:inline>
-        </w:drawing>
-      </w:r>
-    </w:p>
-    <w:p>
-      <w:pPr>
-        <w:numPr>
-          <w:ilvl w:val="0"/>
-          <w:numId w:val="6"/>
-        </w:numPr>
-        <w:spacing w:lineRule="auto"/>
-      </w:pPr>
-      <w:r>
-        <w:rPr/>
-        <w:t xml:space="preserve">Liste des établissements actifs. La création d'un nouvel établissement est réservée à l'administrateur ; la modification et la suppression (logique, sans perte de données) sont possibles pour le personnel autorisé.</w:t>
-      </w:r>
-    </w:p>
-    <w:p>
-      <w:pPr>
-        <w:numPr>
-          <w:ilvl w:val="0"/>
-          <w:numId w:val="6"/>
-        </w:numPr>
-        <w:spacing w:lineRule="auto"/>
-      </w:pPr>
-      <w:r>
-        <w:rPr/>
-        <w:t xml:space="preserve">Un outil « Gérer la structure » permet de créer plusieurs niveaux et classes d'un coup (par exemple taper </w:t>
-      </w:r>
-      <w:r>
-        <w:rPr/>
-        <w:t xml:space="preserve">CP, CE1, CM1</w:t>
-      </w:r>
-      <w:r>
-        <w:rPr/>
-        <w:t xml:space="preserve"> crée les trois niveaux en une seule fois), et de les modifier directement dans le tableau.</w:t>
-      </w:r>
-    </w:p>
-    <w:p>
-      <w:pPr>
-        <w:numPr>
-          <w:ilvl w:val="0"/>
-          <w:numId w:val="6"/>
-        </w:numPr>
-        <w:spacing w:lineRule="auto"/>
-      </w:pPr>
-      <w:r>
-        <w:rPr>
-          <w:b/>
-        </w:rPr>
-        <w:t xml:space="preserve">Délai de grâce</w:t>
-      </w:r>
-      <w:r>
-        <w:rPr/>
-        <w:t xml:space="preserve"> : un champ optionnel permet de définir, pour cet établissement uniquement, un délai différent du délai par défaut (7 jours, réglable dans les Paramètres, §15). Laisser le champ vide pour garder le délai par défaut.</w:t>
-      </w:r>
-    </w:p>
-    <w:p>
-      <w:pPr>
-        <w:numPr>
-          <w:ilvl w:val="0"/>
-          <w:numId w:val="6"/>
-        </w:numPr>
-        <w:spacing w:lineRule="auto"/>
-      </w:pPr>
-      <w:r>
-        <w:rPr/>
-        <w:t xml:space="preserve">Ce menu n'est pas accessible directement à un parent, mais la liste des établissements et des classes lui reste visible pour pouvoir choisir la bonne classe quand il ajoute un enfant (§8) — la création ou la modification restent réservées au personnel.</w:t>
-      </w:r>
-    </w:p>
-    <w:p>
-      <w:pPr>
-        <w:pStyle w:val="Heading2"/>
-        <w:spacing w:lineRule="auto"/>
-      </w:pPr>
-      <w:r>
-        <w:rPr/>
-        <w:t xml:space="preserve">7. Élèves (administrateur / gestionnaire / caissier)</w:t>
-      </w:r>
-    </w:p>
-    <w:p>
-      <w:pPr>
-        <w:spacing w:lineRule="auto"/>
-      </w:pPr>
-      <w:r>
-        <w:rPr/>
-        <w:drawing>
-          <wp:inline distB="0" distL="0" distR="0" distT="0">
-            <wp:extent cx="5715000" cy="3571875"/>
-            <wp:effectExtent b="0" l="0" r="0" t="0"/>
-            <wp:docPr id="7" name="image-al8BPPPeQ5m42H3GOtiVp.png"/>
-            <a:graphic>
-              <a:graphicData uri="http://schemas.openxmlformats.org/drawingml/2006/picture">
-                <pic:pic>
-                  <pic:nvPicPr>
-                    <pic:cNvPr id="7" name="image-al8BPPPeQ5m42H3GOtiVp.png" descr="Liste des élèves"/>
-                    <pic:cNvPicPr/>
-                  </pic:nvPicPr>
-                  <pic:blipFill>
-                    <a:blip r:embed="rId12" cstate="print"/>
-                    <a:srcRect b="0" l="0" r="0" t="0"/>
-                    <a:stretch>
-                      <a:fillRect/>
-                    </a:stretch>
-                  </pic:blipFill>
-                  <pic:spPr>
-                    <a:xfrm>
-                      <a:off x="0" y="0"/>
-                      <a:ext cx="5715000" cy="3571875"/>
-                    </a:xfrm>
-                    <a:prstGeom prst="rect"/>
-                  </pic:spPr>
-                </pic:pic>
-              </a:graphicData>
-            </a:graphic>
-          </wp:inline>
-        </w:drawing>
-      </w:r>
-    </w:p>
-    <w:p>
-      <w:pPr>
-        <w:numPr>
-          <w:ilvl w:val="0"/>
-          <w:numId w:val="7"/>
-        </w:numPr>
-        <w:spacing w:lineRule="auto"/>
-      </w:pPr>
-      <w:r>
-        <w:rPr/>
-        <w:t xml:space="preserve">Liste des élèves avec pagination (reste rapide même avec un grand nombre d'élèves).</w:t>
-      </w:r>
-    </w:p>
-    <w:p>
-      <w:pPr>
-        <w:numPr>
-          <w:ilvl w:val="0"/>
-          <w:numId w:val="7"/>
-        </w:numPr>
-        <w:spacing w:lineRule="auto"/>
-      </w:pPr>
-      <w:r>
-        <w:rPr>
-          <w:b/>
-        </w:rPr>
-        <w:t xml:space="preserve">Recherche</w:t>
-      </w:r>
-      <w:r>
-        <w:rPr/>
-        <w:t xml:space="preserve"> par nom, prénom ou matricule ; filtres par établissement et par statut d'accès.</w:t>
-      </w:r>
-    </w:p>
-    <w:p>
-      <w:pPr>
-        <w:numPr>
-          <w:ilvl w:val="0"/>
-          <w:numId w:val="7"/>
-        </w:numPr>
-        <w:spacing w:lineRule="auto"/>
-      </w:pPr>
-      <w:r>
-        <w:rPr>
-          <w:b/>
-        </w:rPr>
-        <w:t xml:space="preserve">Export</w:t>
-      </w:r>
-      <w:r>
-        <w:rPr/>
-        <w:t xml:space="preserve"> de la liste affichée au format tableau (CSV), via le bouton dédié.</w:t>
-      </w:r>
-    </w:p>
-    <w:p>
-      <w:pPr>
-        <w:numPr>
-          <w:ilvl w:val="0"/>
-          <w:numId w:val="7"/>
-        </w:numPr>
-        <w:spacing w:lineRule="auto"/>
-      </w:pPr>
-      <w:r>
-        <w:rPr/>
-        <w:t xml:space="preserve">La création ou la modification d'un élève se fait dans un formulaire en 3 étapes, pour rester clair et tenir sur un seul écran :</w:t>
-      </w:r>
-    </w:p>
-    <w:p>
-      <w:pPr>
-        <w:spacing w:lineRule="auto"/>
-      </w:pPr>
-      <w:r>
-        <w:rPr/>
-        <w:drawing>
-          <wp:inline distB="0" distL="0" distR="0" distT="0">
-            <wp:extent cx="5715000" cy="3571875"/>
-            <wp:effectExtent b="0" l="0" r="0" t="0"/>
-            <wp:docPr id="8" name="image-uuPSNdc6cGFUdYEuNpPRS.png"/>
-            <a:graphic>
-              <a:graphicData uri="http://schemas.openxmlformats.org/drawingml/2006/picture">
-                <pic:pic>
-                  <pic:nvPicPr>
-                    <pic:cNvPr id="8" name="image-uuPSNdc6cGFUdYEuNpPRS.png" descr="Fiche élève — Informations générales"/>
+                    <pic:cNvPr id="8" name="image-bR1_eiiuHFEGRbAtg1AWB.png" descr="Tableau de bord"/>
                     <pic:cNvPicPr/>
                   </pic:nvPicPr>
                   <pic:blipFill>
@@ -3053,12 +2856,12 @@
           <wp:inline distB="0" distL="0" distR="0" distT="0">
             <wp:extent cx="5715000" cy="3571875"/>
             <wp:effectExtent b="0" l="0" r="0" t="0"/>
-            <wp:docPr id="9" name="image-M1j3S2vyLCgMGmvo1HutI.png"/>
+            <wp:docPr id="9" name="image-1v99SP-qGHFh1beJpiBne.png"/>
             <a:graphic>
               <a:graphicData uri="http://schemas.openxmlformats.org/drawingml/2006/picture">
                 <pic:pic>
                   <pic:nvPicPr>
-                    <pic:cNvPr id="9" name="image-M1j3S2vyLCgMGmvo1HutI.png" descr="Fiche élève — Cantine et affectation"/>
+                    <pic:cNvPr id="9" name="image-1v99SP-qGHFh1beJpiBne.png" descr="Tableau de bord — habillage Premium"/>
                     <pic:cNvPicPr/>
                   </pic:nvPicPr>
                   <pic:blipFill>
@@ -3081,18 +2884,90 @@
           </wp:inline>
         </w:drawing>
       </w:r>
+    </w:p>
+    <w:p>
+      <w:pPr>
+        <w:spacing w:lineRule="auto"/>
+      </w:pPr>
+      <w:r>
+        <w:rPr/>
+        <w:t xml:space="preserve">Vue d'ensemble à l'ouverture de l'application : nombre d'élèves, répartition par statut d'accès, paiements récents, résumé des passages du jour.</w:t>
+      </w:r>
+    </w:p>
+    <w:p>
+      <w:pPr>
+        <w:numPr>
+          <w:ilvl w:val="0"/>
+          <w:numId w:val="7"/>
+        </w:numPr>
+        <w:spacing w:lineRule="auto"/>
+      </w:pPr>
+      <w:r>
+        <w:rPr>
+          <w:b/>
+        </w:rPr>
+        <w:t xml:space="preserve">Administrateur / gestionnaire / caissier</w:t>
+      </w:r>
+      <w:r>
+        <w:rPr/>
+        <w:t xml:space="preserve"> : les chiffres portent sur l'ensemble des élèves.</w:t>
+      </w:r>
+    </w:p>
+    <w:p>
+      <w:pPr>
+        <w:numPr>
+          <w:ilvl w:val="0"/>
+          <w:numId w:val="7"/>
+        </w:numPr>
+        <w:spacing w:lineRule="auto"/>
+      </w:pPr>
+      <w:r>
+        <w:rPr>
+          <w:b/>
+        </w:rPr>
+        <w:t xml:space="preserve">Parent</w:t>
+      </w:r>
+      <w:r>
+        <w:rPr/>
+        <w:t xml:space="preserve"> : les mêmes indicateurs (établissements, élèves, statuts, passages, paiements) portent uniquement sur </w:t>
+      </w:r>
+      <w:r>
+        <w:rPr>
+          <w:b/>
+        </w:rPr>
+        <w:t xml:space="preserve">ses propres enfants</w:t>
+      </w:r>
+      <w:r>
+        <w:rPr/>
+        <w:t xml:space="preserve"> — un parent d'un seul enfant verra par exemple « 1 élève », pas le total de l'établissement. Un parent qui n'a encore aucun enfant rattaché voit des indicateurs à zéro.</w:t>
+      </w:r>
+    </w:p>
+    <w:p>
+      <w:pPr>
+        <w:pStyle w:val="Heading2"/>
+        <w:spacing w:lineRule="auto"/>
+      </w:pPr>
+      <w:r>
+        <w:rPr/>
+        <w:t xml:space="preserve">6. Établissements (administrateur / gestionnaire / caissier)</w:t>
+      </w:r>
+    </w:p>
+    <w:p>
+      <w:pPr>
+        <w:spacing w:lineRule="auto"/>
+      </w:pPr>
       <w:r>
         <w:rPr/>
         <w:drawing>
           <wp:inline distB="0" distL="0" distR="0" distT="0">
             <wp:extent cx="5715000" cy="3571875"/>
             <wp:effectExtent b="0" l="0" r="0" t="0"/>
-            <wp:docPr id="10" name="image-CEbJePa9ak7505ueXhWA7.png"/>
+            <wp:docPr id="10" name="image-4IY5jaAJ8Vo79jRFOKa_c.png"/>
             <a:graphic>
               <a:graphicData uri="http://schemas.openxmlformats.org/drawingml/2006/picture">
                 <pic:pic>
                   <pic:nvPicPr>
-                    <pic:cNvPr id="10" name="image-CEbJePa9ak7505ueXhWA7.png" descr="Fiche élève — Contacts et allergies"/>
+                    <pic:cNvPr id="10" name="image-4IY5jaAJ8Vo79jRFOKa_c.png" descr="Liste des établissements"/>
                     <pic:cNvPicPr/>
                   </pic:nvPicPr>
                   <pic:blipFill>
@@ -3126,7 +3001,7 @@
       </w:pPr>
       <w:r>
         <w:rPr/>
-        <w:t xml:space="preserve">Chaque élève dispose d'un QR Code personnel : consultable, copiable, imprimable — c'est ce même QR Code qui est destiné à être imprimé sur un badge plastifié remis à l'élève (voir l'offre commerciale pour la fabrication des badges).</w:t>
+        <w:t xml:space="preserve">Liste des établissements actifs. La création d'un nouvel établissement est réservée à l'administrateur ; la modification et la suppression (logique, sans perte de données) sont possibles pour le personnel autorisé.</w:t>
       </w:r>
     </w:p>
     <w:p>
@@ -3139,7 +3014,15 @@
       </w:pPr>
       <w:r>
         <w:rPr/>
-        <w:t xml:space="preserve">La suppression d'un élève est réservée à l'administrateur.</w:t>
+        <w:t xml:space="preserve">Un outil « Gérer la structure » permet de créer plusieurs niveaux et classes d'un coup (par exemple taper </w:t>
+      </w:r>
+      <w:r>
+        <w:rPr/>
+        <w:t xml:space="preserve">CP, CE1, CM1</w:t>
+      </w:r>
+      <w:r>
+        <w:rPr/>
+        <w:t xml:space="preserve"> crée les trois niveaux en une seule fois), et de les modifier directement dans le tableau.</w:t>
       </w:r>
     </w:p>
     <w:p>
@@ -3151,97 +3034,27 @@
         <w:spacing w:lineRule="auto"/>
       </w:pPr>
       <w:r>
-        <w:rPr/>
-        <w:t xml:space="preserve">Ce menu n'est pas accessible à un parent (le parent ajoute ses propres enfants depuis « Mes enfants », §8).</w:t>
-      </w:r>
-    </w:p>
-    <w:p>
-      <w:pPr>
-        <w:pStyle w:val="Heading3"/>
-        <w:spacing w:lineRule="auto"/>
-      </w:pPr>
-      <w:r>
-        <w:rPr/>
-        <w:t xml:space="preserve">Allergies et certificat médical</w:t>
-      </w:r>
-    </w:p>
-    <w:p>
-      <w:pPr>
-        <w:numPr>
-          <w:ilvl w:val="0"/>
-          <w:numId w:val="9"/>
-        </w:numPr>
-        <w:spacing w:lineRule="auto"/>
-      </w:pPr>
-      <w:r>
-        <w:rPr/>
-        <w:t xml:space="preserve">Le champ </w:t>
-      </w:r>
-      <w:r>
         <w:rPr>
           <w:b/>
         </w:rPr>
-        <w:t xml:space="preserve">Allergies</w:t>
-      </w:r>
-      <w:r>
-        <w:rPr/>
-        <w:t xml:space="preserve"> ne peut être renseigné </w:t>
-      </w:r>
-      <w:r>
-        <w:rPr>
-          <w:b/>
-        </w:rPr>
-        <w:t xml:space="preserve">qu'après la création</w:t>
-      </w:r>
-      <w:r>
-        <w:rPr/>
-        <w:t xml:space="preserve"> de la fiche de l'élève, pas au moment de la création : le certificat médical qui l'accompagne ne peut être ajouté qu'une fois la fiche déjà enregistrée. Il faut donc d'abord créer l'élève sans allergie, puis ouvrir « Modifier » pour la déclarer.</w:t>
+        <w:t xml:space="preserve">Délai de grâce</w:t>
+      </w:r>
+      <w:r>
+        <w:rPr/>
+        <w:t xml:space="preserve"> : un champ optionnel permet de définir, pour cet établissement uniquement, un délai différent du délai par défaut (7 jours, réglable dans les Paramètres, §15). Laisser le champ vide pour garder le délai par défaut.</w:t>
       </w:r>
     </w:p>
     <w:p>
       <w:pPr>
         <w:numPr>
           <w:ilvl w:val="0"/>
-          <w:numId w:val="9"/>
+          <w:numId w:val="8"/>
         </w:numPr>
         <w:spacing w:lineRule="auto"/>
       </w:pPr>
       <w:r>
         <w:rPr/>
-        <w:t xml:space="preserve">Une fois en modification, un bloc </w:t>
-      </w:r>
-      <w:r>
-        <w:rPr>
-          <w:b/>
-        </w:rPr>
-        <w:t xml:space="preserve">Certificat médical</w:t>
-      </w:r>
-      <w:r>
-        <w:rPr/>
-        <w:t xml:space="preserve"> permet d'</w:t>
-      </w:r>
-      <w:r>
-        <w:rPr>
-          <w:b/>
-        </w:rPr>
-        <w:t xml:space="preserve">ajouter un fichier</w:t>
-      </w:r>
-      <w:r>
-        <w:rPr/>
-        <w:t xml:space="preserve"> (PDF, JPG ou PNG). Une fois le fichier envoyé, un repère « Certificat fourni » apparaît avec un lien pour le consulter et un bouton pour le remplacer si besoin.</w:t>
-      </w:r>
-    </w:p>
-    <w:p>
-      <w:pPr>
-        <w:numPr>
-          <w:ilvl w:val="0"/>
-          <w:numId w:val="9"/>
-        </w:numPr>
-        <w:spacing w:lineRule="auto"/>
-      </w:pPr>
-      <w:r>
-        <w:rPr/>
-        <w:t xml:space="preserve">L'enregistrement de la fiche est bloqué, avec un message clair, si le champ Allergies contient du texte mais qu'aucun certificat n'a été ajouté.</w:t>
+        <w:t xml:space="preserve">Ce menu n'est pas accessible directement à un parent, mais la liste des établissements et des classes lui reste visible pour pouvoir choisir la bonne classe quand il ajoute un enfant (§8) — la création ou la modification restent réservées au personnel.</w:t>
       </w:r>
     </w:p>
     <w:p>
@@ -3251,110 +3064,7 @@
       </w:pPr>
       <w:r>
         <w:rPr/>
-        <w:t xml:space="preserve">8. Mes enfants (espace parent — en libre-service)</w:t>
-      </w:r>
-    </w:p>
-    <w:p>
-      <w:pPr>
-        <w:spacing w:lineRule="auto"/>
-      </w:pPr>
-      <w:r>
-        <w:rPr/>
-        <w:t xml:space="preserve">Un parent connecté accède à l'écran « Mes enfants » pour :</w:t>
-      </w:r>
-    </w:p>
-    <w:p>
-      <w:pPr>
-        <w:numPr>
-          <w:ilvl w:val="0"/>
-          <w:numId w:val="10"/>
-        </w:numPr>
-        <w:spacing w:lineRule="auto"/>
-      </w:pPr>
-      <w:r>
-        <w:rPr>
-          <w:b/>
-        </w:rPr>
-        <w:t xml:space="preserve">Consulter</w:t>
-      </w:r>
-      <w:r>
-        <w:rPr/>
-        <w:t xml:space="preserve"> la liste de ses enfants déjà rattachés (nom, matricule, statut d'accès).</w:t>
-      </w:r>
-    </w:p>
-    <w:p>
-      <w:pPr>
-        <w:numPr>
-          <w:ilvl w:val="0"/>
-          <w:numId w:val="10"/>
-        </w:numPr>
-        <w:spacing w:lineRule="auto"/>
-      </w:pPr>
-      <w:r>
-        <w:rPr>
-          <w:b/>
-        </w:rPr>
-        <w:t xml:space="preserve">Ajouter un enfant</w:t>
-      </w:r>
-      <w:r>
-        <w:rPr/>
-        <w:t xml:space="preserve"> lui-même : il choisit l'établissement dans une liste déroulante, puis la classe correspondante s'affiche automatiquement (les choix proposés dépendent de ce que l'administrateur a déjà configuré), et renseigne le matricule (communiqué par l'établissement à l'inscription), le nom, le prénom, le sexe (facultatif), la date de naissance (facultative), la ville et la commune (obligatoires), le quartier (facultatif).</w:t>
-      </w:r>
-    </w:p>
-    <w:p>
-      <w:pPr>
-        <w:numPr>
-          <w:ilvl w:val="0"/>
-          <w:numId w:val="10"/>
-        </w:numPr>
-        <w:spacing w:lineRule="auto"/>
-      </w:pPr>
-      <w:r>
-        <w:rPr/>
-        <w:t xml:space="preserve">Les coordonnées du parent (nom, téléphone, email) affichées côté établissement pour cet enfant sont </w:t>
-      </w:r>
-      <w:r>
-        <w:rPr>
-          <w:b/>
-        </w:rPr>
-        <w:t xml:space="preserve">reprises automatiquement du compte connecté</w:t>
-      </w:r>
-      <w:r>
-        <w:rPr/>
-        <w:t xml:space="preserve"> — le parent n'a rien à ressaisir.</w:t>
-      </w:r>
-    </w:p>
-    <w:p>
-      <w:pPr>
-        <w:numPr>
-          <w:ilvl w:val="0"/>
-          <w:numId w:val="10"/>
-        </w:numPr>
-        <w:spacing w:lineRule="auto"/>
-      </w:pPr>
-      <w:r>
-        <w:rPr/>
-        <w:t xml:space="preserve">Un enfant ajouté de cette façon démarre avec le statut </w:t>
-      </w:r>
-      <w:r>
-        <w:rPr>
-          <w:b/>
-        </w:rPr>
-        <w:t xml:space="preserve">En attente de paiement</w:t>
-      </w:r>
-      <w:r>
-        <w:rPr/>
-        <w:t xml:space="preserve"> — aucun accès à la cantine tant qu'un paiement n'a pas été enregistré.</w:t>
-      </w:r>
-    </w:p>
-    <w:p>
-      <w:pPr>
-        <w:pStyle w:val="Heading2"/>
-        <w:spacing w:lineRule="auto"/>
-      </w:pPr>
-      <w:r>
-        <w:rPr/>
-        <w:t xml:space="preserve">9. Paiements Mobile Money</w:t>
+        <w:t xml:space="preserve">7. Élèves (administrateur / gestionnaire / caissier)</w:t>
       </w:r>
     </w:p>
     <w:p>
@@ -3367,12 +3077,12 @@
           <wp:inline distB="0" distL="0" distR="0" distT="0">
             <wp:extent cx="5715000" cy="3571875"/>
             <wp:effectExtent b="0" l="0" r="0" t="0"/>
-            <wp:docPr id="11" name="image-Sdl1-NCTiH_T5Ty_o5pZO.png"/>
+            <wp:docPr id="11" name="image-3WV04nteg5GgT5fJAvMD9.png"/>
             <a:graphic>
               <a:graphicData uri="http://schemas.openxmlformats.org/drawingml/2006/picture">
                 <pic:pic>
                   <pic:nvPicPr>
-                    <pic:cNvPr id="11" name="image-Sdl1-NCTiH_T5Ty_o5pZO.png" descr="Écran des paiements"/>
+                    <pic:cNvPr id="11" name="image-3WV04nteg5GgT5fJAvMD9.png" descr="Liste des élèves"/>
                     <pic:cNvPicPr/>
                   </pic:nvPicPr>
                   <pic:blipFill>
@@ -3400,87 +3110,20 @@
       <w:pPr>
         <w:numPr>
           <w:ilvl w:val="0"/>
-          <w:numId w:val="11"/>
+          <w:numId w:val="9"/>
         </w:numPr>
         <w:spacing w:lineRule="auto"/>
       </w:pPr>
       <w:r>
-        <w:rPr>
-          <w:b/>
-        </w:rPr>
-        <w:t xml:space="preserve">Administrateur / gestionnaire / caissier</w:t>
-      </w:r>
-      <w:r>
-        <w:rPr/>
-        <w:t xml:space="preserve"> : voient toutes les transactions et peuvent lancer un paiement pour n'importe quel élève (recherche par nom, prénom ou matricule). Seul l'administrateur peut modifier ou supprimer une transaction.</w:t>
+        <w:rPr/>
+        <w:t xml:space="preserve">Liste des élèves avec pagination (reste rapide même avec un grand nombre d'élèves).</w:t>
       </w:r>
     </w:p>
     <w:p>
       <w:pPr>
         <w:numPr>
           <w:ilvl w:val="0"/>
-          <w:numId w:val="11"/>
-        </w:numPr>
-        <w:spacing w:lineRule="auto"/>
-      </w:pPr>
-      <w:r>
-        <w:rPr>
-          <w:b/>
-        </w:rPr>
-        <w:t xml:space="preserve">Parent</w:t>
-      </w:r>
-      <w:r>
-        <w:rPr/>
-        <w:t xml:space="preserve"> : ne voit que les paiements de ses propres enfants ; en lançant un paiement, seuls ses enfants lui sont proposés (pas de recherche libre parmi tous les élèves).</w:t>
-      </w:r>
-    </w:p>
-    <w:p>
-      <w:pPr>
-        <w:numPr>
-          <w:ilvl w:val="0"/>
-          <w:numId w:val="11"/>
-        </w:numPr>
-        <w:spacing w:lineRule="auto"/>
-      </w:pPr>
-      <w:r>
-        <w:rPr>
-          <w:b/>
-        </w:rPr>
-        <w:t xml:space="preserve">Périodes de paiement</w:t>
-      </w:r>
-      <w:r>
-        <w:rPr/>
-        <w:t xml:space="preserve"> : pour un abonnement, seuls les règlements </w:t>
-      </w:r>
-      <w:r>
-        <w:rPr>
-          <w:b/>
-        </w:rPr>
-        <w:t xml:space="preserve">par trimestre ou par année</w:t>
-      </w:r>
-      <w:r>
-        <w:rPr/>
-        <w:t xml:space="preserve"> sont proposés — pas de paiement mensuel.</w:t>
-      </w:r>
-    </w:p>
-    <w:p>
-      <w:pPr>
-        <w:numPr>
-          <w:ilvl w:val="0"/>
-          <w:numId w:val="11"/>
-        </w:numPr>
-        <w:spacing w:lineRule="auto"/>
-      </w:pPr>
-      <w:r>
-        <w:rPr/>
-        <w:t xml:space="preserve">Opérateurs Mobile Money pris en charge : Orange Money, MTN Money, Moov Money, Wave.</w:t>
-      </w:r>
-    </w:p>
-    <w:p>
-      <w:pPr>
-        <w:numPr>
-          <w:ilvl w:val="0"/>
-          <w:numId w:val="11"/>
+          <w:numId w:val="9"/>
         </w:numPr>
         <w:spacing w:lineRule="auto"/>
       </w:pPr>
@@ -3492,14 +3135,14 @@
       </w:r>
       <w:r>
         <w:rPr/>
-        <w:t xml:space="preserve"> par nom, prénom ou matricule de l'élève ; filtres par statut (En attente / Accepté / Refusé / Annulé), par période (date de début/fin) et par opérateur — tous les filtres peuvent se combiner.</w:t>
+        <w:t xml:space="preserve"> par nom, prénom ou matricule ; filtres par établissement et par statut d'accès.</w:t>
       </w:r>
     </w:p>
     <w:p>
       <w:pPr>
         <w:numPr>
           <w:ilvl w:val="0"/>
-          <w:numId w:val="11"/>
+          <w:numId w:val="9"/>
         </w:numPr>
         <w:spacing w:lineRule="auto"/>
       </w:pPr>
@@ -3511,51 +3154,20 @@
       </w:r>
       <w:r>
         <w:rPr/>
-        <w:t xml:space="preserve"> de la liste affichée au format tableau (CSV).</w:t>
+        <w:t xml:space="preserve"> de la liste affichée au format tableau (CSV), via le bouton dédié.</w:t>
       </w:r>
     </w:p>
     <w:p>
       <w:pPr>
         <w:numPr>
           <w:ilvl w:val="0"/>
-          <w:numId w:val="11"/>
+          <w:numId w:val="9"/>
         </w:numPr>
         <w:spacing w:lineRule="auto"/>
       </w:pPr>
       <w:r>
         <w:rPr/>
-        <w:t xml:space="preserve">Un parent qui tenterait de payer pour un enfant qui n'est pas le sien se voit automatiquement refuser l'opération par le système.</w:t>
-      </w:r>
-    </w:p>
-    <w:p>
-      <w:pPr>
-        <w:ind w:left="284"/>
-        <w:jc w:val="both"/>
-        <w:spacing w:lineRule="auto"/>
-      </w:pPr>
-      <w:r>
-        <w:rPr/>
-        <w:t xml:space="preserve">ℹ️ Le paiement en ligne est réellement connecté à un service de paiement Mobile Money, mais </w:t>
-      </w:r>
-      <w:r>
-        <w:rPr>
-          <w:b/>
-        </w:rPr>
-        <w:t xml:space="preserve">aucun compte marchand réel n'est encore branché</w:t>
-      </w:r>
-      <w:r>
-        <w:rPr/>
-        <w:t xml:space="preserve"> — tant que ce n'est pas fait, une tentative de paiement affiche un message clair (« service de paiement indisponible ou mal configuré ») plutôt qu'un lien de paiement fonctionnel.</w:t>
-      </w:r>
-    </w:p>
-    <w:p>
-      <w:pPr>
-        <w:pStyle w:val="Heading2"/>
-        <w:spacing w:lineRule="auto"/>
-      </w:pPr>
-      <w:r>
-        <w:rPr/>
-        <w:t xml:space="preserve">10. Contrôle d'accès à la cantine</w:t>
+        <w:t xml:space="preserve">La création ou la modification d'un élève se fait dans un formulaire en 3 étapes, pour rester clair et tenir sur un seul écran :</w:t>
       </w:r>
     </w:p>
     <w:p>
@@ -3568,12 +3180,12 @@
           <wp:inline distB="0" distL="0" distR="0" distT="0">
             <wp:extent cx="5715000" cy="3571875"/>
             <wp:effectExtent b="0" l="0" r="0" t="0"/>
-            <wp:docPr id="12" name="image-q2eM7HaXIg7OgaAg0PHcY.png"/>
+            <wp:docPr id="12" name="image-anlauxlbu2o4SRnF6AIEI.png"/>
             <a:graphic>
               <a:graphicData uri="http://schemas.openxmlformats.org/drawingml/2006/picture">
                 <pic:pic>
                   <pic:nvPicPr>
-                    <pic:cNvPr id="12" name="image-q2eM7HaXIg7OgaAg0PHcY.png" descr="Écran de contrôle d'accès"/>
+                    <pic:cNvPr id="12" name="image-anlauxlbu2o4SRnF6AIEI.png" descr="Fiche élève — Informations générales"/>
                     <pic:cNvPicPr/>
                   </pic:nvPicPr>
                   <pic:blipFill>
@@ -3596,108 +3208,18 @@
           </wp:inline>
         </w:drawing>
       </w:r>
-    </w:p>
-    <w:p>
-      <w:pPr>
-        <w:numPr>
-          <w:ilvl w:val="0"/>
-          <w:numId w:val="12"/>
-        </w:numPr>
-        <w:spacing w:lineRule="auto"/>
-      </w:pPr>
-      <w:r>
-        <w:rPr/>
-        <w:t xml:space="preserve">La lecture du QR Code d'un élève à l'entrée de la cantine confirme l'accès en moins d'une seconde : ✓ accès accordé ou ✗ accès refusé (avec le motif affiché).</w:t>
-      </w:r>
-    </w:p>
-    <w:p>
-      <w:pPr>
-        <w:numPr>
-          <w:ilvl w:val="0"/>
-          <w:numId w:val="12"/>
-        </w:numPr>
-        <w:spacing w:lineRule="auto"/>
-      </w:pPr>
-      <w:r>
-        <w:rPr/>
-        <w:t xml:space="preserve">Fonctionne même </w:t>
-      </w:r>
-      <w:r>
-        <w:rPr>
-          <w:b/>
-        </w:rPr>
-        <w:t xml:space="preserve">sans connexion internet</w:t>
-      </w:r>
-      <w:r>
-        <w:rPr/>
-        <w:t xml:space="preserve"> : l'appareil garde en mémoire, pendant 24 heures, la liste des élèves et leur statut d'accès, et se remet à jour automatiquement dès que la connexion revient.</w:t>
-      </w:r>
-    </w:p>
-    <w:p>
-      <w:pPr>
-        <w:numPr>
-          <w:ilvl w:val="0"/>
-          <w:numId w:val="12"/>
-        </w:numPr>
-        <w:spacing w:lineRule="auto"/>
-      </w:pPr>
-      <w:r>
-        <w:rPr/>
-        <w:t xml:space="preserve">Une barre d'état indique si l'appareil est « En ligne » ou « Hors ligne », l'état de ces informations enregistrées à l'avance (absentes, ou datées avec le nombre d'élèves couverts), et propose un bouton pour forcer la mise à jour manuellement.</w:t>
-      </w:r>
-    </w:p>
-    <w:p>
-      <w:pPr>
-        <w:numPr>
-          <w:ilvl w:val="0"/>
-          <w:numId w:val="12"/>
-        </w:numPr>
-        <w:spacing w:lineRule="auto"/>
-      </w:pPr>
-      <w:r>
-        <w:rPr/>
-        <w:t xml:space="preserve">Par défaut, ces informations se mettent à jour automatiquement en arrière-plan dès l'ouverture de l'écran, si une connexion est disponible — ce comportement peut être désactivé dans les Paramètres (§15) pour ne garder que la mise à jour manuelle.</w:t>
-      </w:r>
-    </w:p>
-    <w:p>
-      <w:pPr>
-        <w:numPr>
-          <w:ilvl w:val="0"/>
-          <w:numId w:val="12"/>
-        </w:numPr>
-        <w:spacing w:lineRule="auto"/>
-      </w:pPr>
-      <w:r>
-        <w:rPr/>
-        <w:t xml:space="preserve">Non accessible à un parent.</w:t>
-      </w:r>
-    </w:p>
-    <w:p>
-      <w:pPr>
-        <w:pStyle w:val="Heading2"/>
-        <w:spacing w:lineRule="auto"/>
-      </w:pPr>
-      <w:r>
-        <w:rPr/>
-        <w:t xml:space="preserve">11. Historique des passages</w:t>
-      </w:r>
-    </w:p>
-    <w:p>
-      <w:pPr>
-        <w:spacing w:lineRule="auto"/>
-      </w:pPr>
       <w:r>
         <w:rPr/>
         <w:drawing>
           <wp:inline distB="0" distL="0" distR="0" distT="0">
             <wp:extent cx="5715000" cy="3571875"/>
             <wp:effectExtent b="0" l="0" r="0" t="0"/>
-            <wp:docPr id="13" name="image-gG-67ZLvjR20PAVBfPwEz.png"/>
+            <wp:docPr id="13" name="image-oyJyfuHmaO5_tA0ZYekxY.png"/>
             <a:graphic>
               <a:graphicData uri="http://schemas.openxmlformats.org/drawingml/2006/picture">
                 <pic:pic>
                   <pic:nvPicPr>
-                    <pic:cNvPr id="13" name="image-gG-67ZLvjR20PAVBfPwEz.png" descr="Historique des passages"/>
+                    <pic:cNvPr id="13" name="image-oyJyfuHmaO5_tA0ZYekxY.png" descr="Fiche élève — Cantine et affectation"/>
                     <pic:cNvPicPr/>
                   </pic:nvPicPr>
                   <pic:blipFill>
@@ -3720,71 +3242,18 @@
           </wp:inline>
         </w:drawing>
       </w:r>
-    </w:p>
-    <w:p>
-      <w:pPr>
-        <w:numPr>
-          <w:ilvl w:val="0"/>
-          <w:numId w:val="13"/>
-        </w:numPr>
-        <w:spacing w:lineRule="auto"/>
-      </w:pPr>
-      <w:r>
-        <w:rPr>
-          <w:b/>
-        </w:rPr>
-        <w:t xml:space="preserve">Administrateur / gestionnaire / caissier</w:t>
-      </w:r>
-      <w:r>
-        <w:rPr/>
-        <w:t xml:space="preserve"> : historique complet, filtrable par date, établissement et résultat, avec recherche d'élève ; export au format tableau (CSV) ; la modification ou la suppression d'un passage sont réservées à l'administrateur.</w:t>
-      </w:r>
-    </w:p>
-    <w:p>
-      <w:pPr>
-        <w:numPr>
-          <w:ilvl w:val="0"/>
-          <w:numId w:val="13"/>
-        </w:numPr>
-        <w:spacing w:lineRule="auto"/>
-      </w:pPr>
-      <w:r>
-        <w:rPr>
-          <w:b/>
-        </w:rPr>
-        <w:t xml:space="preserve">Parent</w:t>
-      </w:r>
-      <w:r>
-        <w:rPr/>
-        <w:t xml:space="preserve"> : ne voit que les passages de ses propres enfants ; le filtre par établissement et la colonne « Établissement » du tableau sont masqués (non utiles pour un parent).</w:t>
-      </w:r>
-    </w:p>
-    <w:p>
-      <w:pPr>
-        <w:pStyle w:val="Heading2"/>
-        <w:spacing w:lineRule="auto"/>
-      </w:pPr>
-      <w:r>
-        <w:rPr/>
-        <w:t xml:space="preserve">12. Comptes utilisateurs (administrateur uniquement)</w:t>
-      </w:r>
-    </w:p>
-    <w:p>
-      <w:pPr>
-        <w:spacing w:lineRule="auto"/>
-      </w:pPr>
       <w:r>
         <w:rPr/>
         <w:drawing>
           <wp:inline distB="0" distL="0" distR="0" distT="0">
             <wp:extent cx="5715000" cy="3571875"/>
             <wp:effectExtent b="0" l="0" r="0" t="0"/>
-            <wp:docPr id="14" name="image-hwlYTC1wziJPNldMA4WZd.png"/>
+            <wp:docPr id="14" name="image-Mq7HcpEX7XTY2EH5GPdhC.png"/>
             <a:graphic>
               <a:graphicData uri="http://schemas.openxmlformats.org/drawingml/2006/picture">
                 <pic:pic>
                   <pic:nvPicPr>
-                    <pic:cNvPr id="14" name="image-hwlYTC1wziJPNldMA4WZd.png" descr="Liste des comptes utilisateurs"/>
+                    <pic:cNvPr id="14" name="image-Mq7HcpEX7XTY2EH5GPdhC.png" descr="Fiche élève — Contacts et allergies"/>
                     <pic:cNvPicPr/>
                   </pic:nvPicPr>
                   <pic:blipFill>
@@ -3812,270 +3281,188 @@
       <w:pPr>
         <w:numPr>
           <w:ilvl w:val="0"/>
-          <w:numId w:val="14"/>
+          <w:numId w:val="10"/>
         </w:numPr>
         <w:spacing w:lineRule="auto"/>
       </w:pPr>
       <w:r>
         <w:rPr/>
-        <w:t xml:space="preserve">Création d'un compte : nom, prénom, email, </w:t>
+        <w:t xml:space="preserve">Chaque élève dispose d'un QR Code personnel : consultable, copiable, imprimable — c'est ce même QR Code qui est destiné à être imprimé sur un badge plastifié remis à l'élève (voir l'offre commerciale pour la fabrication des badges).</w:t>
+      </w:r>
+    </w:p>
+    <w:p>
+      <w:pPr>
+        <w:numPr>
+          <w:ilvl w:val="0"/>
+          <w:numId w:val="10"/>
+        </w:numPr>
+        <w:spacing w:lineRule="auto"/>
+      </w:pPr>
+      <w:r>
+        <w:rPr/>
+        <w:t xml:space="preserve">La suppression d'un élève est réservée à l'administrateur.</w:t>
+      </w:r>
+    </w:p>
+    <w:p>
+      <w:pPr>
+        <w:numPr>
+          <w:ilvl w:val="0"/>
+          <w:numId w:val="10"/>
+        </w:numPr>
+        <w:spacing w:lineRule="auto"/>
+      </w:pPr>
+      <w:r>
+        <w:rPr/>
+        <w:t xml:space="preserve">Ce menu n'est pas accessible à un parent (le parent ajoute ses propres enfants depuis « Mes enfants », §8).</w:t>
+      </w:r>
+    </w:p>
+    <w:p>
+      <w:pPr>
+        <w:pStyle w:val="Heading3"/>
+        <w:spacing w:lineRule="auto"/>
+      </w:pPr>
+      <w:r>
+        <w:rPr/>
+        <w:t xml:space="preserve">Allergies et certificat médical</w:t>
+      </w:r>
+    </w:p>
+    <w:p>
+      <w:pPr>
+        <w:numPr>
+          <w:ilvl w:val="0"/>
+          <w:numId w:val="11"/>
+        </w:numPr>
+        <w:spacing w:lineRule="auto"/>
+      </w:pPr>
+      <w:r>
+        <w:rPr/>
+        <w:t xml:space="preserve">Le champ </w:t>
       </w:r>
       <w:r>
         <w:rPr>
           <w:b/>
         </w:rPr>
-        <w:t xml:space="preserve">numéro de téléphone (obligatoire, unique)</w:t>
-      </w:r>
-      <w:r>
-        <w:rPr/>
-        <w:t xml:space="preserve">, mot de passe, rôle (Administrateur, Gestionnaire, Caissier ou Parent).</w:t>
-      </w:r>
-    </w:p>
-    <w:p>
-      <w:pPr>
-        <w:numPr>
-          <w:ilvl w:val="0"/>
-          <w:numId w:val="14"/>
-        </w:numPr>
-        <w:spacing w:lineRule="auto"/>
-      </w:pPr>
-      <w:r>
-        <w:rPr/>
-        <w:t xml:space="preserve">Modification, changement de rôle directement dans le tableau, désactivation/réactivation, suppression définitive.</w:t>
-      </w:r>
-    </w:p>
-    <w:p>
-      <w:pPr>
-        <w:numPr>
-          <w:ilvl w:val="0"/>
-          <w:numId w:val="14"/>
-        </w:numPr>
-        <w:spacing w:lineRule="auto"/>
-      </w:pPr>
-      <w:r>
-        <w:rPr/>
-        <w:t xml:space="preserve">Impossible de désactiver ou de supprimer le tout dernier compte administrateur du système.</w:t>
-      </w:r>
-    </w:p>
-    <w:p>
-      <w:pPr>
-        <w:numPr>
-          <w:ilvl w:val="0"/>
-          <w:numId w:val="14"/>
-        </w:numPr>
-        <w:spacing w:lineRule="auto"/>
-      </w:pPr>
-      <w:r>
-        <w:rPr/>
-        <w:t xml:space="preserve">Impossible de désactiver ou de supprimer son propre compte.</w:t>
-      </w:r>
-    </w:p>
-    <w:p>
-      <w:pPr>
-        <w:numPr>
-          <w:ilvl w:val="0"/>
-          <w:numId w:val="14"/>
-        </w:numPr>
-        <w:spacing w:lineRule="auto"/>
-      </w:pPr>
+        <w:t xml:space="preserve">Allergies</w:t>
+      </w:r>
+      <w:r>
+        <w:rPr/>
+        <w:t xml:space="preserve"> ne peut être renseigné </w:t>
+      </w:r>
       <w:r>
         <w:rPr>
           <w:b/>
         </w:rPr>
-        <w:t xml:space="preserve">Recherche</w:t>
-      </w:r>
-      <w:r>
-        <w:rPr/>
-        <w:t xml:space="preserve"> par email, nom, prénom ou téléphone ; filtres par rôle, par statut (actif ou inactif) et par période de création — tous combinables.</w:t>
-      </w:r>
-    </w:p>
-    <w:p>
-      <w:pPr>
-        <w:pStyle w:val="Heading2"/>
-        <w:spacing w:lineRule="auto"/>
-      </w:pPr>
-      <w:r>
-        <w:rPr/>
-        <w:t xml:space="preserve">13. Parents (rattacher des enfants — administrateur uniquement)</w:t>
+        <w:t xml:space="preserve">qu'après la création</w:t>
+      </w:r>
+      <w:r>
+        <w:rPr/>
+        <w:t xml:space="preserve"> de la fiche de l'élève, pas au moment de la création : le certificat médical qui l'accompagne ne peut être ajouté qu'une fois la fiche déjà enregistrée. Il faut donc d'abord créer l'élève sans allergie, puis ouvrir « Modifier » pour la déclarer.</w:t>
       </w:r>
     </w:p>
     <w:p>
       <w:pPr>
         <w:numPr>
           <w:ilvl w:val="0"/>
-          <w:numId w:val="15"/>
+          <w:numId w:val="11"/>
         </w:numPr>
         <w:spacing w:lineRule="auto"/>
       </w:pPr>
       <w:r>
         <w:rPr/>
-        <w:t xml:space="preserve">Permet de rattacher un compte parent à un ou plusieurs élèves.</w:t>
-      </w:r>
-    </w:p>
-    <w:p>
-      <w:pPr>
-        <w:numPr>
-          <w:ilvl w:val="0"/>
-          <w:numId w:val="15"/>
-        </w:numPr>
-        <w:spacing w:lineRule="auto"/>
-      </w:pPr>
+        <w:t xml:space="preserve">Une fois en modification, un bloc </w:t>
+      </w:r>
       <w:r>
         <w:rPr>
           <w:b/>
         </w:rPr>
-        <w:t xml:space="preserve">Choix du compte parent</w:t>
-      </w:r>
-      <w:r>
-        <w:rPr/>
-        <w:t xml:space="preserve"> : recherche par numéro de téléphone, nom ou prénom (le compte doit déjà exister — le créer d'abord dans « Comptes utilisateurs », ou passer par une demande d'accès validée, §3).</w:t>
-      </w:r>
-    </w:p>
-    <w:p>
-      <w:pPr>
-        <w:numPr>
-          <w:ilvl w:val="0"/>
-          <w:numId w:val="15"/>
-        </w:numPr>
-        <w:spacing w:lineRule="auto"/>
-      </w:pPr>
+        <w:t xml:space="preserve">Certificat médical</w:t>
+      </w:r>
+      <w:r>
+        <w:rPr/>
+        <w:t xml:space="preserve"> permet d'</w:t>
+      </w:r>
       <w:r>
         <w:rPr>
           <w:b/>
         </w:rPr>
-        <w:t xml:space="preserve">Choix des enfants</w:t>
-      </w:r>
-      <w:r>
-        <w:rPr/>
-        <w:t xml:space="preserve"> : recherche par matricule, nom ou prénom, plusieurs enfants peuvent être sélectionnés à la fois.</w:t>
+        <w:t xml:space="preserve">ajouter un fichier</w:t>
+      </w:r>
+      <w:r>
+        <w:rPr/>
+        <w:t xml:space="preserve"> (PDF, JPG ou PNG). Une fois le fichier envoyé, un repère « Certificat fourni » apparaît avec un lien pour le consulter et un bouton pour le remplacer si besoin.</w:t>
       </w:r>
     </w:p>
     <w:p>
       <w:pPr>
         <w:numPr>
           <w:ilvl w:val="0"/>
-          <w:numId w:val="15"/>
+          <w:numId w:val="11"/>
         </w:numPr>
         <w:spacing w:lineRule="auto"/>
       </w:pPr>
       <w:r>
         <w:rPr/>
-        <w:t xml:space="preserve">Modification des enfants rattachés, suppression du lien (les fiches des élèves ne sont pas supprimées pour autant).</w:t>
-      </w:r>
-    </w:p>
-    <w:p>
-      <w:pPr>
-        <w:numPr>
-          <w:ilvl w:val="0"/>
-          <w:numId w:val="15"/>
-        </w:numPr>
-        <w:spacing w:lineRule="auto"/>
-      </w:pPr>
+        <w:t xml:space="preserve">L'enregistrement de la fiche est bloqué, avec un message clair, si le champ Allergies contient du texte mais qu'aucun certificat n'a été ajouté.</w:t>
+      </w:r>
+    </w:p>
+    <w:p>
+      <w:pPr>
+        <w:pStyle w:val="Heading2"/>
+        <w:spacing w:lineRule="auto"/>
+      </w:pPr>
+      <w:r>
+        <w:rPr/>
+        <w:t xml:space="preserve">8. Mes enfants (espace parent — en libre-service)</w:t>
+      </w:r>
+    </w:p>
+    <w:p>
+      <w:pPr>
+        <w:pStyle w:val="Heading3"/>
+        <w:spacing w:lineRule="auto"/>
+      </w:pPr>
+      <w:r>
+        <w:rPr/>
+        <w:t xml:space="preserve">Ce qui se passe quand un parent se connecte</w:t>
+      </w:r>
+    </w:p>
+    <w:p>
+      <w:pPr>
+        <w:spacing w:lineRule="auto"/>
+      </w:pPr>
+      <w:r>
+        <w:rPr/>
+        <w:t xml:space="preserve">Une fois connecté avec son email (ou son identifiant) et son mot de passe, un parent arrive d'abord sur le </w:t>
+      </w:r>
       <w:r>
         <w:rPr>
           <w:b/>
         </w:rPr>
-        <w:t xml:space="preserve">Recherche</w:t>
-      </w:r>
-      <w:r>
-        <w:rPr/>
-        <w:t xml:space="preserve"> sur la liste principale par </w:t>
+        <w:t xml:space="preserve">Tableau de bord</w:t>
+      </w:r>
+      <w:r>
+        <w:rPr/>
+        <w:t xml:space="preserve"> (§5), avec ses propres statistiques (nombre d'enfants, statut d'accès, passages récents). Le menu de gauche, spécifique au rôle Parent, ne propose que quatre écrans : </w:t>
       </w:r>
       <w:r>
         <w:rPr>
           <w:b/>
         </w:rPr>
-        <w:t xml:space="preserve">email ou numéro de téléphone</w:t>
-      </w:r>
-      <w:r>
-        <w:rPr/>
-        <w:t xml:space="preserve"> du compte parent.</w:t>
-      </w:r>
-    </w:p>
-    <w:p>
-      <w:pPr>
-        <w:pStyle w:val="Heading2"/>
-        <w:spacing w:lineRule="auto"/>
-      </w:pPr>
-      <w:r>
-        <w:rPr/>
-        <w:t xml:space="preserve">14. Rapports (administrateur / gestionnaire / caissier) — première version</w:t>
-      </w:r>
-    </w:p>
-    <w:p>
-      <w:pPr>
-        <w:ind w:left="284"/>
-        <w:jc w:val="both"/>
-        <w:spacing w:lineRule="auto"/>
-      </w:pPr>
-      <w:r>
-        <w:rPr/>
-        <w:t xml:space="preserve">Première version de ce module, mise à disposition pour recueillir des retours avant amélioration. Non accessible à un parent.</w:t>
-      </w:r>
-    </w:p>
-    <w:p>
-      <w:pPr>
-        <w:numPr>
-          <w:ilvl w:val="0"/>
-          <w:numId w:val="16"/>
-        </w:numPr>
-        <w:spacing w:lineRule="auto"/>
-      </w:pPr>
-      <w:r>
-        <w:rPr/>
-        <w:t xml:space="preserve">On choisit une période (date de début/fin) et, si besoin, un établissement (ce filtre ne s'applique qu'aux passages à la cantine), puis on clique sur </w:t>
+        <w:t xml:space="preserve">Tableau de bord</w:t>
+      </w:r>
+      <w:r>
+        <w:rPr/>
+        <w:t xml:space="preserve">, </w:t>
       </w:r>
       <w:r>
         <w:rPr>
           <w:b/>
         </w:rPr>
-        <w:t xml:space="preserve">« Générer le rapport »</w:t>
-      </w:r>
-      <w:r>
-        <w:rPr/>
-        <w:t xml:space="preserve">.</w:t>
-      </w:r>
-    </w:p>
-    <w:p>
-      <w:pPr>
-        <w:numPr>
-          <w:ilvl w:val="0"/>
-          <w:numId w:val="16"/>
-        </w:numPr>
-        <w:spacing w:lineRule="auto"/>
-      </w:pPr>
-      <w:r>
-        <w:rPr/>
-        <w:t xml:space="preserve">Trois onglets s'affichent une fois le rapport généré :</w:t>
-      </w:r>
-    </w:p>
-    <w:p>
-      <w:pPr>
-        <w:numPr>
-          <w:ilvl w:val="1"/>
-          <w:numId w:val="17"/>
-        </w:numPr>
-        <w:spacing w:lineRule="auto"/>
-      </w:pPr>
-      <w:r>
-        <w:rPr>
-          <w:b/>
-        </w:rPr>
-        <w:t xml:space="preserve">Résumé</w:t>
-      </w:r>
-      <w:r>
-        <w:rPr/>
-        <w:t xml:space="preserve"> : montant total encaissé, répartition des paiements par statut, répartition des passages par résultat, taux d'accès.</w:t>
-      </w:r>
-    </w:p>
-    <w:p>
-      <w:pPr>
-        <w:numPr>
-          <w:ilvl w:val="1"/>
-          <w:numId w:val="17"/>
-        </w:numPr>
-        <w:spacing w:lineRule="auto"/>
-      </w:pPr>
+        <w:t xml:space="preserve">Mes enfants</w:t>
+      </w:r>
+      <w:r>
+        <w:rPr/>
+        <w:t xml:space="preserve">, </w:t>
+      </w:r>
       <w:r>
         <w:rPr>
           <w:b/>
@@ -4084,87 +3471,17 @@
       </w:r>
       <w:r>
         <w:rPr/>
-        <w:t xml:space="preserve"> : liste détaillée des transactions de la période.</w:t>
-      </w:r>
-    </w:p>
-    <w:p>
-      <w:pPr>
-        <w:numPr>
-          <w:ilvl w:val="1"/>
-          <w:numId w:val="17"/>
-        </w:numPr>
-        <w:spacing w:lineRule="auto"/>
-      </w:pPr>
+        <w:t xml:space="preserve"> et </w:t>
+      </w:r>
       <w:r>
         <w:rPr>
           <w:b/>
         </w:rPr>
-        <w:t xml:space="preserve">Passages</w:t>
-      </w:r>
-      <w:r>
-        <w:rPr/>
-        <w:t xml:space="preserve"> : liste détaillée des passages à la cantine sur la période.</w:t>
-      </w:r>
-    </w:p>
-    <w:p>
-      <w:pPr>
-        <w:numPr>
-          <w:ilvl w:val="0"/>
-          <w:numId w:val="16"/>
-        </w:numPr>
-        <w:spacing w:lineRule="auto"/>
-      </w:pPr>
-      <w:r>
-        <w:rPr>
-          <w:b/>
-        </w:rPr>
-        <w:t xml:space="preserve">Exporter en Excel</w:t>
-      </w:r>
-      <w:r>
-        <w:rPr/>
-        <w:t xml:space="preserve"> : télécharge un fichier avec 3 feuilles (Résumé / Paiements / Passages) couvrant toute la période choisie.</w:t>
-      </w:r>
-    </w:p>
-    <w:p>
-      <w:pPr>
-        <w:numPr>
-          <w:ilvl w:val="0"/>
-          <w:numId w:val="16"/>
-        </w:numPr>
-        <w:spacing w:lineRule="auto"/>
-      </w:pPr>
-      <w:r>
-        <w:rPr>
-          <w:b/>
-        </w:rPr>
-        <w:t xml:space="preserve">Imprimer / PDF</w:t>
-      </w:r>
-      <w:r>
-        <w:rPr/>
-        <w:t xml:space="preserve"> (par onglet) : ouvre la fenêtre d'impression du navigateur, limitée au contenu de l'onglet affiché — choisir « Enregistrer au format PDF » pour obtenir un fichier PDF.</w:t>
-      </w:r>
-    </w:p>
-    <w:p>
-      <w:pPr>
-        <w:numPr>
-          <w:ilvl w:val="0"/>
-          <w:numId w:val="16"/>
-        </w:numPr>
-        <w:spacing w:lineRule="auto"/>
-      </w:pPr>
-      <w:r>
-        <w:rPr/>
-        <w:t xml:space="preserve">Sur une période avec beaucoup de données, un message avertit si le rapport a dû être limité (au delà de 10 000 lignes) : il suffit alors de réduire la période choisie.</w:t>
-      </w:r>
-    </w:p>
-    <w:p>
-      <w:pPr>
-        <w:pStyle w:val="Heading2"/>
-        <w:spacing w:lineRule="auto"/>
-      </w:pPr>
-      <w:r>
-        <w:rPr/>
-        <w:t xml:space="preserve">15. Paramètres (administrateur uniquement)</w:t>
+        <w:t xml:space="preserve">Historique</w:t>
+      </w:r>
+      <w:r>
+        <w:rPr/>
+        <w:t xml:space="preserve"> — tous les menus réservés au personnel (Établissements, Élèves, Scan Réfectoire, Utilisateurs, etc.) sont absents. En cliquant sur « Mes enfants » dans ce menu, le parent arrive sur l'écran suivant :</w:t>
       </w:r>
     </w:p>
     <w:p>
@@ -4177,12 +3494,12 @@
           <wp:inline distB="0" distL="0" distR="0" distT="0">
             <wp:extent cx="5715000" cy="3571875"/>
             <wp:effectExtent b="0" l="0" r="0" t="0"/>
-            <wp:docPr id="15" name="image-Vb3Ot8yI1eoPEjWkxjzSD.png"/>
+            <wp:docPr id="15" name="image-IRW-gkoITnvNowNFzuDtL.png"/>
             <a:graphic>
               <a:graphicData uri="http://schemas.openxmlformats.org/drawingml/2006/picture">
                 <pic:pic>
                   <pic:nvPicPr>
-                    <pic:cNvPr id="15" name="image-Vb3Ot8yI1eoPEjWkxjzSD.png" descr="Écran des paramètres"/>
+                    <pic:cNvPr id="15" name="image-IRW-gkoITnvNowNFzuDtL.png" descr="Mes enfants — liste des enfants rattachés"/>
                     <pic:cNvPicPr/>
                   </pic:nvPicPr>
                   <pic:blipFill>
@@ -4208,310 +3525,40 @@
     </w:p>
     <w:p>
       <w:pPr>
-        <w:spacing w:lineRule="auto"/>
-      </w:pPr>
-      <w:r>
-        <w:rPr/>
-        <w:t xml:space="preserve">Les réglages sont regroupés par thème dans des blocs dépliables (Contrôle d'accès cantine, Notifications, Paiements, Apparence, Organisation) — cliquer sur l'intitulé d'un bloc l'ouvre ou le referme.</w:t>
-      </w:r>
-    </w:p>
-    <w:p>
-      <w:pPr>
         <w:numPr>
           <w:ilvl w:val="0"/>
-          <w:numId w:val="18"/>
+          <w:numId w:val="12"/>
         </w:numPr>
         <w:spacing w:lineRule="auto"/>
       </w:pPr>
-      <w:r>
-        <w:rPr/>
-        <w:t xml:space="preserve">Activer ou désactiver les notifications par email et par SMS.</w:t>
-      </w:r>
-    </w:p>
-    <w:p>
-      <w:pPr>
-        <w:numPr>
-          <w:ilvl w:val="0"/>
-          <w:numId w:val="18"/>
-        </w:numPr>
-        <w:spacing w:lineRule="auto"/>
-      </w:pPr>
-      <w:r>
-        <w:rPr/>
-        <w:t xml:space="preserve">Activer ou désactiver la mise à jour automatique des informations hors-ligne du contrôle d'accès (§10) — activée par défaut.</w:t>
-      </w:r>
-    </w:p>
-    <w:p>
-      <w:pPr>
-        <w:numPr>
-          <w:ilvl w:val="0"/>
-          <w:numId w:val="18"/>
-        </w:numPr>
-        <w:spacing w:lineRule="auto"/>
-      </w:pPr>
-      <w:r>
-        <w:rPr/>
-        <w:t xml:space="preserve">Mode de paiement : par </w:t>
-      </w:r>
       <w:r>
         <w:rPr>
           <w:b/>
         </w:rPr>
-        <w:t xml:space="preserve">abonnement</w:t>
-      </w:r>
-      <w:r>
-        <w:rPr/>
-        <w:t xml:space="preserve"> (accès pour tout le trimestre ou l'année) ou par </w:t>
-      </w:r>
+        <w:t xml:space="preserve">Consulter</w:t>
+      </w:r>
+      <w:r>
+        <w:rPr/>
+        <w:t xml:space="preserve"> la liste de ses enfants déjà rattachés : nom, matricule, statut d'accès (Autorisé, En attente de paiement, Période de grâce, Suspendu).</w:t>
+      </w:r>
+    </w:p>
+    <w:p>
+      <w:pPr>
+        <w:numPr>
+          <w:ilvl w:val="0"/>
+          <w:numId w:val="12"/>
+        </w:numPr>
+        <w:spacing w:lineRule="auto"/>
+      </w:pPr>
       <w:r>
         <w:rPr>
           <w:b/>
         </w:rPr>
-        <w:t xml:space="preserve">crédits</w:t>
-      </w:r>
-      <w:r>
-        <w:rPr/>
-        <w:t xml:space="preserve"> (montant débité à chaque repas, avec un tarif réglable) — les deux modes peuvent coexister, chaque élève utilisant l'un ou l'autre.</w:t>
-      </w:r>
-    </w:p>
-    <w:p>
-      <w:pPr>
-        <w:numPr>
-          <w:ilvl w:val="0"/>
-          <w:numId w:val="18"/>
-        </w:numPr>
-        <w:spacing w:lineRule="auto"/>
-      </w:pPr>
-      <w:r>
-        <w:rPr/>
-        <w:t xml:space="preserve">Délai de grâce par défaut (7 jours), qui peut être ajusté établissement par établissement (§6).</w:t>
-      </w:r>
-    </w:p>
-    <w:p>
-      <w:pPr>
-        <w:numPr>
-          <w:ilvl w:val="0"/>
-          <w:numId w:val="18"/>
-        </w:numPr>
-        <w:spacing w:lineRule="auto"/>
-      </w:pPr>
-      <w:r>
-        <w:rPr/>
-        <w:t xml:space="preserve">Service de paiement actif.</w:t>
-      </w:r>
-    </w:p>
-    <w:p>
-      <w:pPr>
-        <w:numPr>
-          <w:ilvl w:val="0"/>
-          <w:numId w:val="18"/>
-        </w:numPr>
-        <w:spacing w:lineRule="auto"/>
-      </w:pPr>
-      <w:r>
-        <w:rPr/>
-        <w:t xml:space="preserve">Image de fond personnalisée pour l'écran de connexion.</w:t>
-      </w:r>
-    </w:p>
-    <w:p>
-      <w:pPr>
-        <w:pStyle w:val="Heading3"/>
-        <w:spacing w:lineRule="auto"/>
-      </w:pPr>
-      <w:r>
-        <w:rPr/>
-        <w:t xml:space="preserve">Personnalisation par établissement (image, nom, coordonnées)</w:t>
-      </w:r>
-    </w:p>
-    <w:p>
-      <w:pPr>
-        <w:spacing w:lineRule="auto"/>
-      </w:pPr>
-      <w:r>
-        <w:rPr/>
-        <w:t xml:space="preserve">Une section « Organisation » permet d'adapter l'application à l'identité du client :</w:t>
-      </w:r>
-    </w:p>
-    <w:p>
-      <w:pPr>
-        <w:numPr>
-          <w:ilvl w:val="0"/>
-          <w:numId w:val="19"/>
-        </w:numPr>
-        <w:spacing w:lineRule="auto"/>
-      </w:pPr>
-      <w:r>
-        <w:rPr>
-          <w:b/>
-        </w:rPr>
-        <w:t xml:space="preserve">Logo</w:t>
-      </w:r>
-      <w:r>
-        <w:rPr/>
-        <w:t xml:space="preserve"> : à téléverser directement depuis cet écran — il remplace l'icône par défaut en haut de chaque page de l'application.</w:t>
-      </w:r>
-    </w:p>
-    <w:p>
-      <w:pPr>
-        <w:numPr>
-          <w:ilvl w:val="0"/>
-          <w:numId w:val="19"/>
-        </w:numPr>
-        <w:spacing w:lineRule="auto"/>
-      </w:pPr>
-      <w:r>
-        <w:rPr>
-          <w:b/>
-        </w:rPr>
-        <w:t xml:space="preserve">Nom du client</w:t>
-      </w:r>
-      <w:r>
-        <w:rPr/>
-        <w:t xml:space="preserve"> : remplace « Cantine Connect » dans l'en-tête de l'application.</w:t>
-      </w:r>
-    </w:p>
-    <w:p>
-      <w:pPr>
-        <w:numPr>
-          <w:ilvl w:val="0"/>
-          <w:numId w:val="19"/>
-        </w:numPr>
-        <w:spacing w:lineRule="auto"/>
-      </w:pPr>
-      <w:r>
-        <w:rPr>
-          <w:b/>
-        </w:rPr>
-        <w:t xml:space="preserve">Adresse / lieu</w:t>
-      </w:r>
-      <w:r>
-        <w:rPr/>
-        <w:t xml:space="preserve">, </w:t>
-      </w:r>
-      <w:r>
-        <w:rPr>
-          <w:b/>
-        </w:rPr>
-        <w:t xml:space="preserve">téléphone</w:t>
-      </w:r>
-      <w:r>
-        <w:rPr/>
-        <w:t xml:space="preserve">, </w:t>
-      </w:r>
-      <w:r>
-        <w:rPr>
-          <w:b/>
-        </w:rPr>
-        <w:t xml:space="preserve">email</w:t>
-      </w:r>
-      <w:r>
-        <w:rPr/>
-        <w:t xml:space="preserve"> : coordonnées de contact affichées comme référence.</w:t>
-      </w:r>
-    </w:p>
-    <w:p>
-      <w:pPr>
-        <w:numPr>
-          <w:ilvl w:val="0"/>
-          <w:numId w:val="19"/>
-        </w:numPr>
-        <w:spacing w:lineRule="auto"/>
-      </w:pPr>
-      <w:r>
-        <w:rPr>
-          <w:b/>
-        </w:rPr>
-        <w:t xml:space="preserve">Numéro Mobile Money</w:t>
-      </w:r>
-      <w:r>
-        <w:rPr/>
-        <w:t xml:space="preserve"> : numéro communiqué aux parents pour un envoi manuel d'argent — c'est une information affichée aux parents, elle ne change rien au fonctionnement des paiements en ligne (§9).</w:t>
-      </w:r>
-    </w:p>
-    <w:p>
-      <w:pPr>
-        <w:spacing w:lineRule="auto"/>
-      </w:pPr>
-      <w:r>
-        <w:rPr/>
-        <w:t xml:space="preserve">Tant qu'aucune de ces informations n'est renseignée, l'application garde son apparence par défaut (icône par défaut et nom « Cantine Connect »).</w:t>
-      </w:r>
-    </w:p>
-    <w:p>
-      <w:pPr>
-        <w:pStyle w:val="Heading2"/>
-        <w:spacing w:lineRule="auto"/>
-      </w:pPr>
-      <w:r>
-        <w:rPr/>
-        <w:t xml:space="preserve">16. Paiement et notifications — état de la mise en service</w:t>
-      </w:r>
-    </w:p>
-    <w:p>
-      <w:pPr>
-        <w:numPr>
-          <w:ilvl w:val="0"/>
-          <w:numId w:val="20"/>
-        </w:numPr>
-        <w:spacing w:lineRule="auto"/>
-      </w:pPr>
-      <w:r>
-        <w:rPr>
-          <w:b/>
-        </w:rPr>
-        <w:t xml:space="preserve">Paiement</w:t>
-      </w:r>
-      <w:r>
-        <w:rPr/>
-        <w:t xml:space="preserve"> : la connexion avec le service de paiement Mobile Money est réelle, pas une simulation — dès que le client fournit ses identifiants marchands réels, le paiement fonctionne sans développement supplémentaire. Sans ces identifiants, une tentative de paiement échoue avec un message clair plutôt qu'un lien qui ne fonctionne pas.</w:t>
-      </w:r>
-    </w:p>
-    <w:p>
-      <w:pPr>
-        <w:numPr>
-          <w:ilvl w:val="0"/>
-          <w:numId w:val="20"/>
-        </w:numPr>
-        <w:spacing w:lineRule="auto"/>
-      </w:pPr>
-      <w:r>
-        <w:rPr>
-          <w:b/>
-        </w:rPr>
-        <w:t xml:space="preserve">SMS</w:t>
-      </w:r>
-      <w:r>
-        <w:rPr/>
-        <w:t xml:space="preserve"> : la connexion avec le fournisseur de SMS est réelle. Tant qu'aucun compte n'est configuré, les SMS sont simplement enregistrés dans les journaux techniques (aucun envoi réel, et cela ne bloque rien pour l'utilisateur).</w:t>
-      </w:r>
-    </w:p>
-    <w:p>
-      <w:pPr>
-        <w:numPr>
-          <w:ilvl w:val="0"/>
-          <w:numId w:val="20"/>
-        </w:numPr>
-        <w:spacing w:lineRule="auto"/>
-      </w:pPr>
-      <w:r>
-        <w:rPr>
-          <w:b/>
-        </w:rPr>
-        <w:t xml:space="preserve">Email</w:t>
-      </w:r>
-      <w:r>
-        <w:rPr/>
-        <w:t xml:space="preserve"> : fonctionne dès que les paramètres techniques d'envoi (compte email dédié) sont renseignés.</w:t>
-      </w:r>
-    </w:p>
-    <w:p>
-      <w:pPr>
-        <w:pStyle w:val="Heading2"/>
-        <w:spacing w:lineRule="auto"/>
-      </w:pPr>
-      <w:r>
-        <w:rPr/>
-        <w:t xml:space="preserve">17. Support et à propos</w:t>
+        <w:t xml:space="preserve">Ajouter un enfant</w:t>
+      </w:r>
+      <w:r>
+        <w:rPr/>
+        <w:t xml:space="preserve"> lui-même, via le bouton « Ajouter un enfant » qui ouvre un petit formulaire :</w:t>
       </w:r>
     </w:p>
     <w:p>
@@ -4524,12 +3571,12 @@
           <wp:inline distB="0" distL="0" distR="0" distT="0">
             <wp:extent cx="5715000" cy="3571875"/>
             <wp:effectExtent b="0" l="0" r="0" t="0"/>
-            <wp:docPr id="16" name="image-aV4rMg6TlD80tSd8QqIwY.png"/>
+            <wp:docPr id="16" name="image-9QGWewLEExj2dJEqwCY_2.png"/>
             <a:graphic>
               <a:graphicData uri="http://schemas.openxmlformats.org/drawingml/2006/picture">
                 <pic:pic>
                   <pic:nvPicPr>
-                    <pic:cNvPr id="16" name="image-aV4rMg6TlD80tSd8QqIwY.png" descr="Fenêtre « À propos »"/>
+                    <pic:cNvPr id="16" name="image-9QGWewLEExj2dJEqwCY_2.png" descr="Mes enfants — formulaire d'ajout"/>
                     <pic:cNvPicPr/>
                   </pic:nvPicPr>
                   <pic:blipFill>
@@ -4559,6 +3606,1267 @@
       </w:pPr>
       <w:r>
         <w:rPr/>
+        <w:t xml:space="preserve">  Le parent choisit l'établissement dans une liste déroulante, puis la classe correspondante   s'affiche automatiquement une fois l'établissement choisi (les choix proposés dépendent de ce   que l'administrateur a déjà configuré pour cet établissement), et renseigne le matricule   (communiqué par l'établissement à l'inscription), le nom, le prénom, le sexe (facultatif), la   date de naissance (facultative), la ville et la commune (obligatoires), le quartier (facultatif).</w:t>
+      </w:r>
+    </w:p>
+    <w:p>
+      <w:pPr>
+        <w:numPr>
+          <w:ilvl w:val="0"/>
+          <w:numId w:val="13"/>
+        </w:numPr>
+        <w:spacing w:lineRule="auto"/>
+      </w:pPr>
+      <w:r>
+        <w:rPr/>
+        <w:t xml:space="preserve">Les coordonnées du parent (nom, téléphone, email) affichées côté établissement pour cet enfant sont </w:t>
+      </w:r>
+      <w:r>
+        <w:rPr>
+          <w:b/>
+        </w:rPr>
+        <w:t xml:space="preserve">reprises automatiquement du compte connecté</w:t>
+      </w:r>
+      <w:r>
+        <w:rPr/>
+        <w:t xml:space="preserve"> — le parent n'a rien à ressaisir.</w:t>
+      </w:r>
+    </w:p>
+    <w:p>
+      <w:pPr>
+        <w:numPr>
+          <w:ilvl w:val="0"/>
+          <w:numId w:val="13"/>
+        </w:numPr>
+        <w:spacing w:lineRule="auto"/>
+      </w:pPr>
+      <w:r>
+        <w:rPr/>
+        <w:t xml:space="preserve">Un enfant ajouté de cette façon démarre avec le statut </w:t>
+      </w:r>
+      <w:r>
+        <w:rPr>
+          <w:b/>
+        </w:rPr>
+        <w:t xml:space="preserve">En attente de paiement</w:t>
+      </w:r>
+      <w:r>
+        <w:rPr/>
+        <w:t xml:space="preserve"> — aucun accès à la cantine tant qu'un paiement n'a pas été enregistré (voir §9 pour effectuer ce paiement).</w:t>
+      </w:r>
+    </w:p>
+    <w:p>
+      <w:pPr>
+        <w:pStyle w:val="Heading2"/>
+        <w:spacing w:lineRule="auto"/>
+      </w:pPr>
+      <w:r>
+        <w:rPr/>
+        <w:t xml:space="preserve">9. Paiements Mobile Money</w:t>
+      </w:r>
+    </w:p>
+    <w:p>
+      <w:pPr>
+        <w:spacing w:lineRule="auto"/>
+      </w:pPr>
+      <w:r>
+        <w:rPr/>
+        <w:drawing>
+          <wp:inline distB="0" distL="0" distR="0" distT="0">
+            <wp:extent cx="5715000" cy="3571875"/>
+            <wp:effectExtent b="0" l="0" r="0" t="0"/>
+            <wp:docPr id="17" name="image-mNgISKZPsEALRD1IsleRc.png"/>
+            <a:graphic>
+              <a:graphicData uri="http://schemas.openxmlformats.org/drawingml/2006/picture">
+                <pic:pic>
+                  <pic:nvPicPr>
+                    <pic:cNvPr id="17" name="image-mNgISKZPsEALRD1IsleRc.png" descr="Écran des paiements"/>
+                    <pic:cNvPicPr/>
+                  </pic:nvPicPr>
+                  <pic:blipFill>
+                    <a:blip r:embed="rId22" cstate="print"/>
+                    <a:srcRect b="0" l="0" r="0" t="0"/>
+                    <a:stretch>
+                      <a:fillRect/>
+                    </a:stretch>
+                  </pic:blipFill>
+                  <pic:spPr>
+                    <a:xfrm>
+                      <a:off x="0" y="0"/>
+                      <a:ext cx="5715000" cy="3571875"/>
+                    </a:xfrm>
+                    <a:prstGeom prst="rect"/>
+                  </pic:spPr>
+                </pic:pic>
+              </a:graphicData>
+            </a:graphic>
+          </wp:inline>
+        </w:drawing>
+      </w:r>
+    </w:p>
+    <w:p>
+      <w:pPr>
+        <w:numPr>
+          <w:ilvl w:val="0"/>
+          <w:numId w:val="14"/>
+        </w:numPr>
+        <w:spacing w:lineRule="auto"/>
+      </w:pPr>
+      <w:r>
+        <w:rPr>
+          <w:b/>
+        </w:rPr>
+        <w:t xml:space="preserve">Administrateur / gestionnaire / caissier</w:t>
+      </w:r>
+      <w:r>
+        <w:rPr/>
+        <w:t xml:space="preserve"> : voient toutes les transactions et peuvent lancer un paiement pour n'importe quel élève (recherche par nom, prénom ou matricule). Seul l'administrateur peut modifier ou supprimer une transaction.</w:t>
+      </w:r>
+    </w:p>
+    <w:p>
+      <w:pPr>
+        <w:numPr>
+          <w:ilvl w:val="0"/>
+          <w:numId w:val="14"/>
+        </w:numPr>
+        <w:spacing w:lineRule="auto"/>
+      </w:pPr>
+      <w:r>
+        <w:rPr>
+          <w:b/>
+        </w:rPr>
+        <w:t xml:space="preserve">Parent</w:t>
+      </w:r>
+      <w:r>
+        <w:rPr/>
+        <w:t xml:space="preserve"> : ne voit que les paiements de ses propres enfants ; en lançant un paiement, seuls ses enfants lui sont proposés (pas de recherche libre parmi tous les élèves).</w:t>
+      </w:r>
+    </w:p>
+    <w:p>
+      <w:pPr>
+        <w:numPr>
+          <w:ilvl w:val="0"/>
+          <w:numId w:val="14"/>
+        </w:numPr>
+        <w:spacing w:lineRule="auto"/>
+      </w:pPr>
+      <w:r>
+        <w:rPr>
+          <w:b/>
+        </w:rPr>
+        <w:t xml:space="preserve">Périodes de paiement</w:t>
+      </w:r>
+      <w:r>
+        <w:rPr/>
+        <w:t xml:space="preserve"> : pour un abonnement, seuls les règlements </w:t>
+      </w:r>
+      <w:r>
+        <w:rPr>
+          <w:b/>
+        </w:rPr>
+        <w:t xml:space="preserve">par trimestre ou par année</w:t>
+      </w:r>
+      <w:r>
+        <w:rPr/>
+        <w:t xml:space="preserve"> sont proposés — pas de paiement mensuel.</w:t>
+      </w:r>
+    </w:p>
+    <w:p>
+      <w:pPr>
+        <w:numPr>
+          <w:ilvl w:val="0"/>
+          <w:numId w:val="14"/>
+        </w:numPr>
+        <w:spacing w:lineRule="auto"/>
+      </w:pPr>
+      <w:r>
+        <w:rPr/>
+        <w:t xml:space="preserve">Opérateurs Mobile Money pris en charge : Orange Money, MTN Money, Moov Money, Wave.</w:t>
+      </w:r>
+    </w:p>
+    <w:p>
+      <w:pPr>
+        <w:numPr>
+          <w:ilvl w:val="0"/>
+          <w:numId w:val="14"/>
+        </w:numPr>
+        <w:spacing w:lineRule="auto"/>
+      </w:pPr>
+      <w:r>
+        <w:rPr>
+          <w:b/>
+        </w:rPr>
+        <w:t xml:space="preserve">Recherche</w:t>
+      </w:r>
+      <w:r>
+        <w:rPr/>
+        <w:t xml:space="preserve"> par nom, prénom ou matricule de l'élève ; filtres par statut (En attente / Accepté / Refusé / Annulé), par période (date de début/fin) et par opérateur — tous les filtres peuvent se combiner.</w:t>
+      </w:r>
+    </w:p>
+    <w:p>
+      <w:pPr>
+        <w:numPr>
+          <w:ilvl w:val="0"/>
+          <w:numId w:val="14"/>
+        </w:numPr>
+        <w:spacing w:lineRule="auto"/>
+      </w:pPr>
+      <w:r>
+        <w:rPr>
+          <w:b/>
+        </w:rPr>
+        <w:t xml:space="preserve">Export</w:t>
+      </w:r>
+      <w:r>
+        <w:rPr/>
+        <w:t xml:space="preserve"> de la liste affichée au format tableau (CSV).</w:t>
+      </w:r>
+    </w:p>
+    <w:p>
+      <w:pPr>
+        <w:numPr>
+          <w:ilvl w:val="0"/>
+          <w:numId w:val="14"/>
+        </w:numPr>
+        <w:spacing w:lineRule="auto"/>
+      </w:pPr>
+      <w:r>
+        <w:rPr/>
+        <w:t xml:space="preserve">Un parent qui tenterait de payer pour un enfant qui n'est pas le sien se voit automatiquement refuser l'opération par le système.</w:t>
+      </w:r>
+    </w:p>
+    <w:p>
+      <w:pPr>
+        <w:ind w:left="284"/>
+        <w:jc w:val="both"/>
+        <w:spacing w:lineRule="auto"/>
+      </w:pPr>
+      <w:r>
+        <w:rPr/>
+        <w:t xml:space="preserve">ℹ️ Le paiement en ligne est réellement connecté à un service de paiement Mobile Money, mais </w:t>
+      </w:r>
+      <w:r>
+        <w:rPr>
+          <w:b/>
+        </w:rPr>
+        <w:t xml:space="preserve">aucun compte marchand réel n'est encore branché</w:t>
+      </w:r>
+      <w:r>
+        <w:rPr/>
+        <w:t xml:space="preserve"> — tant que ce n'est pas fait, une tentative de paiement affiche un message clair (« service de paiement indisponible ou mal configuré ») plutôt qu'un lien de paiement fonctionnel.</w:t>
+      </w:r>
+    </w:p>
+    <w:p>
+      <w:pPr>
+        <w:pStyle w:val="Heading2"/>
+        <w:spacing w:lineRule="auto"/>
+      </w:pPr>
+      <w:r>
+        <w:rPr/>
+        <w:t xml:space="preserve">10. Contrôle d'accès à la cantine</w:t>
+      </w:r>
+    </w:p>
+    <w:p>
+      <w:pPr>
+        <w:spacing w:lineRule="auto"/>
+      </w:pPr>
+      <w:r>
+        <w:rPr/>
+        <w:drawing>
+          <wp:inline distB="0" distL="0" distR="0" distT="0">
+            <wp:extent cx="5715000" cy="3571875"/>
+            <wp:effectExtent b="0" l="0" r="0" t="0"/>
+            <wp:docPr id="18" name="image-qyRSxc4GDa5tnCui5b23p.png"/>
+            <a:graphic>
+              <a:graphicData uri="http://schemas.openxmlformats.org/drawingml/2006/picture">
+                <pic:pic>
+                  <pic:nvPicPr>
+                    <pic:cNvPr id="18" name="image-qyRSxc4GDa5tnCui5b23p.png" descr="Écran de contrôle d'accès"/>
+                    <pic:cNvPicPr/>
+                  </pic:nvPicPr>
+                  <pic:blipFill>
+                    <a:blip r:embed="rId23" cstate="print"/>
+                    <a:srcRect b="0" l="0" r="0" t="0"/>
+                    <a:stretch>
+                      <a:fillRect/>
+                    </a:stretch>
+                  </pic:blipFill>
+                  <pic:spPr>
+                    <a:xfrm>
+                      <a:off x="0" y="0"/>
+                      <a:ext cx="5715000" cy="3571875"/>
+                    </a:xfrm>
+                    <a:prstGeom prst="rect"/>
+                  </pic:spPr>
+                </pic:pic>
+              </a:graphicData>
+            </a:graphic>
+          </wp:inline>
+        </w:drawing>
+      </w:r>
+    </w:p>
+    <w:p>
+      <w:pPr>
+        <w:numPr>
+          <w:ilvl w:val="0"/>
+          <w:numId w:val="15"/>
+        </w:numPr>
+        <w:spacing w:lineRule="auto"/>
+      </w:pPr>
+      <w:r>
+        <w:rPr/>
+        <w:t xml:space="preserve">La lecture du QR Code d'un élève à l'entrée de la cantine confirme l'accès en moins d'une seconde : ✓ accès accordé ou ✗ accès refusé (avec le motif affiché).</w:t>
+      </w:r>
+    </w:p>
+    <w:p>
+      <w:pPr>
+        <w:numPr>
+          <w:ilvl w:val="0"/>
+          <w:numId w:val="15"/>
+        </w:numPr>
+        <w:spacing w:lineRule="auto"/>
+      </w:pPr>
+      <w:r>
+        <w:rPr/>
+        <w:t xml:space="preserve">Fonctionne même </w:t>
+      </w:r>
+      <w:r>
+        <w:rPr>
+          <w:b/>
+        </w:rPr>
+        <w:t xml:space="preserve">sans connexion internet</w:t>
+      </w:r>
+      <w:r>
+        <w:rPr/>
+        <w:t xml:space="preserve"> : l'appareil garde en mémoire, pendant 24 heures, la liste des élèves et leur statut d'accès, et se remet à jour automatiquement dès que la connexion revient.</w:t>
+      </w:r>
+    </w:p>
+    <w:p>
+      <w:pPr>
+        <w:numPr>
+          <w:ilvl w:val="0"/>
+          <w:numId w:val="15"/>
+        </w:numPr>
+        <w:spacing w:lineRule="auto"/>
+      </w:pPr>
+      <w:r>
+        <w:rPr/>
+        <w:t xml:space="preserve">Une barre d'état indique si l'appareil est « En ligne » ou « Hors ligne », l'état de ces informations enregistrées à l'avance (absentes, ou datées avec le nombre d'élèves couverts), et propose un bouton pour forcer la mise à jour manuellement.</w:t>
+      </w:r>
+    </w:p>
+    <w:p>
+      <w:pPr>
+        <w:numPr>
+          <w:ilvl w:val="0"/>
+          <w:numId w:val="15"/>
+        </w:numPr>
+        <w:spacing w:lineRule="auto"/>
+      </w:pPr>
+      <w:r>
+        <w:rPr/>
+        <w:t xml:space="preserve">Par défaut, ces informations se mettent à jour automatiquement en arrière-plan dès l'ouverture de l'écran, si une connexion est disponible — ce comportement peut être désactivé dans les Paramètres (§15) pour ne garder que la mise à jour manuelle.</w:t>
+      </w:r>
+    </w:p>
+    <w:p>
+      <w:pPr>
+        <w:numPr>
+          <w:ilvl w:val="0"/>
+          <w:numId w:val="15"/>
+        </w:numPr>
+        <w:spacing w:lineRule="auto"/>
+      </w:pPr>
+      <w:r>
+        <w:rPr/>
+        <w:t xml:space="preserve">Non accessible à un parent.</w:t>
+      </w:r>
+    </w:p>
+    <w:p>
+      <w:pPr>
+        <w:pStyle w:val="Heading2"/>
+        <w:spacing w:lineRule="auto"/>
+      </w:pPr>
+      <w:r>
+        <w:rPr/>
+        <w:t xml:space="preserve">11. Historique des passages</w:t>
+      </w:r>
+    </w:p>
+    <w:p>
+      <w:pPr>
+        <w:spacing w:lineRule="auto"/>
+      </w:pPr>
+      <w:r>
+        <w:rPr/>
+        <w:drawing>
+          <wp:inline distB="0" distL="0" distR="0" distT="0">
+            <wp:extent cx="5715000" cy="3571875"/>
+            <wp:effectExtent b="0" l="0" r="0" t="0"/>
+            <wp:docPr id="19" name="image-x13BONRKra4pfdJND97Ss.png"/>
+            <a:graphic>
+              <a:graphicData uri="http://schemas.openxmlformats.org/drawingml/2006/picture">
+                <pic:pic>
+                  <pic:nvPicPr>
+                    <pic:cNvPr id="19" name="image-x13BONRKra4pfdJND97Ss.png" descr="Historique des passages"/>
+                    <pic:cNvPicPr/>
+                  </pic:nvPicPr>
+                  <pic:blipFill>
+                    <a:blip r:embed="rId24" cstate="print"/>
+                    <a:srcRect b="0" l="0" r="0" t="0"/>
+                    <a:stretch>
+                      <a:fillRect/>
+                    </a:stretch>
+                  </pic:blipFill>
+                  <pic:spPr>
+                    <a:xfrm>
+                      <a:off x="0" y="0"/>
+                      <a:ext cx="5715000" cy="3571875"/>
+                    </a:xfrm>
+                    <a:prstGeom prst="rect"/>
+                  </pic:spPr>
+                </pic:pic>
+              </a:graphicData>
+            </a:graphic>
+          </wp:inline>
+        </w:drawing>
+      </w:r>
+    </w:p>
+    <w:p>
+      <w:pPr>
+        <w:numPr>
+          <w:ilvl w:val="0"/>
+          <w:numId w:val="16"/>
+        </w:numPr>
+        <w:spacing w:lineRule="auto"/>
+      </w:pPr>
+      <w:r>
+        <w:rPr>
+          <w:b/>
+        </w:rPr>
+        <w:t xml:space="preserve">Administrateur / gestionnaire / caissier</w:t>
+      </w:r>
+      <w:r>
+        <w:rPr/>
+        <w:t xml:space="preserve"> : historique complet, filtrable par date, établissement et résultat, avec recherche d'élève ; export au format tableau (CSV) ; la modification ou la suppression d'un passage sont réservées à l'administrateur.</w:t>
+      </w:r>
+    </w:p>
+    <w:p>
+      <w:pPr>
+        <w:numPr>
+          <w:ilvl w:val="0"/>
+          <w:numId w:val="16"/>
+        </w:numPr>
+        <w:spacing w:lineRule="auto"/>
+      </w:pPr>
+      <w:r>
+        <w:rPr>
+          <w:b/>
+        </w:rPr>
+        <w:t xml:space="preserve">Parent</w:t>
+      </w:r>
+      <w:r>
+        <w:rPr/>
+        <w:t xml:space="preserve"> : ne voit que les passages de ses propres enfants ; le filtre par établissement et la colonne « Établissement » du tableau sont masqués (non utiles pour un parent).</w:t>
+      </w:r>
+    </w:p>
+    <w:p>
+      <w:pPr>
+        <w:pStyle w:val="Heading2"/>
+        <w:spacing w:lineRule="auto"/>
+      </w:pPr>
+      <w:r>
+        <w:rPr/>
+        <w:t xml:space="preserve">12. Comptes utilisateurs (administrateur uniquement)</w:t>
+      </w:r>
+    </w:p>
+    <w:p>
+      <w:pPr>
+        <w:spacing w:lineRule="auto"/>
+      </w:pPr>
+      <w:r>
+        <w:rPr/>
+        <w:drawing>
+          <wp:inline distB="0" distL="0" distR="0" distT="0">
+            <wp:extent cx="5715000" cy="3571875"/>
+            <wp:effectExtent b="0" l="0" r="0" t="0"/>
+            <wp:docPr id="20" name="image-1hr65KMBfQnlby6p9OmP7.png"/>
+            <a:graphic>
+              <a:graphicData uri="http://schemas.openxmlformats.org/drawingml/2006/picture">
+                <pic:pic>
+                  <pic:nvPicPr>
+                    <pic:cNvPr id="20" name="image-1hr65KMBfQnlby6p9OmP7.png" descr="Liste des comptes utilisateurs"/>
+                    <pic:cNvPicPr/>
+                  </pic:nvPicPr>
+                  <pic:blipFill>
+                    <a:blip r:embed="rId25" cstate="print"/>
+                    <a:srcRect b="0" l="0" r="0" t="0"/>
+                    <a:stretch>
+                      <a:fillRect/>
+                    </a:stretch>
+                  </pic:blipFill>
+                  <pic:spPr>
+                    <a:xfrm>
+                      <a:off x="0" y="0"/>
+                      <a:ext cx="5715000" cy="3571875"/>
+                    </a:xfrm>
+                    <a:prstGeom prst="rect"/>
+                  </pic:spPr>
+                </pic:pic>
+              </a:graphicData>
+            </a:graphic>
+          </wp:inline>
+        </w:drawing>
+      </w:r>
+    </w:p>
+    <w:p>
+      <w:pPr>
+        <w:numPr>
+          <w:ilvl w:val="0"/>
+          <w:numId w:val="17"/>
+        </w:numPr>
+        <w:spacing w:lineRule="auto"/>
+      </w:pPr>
+      <w:r>
+        <w:rPr/>
+        <w:t xml:space="preserve">Création d'un compte : nom, prénom, email, </w:t>
+      </w:r>
+      <w:r>
+        <w:rPr>
+          <w:b/>
+        </w:rPr>
+        <w:t xml:space="preserve">numéro de téléphone (obligatoire, unique)</w:t>
+      </w:r>
+      <w:r>
+        <w:rPr/>
+        <w:t xml:space="preserve">, mot de passe, rôle (Administrateur, Gestionnaire, Caissier ou Parent).</w:t>
+      </w:r>
+    </w:p>
+    <w:p>
+      <w:pPr>
+        <w:numPr>
+          <w:ilvl w:val="0"/>
+          <w:numId w:val="17"/>
+        </w:numPr>
+        <w:spacing w:lineRule="auto"/>
+      </w:pPr>
+      <w:r>
+        <w:rPr/>
+        <w:t xml:space="preserve">Modification, changement de rôle directement dans le tableau, désactivation/réactivation, suppression définitive.</w:t>
+      </w:r>
+    </w:p>
+    <w:p>
+      <w:pPr>
+        <w:numPr>
+          <w:ilvl w:val="0"/>
+          <w:numId w:val="17"/>
+        </w:numPr>
+        <w:spacing w:lineRule="auto"/>
+      </w:pPr>
+      <w:r>
+        <w:rPr/>
+        <w:t xml:space="preserve">Impossible de désactiver ou de supprimer le tout dernier compte administrateur du système.</w:t>
+      </w:r>
+    </w:p>
+    <w:p>
+      <w:pPr>
+        <w:numPr>
+          <w:ilvl w:val="0"/>
+          <w:numId w:val="17"/>
+        </w:numPr>
+        <w:spacing w:lineRule="auto"/>
+      </w:pPr>
+      <w:r>
+        <w:rPr/>
+        <w:t xml:space="preserve">Impossible de désactiver ou de supprimer son propre compte.</w:t>
+      </w:r>
+    </w:p>
+    <w:p>
+      <w:pPr>
+        <w:numPr>
+          <w:ilvl w:val="0"/>
+          <w:numId w:val="17"/>
+        </w:numPr>
+        <w:spacing w:lineRule="auto"/>
+      </w:pPr>
+      <w:r>
+        <w:rPr>
+          <w:b/>
+        </w:rPr>
+        <w:t xml:space="preserve">Recherche</w:t>
+      </w:r>
+      <w:r>
+        <w:rPr/>
+        <w:t xml:space="preserve"> par email, nom, prénom ou téléphone ; filtres par rôle, par statut (actif ou inactif) et par période de création — tous combinables.</w:t>
+      </w:r>
+    </w:p>
+    <w:p>
+      <w:pPr>
+        <w:pStyle w:val="Heading2"/>
+        <w:spacing w:lineRule="auto"/>
+      </w:pPr>
+      <w:r>
+        <w:rPr/>
+        <w:t xml:space="preserve">13. Parents (rattacher des enfants — administrateur uniquement)</w:t>
+      </w:r>
+    </w:p>
+    <w:p>
+      <w:pPr>
+        <w:numPr>
+          <w:ilvl w:val="0"/>
+          <w:numId w:val="18"/>
+        </w:numPr>
+        <w:spacing w:lineRule="auto"/>
+      </w:pPr>
+      <w:r>
+        <w:rPr/>
+        <w:t xml:space="preserve">Permet de rattacher un compte parent à un ou plusieurs élèves.</w:t>
+      </w:r>
+    </w:p>
+    <w:p>
+      <w:pPr>
+        <w:numPr>
+          <w:ilvl w:val="0"/>
+          <w:numId w:val="18"/>
+        </w:numPr>
+        <w:spacing w:lineRule="auto"/>
+      </w:pPr>
+      <w:r>
+        <w:rPr>
+          <w:b/>
+        </w:rPr>
+        <w:t xml:space="preserve">Choix du compte parent</w:t>
+      </w:r>
+      <w:r>
+        <w:rPr/>
+        <w:t xml:space="preserve"> : recherche par numéro de téléphone, nom ou prénom (le compte doit déjà exister — le créer d'abord dans « Comptes utilisateurs », ou passer par une demande d'accès validée, §3).</w:t>
+      </w:r>
+    </w:p>
+    <w:p>
+      <w:pPr>
+        <w:numPr>
+          <w:ilvl w:val="0"/>
+          <w:numId w:val="18"/>
+        </w:numPr>
+        <w:spacing w:lineRule="auto"/>
+      </w:pPr>
+      <w:r>
+        <w:rPr>
+          <w:b/>
+        </w:rPr>
+        <w:t xml:space="preserve">Choix des enfants</w:t>
+      </w:r>
+      <w:r>
+        <w:rPr/>
+        <w:t xml:space="preserve"> : recherche par matricule, nom ou prénom, plusieurs enfants peuvent être sélectionnés à la fois.</w:t>
+      </w:r>
+    </w:p>
+    <w:p>
+      <w:pPr>
+        <w:numPr>
+          <w:ilvl w:val="0"/>
+          <w:numId w:val="18"/>
+        </w:numPr>
+        <w:spacing w:lineRule="auto"/>
+      </w:pPr>
+      <w:r>
+        <w:rPr/>
+        <w:t xml:space="preserve">Modification des enfants rattachés, suppression du lien (les fiches des élèves ne sont pas supprimées pour autant).</w:t>
+      </w:r>
+    </w:p>
+    <w:p>
+      <w:pPr>
+        <w:numPr>
+          <w:ilvl w:val="0"/>
+          <w:numId w:val="18"/>
+        </w:numPr>
+        <w:spacing w:lineRule="auto"/>
+      </w:pPr>
+      <w:r>
+        <w:rPr>
+          <w:b/>
+        </w:rPr>
+        <w:t xml:space="preserve">Recherche</w:t>
+      </w:r>
+      <w:r>
+        <w:rPr/>
+        <w:t xml:space="preserve"> sur la liste principale par </w:t>
+      </w:r>
+      <w:r>
+        <w:rPr>
+          <w:b/>
+        </w:rPr>
+        <w:t xml:space="preserve">email ou numéro de téléphone</w:t>
+      </w:r>
+      <w:r>
+        <w:rPr/>
+        <w:t xml:space="preserve"> du compte parent.</w:t>
+      </w:r>
+    </w:p>
+    <w:p>
+      <w:pPr>
+        <w:pStyle w:val="Heading2"/>
+        <w:spacing w:lineRule="auto"/>
+      </w:pPr>
+      <w:r>
+        <w:rPr/>
+        <w:t xml:space="preserve">14. Rapports (administrateur / gestionnaire / caissier) — première version</w:t>
+      </w:r>
+    </w:p>
+    <w:p>
+      <w:pPr>
+        <w:ind w:left="284"/>
+        <w:jc w:val="both"/>
+        <w:spacing w:lineRule="auto"/>
+      </w:pPr>
+      <w:r>
+        <w:rPr/>
+        <w:t xml:space="preserve">Première version de ce module, mise à disposition pour recueillir des retours avant amélioration. Non accessible à un parent.</w:t>
+      </w:r>
+    </w:p>
+    <w:p>
+      <w:pPr>
+        <w:numPr>
+          <w:ilvl w:val="0"/>
+          <w:numId w:val="19"/>
+        </w:numPr>
+        <w:spacing w:lineRule="auto"/>
+      </w:pPr>
+      <w:r>
+        <w:rPr/>
+        <w:t xml:space="preserve">On choisit une période (date de début/fin) et, si besoin, un établissement (ce filtre ne s'applique qu'aux passages à la cantine), puis on clique sur </w:t>
+      </w:r>
+      <w:r>
+        <w:rPr>
+          <w:b/>
+        </w:rPr>
+        <w:t xml:space="preserve">« Générer le rapport »</w:t>
+      </w:r>
+      <w:r>
+        <w:rPr/>
+        <w:t xml:space="preserve">.</w:t>
+      </w:r>
+    </w:p>
+    <w:p>
+      <w:pPr>
+        <w:numPr>
+          <w:ilvl w:val="0"/>
+          <w:numId w:val="19"/>
+        </w:numPr>
+        <w:spacing w:lineRule="auto"/>
+      </w:pPr>
+      <w:r>
+        <w:rPr/>
+        <w:t xml:space="preserve">Trois onglets s'affichent une fois le rapport généré :</w:t>
+      </w:r>
+    </w:p>
+    <w:p>
+      <w:pPr>
+        <w:numPr>
+          <w:ilvl w:val="1"/>
+          <w:numId w:val="20"/>
+        </w:numPr>
+        <w:spacing w:lineRule="auto"/>
+      </w:pPr>
+      <w:r>
+        <w:rPr>
+          <w:b/>
+        </w:rPr>
+        <w:t xml:space="preserve">Résumé</w:t>
+      </w:r>
+      <w:r>
+        <w:rPr/>
+        <w:t xml:space="preserve"> : montant total encaissé, répartition des paiements par statut, répartition des passages par résultat, taux d'accès.</w:t>
+      </w:r>
+    </w:p>
+    <w:p>
+      <w:pPr>
+        <w:numPr>
+          <w:ilvl w:val="1"/>
+          <w:numId w:val="20"/>
+        </w:numPr>
+        <w:spacing w:lineRule="auto"/>
+      </w:pPr>
+      <w:r>
+        <w:rPr>
+          <w:b/>
+        </w:rPr>
+        <w:t xml:space="preserve">Paiements</w:t>
+      </w:r>
+      <w:r>
+        <w:rPr/>
+        <w:t xml:space="preserve"> : liste détaillée des transactions de la période.</w:t>
+      </w:r>
+    </w:p>
+    <w:p>
+      <w:pPr>
+        <w:numPr>
+          <w:ilvl w:val="1"/>
+          <w:numId w:val="20"/>
+        </w:numPr>
+        <w:spacing w:lineRule="auto"/>
+      </w:pPr>
+      <w:r>
+        <w:rPr>
+          <w:b/>
+        </w:rPr>
+        <w:t xml:space="preserve">Passages</w:t>
+      </w:r>
+      <w:r>
+        <w:rPr/>
+        <w:t xml:space="preserve"> : liste détaillée des passages à la cantine sur la période.</w:t>
+      </w:r>
+    </w:p>
+    <w:p>
+      <w:pPr>
+        <w:numPr>
+          <w:ilvl w:val="0"/>
+          <w:numId w:val="19"/>
+        </w:numPr>
+        <w:spacing w:lineRule="auto"/>
+      </w:pPr>
+      <w:r>
+        <w:rPr>
+          <w:b/>
+        </w:rPr>
+        <w:t xml:space="preserve">Exporter en Excel</w:t>
+      </w:r>
+      <w:r>
+        <w:rPr/>
+        <w:t xml:space="preserve"> : télécharge un fichier avec 3 feuilles (Résumé / Paiements / Passages) couvrant toute la période choisie.</w:t>
+      </w:r>
+    </w:p>
+    <w:p>
+      <w:pPr>
+        <w:numPr>
+          <w:ilvl w:val="0"/>
+          <w:numId w:val="19"/>
+        </w:numPr>
+        <w:spacing w:lineRule="auto"/>
+      </w:pPr>
+      <w:r>
+        <w:rPr>
+          <w:b/>
+        </w:rPr>
+        <w:t xml:space="preserve">Imprimer / PDF</w:t>
+      </w:r>
+      <w:r>
+        <w:rPr/>
+        <w:t xml:space="preserve"> (par onglet) : ouvre la fenêtre d'impression du navigateur, limitée au contenu de l'onglet affiché — choisir « Enregistrer au format PDF » pour obtenir un fichier PDF.</w:t>
+      </w:r>
+    </w:p>
+    <w:p>
+      <w:pPr>
+        <w:numPr>
+          <w:ilvl w:val="0"/>
+          <w:numId w:val="19"/>
+        </w:numPr>
+        <w:spacing w:lineRule="auto"/>
+      </w:pPr>
+      <w:r>
+        <w:rPr/>
+        <w:t xml:space="preserve">Sur une période avec beaucoup de données, un message avertit si le rapport a dû être limité (au delà de 10 000 lignes) : il suffit alors de réduire la période choisie.</w:t>
+      </w:r>
+    </w:p>
+    <w:p>
+      <w:pPr>
+        <w:pStyle w:val="Heading2"/>
+        <w:spacing w:lineRule="auto"/>
+      </w:pPr>
+      <w:r>
+        <w:rPr/>
+        <w:t xml:space="preserve">15. Paramètres (administrateur uniquement)</w:t>
+      </w:r>
+    </w:p>
+    <w:p>
+      <w:pPr>
+        <w:spacing w:lineRule="auto"/>
+      </w:pPr>
+      <w:r>
+        <w:rPr/>
+        <w:drawing>
+          <wp:inline distB="0" distL="0" distR="0" distT="0">
+            <wp:extent cx="5715000" cy="3571875"/>
+            <wp:effectExtent b="0" l="0" r="0" t="0"/>
+            <wp:docPr id="21" name="image-udwiGuW6vl0X85jx8_jlE.png"/>
+            <a:graphic>
+              <a:graphicData uri="http://schemas.openxmlformats.org/drawingml/2006/picture">
+                <pic:pic>
+                  <pic:nvPicPr>
+                    <pic:cNvPr id="21" name="image-udwiGuW6vl0X85jx8_jlE.png" descr="Écran des paramètres"/>
+                    <pic:cNvPicPr/>
+                  </pic:nvPicPr>
+                  <pic:blipFill>
+                    <a:blip r:embed="rId26" cstate="print"/>
+                    <a:srcRect b="0" l="0" r="0" t="0"/>
+                    <a:stretch>
+                      <a:fillRect/>
+                    </a:stretch>
+                  </pic:blipFill>
+                  <pic:spPr>
+                    <a:xfrm>
+                      <a:off x="0" y="0"/>
+                      <a:ext cx="5715000" cy="3571875"/>
+                    </a:xfrm>
+                    <a:prstGeom prst="rect"/>
+                  </pic:spPr>
+                </pic:pic>
+              </a:graphicData>
+            </a:graphic>
+          </wp:inline>
+        </w:drawing>
+      </w:r>
+    </w:p>
+    <w:p>
+      <w:pPr>
+        <w:spacing w:lineRule="auto"/>
+      </w:pPr>
+      <w:r>
+        <w:rPr/>
+        <w:t xml:space="preserve">Les réglages sont regroupés par thème dans des blocs dépliables (Contrôle d'accès cantine, Notifications, Paiements, Apparence, Organisation) — cliquer sur l'intitulé d'un bloc l'ouvre ou le referme.</w:t>
+      </w:r>
+    </w:p>
+    <w:p>
+      <w:pPr>
+        <w:numPr>
+          <w:ilvl w:val="0"/>
+          <w:numId w:val="21"/>
+        </w:numPr>
+        <w:spacing w:lineRule="auto"/>
+      </w:pPr>
+      <w:r>
+        <w:rPr/>
+        <w:t xml:space="preserve">Activer ou désactiver les notifications par email et par SMS.</w:t>
+      </w:r>
+    </w:p>
+    <w:p>
+      <w:pPr>
+        <w:numPr>
+          <w:ilvl w:val="0"/>
+          <w:numId w:val="21"/>
+        </w:numPr>
+        <w:spacing w:lineRule="auto"/>
+      </w:pPr>
+      <w:r>
+        <w:rPr/>
+        <w:t xml:space="preserve">Activer ou désactiver la mise à jour automatique des informations hors-ligne du contrôle d'accès (§10) — activée par défaut.</w:t>
+      </w:r>
+    </w:p>
+    <w:p>
+      <w:pPr>
+        <w:numPr>
+          <w:ilvl w:val="0"/>
+          <w:numId w:val="21"/>
+        </w:numPr>
+        <w:spacing w:lineRule="auto"/>
+      </w:pPr>
+      <w:r>
+        <w:rPr/>
+        <w:t xml:space="preserve">Mode de paiement : par </w:t>
+      </w:r>
+      <w:r>
+        <w:rPr>
+          <w:b/>
+        </w:rPr>
+        <w:t xml:space="preserve">abonnement</w:t>
+      </w:r>
+      <w:r>
+        <w:rPr/>
+        <w:t xml:space="preserve"> (accès pour tout le trimestre ou l'année) ou par </w:t>
+      </w:r>
+      <w:r>
+        <w:rPr>
+          <w:b/>
+        </w:rPr>
+        <w:t xml:space="preserve">crédits</w:t>
+      </w:r>
+      <w:r>
+        <w:rPr/>
+        <w:t xml:space="preserve"> (montant débité à chaque repas, avec un tarif réglable) — les deux modes peuvent coexister, chaque élève utilisant l'un ou l'autre.</w:t>
+      </w:r>
+    </w:p>
+    <w:p>
+      <w:pPr>
+        <w:numPr>
+          <w:ilvl w:val="0"/>
+          <w:numId w:val="21"/>
+        </w:numPr>
+        <w:spacing w:lineRule="auto"/>
+      </w:pPr>
+      <w:r>
+        <w:rPr/>
+        <w:t xml:space="preserve">Délai de grâce par défaut (7 jours), qui peut être ajusté établissement par établissement (§6).</w:t>
+      </w:r>
+    </w:p>
+    <w:p>
+      <w:pPr>
+        <w:numPr>
+          <w:ilvl w:val="0"/>
+          <w:numId w:val="21"/>
+        </w:numPr>
+        <w:spacing w:lineRule="auto"/>
+      </w:pPr>
+      <w:r>
+        <w:rPr/>
+        <w:t xml:space="preserve">Service de paiement actif.</w:t>
+      </w:r>
+    </w:p>
+    <w:p>
+      <w:pPr>
+        <w:numPr>
+          <w:ilvl w:val="0"/>
+          <w:numId w:val="21"/>
+        </w:numPr>
+        <w:spacing w:lineRule="auto"/>
+      </w:pPr>
+      <w:r>
+        <w:rPr/>
+        <w:t xml:space="preserve">Image de fond personnalisée pour l'écran de connexion.</w:t>
+      </w:r>
+    </w:p>
+    <w:p>
+      <w:pPr>
+        <w:pStyle w:val="Heading3"/>
+        <w:spacing w:lineRule="auto"/>
+      </w:pPr>
+      <w:r>
+        <w:rPr/>
+        <w:t xml:space="preserve">Personnalisation par établissement (image, nom, coordonnées)</w:t>
+      </w:r>
+    </w:p>
+    <w:p>
+      <w:pPr>
+        <w:spacing w:lineRule="auto"/>
+      </w:pPr>
+      <w:r>
+        <w:rPr/>
+        <w:t xml:space="preserve">Une section « Organisation » permet d'adapter l'application à l'identité du client :</w:t>
+      </w:r>
+    </w:p>
+    <w:p>
+      <w:pPr>
+        <w:numPr>
+          <w:ilvl w:val="0"/>
+          <w:numId w:val="22"/>
+        </w:numPr>
+        <w:spacing w:lineRule="auto"/>
+      </w:pPr>
+      <w:r>
+        <w:rPr>
+          <w:b/>
+        </w:rPr>
+        <w:t xml:space="preserve">Logo</w:t>
+      </w:r>
+      <w:r>
+        <w:rPr/>
+        <w:t xml:space="preserve"> : à téléverser directement depuis cet écran — il remplace l'icône par défaut en haut de chaque page de l'application.</w:t>
+      </w:r>
+    </w:p>
+    <w:p>
+      <w:pPr>
+        <w:numPr>
+          <w:ilvl w:val="0"/>
+          <w:numId w:val="22"/>
+        </w:numPr>
+        <w:spacing w:lineRule="auto"/>
+      </w:pPr>
+      <w:r>
+        <w:rPr>
+          <w:b/>
+        </w:rPr>
+        <w:t xml:space="preserve">Nom du client</w:t>
+      </w:r>
+      <w:r>
+        <w:rPr/>
+        <w:t xml:space="preserve"> : remplace « Cantine Connect » dans l'en-tête de l'application.</w:t>
+      </w:r>
+    </w:p>
+    <w:p>
+      <w:pPr>
+        <w:numPr>
+          <w:ilvl w:val="0"/>
+          <w:numId w:val="22"/>
+        </w:numPr>
+        <w:spacing w:lineRule="auto"/>
+      </w:pPr>
+      <w:r>
+        <w:rPr>
+          <w:b/>
+        </w:rPr>
+        <w:t xml:space="preserve">Adresse / lieu</w:t>
+      </w:r>
+      <w:r>
+        <w:rPr/>
+        <w:t xml:space="preserve">, </w:t>
+      </w:r>
+      <w:r>
+        <w:rPr>
+          <w:b/>
+        </w:rPr>
+        <w:t xml:space="preserve">téléphone</w:t>
+      </w:r>
+      <w:r>
+        <w:rPr/>
+        <w:t xml:space="preserve">, </w:t>
+      </w:r>
+      <w:r>
+        <w:rPr>
+          <w:b/>
+        </w:rPr>
+        <w:t xml:space="preserve">email</w:t>
+      </w:r>
+      <w:r>
+        <w:rPr/>
+        <w:t xml:space="preserve"> : coordonnées de contact affichées comme référence.</w:t>
+      </w:r>
+    </w:p>
+    <w:p>
+      <w:pPr>
+        <w:numPr>
+          <w:ilvl w:val="0"/>
+          <w:numId w:val="22"/>
+        </w:numPr>
+        <w:spacing w:lineRule="auto"/>
+      </w:pPr>
+      <w:r>
+        <w:rPr>
+          <w:b/>
+        </w:rPr>
+        <w:t xml:space="preserve">Numéro Mobile Money</w:t>
+      </w:r>
+      <w:r>
+        <w:rPr/>
+        <w:t xml:space="preserve"> : numéro communiqué aux parents pour un envoi manuel d'argent — c'est une information affichée aux parents, elle ne change rien au fonctionnement des paiements en ligne (§9).</w:t>
+      </w:r>
+    </w:p>
+    <w:p>
+      <w:pPr>
+        <w:spacing w:lineRule="auto"/>
+      </w:pPr>
+      <w:r>
+        <w:rPr/>
+        <w:t xml:space="preserve">Tant qu'aucune de ces informations n'est renseignée, l'application garde son apparence par défaut (icône par défaut et nom « Cantine Connect »).</w:t>
+      </w:r>
+    </w:p>
+    <w:p>
+      <w:pPr>
+        <w:pStyle w:val="Heading2"/>
+        <w:spacing w:lineRule="auto"/>
+      </w:pPr>
+      <w:r>
+        <w:rPr/>
+        <w:t xml:space="preserve">16. Paiement et notifications — état de la mise en service</w:t>
+      </w:r>
+    </w:p>
+    <w:p>
+      <w:pPr>
+        <w:numPr>
+          <w:ilvl w:val="0"/>
+          <w:numId w:val="23"/>
+        </w:numPr>
+        <w:spacing w:lineRule="auto"/>
+      </w:pPr>
+      <w:r>
+        <w:rPr>
+          <w:b/>
+        </w:rPr>
+        <w:t xml:space="preserve">Paiement</w:t>
+      </w:r>
+      <w:r>
+        <w:rPr/>
+        <w:t xml:space="preserve"> : la connexion avec le service de paiement Mobile Money est réelle, pas une simulation — dès que le client fournit ses identifiants marchands réels, le paiement fonctionne sans développement supplémentaire. Sans ces identifiants, une tentative de paiement échoue avec un message clair plutôt qu'un lien qui ne fonctionne pas.</w:t>
+      </w:r>
+    </w:p>
+    <w:p>
+      <w:pPr>
+        <w:numPr>
+          <w:ilvl w:val="0"/>
+          <w:numId w:val="23"/>
+        </w:numPr>
+        <w:spacing w:lineRule="auto"/>
+      </w:pPr>
+      <w:r>
+        <w:rPr>
+          <w:b/>
+        </w:rPr>
+        <w:t xml:space="preserve">SMS</w:t>
+      </w:r>
+      <w:r>
+        <w:rPr/>
+        <w:t xml:space="preserve"> : la connexion avec le fournisseur de SMS est réelle. Tant qu'aucun compte n'est configuré, les SMS sont simplement enregistrés dans les journaux techniques (aucun envoi réel, et cela ne bloque rien pour l'utilisateur).</w:t>
+      </w:r>
+    </w:p>
+    <w:p>
+      <w:pPr>
+        <w:numPr>
+          <w:ilvl w:val="0"/>
+          <w:numId w:val="23"/>
+        </w:numPr>
+        <w:spacing w:lineRule="auto"/>
+      </w:pPr>
+      <w:r>
+        <w:rPr>
+          <w:b/>
+        </w:rPr>
+        <w:t xml:space="preserve">Email</w:t>
+      </w:r>
+      <w:r>
+        <w:rPr/>
+        <w:t xml:space="preserve"> : fonctionne dès que les paramètres techniques d'envoi (compte email dédié) sont renseignés.</w:t>
+      </w:r>
+    </w:p>
+    <w:p>
+      <w:pPr>
+        <w:pStyle w:val="Heading2"/>
+        <w:spacing w:lineRule="auto"/>
+      </w:pPr>
+      <w:r>
+        <w:rPr/>
+        <w:t xml:space="preserve">17. Support et à propos</w:t>
+      </w:r>
+    </w:p>
+    <w:p>
+      <w:pPr>
+        <w:spacing w:lineRule="auto"/>
+      </w:pPr>
+      <w:r>
+        <w:rPr/>
+        <w:drawing>
+          <wp:inline distB="0" distL="0" distR="0" distT="0">
+            <wp:extent cx="5715000" cy="3571875"/>
+            <wp:effectExtent b="0" l="0" r="0" t="0"/>
+            <wp:docPr id="22" name="image-iq2AAKPYFbVYeHn77S7aS.png"/>
+            <a:graphic>
+              <a:graphicData uri="http://schemas.openxmlformats.org/drawingml/2006/picture">
+                <pic:pic>
+                  <pic:nvPicPr>
+                    <pic:cNvPr id="22" name="image-iq2AAKPYFbVYeHn77S7aS.png" descr="Fenêtre « À propos »"/>
+                    <pic:cNvPicPr/>
+                  </pic:nvPicPr>
+                  <pic:blipFill>
+                    <a:blip r:embed="rId27" cstate="print"/>
+                    <a:srcRect b="0" l="0" r="0" t="0"/>
+                    <a:stretch>
+                      <a:fillRect/>
+                    </a:stretch>
+                  </pic:blipFill>
+                  <pic:spPr>
+                    <a:xfrm>
+                      <a:off x="0" y="0"/>
+                      <a:ext cx="5715000" cy="3571875"/>
+                    </a:xfrm>
+                    <a:prstGeom prst="rect"/>
+                  </pic:spPr>
+                </pic:pic>
+              </a:graphicData>
+            </a:graphic>
+          </wp:inline>
+        </w:drawing>
+      </w:r>
+    </w:p>
+    <w:p>
+      <w:pPr>
+        <w:spacing w:lineRule="auto"/>
+      </w:pPr>
+      <w:r>
+        <w:rPr/>
         <w:t xml:space="preserve">Une fenêtre « À propos », accessible depuis le menu de l'application, rappelle les coordonnées de contact de l'éditeur :</w:t>
       </w:r>
     </w:p>
@@ -4576,7 +4884,7 @@
         <w:rPr/>
         <w:t xml:space="preserve"> — Téléphone : +225 07 58 89 24 77 · Email : </w:t>
       </w:r>
-      <w:hyperlink r:id="rId22">
+      <w:hyperlink r:id="rId28">
         <w:r>
           <w:rPr>
             <w:rStyle w:val="Hyperlink"/>
@@ -4814,8 +5122,8 @@
   <w:abstractNum w:abstractNumId="3">
     <w:lvl w:ilvl="0">
       <w:start w:val="1"/>
-      <w:numFmt w:val="bullet"/>
-      <w:lvlText w:val=""/>
+      <w:numFmt w:val="decimal"/>
+      <w:lvlText w:val="%1."/>
       <w:lvlJc w:val="left"/>
       <w:pPr>
         <w:tabs>
@@ -4823,14 +5131,11 @@
         </w:tabs>
         <w:ind w:left="720" w:hanging="360"/>
       </w:pPr>
-      <w:rPr>
-        <w:rFonts w:ascii="Symbol" w:hAnsi="Symbol" w:hint="default"/>
-      </w:rPr>
     </w:lvl>
     <w:lvl w:ilvl="1">
       <w:start w:val="1"/>
-      <w:numFmt w:val="bullet"/>
-      <w:lvlText w:val=""/>
+      <w:numFmt w:val="decimal"/>
+      <w:lvlText w:val="%2."/>
       <w:lvlJc w:val="left"/>
       <w:pPr>
         <w:tabs>
@@ -4838,14 +5143,11 @@
         </w:tabs>
         <w:ind w:left="1440" w:hanging="360"/>
       </w:pPr>
-      <w:rPr>
-        <w:rFonts w:ascii="Symbol" w:hAnsi="Symbol" w:hint="default"/>
-      </w:rPr>
     </w:lvl>
     <w:lvl w:ilvl="2">
       <w:start w:val="1"/>
-      <w:numFmt w:val="bullet"/>
-      <w:lvlText w:val=""/>
+      <w:numFmt w:val="decimal"/>
+      <w:lvlText w:val="%3."/>
       <w:lvlJc w:val="left"/>
       <w:pPr>
         <w:tabs>
@@ -4853,14 +5155,11 @@
         </w:tabs>
         <w:ind w:left="2160" w:hanging="360"/>
       </w:pPr>
-      <w:rPr>
-        <w:rFonts w:ascii="Symbol" w:hAnsi="Symbol" w:hint="default"/>
-      </w:rPr>
     </w:lvl>
     <w:lvl w:ilvl="3">
       <w:start w:val="1"/>
-      <w:numFmt w:val="bullet"/>
-      <w:lvlText w:val=""/>
+      <w:numFmt w:val="decimal"/>
+      <w:lvlText w:val="%4."/>
       <w:lvlJc w:val="left"/>
       <w:pPr>
         <w:tabs>
@@ -4868,14 +5167,11 @@
         </w:tabs>
         <w:ind w:left="2880" w:hanging="360"/>
       </w:pPr>
-      <w:rPr>
-        <w:rFonts w:ascii="Symbol" w:hAnsi="Symbol" w:hint="default"/>
-      </w:rPr>
     </w:lvl>
     <w:lvl w:ilvl="4">
       <w:start w:val="1"/>
-      <w:numFmt w:val="bullet"/>
-      <w:lvlText w:val=""/>
+      <w:numFmt w:val="decimal"/>
+      <w:lvlText w:val="%5."/>
       <w:lvlJc w:val="left"/>
       <w:pPr>
         <w:tabs>
@@ -4883,14 +5179,11 @@
         </w:tabs>
         <w:ind w:left="3600" w:hanging="360"/>
       </w:pPr>
-      <w:rPr>
-        <w:rFonts w:ascii="Symbol" w:hAnsi="Symbol" w:hint="default"/>
-      </w:rPr>
     </w:lvl>
     <w:lvl w:ilvl="5">
       <w:start w:val="1"/>
-      <w:numFmt w:val="bullet"/>
-      <w:lvlText w:val=""/>
+      <w:numFmt w:val="decimal"/>
+      <w:lvlText w:val="%6."/>
       <w:lvlJc w:val="left"/>
       <w:pPr>
         <w:tabs>
@@ -4898,14 +5191,11 @@
         </w:tabs>
         <w:ind w:left="4320" w:hanging="360"/>
       </w:pPr>
-      <w:rPr>
-        <w:rFonts w:ascii="Symbol" w:hAnsi="Symbol" w:hint="default"/>
-      </w:rPr>
     </w:lvl>
     <w:lvl w:ilvl="6">
       <w:start w:val="1"/>
-      <w:numFmt w:val="bullet"/>
-      <w:lvlText w:val=""/>
+      <w:numFmt w:val="decimal"/>
+      <w:lvlText w:val="%7."/>
       <w:lvlJc w:val="left"/>
       <w:pPr>
         <w:tabs>
@@ -4913,14 +5203,11 @@
         </w:tabs>
         <w:ind w:left="5040" w:hanging="360"/>
       </w:pPr>
-      <w:rPr>
-        <w:rFonts w:ascii="Symbol" w:hAnsi="Symbol" w:hint="default"/>
-      </w:rPr>
     </w:lvl>
     <w:lvl w:ilvl="7">
       <w:start w:val="1"/>
-      <w:numFmt w:val="bullet"/>
-      <w:lvlText w:val=""/>
+      <w:numFmt w:val="decimal"/>
+      <w:lvlText w:val="%8."/>
       <w:lvlJc w:val="left"/>
       <w:pPr>
         <w:tabs>
@@ -4928,16 +5215,13 @@
         </w:tabs>
         <w:ind w:left="5760" w:hanging="360"/>
       </w:pPr>
-      <w:rPr>
-        <w:rFonts w:ascii="Symbol" w:hAnsi="Symbol" w:hint="default"/>
-      </w:rPr>
     </w:lvl>
   </w:abstractNum>
   <w:abstractNum w:abstractNumId="4">
     <w:lvl w:ilvl="0">
       <w:start w:val="1"/>
-      <w:numFmt w:val="bullet"/>
-      <w:lvlText w:val=""/>
+      <w:numFmt w:val="decimal"/>
+      <w:lvlText w:val="%1."/>
       <w:lvlJc w:val="left"/>
       <w:pPr>
         <w:tabs>
@@ -4945,14 +5229,11 @@
         </w:tabs>
         <w:ind w:left="720" w:hanging="360"/>
       </w:pPr>
-      <w:rPr>
-        <w:rFonts w:ascii="Symbol" w:hAnsi="Symbol" w:hint="default"/>
-      </w:rPr>
     </w:lvl>
     <w:lvl w:ilvl="1">
       <w:start w:val="1"/>
-      <w:numFmt w:val="bullet"/>
-      <w:lvlText w:val=""/>
+      <w:numFmt w:val="decimal"/>
+      <w:lvlText w:val="%2."/>
       <w:lvlJc w:val="left"/>
       <w:pPr>
         <w:tabs>
@@ -4960,14 +5241,11 @@
         </w:tabs>
         <w:ind w:left="1440" w:hanging="360"/>
       </w:pPr>
-      <w:rPr>
-        <w:rFonts w:ascii="Symbol" w:hAnsi="Symbol" w:hint="default"/>
-      </w:rPr>
     </w:lvl>
     <w:lvl w:ilvl="2">
       <w:start w:val="1"/>
-      <w:numFmt w:val="bullet"/>
-      <w:lvlText w:val=""/>
+      <w:numFmt w:val="decimal"/>
+      <w:lvlText w:val="%3."/>
       <w:lvlJc w:val="left"/>
       <w:pPr>
         <w:tabs>
@@ -4975,14 +5253,11 @@
         </w:tabs>
         <w:ind w:left="2160" w:hanging="360"/>
       </w:pPr>
-      <w:rPr>
-        <w:rFonts w:ascii="Symbol" w:hAnsi="Symbol" w:hint="default"/>
-      </w:rPr>
     </w:lvl>
     <w:lvl w:ilvl="3">
       <w:start w:val="1"/>
-      <w:numFmt w:val="bullet"/>
-      <w:lvlText w:val=""/>
+      <w:numFmt w:val="decimal"/>
+      <w:lvlText w:val="%4."/>
       <w:lvlJc w:val="left"/>
       <w:pPr>
         <w:tabs>
@@ -4990,14 +5265,11 @@
         </w:tabs>
         <w:ind w:left="2880" w:hanging="360"/>
       </w:pPr>
-      <w:rPr>
-        <w:rFonts w:ascii="Symbol" w:hAnsi="Symbol" w:hint="default"/>
-      </w:rPr>
     </w:lvl>
     <w:lvl w:ilvl="4">
       <w:start w:val="1"/>
-      <w:numFmt w:val="bullet"/>
-      <w:lvlText w:val=""/>
+      <w:numFmt w:val="decimal"/>
+      <w:lvlText w:val="%5."/>
       <w:lvlJc w:val="left"/>
       <w:pPr>
         <w:tabs>
@@ -5005,14 +5277,11 @@
         </w:tabs>
         <w:ind w:left="3600" w:hanging="360"/>
       </w:pPr>
-      <w:rPr>
-        <w:rFonts w:ascii="Symbol" w:hAnsi="Symbol" w:hint="default"/>
-      </w:rPr>
     </w:lvl>
     <w:lvl w:ilvl="5">
       <w:start w:val="1"/>
-      <w:numFmt w:val="bullet"/>
-      <w:lvlText w:val=""/>
+      <w:numFmt w:val="decimal"/>
+      <w:lvlText w:val="%6."/>
       <w:lvlJc w:val="left"/>
       <w:pPr>
         <w:tabs>
@@ -5020,14 +5289,11 @@
         </w:tabs>
         <w:ind w:left="4320" w:hanging="360"/>
       </w:pPr>
-      <w:rPr>
-        <w:rFonts w:ascii="Symbol" w:hAnsi="Symbol" w:hint="default"/>
-      </w:rPr>
     </w:lvl>
     <w:lvl w:ilvl="6">
       <w:start w:val="1"/>
-      <w:numFmt w:val="bullet"/>
-      <w:lvlText w:val=""/>
+      <w:numFmt w:val="decimal"/>
+      <w:lvlText w:val="%7."/>
       <w:lvlJc w:val="left"/>
       <w:pPr>
         <w:tabs>
@@ -5035,14 +5301,11 @@
         </w:tabs>
         <w:ind w:left="5040" w:hanging="360"/>
       </w:pPr>
-      <w:rPr>
-        <w:rFonts w:ascii="Symbol" w:hAnsi="Symbol" w:hint="default"/>
-      </w:rPr>
     </w:lvl>
     <w:lvl w:ilvl="7">
       <w:start w:val="1"/>
-      <w:numFmt w:val="bullet"/>
-      <w:lvlText w:val=""/>
+      <w:numFmt w:val="decimal"/>
+      <w:lvlText w:val="%8."/>
       <w:lvlJc w:val="left"/>
       <w:pPr>
         <w:tabs>
@@ -5050,9 +5313,6 @@
         </w:tabs>
         <w:ind w:left="5760" w:hanging="360"/>
       </w:pPr>
-      <w:rPr>
-        <w:rFonts w:ascii="Symbol" w:hAnsi="Symbol" w:hint="default"/>
-      </w:rPr>
     </w:lvl>
   </w:abstractNum>
   <w:abstractNum w:abstractNumId="5">
@@ -6886,6 +7146,372 @@
     </w:lvl>
   </w:abstractNum>
   <w:abstractNum w:abstractNumId="20">
+    <w:lvl w:ilvl="0">
+      <w:start w:val="1"/>
+      <w:numFmt w:val="bullet"/>
+      <w:lvlText w:val=""/>
+      <w:lvlJc w:val="left"/>
+      <w:pPr>
+        <w:tabs>
+          <w:tab w:val="num" w:pos="720"/>
+        </w:tabs>
+        <w:ind w:left="720" w:hanging="360"/>
+      </w:pPr>
+      <w:rPr>
+        <w:rFonts w:ascii="Symbol" w:hAnsi="Symbol" w:hint="default"/>
+      </w:rPr>
+    </w:lvl>
+    <w:lvl w:ilvl="1">
+      <w:start w:val="1"/>
+      <w:numFmt w:val="bullet"/>
+      <w:lvlText w:val=""/>
+      <w:lvlJc w:val="left"/>
+      <w:pPr>
+        <w:tabs>
+          <w:tab w:val="num" w:pos="1440"/>
+        </w:tabs>
+        <w:ind w:left="1440" w:hanging="360"/>
+      </w:pPr>
+      <w:rPr>
+        <w:rFonts w:ascii="Symbol" w:hAnsi="Symbol" w:hint="default"/>
+      </w:rPr>
+    </w:lvl>
+    <w:lvl w:ilvl="2">
+      <w:start w:val="1"/>
+      <w:numFmt w:val="bullet"/>
+      <w:lvlText w:val=""/>
+      <w:lvlJc w:val="left"/>
+      <w:pPr>
+        <w:tabs>
+          <w:tab w:val="num" w:pos="2160"/>
+        </w:tabs>
+        <w:ind w:left="2160" w:hanging="360"/>
+      </w:pPr>
+      <w:rPr>
+        <w:rFonts w:ascii="Symbol" w:hAnsi="Symbol" w:hint="default"/>
+      </w:rPr>
+    </w:lvl>
+    <w:lvl w:ilvl="3">
+      <w:start w:val="1"/>
+      <w:numFmt w:val="bullet"/>
+      <w:lvlText w:val=""/>
+      <w:lvlJc w:val="left"/>
+      <w:pPr>
+        <w:tabs>
+          <w:tab w:val="num" w:pos="2880"/>
+        </w:tabs>
+        <w:ind w:left="2880" w:hanging="360"/>
+      </w:pPr>
+      <w:rPr>
+        <w:rFonts w:ascii="Symbol" w:hAnsi="Symbol" w:hint="default"/>
+      </w:rPr>
+    </w:lvl>
+    <w:lvl w:ilvl="4">
+      <w:start w:val="1"/>
+      <w:numFmt w:val="bullet"/>
+      <w:lvlText w:val=""/>
+      <w:lvlJc w:val="left"/>
+      <w:pPr>
+        <w:tabs>
+          <w:tab w:val="num" w:pos="3600"/>
+        </w:tabs>
+        <w:ind w:left="3600" w:hanging="360"/>
+      </w:pPr>
+      <w:rPr>
+        <w:rFonts w:ascii="Symbol" w:hAnsi="Symbol" w:hint="default"/>
+      </w:rPr>
+    </w:lvl>
+    <w:lvl w:ilvl="5">
+      <w:start w:val="1"/>
+      <w:numFmt w:val="bullet"/>
+      <w:lvlText w:val=""/>
+      <w:lvlJc w:val="left"/>
+      <w:pPr>
+        <w:tabs>
+          <w:tab w:val="num" w:pos="4320"/>
+        </w:tabs>
+        <w:ind w:left="4320" w:hanging="360"/>
+      </w:pPr>
+      <w:rPr>
+        <w:rFonts w:ascii="Symbol" w:hAnsi="Symbol" w:hint="default"/>
+      </w:rPr>
+    </w:lvl>
+    <w:lvl w:ilvl="6">
+      <w:start w:val="1"/>
+      <w:numFmt w:val="bullet"/>
+      <w:lvlText w:val=""/>
+      <w:lvlJc w:val="left"/>
+      <w:pPr>
+        <w:tabs>
+          <w:tab w:val="num" w:pos="5040"/>
+        </w:tabs>
+        <w:ind w:left="5040" w:hanging="360"/>
+      </w:pPr>
+      <w:rPr>
+        <w:rFonts w:ascii="Symbol" w:hAnsi="Symbol" w:hint="default"/>
+      </w:rPr>
+    </w:lvl>
+    <w:lvl w:ilvl="7">
+      <w:start w:val="1"/>
+      <w:numFmt w:val="bullet"/>
+      <w:lvlText w:val=""/>
+      <w:lvlJc w:val="left"/>
+      <w:pPr>
+        <w:tabs>
+          <w:tab w:val="num" w:pos="5760"/>
+        </w:tabs>
+        <w:ind w:left="5760" w:hanging="360"/>
+      </w:pPr>
+      <w:rPr>
+        <w:rFonts w:ascii="Symbol" w:hAnsi="Symbol" w:hint="default"/>
+      </w:rPr>
+    </w:lvl>
+  </w:abstractNum>
+  <w:abstractNum w:abstractNumId="21">
+    <w:lvl w:ilvl="0">
+      <w:start w:val="1"/>
+      <w:numFmt w:val="bullet"/>
+      <w:lvlText w:val=""/>
+      <w:lvlJc w:val="left"/>
+      <w:pPr>
+        <w:tabs>
+          <w:tab w:val="num" w:pos="720"/>
+        </w:tabs>
+        <w:ind w:left="720" w:hanging="360"/>
+      </w:pPr>
+      <w:rPr>
+        <w:rFonts w:ascii="Symbol" w:hAnsi="Symbol" w:hint="default"/>
+      </w:rPr>
+    </w:lvl>
+    <w:lvl w:ilvl="1">
+      <w:start w:val="1"/>
+      <w:numFmt w:val="bullet"/>
+      <w:lvlText w:val=""/>
+      <w:lvlJc w:val="left"/>
+      <w:pPr>
+        <w:tabs>
+          <w:tab w:val="num" w:pos="1440"/>
+        </w:tabs>
+        <w:ind w:left="1440" w:hanging="360"/>
+      </w:pPr>
+      <w:rPr>
+        <w:rFonts w:ascii="Symbol" w:hAnsi="Symbol" w:hint="default"/>
+      </w:rPr>
+    </w:lvl>
+    <w:lvl w:ilvl="2">
+      <w:start w:val="1"/>
+      <w:numFmt w:val="bullet"/>
+      <w:lvlText w:val=""/>
+      <w:lvlJc w:val="left"/>
+      <w:pPr>
+        <w:tabs>
+          <w:tab w:val="num" w:pos="2160"/>
+        </w:tabs>
+        <w:ind w:left="2160" w:hanging="360"/>
+      </w:pPr>
+      <w:rPr>
+        <w:rFonts w:ascii="Symbol" w:hAnsi="Symbol" w:hint="default"/>
+      </w:rPr>
+    </w:lvl>
+    <w:lvl w:ilvl="3">
+      <w:start w:val="1"/>
+      <w:numFmt w:val="bullet"/>
+      <w:lvlText w:val=""/>
+      <w:lvlJc w:val="left"/>
+      <w:pPr>
+        <w:tabs>
+          <w:tab w:val="num" w:pos="2880"/>
+        </w:tabs>
+        <w:ind w:left="2880" w:hanging="360"/>
+      </w:pPr>
+      <w:rPr>
+        <w:rFonts w:ascii="Symbol" w:hAnsi="Symbol" w:hint="default"/>
+      </w:rPr>
+    </w:lvl>
+    <w:lvl w:ilvl="4">
+      <w:start w:val="1"/>
+      <w:numFmt w:val="bullet"/>
+      <w:lvlText w:val=""/>
+      <w:lvlJc w:val="left"/>
+      <w:pPr>
+        <w:tabs>
+          <w:tab w:val="num" w:pos="3600"/>
+        </w:tabs>
+        <w:ind w:left="3600" w:hanging="360"/>
+      </w:pPr>
+      <w:rPr>
+        <w:rFonts w:ascii="Symbol" w:hAnsi="Symbol" w:hint="default"/>
+      </w:rPr>
+    </w:lvl>
+    <w:lvl w:ilvl="5">
+      <w:start w:val="1"/>
+      <w:numFmt w:val="bullet"/>
+      <w:lvlText w:val=""/>
+      <w:lvlJc w:val="left"/>
+      <w:pPr>
+        <w:tabs>
+          <w:tab w:val="num" w:pos="4320"/>
+        </w:tabs>
+        <w:ind w:left="4320" w:hanging="360"/>
+      </w:pPr>
+      <w:rPr>
+        <w:rFonts w:ascii="Symbol" w:hAnsi="Symbol" w:hint="default"/>
+      </w:rPr>
+    </w:lvl>
+    <w:lvl w:ilvl="6">
+      <w:start w:val="1"/>
+      <w:numFmt w:val="bullet"/>
+      <w:lvlText w:val=""/>
+      <w:lvlJc w:val="left"/>
+      <w:pPr>
+        <w:tabs>
+          <w:tab w:val="num" w:pos="5040"/>
+        </w:tabs>
+        <w:ind w:left="5040" w:hanging="360"/>
+      </w:pPr>
+      <w:rPr>
+        <w:rFonts w:ascii="Symbol" w:hAnsi="Symbol" w:hint="default"/>
+      </w:rPr>
+    </w:lvl>
+    <w:lvl w:ilvl="7">
+      <w:start w:val="1"/>
+      <w:numFmt w:val="bullet"/>
+      <w:lvlText w:val=""/>
+      <w:lvlJc w:val="left"/>
+      <w:pPr>
+        <w:tabs>
+          <w:tab w:val="num" w:pos="5760"/>
+        </w:tabs>
+        <w:ind w:left="5760" w:hanging="360"/>
+      </w:pPr>
+      <w:rPr>
+        <w:rFonts w:ascii="Symbol" w:hAnsi="Symbol" w:hint="default"/>
+      </w:rPr>
+    </w:lvl>
+  </w:abstractNum>
+  <w:abstractNum w:abstractNumId="22">
+    <w:lvl w:ilvl="0">
+      <w:start w:val="1"/>
+      <w:numFmt w:val="bullet"/>
+      <w:lvlText w:val=""/>
+      <w:lvlJc w:val="left"/>
+      <w:pPr>
+        <w:tabs>
+          <w:tab w:val="num" w:pos="720"/>
+        </w:tabs>
+        <w:ind w:left="720" w:hanging="360"/>
+      </w:pPr>
+      <w:rPr>
+        <w:rFonts w:ascii="Symbol" w:hAnsi="Symbol" w:hint="default"/>
+      </w:rPr>
+    </w:lvl>
+    <w:lvl w:ilvl="1">
+      <w:start w:val="1"/>
+      <w:numFmt w:val="bullet"/>
+      <w:lvlText w:val=""/>
+      <w:lvlJc w:val="left"/>
+      <w:pPr>
+        <w:tabs>
+          <w:tab w:val="num" w:pos="1440"/>
+        </w:tabs>
+        <w:ind w:left="1440" w:hanging="360"/>
+      </w:pPr>
+      <w:rPr>
+        <w:rFonts w:ascii="Symbol" w:hAnsi="Symbol" w:hint="default"/>
+      </w:rPr>
+    </w:lvl>
+    <w:lvl w:ilvl="2">
+      <w:start w:val="1"/>
+      <w:numFmt w:val="bullet"/>
+      <w:lvlText w:val=""/>
+      <w:lvlJc w:val="left"/>
+      <w:pPr>
+        <w:tabs>
+          <w:tab w:val="num" w:pos="2160"/>
+        </w:tabs>
+        <w:ind w:left="2160" w:hanging="360"/>
+      </w:pPr>
+      <w:rPr>
+        <w:rFonts w:ascii="Symbol" w:hAnsi="Symbol" w:hint="default"/>
+      </w:rPr>
+    </w:lvl>
+    <w:lvl w:ilvl="3">
+      <w:start w:val="1"/>
+      <w:numFmt w:val="bullet"/>
+      <w:lvlText w:val=""/>
+      <w:lvlJc w:val="left"/>
+      <w:pPr>
+        <w:tabs>
+          <w:tab w:val="num" w:pos="2880"/>
+        </w:tabs>
+        <w:ind w:left="2880" w:hanging="360"/>
+      </w:pPr>
+      <w:rPr>
+        <w:rFonts w:ascii="Symbol" w:hAnsi="Symbol" w:hint="default"/>
+      </w:rPr>
+    </w:lvl>
+    <w:lvl w:ilvl="4">
+      <w:start w:val="1"/>
+      <w:numFmt w:val="bullet"/>
+      <w:lvlText w:val=""/>
+      <w:lvlJc w:val="left"/>
+      <w:pPr>
+        <w:tabs>
+          <w:tab w:val="num" w:pos="3600"/>
+        </w:tabs>
+        <w:ind w:left="3600" w:hanging="360"/>
+      </w:pPr>
+      <w:rPr>
+        <w:rFonts w:ascii="Symbol" w:hAnsi="Symbol" w:hint="default"/>
+      </w:rPr>
+    </w:lvl>
+    <w:lvl w:ilvl="5">
+      <w:start w:val="1"/>
+      <w:numFmt w:val="bullet"/>
+      <w:lvlText w:val=""/>
+      <w:lvlJc w:val="left"/>
+      <w:pPr>
+        <w:tabs>
+          <w:tab w:val="num" w:pos="4320"/>
+        </w:tabs>
+        <w:ind w:left="4320" w:hanging="360"/>
+      </w:pPr>
+      <w:rPr>
+        <w:rFonts w:ascii="Symbol" w:hAnsi="Symbol" w:hint="default"/>
+      </w:rPr>
+    </w:lvl>
+    <w:lvl w:ilvl="6">
+      <w:start w:val="1"/>
+      <w:numFmt w:val="bullet"/>
+      <w:lvlText w:val=""/>
+      <w:lvlJc w:val="left"/>
+      <w:pPr>
+        <w:tabs>
+          <w:tab w:val="num" w:pos="5040"/>
+        </w:tabs>
+        <w:ind w:left="5040" w:hanging="360"/>
+      </w:pPr>
+      <w:rPr>
+        <w:rFonts w:ascii="Symbol" w:hAnsi="Symbol" w:hint="default"/>
+      </w:rPr>
+    </w:lvl>
+    <w:lvl w:ilvl="7">
+      <w:start w:val="1"/>
+      <w:numFmt w:val="bullet"/>
+      <w:lvlText w:val=""/>
+      <w:lvlJc w:val="left"/>
+      <w:pPr>
+        <w:tabs>
+          <w:tab w:val="num" w:pos="5760"/>
+        </w:tabs>
+        <w:ind w:left="5760" w:hanging="360"/>
+      </w:pPr>
+      <w:rPr>
+        <w:rFonts w:ascii="Symbol" w:hAnsi="Symbol" w:hint="default"/>
+      </w:rPr>
+    </w:lvl>
+  </w:abstractNum>
+  <w:abstractNum w:abstractNumId="23">
     <w:lvl w:ilvl="0">
       <w:start w:val="1"/>
       <w:numFmt w:val="bullet"/>
@@ -7066,6 +7692,15 @@
   </w:num>
   <w:num w:numId="20">
     <w:abstractNumId w:val="20"/>
+  </w:num>
+  <w:num w:numId="21">
+    <w:abstractNumId w:val="21"/>
+  </w:num>
+  <w:num w:numId="22">
+    <w:abstractNumId w:val="22"/>
+  </w:num>
+  <w:num w:numId="23">
+    <w:abstractNumId w:val="23"/>
   </w:num>
 </w:numbering>
 </file>

</xml_diff>

<commit_message>
docs(cantine-connect): synchronise le manuel réorganisé et l'offre financière avec sommaire
Rafraîchit docs/from-labs/livraison/ suite à l'ajout d'un sommaire et à la
réorganisation du manuel utilisateur (ordre du menu), à la galerie des 3
habillages visuels, et à l'ajout d'un sommaire sur l'offre financière
standard, côté klem-labs-repository.

Co-Authored-By: Claude Sonnet 5 <noreply@anthropic.com>
</commit_message>
<xml_diff>
--- a/apps/web-app/cantine-connect/docs/from-labs/livraison/manuel-utilisateur.docx
+++ b/apps/web-app/cantine-connect/docs/from-labs/livraison/manuel-utilisateur.docx
@@ -43,6 +43,261 @@
       </w:pPr>
       <w:r>
         <w:rPr/>
+        <w:t xml:space="preserve">Sommaire</w:t>
+      </w:r>
+    </w:p>
+    <w:p>
+      <w:pPr>
+        <w:numPr>
+          <w:ilvl w:val="0"/>
+          <w:numId w:val="1"/>
+        </w:numPr>
+        <w:spacing w:lineRule="auto"/>
+      </w:pPr>
+      <w:r>
+        <w:rPr/>
+        <w:t xml:space="preserve">Page d'accueil (publique)</w:t>
+      </w:r>
+    </w:p>
+    <w:p>
+      <w:pPr>
+        <w:numPr>
+          <w:ilvl w:val="0"/>
+          <w:numId w:val="1"/>
+        </w:numPr>
+        <w:spacing w:lineRule="auto"/>
+      </w:pPr>
+      <w:r>
+        <w:rPr/>
+        <w:t xml:space="preserve">Connexion</w:t>
+      </w:r>
+    </w:p>
+    <w:p>
+      <w:pPr>
+        <w:numPr>
+          <w:ilvl w:val="0"/>
+          <w:numId w:val="1"/>
+        </w:numPr>
+        <w:spacing w:lineRule="auto"/>
+      </w:pPr>
+      <w:r>
+        <w:rPr/>
+        <w:t xml:space="preserve">Demande d'accès parent (sans avoir besoin d'un compte)</w:t>
+      </w:r>
+    </w:p>
+    <w:p>
+      <w:pPr>
+        <w:numPr>
+          <w:ilvl w:val="0"/>
+          <w:numId w:val="1"/>
+        </w:numPr>
+        <w:spacing w:lineRule="auto"/>
+      </w:pPr>
+      <w:r>
+        <w:rPr/>
+        <w:t xml:space="preserve">Qui peut voir et faire quoi</w:t>
+      </w:r>
+    </w:p>
+    <w:p>
+      <w:pPr>
+        <w:numPr>
+          <w:ilvl w:val="0"/>
+          <w:numId w:val="1"/>
+        </w:numPr>
+        <w:spacing w:lineRule="auto"/>
+      </w:pPr>
+      <w:r>
+        <w:rPr/>
+        <w:t xml:space="preserve">Tableau de bord</w:t>
+      </w:r>
+    </w:p>
+    <w:p>
+      <w:pPr>
+        <w:numPr>
+          <w:ilvl w:val="0"/>
+          <w:numId w:val="1"/>
+        </w:numPr>
+        <w:spacing w:lineRule="auto"/>
+      </w:pPr>
+      <w:r>
+        <w:rPr/>
+        <w:t xml:space="preserve">Établissements</w:t>
+      </w:r>
+    </w:p>
+    <w:p>
+      <w:pPr>
+        <w:numPr>
+          <w:ilvl w:val="0"/>
+          <w:numId w:val="1"/>
+        </w:numPr>
+        <w:spacing w:lineRule="auto"/>
+      </w:pPr>
+      <w:r>
+        <w:rPr/>
+        <w:t xml:space="preserve">Élèves</w:t>
+      </w:r>
+    </w:p>
+    <w:p>
+      <w:pPr>
+        <w:numPr>
+          <w:ilvl w:val="0"/>
+          <w:numId w:val="1"/>
+        </w:numPr>
+        <w:spacing w:lineRule="auto"/>
+      </w:pPr>
+      <w:r>
+        <w:rPr/>
+        <w:t xml:space="preserve">Mes enfants</w:t>
+      </w:r>
+    </w:p>
+    <w:p>
+      <w:pPr>
+        <w:numPr>
+          <w:ilvl w:val="0"/>
+          <w:numId w:val="1"/>
+        </w:numPr>
+        <w:spacing w:lineRule="auto"/>
+      </w:pPr>
+      <w:r>
+        <w:rPr/>
+        <w:t xml:space="preserve">Paiements Mobile Money</w:t>
+      </w:r>
+    </w:p>
+    <w:p>
+      <w:pPr>
+        <w:numPr>
+          <w:ilvl w:val="0"/>
+          <w:numId w:val="1"/>
+        </w:numPr>
+        <w:spacing w:lineRule="auto"/>
+      </w:pPr>
+      <w:r>
+        <w:rPr/>
+        <w:t xml:space="preserve">Contrôle d'accès à la cantine</w:t>
+      </w:r>
+    </w:p>
+    <w:p>
+      <w:pPr>
+        <w:numPr>
+          <w:ilvl w:val="0"/>
+          <w:numId w:val="1"/>
+        </w:numPr>
+        <w:spacing w:lineRule="auto"/>
+      </w:pPr>
+      <w:r>
+        <w:rPr/>
+        <w:t xml:space="preserve">Historique des passages</w:t>
+      </w:r>
+    </w:p>
+    <w:p>
+      <w:pPr>
+        <w:numPr>
+          <w:ilvl w:val="0"/>
+          <w:numId w:val="1"/>
+        </w:numPr>
+        <w:spacing w:lineRule="auto"/>
+      </w:pPr>
+      <w:r>
+        <w:rPr/>
+        <w:t xml:space="preserve">Rapports</w:t>
+      </w:r>
+    </w:p>
+    <w:p>
+      <w:pPr>
+        <w:numPr>
+          <w:ilvl w:val="0"/>
+          <w:numId w:val="1"/>
+        </w:numPr>
+        <w:spacing w:lineRule="auto"/>
+      </w:pPr>
+      <w:r>
+        <w:rPr/>
+        <w:t xml:space="preserve">Comptes utilisateurs</w:t>
+      </w:r>
+    </w:p>
+    <w:p>
+      <w:pPr>
+        <w:numPr>
+          <w:ilvl w:val="0"/>
+          <w:numId w:val="1"/>
+        </w:numPr>
+        <w:spacing w:lineRule="auto"/>
+      </w:pPr>
+      <w:r>
+        <w:rPr/>
+        <w:t xml:space="preserve">Parents</w:t>
+      </w:r>
+    </w:p>
+    <w:p>
+      <w:pPr>
+        <w:numPr>
+          <w:ilvl w:val="0"/>
+          <w:numId w:val="1"/>
+        </w:numPr>
+        <w:spacing w:lineRule="auto"/>
+      </w:pPr>
+      <w:r>
+        <w:rPr/>
+        <w:t xml:space="preserve">Demandes d'accès (validation par l'administrateur)</w:t>
+      </w:r>
+    </w:p>
+    <w:p>
+      <w:pPr>
+        <w:numPr>
+          <w:ilvl w:val="0"/>
+          <w:numId w:val="1"/>
+        </w:numPr>
+        <w:spacing w:lineRule="auto"/>
+      </w:pPr>
+      <w:r>
+        <w:rPr/>
+        <w:t xml:space="preserve">Paramètres</w:t>
+      </w:r>
+    </w:p>
+    <w:p>
+      <w:pPr>
+        <w:numPr>
+          <w:ilvl w:val="0"/>
+          <w:numId w:val="1"/>
+        </w:numPr>
+        <w:spacing w:lineRule="auto"/>
+      </w:pPr>
+      <w:r>
+        <w:rPr/>
+        <w:t xml:space="preserve">Paiement et notifications — état de la mise en service</w:t>
+      </w:r>
+    </w:p>
+    <w:p>
+      <w:pPr>
+        <w:numPr>
+          <w:ilvl w:val="0"/>
+          <w:numId w:val="1"/>
+        </w:numPr>
+        <w:spacing w:lineRule="auto"/>
+      </w:pPr>
+      <w:r>
+        <w:rPr/>
+        <w:t xml:space="preserve">Support et à propos</w:t>
+      </w:r>
+    </w:p>
+    <w:p>
+      <w:pPr>
+        <w:ind w:left="284"/>
+        <w:jc w:val="both"/>
+        <w:spacing w:lineRule="auto"/>
+      </w:pPr>
+      <w:r>
+        <w:rPr/>
+        <w:t xml:space="preserve">Les sections 5 à 16 suivent l'ordre du menu affiché à gauche de l'écran une fois connecté — pour retrouver rapidement une fonctionnalité dans ce manuel, il suffit de la chercher dans le même ordre que dans l'application.</w:t>
+      </w:r>
+    </w:p>
+    <w:p>
+      <w:pPr>
+        <w:pStyle w:val="Heading2"/>
+        <w:spacing w:lineRule="auto"/>
+      </w:pPr>
+      <w:r>
+        <w:rPr/>
         <w:t xml:space="preserve">1. Page d'accueil (publique)</w:t>
       </w:r>
     </w:p>
@@ -59,7 +314,7 @@
       <w:pPr>
         <w:numPr>
           <w:ilvl w:val="0"/>
-          <w:numId w:val="1"/>
+          <w:numId w:val="2"/>
         </w:numPr>
         <w:spacing w:lineRule="auto"/>
       </w:pPr>
@@ -78,7 +333,7 @@
       <w:pPr>
         <w:numPr>
           <w:ilvl w:val="0"/>
-          <w:numId w:val="1"/>
+          <w:numId w:val="2"/>
         </w:numPr>
         <w:spacing w:lineRule="auto"/>
       </w:pPr>
@@ -122,12 +377,12 @@
           <wp:inline distB="0" distL="0" distR="0" distT="0">
             <wp:extent cx="5715000" cy="3571875"/>
             <wp:effectExtent b="0" l="0" r="0" t="0"/>
-            <wp:docPr id="1" name="image-MCBjsMLmN3S-KWflkZcdA.png"/>
+            <wp:docPr id="1" name="image-rHKNz1QmiaQgqa2vfbMWi.png"/>
             <a:graphic>
               <a:graphicData uri="http://schemas.openxmlformats.org/drawingml/2006/picture">
                 <pic:pic>
                   <pic:nvPicPr>
-                    <pic:cNvPr id="1" name="image-MCBjsMLmN3S-KWflkZcdA.png" descr="Écran de connexion"/>
+                    <pic:cNvPr id="1" name="image-rHKNz1QmiaQgqa2vfbMWi.png" descr="Écran de connexion"/>
                     <pic:cNvPicPr/>
                   </pic:nvPicPr>
                   <pic:blipFill>
@@ -157,129 +412,7 @@
       </w:pPr>
       <w:r>
         <w:rPr/>
-        <w:t xml:space="preserve">On se connecte avec une adresse email (ou l'identifiant qui a été donné automatiquement aux parents sans email — voir §3) et un mot de passe. Il n'y a plus d'identifiants affichés à l'écran par défaut, pour des raisons de sécurité — ils doivent être communiqués séparément par un administrateur, ou reçus automatiquement quand une demande d'accès est validée (§3).</w:t>
-      </w:r>
-    </w:p>
-    <w:p>
-      <w:pPr>
-        <w:spacing w:lineRule="auto"/>
-      </w:pPr>
-      <w:r>
-        <w:rPr/>
-        <w:t xml:space="preserve">Un </w:t>
-      </w:r>
-      <w:r>
-        <w:rPr>
-          <w:b/>
-        </w:rPr>
-        <w:t xml:space="preserve">sélecteur d'habillage</w:t>
-      </w:r>
-      <w:r>
-        <w:rPr/>
-        <w:t xml:space="preserve"> (icône palette, visible une fois connecté, en haut de l'écran) permet de choisir entre trois présentations visuelles : </w:t>
-      </w:r>
-      <w:r>
-        <w:rPr>
-          <w:b/>
-        </w:rPr>
-        <w:t xml:space="preserve">Premium</w:t>
-      </w:r>
-      <w:r>
-        <w:rPr/>
-        <w:t xml:space="preserve"> (par défaut, tons orange et vert chaleureux), </w:t>
-      </w:r>
-      <w:r>
-        <w:rPr>
-          <w:b/>
-        </w:rPr>
-        <w:t xml:space="preserve">Corporatif</w:t>
-      </w:r>
-      <w:r>
-        <w:rPr/>
-        <w:t xml:space="preserve"> (fond sombre, plus sobre) et </w:t>
-      </w:r>
-      <w:r>
-        <w:rPr>
-          <w:b/>
-        </w:rPr>
-        <w:t xml:space="preserve">Moderne</w:t>
-      </w:r>
-      <w:r>
-        <w:rPr/>
-        <w:t xml:space="preserve"> (fond blanc, dégradés bleu/orange). Le choix reste mémorisé sur l'appareil utilisé.</w:t>
-      </w:r>
-    </w:p>
-    <w:p>
-      <w:pPr>
-        <w:spacing w:lineRule="auto"/>
-      </w:pPr>
-      <w:r>
-        <w:rPr/>
-        <w:drawing>
-          <wp:inline distB="0" distL="0" distR="0" distT="0">
-            <wp:extent cx="5715000" cy="3571875"/>
-            <wp:effectExtent b="0" l="0" r="0" t="0"/>
-            <wp:docPr id="2" name="image-rFOmagL7ACZqUo6kfgJB7.png"/>
-            <a:graphic>
-              <a:graphicData uri="http://schemas.openxmlformats.org/drawingml/2006/picture">
-                <pic:pic>
-                  <pic:nvPicPr>
-                    <pic:cNvPr id="2" name="image-rFOmagL7ACZqUo6kfgJB7.png" descr="Sélecteur d'habillage"/>
-                    <pic:cNvPicPr/>
-                  </pic:nvPicPr>
-                  <pic:blipFill>
-                    <a:blip r:embed="rId7" cstate="print"/>
-                    <a:srcRect b="0" l="0" r="0" t="0"/>
-                    <a:stretch>
-                      <a:fillRect/>
-                    </a:stretch>
-                  </pic:blipFill>
-                  <pic:spPr>
-                    <a:xfrm>
-                      <a:off x="0" y="0"/>
-                      <a:ext cx="5715000" cy="3571875"/>
-                    </a:xfrm>
-                    <a:prstGeom prst="rect"/>
-                  </pic:spPr>
-                </pic:pic>
-              </a:graphicData>
-            </a:graphic>
-          </wp:inline>
-        </w:drawing>
-      </w:r>
-      <w:r>
-        <w:rPr/>
-        <w:drawing>
-          <wp:inline distB="0" distL="0" distR="0" distT="0">
-            <wp:extent cx="5715000" cy="3571875"/>
-            <wp:effectExtent b="0" l="0" r="0" t="0"/>
-            <wp:docPr id="3" name="image-YDq2koF2BWxKEzDVf0xD5.png"/>
-            <a:graphic>
-              <a:graphicData uri="http://schemas.openxmlformats.org/drawingml/2006/picture">
-                <pic:pic>
-                  <pic:nvPicPr>
-                    <pic:cNvPr id="3" name="image-YDq2koF2BWxKEzDVf0xD5.png" descr="Exemple d'habillage Corporatif"/>
-                    <pic:cNvPicPr/>
-                  </pic:nvPicPr>
-                  <pic:blipFill>
-                    <a:blip r:embed="rId8" cstate="print"/>
-                    <a:srcRect b="0" l="0" r="0" t="0"/>
-                    <a:stretch>
-                      <a:fillRect/>
-                    </a:stretch>
-                  </pic:blipFill>
-                  <pic:spPr>
-                    <a:xfrm>
-                      <a:off x="0" y="0"/>
-                      <a:ext cx="5715000" cy="3571875"/>
-                    </a:xfrm>
-                    <a:prstGeom prst="rect"/>
-                  </pic:spPr>
-                </pic:pic>
-              </a:graphicData>
-            </a:graphic>
-          </wp:inline>
-        </w:drawing>
+        <w:t xml:space="preserve">On se connecte avec une adresse email (ou l'identifiant qui a été donné automatiquement aux parents sans email — voir §15) et un mot de passe. Il n'y a plus d'identifiants affichés à l'écran par défaut, pour des raisons de sécurité — ils doivent être communiqués séparément par un administrateur, ou reçus automatiquement quand une demande d'accès est validée (§15).</w:t>
       </w:r>
     </w:p>
     <w:p>
@@ -714,21 +847,31 @@
     </w:p>
     <w:p>
       <w:pPr>
-        <w:pStyle w:val="Heading2"/>
-        <w:spacing w:lineRule="auto"/>
-      </w:pPr>
-      <w:r>
-        <w:rPr/>
-        <w:t xml:space="preserve">3. Demande d'accès parent (sans avoir besoin d'un compte)</w:t>
-      </w:r>
-    </w:p>
-    <w:p>
-      <w:pPr>
-        <w:spacing w:lineRule="auto"/>
-      </w:pPr>
-      <w:r>
-        <w:rPr/>
-        <w:t xml:space="preserve">Un parent qui n'a pas encore de compte peut faire une demande depuis la page « Demande d'accès », accessible depuis la page d'accueil ou l'écran de connexion. C'est un formulaire simple en trois petites étapes, avec une barre de progression en haut pour savoir où on en est :</w:t>
+        <w:pStyle w:val="Heading3"/>
+        <w:spacing w:lineRule="auto"/>
+      </w:pPr>
+      <w:r>
+        <w:rPr/>
+        <w:t xml:space="preserve">Habillages visuels</w:t>
+      </w:r>
+    </w:p>
+    <w:p>
+      <w:pPr>
+        <w:spacing w:lineRule="auto"/>
+      </w:pPr>
+      <w:r>
+        <w:rPr/>
+        <w:t xml:space="preserve">Un </w:t>
+      </w:r>
+      <w:r>
+        <w:rPr>
+          <w:b/>
+        </w:rPr>
+        <w:t xml:space="preserve">sélecteur d'habillage</w:t>
+      </w:r>
+      <w:r>
+        <w:rPr/>
+        <w:t xml:space="preserve"> (icône palette, visible une fois connecté, en haut de l'écran) permet de choisir entre trois présentations visuelles. Le choix reste mémorisé sur l'appareil utilisé.</w:t>
       </w:r>
     </w:p>
     <w:p>
@@ -741,12 +884,120 @@
           <wp:inline distB="0" distL="0" distR="0" distT="0">
             <wp:extent cx="5715000" cy="3571875"/>
             <wp:effectExtent b="0" l="0" r="0" t="0"/>
-            <wp:docPr id="4" name="image-eM05WmXpuTbDJdZKSsCEm.png"/>
+            <wp:docPr id="2" name="image-iJQjtRI08EVCNRKbSX9g_.png"/>
             <a:graphic>
               <a:graphicData uri="http://schemas.openxmlformats.org/drawingml/2006/picture">
                 <pic:pic>
                   <pic:nvPicPr>
-                    <pic:cNvPr id="4" name="image-eM05WmXpuTbDJdZKSsCEm.png" descr="Demande d'accès — étape 1 : identité"/>
+                    <pic:cNvPr id="2" name="image-iJQjtRI08EVCNRKbSX9g_.png" descr="Sélecteur d'habillage"/>
+                    <pic:cNvPicPr/>
+                  </pic:nvPicPr>
+                  <pic:blipFill>
+                    <a:blip r:embed="rId7" cstate="print"/>
+                    <a:srcRect b="0" l="0" r="0" t="0"/>
+                    <a:stretch>
+                      <a:fillRect/>
+                    </a:stretch>
+                  </pic:blipFill>
+                  <pic:spPr>
+                    <a:xfrm>
+                      <a:off x="0" y="0"/>
+                      <a:ext cx="5715000" cy="3571875"/>
+                    </a:xfrm>
+                    <a:prstGeom prst="rect"/>
+                  </pic:spPr>
+                </pic:pic>
+              </a:graphicData>
+            </a:graphic>
+          </wp:inline>
+        </w:drawing>
+      </w:r>
+    </w:p>
+    <w:p>
+      <w:pPr>
+        <w:spacing w:lineRule="auto"/>
+      </w:pPr>
+      <w:r>
+        <w:rPr>
+          <w:b/>
+        </w:rPr>
+        <w:t xml:space="preserve">Premium</w:t>
+      </w:r>
+      <w:r>
+        <w:rPr/>
+        <w:t xml:space="preserve"> (par défaut) — tons orange et vert chaleureux :</w:t>
+      </w:r>
+    </w:p>
+    <w:p>
+      <w:pPr>
+        <w:spacing w:lineRule="auto"/>
+      </w:pPr>
+      <w:r>
+        <w:rPr/>
+        <w:drawing>
+          <wp:inline distB="0" distL="0" distR="0" distT="0">
+            <wp:extent cx="5715000" cy="3571875"/>
+            <wp:effectExtent b="0" l="0" r="0" t="0"/>
+            <wp:docPr id="3" name="image-HoGd_kCsPWYgK4WhBXp5J.png"/>
+            <a:graphic>
+              <a:graphicData uri="http://schemas.openxmlformats.org/drawingml/2006/picture">
+                <pic:pic>
+                  <pic:nvPicPr>
+                    <pic:cNvPr id="3" name="image-HoGd_kCsPWYgK4WhBXp5J.png" descr="Habillage Premium"/>
+                    <pic:cNvPicPr/>
+                  </pic:nvPicPr>
+                  <pic:blipFill>
+                    <a:blip r:embed="rId8" cstate="print"/>
+                    <a:srcRect b="0" l="0" r="0" t="0"/>
+                    <a:stretch>
+                      <a:fillRect/>
+                    </a:stretch>
+                  </pic:blipFill>
+                  <pic:spPr>
+                    <a:xfrm>
+                      <a:off x="0" y="0"/>
+                      <a:ext cx="5715000" cy="3571875"/>
+                    </a:xfrm>
+                    <a:prstGeom prst="rect"/>
+                  </pic:spPr>
+                </pic:pic>
+              </a:graphicData>
+            </a:graphic>
+          </wp:inline>
+        </w:drawing>
+      </w:r>
+    </w:p>
+    <w:p>
+      <w:pPr>
+        <w:spacing w:lineRule="auto"/>
+      </w:pPr>
+      <w:r>
+        <w:rPr>
+          <w:b/>
+        </w:rPr>
+        <w:t xml:space="preserve">Corporatif</w:t>
+      </w:r>
+      <w:r>
+        <w:rPr/>
+        <w:t xml:space="preserve"> — fond sombre, plus sobre :</w:t>
+      </w:r>
+    </w:p>
+    <w:p>
+      <w:pPr>
+        <w:spacing w:lineRule="auto"/>
+      </w:pPr>
+      <w:r>
+        <w:rPr/>
+        <w:drawing>
+          <wp:inline distB="0" distL="0" distR="0" distT="0">
+            <wp:extent cx="5715000" cy="3571875"/>
+            <wp:effectExtent b="0" l="0" r="0" t="0"/>
+            <wp:docPr id="4" name="image-9Ea8n9QaVFxwGj5adsx8-.png"/>
+            <a:graphic>
+              <a:graphicData uri="http://schemas.openxmlformats.org/drawingml/2006/picture">
+                <pic:pic>
+                  <pic:nvPicPr>
+                    <pic:cNvPr id="4" name="image-9Ea8n9QaVFxwGj5adsx8-.png" descr="Habillage Corporatif"/>
                     <pic:cNvPicPr/>
                   </pic:nvPicPr>
                   <pic:blipFill>
@@ -772,21 +1023,17 @@
     </w:p>
     <w:p>
       <w:pPr>
-        <w:numPr>
-          <w:ilvl w:val="0"/>
-          <w:numId w:val="2"/>
-        </w:numPr>
         <w:spacing w:lineRule="auto"/>
       </w:pPr>
       <w:r>
         <w:rPr>
           <w:b/>
         </w:rPr>
-        <w:t xml:space="preserve">Identité</w:t>
-      </w:r>
-      <w:r>
-        <w:rPr/>
-        <w:t xml:space="preserve"> : nom, prénom, fonction (facultatif — par exemple « Maman », « Tuteur »).</w:t>
+        <w:t xml:space="preserve">Moderne</w:t>
+      </w:r>
+      <w:r>
+        <w:rPr/>
+        <w:t xml:space="preserve"> — fond blanc, dégradés bleu/orange :</w:t>
       </w:r>
     </w:p>
     <w:p>
@@ -799,12 +1046,12 @@
           <wp:inline distB="0" distL="0" distR="0" distT="0">
             <wp:extent cx="5715000" cy="3571875"/>
             <wp:effectExtent b="0" l="0" r="0" t="0"/>
-            <wp:docPr id="5" name="image-6ByJh0ajp84QUSy9Y9Wxr.png"/>
+            <wp:docPr id="5" name="image-XWg_vDT57CM3NVrjq_zI-.png"/>
             <a:graphic>
               <a:graphicData uri="http://schemas.openxmlformats.org/drawingml/2006/picture">
                 <pic:pic>
                   <pic:nvPicPr>
-                    <pic:cNvPr id="5" name="image-6ByJh0ajp84QUSy9Y9Wxr.png" descr="Demande d'accès — étape 2 : contact"/>
+                    <pic:cNvPr id="5" name="image-XWg_vDT57CM3NVrjq_zI-.png" descr="Habillage Moderne"/>
                     <pic:cNvPicPr/>
                   </pic:nvPicPr>
                   <pic:blipFill>
@@ -830,21 +1077,21 @@
     </w:p>
     <w:p>
       <w:pPr>
-        <w:numPr>
-          <w:ilvl w:val="0"/>
-          <w:numId w:val="3"/>
-        </w:numPr>
-        <w:spacing w:lineRule="auto"/>
-      </w:pPr>
-      <w:r>
-        <w:rPr>
-          <w:b/>
-        </w:rPr>
-        <w:t xml:space="preserve">Contact</w:t>
-      </w:r>
-      <w:r>
-        <w:rPr/>
-        <w:t xml:space="preserve"> : numéro de téléphone principal (obligatoire), case à cocher « Ce numéro est aussi mon WhatsApp » (sinon un second numéro WhatsApp peut être saisi), second numéro de téléphone (facultatif), email (facultatif). Un message rappelle qu'une notification sera envoyée par SMS et invite à bien vérifier le numéro saisi.</w:t>
+        <w:pStyle w:val="Heading2"/>
+        <w:spacing w:lineRule="auto"/>
+      </w:pPr>
+      <w:r>
+        <w:rPr/>
+        <w:t xml:space="preserve">3. Demande d'accès parent (sans avoir besoin d'un compte)</w:t>
+      </w:r>
+    </w:p>
+    <w:p>
+      <w:pPr>
+        <w:spacing w:lineRule="auto"/>
+      </w:pPr>
+      <w:r>
+        <w:rPr/>
+        <w:t xml:space="preserve">Un parent qui n'a pas encore de compte peut faire une demande depuis la page « Demande d'accès », accessible depuis la page d'accueil ou l'écran de connexion. C'est un formulaire simple en trois petites étapes, avec une barre de progression en haut pour savoir où on en est :</w:t>
       </w:r>
     </w:p>
     <w:p>
@@ -857,12 +1104,12 @@
           <wp:inline distB="0" distL="0" distR="0" distT="0">
             <wp:extent cx="5715000" cy="3571875"/>
             <wp:effectExtent b="0" l="0" r="0" t="0"/>
-            <wp:docPr id="6" name="image-DqhgLwQ7vZWU7IC0KTlCZ.png"/>
+            <wp:docPr id="6" name="image--KXmc1XlGqiGSEoB6SRWh.png"/>
             <a:graphic>
               <a:graphicData uri="http://schemas.openxmlformats.org/drawingml/2006/picture">
                 <pic:pic>
                   <pic:nvPicPr>
-                    <pic:cNvPr id="6" name="image-DqhgLwQ7vZWU7IC0KTlCZ.png" descr="Demande d'accès — étape 3 : résidence"/>
+                    <pic:cNvPr id="6" name="image--KXmc1XlGqiGSEoB6SRWh.png" descr="Demande d'accès — étape 1 : identité"/>
                     <pic:cNvPicPr/>
                   </pic:nvPicPr>
                   <pic:blipFill>
@@ -890,7 +1137,7 @@
       <w:pPr>
         <w:numPr>
           <w:ilvl w:val="0"/>
-          <w:numId w:val="4"/>
+          <w:numId w:val="3"/>
         </w:numPr>
         <w:spacing w:lineRule="auto"/>
       </w:pPr>
@@ -898,45 +1145,11 @@
         <w:rPr>
           <w:b/>
         </w:rPr>
-        <w:t xml:space="preserve">Résidence</w:t>
-      </w:r>
-      <w:r>
-        <w:rPr/>
-        <w:t xml:space="preserve"> : ville, commune (obligatoires), quartier (facultatif).</w:t>
-      </w:r>
-    </w:p>
-    <w:p>
-      <w:pPr>
-        <w:spacing w:lineRule="auto"/>
-      </w:pPr>
-      <w:r>
-        <w:rPr/>
-        <w:t xml:space="preserve">Le numéro principal, le numéro WhatsApp et le second numéro doivent être au format ivoirien (10 chiffres commençant par 0, par exemple </w:t>
-      </w:r>
-      <w:r>
-        <w:rPr/>
-        <w:t xml:space="preserve">07 08 09 10 11</w:t>
-      </w:r>
-      <w:r>
-        <w:rPr/>
-        <w:t xml:space="preserve">, avec l'indicatif </w:t>
-      </w:r>
-      <w:r>
-        <w:rPr/>
-        <w:t xml:space="preserve">+225</w:t>
-      </w:r>
-      <w:r>
-        <w:rPr/>
-        <w:t xml:space="preserve"> en option) ; l'email, s'il est renseigné, doit être une adresse valide. Ce contrôle est fait à la fois dans le formulaire et vérifié une seconde fois par le système, pour éviter toute erreur de saisie.</w:t>
-      </w:r>
-    </w:p>
-    <w:p>
-      <w:pPr>
-        <w:spacing w:lineRule="auto"/>
-      </w:pPr>
-      <w:r>
-        <w:rPr/>
-        <w:t xml:space="preserve">Une fois les trois étapes remplies, un bouton « Envoyer ma demande » termine le processus et un écran de confirmation s'affiche :</w:t>
+        <w:t xml:space="preserve">Identité</w:t>
+      </w:r>
+      <w:r>
+        <w:rPr/>
+        <w:t xml:space="preserve"> : nom, prénom, fonction (facultatif — par exemple « Maman », « Tuteur »).</w:t>
       </w:r>
     </w:p>
     <w:p>
@@ -949,12 +1162,12 @@
           <wp:inline distB="0" distL="0" distR="0" distT="0">
             <wp:extent cx="5715000" cy="3571875"/>
             <wp:effectExtent b="0" l="0" r="0" t="0"/>
-            <wp:docPr id="7" name="image-lzCrLnpttglrrl3Q3-jN-.png"/>
+            <wp:docPr id="7" name="image-McfeYE97C5HLzpofZKZA-.png"/>
             <a:graphic>
               <a:graphicData uri="http://schemas.openxmlformats.org/drawingml/2006/picture">
                 <pic:pic>
                   <pic:nvPicPr>
-                    <pic:cNvPr id="7" name="image-lzCrLnpttglrrl3Q3-jN-.png" descr="Demande d'accès — confirmation"/>
+                    <pic:cNvPr id="7" name="image-McfeYE97C5HLzpofZKZA-.png" descr="Demande d'accès — étape 2 : contact"/>
                     <pic:cNvPicPr/>
                   </pic:nvPicPr>
                   <pic:blipFill>
@@ -980,6 +1193,156 @@
     </w:p>
     <w:p>
       <w:pPr>
+        <w:numPr>
+          <w:ilvl w:val="0"/>
+          <w:numId w:val="4"/>
+        </w:numPr>
+        <w:spacing w:lineRule="auto"/>
+      </w:pPr>
+      <w:r>
+        <w:rPr>
+          <w:b/>
+        </w:rPr>
+        <w:t xml:space="preserve">Contact</w:t>
+      </w:r>
+      <w:r>
+        <w:rPr/>
+        <w:t xml:space="preserve"> : numéro de téléphone principal (obligatoire), case à cocher « Ce numéro est aussi mon WhatsApp » (sinon un second numéro WhatsApp peut être saisi), second numéro de téléphone (facultatif), email (facultatif). Un message rappelle qu'une notification sera envoyée par SMS et invite à bien vérifier le numéro saisi.</w:t>
+      </w:r>
+    </w:p>
+    <w:p>
+      <w:pPr>
+        <w:spacing w:lineRule="auto"/>
+      </w:pPr>
+      <w:r>
+        <w:rPr/>
+        <w:drawing>
+          <wp:inline distB="0" distL="0" distR="0" distT="0">
+            <wp:extent cx="5715000" cy="3571875"/>
+            <wp:effectExtent b="0" l="0" r="0" t="0"/>
+            <wp:docPr id="8" name="image-pmMDYhP-3eruOaDu0o-MA.png"/>
+            <a:graphic>
+              <a:graphicData uri="http://schemas.openxmlformats.org/drawingml/2006/picture">
+                <pic:pic>
+                  <pic:nvPicPr>
+                    <pic:cNvPr id="8" name="image-pmMDYhP-3eruOaDu0o-MA.png" descr="Demande d'accès — étape 3 : résidence"/>
+                    <pic:cNvPicPr/>
+                  </pic:nvPicPr>
+                  <pic:blipFill>
+                    <a:blip r:embed="rId13" cstate="print"/>
+                    <a:srcRect b="0" l="0" r="0" t="0"/>
+                    <a:stretch>
+                      <a:fillRect/>
+                    </a:stretch>
+                  </pic:blipFill>
+                  <pic:spPr>
+                    <a:xfrm>
+                      <a:off x="0" y="0"/>
+                      <a:ext cx="5715000" cy="3571875"/>
+                    </a:xfrm>
+                    <a:prstGeom prst="rect"/>
+                  </pic:spPr>
+                </pic:pic>
+              </a:graphicData>
+            </a:graphic>
+          </wp:inline>
+        </w:drawing>
+      </w:r>
+    </w:p>
+    <w:p>
+      <w:pPr>
+        <w:numPr>
+          <w:ilvl w:val="0"/>
+          <w:numId w:val="5"/>
+        </w:numPr>
+        <w:spacing w:lineRule="auto"/>
+      </w:pPr>
+      <w:r>
+        <w:rPr>
+          <w:b/>
+        </w:rPr>
+        <w:t xml:space="preserve">Résidence</w:t>
+      </w:r>
+      <w:r>
+        <w:rPr/>
+        <w:t xml:space="preserve"> : ville, commune (obligatoires), quartier (facultatif).</w:t>
+      </w:r>
+    </w:p>
+    <w:p>
+      <w:pPr>
+        <w:spacing w:lineRule="auto"/>
+      </w:pPr>
+      <w:r>
+        <w:rPr/>
+        <w:t xml:space="preserve">Le numéro principal, le numéro WhatsApp et le second numéro doivent être au format ivoirien (10 chiffres commençant par 0, par exemple </w:t>
+      </w:r>
+      <w:r>
+        <w:rPr/>
+        <w:t xml:space="preserve">07 08 09 10 11</w:t>
+      </w:r>
+      <w:r>
+        <w:rPr/>
+        <w:t xml:space="preserve">, avec l'indicatif </w:t>
+      </w:r>
+      <w:r>
+        <w:rPr/>
+        <w:t xml:space="preserve">+225</w:t>
+      </w:r>
+      <w:r>
+        <w:rPr/>
+        <w:t xml:space="preserve"> en option) ; l'email, s'il est renseigné, doit être une adresse valide. Ce contrôle est fait à la fois dans le formulaire et vérifié une seconde fois par le système, pour éviter toute erreur de saisie.</w:t>
+      </w:r>
+    </w:p>
+    <w:p>
+      <w:pPr>
+        <w:spacing w:lineRule="auto"/>
+      </w:pPr>
+      <w:r>
+        <w:rPr/>
+        <w:t xml:space="preserve">Une fois les trois étapes remplies, un bouton « Envoyer ma demande » termine le processus et un écran de confirmation s'affiche :</w:t>
+      </w:r>
+    </w:p>
+    <w:p>
+      <w:pPr>
+        <w:spacing w:lineRule="auto"/>
+      </w:pPr>
+      <w:r>
+        <w:rPr/>
+        <w:drawing>
+          <wp:inline distB="0" distL="0" distR="0" distT="0">
+            <wp:extent cx="5715000" cy="3571875"/>
+            <wp:effectExtent b="0" l="0" r="0" t="0"/>
+            <wp:docPr id="9" name="image-URnP64w6LoCXoutWUz8di.png"/>
+            <a:graphic>
+              <a:graphicData uri="http://schemas.openxmlformats.org/drawingml/2006/picture">
+                <pic:pic>
+                  <pic:nvPicPr>
+                    <pic:cNvPr id="9" name="image-URnP64w6LoCXoutWUz8di.png" descr="Demande d'accès — confirmation"/>
+                    <pic:cNvPicPr/>
+                  </pic:nvPicPr>
+                  <pic:blipFill>
+                    <a:blip r:embed="rId14" cstate="print"/>
+                    <a:srcRect b="0" l="0" r="0" t="0"/>
+                    <a:stretch>
+                      <a:fillRect/>
+                    </a:stretch>
+                  </pic:blipFill>
+                  <pic:spPr>
+                    <a:xfrm>
+                      <a:off x="0" y="0"/>
+                      <a:ext cx="5715000" cy="3571875"/>
+                    </a:xfrm>
+                    <a:prstGeom prst="rect"/>
+                  </pic:spPr>
+                </pic:pic>
+              </a:graphicData>
+            </a:graphic>
+          </wp:inline>
+        </w:drawing>
+      </w:r>
+    </w:p>
+    <w:p>
+      <w:pPr>
         <w:spacing w:lineRule="auto"/>
       </w:pPr>
       <w:r>
@@ -990,136 +1353,7 @@
       </w:r>
       <w:r>
         <w:rPr/>
-        <w:t xml:space="preserve"> — la demande est mise en attente jusqu'à ce que l'établissement la valide.</w:t>
-      </w:r>
-    </w:p>
-    <w:p>
-      <w:pPr>
-        <w:pStyle w:val="Heading3"/>
-        <w:spacing w:lineRule="auto"/>
-      </w:pPr>
-      <w:r>
-        <w:rPr/>
-        <w:t xml:space="preserve">Validation par l'administrateur</w:t>
-      </w:r>
-    </w:p>
-    <w:p>
-      <w:pPr>
-        <w:spacing w:lineRule="auto"/>
-      </w:pPr>
-      <w:r>
-        <w:rPr/>
-        <w:t xml:space="preserve">Sur l'écran « Demandes d'accès » (réservé à l'administrateur), on retrouve la liste des demandes, que l'on peut filtrer par statut (En attente / Validées / Rejetées). Chaque ligne a un bouton « Voir détails » qui ouvre une fiche complète du demandeur (identité, tous les numéros de téléphone, email, résidence, historique du traitement) — pour une demande en attente, c'est depuis cette fiche que l'on </w:t>
-      </w:r>
-      <w:r>
-        <w:rPr>
-          <w:b/>
-        </w:rPr>
-        <w:t xml:space="preserve">valide ou rejette</w:t>
-      </w:r>
-      <w:r>
-        <w:rPr/>
-        <w:t xml:space="preserve">, afin de toujours vérifier les informations avant de créer un compte.</w:t>
-      </w:r>
-    </w:p>
-    <w:p>
-      <w:pPr>
-        <w:numPr>
-          <w:ilvl w:val="0"/>
-          <w:numId w:val="5"/>
-        </w:numPr>
-        <w:spacing w:lineRule="auto"/>
-      </w:pPr>
-      <w:r>
-        <w:rPr>
-          <w:b/>
-        </w:rPr>
-        <w:t xml:space="preserve">Valider</w:t>
-      </w:r>
-      <w:r>
-        <w:rPr/>
-        <w:t xml:space="preserve"> : crée le compte du parent, avec un identifiant de connexion et un mot de passe provisoire générés automatiquement. Si les notifications par email et SMS sont activées (voir §15 Configuration), le parent les reçoit automatiquement ; </w:t>
-      </w:r>
-      <w:r>
-        <w:rPr>
-          <w:b/>
-        </w:rPr>
-        <w:t xml:space="preserve">dans tous les cas</w:t>
-      </w:r>
-      <w:r>
-        <w:rPr/>
-        <w:t xml:space="preserve">, une fenêtre affiche l'identifiant et le mot de passe à l'écran, pour pouvoir les communiquer manuellement si besoin.</w:t>
-      </w:r>
-    </w:p>
-    <w:p>
-      <w:pPr>
-        <w:numPr>
-          <w:ilvl w:val="1"/>
-          <w:numId w:val="6"/>
-        </w:numPr>
-        <w:spacing w:lineRule="auto"/>
-      </w:pPr>
-      <w:r>
-        <w:rPr/>
-        <w:t xml:space="preserve">Si le parent n'a donné </w:t>
-      </w:r>
-      <w:r>
-        <w:rPr>
-          <w:b/>
-        </w:rPr>
-        <w:t xml:space="preserve">aucun email</w:t>
-      </w:r>
-      <w:r>
-        <w:rPr/>
-        <w:t xml:space="preserve">, un identifiant de connexion est créé automatiquement à partir de son numéro de téléphone — ce n'est pas une adresse email utilisable, seulement un identifiant de connexion.</w:t>
-      </w:r>
-    </w:p>
-    <w:p>
-      <w:pPr>
-        <w:numPr>
-          <w:ilvl w:val="0"/>
-          <w:numId w:val="5"/>
-        </w:numPr>
-        <w:spacing w:lineRule="auto"/>
-      </w:pPr>
-      <w:r>
-        <w:rPr>
-          <w:b/>
-        </w:rPr>
-        <w:t xml:space="preserve">Rejeter</w:t>
-      </w:r>
-      <w:r>
-        <w:rPr/>
-        <w:t xml:space="preserve"> : un motif est obligatoire ; la demande reste visible avec son statut et le motif, pour garder une trace.</w:t>
-      </w:r>
-    </w:p>
-    <w:p>
-      <w:pPr>
-        <w:pStyle w:val="Heading3"/>
-        <w:spacing w:lineRule="auto"/>
-      </w:pPr>
-      <w:r>
-        <w:rPr/>
-        <w:t xml:space="preserve">Première connexion</w:t>
-      </w:r>
-    </w:p>
-    <w:p>
-      <w:pPr>
-        <w:spacing w:lineRule="auto"/>
-      </w:pPr>
-      <w:r>
-        <w:rPr/>
-        <w:t xml:space="preserve">Un parent dont le compte vient d'être créé </w:t>
-      </w:r>
-      <w:r>
-        <w:rPr>
-          <w:b/>
-        </w:rPr>
-        <w:t xml:space="preserve">doit changer son mot de passe provisoire</w:t>
-      </w:r>
-      <w:r>
-        <w:rPr/>
-        <w:t xml:space="preserve"> dès sa première connexion — l'application l'amène automatiquement sur cet écran et ne laisse pas accéder au reste du site tant que ce n'est pas fait.</w:t>
+        <w:t xml:space="preserve"> — la demande est mise en attente jusqu'à ce que l'établissement la valide (voir §15 pour la suite du processus, côté administrateur).</w:t>
       </w:r>
     </w:p>
     <w:p>
@@ -2822,152 +3056,12 @@
           <wp:inline distB="0" distL="0" distR="0" distT="0">
             <wp:extent cx="5715000" cy="3571875"/>
             <wp:effectExtent b="0" l="0" r="0" t="0"/>
-            <wp:docPr id="8" name="image-bR1_eiiuHFEGRbAtg1AWB.png"/>
+            <wp:docPr id="10" name="image-W-N9ROW2_ixxBNcINizn1.png"/>
             <a:graphic>
               <a:graphicData uri="http://schemas.openxmlformats.org/drawingml/2006/picture">
                 <pic:pic>
                   <pic:nvPicPr>
-                    <pic:cNvPr id="8" name="image-bR1_eiiuHFEGRbAtg1AWB.png" descr="Tableau de bord"/>
-                    <pic:cNvPicPr/>
-                  </pic:nvPicPr>
-                  <pic:blipFill>
-                    <a:blip r:embed="rId13" cstate="print"/>
-                    <a:srcRect b="0" l="0" r="0" t="0"/>
-                    <a:stretch>
-                      <a:fillRect/>
-                    </a:stretch>
-                  </pic:blipFill>
-                  <pic:spPr>
-                    <a:xfrm>
-                      <a:off x="0" y="0"/>
-                      <a:ext cx="5715000" cy="3571875"/>
-                    </a:xfrm>
-                    <a:prstGeom prst="rect"/>
-                  </pic:spPr>
-                </pic:pic>
-              </a:graphicData>
-            </a:graphic>
-          </wp:inline>
-        </w:drawing>
-      </w:r>
-      <w:r>
-        <w:rPr/>
-        <w:drawing>
-          <wp:inline distB="0" distL="0" distR="0" distT="0">
-            <wp:extent cx="5715000" cy="3571875"/>
-            <wp:effectExtent b="0" l="0" r="0" t="0"/>
-            <wp:docPr id="9" name="image-1v99SP-qGHFh1beJpiBne.png"/>
-            <a:graphic>
-              <a:graphicData uri="http://schemas.openxmlformats.org/drawingml/2006/picture">
-                <pic:pic>
-                  <pic:nvPicPr>
-                    <pic:cNvPr id="9" name="image-1v99SP-qGHFh1beJpiBne.png" descr="Tableau de bord — habillage Premium"/>
-                    <pic:cNvPicPr/>
-                  </pic:nvPicPr>
-                  <pic:blipFill>
-                    <a:blip r:embed="rId14" cstate="print"/>
-                    <a:srcRect b="0" l="0" r="0" t="0"/>
-                    <a:stretch>
-                      <a:fillRect/>
-                    </a:stretch>
-                  </pic:blipFill>
-                  <pic:spPr>
-                    <a:xfrm>
-                      <a:off x="0" y="0"/>
-                      <a:ext cx="5715000" cy="3571875"/>
-                    </a:xfrm>
-                    <a:prstGeom prst="rect"/>
-                  </pic:spPr>
-                </pic:pic>
-              </a:graphicData>
-            </a:graphic>
-          </wp:inline>
-        </w:drawing>
-      </w:r>
-    </w:p>
-    <w:p>
-      <w:pPr>
-        <w:spacing w:lineRule="auto"/>
-      </w:pPr>
-      <w:r>
-        <w:rPr/>
-        <w:t xml:space="preserve">Vue d'ensemble à l'ouverture de l'application : nombre d'élèves, répartition par statut d'accès, paiements récents, résumé des passages du jour.</w:t>
-      </w:r>
-    </w:p>
-    <w:p>
-      <w:pPr>
-        <w:numPr>
-          <w:ilvl w:val="0"/>
-          <w:numId w:val="7"/>
-        </w:numPr>
-        <w:spacing w:lineRule="auto"/>
-      </w:pPr>
-      <w:r>
-        <w:rPr>
-          <w:b/>
-        </w:rPr>
-        <w:t xml:space="preserve">Administrateur / gestionnaire / caissier</w:t>
-      </w:r>
-      <w:r>
-        <w:rPr/>
-        <w:t xml:space="preserve"> : les chiffres portent sur l'ensemble des élèves.</w:t>
-      </w:r>
-    </w:p>
-    <w:p>
-      <w:pPr>
-        <w:numPr>
-          <w:ilvl w:val="0"/>
-          <w:numId w:val="7"/>
-        </w:numPr>
-        <w:spacing w:lineRule="auto"/>
-      </w:pPr>
-      <w:r>
-        <w:rPr>
-          <w:b/>
-        </w:rPr>
-        <w:t xml:space="preserve">Parent</w:t>
-      </w:r>
-      <w:r>
-        <w:rPr/>
-        <w:t xml:space="preserve"> : les mêmes indicateurs (établissements, élèves, statuts, passages, paiements) portent uniquement sur </w:t>
-      </w:r>
-      <w:r>
-        <w:rPr>
-          <w:b/>
-        </w:rPr>
-        <w:t xml:space="preserve">ses propres enfants</w:t>
-      </w:r>
-      <w:r>
-        <w:rPr/>
-        <w:t xml:space="preserve"> — un parent d'un seul enfant verra par exemple « 1 élève », pas le total de l'établissement. Un parent qui n'a encore aucun enfant rattaché voit des indicateurs à zéro.</w:t>
-      </w:r>
-    </w:p>
-    <w:p>
-      <w:pPr>
-        <w:pStyle w:val="Heading2"/>
-        <w:spacing w:lineRule="auto"/>
-      </w:pPr>
-      <w:r>
-        <w:rPr/>
-        <w:t xml:space="preserve">6. Établissements (administrateur / gestionnaire / caissier)</w:t>
-      </w:r>
-    </w:p>
-    <w:p>
-      <w:pPr>
-        <w:spacing w:lineRule="auto"/>
-      </w:pPr>
-      <w:r>
-        <w:rPr/>
-        <w:drawing>
-          <wp:inline distB="0" distL="0" distR="0" distT="0">
-            <wp:extent cx="5715000" cy="3571875"/>
-            <wp:effectExtent b="0" l="0" r="0" t="0"/>
-            <wp:docPr id="10" name="image-4IY5jaAJ8Vo79jRFOKa_c.png"/>
-            <a:graphic>
-              <a:graphicData uri="http://schemas.openxmlformats.org/drawingml/2006/picture">
-                <pic:pic>
-                  <pic:nvPicPr>
-                    <pic:cNvPr id="10" name="image-4IY5jaAJ8Vo79jRFOKa_c.png" descr="Liste des établissements"/>
+                    <pic:cNvPr id="10" name="image-W-N9ROW2_ixxBNcINizn1.png" descr="Tableau de bord"/>
                     <pic:cNvPicPr/>
                   </pic:nvPicPr>
                   <pic:blipFill>
@@ -2993,43 +3087,18 @@
     </w:p>
     <w:p>
       <w:pPr>
-        <w:numPr>
-          <w:ilvl w:val="0"/>
-          <w:numId w:val="8"/>
-        </w:numPr>
-        <w:spacing w:lineRule="auto"/>
-      </w:pPr>
-      <w:r>
-        <w:rPr/>
-        <w:t xml:space="preserve">Liste des établissements actifs. La création d'un nouvel établissement est réservée à l'administrateur ; la modification et la suppression (logique, sans perte de données) sont possibles pour le personnel autorisé.</w:t>
-      </w:r>
-    </w:p>
-    <w:p>
-      <w:pPr>
-        <w:numPr>
-          <w:ilvl w:val="0"/>
-          <w:numId w:val="8"/>
-        </w:numPr>
-        <w:spacing w:lineRule="auto"/>
-      </w:pPr>
-      <w:r>
-        <w:rPr/>
-        <w:t xml:space="preserve">Un outil « Gérer la structure » permet de créer plusieurs niveaux et classes d'un coup (par exemple taper </w:t>
-      </w:r>
-      <w:r>
-        <w:rPr/>
-        <w:t xml:space="preserve">CP, CE1, CM1</w:t>
-      </w:r>
-      <w:r>
-        <w:rPr/>
-        <w:t xml:space="preserve"> crée les trois niveaux en une seule fois), et de les modifier directement dans le tableau.</w:t>
-      </w:r>
-    </w:p>
-    <w:p>
-      <w:pPr>
-        <w:numPr>
-          <w:ilvl w:val="0"/>
-          <w:numId w:val="8"/>
+        <w:spacing w:lineRule="auto"/>
+      </w:pPr>
+      <w:r>
+        <w:rPr/>
+        <w:t xml:space="preserve">Vue d'ensemble à l'ouverture de l'application : nombre d'élèves, répartition par statut d'accès, paiements récents, résumé des passages du jour.</w:t>
+      </w:r>
+    </w:p>
+    <w:p>
+      <w:pPr>
+        <w:numPr>
+          <w:ilvl w:val="0"/>
+          <w:numId w:val="6"/>
         </w:numPr>
         <w:spacing w:lineRule="auto"/>
       </w:pPr>
@@ -3037,24 +3106,40 @@
         <w:rPr>
           <w:b/>
         </w:rPr>
-        <w:t xml:space="preserve">Délai de grâce</w:t>
-      </w:r>
-      <w:r>
-        <w:rPr/>
-        <w:t xml:space="preserve"> : un champ optionnel permet de définir, pour cet établissement uniquement, un délai différent du délai par défaut (7 jours, réglable dans les Paramètres, §15). Laisser le champ vide pour garder le délai par défaut.</w:t>
-      </w:r>
-    </w:p>
-    <w:p>
-      <w:pPr>
-        <w:numPr>
-          <w:ilvl w:val="0"/>
-          <w:numId w:val="8"/>
-        </w:numPr>
-        <w:spacing w:lineRule="auto"/>
-      </w:pPr>
-      <w:r>
-        <w:rPr/>
-        <w:t xml:space="preserve">Ce menu n'est pas accessible directement à un parent, mais la liste des établissements et des classes lui reste visible pour pouvoir choisir la bonne classe quand il ajoute un enfant (§8) — la création ou la modification restent réservées au personnel.</w:t>
+        <w:t xml:space="preserve">Administrateur / gestionnaire / caissier</w:t>
+      </w:r>
+      <w:r>
+        <w:rPr/>
+        <w:t xml:space="preserve"> : les chiffres portent sur l'ensemble des élèves.</w:t>
+      </w:r>
+    </w:p>
+    <w:p>
+      <w:pPr>
+        <w:numPr>
+          <w:ilvl w:val="0"/>
+          <w:numId w:val="6"/>
+        </w:numPr>
+        <w:spacing w:lineRule="auto"/>
+      </w:pPr>
+      <w:r>
+        <w:rPr>
+          <w:b/>
+        </w:rPr>
+        <w:t xml:space="preserve">Parent</w:t>
+      </w:r>
+      <w:r>
+        <w:rPr/>
+        <w:t xml:space="preserve"> : les mêmes indicateurs (établissements, élèves, statuts, passages, paiements) portent uniquement sur </w:t>
+      </w:r>
+      <w:r>
+        <w:rPr>
+          <w:b/>
+        </w:rPr>
+        <w:t xml:space="preserve">ses propres enfants</w:t>
+      </w:r>
+      <w:r>
+        <w:rPr/>
+        <w:t xml:space="preserve"> — un parent d'un seul enfant verra par exemple « 1 élève », pas le total de l'établissement. Un parent qui n'a encore aucun enfant rattaché voit des indicateurs à zéro.</w:t>
       </w:r>
     </w:p>
     <w:p>
@@ -3064,7 +3149,7 @@
       </w:pPr>
       <w:r>
         <w:rPr/>
-        <w:t xml:space="preserve">7. Élèves (administrateur / gestionnaire / caissier)</w:t>
+        <w:t xml:space="preserve">6. Établissements (administrateur / gestionnaire / caissier)</w:t>
       </w:r>
     </w:p>
     <w:p>
@@ -3077,12 +3162,12 @@
           <wp:inline distB="0" distL="0" distR="0" distT="0">
             <wp:extent cx="5715000" cy="3571875"/>
             <wp:effectExtent b="0" l="0" r="0" t="0"/>
-            <wp:docPr id="11" name="image-3WV04nteg5GgT5fJAvMD9.png"/>
+            <wp:docPr id="11" name="image-VmWQ2GHCncWpxVLIzVO3q.png"/>
             <a:graphic>
               <a:graphicData uri="http://schemas.openxmlformats.org/drawingml/2006/picture">
                 <pic:pic>
                   <pic:nvPicPr>
-                    <pic:cNvPr id="11" name="image-3WV04nteg5GgT5fJAvMD9.png" descr="Liste des élèves"/>
+                    <pic:cNvPr id="11" name="image-VmWQ2GHCncWpxVLIzVO3q.png" descr="Liste des établissements"/>
                     <pic:cNvPicPr/>
                   </pic:nvPicPr>
                   <pic:blipFill>
@@ -3110,20 +3195,41 @@
       <w:pPr>
         <w:numPr>
           <w:ilvl w:val="0"/>
-          <w:numId w:val="9"/>
-        </w:numPr>
-        <w:spacing w:lineRule="auto"/>
-      </w:pPr>
-      <w:r>
-        <w:rPr/>
-        <w:t xml:space="preserve">Liste des élèves avec pagination (reste rapide même avec un grand nombre d'élèves).</w:t>
-      </w:r>
-    </w:p>
-    <w:p>
-      <w:pPr>
-        <w:numPr>
-          <w:ilvl w:val="0"/>
-          <w:numId w:val="9"/>
+          <w:numId w:val="7"/>
+        </w:numPr>
+        <w:spacing w:lineRule="auto"/>
+      </w:pPr>
+      <w:r>
+        <w:rPr/>
+        <w:t xml:space="preserve">Liste des établissements actifs. La création d'un nouvel établissement est réservée à l'administrateur ; la modification et la suppression (logique, sans perte de données) sont possibles pour le personnel autorisé.</w:t>
+      </w:r>
+    </w:p>
+    <w:p>
+      <w:pPr>
+        <w:numPr>
+          <w:ilvl w:val="0"/>
+          <w:numId w:val="7"/>
+        </w:numPr>
+        <w:spacing w:lineRule="auto"/>
+      </w:pPr>
+      <w:r>
+        <w:rPr/>
+        <w:t xml:space="preserve">Un outil « Gérer la structure » permet de créer plusieurs niveaux et classes d'un coup (par exemple taper </w:t>
+      </w:r>
+      <w:r>
+        <w:rPr/>
+        <w:t xml:space="preserve">CP, CE1, CM1</w:t>
+      </w:r>
+      <w:r>
+        <w:rPr/>
+        <w:t xml:space="preserve"> crée les trois niveaux en une seule fois), et de les modifier directement dans le tableau.</w:t>
+      </w:r>
+    </w:p>
+    <w:p>
+      <w:pPr>
+        <w:numPr>
+          <w:ilvl w:val="0"/>
+          <w:numId w:val="7"/>
         </w:numPr>
         <w:spacing w:lineRule="auto"/>
       </w:pPr>
@@ -3131,43 +3237,34 @@
         <w:rPr>
           <w:b/>
         </w:rPr>
-        <w:t xml:space="preserve">Recherche</w:t>
-      </w:r>
-      <w:r>
-        <w:rPr/>
-        <w:t xml:space="preserve"> par nom, prénom ou matricule ; filtres par établissement et par statut d'accès.</w:t>
-      </w:r>
-    </w:p>
-    <w:p>
-      <w:pPr>
-        <w:numPr>
-          <w:ilvl w:val="0"/>
-          <w:numId w:val="9"/>
-        </w:numPr>
-        <w:spacing w:lineRule="auto"/>
-      </w:pPr>
-      <w:r>
-        <w:rPr>
-          <w:b/>
-        </w:rPr>
-        <w:t xml:space="preserve">Export</w:t>
-      </w:r>
-      <w:r>
-        <w:rPr/>
-        <w:t xml:space="preserve"> de la liste affichée au format tableau (CSV), via le bouton dédié.</w:t>
-      </w:r>
-    </w:p>
-    <w:p>
-      <w:pPr>
-        <w:numPr>
-          <w:ilvl w:val="0"/>
-          <w:numId w:val="9"/>
-        </w:numPr>
-        <w:spacing w:lineRule="auto"/>
-      </w:pPr>
-      <w:r>
-        <w:rPr/>
-        <w:t xml:space="preserve">La création ou la modification d'un élève se fait dans un formulaire en 3 étapes, pour rester clair et tenir sur un seul écran :</w:t>
+        <w:t xml:space="preserve">Délai de grâce</w:t>
+      </w:r>
+      <w:r>
+        <w:rPr/>
+        <w:t xml:space="preserve"> : un champ optionnel permet de définir, pour cet établissement uniquement, un délai différent du délai par défaut (7 jours, réglable dans les Paramètres, §16). Laisser le champ vide pour garder le délai par défaut.</w:t>
+      </w:r>
+    </w:p>
+    <w:p>
+      <w:pPr>
+        <w:numPr>
+          <w:ilvl w:val="0"/>
+          <w:numId w:val="7"/>
+        </w:numPr>
+        <w:spacing w:lineRule="auto"/>
+      </w:pPr>
+      <w:r>
+        <w:rPr/>
+        <w:t xml:space="preserve">Ce menu n'est pas accessible directement à un parent, mais la liste des établissements et des classes lui reste visible pour pouvoir choisir la bonne classe quand il ajoute un enfant (§8) — la création ou la modification restent réservées au personnel.</w:t>
+      </w:r>
+    </w:p>
+    <w:p>
+      <w:pPr>
+        <w:pStyle w:val="Heading2"/>
+        <w:spacing w:lineRule="auto"/>
+      </w:pPr>
+      <w:r>
+        <w:rPr/>
+        <w:t xml:space="preserve">7. Élèves (administrateur / gestionnaire / caissier)</w:t>
       </w:r>
     </w:p>
     <w:p>
@@ -3180,12 +3277,12 @@
           <wp:inline distB="0" distL="0" distR="0" distT="0">
             <wp:extent cx="5715000" cy="3571875"/>
             <wp:effectExtent b="0" l="0" r="0" t="0"/>
-            <wp:docPr id="12" name="image-anlauxlbu2o4SRnF6AIEI.png"/>
+            <wp:docPr id="12" name="image-4uwomeo85zPK7zb5vE4Wu.png"/>
             <a:graphic>
               <a:graphicData uri="http://schemas.openxmlformats.org/drawingml/2006/picture">
                 <pic:pic>
                   <pic:nvPicPr>
-                    <pic:cNvPr id="12" name="image-anlauxlbu2o4SRnF6AIEI.png" descr="Fiche élève — Informations générales"/>
+                    <pic:cNvPr id="12" name="image-4uwomeo85zPK7zb5vE4Wu.png" descr="Liste des élèves"/>
                     <pic:cNvPicPr/>
                   </pic:nvPicPr>
                   <pic:blipFill>
@@ -3208,18 +3305,87 @@
           </wp:inline>
         </w:drawing>
       </w:r>
+    </w:p>
+    <w:p>
+      <w:pPr>
+        <w:numPr>
+          <w:ilvl w:val="0"/>
+          <w:numId w:val="8"/>
+        </w:numPr>
+        <w:spacing w:lineRule="auto"/>
+      </w:pPr>
+      <w:r>
+        <w:rPr/>
+        <w:t xml:space="preserve">Liste des élèves avec pagination (reste rapide même avec un grand nombre d'élèves).</w:t>
+      </w:r>
+    </w:p>
+    <w:p>
+      <w:pPr>
+        <w:numPr>
+          <w:ilvl w:val="0"/>
+          <w:numId w:val="8"/>
+        </w:numPr>
+        <w:spacing w:lineRule="auto"/>
+      </w:pPr>
+      <w:r>
+        <w:rPr>
+          <w:b/>
+        </w:rPr>
+        <w:t xml:space="preserve">Recherche</w:t>
+      </w:r>
+      <w:r>
+        <w:rPr/>
+        <w:t xml:space="preserve"> par nom, prénom ou matricule ; filtres par établissement et par statut d'accès.</w:t>
+      </w:r>
+    </w:p>
+    <w:p>
+      <w:pPr>
+        <w:numPr>
+          <w:ilvl w:val="0"/>
+          <w:numId w:val="8"/>
+        </w:numPr>
+        <w:spacing w:lineRule="auto"/>
+      </w:pPr>
+      <w:r>
+        <w:rPr>
+          <w:b/>
+        </w:rPr>
+        <w:t xml:space="preserve">Export</w:t>
+      </w:r>
+      <w:r>
+        <w:rPr/>
+        <w:t xml:space="preserve"> de la liste affichée au format tableau (CSV), via le bouton dédié.</w:t>
+      </w:r>
+    </w:p>
+    <w:p>
+      <w:pPr>
+        <w:numPr>
+          <w:ilvl w:val="0"/>
+          <w:numId w:val="8"/>
+        </w:numPr>
+        <w:spacing w:lineRule="auto"/>
+      </w:pPr>
+      <w:r>
+        <w:rPr/>
+        <w:t xml:space="preserve">La création ou la modification d'un élève se fait dans un formulaire en 3 étapes, pour rester clair et tenir sur un seul écran :</w:t>
+      </w:r>
+    </w:p>
+    <w:p>
+      <w:pPr>
+        <w:spacing w:lineRule="auto"/>
+      </w:pPr>
       <w:r>
         <w:rPr/>
         <w:drawing>
           <wp:inline distB="0" distL="0" distR="0" distT="0">
             <wp:extent cx="5715000" cy="3571875"/>
             <wp:effectExtent b="0" l="0" r="0" t="0"/>
-            <wp:docPr id="13" name="image-oyJyfuHmaO5_tA0ZYekxY.png"/>
+            <wp:docPr id="13" name="image-Wp96GOV_CGuqPJDOxaBzK.png"/>
             <a:graphic>
               <a:graphicData uri="http://schemas.openxmlformats.org/drawingml/2006/picture">
                 <pic:pic>
                   <pic:nvPicPr>
-                    <pic:cNvPr id="13" name="image-oyJyfuHmaO5_tA0ZYekxY.png" descr="Fiche élève — Cantine et affectation"/>
+                    <pic:cNvPr id="13" name="image-Wp96GOV_CGuqPJDOxaBzK.png" descr="Fiche élève — Informations générales"/>
                     <pic:cNvPicPr/>
                   </pic:nvPicPr>
                   <pic:blipFill>
@@ -3248,12 +3414,12 @@
           <wp:inline distB="0" distL="0" distR="0" distT="0">
             <wp:extent cx="5715000" cy="3571875"/>
             <wp:effectExtent b="0" l="0" r="0" t="0"/>
-            <wp:docPr id="14" name="image-Mq7HcpEX7XTY2EH5GPdhC.png"/>
+            <wp:docPr id="14" name="image-1rxQGLwof5_IyL10zb9rb.png"/>
             <a:graphic>
               <a:graphicData uri="http://schemas.openxmlformats.org/drawingml/2006/picture">
                 <pic:pic>
                   <pic:nvPicPr>
-                    <pic:cNvPr id="14" name="image-Mq7HcpEX7XTY2EH5GPdhC.png" descr="Fiche élève — Contacts et allergies"/>
+                    <pic:cNvPr id="14" name="image-1rxQGLwof5_IyL10zb9rb.png" descr="Fiche élève — Cantine et affectation"/>
                     <pic:cNvPicPr/>
                   </pic:nvPicPr>
                   <pic:blipFill>
@@ -3276,230 +3442,18 @@
           </wp:inline>
         </w:drawing>
       </w:r>
-    </w:p>
-    <w:p>
-      <w:pPr>
-        <w:numPr>
-          <w:ilvl w:val="0"/>
-          <w:numId w:val="10"/>
-        </w:numPr>
-        <w:spacing w:lineRule="auto"/>
-      </w:pPr>
-      <w:r>
-        <w:rPr/>
-        <w:t xml:space="preserve">Chaque élève dispose d'un QR Code personnel : consultable, copiable, imprimable — c'est ce même QR Code qui est destiné à être imprimé sur un badge plastifié remis à l'élève (voir l'offre commerciale pour la fabrication des badges).</w:t>
-      </w:r>
-    </w:p>
-    <w:p>
-      <w:pPr>
-        <w:numPr>
-          <w:ilvl w:val="0"/>
-          <w:numId w:val="10"/>
-        </w:numPr>
-        <w:spacing w:lineRule="auto"/>
-      </w:pPr>
-      <w:r>
-        <w:rPr/>
-        <w:t xml:space="preserve">La suppression d'un élève est réservée à l'administrateur.</w:t>
-      </w:r>
-    </w:p>
-    <w:p>
-      <w:pPr>
-        <w:numPr>
-          <w:ilvl w:val="0"/>
-          <w:numId w:val="10"/>
-        </w:numPr>
-        <w:spacing w:lineRule="auto"/>
-      </w:pPr>
-      <w:r>
-        <w:rPr/>
-        <w:t xml:space="preserve">Ce menu n'est pas accessible à un parent (le parent ajoute ses propres enfants depuis « Mes enfants », §8).</w:t>
-      </w:r>
-    </w:p>
-    <w:p>
-      <w:pPr>
-        <w:pStyle w:val="Heading3"/>
-        <w:spacing w:lineRule="auto"/>
-      </w:pPr>
-      <w:r>
-        <w:rPr/>
-        <w:t xml:space="preserve">Allergies et certificat médical</w:t>
-      </w:r>
-    </w:p>
-    <w:p>
-      <w:pPr>
-        <w:numPr>
-          <w:ilvl w:val="0"/>
-          <w:numId w:val="11"/>
-        </w:numPr>
-        <w:spacing w:lineRule="auto"/>
-      </w:pPr>
-      <w:r>
-        <w:rPr/>
-        <w:t xml:space="preserve">Le champ </w:t>
-      </w:r>
-      <w:r>
-        <w:rPr>
-          <w:b/>
-        </w:rPr>
-        <w:t xml:space="preserve">Allergies</w:t>
-      </w:r>
-      <w:r>
-        <w:rPr/>
-        <w:t xml:space="preserve"> ne peut être renseigné </w:t>
-      </w:r>
-      <w:r>
-        <w:rPr>
-          <w:b/>
-        </w:rPr>
-        <w:t xml:space="preserve">qu'après la création</w:t>
-      </w:r>
-      <w:r>
-        <w:rPr/>
-        <w:t xml:space="preserve"> de la fiche de l'élève, pas au moment de la création : le certificat médical qui l'accompagne ne peut être ajouté qu'une fois la fiche déjà enregistrée. Il faut donc d'abord créer l'élève sans allergie, puis ouvrir « Modifier » pour la déclarer.</w:t>
-      </w:r>
-    </w:p>
-    <w:p>
-      <w:pPr>
-        <w:numPr>
-          <w:ilvl w:val="0"/>
-          <w:numId w:val="11"/>
-        </w:numPr>
-        <w:spacing w:lineRule="auto"/>
-      </w:pPr>
-      <w:r>
-        <w:rPr/>
-        <w:t xml:space="preserve">Une fois en modification, un bloc </w:t>
-      </w:r>
-      <w:r>
-        <w:rPr>
-          <w:b/>
-        </w:rPr>
-        <w:t xml:space="preserve">Certificat médical</w:t>
-      </w:r>
-      <w:r>
-        <w:rPr/>
-        <w:t xml:space="preserve"> permet d'</w:t>
-      </w:r>
-      <w:r>
-        <w:rPr>
-          <w:b/>
-        </w:rPr>
-        <w:t xml:space="preserve">ajouter un fichier</w:t>
-      </w:r>
-      <w:r>
-        <w:rPr/>
-        <w:t xml:space="preserve"> (PDF, JPG ou PNG). Une fois le fichier envoyé, un repère « Certificat fourni » apparaît avec un lien pour le consulter et un bouton pour le remplacer si besoin.</w:t>
-      </w:r>
-    </w:p>
-    <w:p>
-      <w:pPr>
-        <w:numPr>
-          <w:ilvl w:val="0"/>
-          <w:numId w:val="11"/>
-        </w:numPr>
-        <w:spacing w:lineRule="auto"/>
-      </w:pPr>
-      <w:r>
-        <w:rPr/>
-        <w:t xml:space="preserve">L'enregistrement de la fiche est bloqué, avec un message clair, si le champ Allergies contient du texte mais qu'aucun certificat n'a été ajouté.</w:t>
-      </w:r>
-    </w:p>
-    <w:p>
-      <w:pPr>
-        <w:pStyle w:val="Heading2"/>
-        <w:spacing w:lineRule="auto"/>
-      </w:pPr>
-      <w:r>
-        <w:rPr/>
-        <w:t xml:space="preserve">8. Mes enfants (espace parent — en libre-service)</w:t>
-      </w:r>
-    </w:p>
-    <w:p>
-      <w:pPr>
-        <w:pStyle w:val="Heading3"/>
-        <w:spacing w:lineRule="auto"/>
-      </w:pPr>
-      <w:r>
-        <w:rPr/>
-        <w:t xml:space="preserve">Ce qui se passe quand un parent se connecte</w:t>
-      </w:r>
-    </w:p>
-    <w:p>
-      <w:pPr>
-        <w:spacing w:lineRule="auto"/>
-      </w:pPr>
-      <w:r>
-        <w:rPr/>
-        <w:t xml:space="preserve">Une fois connecté avec son email (ou son identifiant) et son mot de passe, un parent arrive d'abord sur le </w:t>
-      </w:r>
-      <w:r>
-        <w:rPr>
-          <w:b/>
-        </w:rPr>
-        <w:t xml:space="preserve">Tableau de bord</w:t>
-      </w:r>
-      <w:r>
-        <w:rPr/>
-        <w:t xml:space="preserve"> (§5), avec ses propres statistiques (nombre d'enfants, statut d'accès, passages récents). Le menu de gauche, spécifique au rôle Parent, ne propose que quatre écrans : </w:t>
-      </w:r>
-      <w:r>
-        <w:rPr>
-          <w:b/>
-        </w:rPr>
-        <w:t xml:space="preserve">Tableau de bord</w:t>
-      </w:r>
-      <w:r>
-        <w:rPr/>
-        <w:t xml:space="preserve">, </w:t>
-      </w:r>
-      <w:r>
-        <w:rPr>
-          <w:b/>
-        </w:rPr>
-        <w:t xml:space="preserve">Mes enfants</w:t>
-      </w:r>
-      <w:r>
-        <w:rPr/>
-        <w:t xml:space="preserve">, </w:t>
-      </w:r>
-      <w:r>
-        <w:rPr>
-          <w:b/>
-        </w:rPr>
-        <w:t xml:space="preserve">Paiements</w:t>
-      </w:r>
-      <w:r>
-        <w:rPr/>
-        <w:t xml:space="preserve"> et </w:t>
-      </w:r>
-      <w:r>
-        <w:rPr>
-          <w:b/>
-        </w:rPr>
-        <w:t xml:space="preserve">Historique</w:t>
-      </w:r>
-      <w:r>
-        <w:rPr/>
-        <w:t xml:space="preserve"> — tous les menus réservés au personnel (Établissements, Élèves, Scan Réfectoire, Utilisateurs, etc.) sont absents. En cliquant sur « Mes enfants » dans ce menu, le parent arrive sur l'écran suivant :</w:t>
-      </w:r>
-    </w:p>
-    <w:p>
-      <w:pPr>
-        <w:spacing w:lineRule="auto"/>
-      </w:pPr>
       <w:r>
         <w:rPr/>
         <w:drawing>
           <wp:inline distB="0" distL="0" distR="0" distT="0">
             <wp:extent cx="5715000" cy="3571875"/>
             <wp:effectExtent b="0" l="0" r="0" t="0"/>
-            <wp:docPr id="15" name="image-IRW-gkoITnvNowNFzuDtL.png"/>
+            <wp:docPr id="15" name="image-nln-S--wg6zc8uBEB2GzR.png"/>
             <a:graphic>
               <a:graphicData uri="http://schemas.openxmlformats.org/drawingml/2006/picture">
                 <pic:pic>
                   <pic:nvPicPr>
-                    <pic:cNvPr id="15" name="image-IRW-gkoITnvNowNFzuDtL.png" descr="Mes enfants — liste des enfants rattachés"/>
+                    <pic:cNvPr id="15" name="image-nln-S--wg6zc8uBEB2GzR.png" descr="Fiche élève — Contacts et allergies"/>
                     <pic:cNvPicPr/>
                   </pic:nvPicPr>
                   <pic:blipFill>
@@ -3527,38 +3481,207 @@
       <w:pPr>
         <w:numPr>
           <w:ilvl w:val="0"/>
-          <w:numId w:val="12"/>
-        </w:numPr>
-        <w:spacing w:lineRule="auto"/>
-      </w:pPr>
+          <w:numId w:val="9"/>
+        </w:numPr>
+        <w:spacing w:lineRule="auto"/>
+      </w:pPr>
+      <w:r>
+        <w:rPr/>
+        <w:t xml:space="preserve">Chaque élève dispose d'un QR Code personnel : consultable, copiable, imprimable — c'est ce même QR Code qui est destiné à être imprimé sur un badge plastifié remis à l'élève (voir l'offre commerciale pour la fabrication des badges).</w:t>
+      </w:r>
+    </w:p>
+    <w:p>
+      <w:pPr>
+        <w:numPr>
+          <w:ilvl w:val="0"/>
+          <w:numId w:val="9"/>
+        </w:numPr>
+        <w:spacing w:lineRule="auto"/>
+      </w:pPr>
+      <w:r>
+        <w:rPr/>
+        <w:t xml:space="preserve">La suppression d'un élève est réservée à l'administrateur.</w:t>
+      </w:r>
+    </w:p>
+    <w:p>
+      <w:pPr>
+        <w:numPr>
+          <w:ilvl w:val="0"/>
+          <w:numId w:val="9"/>
+        </w:numPr>
+        <w:spacing w:lineRule="auto"/>
+      </w:pPr>
+      <w:r>
+        <w:rPr/>
+        <w:t xml:space="preserve">Ce menu n'est pas accessible à un parent (le parent ajoute ses propres enfants depuis « Mes enfants », §8).</w:t>
+      </w:r>
+    </w:p>
+    <w:p>
+      <w:pPr>
+        <w:pStyle w:val="Heading3"/>
+        <w:spacing w:lineRule="auto"/>
+      </w:pPr>
+      <w:r>
+        <w:rPr/>
+        <w:t xml:space="preserve">Allergies et certificat médical</w:t>
+      </w:r>
+    </w:p>
+    <w:p>
+      <w:pPr>
+        <w:numPr>
+          <w:ilvl w:val="0"/>
+          <w:numId w:val="10"/>
+        </w:numPr>
+        <w:spacing w:lineRule="auto"/>
+      </w:pPr>
+      <w:r>
+        <w:rPr/>
+        <w:t xml:space="preserve">Le champ </w:t>
+      </w:r>
       <w:r>
         <w:rPr>
           <w:b/>
         </w:rPr>
-        <w:t xml:space="preserve">Consulter</w:t>
-      </w:r>
-      <w:r>
-        <w:rPr/>
-        <w:t xml:space="preserve"> la liste de ses enfants déjà rattachés : nom, matricule, statut d'accès (Autorisé, En attente de paiement, Période de grâce, Suspendu).</w:t>
-      </w:r>
-    </w:p>
-    <w:p>
-      <w:pPr>
-        <w:numPr>
-          <w:ilvl w:val="0"/>
-          <w:numId w:val="12"/>
-        </w:numPr>
-        <w:spacing w:lineRule="auto"/>
-      </w:pPr>
+        <w:t xml:space="preserve">Allergies</w:t>
+      </w:r>
+      <w:r>
+        <w:rPr/>
+        <w:t xml:space="preserve"> ne peut être renseigné </w:t>
+      </w:r>
       <w:r>
         <w:rPr>
           <w:b/>
         </w:rPr>
-        <w:t xml:space="preserve">Ajouter un enfant</w:t>
-      </w:r>
-      <w:r>
-        <w:rPr/>
-        <w:t xml:space="preserve"> lui-même, via le bouton « Ajouter un enfant » qui ouvre un petit formulaire :</w:t>
+        <w:t xml:space="preserve">qu'après la création</w:t>
+      </w:r>
+      <w:r>
+        <w:rPr/>
+        <w:t xml:space="preserve"> de la fiche de l'élève, pas au moment de la création : le certificat médical qui l'accompagne ne peut être ajouté qu'une fois la fiche déjà enregistrée. Il faut donc d'abord créer l'élève sans allergie, puis ouvrir « Modifier » pour la déclarer.</w:t>
+      </w:r>
+    </w:p>
+    <w:p>
+      <w:pPr>
+        <w:numPr>
+          <w:ilvl w:val="0"/>
+          <w:numId w:val="10"/>
+        </w:numPr>
+        <w:spacing w:lineRule="auto"/>
+      </w:pPr>
+      <w:r>
+        <w:rPr/>
+        <w:t xml:space="preserve">Une fois en modification, un bloc </w:t>
+      </w:r>
+      <w:r>
+        <w:rPr>
+          <w:b/>
+        </w:rPr>
+        <w:t xml:space="preserve">Certificat médical</w:t>
+      </w:r>
+      <w:r>
+        <w:rPr/>
+        <w:t xml:space="preserve"> permet d'</w:t>
+      </w:r>
+      <w:r>
+        <w:rPr>
+          <w:b/>
+        </w:rPr>
+        <w:t xml:space="preserve">ajouter un fichier</w:t>
+      </w:r>
+      <w:r>
+        <w:rPr/>
+        <w:t xml:space="preserve"> (PDF, JPG ou PNG). Une fois le fichier envoyé, un repère « Certificat fourni » apparaît avec un lien pour le consulter et un bouton pour le remplacer si besoin.</w:t>
+      </w:r>
+    </w:p>
+    <w:p>
+      <w:pPr>
+        <w:numPr>
+          <w:ilvl w:val="0"/>
+          <w:numId w:val="10"/>
+        </w:numPr>
+        <w:spacing w:lineRule="auto"/>
+      </w:pPr>
+      <w:r>
+        <w:rPr/>
+        <w:t xml:space="preserve">L'enregistrement de la fiche est bloqué, avec un message clair, si le champ Allergies contient du texte mais qu'aucun certificat n'a été ajouté.</w:t>
+      </w:r>
+    </w:p>
+    <w:p>
+      <w:pPr>
+        <w:pStyle w:val="Heading2"/>
+        <w:spacing w:lineRule="auto"/>
+      </w:pPr>
+      <w:r>
+        <w:rPr/>
+        <w:t xml:space="preserve">8. Mes enfants (espace parent — en libre-service)</w:t>
+      </w:r>
+    </w:p>
+    <w:p>
+      <w:pPr>
+        <w:pStyle w:val="Heading3"/>
+        <w:spacing w:lineRule="auto"/>
+      </w:pPr>
+      <w:r>
+        <w:rPr/>
+        <w:t xml:space="preserve">Ce qui se passe quand un parent se connecte</w:t>
+      </w:r>
+    </w:p>
+    <w:p>
+      <w:pPr>
+        <w:spacing w:lineRule="auto"/>
+      </w:pPr>
+      <w:r>
+        <w:rPr/>
+        <w:t xml:space="preserve">Une fois connecté avec son email (ou son identifiant) et son mot de passe, un parent arrive d'abord sur le </w:t>
+      </w:r>
+      <w:r>
+        <w:rPr>
+          <w:b/>
+        </w:rPr>
+        <w:t xml:space="preserve">Tableau de bord</w:t>
+      </w:r>
+      <w:r>
+        <w:rPr/>
+        <w:t xml:space="preserve"> (§5), avec ses propres statistiques (nombre d'enfants, statut d'accès, passages récents). Le menu de gauche, spécifique au rôle Parent, ne propose que quatre écrans : </w:t>
+      </w:r>
+      <w:r>
+        <w:rPr>
+          <w:b/>
+        </w:rPr>
+        <w:t xml:space="preserve">Tableau de bord</w:t>
+      </w:r>
+      <w:r>
+        <w:rPr/>
+        <w:t xml:space="preserve">, </w:t>
+      </w:r>
+      <w:r>
+        <w:rPr>
+          <w:b/>
+        </w:rPr>
+        <w:t xml:space="preserve">Mes enfants</w:t>
+      </w:r>
+      <w:r>
+        <w:rPr/>
+        <w:t xml:space="preserve">, </w:t>
+      </w:r>
+      <w:r>
+        <w:rPr>
+          <w:b/>
+        </w:rPr>
+        <w:t xml:space="preserve">Paiements</w:t>
+      </w:r>
+      <w:r>
+        <w:rPr/>
+        <w:t xml:space="preserve"> et </w:t>
+      </w:r>
+      <w:r>
+        <w:rPr>
+          <w:b/>
+        </w:rPr>
+        <w:t xml:space="preserve">Historique</w:t>
+      </w:r>
+      <w:r>
+        <w:rPr/>
+        <w:t xml:space="preserve"> — tous les menus réservés au personnel (Établissements, Élèves, Scan Réfectoire, Utilisateurs, etc.) sont absents. En cliquant sur « Mes enfants » dans ce menu, le parent arrive sur l'écran suivant :</w:t>
       </w:r>
     </w:p>
     <w:p>
@@ -3571,12 +3694,12 @@
           <wp:inline distB="0" distL="0" distR="0" distT="0">
             <wp:extent cx="5715000" cy="3571875"/>
             <wp:effectExtent b="0" l="0" r="0" t="0"/>
-            <wp:docPr id="16" name="image-9QGWewLEExj2dJEqwCY_2.png"/>
+            <wp:docPr id="16" name="image-PL2-js-6AhREhDAO8IWdP.png"/>
             <a:graphic>
               <a:graphicData uri="http://schemas.openxmlformats.org/drawingml/2006/picture">
                 <pic:pic>
                   <pic:nvPicPr>
-                    <pic:cNvPr id="16" name="image-9QGWewLEExj2dJEqwCY_2.png" descr="Mes enfants — formulaire d'ajout"/>
+                    <pic:cNvPr id="16" name="image-PL2-js-6AhREhDAO8IWdP.png" descr="Mes enfants — liste des enfants rattachés"/>
                     <pic:cNvPicPr/>
                   </pic:nvPicPr>
                   <pic:blipFill>
@@ -3602,67 +3725,40 @@
     </w:p>
     <w:p>
       <w:pPr>
-        <w:spacing w:lineRule="auto"/>
-      </w:pPr>
-      <w:r>
-        <w:rPr/>
-        <w:t xml:space="preserve">  Le parent choisit l'établissement dans une liste déroulante, puis la classe correspondante   s'affiche automatiquement une fois l'établissement choisi (les choix proposés dépendent de ce   que l'administrateur a déjà configuré pour cet établissement), et renseigne le matricule   (communiqué par l'établissement à l'inscription), le nom, le prénom, le sexe (facultatif), la   date de naissance (facultative), la ville et la commune (obligatoires), le quartier (facultatif).</w:t>
-      </w:r>
-    </w:p>
-    <w:p>
-      <w:pPr>
-        <w:numPr>
-          <w:ilvl w:val="0"/>
-          <w:numId w:val="13"/>
-        </w:numPr>
-        <w:spacing w:lineRule="auto"/>
-      </w:pPr>
-      <w:r>
-        <w:rPr/>
-        <w:t xml:space="preserve">Les coordonnées du parent (nom, téléphone, email) affichées côté établissement pour cet enfant sont </w:t>
-      </w:r>
+        <w:numPr>
+          <w:ilvl w:val="0"/>
+          <w:numId w:val="11"/>
+        </w:numPr>
+        <w:spacing w:lineRule="auto"/>
+      </w:pPr>
       <w:r>
         <w:rPr>
           <w:b/>
         </w:rPr>
-        <w:t xml:space="preserve">reprises automatiquement du compte connecté</w:t>
-      </w:r>
-      <w:r>
-        <w:rPr/>
-        <w:t xml:space="preserve"> — le parent n'a rien à ressaisir.</w:t>
-      </w:r>
-    </w:p>
-    <w:p>
-      <w:pPr>
-        <w:numPr>
-          <w:ilvl w:val="0"/>
-          <w:numId w:val="13"/>
-        </w:numPr>
-        <w:spacing w:lineRule="auto"/>
-      </w:pPr>
-      <w:r>
-        <w:rPr/>
-        <w:t xml:space="preserve">Un enfant ajouté de cette façon démarre avec le statut </w:t>
-      </w:r>
+        <w:t xml:space="preserve">Consulter</w:t>
+      </w:r>
+      <w:r>
+        <w:rPr/>
+        <w:t xml:space="preserve"> la liste de ses enfants déjà rattachés : nom, matricule, statut d'accès (Autorisé, En attente de paiement, Période de grâce, Suspendu).</w:t>
+      </w:r>
+    </w:p>
+    <w:p>
+      <w:pPr>
+        <w:numPr>
+          <w:ilvl w:val="0"/>
+          <w:numId w:val="11"/>
+        </w:numPr>
+        <w:spacing w:lineRule="auto"/>
+      </w:pPr>
       <w:r>
         <w:rPr>
           <w:b/>
         </w:rPr>
-        <w:t xml:space="preserve">En attente de paiement</w:t>
-      </w:r>
-      <w:r>
-        <w:rPr/>
-        <w:t xml:space="preserve"> — aucun accès à la cantine tant qu'un paiement n'a pas été enregistré (voir §9 pour effectuer ce paiement).</w:t>
-      </w:r>
-    </w:p>
-    <w:p>
-      <w:pPr>
-        <w:pStyle w:val="Heading2"/>
-        <w:spacing w:lineRule="auto"/>
-      </w:pPr>
-      <w:r>
-        <w:rPr/>
-        <w:t xml:space="preserve">9. Paiements Mobile Money</w:t>
+        <w:t xml:space="preserve">Ajouter un enfant</w:t>
+      </w:r>
+      <w:r>
+        <w:rPr/>
+        <w:t xml:space="preserve"> lui-même, via le bouton « Ajouter un enfant » qui ouvre un petit formulaire :</w:t>
       </w:r>
     </w:p>
     <w:p>
@@ -3675,12 +3771,12 @@
           <wp:inline distB="0" distL="0" distR="0" distT="0">
             <wp:extent cx="5715000" cy="3571875"/>
             <wp:effectExtent b="0" l="0" r="0" t="0"/>
-            <wp:docPr id="17" name="image-mNgISKZPsEALRD1IsleRc.png"/>
+            <wp:docPr id="17" name="image-UMSbPYFpPp0RYRjv9sh7d.png"/>
             <a:graphic>
               <a:graphicData uri="http://schemas.openxmlformats.org/drawingml/2006/picture">
                 <pic:pic>
                   <pic:nvPicPr>
-                    <pic:cNvPr id="17" name="image-mNgISKZPsEALRD1IsleRc.png" descr="Écran des paiements"/>
+                    <pic:cNvPr id="17" name="image-UMSbPYFpPp0RYRjv9sh7d.png" descr="Mes enfants — formulaire d'ajout"/>
                     <pic:cNvPicPr/>
                   </pic:nvPicPr>
                   <pic:blipFill>
@@ -3706,154 +3802,57 @@
     </w:p>
     <w:p>
       <w:pPr>
-        <w:numPr>
-          <w:ilvl w:val="0"/>
-          <w:numId w:val="14"/>
-        </w:numPr>
-        <w:spacing w:lineRule="auto"/>
-      </w:pPr>
+        <w:spacing w:lineRule="auto"/>
+      </w:pPr>
+      <w:r>
+        <w:rPr/>
+        <w:t xml:space="preserve">  Le parent choisit l'établissement dans une liste déroulante, puis la classe correspondante   s'affiche automatiquement une fois l'établissement choisi (les choix proposés dépendent de ce   que l'administrateur a déjà configuré pour cet établissement), et renseigne le matricule   (communiqué par l'établissement à l'inscription), le nom, le prénom, le sexe (facultatif), la   date de naissance (facultative), la ville et la commune (obligatoires), le quartier (facultatif).</w:t>
+      </w:r>
+    </w:p>
+    <w:p>
+      <w:pPr>
+        <w:numPr>
+          <w:ilvl w:val="0"/>
+          <w:numId w:val="12"/>
+        </w:numPr>
+        <w:spacing w:lineRule="auto"/>
+      </w:pPr>
+      <w:r>
+        <w:rPr/>
+        <w:t xml:space="preserve">Les coordonnées du parent (nom, téléphone, email) affichées côté établissement pour cet enfant sont </w:t>
+      </w:r>
       <w:r>
         <w:rPr>
           <w:b/>
         </w:rPr>
-        <w:t xml:space="preserve">Administrateur / gestionnaire / caissier</w:t>
-      </w:r>
-      <w:r>
-        <w:rPr/>
-        <w:t xml:space="preserve"> : voient toutes les transactions et peuvent lancer un paiement pour n'importe quel élève (recherche par nom, prénom ou matricule). Seul l'administrateur peut modifier ou supprimer une transaction.</w:t>
-      </w:r>
-    </w:p>
-    <w:p>
-      <w:pPr>
-        <w:numPr>
-          <w:ilvl w:val="0"/>
-          <w:numId w:val="14"/>
-        </w:numPr>
-        <w:spacing w:lineRule="auto"/>
-      </w:pPr>
+        <w:t xml:space="preserve">reprises automatiquement du compte connecté</w:t>
+      </w:r>
+      <w:r>
+        <w:rPr/>
+        <w:t xml:space="preserve"> — le parent n'a rien à ressaisir.</w:t>
+      </w:r>
+    </w:p>
+    <w:p>
+      <w:pPr>
+        <w:numPr>
+          <w:ilvl w:val="0"/>
+          <w:numId w:val="12"/>
+        </w:numPr>
+        <w:spacing w:lineRule="auto"/>
+      </w:pPr>
+      <w:r>
+        <w:rPr/>
+        <w:t xml:space="preserve">Un enfant ajouté de cette façon démarre avec le statut </w:t>
+      </w:r>
       <w:r>
         <w:rPr>
           <w:b/>
         </w:rPr>
-        <w:t xml:space="preserve">Parent</w:t>
-      </w:r>
-      <w:r>
-        <w:rPr/>
-        <w:t xml:space="preserve"> : ne voit que les paiements de ses propres enfants ; en lançant un paiement, seuls ses enfants lui sont proposés (pas de recherche libre parmi tous les élèves).</w:t>
-      </w:r>
-    </w:p>
-    <w:p>
-      <w:pPr>
-        <w:numPr>
-          <w:ilvl w:val="0"/>
-          <w:numId w:val="14"/>
-        </w:numPr>
-        <w:spacing w:lineRule="auto"/>
-      </w:pPr>
-      <w:r>
-        <w:rPr>
-          <w:b/>
-        </w:rPr>
-        <w:t xml:space="preserve">Périodes de paiement</w:t>
-      </w:r>
-      <w:r>
-        <w:rPr/>
-        <w:t xml:space="preserve"> : pour un abonnement, seuls les règlements </w:t>
-      </w:r>
-      <w:r>
-        <w:rPr>
-          <w:b/>
-        </w:rPr>
-        <w:t xml:space="preserve">par trimestre ou par année</w:t>
-      </w:r>
-      <w:r>
-        <w:rPr/>
-        <w:t xml:space="preserve"> sont proposés — pas de paiement mensuel.</w:t>
-      </w:r>
-    </w:p>
-    <w:p>
-      <w:pPr>
-        <w:numPr>
-          <w:ilvl w:val="0"/>
-          <w:numId w:val="14"/>
-        </w:numPr>
-        <w:spacing w:lineRule="auto"/>
-      </w:pPr>
-      <w:r>
-        <w:rPr/>
-        <w:t xml:space="preserve">Opérateurs Mobile Money pris en charge : Orange Money, MTN Money, Moov Money, Wave.</w:t>
-      </w:r>
-    </w:p>
-    <w:p>
-      <w:pPr>
-        <w:numPr>
-          <w:ilvl w:val="0"/>
-          <w:numId w:val="14"/>
-        </w:numPr>
-        <w:spacing w:lineRule="auto"/>
-      </w:pPr>
-      <w:r>
-        <w:rPr>
-          <w:b/>
-        </w:rPr>
-        <w:t xml:space="preserve">Recherche</w:t>
-      </w:r>
-      <w:r>
-        <w:rPr/>
-        <w:t xml:space="preserve"> par nom, prénom ou matricule de l'élève ; filtres par statut (En attente / Accepté / Refusé / Annulé), par période (date de début/fin) et par opérateur — tous les filtres peuvent se combiner.</w:t>
-      </w:r>
-    </w:p>
-    <w:p>
-      <w:pPr>
-        <w:numPr>
-          <w:ilvl w:val="0"/>
-          <w:numId w:val="14"/>
-        </w:numPr>
-        <w:spacing w:lineRule="auto"/>
-      </w:pPr>
-      <w:r>
-        <w:rPr>
-          <w:b/>
-        </w:rPr>
-        <w:t xml:space="preserve">Export</w:t>
-      </w:r>
-      <w:r>
-        <w:rPr/>
-        <w:t xml:space="preserve"> de la liste affichée au format tableau (CSV).</w:t>
-      </w:r>
-    </w:p>
-    <w:p>
-      <w:pPr>
-        <w:numPr>
-          <w:ilvl w:val="0"/>
-          <w:numId w:val="14"/>
-        </w:numPr>
-        <w:spacing w:lineRule="auto"/>
-      </w:pPr>
-      <w:r>
-        <w:rPr/>
-        <w:t xml:space="preserve">Un parent qui tenterait de payer pour un enfant qui n'est pas le sien se voit automatiquement refuser l'opération par le système.</w:t>
-      </w:r>
-    </w:p>
-    <w:p>
-      <w:pPr>
-        <w:ind w:left="284"/>
-        <w:jc w:val="both"/>
-        <w:spacing w:lineRule="auto"/>
-      </w:pPr>
-      <w:r>
-        <w:rPr/>
-        <w:t xml:space="preserve">ℹ️ Le paiement en ligne est réellement connecté à un service de paiement Mobile Money, mais </w:t>
-      </w:r>
-      <w:r>
-        <w:rPr>
-          <w:b/>
-        </w:rPr>
-        <w:t xml:space="preserve">aucun compte marchand réel n'est encore branché</w:t>
-      </w:r>
-      <w:r>
-        <w:rPr/>
-        <w:t xml:space="preserve"> — tant que ce n'est pas fait, une tentative de paiement affiche un message clair (« service de paiement indisponible ou mal configuré ») plutôt qu'un lien de paiement fonctionnel.</w:t>
+        <w:t xml:space="preserve">En attente de paiement</w:t>
+      </w:r>
+      <w:r>
+        <w:rPr/>
+        <w:t xml:space="preserve"> — aucun accès à la cantine tant qu'un paiement n'a pas été enregistré (voir §9 pour effectuer ce paiement).</w:t>
       </w:r>
     </w:p>
     <w:p>
@@ -3863,7 +3862,7 @@
       </w:pPr>
       <w:r>
         <w:rPr/>
-        <w:t xml:space="preserve">10. Contrôle d'accès à la cantine</w:t>
+        <w:t xml:space="preserve">9. Paiements Mobile Money</w:t>
       </w:r>
     </w:p>
     <w:p>
@@ -3876,12 +3875,12 @@
           <wp:inline distB="0" distL="0" distR="0" distT="0">
             <wp:extent cx="5715000" cy="3571875"/>
             <wp:effectExtent b="0" l="0" r="0" t="0"/>
-            <wp:docPr id="18" name="image-qyRSxc4GDa5tnCui5b23p.png"/>
+            <wp:docPr id="18" name="image-aolUmSeti4rODSwECB5iZ.png"/>
             <a:graphic>
               <a:graphicData uri="http://schemas.openxmlformats.org/drawingml/2006/picture">
                 <pic:pic>
                   <pic:nvPicPr>
-                    <pic:cNvPr id="18" name="image-qyRSxc4GDa5tnCui5b23p.png" descr="Écran de contrôle d'accès"/>
+                    <pic:cNvPr id="18" name="image-aolUmSeti4rODSwECB5iZ.png" descr="Écran des paiements"/>
                     <pic:cNvPicPr/>
                   </pic:nvPicPr>
                   <pic:blipFill>
@@ -3909,75 +3908,152 @@
       <w:pPr>
         <w:numPr>
           <w:ilvl w:val="0"/>
-          <w:numId w:val="15"/>
-        </w:numPr>
-        <w:spacing w:lineRule="auto"/>
-      </w:pPr>
-      <w:r>
-        <w:rPr/>
-        <w:t xml:space="preserve">La lecture du QR Code d'un élève à l'entrée de la cantine confirme l'accès en moins d'une seconde : ✓ accès accordé ou ✗ accès refusé (avec le motif affiché).</w:t>
-      </w:r>
-    </w:p>
-    <w:p>
-      <w:pPr>
-        <w:numPr>
-          <w:ilvl w:val="0"/>
-          <w:numId w:val="15"/>
-        </w:numPr>
-        <w:spacing w:lineRule="auto"/>
-      </w:pPr>
-      <w:r>
-        <w:rPr/>
-        <w:t xml:space="preserve">Fonctionne même </w:t>
-      </w:r>
+          <w:numId w:val="13"/>
+        </w:numPr>
+        <w:spacing w:lineRule="auto"/>
+      </w:pPr>
       <w:r>
         <w:rPr>
           <w:b/>
         </w:rPr>
-        <w:t xml:space="preserve">sans connexion internet</w:t>
-      </w:r>
-      <w:r>
-        <w:rPr/>
-        <w:t xml:space="preserve"> : l'appareil garde en mémoire, pendant 24 heures, la liste des élèves et leur statut d'accès, et se remet à jour automatiquement dès que la connexion revient.</w:t>
-      </w:r>
-    </w:p>
-    <w:p>
-      <w:pPr>
-        <w:numPr>
-          <w:ilvl w:val="0"/>
-          <w:numId w:val="15"/>
-        </w:numPr>
-        <w:spacing w:lineRule="auto"/>
-      </w:pPr>
-      <w:r>
-        <w:rPr/>
-        <w:t xml:space="preserve">Une barre d'état indique si l'appareil est « En ligne » ou « Hors ligne », l'état de ces informations enregistrées à l'avance (absentes, ou datées avec le nombre d'élèves couverts), et propose un bouton pour forcer la mise à jour manuellement.</w:t>
-      </w:r>
-    </w:p>
-    <w:p>
-      <w:pPr>
-        <w:numPr>
-          <w:ilvl w:val="0"/>
-          <w:numId w:val="15"/>
-        </w:numPr>
-        <w:spacing w:lineRule="auto"/>
-      </w:pPr>
-      <w:r>
-        <w:rPr/>
-        <w:t xml:space="preserve">Par défaut, ces informations se mettent à jour automatiquement en arrière-plan dès l'ouverture de l'écran, si une connexion est disponible — ce comportement peut être désactivé dans les Paramètres (§15) pour ne garder que la mise à jour manuelle.</w:t>
-      </w:r>
-    </w:p>
-    <w:p>
-      <w:pPr>
-        <w:numPr>
-          <w:ilvl w:val="0"/>
-          <w:numId w:val="15"/>
-        </w:numPr>
-        <w:spacing w:lineRule="auto"/>
-      </w:pPr>
-      <w:r>
-        <w:rPr/>
-        <w:t xml:space="preserve">Non accessible à un parent.</w:t>
+        <w:t xml:space="preserve">Administrateur / gestionnaire / caissier</w:t>
+      </w:r>
+      <w:r>
+        <w:rPr/>
+        <w:t xml:space="preserve"> : voient toutes les transactions et peuvent lancer un paiement pour n'importe quel élève (recherche par nom, prénom ou matricule). Seul l'administrateur peut modifier ou supprimer une transaction.</w:t>
+      </w:r>
+    </w:p>
+    <w:p>
+      <w:pPr>
+        <w:numPr>
+          <w:ilvl w:val="0"/>
+          <w:numId w:val="13"/>
+        </w:numPr>
+        <w:spacing w:lineRule="auto"/>
+      </w:pPr>
+      <w:r>
+        <w:rPr>
+          <w:b/>
+        </w:rPr>
+        <w:t xml:space="preserve">Parent</w:t>
+      </w:r>
+      <w:r>
+        <w:rPr/>
+        <w:t xml:space="preserve"> : ne voit que les paiements de ses propres enfants ; en lançant un paiement, seuls ses enfants lui sont proposés (pas de recherche libre parmi tous les élèves).</w:t>
+      </w:r>
+    </w:p>
+    <w:p>
+      <w:pPr>
+        <w:numPr>
+          <w:ilvl w:val="0"/>
+          <w:numId w:val="13"/>
+        </w:numPr>
+        <w:spacing w:lineRule="auto"/>
+      </w:pPr>
+      <w:r>
+        <w:rPr>
+          <w:b/>
+        </w:rPr>
+        <w:t xml:space="preserve">Périodes de paiement</w:t>
+      </w:r>
+      <w:r>
+        <w:rPr/>
+        <w:t xml:space="preserve"> : pour un abonnement, seuls les règlements </w:t>
+      </w:r>
+      <w:r>
+        <w:rPr>
+          <w:b/>
+        </w:rPr>
+        <w:t xml:space="preserve">par trimestre ou par année</w:t>
+      </w:r>
+      <w:r>
+        <w:rPr/>
+        <w:t xml:space="preserve"> sont proposés — pas de paiement mensuel.</w:t>
+      </w:r>
+    </w:p>
+    <w:p>
+      <w:pPr>
+        <w:numPr>
+          <w:ilvl w:val="0"/>
+          <w:numId w:val="13"/>
+        </w:numPr>
+        <w:spacing w:lineRule="auto"/>
+      </w:pPr>
+      <w:r>
+        <w:rPr/>
+        <w:t xml:space="preserve">Opérateurs Mobile Money pris en charge : Orange Money, MTN Money, Moov Money, Wave.</w:t>
+      </w:r>
+    </w:p>
+    <w:p>
+      <w:pPr>
+        <w:numPr>
+          <w:ilvl w:val="0"/>
+          <w:numId w:val="13"/>
+        </w:numPr>
+        <w:spacing w:lineRule="auto"/>
+      </w:pPr>
+      <w:r>
+        <w:rPr>
+          <w:b/>
+        </w:rPr>
+        <w:t xml:space="preserve">Recherche</w:t>
+      </w:r>
+      <w:r>
+        <w:rPr/>
+        <w:t xml:space="preserve"> par nom, prénom ou matricule de l'élève ; filtres par statut (En attente / Accepté / Refusé / Annulé), par période (date de début/fin) et par opérateur — tous les filtres peuvent se combiner.</w:t>
+      </w:r>
+    </w:p>
+    <w:p>
+      <w:pPr>
+        <w:numPr>
+          <w:ilvl w:val="0"/>
+          <w:numId w:val="13"/>
+        </w:numPr>
+        <w:spacing w:lineRule="auto"/>
+      </w:pPr>
+      <w:r>
+        <w:rPr>
+          <w:b/>
+        </w:rPr>
+        <w:t xml:space="preserve">Export</w:t>
+      </w:r>
+      <w:r>
+        <w:rPr/>
+        <w:t xml:space="preserve"> de la liste affichée au format tableau (CSV).</w:t>
+      </w:r>
+    </w:p>
+    <w:p>
+      <w:pPr>
+        <w:numPr>
+          <w:ilvl w:val="0"/>
+          <w:numId w:val="13"/>
+        </w:numPr>
+        <w:spacing w:lineRule="auto"/>
+      </w:pPr>
+      <w:r>
+        <w:rPr/>
+        <w:t xml:space="preserve">Un parent qui tenterait de payer pour un enfant qui n'est pas le sien se voit automatiquement refuser l'opération par le système.</w:t>
+      </w:r>
+    </w:p>
+    <w:p>
+      <w:pPr>
+        <w:ind w:left="284"/>
+        <w:jc w:val="both"/>
+        <w:spacing w:lineRule="auto"/>
+      </w:pPr>
+      <w:r>
+        <w:rPr/>
+        <w:t xml:space="preserve">ℹ️ Le paiement en ligne est réellement connecté à un service de paiement Mobile Money, mais </w:t>
+      </w:r>
+      <w:r>
+        <w:rPr>
+          <w:b/>
+        </w:rPr>
+        <w:t xml:space="preserve">aucun compte marchand réel n'est encore branché</w:t>
+      </w:r>
+      <w:r>
+        <w:rPr/>
+        <w:t xml:space="preserve"> — tant que ce n'est pas fait, une tentative de paiement affiche un message clair (« service de paiement indisponible ou mal configuré ») plutôt qu'un lien de paiement fonctionnel.</w:t>
       </w:r>
     </w:p>
     <w:p>
@@ -3987,7 +4063,7 @@
       </w:pPr>
       <w:r>
         <w:rPr/>
-        <w:t xml:space="preserve">11. Historique des passages</w:t>
+        <w:t xml:space="preserve">10. Contrôle d'accès à la cantine</w:t>
       </w:r>
     </w:p>
     <w:p>
@@ -4000,12 +4076,12 @@
           <wp:inline distB="0" distL="0" distR="0" distT="0">
             <wp:extent cx="5715000" cy="3571875"/>
             <wp:effectExtent b="0" l="0" r="0" t="0"/>
-            <wp:docPr id="19" name="image-x13BONRKra4pfdJND97Ss.png"/>
+            <wp:docPr id="19" name="image-OHU0wWBBj6pJtXUUFyVBQ.png"/>
             <a:graphic>
               <a:graphicData uri="http://schemas.openxmlformats.org/drawingml/2006/picture">
                 <pic:pic>
                   <pic:nvPicPr>
-                    <pic:cNvPr id="19" name="image-x13BONRKra4pfdJND97Ss.png" descr="Historique des passages"/>
+                    <pic:cNvPr id="19" name="image-OHU0wWBBj6pJtXUUFyVBQ.png" descr="Écran de contrôle d'accès"/>
                     <pic:cNvPicPr/>
                   </pic:nvPicPr>
                   <pic:blipFill>
@@ -4033,38 +4109,75 @@
       <w:pPr>
         <w:numPr>
           <w:ilvl w:val="0"/>
-          <w:numId w:val="16"/>
-        </w:numPr>
-        <w:spacing w:lineRule="auto"/>
-      </w:pPr>
+          <w:numId w:val="14"/>
+        </w:numPr>
+        <w:spacing w:lineRule="auto"/>
+      </w:pPr>
+      <w:r>
+        <w:rPr/>
+        <w:t xml:space="preserve">La lecture du QR Code d'un élève à l'entrée de la cantine confirme l'accès en moins d'une seconde : ✓ accès accordé ou ✗ accès refusé (avec le motif affiché).</w:t>
+      </w:r>
+    </w:p>
+    <w:p>
+      <w:pPr>
+        <w:numPr>
+          <w:ilvl w:val="0"/>
+          <w:numId w:val="14"/>
+        </w:numPr>
+        <w:spacing w:lineRule="auto"/>
+      </w:pPr>
+      <w:r>
+        <w:rPr/>
+        <w:t xml:space="preserve">Fonctionne même </w:t>
+      </w:r>
       <w:r>
         <w:rPr>
           <w:b/>
         </w:rPr>
-        <w:t xml:space="preserve">Administrateur / gestionnaire / caissier</w:t>
-      </w:r>
-      <w:r>
-        <w:rPr/>
-        <w:t xml:space="preserve"> : historique complet, filtrable par date, établissement et résultat, avec recherche d'élève ; export au format tableau (CSV) ; la modification ou la suppression d'un passage sont réservées à l'administrateur.</w:t>
-      </w:r>
-    </w:p>
-    <w:p>
-      <w:pPr>
-        <w:numPr>
-          <w:ilvl w:val="0"/>
-          <w:numId w:val="16"/>
-        </w:numPr>
-        <w:spacing w:lineRule="auto"/>
-      </w:pPr>
-      <w:r>
-        <w:rPr>
-          <w:b/>
-        </w:rPr>
-        <w:t xml:space="preserve">Parent</w:t>
-      </w:r>
-      <w:r>
-        <w:rPr/>
-        <w:t xml:space="preserve"> : ne voit que les passages de ses propres enfants ; le filtre par établissement et la colonne « Établissement » du tableau sont masqués (non utiles pour un parent).</w:t>
+        <w:t xml:space="preserve">sans connexion internet</w:t>
+      </w:r>
+      <w:r>
+        <w:rPr/>
+        <w:t xml:space="preserve"> : l'appareil garde en mémoire, pendant 24 heures, la liste des élèves et leur statut d'accès, et se remet à jour automatiquement dès que la connexion revient.</w:t>
+      </w:r>
+    </w:p>
+    <w:p>
+      <w:pPr>
+        <w:numPr>
+          <w:ilvl w:val="0"/>
+          <w:numId w:val="14"/>
+        </w:numPr>
+        <w:spacing w:lineRule="auto"/>
+      </w:pPr>
+      <w:r>
+        <w:rPr/>
+        <w:t xml:space="preserve">Une barre d'état indique si l'appareil est « En ligne » ou « Hors ligne », l'état de ces informations enregistrées à l'avance (absentes, ou datées avec le nombre d'élèves couverts), et propose un bouton pour forcer la mise à jour manuellement.</w:t>
+      </w:r>
+    </w:p>
+    <w:p>
+      <w:pPr>
+        <w:numPr>
+          <w:ilvl w:val="0"/>
+          <w:numId w:val="14"/>
+        </w:numPr>
+        <w:spacing w:lineRule="auto"/>
+      </w:pPr>
+      <w:r>
+        <w:rPr/>
+        <w:t xml:space="preserve">Par défaut, ces informations se mettent à jour automatiquement en arrière-plan dès l'ouverture de l'écran, si une connexion est disponible — ce comportement peut être désactivé dans les Paramètres (§16) pour ne garder que la mise à jour manuelle.</w:t>
+      </w:r>
+    </w:p>
+    <w:p>
+      <w:pPr>
+        <w:numPr>
+          <w:ilvl w:val="0"/>
+          <w:numId w:val="14"/>
+        </w:numPr>
+        <w:spacing w:lineRule="auto"/>
+      </w:pPr>
+      <w:r>
+        <w:rPr/>
+        <w:t xml:space="preserve">Non accessible à un parent.</w:t>
       </w:r>
     </w:p>
     <w:p>
@@ -4074,7 +4187,7 @@
       </w:pPr>
       <w:r>
         <w:rPr/>
-        <w:t xml:space="preserve">12. Comptes utilisateurs (administrateur uniquement)</w:t>
+        <w:t xml:space="preserve">11. Historique des passages</w:t>
       </w:r>
     </w:p>
     <w:p>
@@ -4087,12 +4200,12 @@
           <wp:inline distB="0" distL="0" distR="0" distT="0">
             <wp:extent cx="5715000" cy="3571875"/>
             <wp:effectExtent b="0" l="0" r="0" t="0"/>
-            <wp:docPr id="20" name="image-1hr65KMBfQnlby6p9OmP7.png"/>
+            <wp:docPr id="20" name="image-p5CQCNKPHhyOamOacC93s.png"/>
             <a:graphic>
               <a:graphicData uri="http://schemas.openxmlformats.org/drawingml/2006/picture">
                 <pic:pic>
                   <pic:nvPicPr>
-                    <pic:cNvPr id="20" name="image-1hr65KMBfQnlby6p9OmP7.png" descr="Liste des comptes utilisateurs"/>
+                    <pic:cNvPr id="20" name="image-p5CQCNKPHhyOamOacC93s.png" descr="Historique des passages"/>
                     <pic:cNvPicPr/>
                   </pic:nvPicPr>
                   <pic:blipFill>
@@ -4120,69 +4233,26 @@
       <w:pPr>
         <w:numPr>
           <w:ilvl w:val="0"/>
-          <w:numId w:val="17"/>
-        </w:numPr>
-        <w:spacing w:lineRule="auto"/>
-      </w:pPr>
-      <w:r>
-        <w:rPr/>
-        <w:t xml:space="preserve">Création d'un compte : nom, prénom, email, </w:t>
-      </w:r>
+          <w:numId w:val="15"/>
+        </w:numPr>
+        <w:spacing w:lineRule="auto"/>
+      </w:pPr>
       <w:r>
         <w:rPr>
           <w:b/>
         </w:rPr>
-        <w:t xml:space="preserve">numéro de téléphone (obligatoire, unique)</w:t>
-      </w:r>
-      <w:r>
-        <w:rPr/>
-        <w:t xml:space="preserve">, mot de passe, rôle (Administrateur, Gestionnaire, Caissier ou Parent).</w:t>
-      </w:r>
-    </w:p>
-    <w:p>
-      <w:pPr>
-        <w:numPr>
-          <w:ilvl w:val="0"/>
-          <w:numId w:val="17"/>
-        </w:numPr>
-        <w:spacing w:lineRule="auto"/>
-      </w:pPr>
-      <w:r>
-        <w:rPr/>
-        <w:t xml:space="preserve">Modification, changement de rôle directement dans le tableau, désactivation/réactivation, suppression définitive.</w:t>
-      </w:r>
-    </w:p>
-    <w:p>
-      <w:pPr>
-        <w:numPr>
-          <w:ilvl w:val="0"/>
-          <w:numId w:val="17"/>
-        </w:numPr>
-        <w:spacing w:lineRule="auto"/>
-      </w:pPr>
-      <w:r>
-        <w:rPr/>
-        <w:t xml:space="preserve">Impossible de désactiver ou de supprimer le tout dernier compte administrateur du système.</w:t>
-      </w:r>
-    </w:p>
-    <w:p>
-      <w:pPr>
-        <w:numPr>
-          <w:ilvl w:val="0"/>
-          <w:numId w:val="17"/>
-        </w:numPr>
-        <w:spacing w:lineRule="auto"/>
-      </w:pPr>
-      <w:r>
-        <w:rPr/>
-        <w:t xml:space="preserve">Impossible de désactiver ou de supprimer son propre compte.</w:t>
-      </w:r>
-    </w:p>
-    <w:p>
-      <w:pPr>
-        <w:numPr>
-          <w:ilvl w:val="0"/>
-          <w:numId w:val="17"/>
+        <w:t xml:space="preserve">Administrateur / gestionnaire / caissier</w:t>
+      </w:r>
+      <w:r>
+        <w:rPr/>
+        <w:t xml:space="preserve"> : historique complet, filtrable par date, établissement et résultat, avec recherche d'élève ; export au format tableau (CSV) ; la modification ou la suppression d'un passage sont réservées à l'administrateur.</w:t>
+      </w:r>
+    </w:p>
+    <w:p>
+      <w:pPr>
+        <w:numPr>
+          <w:ilvl w:val="0"/>
+          <w:numId w:val="15"/>
         </w:numPr>
         <w:spacing w:lineRule="auto"/>
       </w:pPr>
@@ -4190,11 +4260,11 @@
         <w:rPr>
           <w:b/>
         </w:rPr>
-        <w:t xml:space="preserve">Recherche</w:t>
-      </w:r>
-      <w:r>
-        <w:rPr/>
-        <w:t xml:space="preserve"> par email, nom, prénom ou téléphone ; filtres par rôle, par statut (actif ou inactif) et par période de création — tous combinables.</w:t>
+        <w:t xml:space="preserve">Parent</w:t>
+      </w:r>
+      <w:r>
+        <w:rPr/>
+        <w:t xml:space="preserve"> : ne voit que les passages de ses propres enfants ; le filtre par établissement et la colonne « Établissement » du tableau sont masqués (non utiles pour un parent).</w:t>
       </w:r>
     </w:p>
     <w:p>
@@ -4204,110 +4274,7 @@
       </w:pPr>
       <w:r>
         <w:rPr/>
-        <w:t xml:space="preserve">13. Parents (rattacher des enfants — administrateur uniquement)</w:t>
-      </w:r>
-    </w:p>
-    <w:p>
-      <w:pPr>
-        <w:numPr>
-          <w:ilvl w:val="0"/>
-          <w:numId w:val="18"/>
-        </w:numPr>
-        <w:spacing w:lineRule="auto"/>
-      </w:pPr>
-      <w:r>
-        <w:rPr/>
-        <w:t xml:space="preserve">Permet de rattacher un compte parent à un ou plusieurs élèves.</w:t>
-      </w:r>
-    </w:p>
-    <w:p>
-      <w:pPr>
-        <w:numPr>
-          <w:ilvl w:val="0"/>
-          <w:numId w:val="18"/>
-        </w:numPr>
-        <w:spacing w:lineRule="auto"/>
-      </w:pPr>
-      <w:r>
-        <w:rPr>
-          <w:b/>
-        </w:rPr>
-        <w:t xml:space="preserve">Choix du compte parent</w:t>
-      </w:r>
-      <w:r>
-        <w:rPr/>
-        <w:t xml:space="preserve"> : recherche par numéro de téléphone, nom ou prénom (le compte doit déjà exister — le créer d'abord dans « Comptes utilisateurs », ou passer par une demande d'accès validée, §3).</w:t>
-      </w:r>
-    </w:p>
-    <w:p>
-      <w:pPr>
-        <w:numPr>
-          <w:ilvl w:val="0"/>
-          <w:numId w:val="18"/>
-        </w:numPr>
-        <w:spacing w:lineRule="auto"/>
-      </w:pPr>
-      <w:r>
-        <w:rPr>
-          <w:b/>
-        </w:rPr>
-        <w:t xml:space="preserve">Choix des enfants</w:t>
-      </w:r>
-      <w:r>
-        <w:rPr/>
-        <w:t xml:space="preserve"> : recherche par matricule, nom ou prénom, plusieurs enfants peuvent être sélectionnés à la fois.</w:t>
-      </w:r>
-    </w:p>
-    <w:p>
-      <w:pPr>
-        <w:numPr>
-          <w:ilvl w:val="0"/>
-          <w:numId w:val="18"/>
-        </w:numPr>
-        <w:spacing w:lineRule="auto"/>
-      </w:pPr>
-      <w:r>
-        <w:rPr/>
-        <w:t xml:space="preserve">Modification des enfants rattachés, suppression du lien (les fiches des élèves ne sont pas supprimées pour autant).</w:t>
-      </w:r>
-    </w:p>
-    <w:p>
-      <w:pPr>
-        <w:numPr>
-          <w:ilvl w:val="0"/>
-          <w:numId w:val="18"/>
-        </w:numPr>
-        <w:spacing w:lineRule="auto"/>
-      </w:pPr>
-      <w:r>
-        <w:rPr>
-          <w:b/>
-        </w:rPr>
-        <w:t xml:space="preserve">Recherche</w:t>
-      </w:r>
-      <w:r>
-        <w:rPr/>
-        <w:t xml:space="preserve"> sur la liste principale par </w:t>
-      </w:r>
-      <w:r>
-        <w:rPr>
-          <w:b/>
-        </w:rPr>
-        <w:t xml:space="preserve">email ou numéro de téléphone</w:t>
-      </w:r>
-      <w:r>
-        <w:rPr/>
-        <w:t xml:space="preserve"> du compte parent.</w:t>
-      </w:r>
-    </w:p>
-    <w:p>
-      <w:pPr>
-        <w:pStyle w:val="Heading2"/>
-        <w:spacing w:lineRule="auto"/>
-      </w:pPr>
-      <w:r>
-        <w:rPr/>
-        <w:t xml:space="preserve">14. Rapports (administrateur / gestionnaire / caissier) — première version</w:t>
+        <w:t xml:space="preserve">12. Rapports (administrateur / gestionnaire / caissier) — première version</w:t>
       </w:r>
     </w:p>
     <w:p>
@@ -4325,7 +4292,7 @@
       <w:pPr>
         <w:numPr>
           <w:ilvl w:val="0"/>
-          <w:numId w:val="19"/>
+          <w:numId w:val="16"/>
         </w:numPr>
         <w:spacing w:lineRule="auto"/>
       </w:pPr>
@@ -4348,7 +4315,7 @@
       <w:pPr>
         <w:numPr>
           <w:ilvl w:val="0"/>
-          <w:numId w:val="19"/>
+          <w:numId w:val="16"/>
         </w:numPr>
         <w:spacing w:lineRule="auto"/>
       </w:pPr>
@@ -4361,7 +4328,7 @@
       <w:pPr>
         <w:numPr>
           <w:ilvl w:val="1"/>
-          <w:numId w:val="20"/>
+          <w:numId w:val="17"/>
         </w:numPr>
         <w:spacing w:lineRule="auto"/>
       </w:pPr>
@@ -4380,7 +4347,7 @@
       <w:pPr>
         <w:numPr>
           <w:ilvl w:val="1"/>
-          <w:numId w:val="20"/>
+          <w:numId w:val="17"/>
         </w:numPr>
         <w:spacing w:lineRule="auto"/>
       </w:pPr>
@@ -4399,7 +4366,7 @@
       <w:pPr>
         <w:numPr>
           <w:ilvl w:val="1"/>
-          <w:numId w:val="20"/>
+          <w:numId w:val="17"/>
         </w:numPr>
         <w:spacing w:lineRule="auto"/>
       </w:pPr>
@@ -4418,7 +4385,7 @@
       <w:pPr>
         <w:numPr>
           <w:ilvl w:val="0"/>
-          <w:numId w:val="19"/>
+          <w:numId w:val="16"/>
         </w:numPr>
         <w:spacing w:lineRule="auto"/>
       </w:pPr>
@@ -4437,7 +4404,7 @@
       <w:pPr>
         <w:numPr>
           <w:ilvl w:val="0"/>
-          <w:numId w:val="19"/>
+          <w:numId w:val="16"/>
         </w:numPr>
         <w:spacing w:lineRule="auto"/>
       </w:pPr>
@@ -4456,7 +4423,7 @@
       <w:pPr>
         <w:numPr>
           <w:ilvl w:val="0"/>
-          <w:numId w:val="19"/>
+          <w:numId w:val="16"/>
         </w:numPr>
         <w:spacing w:lineRule="auto"/>
       </w:pPr>
@@ -4472,7 +4439,7 @@
       </w:pPr>
       <w:r>
         <w:rPr/>
-        <w:t xml:space="preserve">15. Paramètres (administrateur uniquement)</w:t>
+        <w:t xml:space="preserve">13. Comptes utilisateurs (administrateur uniquement)</w:t>
       </w:r>
     </w:p>
     <w:p>
@@ -4485,12 +4452,12 @@
           <wp:inline distB="0" distL="0" distR="0" distT="0">
             <wp:extent cx="5715000" cy="3571875"/>
             <wp:effectExtent b="0" l="0" r="0" t="0"/>
-            <wp:docPr id="21" name="image-udwiGuW6vl0X85jx8_jlE.png"/>
+            <wp:docPr id="21" name="image-WkkQtSRO5pyFkU2YTeKu1.png"/>
             <a:graphic>
               <a:graphicData uri="http://schemas.openxmlformats.org/drawingml/2006/picture">
                 <pic:pic>
                   <pic:nvPicPr>
-                    <pic:cNvPr id="21" name="image-udwiGuW6vl0X85jx8_jlE.png" descr="Écran des paramètres"/>
+                    <pic:cNvPr id="21" name="image-WkkQtSRO5pyFkU2YTeKu1.png" descr="Liste des comptes utilisateurs"/>
                     <pic:cNvPicPr/>
                   </pic:nvPicPr>
                   <pic:blipFill>
@@ -4516,135 +4483,113 @@
     </w:p>
     <w:p>
       <w:pPr>
-        <w:spacing w:lineRule="auto"/>
-      </w:pPr>
-      <w:r>
-        <w:rPr/>
-        <w:t xml:space="preserve">Les réglages sont regroupés par thème dans des blocs dépliables (Contrôle d'accès cantine, Notifications, Paiements, Apparence, Organisation) — cliquer sur l'intitulé d'un bloc l'ouvre ou le referme.</w:t>
-      </w:r>
-    </w:p>
-    <w:p>
-      <w:pPr>
-        <w:numPr>
-          <w:ilvl w:val="0"/>
-          <w:numId w:val="21"/>
-        </w:numPr>
-        <w:spacing w:lineRule="auto"/>
-      </w:pPr>
-      <w:r>
-        <w:rPr/>
-        <w:t xml:space="preserve">Activer ou désactiver les notifications par email et par SMS.</w:t>
-      </w:r>
-    </w:p>
-    <w:p>
-      <w:pPr>
-        <w:numPr>
-          <w:ilvl w:val="0"/>
-          <w:numId w:val="21"/>
-        </w:numPr>
-        <w:spacing w:lineRule="auto"/>
-      </w:pPr>
-      <w:r>
-        <w:rPr/>
-        <w:t xml:space="preserve">Activer ou désactiver la mise à jour automatique des informations hors-ligne du contrôle d'accès (§10) — activée par défaut.</w:t>
-      </w:r>
-    </w:p>
-    <w:p>
-      <w:pPr>
-        <w:numPr>
-          <w:ilvl w:val="0"/>
-          <w:numId w:val="21"/>
-        </w:numPr>
-        <w:spacing w:lineRule="auto"/>
-      </w:pPr>
-      <w:r>
-        <w:rPr/>
-        <w:t xml:space="preserve">Mode de paiement : par </w:t>
+        <w:numPr>
+          <w:ilvl w:val="0"/>
+          <w:numId w:val="18"/>
+        </w:numPr>
+        <w:spacing w:lineRule="auto"/>
+      </w:pPr>
+      <w:r>
+        <w:rPr/>
+        <w:t xml:space="preserve">Création d'un compte : nom, prénom, email, </w:t>
       </w:r>
       <w:r>
         <w:rPr>
           <w:b/>
         </w:rPr>
-        <w:t xml:space="preserve">abonnement</w:t>
-      </w:r>
-      <w:r>
-        <w:rPr/>
-        <w:t xml:space="preserve"> (accès pour tout le trimestre ou l'année) ou par </w:t>
-      </w:r>
+        <w:t xml:space="preserve">numéro de téléphone (obligatoire, unique)</w:t>
+      </w:r>
+      <w:r>
+        <w:rPr/>
+        <w:t xml:space="preserve">, mot de passe, rôle (Administrateur, Gestionnaire, Caissier ou Parent).</w:t>
+      </w:r>
+    </w:p>
+    <w:p>
+      <w:pPr>
+        <w:numPr>
+          <w:ilvl w:val="0"/>
+          <w:numId w:val="18"/>
+        </w:numPr>
+        <w:spacing w:lineRule="auto"/>
+      </w:pPr>
+      <w:r>
+        <w:rPr/>
+        <w:t xml:space="preserve">Modification, changement de rôle directement dans le tableau, désactivation/réactivation, suppression définitive.</w:t>
+      </w:r>
+    </w:p>
+    <w:p>
+      <w:pPr>
+        <w:numPr>
+          <w:ilvl w:val="0"/>
+          <w:numId w:val="18"/>
+        </w:numPr>
+        <w:spacing w:lineRule="auto"/>
+      </w:pPr>
+      <w:r>
+        <w:rPr/>
+        <w:t xml:space="preserve">Impossible de désactiver ou de supprimer le tout dernier compte administrateur du système.</w:t>
+      </w:r>
+    </w:p>
+    <w:p>
+      <w:pPr>
+        <w:numPr>
+          <w:ilvl w:val="0"/>
+          <w:numId w:val="18"/>
+        </w:numPr>
+        <w:spacing w:lineRule="auto"/>
+      </w:pPr>
+      <w:r>
+        <w:rPr/>
+        <w:t xml:space="preserve">Impossible de désactiver ou de supprimer son propre compte.</w:t>
+      </w:r>
+    </w:p>
+    <w:p>
+      <w:pPr>
+        <w:numPr>
+          <w:ilvl w:val="0"/>
+          <w:numId w:val="18"/>
+        </w:numPr>
+        <w:spacing w:lineRule="auto"/>
+      </w:pPr>
       <w:r>
         <w:rPr>
           <w:b/>
         </w:rPr>
-        <w:t xml:space="preserve">crédits</w:t>
-      </w:r>
-      <w:r>
-        <w:rPr/>
-        <w:t xml:space="preserve"> (montant débité à chaque repas, avec un tarif réglable) — les deux modes peuvent coexister, chaque élève utilisant l'un ou l'autre.</w:t>
-      </w:r>
-    </w:p>
-    <w:p>
-      <w:pPr>
-        <w:numPr>
-          <w:ilvl w:val="0"/>
-          <w:numId w:val="21"/>
-        </w:numPr>
-        <w:spacing w:lineRule="auto"/>
-      </w:pPr>
-      <w:r>
-        <w:rPr/>
-        <w:t xml:space="preserve">Délai de grâce par défaut (7 jours), qui peut être ajusté établissement par établissement (§6).</w:t>
-      </w:r>
-    </w:p>
-    <w:p>
-      <w:pPr>
-        <w:numPr>
-          <w:ilvl w:val="0"/>
-          <w:numId w:val="21"/>
-        </w:numPr>
-        <w:spacing w:lineRule="auto"/>
-      </w:pPr>
-      <w:r>
-        <w:rPr/>
-        <w:t xml:space="preserve">Service de paiement actif.</w:t>
-      </w:r>
-    </w:p>
-    <w:p>
-      <w:pPr>
-        <w:numPr>
-          <w:ilvl w:val="0"/>
-          <w:numId w:val="21"/>
-        </w:numPr>
-        <w:spacing w:lineRule="auto"/>
-      </w:pPr>
-      <w:r>
-        <w:rPr/>
-        <w:t xml:space="preserve">Image de fond personnalisée pour l'écran de connexion.</w:t>
-      </w:r>
-    </w:p>
-    <w:p>
-      <w:pPr>
-        <w:pStyle w:val="Heading3"/>
-        <w:spacing w:lineRule="auto"/>
-      </w:pPr>
-      <w:r>
-        <w:rPr/>
-        <w:t xml:space="preserve">Personnalisation par établissement (image, nom, coordonnées)</w:t>
-      </w:r>
-    </w:p>
-    <w:p>
-      <w:pPr>
-        <w:spacing w:lineRule="auto"/>
-      </w:pPr>
-      <w:r>
-        <w:rPr/>
-        <w:t xml:space="preserve">Une section « Organisation » permet d'adapter l'application à l'identité du client :</w:t>
-      </w:r>
-    </w:p>
-    <w:p>
-      <w:pPr>
-        <w:numPr>
-          <w:ilvl w:val="0"/>
-          <w:numId w:val="22"/>
+        <w:t xml:space="preserve">Recherche</w:t>
+      </w:r>
+      <w:r>
+        <w:rPr/>
+        <w:t xml:space="preserve"> par email, nom, prénom ou téléphone ; filtres par rôle, par statut (actif ou inactif) et par période de création — tous combinables.</w:t>
+      </w:r>
+    </w:p>
+    <w:p>
+      <w:pPr>
+        <w:pStyle w:val="Heading2"/>
+        <w:spacing w:lineRule="auto"/>
+      </w:pPr>
+      <w:r>
+        <w:rPr/>
+        <w:t xml:space="preserve">14. Parents (rattacher des enfants — administrateur uniquement)</w:t>
+      </w:r>
+    </w:p>
+    <w:p>
+      <w:pPr>
+        <w:numPr>
+          <w:ilvl w:val="0"/>
+          <w:numId w:val="19"/>
+        </w:numPr>
+        <w:spacing w:lineRule="auto"/>
+      </w:pPr>
+      <w:r>
+        <w:rPr/>
+        <w:t xml:space="preserve">Permet de rattacher un compte parent à un ou plusieurs élèves.</w:t>
+      </w:r>
+    </w:p>
+    <w:p>
+      <w:pPr>
+        <w:numPr>
+          <w:ilvl w:val="0"/>
+          <w:numId w:val="19"/>
         </w:numPr>
         <w:spacing w:lineRule="auto"/>
       </w:pPr>
@@ -4652,18 +4597,18 @@
         <w:rPr>
           <w:b/>
         </w:rPr>
-        <w:t xml:space="preserve">Logo</w:t>
-      </w:r>
-      <w:r>
-        <w:rPr/>
-        <w:t xml:space="preserve"> : à téléverser directement depuis cet écran — il remplace l'icône par défaut en haut de chaque page de l'application.</w:t>
-      </w:r>
-    </w:p>
-    <w:p>
-      <w:pPr>
-        <w:numPr>
-          <w:ilvl w:val="0"/>
-          <w:numId w:val="22"/>
+        <w:t xml:space="preserve">Choix du compte parent</w:t>
+      </w:r>
+      <w:r>
+        <w:rPr/>
+        <w:t xml:space="preserve"> : recherche par numéro de téléphone, nom ou prénom (le compte doit déjà exister — le créer d'abord dans « Comptes utilisateurs », ou passer par une demande d'accès validée, §15).</w:t>
+      </w:r>
+    </w:p>
+    <w:p>
+      <w:pPr>
+        <w:numPr>
+          <w:ilvl w:val="0"/>
+          <w:numId w:val="19"/>
         </w:numPr>
         <w:spacing w:lineRule="auto"/>
       </w:pPr>
@@ -4671,18 +4616,31 @@
         <w:rPr>
           <w:b/>
         </w:rPr>
-        <w:t xml:space="preserve">Nom du client</w:t>
-      </w:r>
-      <w:r>
-        <w:rPr/>
-        <w:t xml:space="preserve"> : remplace « Cantine Connect » dans l'en-tête de l'application.</w:t>
-      </w:r>
-    </w:p>
-    <w:p>
-      <w:pPr>
-        <w:numPr>
-          <w:ilvl w:val="0"/>
-          <w:numId w:val="22"/>
+        <w:t xml:space="preserve">Choix des enfants</w:t>
+      </w:r>
+      <w:r>
+        <w:rPr/>
+        <w:t xml:space="preserve"> : recherche par matricule, nom ou prénom, plusieurs enfants peuvent être sélectionnés à la fois.</w:t>
+      </w:r>
+    </w:p>
+    <w:p>
+      <w:pPr>
+        <w:numPr>
+          <w:ilvl w:val="0"/>
+          <w:numId w:val="19"/>
+        </w:numPr>
+        <w:spacing w:lineRule="auto"/>
+      </w:pPr>
+      <w:r>
+        <w:rPr/>
+        <w:t xml:space="preserve">Modification des enfants rattachés, suppression du lien (les fiches des élèves ne sont pas supprimées pour autant).</w:t>
+      </w:r>
+    </w:p>
+    <w:p>
+      <w:pPr>
+        <w:numPr>
+          <w:ilvl w:val="0"/>
+          <w:numId w:val="19"/>
         </w:numPr>
         <w:spacing w:lineRule="auto"/>
       </w:pPr>
@@ -4690,38 +4648,57 @@
         <w:rPr>
           <w:b/>
         </w:rPr>
-        <w:t xml:space="preserve">Adresse / lieu</w:t>
-      </w:r>
-      <w:r>
-        <w:rPr/>
-        <w:t xml:space="preserve">, </w:t>
+        <w:t xml:space="preserve">Recherche</w:t>
+      </w:r>
+      <w:r>
+        <w:rPr/>
+        <w:t xml:space="preserve"> sur la liste principale par </w:t>
       </w:r>
       <w:r>
         <w:rPr>
           <w:b/>
         </w:rPr>
-        <w:t xml:space="preserve">téléphone</w:t>
-      </w:r>
-      <w:r>
-        <w:rPr/>
-        <w:t xml:space="preserve">, </w:t>
+        <w:t xml:space="preserve">email ou numéro de téléphone</w:t>
+      </w:r>
+      <w:r>
+        <w:rPr/>
+        <w:t xml:space="preserve"> du compte parent.</w:t>
+      </w:r>
+    </w:p>
+    <w:p>
+      <w:pPr>
+        <w:pStyle w:val="Heading2"/>
+        <w:spacing w:lineRule="auto"/>
+      </w:pPr>
+      <w:r>
+        <w:rPr/>
+        <w:t xml:space="preserve">15. Demandes d'accès (validation par l'administrateur)</w:t>
+      </w:r>
+    </w:p>
+    <w:p>
+      <w:pPr>
+        <w:spacing w:lineRule="auto"/>
+      </w:pPr>
+      <w:r>
+        <w:rPr/>
+        <w:t xml:space="preserve">Sur l'écran « Demandes d'accès » (réservé à l'administrateur), on retrouve la liste des demandes soumises depuis la page publique (§3), que l'on peut filtrer par statut (En attente / Validées / Rejetées). Chaque ligne a un bouton « Voir détails » qui ouvre une fiche complète du demandeur (identité, tous les numéros de téléphone, email, résidence, historique du traitement) — pour une demande en attente, c'est depuis cette fiche que l'on </w:t>
       </w:r>
       <w:r>
         <w:rPr>
           <w:b/>
         </w:rPr>
-        <w:t xml:space="preserve">email</w:t>
-      </w:r>
-      <w:r>
-        <w:rPr/>
-        <w:t xml:space="preserve"> : coordonnées de contact affichées comme référence.</w:t>
-      </w:r>
-    </w:p>
-    <w:p>
-      <w:pPr>
-        <w:numPr>
-          <w:ilvl w:val="0"/>
-          <w:numId w:val="22"/>
+        <w:t xml:space="preserve">valide ou rejette</w:t>
+      </w:r>
+      <w:r>
+        <w:rPr/>
+        <w:t xml:space="preserve">, afin de toujours vérifier les informations avant de créer un compte.</w:t>
+      </w:r>
+    </w:p>
+    <w:p>
+      <w:pPr>
+        <w:numPr>
+          <w:ilvl w:val="0"/>
+          <w:numId w:val="20"/>
         </w:numPr>
         <w:spacing w:lineRule="auto"/>
       </w:pPr>
@@ -4729,75 +4706,51 @@
         <w:rPr>
           <w:b/>
         </w:rPr>
-        <w:t xml:space="preserve">Numéro Mobile Money</w:t>
-      </w:r>
-      <w:r>
-        <w:rPr/>
-        <w:t xml:space="preserve"> : numéro communiqué aux parents pour un envoi manuel d'argent — c'est une information affichée aux parents, elle ne change rien au fonctionnement des paiements en ligne (§9).</w:t>
-      </w:r>
-    </w:p>
-    <w:p>
-      <w:pPr>
-        <w:spacing w:lineRule="auto"/>
-      </w:pPr>
-      <w:r>
-        <w:rPr/>
-        <w:t xml:space="preserve">Tant qu'aucune de ces informations n'est renseignée, l'application garde son apparence par défaut (icône par défaut et nom « Cantine Connect »).</w:t>
-      </w:r>
-    </w:p>
-    <w:p>
-      <w:pPr>
-        <w:pStyle w:val="Heading2"/>
-        <w:spacing w:lineRule="auto"/>
-      </w:pPr>
-      <w:r>
-        <w:rPr/>
-        <w:t xml:space="preserve">16. Paiement et notifications — état de la mise en service</w:t>
-      </w:r>
-    </w:p>
-    <w:p>
-      <w:pPr>
-        <w:numPr>
-          <w:ilvl w:val="0"/>
-          <w:numId w:val="23"/>
-        </w:numPr>
-        <w:spacing w:lineRule="auto"/>
-      </w:pPr>
+        <w:t xml:space="preserve">Valider</w:t>
+      </w:r>
+      <w:r>
+        <w:rPr/>
+        <w:t xml:space="preserve"> : crée le compte du parent, avec un identifiant de connexion et un mot de passe provisoire générés automatiquement. Si les notifications par email et SMS sont activées (voir §16 Paramètres), le parent les reçoit automatiquement ; </w:t>
+      </w:r>
       <w:r>
         <w:rPr>
           <w:b/>
         </w:rPr>
-        <w:t xml:space="preserve">Paiement</w:t>
-      </w:r>
-      <w:r>
-        <w:rPr/>
-        <w:t xml:space="preserve"> : la connexion avec le service de paiement Mobile Money est réelle, pas une simulation — dès que le client fournit ses identifiants marchands réels, le paiement fonctionne sans développement supplémentaire. Sans ces identifiants, une tentative de paiement échoue avec un message clair plutôt qu'un lien qui ne fonctionne pas.</w:t>
-      </w:r>
-    </w:p>
-    <w:p>
-      <w:pPr>
-        <w:numPr>
-          <w:ilvl w:val="0"/>
-          <w:numId w:val="23"/>
-        </w:numPr>
-        <w:spacing w:lineRule="auto"/>
-      </w:pPr>
+        <w:t xml:space="preserve">dans tous les cas</w:t>
+      </w:r>
+      <w:r>
+        <w:rPr/>
+        <w:t xml:space="preserve">, une fenêtre affiche l'identifiant et le mot de passe à l'écran, pour pouvoir les communiquer manuellement si besoin.</w:t>
+      </w:r>
+    </w:p>
+    <w:p>
+      <w:pPr>
+        <w:numPr>
+          <w:ilvl w:val="1"/>
+          <w:numId w:val="21"/>
+        </w:numPr>
+        <w:spacing w:lineRule="auto"/>
+      </w:pPr>
+      <w:r>
+        <w:rPr/>
+        <w:t xml:space="preserve">Si le parent n'a donné </w:t>
+      </w:r>
       <w:r>
         <w:rPr>
           <w:b/>
         </w:rPr>
-        <w:t xml:space="preserve">SMS</w:t>
-      </w:r>
-      <w:r>
-        <w:rPr/>
-        <w:t xml:space="preserve"> : la connexion avec le fournisseur de SMS est réelle. Tant qu'aucun compte n'est configuré, les SMS sont simplement enregistrés dans les journaux techniques (aucun envoi réel, et cela ne bloque rien pour l'utilisateur).</w:t>
-      </w:r>
-    </w:p>
-    <w:p>
-      <w:pPr>
-        <w:numPr>
-          <w:ilvl w:val="0"/>
-          <w:numId w:val="23"/>
+        <w:t xml:space="preserve">aucun email</w:t>
+      </w:r>
+      <w:r>
+        <w:rPr/>
+        <w:t xml:space="preserve">, un identifiant de connexion est créé automatiquement à partir de son numéro de téléphone — ce n'est pas une adresse email utilisable, seulement un identifiant de connexion.</w:t>
+      </w:r>
+    </w:p>
+    <w:p>
+      <w:pPr>
+        <w:numPr>
+          <w:ilvl w:val="0"/>
+          <w:numId w:val="20"/>
         </w:numPr>
         <w:spacing w:lineRule="auto"/>
       </w:pPr>
@@ -4805,11 +4758,40 @@
         <w:rPr>
           <w:b/>
         </w:rPr>
-        <w:t xml:space="preserve">Email</w:t>
-      </w:r>
-      <w:r>
-        <w:rPr/>
-        <w:t xml:space="preserve"> : fonctionne dès que les paramètres techniques d'envoi (compte email dédié) sont renseignés.</w:t>
+        <w:t xml:space="preserve">Rejeter</w:t>
+      </w:r>
+      <w:r>
+        <w:rPr/>
+        <w:t xml:space="preserve"> : un motif est obligatoire ; la demande reste visible avec son statut et le motif, pour garder une trace.</w:t>
+      </w:r>
+    </w:p>
+    <w:p>
+      <w:pPr>
+        <w:pStyle w:val="Heading3"/>
+        <w:spacing w:lineRule="auto"/>
+      </w:pPr>
+      <w:r>
+        <w:rPr/>
+        <w:t xml:space="preserve">Première connexion du parent</w:t>
+      </w:r>
+    </w:p>
+    <w:p>
+      <w:pPr>
+        <w:spacing w:lineRule="auto"/>
+      </w:pPr>
+      <w:r>
+        <w:rPr/>
+        <w:t xml:space="preserve">Un parent dont le compte vient d'être créé </w:t>
+      </w:r>
+      <w:r>
+        <w:rPr>
+          <w:b/>
+        </w:rPr>
+        <w:t xml:space="preserve">doit changer son mot de passe provisoire</w:t>
+      </w:r>
+      <w:r>
+        <w:rPr/>
+        <w:t xml:space="preserve"> dès sa première connexion — l'application l'amène automatiquement sur cet écran et ne laisse pas accéder au reste du site tant que ce n'est pas fait.</w:t>
       </w:r>
     </w:p>
     <w:p>
@@ -4819,7 +4801,7 @@
       </w:pPr>
       <w:r>
         <w:rPr/>
-        <w:t xml:space="preserve">17. Support et à propos</w:t>
+        <w:t xml:space="preserve">16. Paramètres (administrateur uniquement)</w:t>
       </w:r>
     </w:p>
     <w:p>
@@ -4832,12 +4814,12 @@
           <wp:inline distB="0" distL="0" distR="0" distT="0">
             <wp:extent cx="5715000" cy="3571875"/>
             <wp:effectExtent b="0" l="0" r="0" t="0"/>
-            <wp:docPr id="22" name="image-iq2AAKPYFbVYeHn77S7aS.png"/>
+            <wp:docPr id="22" name="image-uWMaOWeMbc3qrOoHoHwrg.png"/>
             <a:graphic>
               <a:graphicData uri="http://schemas.openxmlformats.org/drawingml/2006/picture">
                 <pic:pic>
                   <pic:nvPicPr>
-                    <pic:cNvPr id="22" name="image-iq2AAKPYFbVYeHn77S7aS.png" descr="Fenêtre « À propos »"/>
+                    <pic:cNvPr id="22" name="image-uWMaOWeMbc3qrOoHoHwrg.png" descr="Écran des paramètres"/>
                     <pic:cNvPicPr/>
                   </pic:nvPicPr>
                   <pic:blipFill>
@@ -4867,6 +4849,353 @@
       </w:pPr>
       <w:r>
         <w:rPr/>
+        <w:t xml:space="preserve">Les réglages sont regroupés par thème dans des blocs dépliables (Contrôle d'accès cantine, Notifications, Paiements, Apparence, Organisation) — cliquer sur l'intitulé d'un bloc l'ouvre ou le referme.</w:t>
+      </w:r>
+    </w:p>
+    <w:p>
+      <w:pPr>
+        <w:numPr>
+          <w:ilvl w:val="0"/>
+          <w:numId w:val="22"/>
+        </w:numPr>
+        <w:spacing w:lineRule="auto"/>
+      </w:pPr>
+      <w:r>
+        <w:rPr/>
+        <w:t xml:space="preserve">Activer ou désactiver les notifications par email et par SMS.</w:t>
+      </w:r>
+    </w:p>
+    <w:p>
+      <w:pPr>
+        <w:numPr>
+          <w:ilvl w:val="0"/>
+          <w:numId w:val="22"/>
+        </w:numPr>
+        <w:spacing w:lineRule="auto"/>
+      </w:pPr>
+      <w:r>
+        <w:rPr/>
+        <w:t xml:space="preserve">Activer ou désactiver la mise à jour automatique des informations hors-ligne du contrôle d'accès (§10) — activée par défaut.</w:t>
+      </w:r>
+    </w:p>
+    <w:p>
+      <w:pPr>
+        <w:numPr>
+          <w:ilvl w:val="0"/>
+          <w:numId w:val="22"/>
+        </w:numPr>
+        <w:spacing w:lineRule="auto"/>
+      </w:pPr>
+      <w:r>
+        <w:rPr/>
+        <w:t xml:space="preserve">Mode de paiement : par </w:t>
+      </w:r>
+      <w:r>
+        <w:rPr>
+          <w:b/>
+        </w:rPr>
+        <w:t xml:space="preserve">abonnement</w:t>
+      </w:r>
+      <w:r>
+        <w:rPr/>
+        <w:t xml:space="preserve"> (accès pour tout le trimestre ou l'année) ou par </w:t>
+      </w:r>
+      <w:r>
+        <w:rPr>
+          <w:b/>
+        </w:rPr>
+        <w:t xml:space="preserve">crédits</w:t>
+      </w:r>
+      <w:r>
+        <w:rPr/>
+        <w:t xml:space="preserve"> (montant débité à chaque repas, avec un tarif réglable) — les deux modes peuvent coexister, chaque élève utilisant l'un ou l'autre.</w:t>
+      </w:r>
+    </w:p>
+    <w:p>
+      <w:pPr>
+        <w:numPr>
+          <w:ilvl w:val="0"/>
+          <w:numId w:val="22"/>
+        </w:numPr>
+        <w:spacing w:lineRule="auto"/>
+      </w:pPr>
+      <w:r>
+        <w:rPr/>
+        <w:t xml:space="preserve">Délai de grâce par défaut (7 jours), qui peut être ajusté établissement par établissement (§6).</w:t>
+      </w:r>
+    </w:p>
+    <w:p>
+      <w:pPr>
+        <w:numPr>
+          <w:ilvl w:val="0"/>
+          <w:numId w:val="22"/>
+        </w:numPr>
+        <w:spacing w:lineRule="auto"/>
+      </w:pPr>
+      <w:r>
+        <w:rPr/>
+        <w:t xml:space="preserve">Service de paiement actif.</w:t>
+      </w:r>
+    </w:p>
+    <w:p>
+      <w:pPr>
+        <w:numPr>
+          <w:ilvl w:val="0"/>
+          <w:numId w:val="22"/>
+        </w:numPr>
+        <w:spacing w:lineRule="auto"/>
+      </w:pPr>
+      <w:r>
+        <w:rPr/>
+        <w:t xml:space="preserve">Image de fond personnalisée pour l'écran de connexion.</w:t>
+      </w:r>
+    </w:p>
+    <w:p>
+      <w:pPr>
+        <w:pStyle w:val="Heading3"/>
+        <w:spacing w:lineRule="auto"/>
+      </w:pPr>
+      <w:r>
+        <w:rPr/>
+        <w:t xml:space="preserve">Personnalisation par établissement (image, nom, coordonnées)</w:t>
+      </w:r>
+    </w:p>
+    <w:p>
+      <w:pPr>
+        <w:spacing w:lineRule="auto"/>
+      </w:pPr>
+      <w:r>
+        <w:rPr/>
+        <w:t xml:space="preserve">Une section « Organisation » permet d'adapter l'application à l'identité du client :</w:t>
+      </w:r>
+    </w:p>
+    <w:p>
+      <w:pPr>
+        <w:numPr>
+          <w:ilvl w:val="0"/>
+          <w:numId w:val="23"/>
+        </w:numPr>
+        <w:spacing w:lineRule="auto"/>
+      </w:pPr>
+      <w:r>
+        <w:rPr>
+          <w:b/>
+        </w:rPr>
+        <w:t xml:space="preserve">Logo</w:t>
+      </w:r>
+      <w:r>
+        <w:rPr/>
+        <w:t xml:space="preserve"> : à téléverser directement depuis cet écran — il remplace l'icône par défaut en haut de chaque page de l'application.</w:t>
+      </w:r>
+    </w:p>
+    <w:p>
+      <w:pPr>
+        <w:numPr>
+          <w:ilvl w:val="0"/>
+          <w:numId w:val="23"/>
+        </w:numPr>
+        <w:spacing w:lineRule="auto"/>
+      </w:pPr>
+      <w:r>
+        <w:rPr>
+          <w:b/>
+        </w:rPr>
+        <w:t xml:space="preserve">Nom du client</w:t>
+      </w:r>
+      <w:r>
+        <w:rPr/>
+        <w:t xml:space="preserve"> : remplace « Cantine Connect » dans l'en-tête de l'application.</w:t>
+      </w:r>
+    </w:p>
+    <w:p>
+      <w:pPr>
+        <w:numPr>
+          <w:ilvl w:val="0"/>
+          <w:numId w:val="23"/>
+        </w:numPr>
+        <w:spacing w:lineRule="auto"/>
+      </w:pPr>
+      <w:r>
+        <w:rPr>
+          <w:b/>
+        </w:rPr>
+        <w:t xml:space="preserve">Adresse / lieu</w:t>
+      </w:r>
+      <w:r>
+        <w:rPr/>
+        <w:t xml:space="preserve">, </w:t>
+      </w:r>
+      <w:r>
+        <w:rPr>
+          <w:b/>
+        </w:rPr>
+        <w:t xml:space="preserve">téléphone</w:t>
+      </w:r>
+      <w:r>
+        <w:rPr/>
+        <w:t xml:space="preserve">, </w:t>
+      </w:r>
+      <w:r>
+        <w:rPr>
+          <w:b/>
+        </w:rPr>
+        <w:t xml:space="preserve">email</w:t>
+      </w:r>
+      <w:r>
+        <w:rPr/>
+        <w:t xml:space="preserve"> : coordonnées de contact affichées comme référence.</w:t>
+      </w:r>
+    </w:p>
+    <w:p>
+      <w:pPr>
+        <w:numPr>
+          <w:ilvl w:val="0"/>
+          <w:numId w:val="23"/>
+        </w:numPr>
+        <w:spacing w:lineRule="auto"/>
+      </w:pPr>
+      <w:r>
+        <w:rPr>
+          <w:b/>
+        </w:rPr>
+        <w:t xml:space="preserve">Numéro Mobile Money</w:t>
+      </w:r>
+      <w:r>
+        <w:rPr/>
+        <w:t xml:space="preserve"> : numéro communiqué aux parents pour un envoi manuel d'argent — c'est une information affichée aux parents, elle ne change rien au fonctionnement des paiements en ligne (§9).</w:t>
+      </w:r>
+    </w:p>
+    <w:p>
+      <w:pPr>
+        <w:spacing w:lineRule="auto"/>
+      </w:pPr>
+      <w:r>
+        <w:rPr/>
+        <w:t xml:space="preserve">Tant qu'aucune de ces informations n'est renseignée, l'application garde son apparence par défaut (icône par défaut et nom « Cantine Connect »).</w:t>
+      </w:r>
+    </w:p>
+    <w:p>
+      <w:pPr>
+        <w:pStyle w:val="Heading2"/>
+        <w:spacing w:lineRule="auto"/>
+      </w:pPr>
+      <w:r>
+        <w:rPr/>
+        <w:t xml:space="preserve">17. Paiement et notifications — état de la mise en service</w:t>
+      </w:r>
+    </w:p>
+    <w:p>
+      <w:pPr>
+        <w:numPr>
+          <w:ilvl w:val="0"/>
+          <w:numId w:val="24"/>
+        </w:numPr>
+        <w:spacing w:lineRule="auto"/>
+      </w:pPr>
+      <w:r>
+        <w:rPr>
+          <w:b/>
+        </w:rPr>
+        <w:t xml:space="preserve">Paiement</w:t>
+      </w:r>
+      <w:r>
+        <w:rPr/>
+        <w:t xml:space="preserve"> : la connexion avec le service de paiement Mobile Money est réelle, pas une simulation — dès que le client fournit ses identifiants marchands réels, le paiement fonctionne sans développement supplémentaire. Sans ces identifiants, une tentative de paiement échoue avec un message clair plutôt qu'un lien qui ne fonctionne pas.</w:t>
+      </w:r>
+    </w:p>
+    <w:p>
+      <w:pPr>
+        <w:numPr>
+          <w:ilvl w:val="0"/>
+          <w:numId w:val="24"/>
+        </w:numPr>
+        <w:spacing w:lineRule="auto"/>
+      </w:pPr>
+      <w:r>
+        <w:rPr>
+          <w:b/>
+        </w:rPr>
+        <w:t xml:space="preserve">SMS</w:t>
+      </w:r>
+      <w:r>
+        <w:rPr/>
+        <w:t xml:space="preserve"> : la connexion avec le fournisseur de SMS est réelle. Tant qu'aucun compte n'est configuré, les SMS sont simplement enregistrés dans les journaux techniques (aucun envoi réel, et cela ne bloque rien pour l'utilisateur).</w:t>
+      </w:r>
+    </w:p>
+    <w:p>
+      <w:pPr>
+        <w:numPr>
+          <w:ilvl w:val="0"/>
+          <w:numId w:val="24"/>
+        </w:numPr>
+        <w:spacing w:lineRule="auto"/>
+      </w:pPr>
+      <w:r>
+        <w:rPr>
+          <w:b/>
+        </w:rPr>
+        <w:t xml:space="preserve">Email</w:t>
+      </w:r>
+      <w:r>
+        <w:rPr/>
+        <w:t xml:space="preserve"> : fonctionne dès que les paramètres techniques d'envoi (compte email dédié) sont renseignés.</w:t>
+      </w:r>
+    </w:p>
+    <w:p>
+      <w:pPr>
+        <w:pStyle w:val="Heading2"/>
+        <w:spacing w:lineRule="auto"/>
+      </w:pPr>
+      <w:r>
+        <w:rPr/>
+        <w:t xml:space="preserve">18. Support et à propos</w:t>
+      </w:r>
+    </w:p>
+    <w:p>
+      <w:pPr>
+        <w:spacing w:lineRule="auto"/>
+      </w:pPr>
+      <w:r>
+        <w:rPr/>
+        <w:drawing>
+          <wp:inline distB="0" distL="0" distR="0" distT="0">
+            <wp:extent cx="5715000" cy="3571875"/>
+            <wp:effectExtent b="0" l="0" r="0" t="0"/>
+            <wp:docPr id="23" name="image-CsYfbFMQ5WD8g47mCPWKZ.png"/>
+            <a:graphic>
+              <a:graphicData uri="http://schemas.openxmlformats.org/drawingml/2006/picture">
+                <pic:pic>
+                  <pic:nvPicPr>
+                    <pic:cNvPr id="23" name="image-CsYfbFMQ5WD8g47mCPWKZ.png" descr="Fenêtre « À propos »"/>
+                    <pic:cNvPicPr/>
+                  </pic:nvPicPr>
+                  <pic:blipFill>
+                    <a:blip r:embed="rId28" cstate="print"/>
+                    <a:srcRect b="0" l="0" r="0" t="0"/>
+                    <a:stretch>
+                      <a:fillRect/>
+                    </a:stretch>
+                  </pic:blipFill>
+                  <pic:spPr>
+                    <a:xfrm>
+                      <a:off x="0" y="0"/>
+                      <a:ext cx="5715000" cy="3571875"/>
+                    </a:xfrm>
+                    <a:prstGeom prst="rect"/>
+                  </pic:spPr>
+                </pic:pic>
+              </a:graphicData>
+            </a:graphic>
+          </wp:inline>
+        </w:drawing>
+      </w:r>
+    </w:p>
+    <w:p>
+      <w:pPr>
+        <w:spacing w:lineRule="auto"/>
+      </w:pPr>
+      <w:r>
+        <w:rPr/>
         <w:t xml:space="preserve">Une fenêtre « À propos », accessible depuis le menu de l'application, rappelle les coordonnées de contact de l'éditeur :</w:t>
       </w:r>
     </w:p>
@@ -4884,7 +5213,7 @@
         <w:rPr/>
         <w:t xml:space="preserve"> — Téléphone : +225 07 58 89 24 77 · Email : </w:t>
       </w:r>
-      <w:hyperlink r:id="rId28">
+      <w:hyperlink r:id="rId29">
         <w:r>
           <w:rPr>
             <w:rStyle w:val="Hyperlink"/>
@@ -4902,8 +5231,8 @@
   <w:abstractNum w:abstractNumId="1">
     <w:lvl w:ilvl="0">
       <w:start w:val="1"/>
-      <w:numFmt w:val="bullet"/>
-      <w:lvlText w:val=""/>
+      <w:numFmt w:val="decimal"/>
+      <w:lvlText w:val="%1."/>
       <w:lvlJc w:val="left"/>
       <w:pPr>
         <w:tabs>
@@ -4911,14 +5240,11 @@
         </w:tabs>
         <w:ind w:left="720" w:hanging="360"/>
       </w:pPr>
-      <w:rPr>
-        <w:rFonts w:ascii="Symbol" w:hAnsi="Symbol" w:hint="default"/>
-      </w:rPr>
     </w:lvl>
     <w:lvl w:ilvl="1">
       <w:start w:val="1"/>
-      <w:numFmt w:val="bullet"/>
-      <w:lvlText w:val=""/>
+      <w:numFmt w:val="decimal"/>
+      <w:lvlText w:val="%2."/>
       <w:lvlJc w:val="left"/>
       <w:pPr>
         <w:tabs>
@@ -4926,14 +5252,11 @@
         </w:tabs>
         <w:ind w:left="1440" w:hanging="360"/>
       </w:pPr>
-      <w:rPr>
-        <w:rFonts w:ascii="Symbol" w:hAnsi="Symbol" w:hint="default"/>
-      </w:rPr>
     </w:lvl>
     <w:lvl w:ilvl="2">
       <w:start w:val="1"/>
-      <w:numFmt w:val="bullet"/>
-      <w:lvlText w:val=""/>
+      <w:numFmt w:val="decimal"/>
+      <w:lvlText w:val="%3."/>
       <w:lvlJc w:val="left"/>
       <w:pPr>
         <w:tabs>
@@ -4941,14 +5264,11 @@
         </w:tabs>
         <w:ind w:left="2160" w:hanging="360"/>
       </w:pPr>
-      <w:rPr>
-        <w:rFonts w:ascii="Symbol" w:hAnsi="Symbol" w:hint="default"/>
-      </w:rPr>
     </w:lvl>
     <w:lvl w:ilvl="3">
       <w:start w:val="1"/>
-      <w:numFmt w:val="bullet"/>
-      <w:lvlText w:val=""/>
+      <w:numFmt w:val="decimal"/>
+      <w:lvlText w:val="%4."/>
       <w:lvlJc w:val="left"/>
       <w:pPr>
         <w:tabs>
@@ -4956,14 +5276,11 @@
         </w:tabs>
         <w:ind w:left="2880" w:hanging="360"/>
       </w:pPr>
-      <w:rPr>
-        <w:rFonts w:ascii="Symbol" w:hAnsi="Symbol" w:hint="default"/>
-      </w:rPr>
     </w:lvl>
     <w:lvl w:ilvl="4">
       <w:start w:val="1"/>
-      <w:numFmt w:val="bullet"/>
-      <w:lvlText w:val=""/>
+      <w:numFmt w:val="decimal"/>
+      <w:lvlText w:val="%5."/>
       <w:lvlJc w:val="left"/>
       <w:pPr>
         <w:tabs>
@@ -4971,14 +5288,11 @@
         </w:tabs>
         <w:ind w:left="3600" w:hanging="360"/>
       </w:pPr>
-      <w:rPr>
-        <w:rFonts w:ascii="Symbol" w:hAnsi="Symbol" w:hint="default"/>
-      </w:rPr>
     </w:lvl>
     <w:lvl w:ilvl="5">
       <w:start w:val="1"/>
-      <w:numFmt w:val="bullet"/>
-      <w:lvlText w:val=""/>
+      <w:numFmt w:val="decimal"/>
+      <w:lvlText w:val="%6."/>
       <w:lvlJc w:val="left"/>
       <w:pPr>
         <w:tabs>
@@ -4986,14 +5300,11 @@
         </w:tabs>
         <w:ind w:left="4320" w:hanging="360"/>
       </w:pPr>
-      <w:rPr>
-        <w:rFonts w:ascii="Symbol" w:hAnsi="Symbol" w:hint="default"/>
-      </w:rPr>
     </w:lvl>
     <w:lvl w:ilvl="6">
       <w:start w:val="1"/>
-      <w:numFmt w:val="bullet"/>
-      <w:lvlText w:val=""/>
+      <w:numFmt w:val="decimal"/>
+      <w:lvlText w:val="%7."/>
       <w:lvlJc w:val="left"/>
       <w:pPr>
         <w:tabs>
@@ -5001,14 +5312,11 @@
         </w:tabs>
         <w:ind w:left="5040" w:hanging="360"/>
       </w:pPr>
-      <w:rPr>
-        <w:rFonts w:ascii="Symbol" w:hAnsi="Symbol" w:hint="default"/>
-      </w:rPr>
     </w:lvl>
     <w:lvl w:ilvl="7">
       <w:start w:val="1"/>
-      <w:numFmt w:val="bullet"/>
-      <w:lvlText w:val=""/>
+      <w:numFmt w:val="decimal"/>
+      <w:lvlText w:val="%8."/>
       <w:lvlJc w:val="left"/>
       <w:pPr>
         <w:tabs>
@@ -5016,16 +5324,13 @@
         </w:tabs>
         <w:ind w:left="5760" w:hanging="360"/>
       </w:pPr>
-      <w:rPr>
-        <w:rFonts w:ascii="Symbol" w:hAnsi="Symbol" w:hint="default"/>
-      </w:rPr>
     </w:lvl>
   </w:abstractNum>
   <w:abstractNum w:abstractNumId="2">
     <w:lvl w:ilvl="0">
       <w:start w:val="1"/>
-      <w:numFmt w:val="decimal"/>
-      <w:lvlText w:val="%1."/>
+      <w:numFmt w:val="bullet"/>
+      <w:lvlText w:val=""/>
       <w:lvlJc w:val="left"/>
       <w:pPr>
         <w:tabs>
@@ -5033,11 +5338,14 @@
         </w:tabs>
         <w:ind w:left="720" w:hanging="360"/>
       </w:pPr>
+      <w:rPr>
+        <w:rFonts w:ascii="Symbol" w:hAnsi="Symbol" w:hint="default"/>
+      </w:rPr>
     </w:lvl>
     <w:lvl w:ilvl="1">
       <w:start w:val="1"/>
-      <w:numFmt w:val="decimal"/>
-      <w:lvlText w:val="%2."/>
+      <w:numFmt w:val="bullet"/>
+      <w:lvlText w:val=""/>
       <w:lvlJc w:val="left"/>
       <w:pPr>
         <w:tabs>
@@ -5045,11 +5353,14 @@
         </w:tabs>
         <w:ind w:left="1440" w:hanging="360"/>
       </w:pPr>
+      <w:rPr>
+        <w:rFonts w:ascii="Symbol" w:hAnsi="Symbol" w:hint="default"/>
+      </w:rPr>
     </w:lvl>
     <w:lvl w:ilvl="2">
       <w:start w:val="1"/>
-      <w:numFmt w:val="decimal"/>
-      <w:lvlText w:val="%3."/>
+      <w:numFmt w:val="bullet"/>
+      <w:lvlText w:val=""/>
       <w:lvlJc w:val="left"/>
       <w:pPr>
         <w:tabs>
@@ -5057,11 +5368,14 @@
         </w:tabs>
         <w:ind w:left="2160" w:hanging="360"/>
       </w:pPr>
+      <w:rPr>
+        <w:rFonts w:ascii="Symbol" w:hAnsi="Symbol" w:hint="default"/>
+      </w:rPr>
     </w:lvl>
     <w:lvl w:ilvl="3">
       <w:start w:val="1"/>
-      <w:numFmt w:val="decimal"/>
-      <w:lvlText w:val="%4."/>
+      <w:numFmt w:val="bullet"/>
+      <w:lvlText w:val=""/>
       <w:lvlJc w:val="left"/>
       <w:pPr>
         <w:tabs>
@@ -5069,11 +5383,14 @@
         </w:tabs>
         <w:ind w:left="2880" w:hanging="360"/>
       </w:pPr>
+      <w:rPr>
+        <w:rFonts w:ascii="Symbol" w:hAnsi="Symbol" w:hint="default"/>
+      </w:rPr>
     </w:lvl>
     <w:lvl w:ilvl="4">
       <w:start w:val="1"/>
-      <w:numFmt w:val="decimal"/>
-      <w:lvlText w:val="%5."/>
+      <w:numFmt w:val="bullet"/>
+      <w:lvlText w:val=""/>
       <w:lvlJc w:val="left"/>
       <w:pPr>
         <w:tabs>
@@ -5081,11 +5398,14 @@
         </w:tabs>
         <w:ind w:left="3600" w:hanging="360"/>
       </w:pPr>
+      <w:rPr>
+        <w:rFonts w:ascii="Symbol" w:hAnsi="Symbol" w:hint="default"/>
+      </w:rPr>
     </w:lvl>
     <w:lvl w:ilvl="5">
       <w:start w:val="1"/>
-      <w:numFmt w:val="decimal"/>
-      <w:lvlText w:val="%6."/>
+      <w:numFmt w:val="bullet"/>
+      <w:lvlText w:val=""/>
       <w:lvlJc w:val="left"/>
       <w:pPr>
         <w:tabs>
@@ -5093,11 +5413,14 @@
         </w:tabs>
         <w:ind w:left="4320" w:hanging="360"/>
       </w:pPr>
+      <w:rPr>
+        <w:rFonts w:ascii="Symbol" w:hAnsi="Symbol" w:hint="default"/>
+      </w:rPr>
     </w:lvl>
     <w:lvl w:ilvl="6">
       <w:start w:val="1"/>
-      <w:numFmt w:val="decimal"/>
-      <w:lvlText w:val="%7."/>
+      <w:numFmt w:val="bullet"/>
+      <w:lvlText w:val=""/>
       <w:lvlJc w:val="left"/>
       <w:pPr>
         <w:tabs>
@@ -5105,11 +5428,14 @@
         </w:tabs>
         <w:ind w:left="5040" w:hanging="360"/>
       </w:pPr>
+      <w:rPr>
+        <w:rFonts w:ascii="Symbol" w:hAnsi="Symbol" w:hint="default"/>
+      </w:rPr>
     </w:lvl>
     <w:lvl w:ilvl="7">
       <w:start w:val="1"/>
-      <w:numFmt w:val="decimal"/>
-      <w:lvlText w:val="%8."/>
+      <w:numFmt w:val="bullet"/>
+      <w:lvlText w:val=""/>
       <w:lvlJc w:val="left"/>
       <w:pPr>
         <w:tabs>
@@ -5117,6 +5443,9 @@
         </w:tabs>
         <w:ind w:left="5760" w:hanging="360"/>
       </w:pPr>
+      <w:rPr>
+        <w:rFonts w:ascii="Symbol" w:hAnsi="Symbol" w:hint="default"/>
+      </w:rPr>
     </w:lvl>
   </w:abstractNum>
   <w:abstractNum w:abstractNumId="3">
@@ -5318,8 +5647,8 @@
   <w:abstractNum w:abstractNumId="5">
     <w:lvl w:ilvl="0">
       <w:start w:val="1"/>
-      <w:numFmt w:val="bullet"/>
-      <w:lvlText w:val=""/>
+      <w:numFmt w:val="decimal"/>
+      <w:lvlText w:val="%1."/>
       <w:lvlJc w:val="left"/>
       <w:pPr>
         <w:tabs>
@@ -5327,14 +5656,11 @@
         </w:tabs>
         <w:ind w:left="720" w:hanging="360"/>
       </w:pPr>
-      <w:rPr>
-        <w:rFonts w:ascii="Symbol" w:hAnsi="Symbol" w:hint="default"/>
-      </w:rPr>
     </w:lvl>
     <w:lvl w:ilvl="1">
       <w:start w:val="1"/>
-      <w:numFmt w:val="bullet"/>
-      <w:lvlText w:val=""/>
+      <w:numFmt w:val="decimal"/>
+      <w:lvlText w:val="%2."/>
       <w:lvlJc w:val="left"/>
       <w:pPr>
         <w:tabs>
@@ -5342,14 +5668,11 @@
         </w:tabs>
         <w:ind w:left="1440" w:hanging="360"/>
       </w:pPr>
-      <w:rPr>
-        <w:rFonts w:ascii="Symbol" w:hAnsi="Symbol" w:hint="default"/>
-      </w:rPr>
     </w:lvl>
     <w:lvl w:ilvl="2">
       <w:start w:val="1"/>
-      <w:numFmt w:val="bullet"/>
-      <w:lvlText w:val=""/>
+      <w:numFmt w:val="decimal"/>
+      <w:lvlText w:val="%3."/>
       <w:lvlJc w:val="left"/>
       <w:pPr>
         <w:tabs>
@@ -5357,14 +5680,11 @@
         </w:tabs>
         <w:ind w:left="2160" w:hanging="360"/>
       </w:pPr>
-      <w:rPr>
-        <w:rFonts w:ascii="Symbol" w:hAnsi="Symbol" w:hint="default"/>
-      </w:rPr>
     </w:lvl>
     <w:lvl w:ilvl="3">
       <w:start w:val="1"/>
-      <w:numFmt w:val="bullet"/>
-      <w:lvlText w:val=""/>
+      <w:numFmt w:val="decimal"/>
+      <w:lvlText w:val="%4."/>
       <w:lvlJc w:val="left"/>
       <w:pPr>
         <w:tabs>
@@ -5372,14 +5692,11 @@
         </w:tabs>
         <w:ind w:left="2880" w:hanging="360"/>
       </w:pPr>
-      <w:rPr>
-        <w:rFonts w:ascii="Symbol" w:hAnsi="Symbol" w:hint="default"/>
-      </w:rPr>
     </w:lvl>
     <w:lvl w:ilvl="4">
       <w:start w:val="1"/>
-      <w:numFmt w:val="bullet"/>
-      <w:lvlText w:val=""/>
+      <w:numFmt w:val="decimal"/>
+      <w:lvlText w:val="%5."/>
       <w:lvlJc w:val="left"/>
       <w:pPr>
         <w:tabs>
@@ -5387,14 +5704,11 @@
         </w:tabs>
         <w:ind w:left="3600" w:hanging="360"/>
       </w:pPr>
-      <w:rPr>
-        <w:rFonts w:ascii="Symbol" w:hAnsi="Symbol" w:hint="default"/>
-      </w:rPr>
     </w:lvl>
     <w:lvl w:ilvl="5">
       <w:start w:val="1"/>
-      <w:numFmt w:val="bullet"/>
-      <w:lvlText w:val=""/>
+      <w:numFmt w:val="decimal"/>
+      <w:lvlText w:val="%6."/>
       <w:lvlJc w:val="left"/>
       <w:pPr>
         <w:tabs>
@@ -5402,14 +5716,11 @@
         </w:tabs>
         <w:ind w:left="4320" w:hanging="360"/>
       </w:pPr>
-      <w:rPr>
-        <w:rFonts w:ascii="Symbol" w:hAnsi="Symbol" w:hint="default"/>
-      </w:rPr>
     </w:lvl>
     <w:lvl w:ilvl="6">
       <w:start w:val="1"/>
-      <w:numFmt w:val="bullet"/>
-      <w:lvlText w:val=""/>
+      <w:numFmt w:val="decimal"/>
+      <w:lvlText w:val="%7."/>
       <w:lvlJc w:val="left"/>
       <w:pPr>
         <w:tabs>
@@ -5417,14 +5728,11 @@
         </w:tabs>
         <w:ind w:left="5040" w:hanging="360"/>
       </w:pPr>
-      <w:rPr>
-        <w:rFonts w:ascii="Symbol" w:hAnsi="Symbol" w:hint="default"/>
-      </w:rPr>
     </w:lvl>
     <w:lvl w:ilvl="7">
       <w:start w:val="1"/>
-      <w:numFmt w:val="bullet"/>
-      <w:lvlText w:val=""/>
+      <w:numFmt w:val="decimal"/>
+      <w:lvlText w:val="%8."/>
       <w:lvlJc w:val="left"/>
       <w:pPr>
         <w:tabs>
@@ -5432,9 +5740,6 @@
         </w:tabs>
         <w:ind w:left="5760" w:hanging="360"/>
       </w:pPr>
-      <w:rPr>
-        <w:rFonts w:ascii="Symbol" w:hAnsi="Symbol" w:hint="default"/>
-      </w:rPr>
     </w:lvl>
   </w:abstractNum>
   <w:abstractNum w:abstractNumId="6">
@@ -7512,6 +7817,128 @@
     </w:lvl>
   </w:abstractNum>
   <w:abstractNum w:abstractNumId="23">
+    <w:lvl w:ilvl="0">
+      <w:start w:val="1"/>
+      <w:numFmt w:val="bullet"/>
+      <w:lvlText w:val=""/>
+      <w:lvlJc w:val="left"/>
+      <w:pPr>
+        <w:tabs>
+          <w:tab w:val="num" w:pos="720"/>
+        </w:tabs>
+        <w:ind w:left="720" w:hanging="360"/>
+      </w:pPr>
+      <w:rPr>
+        <w:rFonts w:ascii="Symbol" w:hAnsi="Symbol" w:hint="default"/>
+      </w:rPr>
+    </w:lvl>
+    <w:lvl w:ilvl="1">
+      <w:start w:val="1"/>
+      <w:numFmt w:val="bullet"/>
+      <w:lvlText w:val=""/>
+      <w:lvlJc w:val="left"/>
+      <w:pPr>
+        <w:tabs>
+          <w:tab w:val="num" w:pos="1440"/>
+        </w:tabs>
+        <w:ind w:left="1440" w:hanging="360"/>
+      </w:pPr>
+      <w:rPr>
+        <w:rFonts w:ascii="Symbol" w:hAnsi="Symbol" w:hint="default"/>
+      </w:rPr>
+    </w:lvl>
+    <w:lvl w:ilvl="2">
+      <w:start w:val="1"/>
+      <w:numFmt w:val="bullet"/>
+      <w:lvlText w:val=""/>
+      <w:lvlJc w:val="left"/>
+      <w:pPr>
+        <w:tabs>
+          <w:tab w:val="num" w:pos="2160"/>
+        </w:tabs>
+        <w:ind w:left="2160" w:hanging="360"/>
+      </w:pPr>
+      <w:rPr>
+        <w:rFonts w:ascii="Symbol" w:hAnsi="Symbol" w:hint="default"/>
+      </w:rPr>
+    </w:lvl>
+    <w:lvl w:ilvl="3">
+      <w:start w:val="1"/>
+      <w:numFmt w:val="bullet"/>
+      <w:lvlText w:val=""/>
+      <w:lvlJc w:val="left"/>
+      <w:pPr>
+        <w:tabs>
+          <w:tab w:val="num" w:pos="2880"/>
+        </w:tabs>
+        <w:ind w:left="2880" w:hanging="360"/>
+      </w:pPr>
+      <w:rPr>
+        <w:rFonts w:ascii="Symbol" w:hAnsi="Symbol" w:hint="default"/>
+      </w:rPr>
+    </w:lvl>
+    <w:lvl w:ilvl="4">
+      <w:start w:val="1"/>
+      <w:numFmt w:val="bullet"/>
+      <w:lvlText w:val=""/>
+      <w:lvlJc w:val="left"/>
+      <w:pPr>
+        <w:tabs>
+          <w:tab w:val="num" w:pos="3600"/>
+        </w:tabs>
+        <w:ind w:left="3600" w:hanging="360"/>
+      </w:pPr>
+      <w:rPr>
+        <w:rFonts w:ascii="Symbol" w:hAnsi="Symbol" w:hint="default"/>
+      </w:rPr>
+    </w:lvl>
+    <w:lvl w:ilvl="5">
+      <w:start w:val="1"/>
+      <w:numFmt w:val="bullet"/>
+      <w:lvlText w:val=""/>
+      <w:lvlJc w:val="left"/>
+      <w:pPr>
+        <w:tabs>
+          <w:tab w:val="num" w:pos="4320"/>
+        </w:tabs>
+        <w:ind w:left="4320" w:hanging="360"/>
+      </w:pPr>
+      <w:rPr>
+        <w:rFonts w:ascii="Symbol" w:hAnsi="Symbol" w:hint="default"/>
+      </w:rPr>
+    </w:lvl>
+    <w:lvl w:ilvl="6">
+      <w:start w:val="1"/>
+      <w:numFmt w:val="bullet"/>
+      <w:lvlText w:val=""/>
+      <w:lvlJc w:val="left"/>
+      <w:pPr>
+        <w:tabs>
+          <w:tab w:val="num" w:pos="5040"/>
+        </w:tabs>
+        <w:ind w:left="5040" w:hanging="360"/>
+      </w:pPr>
+      <w:rPr>
+        <w:rFonts w:ascii="Symbol" w:hAnsi="Symbol" w:hint="default"/>
+      </w:rPr>
+    </w:lvl>
+    <w:lvl w:ilvl="7">
+      <w:start w:val="1"/>
+      <w:numFmt w:val="bullet"/>
+      <w:lvlText w:val=""/>
+      <w:lvlJc w:val="left"/>
+      <w:pPr>
+        <w:tabs>
+          <w:tab w:val="num" w:pos="5760"/>
+        </w:tabs>
+        <w:ind w:left="5760" w:hanging="360"/>
+      </w:pPr>
+      <w:rPr>
+        <w:rFonts w:ascii="Symbol" w:hAnsi="Symbol" w:hint="default"/>
+      </w:rPr>
+    </w:lvl>
+  </w:abstractNum>
+  <w:abstractNum w:abstractNumId="24">
     <w:lvl w:ilvl="0">
       <w:start w:val="1"/>
       <w:numFmt w:val="bullet"/>
@@ -7701,6 +8128,9 @@
   </w:num>
   <w:num w:numId="23">
     <w:abstractNumId w:val="23"/>
+  </w:num>
+  <w:num w:numId="24">
+    <w:abstractNumId w:val="24"/>
   </w:num>
 </w:numbering>
 </file>

</xml_diff>

<commit_message>
docs(cantine-connect): synchronise la galerie d'habillages regroupée en vignettes
Co-Authored-By: Claude Sonnet 5 <noreply@anthropic.com>
</commit_message>
<xml_diff>
--- a/apps/web-app/cantine-connect/docs/from-labs/livraison/manuel-utilisateur.docx
+++ b/apps/web-app/cantine-connect/docs/from-labs/livraison/manuel-utilisateur.docx
@@ -377,12 +377,12 @@
           <wp:inline distB="0" distL="0" distR="0" distT="0">
             <wp:extent cx="5715000" cy="3571875"/>
             <wp:effectExtent b="0" l="0" r="0" t="0"/>
-            <wp:docPr id="1" name="image-rHKNz1QmiaQgqa2vfbMWi.png"/>
+            <wp:docPr id="1" name="image-CWJ8571TEk43nTskXulql.png"/>
             <a:graphic>
               <a:graphicData uri="http://schemas.openxmlformats.org/drawingml/2006/picture">
                 <pic:pic>
                   <pic:nvPicPr>
-                    <pic:cNvPr id="1" name="image-rHKNz1QmiaQgqa2vfbMWi.png" descr="Écran de connexion"/>
+                    <pic:cNvPr id="1" name="image-CWJ8571TEk43nTskXulql.png" descr="Écran de connexion"/>
                     <pic:cNvPicPr/>
                   </pic:nvPicPr>
                   <pic:blipFill>
@@ -884,12 +884,12 @@
           <wp:inline distB="0" distL="0" distR="0" distT="0">
             <wp:extent cx="5715000" cy="3571875"/>
             <wp:effectExtent b="0" l="0" r="0" t="0"/>
-            <wp:docPr id="2" name="image-iJQjtRI08EVCNRKbSX9g_.png"/>
+            <wp:docPr id="2" name="image-M08gTnFwUhzLhGJsT2aLX.png"/>
             <a:graphic>
               <a:graphicData uri="http://schemas.openxmlformats.org/drawingml/2006/picture">
                 <pic:pic>
                   <pic:nvPicPr>
-                    <pic:cNvPr id="2" name="image-iJQjtRI08EVCNRKbSX9g_.png" descr="Sélecteur d'habillage"/>
+                    <pic:cNvPr id="2" name="image-M08gTnFwUhzLhGJsT2aLX.png" descr="Sélecteur d'habillage"/>
                     <pic:cNvPicPr/>
                   </pic:nvPicPr>
                   <pic:blipFill>
@@ -913,19 +913,348 @@
         </w:drawing>
       </w:r>
     </w:p>
-    <w:p>
-      <w:pPr>
-        <w:spacing w:lineRule="auto"/>
-      </w:pPr>
-      <w:r>
-        <w:rPr>
-          <w:b/>
-        </w:rPr>
-        <w:t xml:space="preserve">Premium</w:t>
-      </w:r>
-      <w:r>
-        <w:rPr/>
-        <w:t xml:space="preserve"> (par défaut) — tons orange et vert chaleureux :</w:t>
+    <w:tbl>
+      <w:tblPr>
+        <w:tblBorders>
+          <w:top w:val="single" w:sz="2" w:space="0" w:color="000000"/>
+          <w:bottom w:val="single" w:sz="2" w:space="0" w:color="000000"/>
+          <w:left w:val="single" w:sz="2" w:space="0" w:color="000000"/>
+          <w:right w:val="single" w:sz="2" w:space="0" w:color="000000"/>
+          <w:insideV w:val="single" w:sz="2" w:space="0" w:color="000000"/>
+          <w:insideH w:val="single" w:sz="2" w:space="0" w:color="000000"/>
+        </w:tblBorders>
+        <w:tblCellSpacing w:w="0" w:type="dxa"/>
+        <w:tblW w:type="dxa" w:w="10240"/>
+        <w:tblCellMar>
+          <w:top w:type="dxa" w:w="80"/>
+          <w:bottom w:type="dxa" w:w="80"/>
+          <w:left w:type="dxa" w:w="160"/>
+          <w:right w:type="dxa" w:w="160"/>
+        </w:tblCellMar>
+        <w:jc w:val="center"/>
+      </w:tblPr>
+      <w:tblGrid>
+        <w:gridCol w:w="3413.3333333333335"/>
+        <w:gridCol w:w="3413.3333333333335"/>
+        <w:gridCol w:w="3413.3333333333335"/>
+      </w:tblGrid>
+      <w:tr>
+        <w:trPr>
+          <w:cantSplit/>
+        </w:trPr>
+        <w:tc>
+          <w:tcPr>
+            <w:shd w:val="clear" w:fill="FFFFFF"/>
+            <w:tcBorders>
+              <w:top w:val="single" w:sz="8" w:space="0" w:color="000000"/>
+              <w:left w:val="single" w:sz="8" w:space="0" w:color="000000"/>
+              <w:bottom w:val="single" w:sz="8" w:space="0" w:color="000000"/>
+              <w:right w:val="single" w:sz="8" w:space="0" w:color="000000"/>
+            </w:tcBorders>
+          </w:tcPr>
+          <w:p>
+            <w:pPr>
+              <w:spacing w:lineRule="auto"/>
+            </w:pPr>
+            <w:r>
+              <w:rPr/>
+              <w:drawing>
+                <wp:inline distB="0" distL="0" distR="0" distT="0">
+                  <wp:extent cx="1809750" cy="1133475"/>
+                  <wp:effectExtent b="0" l="0" r="0" t="0"/>
+                  <wp:docPr id="4" name="image-je-uaRv3CxhMPj9f0E1H8.png"/>
+                  <a:graphic>
+                    <a:graphicData uri="http://schemas.openxmlformats.org/drawingml/2006/picture">
+                      <pic:pic>
+                        <pic:nvPicPr>
+                          <pic:cNvPr id="4" name="image-je-uaRv3CxhMPj9f0E1H8.png" descr="Habillage Premium"/>
+                          <pic:cNvPicPr/>
+                        </pic:nvPicPr>
+                        <pic:blipFill>
+                          <a:blip r:embed="rId9" cstate="print"/>
+                          <a:srcRect b="0" l="0" r="0" t="0"/>
+                          <a:stretch>
+                            <a:fillRect/>
+                          </a:stretch>
+                        </pic:blipFill>
+                        <pic:spPr>
+                          <a:xfrm>
+                            <a:off x="0" y="0"/>
+                            <a:ext cx="1809750" cy="1133475"/>
+                          </a:xfrm>
+                          <a:prstGeom prst="rect"/>
+                        </pic:spPr>
+                      </pic:pic>
+                    </a:graphicData>
+                  </a:graphic>
+                </wp:inline>
+              </w:drawing>
+            </w:r>
+          </w:p>
+          <w:p>
+            <w:pPr>
+              <w:jc w:val="left"/>
+              <w:spacing w:lineRule="auto"/>
+            </w:pPr>
+            <w:r>
+              <w:rPr/>
+              <w:br w:type="textWrapping"/>
+            </w:r>
+          </w:p>
+          <w:p>
+            <w:pPr>
+              <w:jc w:val="left"/>
+              <w:spacing w:lineRule="auto"/>
+            </w:pPr>
+            <w:r>
+              <w:rPr>
+                <w:b/>
+              </w:rPr>
+              <w:t xml:space="preserve">Premium</w:t>
+            </w:r>
+          </w:p>
+          <w:p>
+            <w:pPr>
+              <w:jc w:val="left"/>
+              <w:spacing w:lineRule="auto"/>
+            </w:pPr>
+            <w:r>
+              <w:rPr/>
+              <w:t xml:space="preserve"> (par défaut)</w:t>
+            </w:r>
+          </w:p>
+          <w:p>
+            <w:pPr>
+              <w:jc w:val="left"/>
+              <w:spacing w:lineRule="auto"/>
+            </w:pPr>
+            <w:r>
+              <w:rPr/>
+              <w:br w:type="textWrapping"/>
+            </w:r>
+          </w:p>
+          <w:p>
+            <w:pPr>
+              <w:jc w:val="left"/>
+              <w:spacing w:lineRule="auto"/>
+            </w:pPr>
+            <w:r>
+              <w:rPr/>
+              <w:t xml:space="preserve">tons orange et vert chaleureux</w:t>
+            </w:r>
+          </w:p>
+        </w:tc>
+        <w:tc>
+          <w:tcPr>
+            <w:shd w:val="clear" w:fill="FFFFFF"/>
+            <w:tcBorders>
+              <w:top w:val="single" w:sz="8" w:space="0" w:color="000000"/>
+              <w:left w:val="single" w:sz="8" w:space="0" w:color="000000"/>
+              <w:bottom w:val="single" w:sz="8" w:space="0" w:color="000000"/>
+              <w:right w:val="single" w:sz="8" w:space="0" w:color="000000"/>
+            </w:tcBorders>
+          </w:tcPr>
+          <w:p>
+            <w:pPr>
+              <w:spacing w:lineRule="auto"/>
+            </w:pPr>
+            <w:r>
+              <w:rPr/>
+              <w:drawing>
+                <wp:inline distB="0" distL="0" distR="0" distT="0">
+                  <wp:extent cx="1809750" cy="1133475"/>
+                  <wp:effectExtent b="0" l="0" r="0" t="0"/>
+                  <wp:docPr id="6" name="image-o4kL6DwaDHhsulDhsin4K.png"/>
+                  <a:graphic>
+                    <a:graphicData uri="http://schemas.openxmlformats.org/drawingml/2006/picture">
+                      <pic:pic>
+                        <pic:nvPicPr>
+                          <pic:cNvPr id="6" name="image-o4kL6DwaDHhsulDhsin4K.png" descr="Habillage Corporatif"/>
+                          <pic:cNvPicPr/>
+                        </pic:nvPicPr>
+                        <pic:blipFill>
+                          <a:blip r:embed="rId11" cstate="print"/>
+                          <a:srcRect b="0" l="0" r="0" t="0"/>
+                          <a:stretch>
+                            <a:fillRect/>
+                          </a:stretch>
+                        </pic:blipFill>
+                        <pic:spPr>
+                          <a:xfrm>
+                            <a:off x="0" y="0"/>
+                            <a:ext cx="1809750" cy="1133475"/>
+                          </a:xfrm>
+                          <a:prstGeom prst="rect"/>
+                        </pic:spPr>
+                      </pic:pic>
+                    </a:graphicData>
+                  </a:graphic>
+                </wp:inline>
+              </w:drawing>
+            </w:r>
+          </w:p>
+          <w:p>
+            <w:pPr>
+              <w:jc w:val="left"/>
+              <w:spacing w:lineRule="auto"/>
+            </w:pPr>
+            <w:r>
+              <w:rPr/>
+              <w:br w:type="textWrapping"/>
+            </w:r>
+          </w:p>
+          <w:p>
+            <w:pPr>
+              <w:jc w:val="left"/>
+              <w:spacing w:lineRule="auto"/>
+            </w:pPr>
+            <w:r>
+              <w:rPr>
+                <w:b/>
+              </w:rPr>
+              <w:t xml:space="preserve">Corporatif</w:t>
+            </w:r>
+          </w:p>
+          <w:p>
+            <w:pPr>
+              <w:jc w:val="left"/>
+              <w:spacing w:lineRule="auto"/>
+            </w:pPr>
+            <w:r>
+              <w:rPr/>
+              <w:br w:type="textWrapping"/>
+            </w:r>
+          </w:p>
+          <w:p>
+            <w:pPr>
+              <w:jc w:val="left"/>
+              <w:spacing w:lineRule="auto"/>
+            </w:pPr>
+            <w:r>
+              <w:rPr/>
+              <w:t xml:space="preserve">fond sombre, plus sobre</w:t>
+            </w:r>
+          </w:p>
+        </w:tc>
+        <w:tc>
+          <w:tcPr>
+            <w:shd w:val="clear" w:fill="FFFFFF"/>
+            <w:tcBorders>
+              <w:top w:val="single" w:sz="8" w:space="0" w:color="000000"/>
+              <w:left w:val="single" w:sz="8" w:space="0" w:color="000000"/>
+              <w:bottom w:val="single" w:sz="8" w:space="0" w:color="000000"/>
+              <w:right w:val="single" w:sz="8" w:space="0" w:color="000000"/>
+            </w:tcBorders>
+          </w:tcPr>
+          <w:p>
+            <w:pPr>
+              <w:spacing w:lineRule="auto"/>
+            </w:pPr>
+            <w:r>
+              <w:rPr/>
+              <w:drawing>
+                <wp:inline distB="0" distL="0" distR="0" distT="0">
+                  <wp:extent cx="1809750" cy="1133475"/>
+                  <wp:effectExtent b="0" l="0" r="0" t="0"/>
+                  <wp:docPr id="8" name="image-qkK-DoGa0ibUkU33CqYYv.png"/>
+                  <a:graphic>
+                    <a:graphicData uri="http://schemas.openxmlformats.org/drawingml/2006/picture">
+                      <pic:pic>
+                        <pic:nvPicPr>
+                          <pic:cNvPr id="8" name="image-qkK-DoGa0ibUkU33CqYYv.png" descr="Habillage Moderne"/>
+                          <pic:cNvPicPr/>
+                        </pic:nvPicPr>
+                        <pic:blipFill>
+                          <a:blip r:embed="rId13" cstate="print"/>
+                          <a:srcRect b="0" l="0" r="0" t="0"/>
+                          <a:stretch>
+                            <a:fillRect/>
+                          </a:stretch>
+                        </pic:blipFill>
+                        <pic:spPr>
+                          <a:xfrm>
+                            <a:off x="0" y="0"/>
+                            <a:ext cx="1809750" cy="1133475"/>
+                          </a:xfrm>
+                          <a:prstGeom prst="rect"/>
+                        </pic:spPr>
+                      </pic:pic>
+                    </a:graphicData>
+                  </a:graphic>
+                </wp:inline>
+              </w:drawing>
+            </w:r>
+          </w:p>
+          <w:p>
+            <w:pPr>
+              <w:jc w:val="left"/>
+              <w:spacing w:lineRule="auto"/>
+            </w:pPr>
+            <w:r>
+              <w:rPr/>
+              <w:br w:type="textWrapping"/>
+            </w:r>
+          </w:p>
+          <w:p>
+            <w:pPr>
+              <w:jc w:val="left"/>
+              <w:spacing w:lineRule="auto"/>
+            </w:pPr>
+            <w:r>
+              <w:rPr>
+                <w:b/>
+              </w:rPr>
+              <w:t xml:space="preserve">Moderne</w:t>
+            </w:r>
+          </w:p>
+          <w:p>
+            <w:pPr>
+              <w:jc w:val="left"/>
+              <w:spacing w:lineRule="auto"/>
+            </w:pPr>
+            <w:r>
+              <w:rPr/>
+              <w:br w:type="textWrapping"/>
+            </w:r>
+          </w:p>
+          <w:p>
+            <w:pPr>
+              <w:jc w:val="left"/>
+              <w:spacing w:lineRule="auto"/>
+            </w:pPr>
+            <w:r>
+              <w:rPr/>
+              <w:t xml:space="preserve">fond blanc, dégradés bleu/orange</w:t>
+            </w:r>
+          </w:p>
+        </w:tc>
+      </w:tr>
+    </w:tbl>
+    <w:p>
+      <w:pPr>
+        <w:spacing w:lineRule="auto"/>
+      </w:pPr>
+      <w:r>
+        <w:rPr/>
+      </w:r>
+    </w:p>
+    <w:p>
+      <w:pPr>
+        <w:pStyle w:val="Heading2"/>
+        <w:spacing w:lineRule="auto"/>
+      </w:pPr>
+      <w:r>
+        <w:rPr/>
+        <w:t xml:space="preserve">3. Demande d'accès parent (sans avoir besoin d'un compte)</w:t>
+      </w:r>
+    </w:p>
+    <w:p>
+      <w:pPr>
+        <w:spacing w:lineRule="auto"/>
+      </w:pPr>
+      <w:r>
+        <w:rPr/>
+        <w:t xml:space="preserve">Un parent qui n'a pas encore de compte peut faire une demande depuis la page « Demande d'accès », accessible depuis la page d'accueil ou l'écran de connexion. C'est un formulaire simple en trois petites étapes, avec une barre de progression en haut pour savoir où on en est :</w:t>
       </w:r>
     </w:p>
     <w:p>
@@ -938,16 +1267,16 @@
           <wp:inline distB="0" distL="0" distR="0" distT="0">
             <wp:extent cx="5715000" cy="3571875"/>
             <wp:effectExtent b="0" l="0" r="0" t="0"/>
-            <wp:docPr id="3" name="image-HoGd_kCsPWYgK4WhBXp5J.png"/>
+            <wp:docPr id="9" name="image-DQQCRn0gq56wDue2uuvh8.png"/>
             <a:graphic>
               <a:graphicData uri="http://schemas.openxmlformats.org/drawingml/2006/picture">
                 <pic:pic>
                   <pic:nvPicPr>
-                    <pic:cNvPr id="3" name="image-HoGd_kCsPWYgK4WhBXp5J.png" descr="Habillage Premium"/>
+                    <pic:cNvPr id="9" name="image-DQQCRn0gq56wDue2uuvh8.png" descr="Demande d'accès — étape 1 : identité"/>
                     <pic:cNvPicPr/>
                   </pic:nvPicPr>
                   <pic:blipFill>
-                    <a:blip r:embed="rId8" cstate="print"/>
+                    <a:blip r:embed="rId14" cstate="print"/>
                     <a:srcRect b="0" l="0" r="0" t="0"/>
                     <a:stretch>
                       <a:fillRect/>
@@ -969,17 +1298,21 @@
     </w:p>
     <w:p>
       <w:pPr>
+        <w:numPr>
+          <w:ilvl w:val="0"/>
+          <w:numId w:val="3"/>
+        </w:numPr>
         <w:spacing w:lineRule="auto"/>
       </w:pPr>
       <w:r>
         <w:rPr>
           <w:b/>
         </w:rPr>
-        <w:t xml:space="preserve">Corporatif</w:t>
-      </w:r>
-      <w:r>
-        <w:rPr/>
-        <w:t xml:space="preserve"> — fond sombre, plus sobre :</w:t>
+        <w:t xml:space="preserve">Identité</w:t>
+      </w:r>
+      <w:r>
+        <w:rPr/>
+        <w:t xml:space="preserve"> : nom, prénom, fonction (facultatif — par exemple « Maman », « Tuteur »).</w:t>
       </w:r>
     </w:p>
     <w:p>
@@ -992,16 +1325,16 @@
           <wp:inline distB="0" distL="0" distR="0" distT="0">
             <wp:extent cx="5715000" cy="3571875"/>
             <wp:effectExtent b="0" l="0" r="0" t="0"/>
-            <wp:docPr id="4" name="image-9Ea8n9QaVFxwGj5adsx8-.png"/>
+            <wp:docPr id="10" name="image-dzK0E7UMweHXiyl14Fodn.png"/>
             <a:graphic>
               <a:graphicData uri="http://schemas.openxmlformats.org/drawingml/2006/picture">
                 <pic:pic>
                   <pic:nvPicPr>
-                    <pic:cNvPr id="4" name="image-9Ea8n9QaVFxwGj5adsx8-.png" descr="Habillage Corporatif"/>
+                    <pic:cNvPr id="10" name="image-dzK0E7UMweHXiyl14Fodn.png" descr="Demande d'accès — étape 2 : contact"/>
                     <pic:cNvPicPr/>
                   </pic:nvPicPr>
                   <pic:blipFill>
-                    <a:blip r:embed="rId9" cstate="print"/>
+                    <a:blip r:embed="rId15" cstate="print"/>
                     <a:srcRect b="0" l="0" r="0" t="0"/>
                     <a:stretch>
                       <a:fillRect/>
@@ -1023,17 +1356,21 @@
     </w:p>
     <w:p>
       <w:pPr>
+        <w:numPr>
+          <w:ilvl w:val="0"/>
+          <w:numId w:val="4"/>
+        </w:numPr>
         <w:spacing w:lineRule="auto"/>
       </w:pPr>
       <w:r>
         <w:rPr>
           <w:b/>
         </w:rPr>
-        <w:t xml:space="preserve">Moderne</w:t>
-      </w:r>
-      <w:r>
-        <w:rPr/>
-        <w:t xml:space="preserve"> — fond blanc, dégradés bleu/orange :</w:t>
+        <w:t xml:space="preserve">Contact</w:t>
+      </w:r>
+      <w:r>
+        <w:rPr/>
+        <w:t xml:space="preserve"> : numéro de téléphone principal (obligatoire), case à cocher « Ce numéro est aussi mon WhatsApp » (sinon un second numéro WhatsApp peut être saisi), second numéro de téléphone (facultatif), email (facultatif). Un message rappelle qu'une notification sera envoyée par SMS et invite à bien vérifier le numéro saisi.</w:t>
       </w:r>
     </w:p>
     <w:p>
@@ -1046,16 +1383,16 @@
           <wp:inline distB="0" distL="0" distR="0" distT="0">
             <wp:extent cx="5715000" cy="3571875"/>
             <wp:effectExtent b="0" l="0" r="0" t="0"/>
-            <wp:docPr id="5" name="image-XWg_vDT57CM3NVrjq_zI-.png"/>
+            <wp:docPr id="11" name="image-nW6CcYscTGDFD2-lCv1UR.png"/>
             <a:graphic>
               <a:graphicData uri="http://schemas.openxmlformats.org/drawingml/2006/picture">
                 <pic:pic>
                   <pic:nvPicPr>
-                    <pic:cNvPr id="5" name="image-XWg_vDT57CM3NVrjq_zI-.png" descr="Habillage Moderne"/>
+                    <pic:cNvPr id="11" name="image-nW6CcYscTGDFD2-lCv1UR.png" descr="Demande d'accès — étape 3 : résidence"/>
                     <pic:cNvPicPr/>
                   </pic:nvPicPr>
                   <pic:blipFill>
-                    <a:blip r:embed="rId10" cstate="print"/>
+                    <a:blip r:embed="rId16" cstate="print"/>
                     <a:srcRect b="0" l="0" r="0" t="0"/>
                     <a:stretch>
                       <a:fillRect/>
@@ -1077,21 +1414,55 @@
     </w:p>
     <w:p>
       <w:pPr>
-        <w:pStyle w:val="Heading2"/>
-        <w:spacing w:lineRule="auto"/>
-      </w:pPr>
-      <w:r>
-        <w:rPr/>
-        <w:t xml:space="preserve">3. Demande d'accès parent (sans avoir besoin d'un compte)</w:t>
-      </w:r>
-    </w:p>
-    <w:p>
-      <w:pPr>
-        <w:spacing w:lineRule="auto"/>
-      </w:pPr>
-      <w:r>
-        <w:rPr/>
-        <w:t xml:space="preserve">Un parent qui n'a pas encore de compte peut faire une demande depuis la page « Demande d'accès », accessible depuis la page d'accueil ou l'écran de connexion. C'est un formulaire simple en trois petites étapes, avec une barre de progression en haut pour savoir où on en est :</w:t>
+        <w:numPr>
+          <w:ilvl w:val="0"/>
+          <w:numId w:val="5"/>
+        </w:numPr>
+        <w:spacing w:lineRule="auto"/>
+      </w:pPr>
+      <w:r>
+        <w:rPr>
+          <w:b/>
+        </w:rPr>
+        <w:t xml:space="preserve">Résidence</w:t>
+      </w:r>
+      <w:r>
+        <w:rPr/>
+        <w:t xml:space="preserve"> : ville, commune (obligatoires), quartier (facultatif).</w:t>
+      </w:r>
+    </w:p>
+    <w:p>
+      <w:pPr>
+        <w:spacing w:lineRule="auto"/>
+      </w:pPr>
+      <w:r>
+        <w:rPr/>
+        <w:t xml:space="preserve">Le numéro principal, le numéro WhatsApp et le second numéro doivent être au format ivoirien (10 chiffres commençant par 0, par exemple </w:t>
+      </w:r>
+      <w:r>
+        <w:rPr/>
+        <w:t xml:space="preserve">07 08 09 10 11</w:t>
+      </w:r>
+      <w:r>
+        <w:rPr/>
+        <w:t xml:space="preserve">, avec l'indicatif </w:t>
+      </w:r>
+      <w:r>
+        <w:rPr/>
+        <w:t xml:space="preserve">+225</w:t>
+      </w:r>
+      <w:r>
+        <w:rPr/>
+        <w:t xml:space="preserve"> en option) ; l'email, s'il est renseigné, doit être une adresse valide. Ce contrôle est fait à la fois dans le formulaire et vérifié une seconde fois par le système, pour éviter toute erreur de saisie.</w:t>
+      </w:r>
+    </w:p>
+    <w:p>
+      <w:pPr>
+        <w:spacing w:lineRule="auto"/>
+      </w:pPr>
+      <w:r>
+        <w:rPr/>
+        <w:t xml:space="preserve">Une fois les trois étapes remplies, un bouton « Envoyer ma demande » termine le processus et un écran de confirmation s'affiche :</w:t>
       </w:r>
     </w:p>
     <w:p>
@@ -1104,224 +1475,16 @@
           <wp:inline distB="0" distL="0" distR="0" distT="0">
             <wp:extent cx="5715000" cy="3571875"/>
             <wp:effectExtent b="0" l="0" r="0" t="0"/>
-            <wp:docPr id="6" name="image--KXmc1XlGqiGSEoB6SRWh.png"/>
+            <wp:docPr id="12" name="image-BPY9p3EdbLynou1MTNEPp.png"/>
             <a:graphic>
               <a:graphicData uri="http://schemas.openxmlformats.org/drawingml/2006/picture">
                 <pic:pic>
                   <pic:nvPicPr>
-                    <pic:cNvPr id="6" name="image--KXmc1XlGqiGSEoB6SRWh.png" descr="Demande d'accès — étape 1 : identité"/>
+                    <pic:cNvPr id="12" name="image-BPY9p3EdbLynou1MTNEPp.png" descr="Demande d'accès — confirmation"/>
                     <pic:cNvPicPr/>
                   </pic:nvPicPr>
                   <pic:blipFill>
-                    <a:blip r:embed="rId11" cstate="print"/>
-                    <a:srcRect b="0" l="0" r="0" t="0"/>
-                    <a:stretch>
-                      <a:fillRect/>
-                    </a:stretch>
-                  </pic:blipFill>
-                  <pic:spPr>
-                    <a:xfrm>
-                      <a:off x="0" y="0"/>
-                      <a:ext cx="5715000" cy="3571875"/>
-                    </a:xfrm>
-                    <a:prstGeom prst="rect"/>
-                  </pic:spPr>
-                </pic:pic>
-              </a:graphicData>
-            </a:graphic>
-          </wp:inline>
-        </w:drawing>
-      </w:r>
-    </w:p>
-    <w:p>
-      <w:pPr>
-        <w:numPr>
-          <w:ilvl w:val="0"/>
-          <w:numId w:val="3"/>
-        </w:numPr>
-        <w:spacing w:lineRule="auto"/>
-      </w:pPr>
-      <w:r>
-        <w:rPr>
-          <w:b/>
-        </w:rPr>
-        <w:t xml:space="preserve">Identité</w:t>
-      </w:r>
-      <w:r>
-        <w:rPr/>
-        <w:t xml:space="preserve"> : nom, prénom, fonction (facultatif — par exemple « Maman », « Tuteur »).</w:t>
-      </w:r>
-    </w:p>
-    <w:p>
-      <w:pPr>
-        <w:spacing w:lineRule="auto"/>
-      </w:pPr>
-      <w:r>
-        <w:rPr/>
-        <w:drawing>
-          <wp:inline distB="0" distL="0" distR="0" distT="0">
-            <wp:extent cx="5715000" cy="3571875"/>
-            <wp:effectExtent b="0" l="0" r="0" t="0"/>
-            <wp:docPr id="7" name="image-McfeYE97C5HLzpofZKZA-.png"/>
-            <a:graphic>
-              <a:graphicData uri="http://schemas.openxmlformats.org/drawingml/2006/picture">
-                <pic:pic>
-                  <pic:nvPicPr>
-                    <pic:cNvPr id="7" name="image-McfeYE97C5HLzpofZKZA-.png" descr="Demande d'accès — étape 2 : contact"/>
-                    <pic:cNvPicPr/>
-                  </pic:nvPicPr>
-                  <pic:blipFill>
-                    <a:blip r:embed="rId12" cstate="print"/>
-                    <a:srcRect b="0" l="0" r="0" t="0"/>
-                    <a:stretch>
-                      <a:fillRect/>
-                    </a:stretch>
-                  </pic:blipFill>
-                  <pic:spPr>
-                    <a:xfrm>
-                      <a:off x="0" y="0"/>
-                      <a:ext cx="5715000" cy="3571875"/>
-                    </a:xfrm>
-                    <a:prstGeom prst="rect"/>
-                  </pic:spPr>
-                </pic:pic>
-              </a:graphicData>
-            </a:graphic>
-          </wp:inline>
-        </w:drawing>
-      </w:r>
-    </w:p>
-    <w:p>
-      <w:pPr>
-        <w:numPr>
-          <w:ilvl w:val="0"/>
-          <w:numId w:val="4"/>
-        </w:numPr>
-        <w:spacing w:lineRule="auto"/>
-      </w:pPr>
-      <w:r>
-        <w:rPr>
-          <w:b/>
-        </w:rPr>
-        <w:t xml:space="preserve">Contact</w:t>
-      </w:r>
-      <w:r>
-        <w:rPr/>
-        <w:t xml:space="preserve"> : numéro de téléphone principal (obligatoire), case à cocher « Ce numéro est aussi mon WhatsApp » (sinon un second numéro WhatsApp peut être saisi), second numéro de téléphone (facultatif), email (facultatif). Un message rappelle qu'une notification sera envoyée par SMS et invite à bien vérifier le numéro saisi.</w:t>
-      </w:r>
-    </w:p>
-    <w:p>
-      <w:pPr>
-        <w:spacing w:lineRule="auto"/>
-      </w:pPr>
-      <w:r>
-        <w:rPr/>
-        <w:drawing>
-          <wp:inline distB="0" distL="0" distR="0" distT="0">
-            <wp:extent cx="5715000" cy="3571875"/>
-            <wp:effectExtent b="0" l="0" r="0" t="0"/>
-            <wp:docPr id="8" name="image-pmMDYhP-3eruOaDu0o-MA.png"/>
-            <a:graphic>
-              <a:graphicData uri="http://schemas.openxmlformats.org/drawingml/2006/picture">
-                <pic:pic>
-                  <pic:nvPicPr>
-                    <pic:cNvPr id="8" name="image-pmMDYhP-3eruOaDu0o-MA.png" descr="Demande d'accès — étape 3 : résidence"/>
-                    <pic:cNvPicPr/>
-                  </pic:nvPicPr>
-                  <pic:blipFill>
-                    <a:blip r:embed="rId13" cstate="print"/>
-                    <a:srcRect b="0" l="0" r="0" t="0"/>
-                    <a:stretch>
-                      <a:fillRect/>
-                    </a:stretch>
-                  </pic:blipFill>
-                  <pic:spPr>
-                    <a:xfrm>
-                      <a:off x="0" y="0"/>
-                      <a:ext cx="5715000" cy="3571875"/>
-                    </a:xfrm>
-                    <a:prstGeom prst="rect"/>
-                  </pic:spPr>
-                </pic:pic>
-              </a:graphicData>
-            </a:graphic>
-          </wp:inline>
-        </w:drawing>
-      </w:r>
-    </w:p>
-    <w:p>
-      <w:pPr>
-        <w:numPr>
-          <w:ilvl w:val="0"/>
-          <w:numId w:val="5"/>
-        </w:numPr>
-        <w:spacing w:lineRule="auto"/>
-      </w:pPr>
-      <w:r>
-        <w:rPr>
-          <w:b/>
-        </w:rPr>
-        <w:t xml:space="preserve">Résidence</w:t>
-      </w:r>
-      <w:r>
-        <w:rPr/>
-        <w:t xml:space="preserve"> : ville, commune (obligatoires), quartier (facultatif).</w:t>
-      </w:r>
-    </w:p>
-    <w:p>
-      <w:pPr>
-        <w:spacing w:lineRule="auto"/>
-      </w:pPr>
-      <w:r>
-        <w:rPr/>
-        <w:t xml:space="preserve">Le numéro principal, le numéro WhatsApp et le second numéro doivent être au format ivoirien (10 chiffres commençant par 0, par exemple </w:t>
-      </w:r>
-      <w:r>
-        <w:rPr/>
-        <w:t xml:space="preserve">07 08 09 10 11</w:t>
-      </w:r>
-      <w:r>
-        <w:rPr/>
-        <w:t xml:space="preserve">, avec l'indicatif </w:t>
-      </w:r>
-      <w:r>
-        <w:rPr/>
-        <w:t xml:space="preserve">+225</w:t>
-      </w:r>
-      <w:r>
-        <w:rPr/>
-        <w:t xml:space="preserve"> en option) ; l'email, s'il est renseigné, doit être une adresse valide. Ce contrôle est fait à la fois dans le formulaire et vérifié une seconde fois par le système, pour éviter toute erreur de saisie.</w:t>
-      </w:r>
-    </w:p>
-    <w:p>
-      <w:pPr>
-        <w:spacing w:lineRule="auto"/>
-      </w:pPr>
-      <w:r>
-        <w:rPr/>
-        <w:t xml:space="preserve">Une fois les trois étapes remplies, un bouton « Envoyer ma demande » termine le processus et un écran de confirmation s'affiche :</w:t>
-      </w:r>
-    </w:p>
-    <w:p>
-      <w:pPr>
-        <w:spacing w:lineRule="auto"/>
-      </w:pPr>
-      <w:r>
-        <w:rPr/>
-        <w:drawing>
-          <wp:inline distB="0" distL="0" distR="0" distT="0">
-            <wp:extent cx="5715000" cy="3571875"/>
-            <wp:effectExtent b="0" l="0" r="0" t="0"/>
-            <wp:docPr id="9" name="image-URnP64w6LoCXoutWUz8di.png"/>
-            <a:graphic>
-              <a:graphicData uri="http://schemas.openxmlformats.org/drawingml/2006/picture">
-                <pic:pic>
-                  <pic:nvPicPr>
-                    <pic:cNvPr id="9" name="image-URnP64w6LoCXoutWUz8di.png" descr="Demande d'accès — confirmation"/>
-                    <pic:cNvPicPr/>
-                  </pic:nvPicPr>
-                  <pic:blipFill>
-                    <a:blip r:embed="rId14" cstate="print"/>
+                    <a:blip r:embed="rId17" cstate="print"/>
                     <a:srcRect b="0" l="0" r="0" t="0"/>
                     <a:stretch>
                       <a:fillRect/>
@@ -3056,336 +3219,12 @@
           <wp:inline distB="0" distL="0" distR="0" distT="0">
             <wp:extent cx="5715000" cy="3571875"/>
             <wp:effectExtent b="0" l="0" r="0" t="0"/>
-            <wp:docPr id="10" name="image-W-N9ROW2_ixxBNcINizn1.png"/>
+            <wp:docPr id="13" name="image-U9NhyI_iYtHXxhpiVv583.png"/>
             <a:graphic>
               <a:graphicData uri="http://schemas.openxmlformats.org/drawingml/2006/picture">
                 <pic:pic>
                   <pic:nvPicPr>
-                    <pic:cNvPr id="10" name="image-W-N9ROW2_ixxBNcINizn1.png" descr="Tableau de bord"/>
-                    <pic:cNvPicPr/>
-                  </pic:nvPicPr>
-                  <pic:blipFill>
-                    <a:blip r:embed="rId15" cstate="print"/>
-                    <a:srcRect b="0" l="0" r="0" t="0"/>
-                    <a:stretch>
-                      <a:fillRect/>
-                    </a:stretch>
-                  </pic:blipFill>
-                  <pic:spPr>
-                    <a:xfrm>
-                      <a:off x="0" y="0"/>
-                      <a:ext cx="5715000" cy="3571875"/>
-                    </a:xfrm>
-                    <a:prstGeom prst="rect"/>
-                  </pic:spPr>
-                </pic:pic>
-              </a:graphicData>
-            </a:graphic>
-          </wp:inline>
-        </w:drawing>
-      </w:r>
-    </w:p>
-    <w:p>
-      <w:pPr>
-        <w:spacing w:lineRule="auto"/>
-      </w:pPr>
-      <w:r>
-        <w:rPr/>
-        <w:t xml:space="preserve">Vue d'ensemble à l'ouverture de l'application : nombre d'élèves, répartition par statut d'accès, paiements récents, résumé des passages du jour.</w:t>
-      </w:r>
-    </w:p>
-    <w:p>
-      <w:pPr>
-        <w:numPr>
-          <w:ilvl w:val="0"/>
-          <w:numId w:val="6"/>
-        </w:numPr>
-        <w:spacing w:lineRule="auto"/>
-      </w:pPr>
-      <w:r>
-        <w:rPr>
-          <w:b/>
-        </w:rPr>
-        <w:t xml:space="preserve">Administrateur / gestionnaire / caissier</w:t>
-      </w:r>
-      <w:r>
-        <w:rPr/>
-        <w:t xml:space="preserve"> : les chiffres portent sur l'ensemble des élèves.</w:t>
-      </w:r>
-    </w:p>
-    <w:p>
-      <w:pPr>
-        <w:numPr>
-          <w:ilvl w:val="0"/>
-          <w:numId w:val="6"/>
-        </w:numPr>
-        <w:spacing w:lineRule="auto"/>
-      </w:pPr>
-      <w:r>
-        <w:rPr>
-          <w:b/>
-        </w:rPr>
-        <w:t xml:space="preserve">Parent</w:t>
-      </w:r>
-      <w:r>
-        <w:rPr/>
-        <w:t xml:space="preserve"> : les mêmes indicateurs (établissements, élèves, statuts, passages, paiements) portent uniquement sur </w:t>
-      </w:r>
-      <w:r>
-        <w:rPr>
-          <w:b/>
-        </w:rPr>
-        <w:t xml:space="preserve">ses propres enfants</w:t>
-      </w:r>
-      <w:r>
-        <w:rPr/>
-        <w:t xml:space="preserve"> — un parent d'un seul enfant verra par exemple « 1 élève », pas le total de l'établissement. Un parent qui n'a encore aucun enfant rattaché voit des indicateurs à zéro.</w:t>
-      </w:r>
-    </w:p>
-    <w:p>
-      <w:pPr>
-        <w:pStyle w:val="Heading2"/>
-        <w:spacing w:lineRule="auto"/>
-      </w:pPr>
-      <w:r>
-        <w:rPr/>
-        <w:t xml:space="preserve">6. Établissements (administrateur / gestionnaire / caissier)</w:t>
-      </w:r>
-    </w:p>
-    <w:p>
-      <w:pPr>
-        <w:spacing w:lineRule="auto"/>
-      </w:pPr>
-      <w:r>
-        <w:rPr/>
-        <w:drawing>
-          <wp:inline distB="0" distL="0" distR="0" distT="0">
-            <wp:extent cx="5715000" cy="3571875"/>
-            <wp:effectExtent b="0" l="0" r="0" t="0"/>
-            <wp:docPr id="11" name="image-VmWQ2GHCncWpxVLIzVO3q.png"/>
-            <a:graphic>
-              <a:graphicData uri="http://schemas.openxmlformats.org/drawingml/2006/picture">
-                <pic:pic>
-                  <pic:nvPicPr>
-                    <pic:cNvPr id="11" name="image-VmWQ2GHCncWpxVLIzVO3q.png" descr="Liste des établissements"/>
-                    <pic:cNvPicPr/>
-                  </pic:nvPicPr>
-                  <pic:blipFill>
-                    <a:blip r:embed="rId16" cstate="print"/>
-                    <a:srcRect b="0" l="0" r="0" t="0"/>
-                    <a:stretch>
-                      <a:fillRect/>
-                    </a:stretch>
-                  </pic:blipFill>
-                  <pic:spPr>
-                    <a:xfrm>
-                      <a:off x="0" y="0"/>
-                      <a:ext cx="5715000" cy="3571875"/>
-                    </a:xfrm>
-                    <a:prstGeom prst="rect"/>
-                  </pic:spPr>
-                </pic:pic>
-              </a:graphicData>
-            </a:graphic>
-          </wp:inline>
-        </w:drawing>
-      </w:r>
-    </w:p>
-    <w:p>
-      <w:pPr>
-        <w:numPr>
-          <w:ilvl w:val="0"/>
-          <w:numId w:val="7"/>
-        </w:numPr>
-        <w:spacing w:lineRule="auto"/>
-      </w:pPr>
-      <w:r>
-        <w:rPr/>
-        <w:t xml:space="preserve">Liste des établissements actifs. La création d'un nouvel établissement est réservée à l'administrateur ; la modification et la suppression (logique, sans perte de données) sont possibles pour le personnel autorisé.</w:t>
-      </w:r>
-    </w:p>
-    <w:p>
-      <w:pPr>
-        <w:numPr>
-          <w:ilvl w:val="0"/>
-          <w:numId w:val="7"/>
-        </w:numPr>
-        <w:spacing w:lineRule="auto"/>
-      </w:pPr>
-      <w:r>
-        <w:rPr/>
-        <w:t xml:space="preserve">Un outil « Gérer la structure » permet de créer plusieurs niveaux et classes d'un coup (par exemple taper </w:t>
-      </w:r>
-      <w:r>
-        <w:rPr/>
-        <w:t xml:space="preserve">CP, CE1, CM1</w:t>
-      </w:r>
-      <w:r>
-        <w:rPr/>
-        <w:t xml:space="preserve"> crée les trois niveaux en une seule fois), et de les modifier directement dans le tableau.</w:t>
-      </w:r>
-    </w:p>
-    <w:p>
-      <w:pPr>
-        <w:numPr>
-          <w:ilvl w:val="0"/>
-          <w:numId w:val="7"/>
-        </w:numPr>
-        <w:spacing w:lineRule="auto"/>
-      </w:pPr>
-      <w:r>
-        <w:rPr>
-          <w:b/>
-        </w:rPr>
-        <w:t xml:space="preserve">Délai de grâce</w:t>
-      </w:r>
-      <w:r>
-        <w:rPr/>
-        <w:t xml:space="preserve"> : un champ optionnel permet de définir, pour cet établissement uniquement, un délai différent du délai par défaut (7 jours, réglable dans les Paramètres, §16). Laisser le champ vide pour garder le délai par défaut.</w:t>
-      </w:r>
-    </w:p>
-    <w:p>
-      <w:pPr>
-        <w:numPr>
-          <w:ilvl w:val="0"/>
-          <w:numId w:val="7"/>
-        </w:numPr>
-        <w:spacing w:lineRule="auto"/>
-      </w:pPr>
-      <w:r>
-        <w:rPr/>
-        <w:t xml:space="preserve">Ce menu n'est pas accessible directement à un parent, mais la liste des établissements et des classes lui reste visible pour pouvoir choisir la bonne classe quand il ajoute un enfant (§8) — la création ou la modification restent réservées au personnel.</w:t>
-      </w:r>
-    </w:p>
-    <w:p>
-      <w:pPr>
-        <w:pStyle w:val="Heading2"/>
-        <w:spacing w:lineRule="auto"/>
-      </w:pPr>
-      <w:r>
-        <w:rPr/>
-        <w:t xml:space="preserve">7. Élèves (administrateur / gestionnaire / caissier)</w:t>
-      </w:r>
-    </w:p>
-    <w:p>
-      <w:pPr>
-        <w:spacing w:lineRule="auto"/>
-      </w:pPr>
-      <w:r>
-        <w:rPr/>
-        <w:drawing>
-          <wp:inline distB="0" distL="0" distR="0" distT="0">
-            <wp:extent cx="5715000" cy="3571875"/>
-            <wp:effectExtent b="0" l="0" r="0" t="0"/>
-            <wp:docPr id="12" name="image-4uwomeo85zPK7zb5vE4Wu.png"/>
-            <a:graphic>
-              <a:graphicData uri="http://schemas.openxmlformats.org/drawingml/2006/picture">
-                <pic:pic>
-                  <pic:nvPicPr>
-                    <pic:cNvPr id="12" name="image-4uwomeo85zPK7zb5vE4Wu.png" descr="Liste des élèves"/>
-                    <pic:cNvPicPr/>
-                  </pic:nvPicPr>
-                  <pic:blipFill>
-                    <a:blip r:embed="rId17" cstate="print"/>
-                    <a:srcRect b="0" l="0" r="0" t="0"/>
-                    <a:stretch>
-                      <a:fillRect/>
-                    </a:stretch>
-                  </pic:blipFill>
-                  <pic:spPr>
-                    <a:xfrm>
-                      <a:off x="0" y="0"/>
-                      <a:ext cx="5715000" cy="3571875"/>
-                    </a:xfrm>
-                    <a:prstGeom prst="rect"/>
-                  </pic:spPr>
-                </pic:pic>
-              </a:graphicData>
-            </a:graphic>
-          </wp:inline>
-        </w:drawing>
-      </w:r>
-    </w:p>
-    <w:p>
-      <w:pPr>
-        <w:numPr>
-          <w:ilvl w:val="0"/>
-          <w:numId w:val="8"/>
-        </w:numPr>
-        <w:spacing w:lineRule="auto"/>
-      </w:pPr>
-      <w:r>
-        <w:rPr/>
-        <w:t xml:space="preserve">Liste des élèves avec pagination (reste rapide même avec un grand nombre d'élèves).</w:t>
-      </w:r>
-    </w:p>
-    <w:p>
-      <w:pPr>
-        <w:numPr>
-          <w:ilvl w:val="0"/>
-          <w:numId w:val="8"/>
-        </w:numPr>
-        <w:spacing w:lineRule="auto"/>
-      </w:pPr>
-      <w:r>
-        <w:rPr>
-          <w:b/>
-        </w:rPr>
-        <w:t xml:space="preserve">Recherche</w:t>
-      </w:r>
-      <w:r>
-        <w:rPr/>
-        <w:t xml:space="preserve"> par nom, prénom ou matricule ; filtres par établissement et par statut d'accès.</w:t>
-      </w:r>
-    </w:p>
-    <w:p>
-      <w:pPr>
-        <w:numPr>
-          <w:ilvl w:val="0"/>
-          <w:numId w:val="8"/>
-        </w:numPr>
-        <w:spacing w:lineRule="auto"/>
-      </w:pPr>
-      <w:r>
-        <w:rPr>
-          <w:b/>
-        </w:rPr>
-        <w:t xml:space="preserve">Export</w:t>
-      </w:r>
-      <w:r>
-        <w:rPr/>
-        <w:t xml:space="preserve"> de la liste affichée au format tableau (CSV), via le bouton dédié.</w:t>
-      </w:r>
-    </w:p>
-    <w:p>
-      <w:pPr>
-        <w:numPr>
-          <w:ilvl w:val="0"/>
-          <w:numId w:val="8"/>
-        </w:numPr>
-        <w:spacing w:lineRule="auto"/>
-      </w:pPr>
-      <w:r>
-        <w:rPr/>
-        <w:t xml:space="preserve">La création ou la modification d'un élève se fait dans un formulaire en 3 étapes, pour rester clair et tenir sur un seul écran :</w:t>
-      </w:r>
-    </w:p>
-    <w:p>
-      <w:pPr>
-        <w:spacing w:lineRule="auto"/>
-      </w:pPr>
-      <w:r>
-        <w:rPr/>
-        <w:drawing>
-          <wp:inline distB="0" distL="0" distR="0" distT="0">
-            <wp:extent cx="5715000" cy="3571875"/>
-            <wp:effectExtent b="0" l="0" r="0" t="0"/>
-            <wp:docPr id="13" name="image-Wp96GOV_CGuqPJDOxaBzK.png"/>
-            <a:graphic>
-              <a:graphicData uri="http://schemas.openxmlformats.org/drawingml/2006/picture">
-                <pic:pic>
-                  <pic:nvPicPr>
-                    <pic:cNvPr id="13" name="image-Wp96GOV_CGuqPJDOxaBzK.png" descr="Fiche élève — Informations générales"/>
+                    <pic:cNvPr id="13" name="image-U9NhyI_iYtHXxhpiVv583.png" descr="Tableau de bord"/>
                     <pic:cNvPicPr/>
                   </pic:nvPicPr>
                   <pic:blipFill>
@@ -3408,18 +3247,90 @@
           </wp:inline>
         </w:drawing>
       </w:r>
+    </w:p>
+    <w:p>
+      <w:pPr>
+        <w:spacing w:lineRule="auto"/>
+      </w:pPr>
+      <w:r>
+        <w:rPr/>
+        <w:t xml:space="preserve">Vue d'ensemble à l'ouverture de l'application : nombre d'élèves, répartition par statut d'accès, paiements récents, résumé des passages du jour.</w:t>
+      </w:r>
+    </w:p>
+    <w:p>
+      <w:pPr>
+        <w:numPr>
+          <w:ilvl w:val="0"/>
+          <w:numId w:val="6"/>
+        </w:numPr>
+        <w:spacing w:lineRule="auto"/>
+      </w:pPr>
+      <w:r>
+        <w:rPr>
+          <w:b/>
+        </w:rPr>
+        <w:t xml:space="preserve">Administrateur / gestionnaire / caissier</w:t>
+      </w:r>
+      <w:r>
+        <w:rPr/>
+        <w:t xml:space="preserve"> : les chiffres portent sur l'ensemble des élèves.</w:t>
+      </w:r>
+    </w:p>
+    <w:p>
+      <w:pPr>
+        <w:numPr>
+          <w:ilvl w:val="0"/>
+          <w:numId w:val="6"/>
+        </w:numPr>
+        <w:spacing w:lineRule="auto"/>
+      </w:pPr>
+      <w:r>
+        <w:rPr>
+          <w:b/>
+        </w:rPr>
+        <w:t xml:space="preserve">Parent</w:t>
+      </w:r>
+      <w:r>
+        <w:rPr/>
+        <w:t xml:space="preserve"> : les mêmes indicateurs (établissements, élèves, statuts, passages, paiements) portent uniquement sur </w:t>
+      </w:r>
+      <w:r>
+        <w:rPr>
+          <w:b/>
+        </w:rPr>
+        <w:t xml:space="preserve">ses propres enfants</w:t>
+      </w:r>
+      <w:r>
+        <w:rPr/>
+        <w:t xml:space="preserve"> — un parent d'un seul enfant verra par exemple « 1 élève », pas le total de l'établissement. Un parent qui n'a encore aucun enfant rattaché voit des indicateurs à zéro.</w:t>
+      </w:r>
+    </w:p>
+    <w:p>
+      <w:pPr>
+        <w:pStyle w:val="Heading2"/>
+        <w:spacing w:lineRule="auto"/>
+      </w:pPr>
+      <w:r>
+        <w:rPr/>
+        <w:t xml:space="preserve">6. Établissements (administrateur / gestionnaire / caissier)</w:t>
+      </w:r>
+    </w:p>
+    <w:p>
+      <w:pPr>
+        <w:spacing w:lineRule="auto"/>
+      </w:pPr>
       <w:r>
         <w:rPr/>
         <w:drawing>
           <wp:inline distB="0" distL="0" distR="0" distT="0">
             <wp:extent cx="5715000" cy="3571875"/>
             <wp:effectExtent b="0" l="0" r="0" t="0"/>
-            <wp:docPr id="14" name="image-1rxQGLwof5_IyL10zb9rb.png"/>
+            <wp:docPr id="14" name="image-E3lJ3fdYCp5-YJBZ4324e.png"/>
             <a:graphic>
               <a:graphicData uri="http://schemas.openxmlformats.org/drawingml/2006/picture">
                 <pic:pic>
                   <pic:nvPicPr>
-                    <pic:cNvPr id="14" name="image-1rxQGLwof5_IyL10zb9rb.png" descr="Fiche élève — Cantine et affectation"/>
+                    <pic:cNvPr id="14" name="image-E3lJ3fdYCp5-YJBZ4324e.png" descr="Liste des établissements"/>
                     <pic:cNvPicPr/>
                   </pic:nvPicPr>
                   <pic:blipFill>
@@ -3442,18 +3353,99 @@
           </wp:inline>
         </w:drawing>
       </w:r>
+    </w:p>
+    <w:p>
+      <w:pPr>
+        <w:numPr>
+          <w:ilvl w:val="0"/>
+          <w:numId w:val="7"/>
+        </w:numPr>
+        <w:spacing w:lineRule="auto"/>
+      </w:pPr>
+      <w:r>
+        <w:rPr/>
+        <w:t xml:space="preserve">Liste des établissements actifs. La création d'un nouvel établissement est réservée à l'administrateur ; la modification et la suppression (logique, sans perte de données) sont possibles pour le personnel autorisé.</w:t>
+      </w:r>
+    </w:p>
+    <w:p>
+      <w:pPr>
+        <w:numPr>
+          <w:ilvl w:val="0"/>
+          <w:numId w:val="7"/>
+        </w:numPr>
+        <w:spacing w:lineRule="auto"/>
+      </w:pPr>
+      <w:r>
+        <w:rPr/>
+        <w:t xml:space="preserve">Un outil « Gérer la structure » permet de créer plusieurs niveaux et classes d'un coup (par exemple taper </w:t>
+      </w:r>
+      <w:r>
+        <w:rPr/>
+        <w:t xml:space="preserve">CP, CE1, CM1</w:t>
+      </w:r>
+      <w:r>
+        <w:rPr/>
+        <w:t xml:space="preserve"> crée les trois niveaux en une seule fois), et de les modifier directement dans le tableau.</w:t>
+      </w:r>
+    </w:p>
+    <w:p>
+      <w:pPr>
+        <w:numPr>
+          <w:ilvl w:val="0"/>
+          <w:numId w:val="7"/>
+        </w:numPr>
+        <w:spacing w:lineRule="auto"/>
+      </w:pPr>
+      <w:r>
+        <w:rPr>
+          <w:b/>
+        </w:rPr>
+        <w:t xml:space="preserve">Délai de grâce</w:t>
+      </w:r>
+      <w:r>
+        <w:rPr/>
+        <w:t xml:space="preserve"> : un champ optionnel permet de définir, pour cet établissement uniquement, un délai différent du délai par défaut (7 jours, réglable dans les Paramètres, §16). Laisser le champ vide pour garder le délai par défaut.</w:t>
+      </w:r>
+    </w:p>
+    <w:p>
+      <w:pPr>
+        <w:numPr>
+          <w:ilvl w:val="0"/>
+          <w:numId w:val="7"/>
+        </w:numPr>
+        <w:spacing w:lineRule="auto"/>
+      </w:pPr>
+      <w:r>
+        <w:rPr/>
+        <w:t xml:space="preserve">Ce menu n'est pas accessible directement à un parent, mais la liste des établissements et des classes lui reste visible pour pouvoir choisir la bonne classe quand il ajoute un enfant (§8) — la création ou la modification restent réservées au personnel.</w:t>
+      </w:r>
+    </w:p>
+    <w:p>
+      <w:pPr>
+        <w:pStyle w:val="Heading2"/>
+        <w:spacing w:lineRule="auto"/>
+      </w:pPr>
+      <w:r>
+        <w:rPr/>
+        <w:t xml:space="preserve">7. Élèves (administrateur / gestionnaire / caissier)</w:t>
+      </w:r>
+    </w:p>
+    <w:p>
+      <w:pPr>
+        <w:spacing w:lineRule="auto"/>
+      </w:pPr>
       <w:r>
         <w:rPr/>
         <w:drawing>
           <wp:inline distB="0" distL="0" distR="0" distT="0">
             <wp:extent cx="5715000" cy="3571875"/>
             <wp:effectExtent b="0" l="0" r="0" t="0"/>
-            <wp:docPr id="15" name="image-nln-S--wg6zc8uBEB2GzR.png"/>
+            <wp:docPr id="15" name="image-kRXf4AlwafXJT81Cqs82Z.png"/>
             <a:graphic>
               <a:graphicData uri="http://schemas.openxmlformats.org/drawingml/2006/picture">
                 <pic:pic>
                   <pic:nvPicPr>
-                    <pic:cNvPr id="15" name="image-nln-S--wg6zc8uBEB2GzR.png" descr="Fiche élève — Contacts et allergies"/>
+                    <pic:cNvPr id="15" name="image-kRXf4AlwafXJT81Cqs82Z.png" descr="Liste des élèves"/>
                     <pic:cNvPicPr/>
                   </pic:nvPicPr>
                   <pic:blipFill>
@@ -3481,207 +3473,64 @@
       <w:pPr>
         <w:numPr>
           <w:ilvl w:val="0"/>
-          <w:numId w:val="9"/>
-        </w:numPr>
-        <w:spacing w:lineRule="auto"/>
-      </w:pPr>
-      <w:r>
-        <w:rPr/>
-        <w:t xml:space="preserve">Chaque élève dispose d'un QR Code personnel : consultable, copiable, imprimable — c'est ce même QR Code qui est destiné à être imprimé sur un badge plastifié remis à l'élève (voir l'offre commerciale pour la fabrication des badges).</w:t>
+          <w:numId w:val="8"/>
+        </w:numPr>
+        <w:spacing w:lineRule="auto"/>
+      </w:pPr>
+      <w:r>
+        <w:rPr/>
+        <w:t xml:space="preserve">Liste des élèves avec pagination (reste rapide même avec un grand nombre d'élèves).</w:t>
       </w:r>
     </w:p>
     <w:p>
       <w:pPr>
         <w:numPr>
           <w:ilvl w:val="0"/>
-          <w:numId w:val="9"/>
-        </w:numPr>
-        <w:spacing w:lineRule="auto"/>
-      </w:pPr>
-      <w:r>
-        <w:rPr/>
-        <w:t xml:space="preserve">La suppression d'un élève est réservée à l'administrateur.</w:t>
-      </w:r>
-    </w:p>
-    <w:p>
-      <w:pPr>
-        <w:numPr>
-          <w:ilvl w:val="0"/>
-          <w:numId w:val="9"/>
-        </w:numPr>
-        <w:spacing w:lineRule="auto"/>
-      </w:pPr>
-      <w:r>
-        <w:rPr/>
-        <w:t xml:space="preserve">Ce menu n'est pas accessible à un parent (le parent ajoute ses propres enfants depuis « Mes enfants », §8).</w:t>
-      </w:r>
-    </w:p>
-    <w:p>
-      <w:pPr>
-        <w:pStyle w:val="Heading3"/>
-        <w:spacing w:lineRule="auto"/>
-      </w:pPr>
-      <w:r>
-        <w:rPr/>
-        <w:t xml:space="preserve">Allergies et certificat médical</w:t>
-      </w:r>
-    </w:p>
-    <w:p>
-      <w:pPr>
-        <w:numPr>
-          <w:ilvl w:val="0"/>
-          <w:numId w:val="10"/>
-        </w:numPr>
-        <w:spacing w:lineRule="auto"/>
-      </w:pPr>
-      <w:r>
-        <w:rPr/>
-        <w:t xml:space="preserve">Le champ </w:t>
-      </w:r>
+          <w:numId w:val="8"/>
+        </w:numPr>
+        <w:spacing w:lineRule="auto"/>
+      </w:pPr>
       <w:r>
         <w:rPr>
           <w:b/>
         </w:rPr>
-        <w:t xml:space="preserve">Allergies</w:t>
-      </w:r>
-      <w:r>
-        <w:rPr/>
-        <w:t xml:space="preserve"> ne peut être renseigné </w:t>
-      </w:r>
+        <w:t xml:space="preserve">Recherche</w:t>
+      </w:r>
+      <w:r>
+        <w:rPr/>
+        <w:t xml:space="preserve"> par nom, prénom ou matricule ; filtres par établissement et par statut d'accès.</w:t>
+      </w:r>
+    </w:p>
+    <w:p>
+      <w:pPr>
+        <w:numPr>
+          <w:ilvl w:val="0"/>
+          <w:numId w:val="8"/>
+        </w:numPr>
+        <w:spacing w:lineRule="auto"/>
+      </w:pPr>
       <w:r>
         <w:rPr>
           <w:b/>
         </w:rPr>
-        <w:t xml:space="preserve">qu'après la création</w:t>
-      </w:r>
-      <w:r>
-        <w:rPr/>
-        <w:t xml:space="preserve"> de la fiche de l'élève, pas au moment de la création : le certificat médical qui l'accompagne ne peut être ajouté qu'une fois la fiche déjà enregistrée. Il faut donc d'abord créer l'élève sans allergie, puis ouvrir « Modifier » pour la déclarer.</w:t>
+        <w:t xml:space="preserve">Export</w:t>
+      </w:r>
+      <w:r>
+        <w:rPr/>
+        <w:t xml:space="preserve"> de la liste affichée au format tableau (CSV), via le bouton dédié.</w:t>
       </w:r>
     </w:p>
     <w:p>
       <w:pPr>
         <w:numPr>
           <w:ilvl w:val="0"/>
-          <w:numId w:val="10"/>
-        </w:numPr>
-        <w:spacing w:lineRule="auto"/>
-      </w:pPr>
-      <w:r>
-        <w:rPr/>
-        <w:t xml:space="preserve">Une fois en modification, un bloc </w:t>
-      </w:r>
-      <w:r>
-        <w:rPr>
-          <w:b/>
-        </w:rPr>
-        <w:t xml:space="preserve">Certificat médical</w:t>
-      </w:r>
-      <w:r>
-        <w:rPr/>
-        <w:t xml:space="preserve"> permet d'</w:t>
-      </w:r>
-      <w:r>
-        <w:rPr>
-          <w:b/>
-        </w:rPr>
-        <w:t xml:space="preserve">ajouter un fichier</w:t>
-      </w:r>
-      <w:r>
-        <w:rPr/>
-        <w:t xml:space="preserve"> (PDF, JPG ou PNG). Une fois le fichier envoyé, un repère « Certificat fourni » apparaît avec un lien pour le consulter et un bouton pour le remplacer si besoin.</w:t>
-      </w:r>
-    </w:p>
-    <w:p>
-      <w:pPr>
-        <w:numPr>
-          <w:ilvl w:val="0"/>
-          <w:numId w:val="10"/>
-        </w:numPr>
-        <w:spacing w:lineRule="auto"/>
-      </w:pPr>
-      <w:r>
-        <w:rPr/>
-        <w:t xml:space="preserve">L'enregistrement de la fiche est bloqué, avec un message clair, si le champ Allergies contient du texte mais qu'aucun certificat n'a été ajouté.</w:t>
-      </w:r>
-    </w:p>
-    <w:p>
-      <w:pPr>
-        <w:pStyle w:val="Heading2"/>
-        <w:spacing w:lineRule="auto"/>
-      </w:pPr>
-      <w:r>
-        <w:rPr/>
-        <w:t xml:space="preserve">8. Mes enfants (espace parent — en libre-service)</w:t>
-      </w:r>
-    </w:p>
-    <w:p>
-      <w:pPr>
-        <w:pStyle w:val="Heading3"/>
-        <w:spacing w:lineRule="auto"/>
-      </w:pPr>
-      <w:r>
-        <w:rPr/>
-        <w:t xml:space="preserve">Ce qui se passe quand un parent se connecte</w:t>
-      </w:r>
-    </w:p>
-    <w:p>
-      <w:pPr>
-        <w:spacing w:lineRule="auto"/>
-      </w:pPr>
-      <w:r>
-        <w:rPr/>
-        <w:t xml:space="preserve">Une fois connecté avec son email (ou son identifiant) et son mot de passe, un parent arrive d'abord sur le </w:t>
-      </w:r>
-      <w:r>
-        <w:rPr>
-          <w:b/>
-        </w:rPr>
-        <w:t xml:space="preserve">Tableau de bord</w:t>
-      </w:r>
-      <w:r>
-        <w:rPr/>
-        <w:t xml:space="preserve"> (§5), avec ses propres statistiques (nombre d'enfants, statut d'accès, passages récents). Le menu de gauche, spécifique au rôle Parent, ne propose que quatre écrans : </w:t>
-      </w:r>
-      <w:r>
-        <w:rPr>
-          <w:b/>
-        </w:rPr>
-        <w:t xml:space="preserve">Tableau de bord</w:t>
-      </w:r>
-      <w:r>
-        <w:rPr/>
-        <w:t xml:space="preserve">, </w:t>
-      </w:r>
-      <w:r>
-        <w:rPr>
-          <w:b/>
-        </w:rPr>
-        <w:t xml:space="preserve">Mes enfants</w:t>
-      </w:r>
-      <w:r>
-        <w:rPr/>
-        <w:t xml:space="preserve">, </w:t>
-      </w:r>
-      <w:r>
-        <w:rPr>
-          <w:b/>
-        </w:rPr>
-        <w:t xml:space="preserve">Paiements</w:t>
-      </w:r>
-      <w:r>
-        <w:rPr/>
-        <w:t xml:space="preserve"> et </w:t>
-      </w:r>
-      <w:r>
-        <w:rPr>
-          <w:b/>
-        </w:rPr>
-        <w:t xml:space="preserve">Historique</w:t>
-      </w:r>
-      <w:r>
-        <w:rPr/>
-        <w:t xml:space="preserve"> — tous les menus réservés au personnel (Établissements, Élèves, Scan Réfectoire, Utilisateurs, etc.) sont absents. En cliquant sur « Mes enfants » dans ce menu, le parent arrive sur l'écran suivant :</w:t>
+          <w:numId w:val="8"/>
+        </w:numPr>
+        <w:spacing w:lineRule="auto"/>
+      </w:pPr>
+      <w:r>
+        <w:rPr/>
+        <w:t xml:space="preserve">La création ou la modification d'un élève se fait dans un formulaire en 3 étapes, pour rester clair et tenir sur un seul écran :</w:t>
       </w:r>
     </w:p>
     <w:p>
@@ -3694,12 +3543,12 @@
           <wp:inline distB="0" distL="0" distR="0" distT="0">
             <wp:extent cx="5715000" cy="3571875"/>
             <wp:effectExtent b="0" l="0" r="0" t="0"/>
-            <wp:docPr id="16" name="image-PL2-js-6AhREhDAO8IWdP.png"/>
+            <wp:docPr id="16" name="image-EVOq7tP_8reolbYNlk_dQ.png"/>
             <a:graphic>
               <a:graphicData uri="http://schemas.openxmlformats.org/drawingml/2006/picture">
                 <pic:pic>
                   <pic:nvPicPr>
-                    <pic:cNvPr id="16" name="image-PL2-js-6AhREhDAO8IWdP.png" descr="Mes enfants — liste des enfants rattachés"/>
+                    <pic:cNvPr id="16" name="image-EVOq7tP_8reolbYNlk_dQ.png" descr="Fiche élève — Informations générales"/>
                     <pic:cNvPicPr/>
                   </pic:nvPicPr>
                   <pic:blipFill>
@@ -3722,61 +3571,18 @@
           </wp:inline>
         </w:drawing>
       </w:r>
-    </w:p>
-    <w:p>
-      <w:pPr>
-        <w:numPr>
-          <w:ilvl w:val="0"/>
-          <w:numId w:val="11"/>
-        </w:numPr>
-        <w:spacing w:lineRule="auto"/>
-      </w:pPr>
-      <w:r>
-        <w:rPr>
-          <w:b/>
-        </w:rPr>
-        <w:t xml:space="preserve">Consulter</w:t>
-      </w:r>
-      <w:r>
-        <w:rPr/>
-        <w:t xml:space="preserve"> la liste de ses enfants déjà rattachés : nom, matricule, statut d'accès (Autorisé, En attente de paiement, Période de grâce, Suspendu).</w:t>
-      </w:r>
-    </w:p>
-    <w:p>
-      <w:pPr>
-        <w:numPr>
-          <w:ilvl w:val="0"/>
-          <w:numId w:val="11"/>
-        </w:numPr>
-        <w:spacing w:lineRule="auto"/>
-      </w:pPr>
-      <w:r>
-        <w:rPr>
-          <w:b/>
-        </w:rPr>
-        <w:t xml:space="preserve">Ajouter un enfant</w:t>
-      </w:r>
-      <w:r>
-        <w:rPr/>
-        <w:t xml:space="preserve"> lui-même, via le bouton « Ajouter un enfant » qui ouvre un petit formulaire :</w:t>
-      </w:r>
-    </w:p>
-    <w:p>
-      <w:pPr>
-        <w:spacing w:lineRule="auto"/>
-      </w:pPr>
       <w:r>
         <w:rPr/>
         <w:drawing>
           <wp:inline distB="0" distL="0" distR="0" distT="0">
             <wp:extent cx="5715000" cy="3571875"/>
             <wp:effectExtent b="0" l="0" r="0" t="0"/>
-            <wp:docPr id="17" name="image-UMSbPYFpPp0RYRjv9sh7d.png"/>
+            <wp:docPr id="17" name="image-S0-Ymv6Oima0LCOacgP2a.png"/>
             <a:graphic>
               <a:graphicData uri="http://schemas.openxmlformats.org/drawingml/2006/picture">
                 <pic:pic>
                   <pic:nvPicPr>
-                    <pic:cNvPr id="17" name="image-UMSbPYFpPp0RYRjv9sh7d.png" descr="Mes enfants — formulaire d'ajout"/>
+                    <pic:cNvPr id="17" name="image-S0-Ymv6Oima0LCOacgP2a.png" descr="Fiche élève — Cantine et affectation"/>
                     <pic:cNvPicPr/>
                   </pic:nvPicPr>
                   <pic:blipFill>
@@ -3799,88 +3605,18 @@
           </wp:inline>
         </w:drawing>
       </w:r>
-    </w:p>
-    <w:p>
-      <w:pPr>
-        <w:spacing w:lineRule="auto"/>
-      </w:pPr>
-      <w:r>
-        <w:rPr/>
-        <w:t xml:space="preserve">  Le parent choisit l'établissement dans une liste déroulante, puis la classe correspondante   s'affiche automatiquement une fois l'établissement choisi (les choix proposés dépendent de ce   que l'administrateur a déjà configuré pour cet établissement), et renseigne le matricule   (communiqué par l'établissement à l'inscription), le nom, le prénom, le sexe (facultatif), la   date de naissance (facultative), la ville et la commune (obligatoires), le quartier (facultatif).</w:t>
-      </w:r>
-    </w:p>
-    <w:p>
-      <w:pPr>
-        <w:numPr>
-          <w:ilvl w:val="0"/>
-          <w:numId w:val="12"/>
-        </w:numPr>
-        <w:spacing w:lineRule="auto"/>
-      </w:pPr>
-      <w:r>
-        <w:rPr/>
-        <w:t xml:space="preserve">Les coordonnées du parent (nom, téléphone, email) affichées côté établissement pour cet enfant sont </w:t>
-      </w:r>
-      <w:r>
-        <w:rPr>
-          <w:b/>
-        </w:rPr>
-        <w:t xml:space="preserve">reprises automatiquement du compte connecté</w:t>
-      </w:r>
-      <w:r>
-        <w:rPr/>
-        <w:t xml:space="preserve"> — le parent n'a rien à ressaisir.</w:t>
-      </w:r>
-    </w:p>
-    <w:p>
-      <w:pPr>
-        <w:numPr>
-          <w:ilvl w:val="0"/>
-          <w:numId w:val="12"/>
-        </w:numPr>
-        <w:spacing w:lineRule="auto"/>
-      </w:pPr>
-      <w:r>
-        <w:rPr/>
-        <w:t xml:space="preserve">Un enfant ajouté de cette façon démarre avec le statut </w:t>
-      </w:r>
-      <w:r>
-        <w:rPr>
-          <w:b/>
-        </w:rPr>
-        <w:t xml:space="preserve">En attente de paiement</w:t>
-      </w:r>
-      <w:r>
-        <w:rPr/>
-        <w:t xml:space="preserve"> — aucun accès à la cantine tant qu'un paiement n'a pas été enregistré (voir §9 pour effectuer ce paiement).</w:t>
-      </w:r>
-    </w:p>
-    <w:p>
-      <w:pPr>
-        <w:pStyle w:val="Heading2"/>
-        <w:spacing w:lineRule="auto"/>
-      </w:pPr>
-      <w:r>
-        <w:rPr/>
-        <w:t xml:space="preserve">9. Paiements Mobile Money</w:t>
-      </w:r>
-    </w:p>
-    <w:p>
-      <w:pPr>
-        <w:spacing w:lineRule="auto"/>
-      </w:pPr>
       <w:r>
         <w:rPr/>
         <w:drawing>
           <wp:inline distB="0" distL="0" distR="0" distT="0">
             <wp:extent cx="5715000" cy="3571875"/>
             <wp:effectExtent b="0" l="0" r="0" t="0"/>
-            <wp:docPr id="18" name="image-aolUmSeti4rODSwECB5iZ.png"/>
+            <wp:docPr id="18" name="image-coAfJCbiSXXWIq0e_DOb2.png"/>
             <a:graphic>
               <a:graphicData uri="http://schemas.openxmlformats.org/drawingml/2006/picture">
                 <pic:pic>
                   <pic:nvPicPr>
-                    <pic:cNvPr id="18" name="image-aolUmSeti4rODSwECB5iZ.png" descr="Écran des paiements"/>
+                    <pic:cNvPr id="18" name="image-coAfJCbiSXXWIq0e_DOb2.png" descr="Fiche élève — Contacts et allergies"/>
                     <pic:cNvPicPr/>
                   </pic:nvPicPr>
                   <pic:blipFill>
@@ -3908,162 +3644,207 @@
       <w:pPr>
         <w:numPr>
           <w:ilvl w:val="0"/>
-          <w:numId w:val="13"/>
-        </w:numPr>
-        <w:spacing w:lineRule="auto"/>
-      </w:pPr>
+          <w:numId w:val="9"/>
+        </w:numPr>
+        <w:spacing w:lineRule="auto"/>
+      </w:pPr>
+      <w:r>
+        <w:rPr/>
+        <w:t xml:space="preserve">Chaque élève dispose d'un QR Code personnel : consultable, copiable, imprimable — c'est ce même QR Code qui est destiné à être imprimé sur un badge plastifié remis à l'élève (voir l'offre commerciale pour la fabrication des badges).</w:t>
+      </w:r>
+    </w:p>
+    <w:p>
+      <w:pPr>
+        <w:numPr>
+          <w:ilvl w:val="0"/>
+          <w:numId w:val="9"/>
+        </w:numPr>
+        <w:spacing w:lineRule="auto"/>
+      </w:pPr>
+      <w:r>
+        <w:rPr/>
+        <w:t xml:space="preserve">La suppression d'un élève est réservée à l'administrateur.</w:t>
+      </w:r>
+    </w:p>
+    <w:p>
+      <w:pPr>
+        <w:numPr>
+          <w:ilvl w:val="0"/>
+          <w:numId w:val="9"/>
+        </w:numPr>
+        <w:spacing w:lineRule="auto"/>
+      </w:pPr>
+      <w:r>
+        <w:rPr/>
+        <w:t xml:space="preserve">Ce menu n'est pas accessible à un parent (le parent ajoute ses propres enfants depuis « Mes enfants », §8).</w:t>
+      </w:r>
+    </w:p>
+    <w:p>
+      <w:pPr>
+        <w:pStyle w:val="Heading3"/>
+        <w:spacing w:lineRule="auto"/>
+      </w:pPr>
+      <w:r>
+        <w:rPr/>
+        <w:t xml:space="preserve">Allergies et certificat médical</w:t>
+      </w:r>
+    </w:p>
+    <w:p>
+      <w:pPr>
+        <w:numPr>
+          <w:ilvl w:val="0"/>
+          <w:numId w:val="10"/>
+        </w:numPr>
+        <w:spacing w:lineRule="auto"/>
+      </w:pPr>
+      <w:r>
+        <w:rPr/>
+        <w:t xml:space="preserve">Le champ </w:t>
+      </w:r>
       <w:r>
         <w:rPr>
           <w:b/>
         </w:rPr>
-        <w:t xml:space="preserve">Administrateur / gestionnaire / caissier</w:t>
-      </w:r>
-      <w:r>
-        <w:rPr/>
-        <w:t xml:space="preserve"> : voient toutes les transactions et peuvent lancer un paiement pour n'importe quel élève (recherche par nom, prénom ou matricule). Seul l'administrateur peut modifier ou supprimer une transaction.</w:t>
-      </w:r>
-    </w:p>
-    <w:p>
-      <w:pPr>
-        <w:numPr>
-          <w:ilvl w:val="0"/>
-          <w:numId w:val="13"/>
-        </w:numPr>
-        <w:spacing w:lineRule="auto"/>
-      </w:pPr>
+        <w:t xml:space="preserve">Allergies</w:t>
+      </w:r>
+      <w:r>
+        <w:rPr/>
+        <w:t xml:space="preserve"> ne peut être renseigné </w:t>
+      </w:r>
       <w:r>
         <w:rPr>
           <w:b/>
         </w:rPr>
-        <w:t xml:space="preserve">Parent</w:t>
-      </w:r>
-      <w:r>
-        <w:rPr/>
-        <w:t xml:space="preserve"> : ne voit que les paiements de ses propres enfants ; en lançant un paiement, seuls ses enfants lui sont proposés (pas de recherche libre parmi tous les élèves).</w:t>
+        <w:t xml:space="preserve">qu'après la création</w:t>
+      </w:r>
+      <w:r>
+        <w:rPr/>
+        <w:t xml:space="preserve"> de la fiche de l'élève, pas au moment de la création : le certificat médical qui l'accompagne ne peut être ajouté qu'une fois la fiche déjà enregistrée. Il faut donc d'abord créer l'élève sans allergie, puis ouvrir « Modifier » pour la déclarer.</w:t>
       </w:r>
     </w:p>
     <w:p>
       <w:pPr>
         <w:numPr>
           <w:ilvl w:val="0"/>
-          <w:numId w:val="13"/>
-        </w:numPr>
-        <w:spacing w:lineRule="auto"/>
-      </w:pPr>
+          <w:numId w:val="10"/>
+        </w:numPr>
+        <w:spacing w:lineRule="auto"/>
+      </w:pPr>
+      <w:r>
+        <w:rPr/>
+        <w:t xml:space="preserve">Une fois en modification, un bloc </w:t>
+      </w:r>
       <w:r>
         <w:rPr>
           <w:b/>
         </w:rPr>
-        <w:t xml:space="preserve">Périodes de paiement</w:t>
-      </w:r>
-      <w:r>
-        <w:rPr/>
-        <w:t xml:space="preserve"> : pour un abonnement, seuls les règlements </w:t>
+        <w:t xml:space="preserve">Certificat médical</w:t>
+      </w:r>
+      <w:r>
+        <w:rPr/>
+        <w:t xml:space="preserve"> permet d'</w:t>
       </w:r>
       <w:r>
         <w:rPr>
           <w:b/>
         </w:rPr>
-        <w:t xml:space="preserve">par trimestre ou par année</w:t>
-      </w:r>
-      <w:r>
-        <w:rPr/>
-        <w:t xml:space="preserve"> sont proposés — pas de paiement mensuel.</w:t>
+        <w:t xml:space="preserve">ajouter un fichier</w:t>
+      </w:r>
+      <w:r>
+        <w:rPr/>
+        <w:t xml:space="preserve"> (PDF, JPG ou PNG). Une fois le fichier envoyé, un repère « Certificat fourni » apparaît avec un lien pour le consulter et un bouton pour le remplacer si besoin.</w:t>
       </w:r>
     </w:p>
     <w:p>
       <w:pPr>
         <w:numPr>
           <w:ilvl w:val="0"/>
-          <w:numId w:val="13"/>
-        </w:numPr>
-        <w:spacing w:lineRule="auto"/>
-      </w:pPr>
-      <w:r>
-        <w:rPr/>
-        <w:t xml:space="preserve">Opérateurs Mobile Money pris en charge : Orange Money, MTN Money, Moov Money, Wave.</w:t>
-      </w:r>
-    </w:p>
-    <w:p>
-      <w:pPr>
-        <w:numPr>
-          <w:ilvl w:val="0"/>
-          <w:numId w:val="13"/>
-        </w:numPr>
-        <w:spacing w:lineRule="auto"/>
-      </w:pPr>
+          <w:numId w:val="10"/>
+        </w:numPr>
+        <w:spacing w:lineRule="auto"/>
+      </w:pPr>
+      <w:r>
+        <w:rPr/>
+        <w:t xml:space="preserve">L'enregistrement de la fiche est bloqué, avec un message clair, si le champ Allergies contient du texte mais qu'aucun certificat n'a été ajouté.</w:t>
+      </w:r>
+    </w:p>
+    <w:p>
+      <w:pPr>
+        <w:pStyle w:val="Heading2"/>
+        <w:spacing w:lineRule="auto"/>
+      </w:pPr>
+      <w:r>
+        <w:rPr/>
+        <w:t xml:space="preserve">8. Mes enfants (espace parent — en libre-service)</w:t>
+      </w:r>
+    </w:p>
+    <w:p>
+      <w:pPr>
+        <w:pStyle w:val="Heading3"/>
+        <w:spacing w:lineRule="auto"/>
+      </w:pPr>
+      <w:r>
+        <w:rPr/>
+        <w:t xml:space="preserve">Ce qui se passe quand un parent se connecte</w:t>
+      </w:r>
+    </w:p>
+    <w:p>
+      <w:pPr>
+        <w:spacing w:lineRule="auto"/>
+      </w:pPr>
+      <w:r>
+        <w:rPr/>
+        <w:t xml:space="preserve">Une fois connecté avec son email (ou son identifiant) et son mot de passe, un parent arrive d'abord sur le </w:t>
+      </w:r>
       <w:r>
         <w:rPr>
           <w:b/>
         </w:rPr>
-        <w:t xml:space="preserve">Recherche</w:t>
-      </w:r>
-      <w:r>
-        <w:rPr/>
-        <w:t xml:space="preserve"> par nom, prénom ou matricule de l'élève ; filtres par statut (En attente / Accepté / Refusé / Annulé), par période (date de début/fin) et par opérateur — tous les filtres peuvent se combiner.</w:t>
-      </w:r>
-    </w:p>
-    <w:p>
-      <w:pPr>
-        <w:numPr>
-          <w:ilvl w:val="0"/>
-          <w:numId w:val="13"/>
-        </w:numPr>
-        <w:spacing w:lineRule="auto"/>
-      </w:pPr>
+        <w:t xml:space="preserve">Tableau de bord</w:t>
+      </w:r>
+      <w:r>
+        <w:rPr/>
+        <w:t xml:space="preserve"> (§5), avec ses propres statistiques (nombre d'enfants, statut d'accès, passages récents). Le menu de gauche, spécifique au rôle Parent, ne propose que quatre écrans : </w:t>
+      </w:r>
       <w:r>
         <w:rPr>
           <w:b/>
         </w:rPr>
-        <w:t xml:space="preserve">Export</w:t>
-      </w:r>
-      <w:r>
-        <w:rPr/>
-        <w:t xml:space="preserve"> de la liste affichée au format tableau (CSV).</w:t>
-      </w:r>
-    </w:p>
-    <w:p>
-      <w:pPr>
-        <w:numPr>
-          <w:ilvl w:val="0"/>
-          <w:numId w:val="13"/>
-        </w:numPr>
-        <w:spacing w:lineRule="auto"/>
-      </w:pPr>
-      <w:r>
-        <w:rPr/>
-        <w:t xml:space="preserve">Un parent qui tenterait de payer pour un enfant qui n'est pas le sien se voit automatiquement refuser l'opération par le système.</w:t>
-      </w:r>
-    </w:p>
-    <w:p>
-      <w:pPr>
-        <w:ind w:left="284"/>
-        <w:jc w:val="both"/>
-        <w:spacing w:lineRule="auto"/>
-      </w:pPr>
-      <w:r>
-        <w:rPr/>
-        <w:t xml:space="preserve">ℹ️ Le paiement en ligne est réellement connecté à un service de paiement Mobile Money, mais </w:t>
+        <w:t xml:space="preserve">Tableau de bord</w:t>
+      </w:r>
+      <w:r>
+        <w:rPr/>
+        <w:t xml:space="preserve">, </w:t>
       </w:r>
       <w:r>
         <w:rPr>
           <w:b/>
         </w:rPr>
-        <w:t xml:space="preserve">aucun compte marchand réel n'est encore branché</w:t>
-      </w:r>
-      <w:r>
-        <w:rPr/>
-        <w:t xml:space="preserve"> — tant que ce n'est pas fait, une tentative de paiement affiche un message clair (« service de paiement indisponible ou mal configuré ») plutôt qu'un lien de paiement fonctionnel.</w:t>
-      </w:r>
-    </w:p>
-    <w:p>
-      <w:pPr>
-        <w:pStyle w:val="Heading2"/>
-        <w:spacing w:lineRule="auto"/>
-      </w:pPr>
-      <w:r>
-        <w:rPr/>
-        <w:t xml:space="preserve">10. Contrôle d'accès à la cantine</w:t>
+        <w:t xml:space="preserve">Mes enfants</w:t>
+      </w:r>
+      <w:r>
+        <w:rPr/>
+        <w:t xml:space="preserve">, </w:t>
+      </w:r>
+      <w:r>
+        <w:rPr>
+          <w:b/>
+        </w:rPr>
+        <w:t xml:space="preserve">Paiements</w:t>
+      </w:r>
+      <w:r>
+        <w:rPr/>
+        <w:t xml:space="preserve"> et </w:t>
+      </w:r>
+      <w:r>
+        <w:rPr>
+          <w:b/>
+        </w:rPr>
+        <w:t xml:space="preserve">Historique</w:t>
+      </w:r>
+      <w:r>
+        <w:rPr/>
+        <w:t xml:space="preserve"> — tous les menus réservés au personnel (Établissements, Élèves, Scan Réfectoire, Utilisateurs, etc.) sont absents. En cliquant sur « Mes enfants » dans ce menu, le parent arrive sur l'écran suivant :</w:t>
       </w:r>
     </w:p>
     <w:p>
@@ -4076,12 +3857,12 @@
           <wp:inline distB="0" distL="0" distR="0" distT="0">
             <wp:extent cx="5715000" cy="3571875"/>
             <wp:effectExtent b="0" l="0" r="0" t="0"/>
-            <wp:docPr id="19" name="image-OHU0wWBBj6pJtXUUFyVBQ.png"/>
+            <wp:docPr id="19" name="image-rO5-SGvFMXn49o9Kmzdv8.png"/>
             <a:graphic>
               <a:graphicData uri="http://schemas.openxmlformats.org/drawingml/2006/picture">
                 <pic:pic>
                   <pic:nvPicPr>
-                    <pic:cNvPr id="19" name="image-OHU0wWBBj6pJtXUUFyVBQ.png" descr="Écran de contrôle d'accès"/>
+                    <pic:cNvPr id="19" name="image-rO5-SGvFMXn49o9Kmzdv8.png" descr="Mes enfants — liste des enfants rattachés"/>
                     <pic:cNvPicPr/>
                   </pic:nvPicPr>
                   <pic:blipFill>
@@ -4109,85 +3890,38 @@
       <w:pPr>
         <w:numPr>
           <w:ilvl w:val="0"/>
-          <w:numId w:val="14"/>
-        </w:numPr>
-        <w:spacing w:lineRule="auto"/>
-      </w:pPr>
-      <w:r>
-        <w:rPr/>
-        <w:t xml:space="preserve">La lecture du QR Code d'un élève à l'entrée de la cantine confirme l'accès en moins d'une seconde : ✓ accès accordé ou ✗ accès refusé (avec le motif affiché).</w:t>
-      </w:r>
-    </w:p>
-    <w:p>
-      <w:pPr>
-        <w:numPr>
-          <w:ilvl w:val="0"/>
-          <w:numId w:val="14"/>
-        </w:numPr>
-        <w:spacing w:lineRule="auto"/>
-      </w:pPr>
-      <w:r>
-        <w:rPr/>
-        <w:t xml:space="preserve">Fonctionne même </w:t>
-      </w:r>
+          <w:numId w:val="11"/>
+        </w:numPr>
+        <w:spacing w:lineRule="auto"/>
+      </w:pPr>
       <w:r>
         <w:rPr>
           <w:b/>
         </w:rPr>
-        <w:t xml:space="preserve">sans connexion internet</w:t>
-      </w:r>
-      <w:r>
-        <w:rPr/>
-        <w:t xml:space="preserve"> : l'appareil garde en mémoire, pendant 24 heures, la liste des élèves et leur statut d'accès, et se remet à jour automatiquement dès que la connexion revient.</w:t>
+        <w:t xml:space="preserve">Consulter</w:t>
+      </w:r>
+      <w:r>
+        <w:rPr/>
+        <w:t xml:space="preserve"> la liste de ses enfants déjà rattachés : nom, matricule, statut d'accès (Autorisé, En attente de paiement, Période de grâce, Suspendu).</w:t>
       </w:r>
     </w:p>
     <w:p>
       <w:pPr>
         <w:numPr>
           <w:ilvl w:val="0"/>
-          <w:numId w:val="14"/>
-        </w:numPr>
-        <w:spacing w:lineRule="auto"/>
-      </w:pPr>
-      <w:r>
-        <w:rPr/>
-        <w:t xml:space="preserve">Une barre d'état indique si l'appareil est « En ligne » ou « Hors ligne », l'état de ces informations enregistrées à l'avance (absentes, ou datées avec le nombre d'élèves couverts), et propose un bouton pour forcer la mise à jour manuellement.</w:t>
-      </w:r>
-    </w:p>
-    <w:p>
-      <w:pPr>
-        <w:numPr>
-          <w:ilvl w:val="0"/>
-          <w:numId w:val="14"/>
-        </w:numPr>
-        <w:spacing w:lineRule="auto"/>
-      </w:pPr>
-      <w:r>
-        <w:rPr/>
-        <w:t xml:space="preserve">Par défaut, ces informations se mettent à jour automatiquement en arrière-plan dès l'ouverture de l'écran, si une connexion est disponible — ce comportement peut être désactivé dans les Paramètres (§16) pour ne garder que la mise à jour manuelle.</w:t>
-      </w:r>
-    </w:p>
-    <w:p>
-      <w:pPr>
-        <w:numPr>
-          <w:ilvl w:val="0"/>
-          <w:numId w:val="14"/>
-        </w:numPr>
-        <w:spacing w:lineRule="auto"/>
-      </w:pPr>
-      <w:r>
-        <w:rPr/>
-        <w:t xml:space="preserve">Non accessible à un parent.</w:t>
-      </w:r>
-    </w:p>
-    <w:p>
-      <w:pPr>
-        <w:pStyle w:val="Heading2"/>
-        <w:spacing w:lineRule="auto"/>
-      </w:pPr>
-      <w:r>
-        <w:rPr/>
-        <w:t xml:space="preserve">11. Historique des passages</w:t>
+          <w:numId w:val="11"/>
+        </w:numPr>
+        <w:spacing w:lineRule="auto"/>
+      </w:pPr>
+      <w:r>
+        <w:rPr>
+          <w:b/>
+        </w:rPr>
+        <w:t xml:space="preserve">Ajouter un enfant</w:t>
+      </w:r>
+      <w:r>
+        <w:rPr/>
+        <w:t xml:space="preserve"> lui-même, via le bouton « Ajouter un enfant » qui ouvre un petit formulaire :</w:t>
       </w:r>
     </w:p>
     <w:p>
@@ -4200,12 +3934,12 @@
           <wp:inline distB="0" distL="0" distR="0" distT="0">
             <wp:extent cx="5715000" cy="3571875"/>
             <wp:effectExtent b="0" l="0" r="0" t="0"/>
-            <wp:docPr id="20" name="image-p5CQCNKPHhyOamOacC93s.png"/>
+            <wp:docPr id="20" name="image-sB1jVCkE3gwwTmbpquyO-.png"/>
             <a:graphic>
               <a:graphicData uri="http://schemas.openxmlformats.org/drawingml/2006/picture">
                 <pic:pic>
                   <pic:nvPicPr>
-                    <pic:cNvPr id="20" name="image-p5CQCNKPHhyOamOacC93s.png" descr="Historique des passages"/>
+                    <pic:cNvPr id="20" name="image-sB1jVCkE3gwwTmbpquyO-.png" descr="Mes enfants — formulaire d'ajout"/>
                     <pic:cNvPicPr/>
                   </pic:nvPicPr>
                   <pic:blipFill>
@@ -4231,40 +3965,57 @@
     </w:p>
     <w:p>
       <w:pPr>
+        <w:spacing w:lineRule="auto"/>
+      </w:pPr>
+      <w:r>
+        <w:rPr/>
+        <w:t xml:space="preserve">  Le parent choisit l'établissement dans une liste déroulante, puis la classe correspondante   s'affiche automatiquement une fois l'établissement choisi (les choix proposés dépendent de ce   que l'administrateur a déjà configuré pour cet établissement), et renseigne le matricule   (communiqué par l'établissement à l'inscription), le nom, le prénom, le sexe (facultatif), la   date de naissance (facultative), la ville et la commune (obligatoires), le quartier (facultatif).</w:t>
+      </w:r>
+    </w:p>
+    <w:p>
+      <w:pPr>
         <w:numPr>
           <w:ilvl w:val="0"/>
-          <w:numId w:val="15"/>
-        </w:numPr>
-        <w:spacing w:lineRule="auto"/>
-      </w:pPr>
+          <w:numId w:val="12"/>
+        </w:numPr>
+        <w:spacing w:lineRule="auto"/>
+      </w:pPr>
+      <w:r>
+        <w:rPr/>
+        <w:t xml:space="preserve">Les coordonnées du parent (nom, téléphone, email) affichées côté établissement pour cet enfant sont </w:t>
+      </w:r>
       <w:r>
         <w:rPr>
           <w:b/>
         </w:rPr>
-        <w:t xml:space="preserve">Administrateur / gestionnaire / caissier</w:t>
-      </w:r>
-      <w:r>
-        <w:rPr/>
-        <w:t xml:space="preserve"> : historique complet, filtrable par date, établissement et résultat, avec recherche d'élève ; export au format tableau (CSV) ; la modification ou la suppression d'un passage sont réservées à l'administrateur.</w:t>
+        <w:t xml:space="preserve">reprises automatiquement du compte connecté</w:t>
+      </w:r>
+      <w:r>
+        <w:rPr/>
+        <w:t xml:space="preserve"> — le parent n'a rien à ressaisir.</w:t>
       </w:r>
     </w:p>
     <w:p>
       <w:pPr>
         <w:numPr>
           <w:ilvl w:val="0"/>
-          <w:numId w:val="15"/>
-        </w:numPr>
-        <w:spacing w:lineRule="auto"/>
-      </w:pPr>
+          <w:numId w:val="12"/>
+        </w:numPr>
+        <w:spacing w:lineRule="auto"/>
+      </w:pPr>
+      <w:r>
+        <w:rPr/>
+        <w:t xml:space="preserve">Un enfant ajouté de cette façon démarre avec le statut </w:t>
+      </w:r>
       <w:r>
         <w:rPr>
           <w:b/>
         </w:rPr>
-        <w:t xml:space="preserve">Parent</w:t>
-      </w:r>
-      <w:r>
-        <w:rPr/>
-        <w:t xml:space="preserve"> : ne voit que les passages de ses propres enfants ; le filtre par établissement et la colonne « Établissement » du tableau sont masqués (non utiles pour un parent).</w:t>
+        <w:t xml:space="preserve">En attente de paiement</w:t>
+      </w:r>
+      <w:r>
+        <w:rPr/>
+        <w:t xml:space="preserve"> — aucun accès à la cantine tant qu'un paiement n'a pas été enregistré (voir §9 pour effectuer ce paiement).</w:t>
       </w:r>
     </w:p>
     <w:p>
@@ -4274,172 +4025,7 @@
       </w:pPr>
       <w:r>
         <w:rPr/>
-        <w:t xml:space="preserve">12. Rapports (administrateur / gestionnaire / caissier) — première version</w:t>
-      </w:r>
-    </w:p>
-    <w:p>
-      <w:pPr>
-        <w:ind w:left="284"/>
-        <w:jc w:val="both"/>
-        <w:spacing w:lineRule="auto"/>
-      </w:pPr>
-      <w:r>
-        <w:rPr/>
-        <w:t xml:space="preserve">Première version de ce module, mise à disposition pour recueillir des retours avant amélioration. Non accessible à un parent.</w:t>
-      </w:r>
-    </w:p>
-    <w:p>
-      <w:pPr>
-        <w:numPr>
-          <w:ilvl w:val="0"/>
-          <w:numId w:val="16"/>
-        </w:numPr>
-        <w:spacing w:lineRule="auto"/>
-      </w:pPr>
-      <w:r>
-        <w:rPr/>
-        <w:t xml:space="preserve">On choisit une période (date de début/fin) et, si besoin, un établissement (ce filtre ne s'applique qu'aux passages à la cantine), puis on clique sur </w:t>
-      </w:r>
-      <w:r>
-        <w:rPr>
-          <w:b/>
-        </w:rPr>
-        <w:t xml:space="preserve">« Générer le rapport »</w:t>
-      </w:r>
-      <w:r>
-        <w:rPr/>
-        <w:t xml:space="preserve">.</w:t>
-      </w:r>
-    </w:p>
-    <w:p>
-      <w:pPr>
-        <w:numPr>
-          <w:ilvl w:val="0"/>
-          <w:numId w:val="16"/>
-        </w:numPr>
-        <w:spacing w:lineRule="auto"/>
-      </w:pPr>
-      <w:r>
-        <w:rPr/>
-        <w:t xml:space="preserve">Trois onglets s'affichent une fois le rapport généré :</w:t>
-      </w:r>
-    </w:p>
-    <w:p>
-      <w:pPr>
-        <w:numPr>
-          <w:ilvl w:val="1"/>
-          <w:numId w:val="17"/>
-        </w:numPr>
-        <w:spacing w:lineRule="auto"/>
-      </w:pPr>
-      <w:r>
-        <w:rPr>
-          <w:b/>
-        </w:rPr>
-        <w:t xml:space="preserve">Résumé</w:t>
-      </w:r>
-      <w:r>
-        <w:rPr/>
-        <w:t xml:space="preserve"> : montant total encaissé, répartition des paiements par statut, répartition des passages par résultat, taux d'accès.</w:t>
-      </w:r>
-    </w:p>
-    <w:p>
-      <w:pPr>
-        <w:numPr>
-          <w:ilvl w:val="1"/>
-          <w:numId w:val="17"/>
-        </w:numPr>
-        <w:spacing w:lineRule="auto"/>
-      </w:pPr>
-      <w:r>
-        <w:rPr>
-          <w:b/>
-        </w:rPr>
-        <w:t xml:space="preserve">Paiements</w:t>
-      </w:r>
-      <w:r>
-        <w:rPr/>
-        <w:t xml:space="preserve"> : liste détaillée des transactions de la période.</w:t>
-      </w:r>
-    </w:p>
-    <w:p>
-      <w:pPr>
-        <w:numPr>
-          <w:ilvl w:val="1"/>
-          <w:numId w:val="17"/>
-        </w:numPr>
-        <w:spacing w:lineRule="auto"/>
-      </w:pPr>
-      <w:r>
-        <w:rPr>
-          <w:b/>
-        </w:rPr>
-        <w:t xml:space="preserve">Passages</w:t>
-      </w:r>
-      <w:r>
-        <w:rPr/>
-        <w:t xml:space="preserve"> : liste détaillée des passages à la cantine sur la période.</w:t>
-      </w:r>
-    </w:p>
-    <w:p>
-      <w:pPr>
-        <w:numPr>
-          <w:ilvl w:val="0"/>
-          <w:numId w:val="16"/>
-        </w:numPr>
-        <w:spacing w:lineRule="auto"/>
-      </w:pPr>
-      <w:r>
-        <w:rPr>
-          <w:b/>
-        </w:rPr>
-        <w:t xml:space="preserve">Exporter en Excel</w:t>
-      </w:r>
-      <w:r>
-        <w:rPr/>
-        <w:t xml:space="preserve"> : télécharge un fichier avec 3 feuilles (Résumé / Paiements / Passages) couvrant toute la période choisie.</w:t>
-      </w:r>
-    </w:p>
-    <w:p>
-      <w:pPr>
-        <w:numPr>
-          <w:ilvl w:val="0"/>
-          <w:numId w:val="16"/>
-        </w:numPr>
-        <w:spacing w:lineRule="auto"/>
-      </w:pPr>
-      <w:r>
-        <w:rPr>
-          <w:b/>
-        </w:rPr>
-        <w:t xml:space="preserve">Imprimer / PDF</w:t>
-      </w:r>
-      <w:r>
-        <w:rPr/>
-        <w:t xml:space="preserve"> (par onglet) : ouvre la fenêtre d'impression du navigateur, limitée au contenu de l'onglet affiché — choisir « Enregistrer au format PDF » pour obtenir un fichier PDF.</w:t>
-      </w:r>
-    </w:p>
-    <w:p>
-      <w:pPr>
-        <w:numPr>
-          <w:ilvl w:val="0"/>
-          <w:numId w:val="16"/>
-        </w:numPr>
-        <w:spacing w:lineRule="auto"/>
-      </w:pPr>
-      <w:r>
-        <w:rPr/>
-        <w:t xml:space="preserve">Sur une période avec beaucoup de données, un message avertit si le rapport a dû être limité (au delà de 10 000 lignes) : il suffit alors de réduire la période choisie.</w:t>
-      </w:r>
-    </w:p>
-    <w:p>
-      <w:pPr>
-        <w:pStyle w:val="Heading2"/>
-        <w:spacing w:lineRule="auto"/>
-      </w:pPr>
-      <w:r>
-        <w:rPr/>
-        <w:t xml:space="preserve">13. Comptes utilisateurs (administrateur uniquement)</w:t>
+        <w:t xml:space="preserve">9. Paiements Mobile Money</w:t>
       </w:r>
     </w:p>
     <w:p>
@@ -4452,12 +4038,12 @@
           <wp:inline distB="0" distL="0" distR="0" distT="0">
             <wp:extent cx="5715000" cy="3571875"/>
             <wp:effectExtent b="0" l="0" r="0" t="0"/>
-            <wp:docPr id="21" name="image-WkkQtSRO5pyFkU2YTeKu1.png"/>
+            <wp:docPr id="21" name="image-KLB-swlpyTgQd6HRDtsZu.png"/>
             <a:graphic>
               <a:graphicData uri="http://schemas.openxmlformats.org/drawingml/2006/picture">
                 <pic:pic>
                   <pic:nvPicPr>
-                    <pic:cNvPr id="21" name="image-WkkQtSRO5pyFkU2YTeKu1.png" descr="Liste des comptes utilisateurs"/>
+                    <pic:cNvPr id="21" name="image-KLB-swlpyTgQd6HRDtsZu.png" descr="Écran des paiements"/>
                     <pic:cNvPicPr/>
                   </pic:nvPicPr>
                   <pic:blipFill>
@@ -4485,69 +4071,87 @@
       <w:pPr>
         <w:numPr>
           <w:ilvl w:val="0"/>
-          <w:numId w:val="18"/>
-        </w:numPr>
-        <w:spacing w:lineRule="auto"/>
-      </w:pPr>
-      <w:r>
-        <w:rPr/>
-        <w:t xml:space="preserve">Création d'un compte : nom, prénom, email, </w:t>
-      </w:r>
+          <w:numId w:val="13"/>
+        </w:numPr>
+        <w:spacing w:lineRule="auto"/>
+      </w:pPr>
       <w:r>
         <w:rPr>
           <w:b/>
         </w:rPr>
-        <w:t xml:space="preserve">numéro de téléphone (obligatoire, unique)</w:t>
-      </w:r>
-      <w:r>
-        <w:rPr/>
-        <w:t xml:space="preserve">, mot de passe, rôle (Administrateur, Gestionnaire, Caissier ou Parent).</w:t>
+        <w:t xml:space="preserve">Administrateur / gestionnaire / caissier</w:t>
+      </w:r>
+      <w:r>
+        <w:rPr/>
+        <w:t xml:space="preserve"> : voient toutes les transactions et peuvent lancer un paiement pour n'importe quel élève (recherche par nom, prénom ou matricule). Seul l'administrateur peut modifier ou supprimer une transaction.</w:t>
       </w:r>
     </w:p>
     <w:p>
       <w:pPr>
         <w:numPr>
           <w:ilvl w:val="0"/>
-          <w:numId w:val="18"/>
-        </w:numPr>
-        <w:spacing w:lineRule="auto"/>
-      </w:pPr>
-      <w:r>
-        <w:rPr/>
-        <w:t xml:space="preserve">Modification, changement de rôle directement dans le tableau, désactivation/réactivation, suppression définitive.</w:t>
+          <w:numId w:val="13"/>
+        </w:numPr>
+        <w:spacing w:lineRule="auto"/>
+      </w:pPr>
+      <w:r>
+        <w:rPr>
+          <w:b/>
+        </w:rPr>
+        <w:t xml:space="preserve">Parent</w:t>
+      </w:r>
+      <w:r>
+        <w:rPr/>
+        <w:t xml:space="preserve"> : ne voit que les paiements de ses propres enfants ; en lançant un paiement, seuls ses enfants lui sont proposés (pas de recherche libre parmi tous les élèves).</w:t>
       </w:r>
     </w:p>
     <w:p>
       <w:pPr>
         <w:numPr>
           <w:ilvl w:val="0"/>
-          <w:numId w:val="18"/>
-        </w:numPr>
-        <w:spacing w:lineRule="auto"/>
-      </w:pPr>
-      <w:r>
-        <w:rPr/>
-        <w:t xml:space="preserve">Impossible de désactiver ou de supprimer le tout dernier compte administrateur du système.</w:t>
+          <w:numId w:val="13"/>
+        </w:numPr>
+        <w:spacing w:lineRule="auto"/>
+      </w:pPr>
+      <w:r>
+        <w:rPr>
+          <w:b/>
+        </w:rPr>
+        <w:t xml:space="preserve">Périodes de paiement</w:t>
+      </w:r>
+      <w:r>
+        <w:rPr/>
+        <w:t xml:space="preserve"> : pour un abonnement, seuls les règlements </w:t>
+      </w:r>
+      <w:r>
+        <w:rPr>
+          <w:b/>
+        </w:rPr>
+        <w:t xml:space="preserve">par trimestre ou par année</w:t>
+      </w:r>
+      <w:r>
+        <w:rPr/>
+        <w:t xml:space="preserve"> sont proposés — pas de paiement mensuel.</w:t>
       </w:r>
     </w:p>
     <w:p>
       <w:pPr>
         <w:numPr>
           <w:ilvl w:val="0"/>
-          <w:numId w:val="18"/>
-        </w:numPr>
-        <w:spacing w:lineRule="auto"/>
-      </w:pPr>
-      <w:r>
-        <w:rPr/>
-        <w:t xml:space="preserve">Impossible de désactiver ou de supprimer son propre compte.</w:t>
+          <w:numId w:val="13"/>
+        </w:numPr>
+        <w:spacing w:lineRule="auto"/>
+      </w:pPr>
+      <w:r>
+        <w:rPr/>
+        <w:t xml:space="preserve">Opérateurs Mobile Money pris en charge : Orange Money, MTN Money, Moov Money, Wave.</w:t>
       </w:r>
     </w:p>
     <w:p>
       <w:pPr>
         <w:numPr>
           <w:ilvl w:val="0"/>
-          <w:numId w:val="18"/>
+          <w:numId w:val="13"/>
         </w:numPr>
         <w:spacing w:lineRule="auto"/>
       </w:pPr>
@@ -4559,37 +4163,14 @@
       </w:r>
       <w:r>
         <w:rPr/>
-        <w:t xml:space="preserve"> par email, nom, prénom ou téléphone ; filtres par rôle, par statut (actif ou inactif) et par période de création — tous combinables.</w:t>
-      </w:r>
-    </w:p>
-    <w:p>
-      <w:pPr>
-        <w:pStyle w:val="Heading2"/>
-        <w:spacing w:lineRule="auto"/>
-      </w:pPr>
-      <w:r>
-        <w:rPr/>
-        <w:t xml:space="preserve">14. Parents (rattacher des enfants — administrateur uniquement)</w:t>
+        <w:t xml:space="preserve"> par nom, prénom ou matricule de l'élève ; filtres par statut (En attente / Accepté / Refusé / Annulé), par période (date de début/fin) et par opérateur — tous les filtres peuvent se combiner.</w:t>
       </w:r>
     </w:p>
     <w:p>
       <w:pPr>
         <w:numPr>
           <w:ilvl w:val="0"/>
-          <w:numId w:val="19"/>
-        </w:numPr>
-        <w:spacing w:lineRule="auto"/>
-      </w:pPr>
-      <w:r>
-        <w:rPr/>
-        <w:t xml:space="preserve">Permet de rattacher un compte parent à un ou plusieurs élèves.</w:t>
-      </w:r>
-    </w:p>
-    <w:p>
-      <w:pPr>
-        <w:numPr>
-          <w:ilvl w:val="0"/>
-          <w:numId w:val="19"/>
+          <w:numId w:val="13"/>
         </w:numPr>
         <w:spacing w:lineRule="auto"/>
       </w:pPr>
@@ -4597,72 +4178,45 @@
         <w:rPr>
           <w:b/>
         </w:rPr>
-        <w:t xml:space="preserve">Choix du compte parent</w:t>
-      </w:r>
-      <w:r>
-        <w:rPr/>
-        <w:t xml:space="preserve"> : recherche par numéro de téléphone, nom ou prénom (le compte doit déjà exister — le créer d'abord dans « Comptes utilisateurs », ou passer par une demande d'accès validée, §15).</w:t>
+        <w:t xml:space="preserve">Export</w:t>
+      </w:r>
+      <w:r>
+        <w:rPr/>
+        <w:t xml:space="preserve"> de la liste affichée au format tableau (CSV).</w:t>
       </w:r>
     </w:p>
     <w:p>
       <w:pPr>
         <w:numPr>
           <w:ilvl w:val="0"/>
-          <w:numId w:val="19"/>
-        </w:numPr>
-        <w:spacing w:lineRule="auto"/>
-      </w:pPr>
+          <w:numId w:val="13"/>
+        </w:numPr>
+        <w:spacing w:lineRule="auto"/>
+      </w:pPr>
+      <w:r>
+        <w:rPr/>
+        <w:t xml:space="preserve">Un parent qui tenterait de payer pour un enfant qui n'est pas le sien se voit automatiquement refuser l'opération par le système.</w:t>
+      </w:r>
+    </w:p>
+    <w:p>
+      <w:pPr>
+        <w:ind w:left="284"/>
+        <w:jc w:val="both"/>
+        <w:spacing w:lineRule="auto"/>
+      </w:pPr>
+      <w:r>
+        <w:rPr/>
+        <w:t xml:space="preserve">ℹ️ Le paiement en ligne est réellement connecté à un service de paiement Mobile Money, mais </w:t>
+      </w:r>
       <w:r>
         <w:rPr>
           <w:b/>
         </w:rPr>
-        <w:t xml:space="preserve">Choix des enfants</w:t>
-      </w:r>
-      <w:r>
-        <w:rPr/>
-        <w:t xml:space="preserve"> : recherche par matricule, nom ou prénom, plusieurs enfants peuvent être sélectionnés à la fois.</w:t>
-      </w:r>
-    </w:p>
-    <w:p>
-      <w:pPr>
-        <w:numPr>
-          <w:ilvl w:val="0"/>
-          <w:numId w:val="19"/>
-        </w:numPr>
-        <w:spacing w:lineRule="auto"/>
-      </w:pPr>
-      <w:r>
-        <w:rPr/>
-        <w:t xml:space="preserve">Modification des enfants rattachés, suppression du lien (les fiches des élèves ne sont pas supprimées pour autant).</w:t>
-      </w:r>
-    </w:p>
-    <w:p>
-      <w:pPr>
-        <w:numPr>
-          <w:ilvl w:val="0"/>
-          <w:numId w:val="19"/>
-        </w:numPr>
-        <w:spacing w:lineRule="auto"/>
-      </w:pPr>
-      <w:r>
-        <w:rPr>
-          <w:b/>
-        </w:rPr>
-        <w:t xml:space="preserve">Recherche</w:t>
-      </w:r>
-      <w:r>
-        <w:rPr/>
-        <w:t xml:space="preserve"> sur la liste principale par </w:t>
-      </w:r>
-      <w:r>
-        <w:rPr>
-          <w:b/>
-        </w:rPr>
-        <w:t xml:space="preserve">email ou numéro de téléphone</w:t>
-      </w:r>
-      <w:r>
-        <w:rPr/>
-        <w:t xml:space="preserve"> du compte parent.</w:t>
+        <w:t xml:space="preserve">aucun compte marchand réel n'est encore branché</w:t>
+      </w:r>
+      <w:r>
+        <w:rPr/>
+        <w:t xml:space="preserve"> — tant que ce n'est pas fait, une tentative de paiement affiche un message clair (« service de paiement indisponible ou mal configuré ») plutôt qu'un lien de paiement fonctionnel.</w:t>
       </w:r>
     </w:p>
     <w:p>
@@ -4672,136 +4226,7 @@
       </w:pPr>
       <w:r>
         <w:rPr/>
-        <w:t xml:space="preserve">15. Demandes d'accès (validation par l'administrateur)</w:t>
-      </w:r>
-    </w:p>
-    <w:p>
-      <w:pPr>
-        <w:spacing w:lineRule="auto"/>
-      </w:pPr>
-      <w:r>
-        <w:rPr/>
-        <w:t xml:space="preserve">Sur l'écran « Demandes d'accès » (réservé à l'administrateur), on retrouve la liste des demandes soumises depuis la page publique (§3), que l'on peut filtrer par statut (En attente / Validées / Rejetées). Chaque ligne a un bouton « Voir détails » qui ouvre une fiche complète du demandeur (identité, tous les numéros de téléphone, email, résidence, historique du traitement) — pour une demande en attente, c'est depuis cette fiche que l'on </w:t>
-      </w:r>
-      <w:r>
-        <w:rPr>
-          <w:b/>
-        </w:rPr>
-        <w:t xml:space="preserve">valide ou rejette</w:t>
-      </w:r>
-      <w:r>
-        <w:rPr/>
-        <w:t xml:space="preserve">, afin de toujours vérifier les informations avant de créer un compte.</w:t>
-      </w:r>
-    </w:p>
-    <w:p>
-      <w:pPr>
-        <w:numPr>
-          <w:ilvl w:val="0"/>
-          <w:numId w:val="20"/>
-        </w:numPr>
-        <w:spacing w:lineRule="auto"/>
-      </w:pPr>
-      <w:r>
-        <w:rPr>
-          <w:b/>
-        </w:rPr>
-        <w:t xml:space="preserve">Valider</w:t>
-      </w:r>
-      <w:r>
-        <w:rPr/>
-        <w:t xml:space="preserve"> : crée le compte du parent, avec un identifiant de connexion et un mot de passe provisoire générés automatiquement. Si les notifications par email et SMS sont activées (voir §16 Paramètres), le parent les reçoit automatiquement ; </w:t>
-      </w:r>
-      <w:r>
-        <w:rPr>
-          <w:b/>
-        </w:rPr>
-        <w:t xml:space="preserve">dans tous les cas</w:t>
-      </w:r>
-      <w:r>
-        <w:rPr/>
-        <w:t xml:space="preserve">, une fenêtre affiche l'identifiant et le mot de passe à l'écran, pour pouvoir les communiquer manuellement si besoin.</w:t>
-      </w:r>
-    </w:p>
-    <w:p>
-      <w:pPr>
-        <w:numPr>
-          <w:ilvl w:val="1"/>
-          <w:numId w:val="21"/>
-        </w:numPr>
-        <w:spacing w:lineRule="auto"/>
-      </w:pPr>
-      <w:r>
-        <w:rPr/>
-        <w:t xml:space="preserve">Si le parent n'a donné </w:t>
-      </w:r>
-      <w:r>
-        <w:rPr>
-          <w:b/>
-        </w:rPr>
-        <w:t xml:space="preserve">aucun email</w:t>
-      </w:r>
-      <w:r>
-        <w:rPr/>
-        <w:t xml:space="preserve">, un identifiant de connexion est créé automatiquement à partir de son numéro de téléphone — ce n'est pas une adresse email utilisable, seulement un identifiant de connexion.</w:t>
-      </w:r>
-    </w:p>
-    <w:p>
-      <w:pPr>
-        <w:numPr>
-          <w:ilvl w:val="0"/>
-          <w:numId w:val="20"/>
-        </w:numPr>
-        <w:spacing w:lineRule="auto"/>
-      </w:pPr>
-      <w:r>
-        <w:rPr>
-          <w:b/>
-        </w:rPr>
-        <w:t xml:space="preserve">Rejeter</w:t>
-      </w:r>
-      <w:r>
-        <w:rPr/>
-        <w:t xml:space="preserve"> : un motif est obligatoire ; la demande reste visible avec son statut et le motif, pour garder une trace.</w:t>
-      </w:r>
-    </w:p>
-    <w:p>
-      <w:pPr>
-        <w:pStyle w:val="Heading3"/>
-        <w:spacing w:lineRule="auto"/>
-      </w:pPr>
-      <w:r>
-        <w:rPr/>
-        <w:t xml:space="preserve">Première connexion du parent</w:t>
-      </w:r>
-    </w:p>
-    <w:p>
-      <w:pPr>
-        <w:spacing w:lineRule="auto"/>
-      </w:pPr>
-      <w:r>
-        <w:rPr/>
-        <w:t xml:space="preserve">Un parent dont le compte vient d'être créé </w:t>
-      </w:r>
-      <w:r>
-        <w:rPr>
-          <w:b/>
-        </w:rPr>
-        <w:t xml:space="preserve">doit changer son mot de passe provisoire</w:t>
-      </w:r>
-      <w:r>
-        <w:rPr/>
-        <w:t xml:space="preserve"> dès sa première connexion — l'application l'amène automatiquement sur cet écran et ne laisse pas accéder au reste du site tant que ce n'est pas fait.</w:t>
-      </w:r>
-    </w:p>
-    <w:p>
-      <w:pPr>
-        <w:pStyle w:val="Heading2"/>
-        <w:spacing w:lineRule="auto"/>
-      </w:pPr>
-      <w:r>
-        <w:rPr/>
-        <w:t xml:space="preserve">16. Paramètres (administrateur uniquement)</w:t>
+        <w:t xml:space="preserve">10. Contrôle d'accès à la cantine</w:t>
       </w:r>
     </w:p>
     <w:p>
@@ -4814,12 +4239,12 @@
           <wp:inline distB="0" distL="0" distR="0" distT="0">
             <wp:extent cx="5715000" cy="3571875"/>
             <wp:effectExtent b="0" l="0" r="0" t="0"/>
-            <wp:docPr id="22" name="image-uWMaOWeMbc3qrOoHoHwrg.png"/>
+            <wp:docPr id="22" name="image-sXQqxSCE-T82LdwCsLvst.png"/>
             <a:graphic>
               <a:graphicData uri="http://schemas.openxmlformats.org/drawingml/2006/picture">
                 <pic:pic>
                   <pic:nvPicPr>
-                    <pic:cNvPr id="22" name="image-uWMaOWeMbc3qrOoHoHwrg.png" descr="Écran des paramètres"/>
+                    <pic:cNvPr id="22" name="image-sXQqxSCE-T82LdwCsLvst.png" descr="Écran de contrôle d'accès"/>
                     <pic:cNvPicPr/>
                   </pic:nvPicPr>
                   <pic:blipFill>
@@ -4845,233 +4270,77 @@
     </w:p>
     <w:p>
       <w:pPr>
-        <w:spacing w:lineRule="auto"/>
-      </w:pPr>
-      <w:r>
-        <w:rPr/>
-        <w:t xml:space="preserve">Les réglages sont regroupés par thème dans des blocs dépliables (Contrôle d'accès cantine, Notifications, Paiements, Apparence, Organisation) — cliquer sur l'intitulé d'un bloc l'ouvre ou le referme.</w:t>
-      </w:r>
-    </w:p>
-    <w:p>
-      <w:pPr>
         <w:numPr>
           <w:ilvl w:val="0"/>
-          <w:numId w:val="22"/>
-        </w:numPr>
-        <w:spacing w:lineRule="auto"/>
-      </w:pPr>
-      <w:r>
-        <w:rPr/>
-        <w:t xml:space="preserve">Activer ou désactiver les notifications par email et par SMS.</w:t>
+          <w:numId w:val="14"/>
+        </w:numPr>
+        <w:spacing w:lineRule="auto"/>
+      </w:pPr>
+      <w:r>
+        <w:rPr/>
+        <w:t xml:space="preserve">La lecture du QR Code d'un élève à l'entrée de la cantine confirme l'accès en moins d'une seconde : ✓ accès accordé ou ✗ accès refusé (avec le motif affiché).</w:t>
       </w:r>
     </w:p>
     <w:p>
       <w:pPr>
         <w:numPr>
           <w:ilvl w:val="0"/>
-          <w:numId w:val="22"/>
-        </w:numPr>
-        <w:spacing w:lineRule="auto"/>
-      </w:pPr>
-      <w:r>
-        <w:rPr/>
-        <w:t xml:space="preserve">Activer ou désactiver la mise à jour automatique des informations hors-ligne du contrôle d'accès (§10) — activée par défaut.</w:t>
-      </w:r>
-    </w:p>
-    <w:p>
-      <w:pPr>
-        <w:numPr>
-          <w:ilvl w:val="0"/>
-          <w:numId w:val="22"/>
-        </w:numPr>
-        <w:spacing w:lineRule="auto"/>
-      </w:pPr>
-      <w:r>
-        <w:rPr/>
-        <w:t xml:space="preserve">Mode de paiement : par </w:t>
+          <w:numId w:val="14"/>
+        </w:numPr>
+        <w:spacing w:lineRule="auto"/>
+      </w:pPr>
+      <w:r>
+        <w:rPr/>
+        <w:t xml:space="preserve">Fonctionne même </w:t>
       </w:r>
       <w:r>
         <w:rPr>
           <w:b/>
         </w:rPr>
-        <w:t xml:space="preserve">abonnement</w:t>
-      </w:r>
-      <w:r>
-        <w:rPr/>
-        <w:t xml:space="preserve"> (accès pour tout le trimestre ou l'année) ou par </w:t>
-      </w:r>
-      <w:r>
-        <w:rPr>
-          <w:b/>
-        </w:rPr>
-        <w:t xml:space="preserve">crédits</w:t>
-      </w:r>
-      <w:r>
-        <w:rPr/>
-        <w:t xml:space="preserve"> (montant débité à chaque repas, avec un tarif réglable) — les deux modes peuvent coexister, chaque élève utilisant l'un ou l'autre.</w:t>
+        <w:t xml:space="preserve">sans connexion internet</w:t>
+      </w:r>
+      <w:r>
+        <w:rPr/>
+        <w:t xml:space="preserve"> : l'appareil garde en mémoire, pendant 24 heures, la liste des élèves et leur statut d'accès, et se remet à jour automatiquement dès que la connexion revient.</w:t>
       </w:r>
     </w:p>
     <w:p>
       <w:pPr>
         <w:numPr>
           <w:ilvl w:val="0"/>
-          <w:numId w:val="22"/>
-        </w:numPr>
-        <w:spacing w:lineRule="auto"/>
-      </w:pPr>
-      <w:r>
-        <w:rPr/>
-        <w:t xml:space="preserve">Délai de grâce par défaut (7 jours), qui peut être ajusté établissement par établissement (§6).</w:t>
+          <w:numId w:val="14"/>
+        </w:numPr>
+        <w:spacing w:lineRule="auto"/>
+      </w:pPr>
+      <w:r>
+        <w:rPr/>
+        <w:t xml:space="preserve">Une barre d'état indique si l'appareil est « En ligne » ou « Hors ligne », l'état de ces informations enregistrées à l'avance (absentes, ou datées avec le nombre d'élèves couverts), et propose un bouton pour forcer la mise à jour manuellement.</w:t>
       </w:r>
     </w:p>
     <w:p>
       <w:pPr>
         <w:numPr>
           <w:ilvl w:val="0"/>
-          <w:numId w:val="22"/>
-        </w:numPr>
-        <w:spacing w:lineRule="auto"/>
-      </w:pPr>
-      <w:r>
-        <w:rPr/>
-        <w:t xml:space="preserve">Service de paiement actif.</w:t>
+          <w:numId w:val="14"/>
+        </w:numPr>
+        <w:spacing w:lineRule="auto"/>
+      </w:pPr>
+      <w:r>
+        <w:rPr/>
+        <w:t xml:space="preserve">Par défaut, ces informations se mettent à jour automatiquement en arrière-plan dès l'ouverture de l'écran, si une connexion est disponible — ce comportement peut être désactivé dans les Paramètres (§16) pour ne garder que la mise à jour manuelle.</w:t>
       </w:r>
     </w:p>
     <w:p>
       <w:pPr>
         <w:numPr>
           <w:ilvl w:val="0"/>
-          <w:numId w:val="22"/>
-        </w:numPr>
-        <w:spacing w:lineRule="auto"/>
-      </w:pPr>
-      <w:r>
-        <w:rPr/>
-        <w:t xml:space="preserve">Image de fond personnalisée pour l'écran de connexion.</w:t>
-      </w:r>
-    </w:p>
-    <w:p>
-      <w:pPr>
-        <w:pStyle w:val="Heading3"/>
-        <w:spacing w:lineRule="auto"/>
-      </w:pPr>
-      <w:r>
-        <w:rPr/>
-        <w:t xml:space="preserve">Personnalisation par établissement (image, nom, coordonnées)</w:t>
-      </w:r>
-    </w:p>
-    <w:p>
-      <w:pPr>
-        <w:spacing w:lineRule="auto"/>
-      </w:pPr>
-      <w:r>
-        <w:rPr/>
-        <w:t xml:space="preserve">Une section « Organisation » permet d'adapter l'application à l'identité du client :</w:t>
-      </w:r>
-    </w:p>
-    <w:p>
-      <w:pPr>
-        <w:numPr>
-          <w:ilvl w:val="0"/>
-          <w:numId w:val="23"/>
-        </w:numPr>
-        <w:spacing w:lineRule="auto"/>
-      </w:pPr>
-      <w:r>
-        <w:rPr>
-          <w:b/>
-        </w:rPr>
-        <w:t xml:space="preserve">Logo</w:t>
-      </w:r>
-      <w:r>
-        <w:rPr/>
-        <w:t xml:space="preserve"> : à téléverser directement depuis cet écran — il remplace l'icône par défaut en haut de chaque page de l'application.</w:t>
-      </w:r>
-    </w:p>
-    <w:p>
-      <w:pPr>
-        <w:numPr>
-          <w:ilvl w:val="0"/>
-          <w:numId w:val="23"/>
-        </w:numPr>
-        <w:spacing w:lineRule="auto"/>
-      </w:pPr>
-      <w:r>
-        <w:rPr>
-          <w:b/>
-        </w:rPr>
-        <w:t xml:space="preserve">Nom du client</w:t>
-      </w:r>
-      <w:r>
-        <w:rPr/>
-        <w:t xml:space="preserve"> : remplace « Cantine Connect » dans l'en-tête de l'application.</w:t>
-      </w:r>
-    </w:p>
-    <w:p>
-      <w:pPr>
-        <w:numPr>
-          <w:ilvl w:val="0"/>
-          <w:numId w:val="23"/>
-        </w:numPr>
-        <w:spacing w:lineRule="auto"/>
-      </w:pPr>
-      <w:r>
-        <w:rPr>
-          <w:b/>
-        </w:rPr>
-        <w:t xml:space="preserve">Adresse / lieu</w:t>
-      </w:r>
-      <w:r>
-        <w:rPr/>
-        <w:t xml:space="preserve">, </w:t>
-      </w:r>
-      <w:r>
-        <w:rPr>
-          <w:b/>
-        </w:rPr>
-        <w:t xml:space="preserve">téléphone</w:t>
-      </w:r>
-      <w:r>
-        <w:rPr/>
-        <w:t xml:space="preserve">, </w:t>
-      </w:r>
-      <w:r>
-        <w:rPr>
-          <w:b/>
-        </w:rPr>
-        <w:t xml:space="preserve">email</w:t>
-      </w:r>
-      <w:r>
-        <w:rPr/>
-        <w:t xml:space="preserve"> : coordonnées de contact affichées comme référence.</w:t>
-      </w:r>
-    </w:p>
-    <w:p>
-      <w:pPr>
-        <w:numPr>
-          <w:ilvl w:val="0"/>
-          <w:numId w:val="23"/>
-        </w:numPr>
-        <w:spacing w:lineRule="auto"/>
-      </w:pPr>
-      <w:r>
-        <w:rPr>
-          <w:b/>
-        </w:rPr>
-        <w:t xml:space="preserve">Numéro Mobile Money</w:t>
-      </w:r>
-      <w:r>
-        <w:rPr/>
-        <w:t xml:space="preserve"> : numéro communiqué aux parents pour un envoi manuel d'argent — c'est une information affichée aux parents, elle ne change rien au fonctionnement des paiements en ligne (§9).</w:t>
-      </w:r>
-    </w:p>
-    <w:p>
-      <w:pPr>
-        <w:spacing w:lineRule="auto"/>
-      </w:pPr>
-      <w:r>
-        <w:rPr/>
-        <w:t xml:space="preserve">Tant qu'aucune de ces informations n'est renseignée, l'application garde son apparence par défaut (icône par défaut et nom « Cantine Connect »).</w:t>
+          <w:numId w:val="14"/>
+        </w:numPr>
+        <w:spacing w:lineRule="auto"/>
+      </w:pPr>
+      <w:r>
+        <w:rPr/>
+        <w:t xml:space="preserve">Non accessible à un parent.</w:t>
       </w:r>
     </w:p>
     <w:p>
@@ -5081,74 +4350,7 @@
       </w:pPr>
       <w:r>
         <w:rPr/>
-        <w:t xml:space="preserve">17. Paiement et notifications — état de la mise en service</w:t>
-      </w:r>
-    </w:p>
-    <w:p>
-      <w:pPr>
-        <w:numPr>
-          <w:ilvl w:val="0"/>
-          <w:numId w:val="24"/>
-        </w:numPr>
-        <w:spacing w:lineRule="auto"/>
-      </w:pPr>
-      <w:r>
-        <w:rPr>
-          <w:b/>
-        </w:rPr>
-        <w:t xml:space="preserve">Paiement</w:t>
-      </w:r>
-      <w:r>
-        <w:rPr/>
-        <w:t xml:space="preserve"> : la connexion avec le service de paiement Mobile Money est réelle, pas une simulation — dès que le client fournit ses identifiants marchands réels, le paiement fonctionne sans développement supplémentaire. Sans ces identifiants, une tentative de paiement échoue avec un message clair plutôt qu'un lien qui ne fonctionne pas.</w:t>
-      </w:r>
-    </w:p>
-    <w:p>
-      <w:pPr>
-        <w:numPr>
-          <w:ilvl w:val="0"/>
-          <w:numId w:val="24"/>
-        </w:numPr>
-        <w:spacing w:lineRule="auto"/>
-      </w:pPr>
-      <w:r>
-        <w:rPr>
-          <w:b/>
-        </w:rPr>
-        <w:t xml:space="preserve">SMS</w:t>
-      </w:r>
-      <w:r>
-        <w:rPr/>
-        <w:t xml:space="preserve"> : la connexion avec le fournisseur de SMS est réelle. Tant qu'aucun compte n'est configuré, les SMS sont simplement enregistrés dans les journaux techniques (aucun envoi réel, et cela ne bloque rien pour l'utilisateur).</w:t>
-      </w:r>
-    </w:p>
-    <w:p>
-      <w:pPr>
-        <w:numPr>
-          <w:ilvl w:val="0"/>
-          <w:numId w:val="24"/>
-        </w:numPr>
-        <w:spacing w:lineRule="auto"/>
-      </w:pPr>
-      <w:r>
-        <w:rPr>
-          <w:b/>
-        </w:rPr>
-        <w:t xml:space="preserve">Email</w:t>
-      </w:r>
-      <w:r>
-        <w:rPr/>
-        <w:t xml:space="preserve"> : fonctionne dès que les paramètres techniques d'envoi (compte email dédié) sont renseignés.</w:t>
-      </w:r>
-    </w:p>
-    <w:p>
-      <w:pPr>
-        <w:pStyle w:val="Heading2"/>
-        <w:spacing w:lineRule="auto"/>
-      </w:pPr>
-      <w:r>
-        <w:rPr/>
-        <w:t xml:space="preserve">18. Support et à propos</w:t>
+        <w:t xml:space="preserve">11. Historique des passages</w:t>
       </w:r>
     </w:p>
     <w:p>
@@ -5161,12 +4363,12 @@
           <wp:inline distB="0" distL="0" distR="0" distT="0">
             <wp:extent cx="5715000" cy="3571875"/>
             <wp:effectExtent b="0" l="0" r="0" t="0"/>
-            <wp:docPr id="23" name="image-CsYfbFMQ5WD8g47mCPWKZ.png"/>
+            <wp:docPr id="23" name="image-jB4WVpcgbt1cFD_azRule.png"/>
             <a:graphic>
               <a:graphicData uri="http://schemas.openxmlformats.org/drawingml/2006/picture">
                 <pic:pic>
                   <pic:nvPicPr>
-                    <pic:cNvPr id="23" name="image-CsYfbFMQ5WD8g47mCPWKZ.png" descr="Fenêtre « À propos »"/>
+                    <pic:cNvPr id="23" name="image-jB4WVpcgbt1cFD_azRule.png" descr="Historique des passages"/>
                     <pic:cNvPicPr/>
                   </pic:nvPicPr>
                   <pic:blipFill>
@@ -5192,6 +4394,967 @@
     </w:p>
     <w:p>
       <w:pPr>
+        <w:numPr>
+          <w:ilvl w:val="0"/>
+          <w:numId w:val="15"/>
+        </w:numPr>
+        <w:spacing w:lineRule="auto"/>
+      </w:pPr>
+      <w:r>
+        <w:rPr>
+          <w:b/>
+        </w:rPr>
+        <w:t xml:space="preserve">Administrateur / gestionnaire / caissier</w:t>
+      </w:r>
+      <w:r>
+        <w:rPr/>
+        <w:t xml:space="preserve"> : historique complet, filtrable par date, établissement et résultat, avec recherche d'élève ; export au format tableau (CSV) ; la modification ou la suppression d'un passage sont réservées à l'administrateur.</w:t>
+      </w:r>
+    </w:p>
+    <w:p>
+      <w:pPr>
+        <w:numPr>
+          <w:ilvl w:val="0"/>
+          <w:numId w:val="15"/>
+        </w:numPr>
+        <w:spacing w:lineRule="auto"/>
+      </w:pPr>
+      <w:r>
+        <w:rPr>
+          <w:b/>
+        </w:rPr>
+        <w:t xml:space="preserve">Parent</w:t>
+      </w:r>
+      <w:r>
+        <w:rPr/>
+        <w:t xml:space="preserve"> : ne voit que les passages de ses propres enfants ; le filtre par établissement et la colonne « Établissement » du tableau sont masqués (non utiles pour un parent).</w:t>
+      </w:r>
+    </w:p>
+    <w:p>
+      <w:pPr>
+        <w:pStyle w:val="Heading2"/>
+        <w:spacing w:lineRule="auto"/>
+      </w:pPr>
+      <w:r>
+        <w:rPr/>
+        <w:t xml:space="preserve">12. Rapports (administrateur / gestionnaire / caissier) — première version</w:t>
+      </w:r>
+    </w:p>
+    <w:p>
+      <w:pPr>
+        <w:ind w:left="284"/>
+        <w:jc w:val="both"/>
+        <w:spacing w:lineRule="auto"/>
+      </w:pPr>
+      <w:r>
+        <w:rPr/>
+        <w:t xml:space="preserve">Première version de ce module, mise à disposition pour recueillir des retours avant amélioration. Non accessible à un parent.</w:t>
+      </w:r>
+    </w:p>
+    <w:p>
+      <w:pPr>
+        <w:numPr>
+          <w:ilvl w:val="0"/>
+          <w:numId w:val="16"/>
+        </w:numPr>
+        <w:spacing w:lineRule="auto"/>
+      </w:pPr>
+      <w:r>
+        <w:rPr/>
+        <w:t xml:space="preserve">On choisit une période (date de début/fin) et, si besoin, un établissement (ce filtre ne s'applique qu'aux passages à la cantine), puis on clique sur </w:t>
+      </w:r>
+      <w:r>
+        <w:rPr>
+          <w:b/>
+        </w:rPr>
+        <w:t xml:space="preserve">« Générer le rapport »</w:t>
+      </w:r>
+      <w:r>
+        <w:rPr/>
+        <w:t xml:space="preserve">.</w:t>
+      </w:r>
+    </w:p>
+    <w:p>
+      <w:pPr>
+        <w:numPr>
+          <w:ilvl w:val="0"/>
+          <w:numId w:val="16"/>
+        </w:numPr>
+        <w:spacing w:lineRule="auto"/>
+      </w:pPr>
+      <w:r>
+        <w:rPr/>
+        <w:t xml:space="preserve">Trois onglets s'affichent une fois le rapport généré :</w:t>
+      </w:r>
+    </w:p>
+    <w:p>
+      <w:pPr>
+        <w:numPr>
+          <w:ilvl w:val="1"/>
+          <w:numId w:val="17"/>
+        </w:numPr>
+        <w:spacing w:lineRule="auto"/>
+      </w:pPr>
+      <w:r>
+        <w:rPr>
+          <w:b/>
+        </w:rPr>
+        <w:t xml:space="preserve">Résumé</w:t>
+      </w:r>
+      <w:r>
+        <w:rPr/>
+        <w:t xml:space="preserve"> : montant total encaissé, répartition des paiements par statut, répartition des passages par résultat, taux d'accès.</w:t>
+      </w:r>
+    </w:p>
+    <w:p>
+      <w:pPr>
+        <w:numPr>
+          <w:ilvl w:val="1"/>
+          <w:numId w:val="17"/>
+        </w:numPr>
+        <w:spacing w:lineRule="auto"/>
+      </w:pPr>
+      <w:r>
+        <w:rPr>
+          <w:b/>
+        </w:rPr>
+        <w:t xml:space="preserve">Paiements</w:t>
+      </w:r>
+      <w:r>
+        <w:rPr/>
+        <w:t xml:space="preserve"> : liste détaillée des transactions de la période.</w:t>
+      </w:r>
+    </w:p>
+    <w:p>
+      <w:pPr>
+        <w:numPr>
+          <w:ilvl w:val="1"/>
+          <w:numId w:val="17"/>
+        </w:numPr>
+        <w:spacing w:lineRule="auto"/>
+      </w:pPr>
+      <w:r>
+        <w:rPr>
+          <w:b/>
+        </w:rPr>
+        <w:t xml:space="preserve">Passages</w:t>
+      </w:r>
+      <w:r>
+        <w:rPr/>
+        <w:t xml:space="preserve"> : liste détaillée des passages à la cantine sur la période.</w:t>
+      </w:r>
+    </w:p>
+    <w:p>
+      <w:pPr>
+        <w:numPr>
+          <w:ilvl w:val="0"/>
+          <w:numId w:val="16"/>
+        </w:numPr>
+        <w:spacing w:lineRule="auto"/>
+      </w:pPr>
+      <w:r>
+        <w:rPr>
+          <w:b/>
+        </w:rPr>
+        <w:t xml:space="preserve">Exporter en Excel</w:t>
+      </w:r>
+      <w:r>
+        <w:rPr/>
+        <w:t xml:space="preserve"> : télécharge un fichier avec 3 feuilles (Résumé / Paiements / Passages) couvrant toute la période choisie.</w:t>
+      </w:r>
+    </w:p>
+    <w:p>
+      <w:pPr>
+        <w:numPr>
+          <w:ilvl w:val="0"/>
+          <w:numId w:val="16"/>
+        </w:numPr>
+        <w:spacing w:lineRule="auto"/>
+      </w:pPr>
+      <w:r>
+        <w:rPr>
+          <w:b/>
+        </w:rPr>
+        <w:t xml:space="preserve">Imprimer / PDF</w:t>
+      </w:r>
+      <w:r>
+        <w:rPr/>
+        <w:t xml:space="preserve"> (par onglet) : ouvre la fenêtre d'impression du navigateur, limitée au contenu de l'onglet affiché — choisir « Enregistrer au format PDF » pour obtenir un fichier PDF.</w:t>
+      </w:r>
+    </w:p>
+    <w:p>
+      <w:pPr>
+        <w:numPr>
+          <w:ilvl w:val="0"/>
+          <w:numId w:val="16"/>
+        </w:numPr>
+        <w:spacing w:lineRule="auto"/>
+      </w:pPr>
+      <w:r>
+        <w:rPr/>
+        <w:t xml:space="preserve">Sur une période avec beaucoup de données, un message avertit si le rapport a dû être limité (au delà de 10 000 lignes) : il suffit alors de réduire la période choisie.</w:t>
+      </w:r>
+    </w:p>
+    <w:p>
+      <w:pPr>
+        <w:pStyle w:val="Heading2"/>
+        <w:spacing w:lineRule="auto"/>
+      </w:pPr>
+      <w:r>
+        <w:rPr/>
+        <w:t xml:space="preserve">13. Comptes utilisateurs (administrateur uniquement)</w:t>
+      </w:r>
+    </w:p>
+    <w:p>
+      <w:pPr>
+        <w:spacing w:lineRule="auto"/>
+      </w:pPr>
+      <w:r>
+        <w:rPr/>
+        <w:drawing>
+          <wp:inline distB="0" distL="0" distR="0" distT="0">
+            <wp:extent cx="5715000" cy="3571875"/>
+            <wp:effectExtent b="0" l="0" r="0" t="0"/>
+            <wp:docPr id="24" name="image--VgBH9zRt9T_zK_BsS4Eg.png"/>
+            <a:graphic>
+              <a:graphicData uri="http://schemas.openxmlformats.org/drawingml/2006/picture">
+                <pic:pic>
+                  <pic:nvPicPr>
+                    <pic:cNvPr id="24" name="image--VgBH9zRt9T_zK_BsS4Eg.png" descr="Liste des comptes utilisateurs"/>
+                    <pic:cNvPicPr/>
+                  </pic:nvPicPr>
+                  <pic:blipFill>
+                    <a:blip r:embed="rId29" cstate="print"/>
+                    <a:srcRect b="0" l="0" r="0" t="0"/>
+                    <a:stretch>
+                      <a:fillRect/>
+                    </a:stretch>
+                  </pic:blipFill>
+                  <pic:spPr>
+                    <a:xfrm>
+                      <a:off x="0" y="0"/>
+                      <a:ext cx="5715000" cy="3571875"/>
+                    </a:xfrm>
+                    <a:prstGeom prst="rect"/>
+                  </pic:spPr>
+                </pic:pic>
+              </a:graphicData>
+            </a:graphic>
+          </wp:inline>
+        </w:drawing>
+      </w:r>
+    </w:p>
+    <w:p>
+      <w:pPr>
+        <w:numPr>
+          <w:ilvl w:val="0"/>
+          <w:numId w:val="18"/>
+        </w:numPr>
+        <w:spacing w:lineRule="auto"/>
+      </w:pPr>
+      <w:r>
+        <w:rPr/>
+        <w:t xml:space="preserve">Création d'un compte : nom, prénom, email, </w:t>
+      </w:r>
+      <w:r>
+        <w:rPr>
+          <w:b/>
+        </w:rPr>
+        <w:t xml:space="preserve">numéro de téléphone (obligatoire, unique)</w:t>
+      </w:r>
+      <w:r>
+        <w:rPr/>
+        <w:t xml:space="preserve">, mot de passe, rôle (Administrateur, Gestionnaire, Caissier ou Parent).</w:t>
+      </w:r>
+    </w:p>
+    <w:p>
+      <w:pPr>
+        <w:numPr>
+          <w:ilvl w:val="0"/>
+          <w:numId w:val="18"/>
+        </w:numPr>
+        <w:spacing w:lineRule="auto"/>
+      </w:pPr>
+      <w:r>
+        <w:rPr/>
+        <w:t xml:space="preserve">Modification, changement de rôle directement dans le tableau, désactivation/réactivation, suppression définitive.</w:t>
+      </w:r>
+    </w:p>
+    <w:p>
+      <w:pPr>
+        <w:numPr>
+          <w:ilvl w:val="0"/>
+          <w:numId w:val="18"/>
+        </w:numPr>
+        <w:spacing w:lineRule="auto"/>
+      </w:pPr>
+      <w:r>
+        <w:rPr/>
+        <w:t xml:space="preserve">Impossible de désactiver ou de supprimer le tout dernier compte administrateur du système.</w:t>
+      </w:r>
+    </w:p>
+    <w:p>
+      <w:pPr>
+        <w:numPr>
+          <w:ilvl w:val="0"/>
+          <w:numId w:val="18"/>
+        </w:numPr>
+        <w:spacing w:lineRule="auto"/>
+      </w:pPr>
+      <w:r>
+        <w:rPr/>
+        <w:t xml:space="preserve">Impossible de désactiver ou de supprimer son propre compte.</w:t>
+      </w:r>
+    </w:p>
+    <w:p>
+      <w:pPr>
+        <w:numPr>
+          <w:ilvl w:val="0"/>
+          <w:numId w:val="18"/>
+        </w:numPr>
+        <w:spacing w:lineRule="auto"/>
+      </w:pPr>
+      <w:r>
+        <w:rPr>
+          <w:b/>
+        </w:rPr>
+        <w:t xml:space="preserve">Recherche</w:t>
+      </w:r>
+      <w:r>
+        <w:rPr/>
+        <w:t xml:space="preserve"> par email, nom, prénom ou téléphone ; filtres par rôle, par statut (actif ou inactif) et par période de création — tous combinables.</w:t>
+      </w:r>
+    </w:p>
+    <w:p>
+      <w:pPr>
+        <w:pStyle w:val="Heading2"/>
+        <w:spacing w:lineRule="auto"/>
+      </w:pPr>
+      <w:r>
+        <w:rPr/>
+        <w:t xml:space="preserve">14. Parents (rattacher des enfants — administrateur uniquement)</w:t>
+      </w:r>
+    </w:p>
+    <w:p>
+      <w:pPr>
+        <w:numPr>
+          <w:ilvl w:val="0"/>
+          <w:numId w:val="19"/>
+        </w:numPr>
+        <w:spacing w:lineRule="auto"/>
+      </w:pPr>
+      <w:r>
+        <w:rPr/>
+        <w:t xml:space="preserve">Permet de rattacher un compte parent à un ou plusieurs élèves.</w:t>
+      </w:r>
+    </w:p>
+    <w:p>
+      <w:pPr>
+        <w:numPr>
+          <w:ilvl w:val="0"/>
+          <w:numId w:val="19"/>
+        </w:numPr>
+        <w:spacing w:lineRule="auto"/>
+      </w:pPr>
+      <w:r>
+        <w:rPr>
+          <w:b/>
+        </w:rPr>
+        <w:t xml:space="preserve">Choix du compte parent</w:t>
+      </w:r>
+      <w:r>
+        <w:rPr/>
+        <w:t xml:space="preserve"> : recherche par numéro de téléphone, nom ou prénom (le compte doit déjà exister — le créer d'abord dans « Comptes utilisateurs », ou passer par une demande d'accès validée, §15).</w:t>
+      </w:r>
+    </w:p>
+    <w:p>
+      <w:pPr>
+        <w:numPr>
+          <w:ilvl w:val="0"/>
+          <w:numId w:val="19"/>
+        </w:numPr>
+        <w:spacing w:lineRule="auto"/>
+      </w:pPr>
+      <w:r>
+        <w:rPr>
+          <w:b/>
+        </w:rPr>
+        <w:t xml:space="preserve">Choix des enfants</w:t>
+      </w:r>
+      <w:r>
+        <w:rPr/>
+        <w:t xml:space="preserve"> : recherche par matricule, nom ou prénom, plusieurs enfants peuvent être sélectionnés à la fois.</w:t>
+      </w:r>
+    </w:p>
+    <w:p>
+      <w:pPr>
+        <w:numPr>
+          <w:ilvl w:val="0"/>
+          <w:numId w:val="19"/>
+        </w:numPr>
+        <w:spacing w:lineRule="auto"/>
+      </w:pPr>
+      <w:r>
+        <w:rPr/>
+        <w:t xml:space="preserve">Modification des enfants rattachés, suppression du lien (les fiches des élèves ne sont pas supprimées pour autant).</w:t>
+      </w:r>
+    </w:p>
+    <w:p>
+      <w:pPr>
+        <w:numPr>
+          <w:ilvl w:val="0"/>
+          <w:numId w:val="19"/>
+        </w:numPr>
+        <w:spacing w:lineRule="auto"/>
+      </w:pPr>
+      <w:r>
+        <w:rPr>
+          <w:b/>
+        </w:rPr>
+        <w:t xml:space="preserve">Recherche</w:t>
+      </w:r>
+      <w:r>
+        <w:rPr/>
+        <w:t xml:space="preserve"> sur la liste principale par </w:t>
+      </w:r>
+      <w:r>
+        <w:rPr>
+          <w:b/>
+        </w:rPr>
+        <w:t xml:space="preserve">email ou numéro de téléphone</w:t>
+      </w:r>
+      <w:r>
+        <w:rPr/>
+        <w:t xml:space="preserve"> du compte parent.</w:t>
+      </w:r>
+    </w:p>
+    <w:p>
+      <w:pPr>
+        <w:pStyle w:val="Heading2"/>
+        <w:spacing w:lineRule="auto"/>
+      </w:pPr>
+      <w:r>
+        <w:rPr/>
+        <w:t xml:space="preserve">15. Demandes d'accès (validation par l'administrateur)</w:t>
+      </w:r>
+    </w:p>
+    <w:p>
+      <w:pPr>
+        <w:spacing w:lineRule="auto"/>
+      </w:pPr>
+      <w:r>
+        <w:rPr/>
+        <w:t xml:space="preserve">Sur l'écran « Demandes d'accès » (réservé à l'administrateur), on retrouve la liste des demandes soumises depuis la page publique (§3), que l'on peut filtrer par statut (En attente / Validées / Rejetées). Chaque ligne a un bouton « Voir détails » qui ouvre une fiche complète du demandeur (identité, tous les numéros de téléphone, email, résidence, historique du traitement) — pour une demande en attente, c'est depuis cette fiche que l'on </w:t>
+      </w:r>
+      <w:r>
+        <w:rPr>
+          <w:b/>
+        </w:rPr>
+        <w:t xml:space="preserve">valide ou rejette</w:t>
+      </w:r>
+      <w:r>
+        <w:rPr/>
+        <w:t xml:space="preserve">, afin de toujours vérifier les informations avant de créer un compte.</w:t>
+      </w:r>
+    </w:p>
+    <w:p>
+      <w:pPr>
+        <w:numPr>
+          <w:ilvl w:val="0"/>
+          <w:numId w:val="20"/>
+        </w:numPr>
+        <w:spacing w:lineRule="auto"/>
+      </w:pPr>
+      <w:r>
+        <w:rPr>
+          <w:b/>
+        </w:rPr>
+        <w:t xml:space="preserve">Valider</w:t>
+      </w:r>
+      <w:r>
+        <w:rPr/>
+        <w:t xml:space="preserve"> : crée le compte du parent, avec un identifiant de connexion et un mot de passe provisoire générés automatiquement. Si les notifications par email et SMS sont activées (voir §16 Paramètres), le parent les reçoit automatiquement ; </w:t>
+      </w:r>
+      <w:r>
+        <w:rPr>
+          <w:b/>
+        </w:rPr>
+        <w:t xml:space="preserve">dans tous les cas</w:t>
+      </w:r>
+      <w:r>
+        <w:rPr/>
+        <w:t xml:space="preserve">, une fenêtre affiche l'identifiant et le mot de passe à l'écran, pour pouvoir les communiquer manuellement si besoin.</w:t>
+      </w:r>
+    </w:p>
+    <w:p>
+      <w:pPr>
+        <w:numPr>
+          <w:ilvl w:val="1"/>
+          <w:numId w:val="21"/>
+        </w:numPr>
+        <w:spacing w:lineRule="auto"/>
+      </w:pPr>
+      <w:r>
+        <w:rPr/>
+        <w:t xml:space="preserve">Si le parent n'a donné </w:t>
+      </w:r>
+      <w:r>
+        <w:rPr>
+          <w:b/>
+        </w:rPr>
+        <w:t xml:space="preserve">aucun email</w:t>
+      </w:r>
+      <w:r>
+        <w:rPr/>
+        <w:t xml:space="preserve">, un identifiant de connexion est créé automatiquement à partir de son numéro de téléphone — ce n'est pas une adresse email utilisable, seulement un identifiant de connexion.</w:t>
+      </w:r>
+    </w:p>
+    <w:p>
+      <w:pPr>
+        <w:numPr>
+          <w:ilvl w:val="0"/>
+          <w:numId w:val="20"/>
+        </w:numPr>
+        <w:spacing w:lineRule="auto"/>
+      </w:pPr>
+      <w:r>
+        <w:rPr>
+          <w:b/>
+        </w:rPr>
+        <w:t xml:space="preserve">Rejeter</w:t>
+      </w:r>
+      <w:r>
+        <w:rPr/>
+        <w:t xml:space="preserve"> : un motif est obligatoire ; la demande reste visible avec son statut et le motif, pour garder une trace.</w:t>
+      </w:r>
+    </w:p>
+    <w:p>
+      <w:pPr>
+        <w:pStyle w:val="Heading3"/>
+        <w:spacing w:lineRule="auto"/>
+      </w:pPr>
+      <w:r>
+        <w:rPr/>
+        <w:t xml:space="preserve">Première connexion du parent</w:t>
+      </w:r>
+    </w:p>
+    <w:p>
+      <w:pPr>
+        <w:spacing w:lineRule="auto"/>
+      </w:pPr>
+      <w:r>
+        <w:rPr/>
+        <w:t xml:space="preserve">Un parent dont le compte vient d'être créé </w:t>
+      </w:r>
+      <w:r>
+        <w:rPr>
+          <w:b/>
+        </w:rPr>
+        <w:t xml:space="preserve">doit changer son mot de passe provisoire</w:t>
+      </w:r>
+      <w:r>
+        <w:rPr/>
+        <w:t xml:space="preserve"> dès sa première connexion — l'application l'amène automatiquement sur cet écran et ne laisse pas accéder au reste du site tant que ce n'est pas fait.</w:t>
+      </w:r>
+    </w:p>
+    <w:p>
+      <w:pPr>
+        <w:pStyle w:val="Heading2"/>
+        <w:spacing w:lineRule="auto"/>
+      </w:pPr>
+      <w:r>
+        <w:rPr/>
+        <w:t xml:space="preserve">16. Paramètres (administrateur uniquement)</w:t>
+      </w:r>
+    </w:p>
+    <w:p>
+      <w:pPr>
+        <w:spacing w:lineRule="auto"/>
+      </w:pPr>
+      <w:r>
+        <w:rPr/>
+        <w:drawing>
+          <wp:inline distB="0" distL="0" distR="0" distT="0">
+            <wp:extent cx="5715000" cy="3571875"/>
+            <wp:effectExtent b="0" l="0" r="0" t="0"/>
+            <wp:docPr id="25" name="image-n6QMqzFq7kQhTsqllrDzV.png"/>
+            <a:graphic>
+              <a:graphicData uri="http://schemas.openxmlformats.org/drawingml/2006/picture">
+                <pic:pic>
+                  <pic:nvPicPr>
+                    <pic:cNvPr id="25" name="image-n6QMqzFq7kQhTsqllrDzV.png" descr="Écran des paramètres"/>
+                    <pic:cNvPicPr/>
+                  </pic:nvPicPr>
+                  <pic:blipFill>
+                    <a:blip r:embed="rId30" cstate="print"/>
+                    <a:srcRect b="0" l="0" r="0" t="0"/>
+                    <a:stretch>
+                      <a:fillRect/>
+                    </a:stretch>
+                  </pic:blipFill>
+                  <pic:spPr>
+                    <a:xfrm>
+                      <a:off x="0" y="0"/>
+                      <a:ext cx="5715000" cy="3571875"/>
+                    </a:xfrm>
+                    <a:prstGeom prst="rect"/>
+                  </pic:spPr>
+                </pic:pic>
+              </a:graphicData>
+            </a:graphic>
+          </wp:inline>
+        </w:drawing>
+      </w:r>
+    </w:p>
+    <w:p>
+      <w:pPr>
+        <w:spacing w:lineRule="auto"/>
+      </w:pPr>
+      <w:r>
+        <w:rPr/>
+        <w:t xml:space="preserve">Les réglages sont regroupés par thème dans des blocs dépliables (Contrôle d'accès cantine, Notifications, Paiements, Apparence, Organisation) — cliquer sur l'intitulé d'un bloc l'ouvre ou le referme.</w:t>
+      </w:r>
+    </w:p>
+    <w:p>
+      <w:pPr>
+        <w:numPr>
+          <w:ilvl w:val="0"/>
+          <w:numId w:val="22"/>
+        </w:numPr>
+        <w:spacing w:lineRule="auto"/>
+      </w:pPr>
+      <w:r>
+        <w:rPr/>
+        <w:t xml:space="preserve">Activer ou désactiver les notifications par email et par SMS.</w:t>
+      </w:r>
+    </w:p>
+    <w:p>
+      <w:pPr>
+        <w:numPr>
+          <w:ilvl w:val="0"/>
+          <w:numId w:val="22"/>
+        </w:numPr>
+        <w:spacing w:lineRule="auto"/>
+      </w:pPr>
+      <w:r>
+        <w:rPr/>
+        <w:t xml:space="preserve">Activer ou désactiver la mise à jour automatique des informations hors-ligne du contrôle d'accès (§10) — activée par défaut.</w:t>
+      </w:r>
+    </w:p>
+    <w:p>
+      <w:pPr>
+        <w:numPr>
+          <w:ilvl w:val="0"/>
+          <w:numId w:val="22"/>
+        </w:numPr>
+        <w:spacing w:lineRule="auto"/>
+      </w:pPr>
+      <w:r>
+        <w:rPr/>
+        <w:t xml:space="preserve">Mode de paiement : par </w:t>
+      </w:r>
+      <w:r>
+        <w:rPr>
+          <w:b/>
+        </w:rPr>
+        <w:t xml:space="preserve">abonnement</w:t>
+      </w:r>
+      <w:r>
+        <w:rPr/>
+        <w:t xml:space="preserve"> (accès pour tout le trimestre ou l'année) ou par </w:t>
+      </w:r>
+      <w:r>
+        <w:rPr>
+          <w:b/>
+        </w:rPr>
+        <w:t xml:space="preserve">crédits</w:t>
+      </w:r>
+      <w:r>
+        <w:rPr/>
+        <w:t xml:space="preserve"> (montant débité à chaque repas, avec un tarif réglable) — les deux modes peuvent coexister, chaque élève utilisant l'un ou l'autre.</w:t>
+      </w:r>
+    </w:p>
+    <w:p>
+      <w:pPr>
+        <w:numPr>
+          <w:ilvl w:val="0"/>
+          <w:numId w:val="22"/>
+        </w:numPr>
+        <w:spacing w:lineRule="auto"/>
+      </w:pPr>
+      <w:r>
+        <w:rPr/>
+        <w:t xml:space="preserve">Délai de grâce par défaut (7 jours), qui peut être ajusté établissement par établissement (§6).</w:t>
+      </w:r>
+    </w:p>
+    <w:p>
+      <w:pPr>
+        <w:numPr>
+          <w:ilvl w:val="0"/>
+          <w:numId w:val="22"/>
+        </w:numPr>
+        <w:spacing w:lineRule="auto"/>
+      </w:pPr>
+      <w:r>
+        <w:rPr/>
+        <w:t xml:space="preserve">Service de paiement actif.</w:t>
+      </w:r>
+    </w:p>
+    <w:p>
+      <w:pPr>
+        <w:numPr>
+          <w:ilvl w:val="0"/>
+          <w:numId w:val="22"/>
+        </w:numPr>
+        <w:spacing w:lineRule="auto"/>
+      </w:pPr>
+      <w:r>
+        <w:rPr/>
+        <w:t xml:space="preserve">Image de fond personnalisée pour l'écran de connexion.</w:t>
+      </w:r>
+    </w:p>
+    <w:p>
+      <w:pPr>
+        <w:pStyle w:val="Heading3"/>
+        <w:spacing w:lineRule="auto"/>
+      </w:pPr>
+      <w:r>
+        <w:rPr/>
+        <w:t xml:space="preserve">Personnalisation par établissement (image, nom, coordonnées)</w:t>
+      </w:r>
+    </w:p>
+    <w:p>
+      <w:pPr>
+        <w:spacing w:lineRule="auto"/>
+      </w:pPr>
+      <w:r>
+        <w:rPr/>
+        <w:t xml:space="preserve">Une section « Organisation » permet d'adapter l'application à l'identité du client :</w:t>
+      </w:r>
+    </w:p>
+    <w:p>
+      <w:pPr>
+        <w:numPr>
+          <w:ilvl w:val="0"/>
+          <w:numId w:val="23"/>
+        </w:numPr>
+        <w:spacing w:lineRule="auto"/>
+      </w:pPr>
+      <w:r>
+        <w:rPr>
+          <w:b/>
+        </w:rPr>
+        <w:t xml:space="preserve">Logo</w:t>
+      </w:r>
+      <w:r>
+        <w:rPr/>
+        <w:t xml:space="preserve"> : à téléverser directement depuis cet écran — il remplace l'icône par défaut en haut de chaque page de l'application.</w:t>
+      </w:r>
+    </w:p>
+    <w:p>
+      <w:pPr>
+        <w:numPr>
+          <w:ilvl w:val="0"/>
+          <w:numId w:val="23"/>
+        </w:numPr>
+        <w:spacing w:lineRule="auto"/>
+      </w:pPr>
+      <w:r>
+        <w:rPr>
+          <w:b/>
+        </w:rPr>
+        <w:t xml:space="preserve">Nom du client</w:t>
+      </w:r>
+      <w:r>
+        <w:rPr/>
+        <w:t xml:space="preserve"> : remplace « Cantine Connect » dans l'en-tête de l'application.</w:t>
+      </w:r>
+    </w:p>
+    <w:p>
+      <w:pPr>
+        <w:numPr>
+          <w:ilvl w:val="0"/>
+          <w:numId w:val="23"/>
+        </w:numPr>
+        <w:spacing w:lineRule="auto"/>
+      </w:pPr>
+      <w:r>
+        <w:rPr>
+          <w:b/>
+        </w:rPr>
+        <w:t xml:space="preserve">Adresse / lieu</w:t>
+      </w:r>
+      <w:r>
+        <w:rPr/>
+        <w:t xml:space="preserve">, </w:t>
+      </w:r>
+      <w:r>
+        <w:rPr>
+          <w:b/>
+        </w:rPr>
+        <w:t xml:space="preserve">téléphone</w:t>
+      </w:r>
+      <w:r>
+        <w:rPr/>
+        <w:t xml:space="preserve">, </w:t>
+      </w:r>
+      <w:r>
+        <w:rPr>
+          <w:b/>
+        </w:rPr>
+        <w:t xml:space="preserve">email</w:t>
+      </w:r>
+      <w:r>
+        <w:rPr/>
+        <w:t xml:space="preserve"> : coordonnées de contact affichées comme référence.</w:t>
+      </w:r>
+    </w:p>
+    <w:p>
+      <w:pPr>
+        <w:numPr>
+          <w:ilvl w:val="0"/>
+          <w:numId w:val="23"/>
+        </w:numPr>
+        <w:spacing w:lineRule="auto"/>
+      </w:pPr>
+      <w:r>
+        <w:rPr>
+          <w:b/>
+        </w:rPr>
+        <w:t xml:space="preserve">Numéro Mobile Money</w:t>
+      </w:r>
+      <w:r>
+        <w:rPr/>
+        <w:t xml:space="preserve"> : numéro communiqué aux parents pour un envoi manuel d'argent — c'est une information affichée aux parents, elle ne change rien au fonctionnement des paiements en ligne (§9).</w:t>
+      </w:r>
+    </w:p>
+    <w:p>
+      <w:pPr>
+        <w:spacing w:lineRule="auto"/>
+      </w:pPr>
+      <w:r>
+        <w:rPr/>
+        <w:t xml:space="preserve">Tant qu'aucune de ces informations n'est renseignée, l'application garde son apparence par défaut (icône par défaut et nom « Cantine Connect »).</w:t>
+      </w:r>
+    </w:p>
+    <w:p>
+      <w:pPr>
+        <w:pStyle w:val="Heading2"/>
+        <w:spacing w:lineRule="auto"/>
+      </w:pPr>
+      <w:r>
+        <w:rPr/>
+        <w:t xml:space="preserve">17. Paiement et notifications — état de la mise en service</w:t>
+      </w:r>
+    </w:p>
+    <w:p>
+      <w:pPr>
+        <w:numPr>
+          <w:ilvl w:val="0"/>
+          <w:numId w:val="24"/>
+        </w:numPr>
+        <w:spacing w:lineRule="auto"/>
+      </w:pPr>
+      <w:r>
+        <w:rPr>
+          <w:b/>
+        </w:rPr>
+        <w:t xml:space="preserve">Paiement</w:t>
+      </w:r>
+      <w:r>
+        <w:rPr/>
+        <w:t xml:space="preserve"> : la connexion avec le service de paiement Mobile Money est réelle, pas une simulation — dès que le client fournit ses identifiants marchands réels, le paiement fonctionne sans développement supplémentaire. Sans ces identifiants, une tentative de paiement échoue avec un message clair plutôt qu'un lien qui ne fonctionne pas.</w:t>
+      </w:r>
+    </w:p>
+    <w:p>
+      <w:pPr>
+        <w:numPr>
+          <w:ilvl w:val="0"/>
+          <w:numId w:val="24"/>
+        </w:numPr>
+        <w:spacing w:lineRule="auto"/>
+      </w:pPr>
+      <w:r>
+        <w:rPr>
+          <w:b/>
+        </w:rPr>
+        <w:t xml:space="preserve">SMS</w:t>
+      </w:r>
+      <w:r>
+        <w:rPr/>
+        <w:t xml:space="preserve"> : la connexion avec le fournisseur de SMS est réelle. Tant qu'aucun compte n'est configuré, les SMS sont simplement enregistrés dans les journaux techniques (aucun envoi réel, et cela ne bloque rien pour l'utilisateur).</w:t>
+      </w:r>
+    </w:p>
+    <w:p>
+      <w:pPr>
+        <w:numPr>
+          <w:ilvl w:val="0"/>
+          <w:numId w:val="24"/>
+        </w:numPr>
+        <w:spacing w:lineRule="auto"/>
+      </w:pPr>
+      <w:r>
+        <w:rPr>
+          <w:b/>
+        </w:rPr>
+        <w:t xml:space="preserve">Email</w:t>
+      </w:r>
+      <w:r>
+        <w:rPr/>
+        <w:t xml:space="preserve"> : fonctionne dès que les paramètres techniques d'envoi (compte email dédié) sont renseignés.</w:t>
+      </w:r>
+    </w:p>
+    <w:p>
+      <w:pPr>
+        <w:pStyle w:val="Heading2"/>
+        <w:spacing w:lineRule="auto"/>
+      </w:pPr>
+      <w:r>
+        <w:rPr/>
+        <w:t xml:space="preserve">18. Support et à propos</w:t>
+      </w:r>
+    </w:p>
+    <w:p>
+      <w:pPr>
+        <w:spacing w:lineRule="auto"/>
+      </w:pPr>
+      <w:r>
+        <w:rPr/>
+        <w:drawing>
+          <wp:inline distB="0" distL="0" distR="0" distT="0">
+            <wp:extent cx="5715000" cy="3571875"/>
+            <wp:effectExtent b="0" l="0" r="0" t="0"/>
+            <wp:docPr id="26" name="image-IC10J1rtmKFUt0mKmkln3.png"/>
+            <a:graphic>
+              <a:graphicData uri="http://schemas.openxmlformats.org/drawingml/2006/picture">
+                <pic:pic>
+                  <pic:nvPicPr>
+                    <pic:cNvPr id="26" name="image-IC10J1rtmKFUt0mKmkln3.png" descr="Fenêtre « À propos »"/>
+                    <pic:cNvPicPr/>
+                  </pic:nvPicPr>
+                  <pic:blipFill>
+                    <a:blip r:embed="rId31" cstate="print"/>
+                    <a:srcRect b="0" l="0" r="0" t="0"/>
+                    <a:stretch>
+                      <a:fillRect/>
+                    </a:stretch>
+                  </pic:blipFill>
+                  <pic:spPr>
+                    <a:xfrm>
+                      <a:off x="0" y="0"/>
+                      <a:ext cx="5715000" cy="3571875"/>
+                    </a:xfrm>
+                    <a:prstGeom prst="rect"/>
+                  </pic:spPr>
+                </pic:pic>
+              </a:graphicData>
+            </a:graphic>
+          </wp:inline>
+        </w:drawing>
+      </w:r>
+    </w:p>
+    <w:p>
+      <w:pPr>
         <w:spacing w:lineRule="auto"/>
       </w:pPr>
       <w:r>
@@ -5213,7 +5376,7 @@
         <w:rPr/>
         <w:t xml:space="preserve"> — Téléphone : +225 07 58 89 24 77 · Email : </w:t>
       </w:r>
-      <w:hyperlink r:id="rId29">
+      <w:hyperlink r:id="rId32">
         <w:r>
           <w:rPr>
             <w:rStyle w:val="Hyperlink"/>

</xml_diff>

<commit_message>
docs(cantine-connect): synchronise le correctif de cassure de page sur la galerie d'habillages
Co-Authored-By: Claude Sonnet 5 <noreply@anthropic.com>
</commit_message>
<xml_diff>
--- a/apps/web-app/cantine-connect/docs/from-labs/livraison/manuel-utilisateur.docx
+++ b/apps/web-app/cantine-connect/docs/from-labs/livraison/manuel-utilisateur.docx
@@ -377,12 +377,12 @@
           <wp:inline distB="0" distL="0" distR="0" distT="0">
             <wp:extent cx="5715000" cy="3571875"/>
             <wp:effectExtent b="0" l="0" r="0" t="0"/>
-            <wp:docPr id="1" name="image-CWJ8571TEk43nTskXulql.png"/>
+            <wp:docPr id="1" name="image-xhI8o5sXQRbhxScfweffl.png"/>
             <a:graphic>
               <a:graphicData uri="http://schemas.openxmlformats.org/drawingml/2006/picture">
                 <pic:pic>
                   <pic:nvPicPr>
-                    <pic:cNvPr id="1" name="image-CWJ8571TEk43nTskXulql.png" descr="Écran de connexion"/>
+                    <pic:cNvPr id="1" name="image-xhI8o5sXQRbhxScfweffl.png" descr="Écran de connexion"/>
                     <pic:cNvPicPr/>
                   </pic:nvPicPr>
                   <pic:blipFill>
@@ -884,12 +884,12 @@
           <wp:inline distB="0" distL="0" distR="0" distT="0">
             <wp:extent cx="5715000" cy="3571875"/>
             <wp:effectExtent b="0" l="0" r="0" t="0"/>
-            <wp:docPr id="2" name="image-M08gTnFwUhzLhGJsT2aLX.png"/>
+            <wp:docPr id="2" name="image-CVptgZ9NEGzEZpjFXRw5q.png"/>
             <a:graphic>
               <a:graphicData uri="http://schemas.openxmlformats.org/drawingml/2006/picture">
                 <pic:pic>
                   <pic:nvPicPr>
-                    <pic:cNvPr id="2" name="image-M08gTnFwUhzLhGJsT2aLX.png" descr="Sélecteur d'habillage"/>
+                    <pic:cNvPr id="2" name="image-CVptgZ9NEGzEZpjFXRw5q.png" descr="Sélecteur d'habillage"/>
                     <pic:cNvPicPr/>
                   </pic:nvPicPr>
                   <pic:blipFill>
@@ -954,6 +954,58 @@
           </w:tcPr>
           <w:p>
             <w:pPr>
+              <w:jc w:val="left"/>
+              <w:spacing w:lineRule="auto"/>
+            </w:pPr>
+            <w:r>
+              <w:rPr>
+                <w:b/>
+              </w:rPr>
+              <w:t xml:space="preserve">Premium</w:t>
+            </w:r>
+          </w:p>
+          <w:p>
+            <w:pPr>
+              <w:jc w:val="left"/>
+              <w:spacing w:lineRule="auto"/>
+            </w:pPr>
+            <w:r>
+              <w:rPr/>
+              <w:t xml:space="preserve"> (par défaut)</w:t>
+            </w:r>
+          </w:p>
+          <w:p>
+            <w:pPr>
+              <w:jc w:val="left"/>
+              <w:spacing w:lineRule="auto"/>
+            </w:pPr>
+            <w:r>
+              <w:rPr/>
+              <w:br w:type="textWrapping"/>
+            </w:r>
+          </w:p>
+          <w:p>
+            <w:pPr>
+              <w:jc w:val="left"/>
+              <w:spacing w:lineRule="auto"/>
+            </w:pPr>
+            <w:r>
+              <w:rPr/>
+              <w:t xml:space="preserve">tons orange et vert chaleureux</w:t>
+            </w:r>
+          </w:p>
+          <w:p>
+            <w:pPr>
+              <w:jc w:val="left"/>
+              <w:spacing w:lineRule="auto"/>
+            </w:pPr>
+            <w:r>
+              <w:rPr/>
+              <w:br w:type="textWrapping"/>
+            </w:r>
+          </w:p>
+          <w:p>
+            <w:pPr>
               <w:spacing w:lineRule="auto"/>
             </w:pPr>
             <w:r>
@@ -962,12 +1014,12 @@
                 <wp:inline distB="0" distL="0" distR="0" distT="0">
                   <wp:extent cx="1809750" cy="1133475"/>
                   <wp:effectExtent b="0" l="0" r="0" t="0"/>
-                  <wp:docPr id="4" name="image-je-uaRv3CxhMPj9f0E1H8.png"/>
+                  <wp:docPr id="4" name="image-S3DaOgdSGgCu5PI4-Hr_Y.png"/>
                   <a:graphic>
                     <a:graphicData uri="http://schemas.openxmlformats.org/drawingml/2006/picture">
                       <pic:pic>
                         <pic:nvPicPr>
-                          <pic:cNvPr id="4" name="image-je-uaRv3CxhMPj9f0E1H8.png" descr="Habillage Premium"/>
+                          <pic:cNvPr id="4" name="image-S3DaOgdSGgCu5PI4-Hr_Y.png" descr="Habillage Premium"/>
                           <pic:cNvPicPr/>
                         </pic:nvPicPr>
                         <pic:blipFill>
@@ -991,16 +1043,17 @@
               </w:drawing>
             </w:r>
           </w:p>
-          <w:p>
-            <w:pPr>
-              <w:jc w:val="left"/>
-              <w:spacing w:lineRule="auto"/>
-            </w:pPr>
-            <w:r>
-              <w:rPr/>
-              <w:br w:type="textWrapping"/>
-            </w:r>
-          </w:p>
+        </w:tc>
+        <w:tc>
+          <w:tcPr>
+            <w:shd w:val="clear" w:fill="FFFFFF"/>
+            <w:tcBorders>
+              <w:top w:val="single" w:sz="8" w:space="0" w:color="000000"/>
+              <w:left w:val="single" w:sz="8" w:space="0" w:color="000000"/>
+              <w:bottom w:val="single" w:sz="8" w:space="0" w:color="000000"/>
+              <w:right w:val="single" w:sz="8" w:space="0" w:color="000000"/>
+            </w:tcBorders>
+          </w:tcPr>
           <w:p>
             <w:pPr>
               <w:jc w:val="left"/>
@@ -1010,17 +1063,7 @@
               <w:rPr>
                 <w:b/>
               </w:rPr>
-              <w:t xml:space="preserve">Premium</w:t>
-            </w:r>
-          </w:p>
-          <w:p>
-            <w:pPr>
-              <w:jc w:val="left"/>
-              <w:spacing w:lineRule="auto"/>
-            </w:pPr>
-            <w:r>
-              <w:rPr/>
-              <w:t xml:space="preserve"> (par défaut)</w:t>
+              <w:t xml:space="preserve">Corporatif</w:t>
             </w:r>
           </w:p>
           <w:p>
@@ -1040,20 +1083,19 @@
             </w:pPr>
             <w:r>
               <w:rPr/>
-              <w:t xml:space="preserve">tons orange et vert chaleureux</w:t>
-            </w:r>
-          </w:p>
-        </w:tc>
-        <w:tc>
-          <w:tcPr>
-            <w:shd w:val="clear" w:fill="FFFFFF"/>
-            <w:tcBorders>
-              <w:top w:val="single" w:sz="8" w:space="0" w:color="000000"/>
-              <w:left w:val="single" w:sz="8" w:space="0" w:color="000000"/>
-              <w:bottom w:val="single" w:sz="8" w:space="0" w:color="000000"/>
-              <w:right w:val="single" w:sz="8" w:space="0" w:color="000000"/>
-            </w:tcBorders>
-          </w:tcPr>
+              <w:t xml:space="preserve">fond sombre, plus sobre</w:t>
+            </w:r>
+          </w:p>
+          <w:p>
+            <w:pPr>
+              <w:jc w:val="left"/>
+              <w:spacing w:lineRule="auto"/>
+            </w:pPr>
+            <w:r>
+              <w:rPr/>
+              <w:br w:type="textWrapping"/>
+            </w:r>
+          </w:p>
           <w:p>
             <w:pPr>
               <w:spacing w:lineRule="auto"/>
@@ -1064,12 +1106,12 @@
                 <wp:inline distB="0" distL="0" distR="0" distT="0">
                   <wp:extent cx="1809750" cy="1133475"/>
                   <wp:effectExtent b="0" l="0" r="0" t="0"/>
-                  <wp:docPr id="6" name="image-o4kL6DwaDHhsulDhsin4K.png"/>
+                  <wp:docPr id="6" name="image-QROLZkchirrcefnGScbzg.png"/>
                   <a:graphic>
                     <a:graphicData uri="http://schemas.openxmlformats.org/drawingml/2006/picture">
                       <pic:pic>
                         <pic:nvPicPr>
-                          <pic:cNvPr id="6" name="image-o4kL6DwaDHhsulDhsin4K.png" descr="Habillage Corporatif"/>
+                          <pic:cNvPr id="6" name="image-QROLZkchirrcefnGScbzg.png" descr="Habillage Corporatif"/>
                           <pic:cNvPicPr/>
                         </pic:nvPicPr>
                         <pic:blipFill>
@@ -1093,16 +1135,17 @@
               </w:drawing>
             </w:r>
           </w:p>
-          <w:p>
-            <w:pPr>
-              <w:jc w:val="left"/>
-              <w:spacing w:lineRule="auto"/>
-            </w:pPr>
-            <w:r>
-              <w:rPr/>
-              <w:br w:type="textWrapping"/>
-            </w:r>
-          </w:p>
+        </w:tc>
+        <w:tc>
+          <w:tcPr>
+            <w:shd w:val="clear" w:fill="FFFFFF"/>
+            <w:tcBorders>
+              <w:top w:val="single" w:sz="8" w:space="0" w:color="000000"/>
+              <w:left w:val="single" w:sz="8" w:space="0" w:color="000000"/>
+              <w:bottom w:val="single" w:sz="8" w:space="0" w:color="000000"/>
+              <w:right w:val="single" w:sz="8" w:space="0" w:color="000000"/>
+            </w:tcBorders>
+          </w:tcPr>
           <w:p>
             <w:pPr>
               <w:jc w:val="left"/>
@@ -1112,7 +1155,7 @@
               <w:rPr>
                 <w:b/>
               </w:rPr>
-              <w:t xml:space="preserve">Corporatif</w:t>
+              <w:t xml:space="preserve">Moderne</w:t>
             </w:r>
           </w:p>
           <w:p>
@@ -1132,20 +1175,19 @@
             </w:pPr>
             <w:r>
               <w:rPr/>
-              <w:t xml:space="preserve">fond sombre, plus sobre</w:t>
-            </w:r>
-          </w:p>
-        </w:tc>
-        <w:tc>
-          <w:tcPr>
-            <w:shd w:val="clear" w:fill="FFFFFF"/>
-            <w:tcBorders>
-              <w:top w:val="single" w:sz="8" w:space="0" w:color="000000"/>
-              <w:left w:val="single" w:sz="8" w:space="0" w:color="000000"/>
-              <w:bottom w:val="single" w:sz="8" w:space="0" w:color="000000"/>
-              <w:right w:val="single" w:sz="8" w:space="0" w:color="000000"/>
-            </w:tcBorders>
-          </w:tcPr>
+              <w:t xml:space="preserve">fond blanc, dégradés bleu/orange</w:t>
+            </w:r>
+          </w:p>
+          <w:p>
+            <w:pPr>
+              <w:jc w:val="left"/>
+              <w:spacing w:lineRule="auto"/>
+            </w:pPr>
+            <w:r>
+              <w:rPr/>
+              <w:br w:type="textWrapping"/>
+            </w:r>
+          </w:p>
           <w:p>
             <w:pPr>
               <w:spacing w:lineRule="auto"/>
@@ -1156,12 +1198,12 @@
                 <wp:inline distB="0" distL="0" distR="0" distT="0">
                   <wp:extent cx="1809750" cy="1133475"/>
                   <wp:effectExtent b="0" l="0" r="0" t="0"/>
-                  <wp:docPr id="8" name="image-qkK-DoGa0ibUkU33CqYYv.png"/>
+                  <wp:docPr id="8" name="image-3j6j3Y_7Go0nnyVrdSsOy.png"/>
                   <a:graphic>
                     <a:graphicData uri="http://schemas.openxmlformats.org/drawingml/2006/picture">
                       <pic:pic>
                         <pic:nvPicPr>
-                          <pic:cNvPr id="8" name="image-qkK-DoGa0ibUkU33CqYYv.png" descr="Habillage Moderne"/>
+                          <pic:cNvPr id="8" name="image-3j6j3Y_7Go0nnyVrdSsOy.png" descr="Habillage Moderne"/>
                           <pic:cNvPicPr/>
                         </pic:nvPicPr>
                         <pic:blipFill>
@@ -1185,48 +1227,6 @@
               </w:drawing>
             </w:r>
           </w:p>
-          <w:p>
-            <w:pPr>
-              <w:jc w:val="left"/>
-              <w:spacing w:lineRule="auto"/>
-            </w:pPr>
-            <w:r>
-              <w:rPr/>
-              <w:br w:type="textWrapping"/>
-            </w:r>
-          </w:p>
-          <w:p>
-            <w:pPr>
-              <w:jc w:val="left"/>
-              <w:spacing w:lineRule="auto"/>
-            </w:pPr>
-            <w:r>
-              <w:rPr>
-                <w:b/>
-              </w:rPr>
-              <w:t xml:space="preserve">Moderne</w:t>
-            </w:r>
-          </w:p>
-          <w:p>
-            <w:pPr>
-              <w:jc w:val="left"/>
-              <w:spacing w:lineRule="auto"/>
-            </w:pPr>
-            <w:r>
-              <w:rPr/>
-              <w:br w:type="textWrapping"/>
-            </w:r>
-          </w:p>
-          <w:p>
-            <w:pPr>
-              <w:jc w:val="left"/>
-              <w:spacing w:lineRule="auto"/>
-            </w:pPr>
-            <w:r>
-              <w:rPr/>
-              <w:t xml:space="preserve">fond blanc, dégradés bleu/orange</w:t>
-            </w:r>
-          </w:p>
         </w:tc>
       </w:tr>
     </w:tbl>
@@ -1267,12 +1267,12 @@
           <wp:inline distB="0" distL="0" distR="0" distT="0">
             <wp:extent cx="5715000" cy="3571875"/>
             <wp:effectExtent b="0" l="0" r="0" t="0"/>
-            <wp:docPr id="9" name="image-DQQCRn0gq56wDue2uuvh8.png"/>
+            <wp:docPr id="9" name="image-6HwWsS34Q6RnPlxYN0G-2.png"/>
             <a:graphic>
               <a:graphicData uri="http://schemas.openxmlformats.org/drawingml/2006/picture">
                 <pic:pic>
                   <pic:nvPicPr>
-                    <pic:cNvPr id="9" name="image-DQQCRn0gq56wDue2uuvh8.png" descr="Demande d'accès — étape 1 : identité"/>
+                    <pic:cNvPr id="9" name="image-6HwWsS34Q6RnPlxYN0G-2.png" descr="Demande d'accès — étape 1 : identité"/>
                     <pic:cNvPicPr/>
                   </pic:nvPicPr>
                   <pic:blipFill>
@@ -1325,12 +1325,12 @@
           <wp:inline distB="0" distL="0" distR="0" distT="0">
             <wp:extent cx="5715000" cy="3571875"/>
             <wp:effectExtent b="0" l="0" r="0" t="0"/>
-            <wp:docPr id="10" name="image-dzK0E7UMweHXiyl14Fodn.png"/>
+            <wp:docPr id="10" name="image-6wH2nsGb27NM1PUDKEHTA.png"/>
             <a:graphic>
               <a:graphicData uri="http://schemas.openxmlformats.org/drawingml/2006/picture">
                 <pic:pic>
                   <pic:nvPicPr>
-                    <pic:cNvPr id="10" name="image-dzK0E7UMweHXiyl14Fodn.png" descr="Demande d'accès — étape 2 : contact"/>
+                    <pic:cNvPr id="10" name="image-6wH2nsGb27NM1PUDKEHTA.png" descr="Demande d'accès — étape 2 : contact"/>
                     <pic:cNvPicPr/>
                   </pic:nvPicPr>
                   <pic:blipFill>
@@ -1383,12 +1383,12 @@
           <wp:inline distB="0" distL="0" distR="0" distT="0">
             <wp:extent cx="5715000" cy="3571875"/>
             <wp:effectExtent b="0" l="0" r="0" t="0"/>
-            <wp:docPr id="11" name="image-nW6CcYscTGDFD2-lCv1UR.png"/>
+            <wp:docPr id="11" name="image-xPp4SffvIWtp_TZRgGRTp.png"/>
             <a:graphic>
               <a:graphicData uri="http://schemas.openxmlformats.org/drawingml/2006/picture">
                 <pic:pic>
                   <pic:nvPicPr>
-                    <pic:cNvPr id="11" name="image-nW6CcYscTGDFD2-lCv1UR.png" descr="Demande d'accès — étape 3 : résidence"/>
+                    <pic:cNvPr id="11" name="image-xPp4SffvIWtp_TZRgGRTp.png" descr="Demande d'accès — étape 3 : résidence"/>
                     <pic:cNvPicPr/>
                   </pic:nvPicPr>
                   <pic:blipFill>
@@ -1475,12 +1475,12 @@
           <wp:inline distB="0" distL="0" distR="0" distT="0">
             <wp:extent cx="5715000" cy="3571875"/>
             <wp:effectExtent b="0" l="0" r="0" t="0"/>
-            <wp:docPr id="12" name="image-BPY9p3EdbLynou1MTNEPp.png"/>
+            <wp:docPr id="12" name="image-IYDXl0RWbu97UtXH0shAz.png"/>
             <a:graphic>
               <a:graphicData uri="http://schemas.openxmlformats.org/drawingml/2006/picture">
                 <pic:pic>
                   <pic:nvPicPr>
-                    <pic:cNvPr id="12" name="image-BPY9p3EdbLynou1MTNEPp.png" descr="Demande d'accès — confirmation"/>
+                    <pic:cNvPr id="12" name="image-IYDXl0RWbu97UtXH0shAz.png" descr="Demande d'accès — confirmation"/>
                     <pic:cNvPicPr/>
                   </pic:nvPicPr>
                   <pic:blipFill>
@@ -3219,12 +3219,12 @@
           <wp:inline distB="0" distL="0" distR="0" distT="0">
             <wp:extent cx="5715000" cy="3571875"/>
             <wp:effectExtent b="0" l="0" r="0" t="0"/>
-            <wp:docPr id="13" name="image-U9NhyI_iYtHXxhpiVv583.png"/>
+            <wp:docPr id="13" name="image-ComckSdGATTtitI3zKJDY.png"/>
             <a:graphic>
               <a:graphicData uri="http://schemas.openxmlformats.org/drawingml/2006/picture">
                 <pic:pic>
                   <pic:nvPicPr>
-                    <pic:cNvPr id="13" name="image-U9NhyI_iYtHXxhpiVv583.png" descr="Tableau de bord"/>
+                    <pic:cNvPr id="13" name="image-ComckSdGATTtitI3zKJDY.png" descr="Tableau de bord"/>
                     <pic:cNvPicPr/>
                   </pic:nvPicPr>
                   <pic:blipFill>
@@ -3325,12 +3325,12 @@
           <wp:inline distB="0" distL="0" distR="0" distT="0">
             <wp:extent cx="5715000" cy="3571875"/>
             <wp:effectExtent b="0" l="0" r="0" t="0"/>
-            <wp:docPr id="14" name="image-E3lJ3fdYCp5-YJBZ4324e.png"/>
+            <wp:docPr id="14" name="image-kFnCRUtveef4uoqEZ5LCI.png"/>
             <a:graphic>
               <a:graphicData uri="http://schemas.openxmlformats.org/drawingml/2006/picture">
                 <pic:pic>
                   <pic:nvPicPr>
-                    <pic:cNvPr id="14" name="image-E3lJ3fdYCp5-YJBZ4324e.png" descr="Liste des établissements"/>
+                    <pic:cNvPr id="14" name="image-kFnCRUtveef4uoqEZ5LCI.png" descr="Liste des établissements"/>
                     <pic:cNvPicPr/>
                   </pic:nvPicPr>
                   <pic:blipFill>
@@ -3440,12 +3440,12 @@
           <wp:inline distB="0" distL="0" distR="0" distT="0">
             <wp:extent cx="5715000" cy="3571875"/>
             <wp:effectExtent b="0" l="0" r="0" t="0"/>
-            <wp:docPr id="15" name="image-kRXf4AlwafXJT81Cqs82Z.png"/>
+            <wp:docPr id="15" name="image-mIo-dfPGYx1WLUcrYPQwP.png"/>
             <a:graphic>
               <a:graphicData uri="http://schemas.openxmlformats.org/drawingml/2006/picture">
                 <pic:pic>
                   <pic:nvPicPr>
-                    <pic:cNvPr id="15" name="image-kRXf4AlwafXJT81Cqs82Z.png" descr="Liste des élèves"/>
+                    <pic:cNvPr id="15" name="image-mIo-dfPGYx1WLUcrYPQwP.png" descr="Liste des élèves"/>
                     <pic:cNvPicPr/>
                   </pic:nvPicPr>
                   <pic:blipFill>
@@ -3543,12 +3543,12 @@
           <wp:inline distB="0" distL="0" distR="0" distT="0">
             <wp:extent cx="5715000" cy="3571875"/>
             <wp:effectExtent b="0" l="0" r="0" t="0"/>
-            <wp:docPr id="16" name="image-EVOq7tP_8reolbYNlk_dQ.png"/>
+            <wp:docPr id="16" name="image-2xzeARxqRvTRWYMe4eimC.png"/>
             <a:graphic>
               <a:graphicData uri="http://schemas.openxmlformats.org/drawingml/2006/picture">
                 <pic:pic>
                   <pic:nvPicPr>
-                    <pic:cNvPr id="16" name="image-EVOq7tP_8reolbYNlk_dQ.png" descr="Fiche élève — Informations générales"/>
+                    <pic:cNvPr id="16" name="image-2xzeARxqRvTRWYMe4eimC.png" descr="Fiche élève — Informations générales"/>
                     <pic:cNvPicPr/>
                   </pic:nvPicPr>
                   <pic:blipFill>
@@ -3577,12 +3577,12 @@
           <wp:inline distB="0" distL="0" distR="0" distT="0">
             <wp:extent cx="5715000" cy="3571875"/>
             <wp:effectExtent b="0" l="0" r="0" t="0"/>
-            <wp:docPr id="17" name="image-S0-Ymv6Oima0LCOacgP2a.png"/>
+            <wp:docPr id="17" name="image-wullpiza3QgUh3oiIb0M1.png"/>
             <a:graphic>
               <a:graphicData uri="http://schemas.openxmlformats.org/drawingml/2006/picture">
                 <pic:pic>
                   <pic:nvPicPr>
-                    <pic:cNvPr id="17" name="image-S0-Ymv6Oima0LCOacgP2a.png" descr="Fiche élève — Cantine et affectation"/>
+                    <pic:cNvPr id="17" name="image-wullpiza3QgUh3oiIb0M1.png" descr="Fiche élève — Cantine et affectation"/>
                     <pic:cNvPicPr/>
                   </pic:nvPicPr>
                   <pic:blipFill>
@@ -3611,12 +3611,12 @@
           <wp:inline distB="0" distL="0" distR="0" distT="0">
             <wp:extent cx="5715000" cy="3571875"/>
             <wp:effectExtent b="0" l="0" r="0" t="0"/>
-            <wp:docPr id="18" name="image-coAfJCbiSXXWIq0e_DOb2.png"/>
+            <wp:docPr id="18" name="image-ciBtbZnuTrtk0PlB1Nv9_.png"/>
             <a:graphic>
               <a:graphicData uri="http://schemas.openxmlformats.org/drawingml/2006/picture">
                 <pic:pic>
                   <pic:nvPicPr>
-                    <pic:cNvPr id="18" name="image-coAfJCbiSXXWIq0e_DOb2.png" descr="Fiche élève — Contacts et allergies"/>
+                    <pic:cNvPr id="18" name="image-ciBtbZnuTrtk0PlB1Nv9_.png" descr="Fiche élève — Contacts et allergies"/>
                     <pic:cNvPicPr/>
                   </pic:nvPicPr>
                   <pic:blipFill>
@@ -3857,12 +3857,12 @@
           <wp:inline distB="0" distL="0" distR="0" distT="0">
             <wp:extent cx="5715000" cy="3571875"/>
             <wp:effectExtent b="0" l="0" r="0" t="0"/>
-            <wp:docPr id="19" name="image-rO5-SGvFMXn49o9Kmzdv8.png"/>
+            <wp:docPr id="19" name="image-88HlCUlBrYmFsXJi5PCkN.png"/>
             <a:graphic>
               <a:graphicData uri="http://schemas.openxmlformats.org/drawingml/2006/picture">
                 <pic:pic>
                   <pic:nvPicPr>
-                    <pic:cNvPr id="19" name="image-rO5-SGvFMXn49o9Kmzdv8.png" descr="Mes enfants — liste des enfants rattachés"/>
+                    <pic:cNvPr id="19" name="image-88HlCUlBrYmFsXJi5PCkN.png" descr="Mes enfants — liste des enfants rattachés"/>
                     <pic:cNvPicPr/>
                   </pic:nvPicPr>
                   <pic:blipFill>
@@ -3934,12 +3934,12 @@
           <wp:inline distB="0" distL="0" distR="0" distT="0">
             <wp:extent cx="5715000" cy="3571875"/>
             <wp:effectExtent b="0" l="0" r="0" t="0"/>
-            <wp:docPr id="20" name="image-sB1jVCkE3gwwTmbpquyO-.png"/>
+            <wp:docPr id="20" name="image-yL23eQaiAJP8CDYr69HRE.png"/>
             <a:graphic>
               <a:graphicData uri="http://schemas.openxmlformats.org/drawingml/2006/picture">
                 <pic:pic>
                   <pic:nvPicPr>
-                    <pic:cNvPr id="20" name="image-sB1jVCkE3gwwTmbpquyO-.png" descr="Mes enfants — formulaire d'ajout"/>
+                    <pic:cNvPr id="20" name="image-yL23eQaiAJP8CDYr69HRE.png" descr="Mes enfants — formulaire d'ajout"/>
                     <pic:cNvPicPr/>
                   </pic:nvPicPr>
                   <pic:blipFill>
@@ -4038,12 +4038,12 @@
           <wp:inline distB="0" distL="0" distR="0" distT="0">
             <wp:extent cx="5715000" cy="3571875"/>
             <wp:effectExtent b="0" l="0" r="0" t="0"/>
-            <wp:docPr id="21" name="image-KLB-swlpyTgQd6HRDtsZu.png"/>
+            <wp:docPr id="21" name="image-k3t647oToFeJVL-_6MEs9.png"/>
             <a:graphic>
               <a:graphicData uri="http://schemas.openxmlformats.org/drawingml/2006/picture">
                 <pic:pic>
                   <pic:nvPicPr>
-                    <pic:cNvPr id="21" name="image-KLB-swlpyTgQd6HRDtsZu.png" descr="Écran des paiements"/>
+                    <pic:cNvPr id="21" name="image-k3t647oToFeJVL-_6MEs9.png" descr="Écran des paiements"/>
                     <pic:cNvPicPr/>
                   </pic:nvPicPr>
                   <pic:blipFill>
@@ -4239,12 +4239,12 @@
           <wp:inline distB="0" distL="0" distR="0" distT="0">
             <wp:extent cx="5715000" cy="3571875"/>
             <wp:effectExtent b="0" l="0" r="0" t="0"/>
-            <wp:docPr id="22" name="image-sXQqxSCE-T82LdwCsLvst.png"/>
+            <wp:docPr id="22" name="image-tZ5jCU9pxoSecjzu7P1qW.png"/>
             <a:graphic>
               <a:graphicData uri="http://schemas.openxmlformats.org/drawingml/2006/picture">
                 <pic:pic>
                   <pic:nvPicPr>
-                    <pic:cNvPr id="22" name="image-sXQqxSCE-T82LdwCsLvst.png" descr="Écran de contrôle d'accès"/>
+                    <pic:cNvPr id="22" name="image-tZ5jCU9pxoSecjzu7P1qW.png" descr="Écran de contrôle d'accès"/>
                     <pic:cNvPicPr/>
                   </pic:nvPicPr>
                   <pic:blipFill>
@@ -4363,12 +4363,12 @@
           <wp:inline distB="0" distL="0" distR="0" distT="0">
             <wp:extent cx="5715000" cy="3571875"/>
             <wp:effectExtent b="0" l="0" r="0" t="0"/>
-            <wp:docPr id="23" name="image-jB4WVpcgbt1cFD_azRule.png"/>
+            <wp:docPr id="23" name="image-1AI_mRgrm4OB-YxIiHKIA.png"/>
             <a:graphic>
               <a:graphicData uri="http://schemas.openxmlformats.org/drawingml/2006/picture">
                 <pic:pic>
                   <pic:nvPicPr>
-                    <pic:cNvPr id="23" name="image-jB4WVpcgbt1cFD_azRule.png" descr="Historique des passages"/>
+                    <pic:cNvPr id="23" name="image-1AI_mRgrm4OB-YxIiHKIA.png" descr="Historique des passages"/>
                     <pic:cNvPicPr/>
                   </pic:nvPicPr>
                   <pic:blipFill>
@@ -4615,12 +4615,12 @@
           <wp:inline distB="0" distL="0" distR="0" distT="0">
             <wp:extent cx="5715000" cy="3571875"/>
             <wp:effectExtent b="0" l="0" r="0" t="0"/>
-            <wp:docPr id="24" name="image--VgBH9zRt9T_zK_BsS4Eg.png"/>
+            <wp:docPr id="24" name="image-OAwzvhAIOU6XTFjABe04m.png"/>
             <a:graphic>
               <a:graphicData uri="http://schemas.openxmlformats.org/drawingml/2006/picture">
                 <pic:pic>
                   <pic:nvPicPr>
-                    <pic:cNvPr id="24" name="image--VgBH9zRt9T_zK_BsS4Eg.png" descr="Liste des comptes utilisateurs"/>
+                    <pic:cNvPr id="24" name="image-OAwzvhAIOU6XTFjABe04m.png" descr="Liste des comptes utilisateurs"/>
                     <pic:cNvPicPr/>
                   </pic:nvPicPr>
                   <pic:blipFill>
@@ -4977,12 +4977,12 @@
           <wp:inline distB="0" distL="0" distR="0" distT="0">
             <wp:extent cx="5715000" cy="3571875"/>
             <wp:effectExtent b="0" l="0" r="0" t="0"/>
-            <wp:docPr id="25" name="image-n6QMqzFq7kQhTsqllrDzV.png"/>
+            <wp:docPr id="25" name="image-DcgoTkULsVUHBgty2NU2z.png"/>
             <a:graphic>
               <a:graphicData uri="http://schemas.openxmlformats.org/drawingml/2006/picture">
                 <pic:pic>
                   <pic:nvPicPr>
-                    <pic:cNvPr id="25" name="image-n6QMqzFq7kQhTsqllrDzV.png" descr="Écran des paramètres"/>
+                    <pic:cNvPr id="25" name="image-DcgoTkULsVUHBgty2NU2z.png" descr="Écran des paramètres"/>
                     <pic:cNvPicPr/>
                   </pic:nvPicPr>
                   <pic:blipFill>
@@ -5324,12 +5324,12 @@
           <wp:inline distB="0" distL="0" distR="0" distT="0">
             <wp:extent cx="5715000" cy="3571875"/>
             <wp:effectExtent b="0" l="0" r="0" t="0"/>
-            <wp:docPr id="26" name="image-IC10J1rtmKFUt0mKmkln3.png"/>
+            <wp:docPr id="26" name="image-MbJdcxR4Uv0EQMmjQUatF.png"/>
             <a:graphic>
               <a:graphicData uri="http://schemas.openxmlformats.org/drawingml/2006/picture">
                 <pic:pic>
                   <pic:nvPicPr>
-                    <pic:cNvPr id="26" name="image-IC10J1rtmKFUt0mKmkln3.png" descr="Fenêtre « À propos »"/>
+                    <pic:cNvPr id="26" name="image-MbJdcxR4Uv0EQMmjQUatF.png" descr="Fenêtre « À propos »"/>
                     <pic:cNvPicPr/>
                   </pic:nvPicPr>
                   <pic:blipFill>

</xml_diff>

<commit_message>
docs(cantine-connect): synchronise les nouvelles captures page d'accueil et connexion
Co-Authored-By: Claude Sonnet 5 <noreply@anthropic.com>
</commit_message>
<xml_diff>
--- a/apps/web-app/cantine-connect/docs/from-labs/livraison/manuel-utilisateur.docx
+++ b/apps/web-app/cantine-connect/docs/from-labs/livraison/manuel-utilisateur.docx
@@ -307,82 +307,16 @@
       </w:pPr>
       <w:r>
         <w:rPr/>
-        <w:t xml:space="preserve">Avant de se connecter, toute personne qui arrive sur le site voit une page d'accueil qui présente l'application : ses points forts (paiement par Mobile Money, entrée à la cantine par QR Code, suivi des allergies, notifications aux parents), avec deux boutons principaux :</w:t>
-      </w:r>
-    </w:p>
-    <w:p>
-      <w:pPr>
-        <w:numPr>
-          <w:ilvl w:val="0"/>
-          <w:numId w:val="2"/>
-        </w:numPr>
-        <w:spacing w:lineRule="auto"/>
-      </w:pPr>
-      <w:r>
-        <w:rPr>
-          <w:b/>
-        </w:rPr>
-        <w:t xml:space="preserve">Se connecter</w:t>
-      </w:r>
-      <w:r>
-        <w:rPr/>
-        <w:t xml:space="preserve"> — pour les personnes qui ont déjà un compte</w:t>
-      </w:r>
-    </w:p>
-    <w:p>
-      <w:pPr>
-        <w:numPr>
-          <w:ilvl w:val="0"/>
-          <w:numId w:val="2"/>
-        </w:numPr>
-        <w:spacing w:lineRule="auto"/>
-      </w:pPr>
-      <w:r>
-        <w:rPr>
-          <w:b/>
-        </w:rPr>
-        <w:t xml:space="preserve">Demande d'accès</w:t>
-      </w:r>
-      <w:r>
-        <w:rPr/>
-        <w:t xml:space="preserve"> — pour un parent qui n'a pas encore de compte</w:t>
-      </w:r>
-    </w:p>
-    <w:p>
-      <w:pPr>
-        <w:spacing w:lineRule="auto"/>
-      </w:pPr>
-      <w:r>
-        <w:rPr/>
-        <w:t xml:space="preserve">Ces deux boutons sont aussi disponibles en haut de toutes les pages publiques.</w:t>
-      </w:r>
-    </w:p>
-    <w:p>
-      <w:pPr>
-        <w:pStyle w:val="Heading2"/>
-        <w:spacing w:lineRule="auto"/>
-      </w:pPr>
-      <w:r>
-        <w:rPr/>
-        <w:t xml:space="preserve">2. Connexion</w:t>
-      </w:r>
-    </w:p>
-    <w:p>
-      <w:pPr>
-        <w:spacing w:lineRule="auto"/>
-      </w:pPr>
-      <w:r>
-        <w:rPr/>
         <w:drawing>
           <wp:inline distB="0" distL="0" distR="0" distT="0">
-            <wp:extent cx="5715000" cy="3571875"/>
+            <wp:extent cx="5715000" cy="2771775"/>
             <wp:effectExtent b="0" l="0" r="0" t="0"/>
-            <wp:docPr id="1" name="image-xhI8o5sXQRbhxScfweffl.png"/>
+            <wp:docPr id="1" name="image-B0mG4RrmCshA9B2Dt6xFf.png"/>
             <a:graphic>
               <a:graphicData uri="http://schemas.openxmlformats.org/drawingml/2006/picture">
                 <pic:pic>
                   <pic:nvPicPr>
-                    <pic:cNvPr id="1" name="image-xhI8o5sXQRbhxScfweffl.png" descr="Écran de connexion"/>
+                    <pic:cNvPr id="1" name="image-B0mG4RrmCshA9B2Dt6xFf.png" descr="Page d'accueil"/>
                     <pic:cNvPicPr/>
                   </pic:nvPicPr>
                   <pic:blipFill>
@@ -395,7 +329,112 @@
                   <pic:spPr>
                     <a:xfrm>
                       <a:off x="0" y="0"/>
-                      <a:ext cx="5715000" cy="3571875"/>
+                      <a:ext cx="5715000" cy="2771775"/>
+                    </a:xfrm>
+                    <a:prstGeom prst="rect"/>
+                  </pic:spPr>
+                </pic:pic>
+              </a:graphicData>
+            </a:graphic>
+          </wp:inline>
+        </w:drawing>
+      </w:r>
+    </w:p>
+    <w:p>
+      <w:pPr>
+        <w:spacing w:lineRule="auto"/>
+      </w:pPr>
+      <w:r>
+        <w:rPr/>
+        <w:t xml:space="preserve">Avant de se connecter, toute personne qui arrive sur le site voit une page d'accueil qui présente l'application : ses points forts (paiement par Mobile Money, entrée à la cantine par QR Code, suivi des allergies, notifications aux parents), avec deux boutons principaux :</w:t>
+      </w:r>
+    </w:p>
+    <w:p>
+      <w:pPr>
+        <w:numPr>
+          <w:ilvl w:val="0"/>
+          <w:numId w:val="2"/>
+        </w:numPr>
+        <w:spacing w:lineRule="auto"/>
+      </w:pPr>
+      <w:r>
+        <w:rPr>
+          <w:b/>
+        </w:rPr>
+        <w:t xml:space="preserve">Se connecter</w:t>
+      </w:r>
+      <w:r>
+        <w:rPr/>
+        <w:t xml:space="preserve"> — pour les personnes qui ont déjà un compte</w:t>
+      </w:r>
+    </w:p>
+    <w:p>
+      <w:pPr>
+        <w:numPr>
+          <w:ilvl w:val="0"/>
+          <w:numId w:val="2"/>
+        </w:numPr>
+        <w:spacing w:lineRule="auto"/>
+      </w:pPr>
+      <w:r>
+        <w:rPr>
+          <w:b/>
+        </w:rPr>
+        <w:t xml:space="preserve">Demande d'accès</w:t>
+      </w:r>
+      <w:r>
+        <w:rPr/>
+        <w:t xml:space="preserve"> — pour un parent qui n'a pas encore de compte</w:t>
+      </w:r>
+    </w:p>
+    <w:p>
+      <w:pPr>
+        <w:spacing w:lineRule="auto"/>
+      </w:pPr>
+      <w:r>
+        <w:rPr/>
+        <w:t xml:space="preserve">Ces deux boutons sont aussi disponibles en haut de toutes les pages publiques.</w:t>
+      </w:r>
+    </w:p>
+    <w:p>
+      <w:pPr>
+        <w:pStyle w:val="Heading2"/>
+        <w:spacing w:lineRule="auto"/>
+      </w:pPr>
+      <w:r>
+        <w:rPr/>
+        <w:t xml:space="preserve">2. Connexion</w:t>
+      </w:r>
+    </w:p>
+    <w:p>
+      <w:pPr>
+        <w:spacing w:lineRule="auto"/>
+      </w:pPr>
+      <w:r>
+        <w:rPr/>
+        <w:drawing>
+          <wp:inline distB="0" distL="0" distR="0" distT="0">
+            <wp:extent cx="5715000" cy="2743200"/>
+            <wp:effectExtent b="0" l="0" r="0" t="0"/>
+            <wp:docPr id="2" name="image-YgW_XFF8hIPOPA_qjOwIz.png"/>
+            <a:graphic>
+              <a:graphicData uri="http://schemas.openxmlformats.org/drawingml/2006/picture">
+                <pic:pic>
+                  <pic:nvPicPr>
+                    <pic:cNvPr id="2" name="image-YgW_XFF8hIPOPA_qjOwIz.png" descr="Écran de connexion"/>
+                    <pic:cNvPicPr/>
+                  </pic:nvPicPr>
+                  <pic:blipFill>
+                    <a:blip r:embed="rId7" cstate="print"/>
+                    <a:srcRect b="0" l="0" r="0" t="0"/>
+                    <a:stretch>
+                      <a:fillRect/>
+                    </a:stretch>
+                  </pic:blipFill>
+                  <pic:spPr>
+                    <a:xfrm>
+                      <a:off x="0" y="0"/>
+                      <a:ext cx="5715000" cy="2743200"/>
                     </a:xfrm>
                     <a:prstGeom prst="rect"/>
                   </pic:spPr>
@@ -884,16 +923,16 @@
           <wp:inline distB="0" distL="0" distR="0" distT="0">
             <wp:extent cx="5715000" cy="3571875"/>
             <wp:effectExtent b="0" l="0" r="0" t="0"/>
-            <wp:docPr id="2" name="image-CVptgZ9NEGzEZpjFXRw5q.png"/>
+            <wp:docPr id="3" name="image-yeZaGICYMQFI5YbUt37Xk.png"/>
             <a:graphic>
               <a:graphicData uri="http://schemas.openxmlformats.org/drawingml/2006/picture">
                 <pic:pic>
                   <pic:nvPicPr>
-                    <pic:cNvPr id="2" name="image-CVptgZ9NEGzEZpjFXRw5q.png" descr="Sélecteur d'habillage"/>
+                    <pic:cNvPr id="3" name="image-yeZaGICYMQFI5YbUt37Xk.png" descr="Sélecteur d'habillage"/>
                     <pic:cNvPicPr/>
                   </pic:nvPicPr>
                   <pic:blipFill>
-                    <a:blip r:embed="rId7" cstate="print"/>
+                    <a:blip r:embed="rId8" cstate="print"/>
                     <a:srcRect b="0" l="0" r="0" t="0"/>
                     <a:stretch>
                       <a:fillRect/>
@@ -1014,16 +1053,16 @@
                 <wp:inline distB="0" distL="0" distR="0" distT="0">
                   <wp:extent cx="1809750" cy="1133475"/>
                   <wp:effectExtent b="0" l="0" r="0" t="0"/>
-                  <wp:docPr id="4" name="image-S3DaOgdSGgCu5PI4-Hr_Y.png"/>
+                  <wp:docPr id="5" name="image-0-yQ-1e8iDe1qoo4qKlTP.png"/>
                   <a:graphic>
                     <a:graphicData uri="http://schemas.openxmlformats.org/drawingml/2006/picture">
                       <pic:pic>
                         <pic:nvPicPr>
-                          <pic:cNvPr id="4" name="image-S3DaOgdSGgCu5PI4-Hr_Y.png" descr="Habillage Premium"/>
+                          <pic:cNvPr id="5" name="image-0-yQ-1e8iDe1qoo4qKlTP.png" descr="Habillage Premium"/>
                           <pic:cNvPicPr/>
                         </pic:nvPicPr>
                         <pic:blipFill>
-                          <a:blip r:embed="rId9" cstate="print"/>
+                          <a:blip r:embed="rId10" cstate="print"/>
                           <a:srcRect b="0" l="0" r="0" t="0"/>
                           <a:stretch>
                             <a:fillRect/>
@@ -1106,16 +1145,16 @@
                 <wp:inline distB="0" distL="0" distR="0" distT="0">
                   <wp:extent cx="1809750" cy="1133475"/>
                   <wp:effectExtent b="0" l="0" r="0" t="0"/>
-                  <wp:docPr id="6" name="image-QROLZkchirrcefnGScbzg.png"/>
+                  <wp:docPr id="7" name="image-kSc4l_Y6Tlx98PLAzxSbF.png"/>
                   <a:graphic>
                     <a:graphicData uri="http://schemas.openxmlformats.org/drawingml/2006/picture">
                       <pic:pic>
                         <pic:nvPicPr>
-                          <pic:cNvPr id="6" name="image-QROLZkchirrcefnGScbzg.png" descr="Habillage Corporatif"/>
+                          <pic:cNvPr id="7" name="image-kSc4l_Y6Tlx98PLAzxSbF.png" descr="Habillage Corporatif"/>
                           <pic:cNvPicPr/>
                         </pic:nvPicPr>
                         <pic:blipFill>
-                          <a:blip r:embed="rId11" cstate="print"/>
+                          <a:blip r:embed="rId12" cstate="print"/>
                           <a:srcRect b="0" l="0" r="0" t="0"/>
                           <a:stretch>
                             <a:fillRect/>
@@ -1198,16 +1237,16 @@
                 <wp:inline distB="0" distL="0" distR="0" distT="0">
                   <wp:extent cx="1809750" cy="1133475"/>
                   <wp:effectExtent b="0" l="0" r="0" t="0"/>
-                  <wp:docPr id="8" name="image-3j6j3Y_7Go0nnyVrdSsOy.png"/>
+                  <wp:docPr id="9" name="image-GrlAqB0l6oyh62KRxqIwO.png"/>
                   <a:graphic>
                     <a:graphicData uri="http://schemas.openxmlformats.org/drawingml/2006/picture">
                       <pic:pic>
                         <pic:nvPicPr>
-                          <pic:cNvPr id="8" name="image-3j6j3Y_7Go0nnyVrdSsOy.png" descr="Habillage Moderne"/>
+                          <pic:cNvPr id="9" name="image-GrlAqB0l6oyh62KRxqIwO.png" descr="Habillage Moderne"/>
                           <pic:cNvPicPr/>
                         </pic:nvPicPr>
                         <pic:blipFill>
-                          <a:blip r:embed="rId13" cstate="print"/>
+                          <a:blip r:embed="rId14" cstate="print"/>
                           <a:srcRect b="0" l="0" r="0" t="0"/>
                           <a:stretch>
                             <a:fillRect/>
@@ -1267,70 +1306,12 @@
           <wp:inline distB="0" distL="0" distR="0" distT="0">
             <wp:extent cx="5715000" cy="3571875"/>
             <wp:effectExtent b="0" l="0" r="0" t="0"/>
-            <wp:docPr id="9" name="image-6HwWsS34Q6RnPlxYN0G-2.png"/>
+            <wp:docPr id="10" name="image-PWyY5C7ESVt_yJPWJWqdI.png"/>
             <a:graphic>
               <a:graphicData uri="http://schemas.openxmlformats.org/drawingml/2006/picture">
                 <pic:pic>
                   <pic:nvPicPr>
-                    <pic:cNvPr id="9" name="image-6HwWsS34Q6RnPlxYN0G-2.png" descr="Demande d'accès — étape 1 : identité"/>
-                    <pic:cNvPicPr/>
-                  </pic:nvPicPr>
-                  <pic:blipFill>
-                    <a:blip r:embed="rId14" cstate="print"/>
-                    <a:srcRect b="0" l="0" r="0" t="0"/>
-                    <a:stretch>
-                      <a:fillRect/>
-                    </a:stretch>
-                  </pic:blipFill>
-                  <pic:spPr>
-                    <a:xfrm>
-                      <a:off x="0" y="0"/>
-                      <a:ext cx="5715000" cy="3571875"/>
-                    </a:xfrm>
-                    <a:prstGeom prst="rect"/>
-                  </pic:spPr>
-                </pic:pic>
-              </a:graphicData>
-            </a:graphic>
-          </wp:inline>
-        </w:drawing>
-      </w:r>
-    </w:p>
-    <w:p>
-      <w:pPr>
-        <w:numPr>
-          <w:ilvl w:val="0"/>
-          <w:numId w:val="3"/>
-        </w:numPr>
-        <w:spacing w:lineRule="auto"/>
-      </w:pPr>
-      <w:r>
-        <w:rPr>
-          <w:b/>
-        </w:rPr>
-        <w:t xml:space="preserve">Identité</w:t>
-      </w:r>
-      <w:r>
-        <w:rPr/>
-        <w:t xml:space="preserve"> : nom, prénom, fonction (facultatif — par exemple « Maman », « Tuteur »).</w:t>
-      </w:r>
-    </w:p>
-    <w:p>
-      <w:pPr>
-        <w:spacing w:lineRule="auto"/>
-      </w:pPr>
-      <w:r>
-        <w:rPr/>
-        <w:drawing>
-          <wp:inline distB="0" distL="0" distR="0" distT="0">
-            <wp:extent cx="5715000" cy="3571875"/>
-            <wp:effectExtent b="0" l="0" r="0" t="0"/>
-            <wp:docPr id="10" name="image-6wH2nsGb27NM1PUDKEHTA.png"/>
-            <a:graphic>
-              <a:graphicData uri="http://schemas.openxmlformats.org/drawingml/2006/picture">
-                <pic:pic>
-                  <pic:nvPicPr>
-                    <pic:cNvPr id="10" name="image-6wH2nsGb27NM1PUDKEHTA.png" descr="Demande d'accès — étape 2 : contact"/>
+                    <pic:cNvPr id="10" name="image-PWyY5C7ESVt_yJPWJWqdI.png" descr="Demande d'accès — étape 1 : identité"/>
                     <pic:cNvPicPr/>
                   </pic:nvPicPr>
                   <pic:blipFill>
@@ -1358,7 +1339,7 @@
       <w:pPr>
         <w:numPr>
           <w:ilvl w:val="0"/>
-          <w:numId w:val="4"/>
+          <w:numId w:val="3"/>
         </w:numPr>
         <w:spacing w:lineRule="auto"/>
       </w:pPr>
@@ -1366,11 +1347,11 @@
         <w:rPr>
           <w:b/>
         </w:rPr>
-        <w:t xml:space="preserve">Contact</w:t>
-      </w:r>
-      <w:r>
-        <w:rPr/>
-        <w:t xml:space="preserve"> : numéro de téléphone principal (obligatoire), case à cocher « Ce numéro est aussi mon WhatsApp » (sinon un second numéro WhatsApp peut être saisi), second numéro de téléphone (facultatif), email (facultatif). Un message rappelle qu'une notification sera envoyée par SMS et invite à bien vérifier le numéro saisi.</w:t>
+        <w:t xml:space="preserve">Identité</w:t>
+      </w:r>
+      <w:r>
+        <w:rPr/>
+        <w:t xml:space="preserve"> : nom, prénom, fonction (facultatif — par exemple « Maman », « Tuteur »).</w:t>
       </w:r>
     </w:p>
     <w:p>
@@ -1383,12 +1364,12 @@
           <wp:inline distB="0" distL="0" distR="0" distT="0">
             <wp:extent cx="5715000" cy="3571875"/>
             <wp:effectExtent b="0" l="0" r="0" t="0"/>
-            <wp:docPr id="11" name="image-xPp4SffvIWtp_TZRgGRTp.png"/>
+            <wp:docPr id="11" name="image-rJUKuUYs9pqLbuG2jE-C2.png"/>
             <a:graphic>
               <a:graphicData uri="http://schemas.openxmlformats.org/drawingml/2006/picture">
                 <pic:pic>
                   <pic:nvPicPr>
-                    <pic:cNvPr id="11" name="image-xPp4SffvIWtp_TZRgGRTp.png" descr="Demande d'accès — étape 3 : résidence"/>
+                    <pic:cNvPr id="11" name="image-rJUKuUYs9pqLbuG2jE-C2.png" descr="Demande d'accès — étape 2 : contact"/>
                     <pic:cNvPicPr/>
                   </pic:nvPicPr>
                   <pic:blipFill>
@@ -1416,6 +1397,64 @@
       <w:pPr>
         <w:numPr>
           <w:ilvl w:val="0"/>
+          <w:numId w:val="4"/>
+        </w:numPr>
+        <w:spacing w:lineRule="auto"/>
+      </w:pPr>
+      <w:r>
+        <w:rPr>
+          <w:b/>
+        </w:rPr>
+        <w:t xml:space="preserve">Contact</w:t>
+      </w:r>
+      <w:r>
+        <w:rPr/>
+        <w:t xml:space="preserve"> : numéro de téléphone principal (obligatoire), case à cocher « Ce numéro est aussi mon WhatsApp » (sinon un second numéro WhatsApp peut être saisi), second numéro de téléphone (facultatif), email (facultatif). Un message rappelle qu'une notification sera envoyée par SMS et invite à bien vérifier le numéro saisi.</w:t>
+      </w:r>
+    </w:p>
+    <w:p>
+      <w:pPr>
+        <w:spacing w:lineRule="auto"/>
+      </w:pPr>
+      <w:r>
+        <w:rPr/>
+        <w:drawing>
+          <wp:inline distB="0" distL="0" distR="0" distT="0">
+            <wp:extent cx="5715000" cy="3571875"/>
+            <wp:effectExtent b="0" l="0" r="0" t="0"/>
+            <wp:docPr id="12" name="image-sCRPLtbXu1owLdEZdgnYG.png"/>
+            <a:graphic>
+              <a:graphicData uri="http://schemas.openxmlformats.org/drawingml/2006/picture">
+                <pic:pic>
+                  <pic:nvPicPr>
+                    <pic:cNvPr id="12" name="image-sCRPLtbXu1owLdEZdgnYG.png" descr="Demande d'accès — étape 3 : résidence"/>
+                    <pic:cNvPicPr/>
+                  </pic:nvPicPr>
+                  <pic:blipFill>
+                    <a:blip r:embed="rId17" cstate="print"/>
+                    <a:srcRect b="0" l="0" r="0" t="0"/>
+                    <a:stretch>
+                      <a:fillRect/>
+                    </a:stretch>
+                  </pic:blipFill>
+                  <pic:spPr>
+                    <a:xfrm>
+                      <a:off x="0" y="0"/>
+                      <a:ext cx="5715000" cy="3571875"/>
+                    </a:xfrm>
+                    <a:prstGeom prst="rect"/>
+                  </pic:spPr>
+                </pic:pic>
+              </a:graphicData>
+            </a:graphic>
+          </wp:inline>
+        </w:drawing>
+      </w:r>
+    </w:p>
+    <w:p>
+      <w:pPr>
+        <w:numPr>
+          <w:ilvl w:val="0"/>
           <w:numId w:val="5"/>
         </w:numPr>
         <w:spacing w:lineRule="auto"/>
@@ -1475,16 +1514,16 @@
           <wp:inline distB="0" distL="0" distR="0" distT="0">
             <wp:extent cx="5715000" cy="3571875"/>
             <wp:effectExtent b="0" l="0" r="0" t="0"/>
-            <wp:docPr id="12" name="image-IYDXl0RWbu97UtXH0shAz.png"/>
+            <wp:docPr id="13" name="image-qs5mo4RkuZXL2eVL4f_SW.png"/>
             <a:graphic>
               <a:graphicData uri="http://schemas.openxmlformats.org/drawingml/2006/picture">
                 <pic:pic>
                   <pic:nvPicPr>
-                    <pic:cNvPr id="12" name="image-IYDXl0RWbu97UtXH0shAz.png" descr="Demande d'accès — confirmation"/>
+                    <pic:cNvPr id="13" name="image-qs5mo4RkuZXL2eVL4f_SW.png" descr="Demande d'accès — confirmation"/>
                     <pic:cNvPicPr/>
                   </pic:nvPicPr>
                   <pic:blipFill>
-                    <a:blip r:embed="rId17" cstate="print"/>
+                    <a:blip r:embed="rId18" cstate="print"/>
                     <a:srcRect b="0" l="0" r="0" t="0"/>
                     <a:stretch>
                       <a:fillRect/>
@@ -3219,118 +3258,12 @@
           <wp:inline distB="0" distL="0" distR="0" distT="0">
             <wp:extent cx="5715000" cy="3571875"/>
             <wp:effectExtent b="0" l="0" r="0" t="0"/>
-            <wp:docPr id="13" name="image-ComckSdGATTtitI3zKJDY.png"/>
+            <wp:docPr id="14" name="image-QHDXkAayR3f1k36Kz3o4y.png"/>
             <a:graphic>
               <a:graphicData uri="http://schemas.openxmlformats.org/drawingml/2006/picture">
                 <pic:pic>
                   <pic:nvPicPr>
-                    <pic:cNvPr id="13" name="image-ComckSdGATTtitI3zKJDY.png" descr="Tableau de bord"/>
-                    <pic:cNvPicPr/>
-                  </pic:nvPicPr>
-                  <pic:blipFill>
-                    <a:blip r:embed="rId18" cstate="print"/>
-                    <a:srcRect b="0" l="0" r="0" t="0"/>
-                    <a:stretch>
-                      <a:fillRect/>
-                    </a:stretch>
-                  </pic:blipFill>
-                  <pic:spPr>
-                    <a:xfrm>
-                      <a:off x="0" y="0"/>
-                      <a:ext cx="5715000" cy="3571875"/>
-                    </a:xfrm>
-                    <a:prstGeom prst="rect"/>
-                  </pic:spPr>
-                </pic:pic>
-              </a:graphicData>
-            </a:graphic>
-          </wp:inline>
-        </w:drawing>
-      </w:r>
-    </w:p>
-    <w:p>
-      <w:pPr>
-        <w:spacing w:lineRule="auto"/>
-      </w:pPr>
-      <w:r>
-        <w:rPr/>
-        <w:t xml:space="preserve">Vue d'ensemble à l'ouverture de l'application : nombre d'élèves, répartition par statut d'accès, paiements récents, résumé des passages du jour.</w:t>
-      </w:r>
-    </w:p>
-    <w:p>
-      <w:pPr>
-        <w:numPr>
-          <w:ilvl w:val="0"/>
-          <w:numId w:val="6"/>
-        </w:numPr>
-        <w:spacing w:lineRule="auto"/>
-      </w:pPr>
-      <w:r>
-        <w:rPr>
-          <w:b/>
-        </w:rPr>
-        <w:t xml:space="preserve">Administrateur / gestionnaire / caissier</w:t>
-      </w:r>
-      <w:r>
-        <w:rPr/>
-        <w:t xml:space="preserve"> : les chiffres portent sur l'ensemble des élèves.</w:t>
-      </w:r>
-    </w:p>
-    <w:p>
-      <w:pPr>
-        <w:numPr>
-          <w:ilvl w:val="0"/>
-          <w:numId w:val="6"/>
-        </w:numPr>
-        <w:spacing w:lineRule="auto"/>
-      </w:pPr>
-      <w:r>
-        <w:rPr>
-          <w:b/>
-        </w:rPr>
-        <w:t xml:space="preserve">Parent</w:t>
-      </w:r>
-      <w:r>
-        <w:rPr/>
-        <w:t xml:space="preserve"> : les mêmes indicateurs (établissements, élèves, statuts, passages, paiements) portent uniquement sur </w:t>
-      </w:r>
-      <w:r>
-        <w:rPr>
-          <w:b/>
-        </w:rPr>
-        <w:t xml:space="preserve">ses propres enfants</w:t>
-      </w:r>
-      <w:r>
-        <w:rPr/>
-        <w:t xml:space="preserve"> — un parent d'un seul enfant verra par exemple « 1 élève », pas le total de l'établissement. Un parent qui n'a encore aucun enfant rattaché voit des indicateurs à zéro.</w:t>
-      </w:r>
-    </w:p>
-    <w:p>
-      <w:pPr>
-        <w:pStyle w:val="Heading2"/>
-        <w:spacing w:lineRule="auto"/>
-      </w:pPr>
-      <w:r>
-        <w:rPr/>
-        <w:t xml:space="preserve">6. Établissements (administrateur / gestionnaire / caissier)</w:t>
-      </w:r>
-    </w:p>
-    <w:p>
-      <w:pPr>
-        <w:spacing w:lineRule="auto"/>
-      </w:pPr>
-      <w:r>
-        <w:rPr/>
-        <w:drawing>
-          <wp:inline distB="0" distL="0" distR="0" distT="0">
-            <wp:extent cx="5715000" cy="3571875"/>
-            <wp:effectExtent b="0" l="0" r="0" t="0"/>
-            <wp:docPr id="14" name="image-kFnCRUtveef4uoqEZ5LCI.png"/>
-            <a:graphic>
-              <a:graphicData uri="http://schemas.openxmlformats.org/drawingml/2006/picture">
-                <pic:pic>
-                  <pic:nvPicPr>
-                    <pic:cNvPr id="14" name="image-kFnCRUtveef4uoqEZ5LCI.png" descr="Liste des établissements"/>
+                    <pic:cNvPr id="14" name="image-QHDXkAayR3f1k36Kz3o4y.png" descr="Tableau de bord"/>
                     <pic:cNvPicPr/>
                   </pic:nvPicPr>
                   <pic:blipFill>
@@ -3356,43 +3289,18 @@
     </w:p>
     <w:p>
       <w:pPr>
+        <w:spacing w:lineRule="auto"/>
+      </w:pPr>
+      <w:r>
+        <w:rPr/>
+        <w:t xml:space="preserve">Vue d'ensemble à l'ouverture de l'application : nombre d'élèves, répartition par statut d'accès, paiements récents, résumé des passages du jour.</w:t>
+      </w:r>
+    </w:p>
+    <w:p>
+      <w:pPr>
         <w:numPr>
           <w:ilvl w:val="0"/>
-          <w:numId w:val="7"/>
-        </w:numPr>
-        <w:spacing w:lineRule="auto"/>
-      </w:pPr>
-      <w:r>
-        <w:rPr/>
-        <w:t xml:space="preserve">Liste des établissements actifs. La création d'un nouvel établissement est réservée à l'administrateur ; la modification et la suppression (logique, sans perte de données) sont possibles pour le personnel autorisé.</w:t>
-      </w:r>
-    </w:p>
-    <w:p>
-      <w:pPr>
-        <w:numPr>
-          <w:ilvl w:val="0"/>
-          <w:numId w:val="7"/>
-        </w:numPr>
-        <w:spacing w:lineRule="auto"/>
-      </w:pPr>
-      <w:r>
-        <w:rPr/>
-        <w:t xml:space="preserve">Un outil « Gérer la structure » permet de créer plusieurs niveaux et classes d'un coup (par exemple taper </w:t>
-      </w:r>
-      <w:r>
-        <w:rPr/>
-        <w:t xml:space="preserve">CP, CE1, CM1</w:t>
-      </w:r>
-      <w:r>
-        <w:rPr/>
-        <w:t xml:space="preserve"> crée les trois niveaux en une seule fois), et de les modifier directement dans le tableau.</w:t>
-      </w:r>
-    </w:p>
-    <w:p>
-      <w:pPr>
-        <w:numPr>
-          <w:ilvl w:val="0"/>
-          <w:numId w:val="7"/>
+          <w:numId w:val="6"/>
         </w:numPr>
         <w:spacing w:lineRule="auto"/>
       </w:pPr>
@@ -3400,24 +3308,40 @@
         <w:rPr>
           <w:b/>
         </w:rPr>
-        <w:t xml:space="preserve">Délai de grâce</w:t>
-      </w:r>
-      <w:r>
-        <w:rPr/>
-        <w:t xml:space="preserve"> : un champ optionnel permet de définir, pour cet établissement uniquement, un délai différent du délai par défaut (7 jours, réglable dans les Paramètres, §16). Laisser le champ vide pour garder le délai par défaut.</w:t>
+        <w:t xml:space="preserve">Administrateur / gestionnaire / caissier</w:t>
+      </w:r>
+      <w:r>
+        <w:rPr/>
+        <w:t xml:space="preserve"> : les chiffres portent sur l'ensemble des élèves.</w:t>
       </w:r>
     </w:p>
     <w:p>
       <w:pPr>
         <w:numPr>
           <w:ilvl w:val="0"/>
-          <w:numId w:val="7"/>
-        </w:numPr>
-        <w:spacing w:lineRule="auto"/>
-      </w:pPr>
-      <w:r>
-        <w:rPr/>
-        <w:t xml:space="preserve">Ce menu n'est pas accessible directement à un parent, mais la liste des établissements et des classes lui reste visible pour pouvoir choisir la bonne classe quand il ajoute un enfant (§8) — la création ou la modification restent réservées au personnel.</w:t>
+          <w:numId w:val="6"/>
+        </w:numPr>
+        <w:spacing w:lineRule="auto"/>
+      </w:pPr>
+      <w:r>
+        <w:rPr>
+          <w:b/>
+        </w:rPr>
+        <w:t xml:space="preserve">Parent</w:t>
+      </w:r>
+      <w:r>
+        <w:rPr/>
+        <w:t xml:space="preserve"> : les mêmes indicateurs (établissements, élèves, statuts, passages, paiements) portent uniquement sur </w:t>
+      </w:r>
+      <w:r>
+        <w:rPr>
+          <w:b/>
+        </w:rPr>
+        <w:t xml:space="preserve">ses propres enfants</w:t>
+      </w:r>
+      <w:r>
+        <w:rPr/>
+        <w:t xml:space="preserve"> — un parent d'un seul enfant verra par exemple « 1 élève », pas le total de l'établissement. Un parent qui n'a encore aucun enfant rattaché voit des indicateurs à zéro.</w:t>
       </w:r>
     </w:p>
     <w:p>
@@ -3427,7 +3351,7 @@
       </w:pPr>
       <w:r>
         <w:rPr/>
-        <w:t xml:space="preserve">7. Élèves (administrateur / gestionnaire / caissier)</w:t>
+        <w:t xml:space="preserve">6. Établissements (administrateur / gestionnaire / caissier)</w:t>
       </w:r>
     </w:p>
     <w:p>
@@ -3440,12 +3364,12 @@
           <wp:inline distB="0" distL="0" distR="0" distT="0">
             <wp:extent cx="5715000" cy="3571875"/>
             <wp:effectExtent b="0" l="0" r="0" t="0"/>
-            <wp:docPr id="15" name="image-mIo-dfPGYx1WLUcrYPQwP.png"/>
+            <wp:docPr id="15" name="image-xn6rapYZqe2SAJ--80ATb.png"/>
             <a:graphic>
               <a:graphicData uri="http://schemas.openxmlformats.org/drawingml/2006/picture">
                 <pic:pic>
                   <pic:nvPicPr>
-                    <pic:cNvPr id="15" name="image-mIo-dfPGYx1WLUcrYPQwP.png" descr="Liste des élèves"/>
+                    <pic:cNvPr id="15" name="image-xn6rapYZqe2SAJ--80ATb.png" descr="Liste des établissements"/>
                     <pic:cNvPicPr/>
                   </pic:nvPicPr>
                   <pic:blipFill>
@@ -3473,20 +3397,41 @@
       <w:pPr>
         <w:numPr>
           <w:ilvl w:val="0"/>
-          <w:numId w:val="8"/>
-        </w:numPr>
-        <w:spacing w:lineRule="auto"/>
-      </w:pPr>
-      <w:r>
-        <w:rPr/>
-        <w:t xml:space="preserve">Liste des élèves avec pagination (reste rapide même avec un grand nombre d'élèves).</w:t>
+          <w:numId w:val="7"/>
+        </w:numPr>
+        <w:spacing w:lineRule="auto"/>
+      </w:pPr>
+      <w:r>
+        <w:rPr/>
+        <w:t xml:space="preserve">Liste des établissements actifs. La création d'un nouvel établissement est réservée à l'administrateur ; la modification et la suppression (logique, sans perte de données) sont possibles pour le personnel autorisé.</w:t>
       </w:r>
     </w:p>
     <w:p>
       <w:pPr>
         <w:numPr>
           <w:ilvl w:val="0"/>
-          <w:numId w:val="8"/>
+          <w:numId w:val="7"/>
+        </w:numPr>
+        <w:spacing w:lineRule="auto"/>
+      </w:pPr>
+      <w:r>
+        <w:rPr/>
+        <w:t xml:space="preserve">Un outil « Gérer la structure » permet de créer plusieurs niveaux et classes d'un coup (par exemple taper </w:t>
+      </w:r>
+      <w:r>
+        <w:rPr/>
+        <w:t xml:space="preserve">CP, CE1, CM1</w:t>
+      </w:r>
+      <w:r>
+        <w:rPr/>
+        <w:t xml:space="preserve"> crée les trois niveaux en une seule fois), et de les modifier directement dans le tableau.</w:t>
+      </w:r>
+    </w:p>
+    <w:p>
+      <w:pPr>
+        <w:numPr>
+          <w:ilvl w:val="0"/>
+          <w:numId w:val="7"/>
         </w:numPr>
         <w:spacing w:lineRule="auto"/>
       </w:pPr>
@@ -3494,43 +3439,34 @@
         <w:rPr>
           <w:b/>
         </w:rPr>
-        <w:t xml:space="preserve">Recherche</w:t>
-      </w:r>
-      <w:r>
-        <w:rPr/>
-        <w:t xml:space="preserve"> par nom, prénom ou matricule ; filtres par établissement et par statut d'accès.</w:t>
+        <w:t xml:space="preserve">Délai de grâce</w:t>
+      </w:r>
+      <w:r>
+        <w:rPr/>
+        <w:t xml:space="preserve"> : un champ optionnel permet de définir, pour cet établissement uniquement, un délai différent du délai par défaut (7 jours, réglable dans les Paramètres, §16). Laisser le champ vide pour garder le délai par défaut.</w:t>
       </w:r>
     </w:p>
     <w:p>
       <w:pPr>
         <w:numPr>
           <w:ilvl w:val="0"/>
-          <w:numId w:val="8"/>
-        </w:numPr>
-        <w:spacing w:lineRule="auto"/>
-      </w:pPr>
-      <w:r>
-        <w:rPr>
-          <w:b/>
-        </w:rPr>
-        <w:t xml:space="preserve">Export</w:t>
-      </w:r>
-      <w:r>
-        <w:rPr/>
-        <w:t xml:space="preserve"> de la liste affichée au format tableau (CSV), via le bouton dédié.</w:t>
-      </w:r>
-    </w:p>
-    <w:p>
-      <w:pPr>
-        <w:numPr>
-          <w:ilvl w:val="0"/>
-          <w:numId w:val="8"/>
-        </w:numPr>
-        <w:spacing w:lineRule="auto"/>
-      </w:pPr>
-      <w:r>
-        <w:rPr/>
-        <w:t xml:space="preserve">La création ou la modification d'un élève se fait dans un formulaire en 3 étapes, pour rester clair et tenir sur un seul écran :</w:t>
+          <w:numId w:val="7"/>
+        </w:numPr>
+        <w:spacing w:lineRule="auto"/>
+      </w:pPr>
+      <w:r>
+        <w:rPr/>
+        <w:t xml:space="preserve">Ce menu n'est pas accessible directement à un parent, mais la liste des établissements et des classes lui reste visible pour pouvoir choisir la bonne classe quand il ajoute un enfant (§8) — la création ou la modification restent réservées au personnel.</w:t>
+      </w:r>
+    </w:p>
+    <w:p>
+      <w:pPr>
+        <w:pStyle w:val="Heading2"/>
+        <w:spacing w:lineRule="auto"/>
+      </w:pPr>
+      <w:r>
+        <w:rPr/>
+        <w:t xml:space="preserve">7. Élèves (administrateur / gestionnaire / caissier)</w:t>
       </w:r>
     </w:p>
     <w:p>
@@ -3543,12 +3479,12 @@
           <wp:inline distB="0" distL="0" distR="0" distT="0">
             <wp:extent cx="5715000" cy="3571875"/>
             <wp:effectExtent b="0" l="0" r="0" t="0"/>
-            <wp:docPr id="16" name="image-2xzeARxqRvTRWYMe4eimC.png"/>
+            <wp:docPr id="16" name="image-PLq_1scscGnvE3RmRq5ph.png"/>
             <a:graphic>
               <a:graphicData uri="http://schemas.openxmlformats.org/drawingml/2006/picture">
                 <pic:pic>
                   <pic:nvPicPr>
-                    <pic:cNvPr id="16" name="image-2xzeARxqRvTRWYMe4eimC.png" descr="Fiche élève — Informations générales"/>
+                    <pic:cNvPr id="16" name="image-PLq_1scscGnvE3RmRq5ph.png" descr="Liste des élèves"/>
                     <pic:cNvPicPr/>
                   </pic:nvPicPr>
                   <pic:blipFill>
@@ -3571,18 +3507,87 @@
           </wp:inline>
         </w:drawing>
       </w:r>
+    </w:p>
+    <w:p>
+      <w:pPr>
+        <w:numPr>
+          <w:ilvl w:val="0"/>
+          <w:numId w:val="8"/>
+        </w:numPr>
+        <w:spacing w:lineRule="auto"/>
+      </w:pPr>
+      <w:r>
+        <w:rPr/>
+        <w:t xml:space="preserve">Liste des élèves avec pagination (reste rapide même avec un grand nombre d'élèves).</w:t>
+      </w:r>
+    </w:p>
+    <w:p>
+      <w:pPr>
+        <w:numPr>
+          <w:ilvl w:val="0"/>
+          <w:numId w:val="8"/>
+        </w:numPr>
+        <w:spacing w:lineRule="auto"/>
+      </w:pPr>
+      <w:r>
+        <w:rPr>
+          <w:b/>
+        </w:rPr>
+        <w:t xml:space="preserve">Recherche</w:t>
+      </w:r>
+      <w:r>
+        <w:rPr/>
+        <w:t xml:space="preserve"> par nom, prénom ou matricule ; filtres par établissement et par statut d'accès.</w:t>
+      </w:r>
+    </w:p>
+    <w:p>
+      <w:pPr>
+        <w:numPr>
+          <w:ilvl w:val="0"/>
+          <w:numId w:val="8"/>
+        </w:numPr>
+        <w:spacing w:lineRule="auto"/>
+      </w:pPr>
+      <w:r>
+        <w:rPr>
+          <w:b/>
+        </w:rPr>
+        <w:t xml:space="preserve">Export</w:t>
+      </w:r>
+      <w:r>
+        <w:rPr/>
+        <w:t xml:space="preserve"> de la liste affichée au format tableau (CSV), via le bouton dédié.</w:t>
+      </w:r>
+    </w:p>
+    <w:p>
+      <w:pPr>
+        <w:numPr>
+          <w:ilvl w:val="0"/>
+          <w:numId w:val="8"/>
+        </w:numPr>
+        <w:spacing w:lineRule="auto"/>
+      </w:pPr>
+      <w:r>
+        <w:rPr/>
+        <w:t xml:space="preserve">La création ou la modification d'un élève se fait dans un formulaire en 3 étapes, pour rester clair et tenir sur un seul écran :</w:t>
+      </w:r>
+    </w:p>
+    <w:p>
+      <w:pPr>
+        <w:spacing w:lineRule="auto"/>
+      </w:pPr>
       <w:r>
         <w:rPr/>
         <w:drawing>
           <wp:inline distB="0" distL="0" distR="0" distT="0">
             <wp:extent cx="5715000" cy="3571875"/>
             <wp:effectExtent b="0" l="0" r="0" t="0"/>
-            <wp:docPr id="17" name="image-wullpiza3QgUh3oiIb0M1.png"/>
+            <wp:docPr id="17" name="image-deEIgK5SLYVGBP3RZl3-c.png"/>
             <a:graphic>
               <a:graphicData uri="http://schemas.openxmlformats.org/drawingml/2006/picture">
                 <pic:pic>
                   <pic:nvPicPr>
-                    <pic:cNvPr id="17" name="image-wullpiza3QgUh3oiIb0M1.png" descr="Fiche élève — Cantine et affectation"/>
+                    <pic:cNvPr id="17" name="image-deEIgK5SLYVGBP3RZl3-c.png" descr="Fiche élève — Informations générales"/>
                     <pic:cNvPicPr/>
                   </pic:nvPicPr>
                   <pic:blipFill>
@@ -3611,12 +3616,12 @@
           <wp:inline distB="0" distL="0" distR="0" distT="0">
             <wp:extent cx="5715000" cy="3571875"/>
             <wp:effectExtent b="0" l="0" r="0" t="0"/>
-            <wp:docPr id="18" name="image-ciBtbZnuTrtk0PlB1Nv9_.png"/>
+            <wp:docPr id="18" name="image-yYnJgta4p8vVGQMIUfEXj.png"/>
             <a:graphic>
               <a:graphicData uri="http://schemas.openxmlformats.org/drawingml/2006/picture">
                 <pic:pic>
                   <pic:nvPicPr>
-                    <pic:cNvPr id="18" name="image-ciBtbZnuTrtk0PlB1Nv9_.png" descr="Fiche élève — Contacts et allergies"/>
+                    <pic:cNvPr id="18" name="image-yYnJgta4p8vVGQMIUfEXj.png" descr="Fiche élève — Cantine et affectation"/>
                     <pic:cNvPicPr/>
                   </pic:nvPicPr>
                   <pic:blipFill>
@@ -3639,230 +3644,18 @@
           </wp:inline>
         </w:drawing>
       </w:r>
-    </w:p>
-    <w:p>
-      <w:pPr>
-        <w:numPr>
-          <w:ilvl w:val="0"/>
-          <w:numId w:val="9"/>
-        </w:numPr>
-        <w:spacing w:lineRule="auto"/>
-      </w:pPr>
-      <w:r>
-        <w:rPr/>
-        <w:t xml:space="preserve">Chaque élève dispose d'un QR Code personnel : consultable, copiable, imprimable — c'est ce même QR Code qui est destiné à être imprimé sur un badge plastifié remis à l'élève (voir l'offre commerciale pour la fabrication des badges).</w:t>
-      </w:r>
-    </w:p>
-    <w:p>
-      <w:pPr>
-        <w:numPr>
-          <w:ilvl w:val="0"/>
-          <w:numId w:val="9"/>
-        </w:numPr>
-        <w:spacing w:lineRule="auto"/>
-      </w:pPr>
-      <w:r>
-        <w:rPr/>
-        <w:t xml:space="preserve">La suppression d'un élève est réservée à l'administrateur.</w:t>
-      </w:r>
-    </w:p>
-    <w:p>
-      <w:pPr>
-        <w:numPr>
-          <w:ilvl w:val="0"/>
-          <w:numId w:val="9"/>
-        </w:numPr>
-        <w:spacing w:lineRule="auto"/>
-      </w:pPr>
-      <w:r>
-        <w:rPr/>
-        <w:t xml:space="preserve">Ce menu n'est pas accessible à un parent (le parent ajoute ses propres enfants depuis « Mes enfants », §8).</w:t>
-      </w:r>
-    </w:p>
-    <w:p>
-      <w:pPr>
-        <w:pStyle w:val="Heading3"/>
-        <w:spacing w:lineRule="auto"/>
-      </w:pPr>
-      <w:r>
-        <w:rPr/>
-        <w:t xml:space="preserve">Allergies et certificat médical</w:t>
-      </w:r>
-    </w:p>
-    <w:p>
-      <w:pPr>
-        <w:numPr>
-          <w:ilvl w:val="0"/>
-          <w:numId w:val="10"/>
-        </w:numPr>
-        <w:spacing w:lineRule="auto"/>
-      </w:pPr>
-      <w:r>
-        <w:rPr/>
-        <w:t xml:space="preserve">Le champ </w:t>
-      </w:r>
-      <w:r>
-        <w:rPr>
-          <w:b/>
-        </w:rPr>
-        <w:t xml:space="preserve">Allergies</w:t>
-      </w:r>
-      <w:r>
-        <w:rPr/>
-        <w:t xml:space="preserve"> ne peut être renseigné </w:t>
-      </w:r>
-      <w:r>
-        <w:rPr>
-          <w:b/>
-        </w:rPr>
-        <w:t xml:space="preserve">qu'après la création</w:t>
-      </w:r>
-      <w:r>
-        <w:rPr/>
-        <w:t xml:space="preserve"> de la fiche de l'élève, pas au moment de la création : le certificat médical qui l'accompagne ne peut être ajouté qu'une fois la fiche déjà enregistrée. Il faut donc d'abord créer l'élève sans allergie, puis ouvrir « Modifier » pour la déclarer.</w:t>
-      </w:r>
-    </w:p>
-    <w:p>
-      <w:pPr>
-        <w:numPr>
-          <w:ilvl w:val="0"/>
-          <w:numId w:val="10"/>
-        </w:numPr>
-        <w:spacing w:lineRule="auto"/>
-      </w:pPr>
-      <w:r>
-        <w:rPr/>
-        <w:t xml:space="preserve">Une fois en modification, un bloc </w:t>
-      </w:r>
-      <w:r>
-        <w:rPr>
-          <w:b/>
-        </w:rPr>
-        <w:t xml:space="preserve">Certificat médical</w:t>
-      </w:r>
-      <w:r>
-        <w:rPr/>
-        <w:t xml:space="preserve"> permet d'</w:t>
-      </w:r>
-      <w:r>
-        <w:rPr>
-          <w:b/>
-        </w:rPr>
-        <w:t xml:space="preserve">ajouter un fichier</w:t>
-      </w:r>
-      <w:r>
-        <w:rPr/>
-        <w:t xml:space="preserve"> (PDF, JPG ou PNG). Une fois le fichier envoyé, un repère « Certificat fourni » apparaît avec un lien pour le consulter et un bouton pour le remplacer si besoin.</w:t>
-      </w:r>
-    </w:p>
-    <w:p>
-      <w:pPr>
-        <w:numPr>
-          <w:ilvl w:val="0"/>
-          <w:numId w:val="10"/>
-        </w:numPr>
-        <w:spacing w:lineRule="auto"/>
-      </w:pPr>
-      <w:r>
-        <w:rPr/>
-        <w:t xml:space="preserve">L'enregistrement de la fiche est bloqué, avec un message clair, si le champ Allergies contient du texte mais qu'aucun certificat n'a été ajouté.</w:t>
-      </w:r>
-    </w:p>
-    <w:p>
-      <w:pPr>
-        <w:pStyle w:val="Heading2"/>
-        <w:spacing w:lineRule="auto"/>
-      </w:pPr>
-      <w:r>
-        <w:rPr/>
-        <w:t xml:space="preserve">8. Mes enfants (espace parent — en libre-service)</w:t>
-      </w:r>
-    </w:p>
-    <w:p>
-      <w:pPr>
-        <w:pStyle w:val="Heading3"/>
-        <w:spacing w:lineRule="auto"/>
-      </w:pPr>
-      <w:r>
-        <w:rPr/>
-        <w:t xml:space="preserve">Ce qui se passe quand un parent se connecte</w:t>
-      </w:r>
-    </w:p>
-    <w:p>
-      <w:pPr>
-        <w:spacing w:lineRule="auto"/>
-      </w:pPr>
-      <w:r>
-        <w:rPr/>
-        <w:t xml:space="preserve">Une fois connecté avec son email (ou son identifiant) et son mot de passe, un parent arrive d'abord sur le </w:t>
-      </w:r>
-      <w:r>
-        <w:rPr>
-          <w:b/>
-        </w:rPr>
-        <w:t xml:space="preserve">Tableau de bord</w:t>
-      </w:r>
-      <w:r>
-        <w:rPr/>
-        <w:t xml:space="preserve"> (§5), avec ses propres statistiques (nombre d'enfants, statut d'accès, passages récents). Le menu de gauche, spécifique au rôle Parent, ne propose que quatre écrans : </w:t>
-      </w:r>
-      <w:r>
-        <w:rPr>
-          <w:b/>
-        </w:rPr>
-        <w:t xml:space="preserve">Tableau de bord</w:t>
-      </w:r>
-      <w:r>
-        <w:rPr/>
-        <w:t xml:space="preserve">, </w:t>
-      </w:r>
-      <w:r>
-        <w:rPr>
-          <w:b/>
-        </w:rPr>
-        <w:t xml:space="preserve">Mes enfants</w:t>
-      </w:r>
-      <w:r>
-        <w:rPr/>
-        <w:t xml:space="preserve">, </w:t>
-      </w:r>
-      <w:r>
-        <w:rPr>
-          <w:b/>
-        </w:rPr>
-        <w:t xml:space="preserve">Paiements</w:t>
-      </w:r>
-      <w:r>
-        <w:rPr/>
-        <w:t xml:space="preserve"> et </w:t>
-      </w:r>
-      <w:r>
-        <w:rPr>
-          <w:b/>
-        </w:rPr>
-        <w:t xml:space="preserve">Historique</w:t>
-      </w:r>
-      <w:r>
-        <w:rPr/>
-        <w:t xml:space="preserve"> — tous les menus réservés au personnel (Établissements, Élèves, Scan Réfectoire, Utilisateurs, etc.) sont absents. En cliquant sur « Mes enfants » dans ce menu, le parent arrive sur l'écran suivant :</w:t>
-      </w:r>
-    </w:p>
-    <w:p>
-      <w:pPr>
-        <w:spacing w:lineRule="auto"/>
-      </w:pPr>
       <w:r>
         <w:rPr/>
         <w:drawing>
           <wp:inline distB="0" distL="0" distR="0" distT="0">
             <wp:extent cx="5715000" cy="3571875"/>
             <wp:effectExtent b="0" l="0" r="0" t="0"/>
-            <wp:docPr id="19" name="image-88HlCUlBrYmFsXJi5PCkN.png"/>
+            <wp:docPr id="19" name="image-ma-wJhms6s0_zu9jFE5O1.png"/>
             <a:graphic>
               <a:graphicData uri="http://schemas.openxmlformats.org/drawingml/2006/picture">
                 <pic:pic>
                   <pic:nvPicPr>
-                    <pic:cNvPr id="19" name="image-88HlCUlBrYmFsXJi5PCkN.png" descr="Mes enfants — liste des enfants rattachés"/>
+                    <pic:cNvPr id="19" name="image-ma-wJhms6s0_zu9jFE5O1.png" descr="Fiche élève — Contacts et allergies"/>
                     <pic:cNvPicPr/>
                   </pic:nvPicPr>
                   <pic:blipFill>
@@ -3890,38 +3683,207 @@
       <w:pPr>
         <w:numPr>
           <w:ilvl w:val="0"/>
-          <w:numId w:val="11"/>
-        </w:numPr>
-        <w:spacing w:lineRule="auto"/>
-      </w:pPr>
+          <w:numId w:val="9"/>
+        </w:numPr>
+        <w:spacing w:lineRule="auto"/>
+      </w:pPr>
+      <w:r>
+        <w:rPr/>
+        <w:t xml:space="preserve">Chaque élève dispose d'un QR Code personnel : consultable, copiable, imprimable — c'est ce même QR Code qui est destiné à être imprimé sur un badge plastifié remis à l'élève (voir l'offre commerciale pour la fabrication des badges).</w:t>
+      </w:r>
+    </w:p>
+    <w:p>
+      <w:pPr>
+        <w:numPr>
+          <w:ilvl w:val="0"/>
+          <w:numId w:val="9"/>
+        </w:numPr>
+        <w:spacing w:lineRule="auto"/>
+      </w:pPr>
+      <w:r>
+        <w:rPr/>
+        <w:t xml:space="preserve">La suppression d'un élève est réservée à l'administrateur.</w:t>
+      </w:r>
+    </w:p>
+    <w:p>
+      <w:pPr>
+        <w:numPr>
+          <w:ilvl w:val="0"/>
+          <w:numId w:val="9"/>
+        </w:numPr>
+        <w:spacing w:lineRule="auto"/>
+      </w:pPr>
+      <w:r>
+        <w:rPr/>
+        <w:t xml:space="preserve">Ce menu n'est pas accessible à un parent (le parent ajoute ses propres enfants depuis « Mes enfants », §8).</w:t>
+      </w:r>
+    </w:p>
+    <w:p>
+      <w:pPr>
+        <w:pStyle w:val="Heading3"/>
+        <w:spacing w:lineRule="auto"/>
+      </w:pPr>
+      <w:r>
+        <w:rPr/>
+        <w:t xml:space="preserve">Allergies et certificat médical</w:t>
+      </w:r>
+    </w:p>
+    <w:p>
+      <w:pPr>
+        <w:numPr>
+          <w:ilvl w:val="0"/>
+          <w:numId w:val="10"/>
+        </w:numPr>
+        <w:spacing w:lineRule="auto"/>
+      </w:pPr>
+      <w:r>
+        <w:rPr/>
+        <w:t xml:space="preserve">Le champ </w:t>
+      </w:r>
       <w:r>
         <w:rPr>
           <w:b/>
         </w:rPr>
-        <w:t xml:space="preserve">Consulter</w:t>
-      </w:r>
-      <w:r>
-        <w:rPr/>
-        <w:t xml:space="preserve"> la liste de ses enfants déjà rattachés : nom, matricule, statut d'accès (Autorisé, En attente de paiement, Période de grâce, Suspendu).</w:t>
-      </w:r>
-    </w:p>
-    <w:p>
-      <w:pPr>
-        <w:numPr>
-          <w:ilvl w:val="0"/>
-          <w:numId w:val="11"/>
-        </w:numPr>
-        <w:spacing w:lineRule="auto"/>
-      </w:pPr>
+        <w:t xml:space="preserve">Allergies</w:t>
+      </w:r>
+      <w:r>
+        <w:rPr/>
+        <w:t xml:space="preserve"> ne peut être renseigné </w:t>
+      </w:r>
       <w:r>
         <w:rPr>
           <w:b/>
         </w:rPr>
-        <w:t xml:space="preserve">Ajouter un enfant</w:t>
-      </w:r>
-      <w:r>
-        <w:rPr/>
-        <w:t xml:space="preserve"> lui-même, via le bouton « Ajouter un enfant » qui ouvre un petit formulaire :</w:t>
+        <w:t xml:space="preserve">qu'après la création</w:t>
+      </w:r>
+      <w:r>
+        <w:rPr/>
+        <w:t xml:space="preserve"> de la fiche de l'élève, pas au moment de la création : le certificat médical qui l'accompagne ne peut être ajouté qu'une fois la fiche déjà enregistrée. Il faut donc d'abord créer l'élève sans allergie, puis ouvrir « Modifier » pour la déclarer.</w:t>
+      </w:r>
+    </w:p>
+    <w:p>
+      <w:pPr>
+        <w:numPr>
+          <w:ilvl w:val="0"/>
+          <w:numId w:val="10"/>
+        </w:numPr>
+        <w:spacing w:lineRule="auto"/>
+      </w:pPr>
+      <w:r>
+        <w:rPr/>
+        <w:t xml:space="preserve">Une fois en modification, un bloc </w:t>
+      </w:r>
+      <w:r>
+        <w:rPr>
+          <w:b/>
+        </w:rPr>
+        <w:t xml:space="preserve">Certificat médical</w:t>
+      </w:r>
+      <w:r>
+        <w:rPr/>
+        <w:t xml:space="preserve"> permet d'</w:t>
+      </w:r>
+      <w:r>
+        <w:rPr>
+          <w:b/>
+        </w:rPr>
+        <w:t xml:space="preserve">ajouter un fichier</w:t>
+      </w:r>
+      <w:r>
+        <w:rPr/>
+        <w:t xml:space="preserve"> (PDF, JPG ou PNG). Une fois le fichier envoyé, un repère « Certificat fourni » apparaît avec un lien pour le consulter et un bouton pour le remplacer si besoin.</w:t>
+      </w:r>
+    </w:p>
+    <w:p>
+      <w:pPr>
+        <w:numPr>
+          <w:ilvl w:val="0"/>
+          <w:numId w:val="10"/>
+        </w:numPr>
+        <w:spacing w:lineRule="auto"/>
+      </w:pPr>
+      <w:r>
+        <w:rPr/>
+        <w:t xml:space="preserve">L'enregistrement de la fiche est bloqué, avec un message clair, si le champ Allergies contient du texte mais qu'aucun certificat n'a été ajouté.</w:t>
+      </w:r>
+    </w:p>
+    <w:p>
+      <w:pPr>
+        <w:pStyle w:val="Heading2"/>
+        <w:spacing w:lineRule="auto"/>
+      </w:pPr>
+      <w:r>
+        <w:rPr/>
+        <w:t xml:space="preserve">8. Mes enfants (espace parent — en libre-service)</w:t>
+      </w:r>
+    </w:p>
+    <w:p>
+      <w:pPr>
+        <w:pStyle w:val="Heading3"/>
+        <w:spacing w:lineRule="auto"/>
+      </w:pPr>
+      <w:r>
+        <w:rPr/>
+        <w:t xml:space="preserve">Ce qui se passe quand un parent se connecte</w:t>
+      </w:r>
+    </w:p>
+    <w:p>
+      <w:pPr>
+        <w:spacing w:lineRule="auto"/>
+      </w:pPr>
+      <w:r>
+        <w:rPr/>
+        <w:t xml:space="preserve">Une fois connecté avec son email (ou son identifiant) et son mot de passe, un parent arrive d'abord sur le </w:t>
+      </w:r>
+      <w:r>
+        <w:rPr>
+          <w:b/>
+        </w:rPr>
+        <w:t xml:space="preserve">Tableau de bord</w:t>
+      </w:r>
+      <w:r>
+        <w:rPr/>
+        <w:t xml:space="preserve"> (§5), avec ses propres statistiques (nombre d'enfants, statut d'accès, passages récents). Le menu de gauche, spécifique au rôle Parent, ne propose que quatre écrans : </w:t>
+      </w:r>
+      <w:r>
+        <w:rPr>
+          <w:b/>
+        </w:rPr>
+        <w:t xml:space="preserve">Tableau de bord</w:t>
+      </w:r>
+      <w:r>
+        <w:rPr/>
+        <w:t xml:space="preserve">, </w:t>
+      </w:r>
+      <w:r>
+        <w:rPr>
+          <w:b/>
+        </w:rPr>
+        <w:t xml:space="preserve">Mes enfants</w:t>
+      </w:r>
+      <w:r>
+        <w:rPr/>
+        <w:t xml:space="preserve">, </w:t>
+      </w:r>
+      <w:r>
+        <w:rPr>
+          <w:b/>
+        </w:rPr>
+        <w:t xml:space="preserve">Paiements</w:t>
+      </w:r>
+      <w:r>
+        <w:rPr/>
+        <w:t xml:space="preserve"> et </w:t>
+      </w:r>
+      <w:r>
+        <w:rPr>
+          <w:b/>
+        </w:rPr>
+        <w:t xml:space="preserve">Historique</w:t>
+      </w:r>
+      <w:r>
+        <w:rPr/>
+        <w:t xml:space="preserve"> — tous les menus réservés au personnel (Établissements, Élèves, Scan Réfectoire, Utilisateurs, etc.) sont absents. En cliquant sur « Mes enfants » dans ce menu, le parent arrive sur l'écran suivant :</w:t>
       </w:r>
     </w:p>
     <w:p>
@@ -3934,12 +3896,12 @@
           <wp:inline distB="0" distL="0" distR="0" distT="0">
             <wp:extent cx="5715000" cy="3571875"/>
             <wp:effectExtent b="0" l="0" r="0" t="0"/>
-            <wp:docPr id="20" name="image-yL23eQaiAJP8CDYr69HRE.png"/>
+            <wp:docPr id="20" name="image-7Cm2OXZ610bXcPiQJ4EC3.png"/>
             <a:graphic>
               <a:graphicData uri="http://schemas.openxmlformats.org/drawingml/2006/picture">
                 <pic:pic>
                   <pic:nvPicPr>
-                    <pic:cNvPr id="20" name="image-yL23eQaiAJP8CDYr69HRE.png" descr="Mes enfants — formulaire d'ajout"/>
+                    <pic:cNvPr id="20" name="image-7Cm2OXZ610bXcPiQJ4EC3.png" descr="Mes enfants — liste des enfants rattachés"/>
                     <pic:cNvPicPr/>
                   </pic:nvPicPr>
                   <pic:blipFill>
@@ -3965,67 +3927,40 @@
     </w:p>
     <w:p>
       <w:pPr>
-        <w:spacing w:lineRule="auto"/>
-      </w:pPr>
-      <w:r>
-        <w:rPr/>
-        <w:t xml:space="preserve">  Le parent choisit l'établissement dans une liste déroulante, puis la classe correspondante   s'affiche automatiquement une fois l'établissement choisi (les choix proposés dépendent de ce   que l'administrateur a déjà configuré pour cet établissement), et renseigne le matricule   (communiqué par l'établissement à l'inscription), le nom, le prénom, le sexe (facultatif), la   date de naissance (facultative), la ville et la commune (obligatoires), le quartier (facultatif).</w:t>
-      </w:r>
-    </w:p>
-    <w:p>
-      <w:pPr>
         <w:numPr>
           <w:ilvl w:val="0"/>
-          <w:numId w:val="12"/>
-        </w:numPr>
-        <w:spacing w:lineRule="auto"/>
-      </w:pPr>
-      <w:r>
-        <w:rPr/>
-        <w:t xml:space="preserve">Les coordonnées du parent (nom, téléphone, email) affichées côté établissement pour cet enfant sont </w:t>
-      </w:r>
+          <w:numId w:val="11"/>
+        </w:numPr>
+        <w:spacing w:lineRule="auto"/>
+      </w:pPr>
       <w:r>
         <w:rPr>
           <w:b/>
         </w:rPr>
-        <w:t xml:space="preserve">reprises automatiquement du compte connecté</w:t>
-      </w:r>
-      <w:r>
-        <w:rPr/>
-        <w:t xml:space="preserve"> — le parent n'a rien à ressaisir.</w:t>
+        <w:t xml:space="preserve">Consulter</w:t>
+      </w:r>
+      <w:r>
+        <w:rPr/>
+        <w:t xml:space="preserve"> la liste de ses enfants déjà rattachés : nom, matricule, statut d'accès (Autorisé, En attente de paiement, Période de grâce, Suspendu).</w:t>
       </w:r>
     </w:p>
     <w:p>
       <w:pPr>
         <w:numPr>
           <w:ilvl w:val="0"/>
-          <w:numId w:val="12"/>
-        </w:numPr>
-        <w:spacing w:lineRule="auto"/>
-      </w:pPr>
-      <w:r>
-        <w:rPr/>
-        <w:t xml:space="preserve">Un enfant ajouté de cette façon démarre avec le statut </w:t>
-      </w:r>
+          <w:numId w:val="11"/>
+        </w:numPr>
+        <w:spacing w:lineRule="auto"/>
+      </w:pPr>
       <w:r>
         <w:rPr>
           <w:b/>
         </w:rPr>
-        <w:t xml:space="preserve">En attente de paiement</w:t>
-      </w:r>
-      <w:r>
-        <w:rPr/>
-        <w:t xml:space="preserve"> — aucun accès à la cantine tant qu'un paiement n'a pas été enregistré (voir §9 pour effectuer ce paiement).</w:t>
-      </w:r>
-    </w:p>
-    <w:p>
-      <w:pPr>
-        <w:pStyle w:val="Heading2"/>
-        <w:spacing w:lineRule="auto"/>
-      </w:pPr>
-      <w:r>
-        <w:rPr/>
-        <w:t xml:space="preserve">9. Paiements Mobile Money</w:t>
+        <w:t xml:space="preserve">Ajouter un enfant</w:t>
+      </w:r>
+      <w:r>
+        <w:rPr/>
+        <w:t xml:space="preserve"> lui-même, via le bouton « Ajouter un enfant » qui ouvre un petit formulaire :</w:t>
       </w:r>
     </w:p>
     <w:p>
@@ -4038,12 +3973,12 @@
           <wp:inline distB="0" distL="0" distR="0" distT="0">
             <wp:extent cx="5715000" cy="3571875"/>
             <wp:effectExtent b="0" l="0" r="0" t="0"/>
-            <wp:docPr id="21" name="image-k3t647oToFeJVL-_6MEs9.png"/>
+            <wp:docPr id="21" name="image-ptWIHfDED0avwiik4rrek.png"/>
             <a:graphic>
               <a:graphicData uri="http://schemas.openxmlformats.org/drawingml/2006/picture">
                 <pic:pic>
                   <pic:nvPicPr>
-                    <pic:cNvPr id="21" name="image-k3t647oToFeJVL-_6MEs9.png" descr="Écran des paiements"/>
+                    <pic:cNvPr id="21" name="image-ptWIHfDED0avwiik4rrek.png" descr="Mes enfants — formulaire d'ajout"/>
                     <pic:cNvPicPr/>
                   </pic:nvPicPr>
                   <pic:blipFill>
@@ -4069,154 +4004,57 @@
     </w:p>
     <w:p>
       <w:pPr>
+        <w:spacing w:lineRule="auto"/>
+      </w:pPr>
+      <w:r>
+        <w:rPr/>
+        <w:t xml:space="preserve">  Le parent choisit l'établissement dans une liste déroulante, puis la classe correspondante   s'affiche automatiquement une fois l'établissement choisi (les choix proposés dépendent de ce   que l'administrateur a déjà configuré pour cet établissement), et renseigne le matricule   (communiqué par l'établissement à l'inscription), le nom, le prénom, le sexe (facultatif), la   date de naissance (facultative), la ville et la commune (obligatoires), le quartier (facultatif).</w:t>
+      </w:r>
+    </w:p>
+    <w:p>
+      <w:pPr>
         <w:numPr>
           <w:ilvl w:val="0"/>
-          <w:numId w:val="13"/>
-        </w:numPr>
-        <w:spacing w:lineRule="auto"/>
-      </w:pPr>
+          <w:numId w:val="12"/>
+        </w:numPr>
+        <w:spacing w:lineRule="auto"/>
+      </w:pPr>
+      <w:r>
+        <w:rPr/>
+        <w:t xml:space="preserve">Les coordonnées du parent (nom, téléphone, email) affichées côté établissement pour cet enfant sont </w:t>
+      </w:r>
       <w:r>
         <w:rPr>
           <w:b/>
         </w:rPr>
-        <w:t xml:space="preserve">Administrateur / gestionnaire / caissier</w:t>
-      </w:r>
-      <w:r>
-        <w:rPr/>
-        <w:t xml:space="preserve"> : voient toutes les transactions et peuvent lancer un paiement pour n'importe quel élève (recherche par nom, prénom ou matricule). Seul l'administrateur peut modifier ou supprimer une transaction.</w:t>
+        <w:t xml:space="preserve">reprises automatiquement du compte connecté</w:t>
+      </w:r>
+      <w:r>
+        <w:rPr/>
+        <w:t xml:space="preserve"> — le parent n'a rien à ressaisir.</w:t>
       </w:r>
     </w:p>
     <w:p>
       <w:pPr>
         <w:numPr>
           <w:ilvl w:val="0"/>
-          <w:numId w:val="13"/>
-        </w:numPr>
-        <w:spacing w:lineRule="auto"/>
-      </w:pPr>
+          <w:numId w:val="12"/>
+        </w:numPr>
+        <w:spacing w:lineRule="auto"/>
+      </w:pPr>
+      <w:r>
+        <w:rPr/>
+        <w:t xml:space="preserve">Un enfant ajouté de cette façon démarre avec le statut </w:t>
+      </w:r>
       <w:r>
         <w:rPr>
           <w:b/>
         </w:rPr>
-        <w:t xml:space="preserve">Parent</w:t>
-      </w:r>
-      <w:r>
-        <w:rPr/>
-        <w:t xml:space="preserve"> : ne voit que les paiements de ses propres enfants ; en lançant un paiement, seuls ses enfants lui sont proposés (pas de recherche libre parmi tous les élèves).</w:t>
-      </w:r>
-    </w:p>
-    <w:p>
-      <w:pPr>
-        <w:numPr>
-          <w:ilvl w:val="0"/>
-          <w:numId w:val="13"/>
-        </w:numPr>
-        <w:spacing w:lineRule="auto"/>
-      </w:pPr>
-      <w:r>
-        <w:rPr>
-          <w:b/>
-        </w:rPr>
-        <w:t xml:space="preserve">Périodes de paiement</w:t>
-      </w:r>
-      <w:r>
-        <w:rPr/>
-        <w:t xml:space="preserve"> : pour un abonnement, seuls les règlements </w:t>
-      </w:r>
-      <w:r>
-        <w:rPr>
-          <w:b/>
-        </w:rPr>
-        <w:t xml:space="preserve">par trimestre ou par année</w:t>
-      </w:r>
-      <w:r>
-        <w:rPr/>
-        <w:t xml:space="preserve"> sont proposés — pas de paiement mensuel.</w:t>
-      </w:r>
-    </w:p>
-    <w:p>
-      <w:pPr>
-        <w:numPr>
-          <w:ilvl w:val="0"/>
-          <w:numId w:val="13"/>
-        </w:numPr>
-        <w:spacing w:lineRule="auto"/>
-      </w:pPr>
-      <w:r>
-        <w:rPr/>
-        <w:t xml:space="preserve">Opérateurs Mobile Money pris en charge : Orange Money, MTN Money, Moov Money, Wave.</w:t>
-      </w:r>
-    </w:p>
-    <w:p>
-      <w:pPr>
-        <w:numPr>
-          <w:ilvl w:val="0"/>
-          <w:numId w:val="13"/>
-        </w:numPr>
-        <w:spacing w:lineRule="auto"/>
-      </w:pPr>
-      <w:r>
-        <w:rPr>
-          <w:b/>
-        </w:rPr>
-        <w:t xml:space="preserve">Recherche</w:t>
-      </w:r>
-      <w:r>
-        <w:rPr/>
-        <w:t xml:space="preserve"> par nom, prénom ou matricule de l'élève ; filtres par statut (En attente / Accepté / Refusé / Annulé), par période (date de début/fin) et par opérateur — tous les filtres peuvent se combiner.</w:t>
-      </w:r>
-    </w:p>
-    <w:p>
-      <w:pPr>
-        <w:numPr>
-          <w:ilvl w:val="0"/>
-          <w:numId w:val="13"/>
-        </w:numPr>
-        <w:spacing w:lineRule="auto"/>
-      </w:pPr>
-      <w:r>
-        <w:rPr>
-          <w:b/>
-        </w:rPr>
-        <w:t xml:space="preserve">Export</w:t>
-      </w:r>
-      <w:r>
-        <w:rPr/>
-        <w:t xml:space="preserve"> de la liste affichée au format tableau (CSV).</w:t>
-      </w:r>
-    </w:p>
-    <w:p>
-      <w:pPr>
-        <w:numPr>
-          <w:ilvl w:val="0"/>
-          <w:numId w:val="13"/>
-        </w:numPr>
-        <w:spacing w:lineRule="auto"/>
-      </w:pPr>
-      <w:r>
-        <w:rPr/>
-        <w:t xml:space="preserve">Un parent qui tenterait de payer pour un enfant qui n'est pas le sien se voit automatiquement refuser l'opération par le système.</w:t>
-      </w:r>
-    </w:p>
-    <w:p>
-      <w:pPr>
-        <w:ind w:left="284"/>
-        <w:jc w:val="both"/>
-        <w:spacing w:lineRule="auto"/>
-      </w:pPr>
-      <w:r>
-        <w:rPr/>
-        <w:t xml:space="preserve">ℹ️ Le paiement en ligne est réellement connecté à un service de paiement Mobile Money, mais </w:t>
-      </w:r>
-      <w:r>
-        <w:rPr>
-          <w:b/>
-        </w:rPr>
-        <w:t xml:space="preserve">aucun compte marchand réel n'est encore branché</w:t>
-      </w:r>
-      <w:r>
-        <w:rPr/>
-        <w:t xml:space="preserve"> — tant que ce n'est pas fait, une tentative de paiement affiche un message clair (« service de paiement indisponible ou mal configuré ») plutôt qu'un lien de paiement fonctionnel.</w:t>
+        <w:t xml:space="preserve">En attente de paiement</w:t>
+      </w:r>
+      <w:r>
+        <w:rPr/>
+        <w:t xml:space="preserve"> — aucun accès à la cantine tant qu'un paiement n'a pas été enregistré (voir §9 pour effectuer ce paiement).</w:t>
       </w:r>
     </w:p>
     <w:p>
@@ -4226,7 +4064,7 @@
       </w:pPr>
       <w:r>
         <w:rPr/>
-        <w:t xml:space="preserve">10. Contrôle d'accès à la cantine</w:t>
+        <w:t xml:space="preserve">9. Paiements Mobile Money</w:t>
       </w:r>
     </w:p>
     <w:p>
@@ -4239,12 +4077,12 @@
           <wp:inline distB="0" distL="0" distR="0" distT="0">
             <wp:extent cx="5715000" cy="3571875"/>
             <wp:effectExtent b="0" l="0" r="0" t="0"/>
-            <wp:docPr id="22" name="image-tZ5jCU9pxoSecjzu7P1qW.png"/>
+            <wp:docPr id="22" name="image-S0S80oKnnzOWPNUSAg763.png"/>
             <a:graphic>
               <a:graphicData uri="http://schemas.openxmlformats.org/drawingml/2006/picture">
                 <pic:pic>
                   <pic:nvPicPr>
-                    <pic:cNvPr id="22" name="image-tZ5jCU9pxoSecjzu7P1qW.png" descr="Écran de contrôle d'accès"/>
+                    <pic:cNvPr id="22" name="image-S0S80oKnnzOWPNUSAg763.png" descr="Écran des paiements"/>
                     <pic:cNvPicPr/>
                   </pic:nvPicPr>
                   <pic:blipFill>
@@ -4272,75 +4110,152 @@
       <w:pPr>
         <w:numPr>
           <w:ilvl w:val="0"/>
-          <w:numId w:val="14"/>
-        </w:numPr>
-        <w:spacing w:lineRule="auto"/>
-      </w:pPr>
-      <w:r>
-        <w:rPr/>
-        <w:t xml:space="preserve">La lecture du QR Code d'un élève à l'entrée de la cantine confirme l'accès en moins d'une seconde : ✓ accès accordé ou ✗ accès refusé (avec le motif affiché).</w:t>
-      </w:r>
-    </w:p>
-    <w:p>
-      <w:pPr>
-        <w:numPr>
-          <w:ilvl w:val="0"/>
-          <w:numId w:val="14"/>
-        </w:numPr>
-        <w:spacing w:lineRule="auto"/>
-      </w:pPr>
-      <w:r>
-        <w:rPr/>
-        <w:t xml:space="preserve">Fonctionne même </w:t>
-      </w:r>
+          <w:numId w:val="13"/>
+        </w:numPr>
+        <w:spacing w:lineRule="auto"/>
+      </w:pPr>
       <w:r>
         <w:rPr>
           <w:b/>
         </w:rPr>
-        <w:t xml:space="preserve">sans connexion internet</w:t>
-      </w:r>
-      <w:r>
-        <w:rPr/>
-        <w:t xml:space="preserve"> : l'appareil garde en mémoire, pendant 24 heures, la liste des élèves et leur statut d'accès, et se remet à jour automatiquement dès que la connexion revient.</w:t>
+        <w:t xml:space="preserve">Administrateur / gestionnaire / caissier</w:t>
+      </w:r>
+      <w:r>
+        <w:rPr/>
+        <w:t xml:space="preserve"> : voient toutes les transactions et peuvent lancer un paiement pour n'importe quel élève (recherche par nom, prénom ou matricule). Seul l'administrateur peut modifier ou supprimer une transaction.</w:t>
       </w:r>
     </w:p>
     <w:p>
       <w:pPr>
         <w:numPr>
           <w:ilvl w:val="0"/>
-          <w:numId w:val="14"/>
-        </w:numPr>
-        <w:spacing w:lineRule="auto"/>
-      </w:pPr>
-      <w:r>
-        <w:rPr/>
-        <w:t xml:space="preserve">Une barre d'état indique si l'appareil est « En ligne » ou « Hors ligne », l'état de ces informations enregistrées à l'avance (absentes, ou datées avec le nombre d'élèves couverts), et propose un bouton pour forcer la mise à jour manuellement.</w:t>
+          <w:numId w:val="13"/>
+        </w:numPr>
+        <w:spacing w:lineRule="auto"/>
+      </w:pPr>
+      <w:r>
+        <w:rPr>
+          <w:b/>
+        </w:rPr>
+        <w:t xml:space="preserve">Parent</w:t>
+      </w:r>
+      <w:r>
+        <w:rPr/>
+        <w:t xml:space="preserve"> : ne voit que les paiements de ses propres enfants ; en lançant un paiement, seuls ses enfants lui sont proposés (pas de recherche libre parmi tous les élèves).</w:t>
       </w:r>
     </w:p>
     <w:p>
       <w:pPr>
         <w:numPr>
           <w:ilvl w:val="0"/>
-          <w:numId w:val="14"/>
-        </w:numPr>
-        <w:spacing w:lineRule="auto"/>
-      </w:pPr>
-      <w:r>
-        <w:rPr/>
-        <w:t xml:space="preserve">Par défaut, ces informations se mettent à jour automatiquement en arrière-plan dès l'ouverture de l'écran, si une connexion est disponible — ce comportement peut être désactivé dans les Paramètres (§16) pour ne garder que la mise à jour manuelle.</w:t>
+          <w:numId w:val="13"/>
+        </w:numPr>
+        <w:spacing w:lineRule="auto"/>
+      </w:pPr>
+      <w:r>
+        <w:rPr>
+          <w:b/>
+        </w:rPr>
+        <w:t xml:space="preserve">Périodes de paiement</w:t>
+      </w:r>
+      <w:r>
+        <w:rPr/>
+        <w:t xml:space="preserve"> : pour un abonnement, seuls les règlements </w:t>
+      </w:r>
+      <w:r>
+        <w:rPr>
+          <w:b/>
+        </w:rPr>
+        <w:t xml:space="preserve">par trimestre ou par année</w:t>
+      </w:r>
+      <w:r>
+        <w:rPr/>
+        <w:t xml:space="preserve"> sont proposés — pas de paiement mensuel.</w:t>
       </w:r>
     </w:p>
     <w:p>
       <w:pPr>
         <w:numPr>
           <w:ilvl w:val="0"/>
-          <w:numId w:val="14"/>
-        </w:numPr>
-        <w:spacing w:lineRule="auto"/>
-      </w:pPr>
-      <w:r>
-        <w:rPr/>
-        <w:t xml:space="preserve">Non accessible à un parent.</w:t>
+          <w:numId w:val="13"/>
+        </w:numPr>
+        <w:spacing w:lineRule="auto"/>
+      </w:pPr>
+      <w:r>
+        <w:rPr/>
+        <w:t xml:space="preserve">Opérateurs Mobile Money pris en charge : Orange Money, MTN Money, Moov Money, Wave.</w:t>
+      </w:r>
+    </w:p>
+    <w:p>
+      <w:pPr>
+        <w:numPr>
+          <w:ilvl w:val="0"/>
+          <w:numId w:val="13"/>
+        </w:numPr>
+        <w:spacing w:lineRule="auto"/>
+      </w:pPr>
+      <w:r>
+        <w:rPr>
+          <w:b/>
+        </w:rPr>
+        <w:t xml:space="preserve">Recherche</w:t>
+      </w:r>
+      <w:r>
+        <w:rPr/>
+        <w:t xml:space="preserve"> par nom, prénom ou matricule de l'élève ; filtres par statut (En attente / Accepté / Refusé / Annulé), par période (date de début/fin) et par opérateur — tous les filtres peuvent se combiner.</w:t>
+      </w:r>
+    </w:p>
+    <w:p>
+      <w:pPr>
+        <w:numPr>
+          <w:ilvl w:val="0"/>
+          <w:numId w:val="13"/>
+        </w:numPr>
+        <w:spacing w:lineRule="auto"/>
+      </w:pPr>
+      <w:r>
+        <w:rPr>
+          <w:b/>
+        </w:rPr>
+        <w:t xml:space="preserve">Export</w:t>
+      </w:r>
+      <w:r>
+        <w:rPr/>
+        <w:t xml:space="preserve"> de la liste affichée au format tableau (CSV).</w:t>
+      </w:r>
+    </w:p>
+    <w:p>
+      <w:pPr>
+        <w:numPr>
+          <w:ilvl w:val="0"/>
+          <w:numId w:val="13"/>
+        </w:numPr>
+        <w:spacing w:lineRule="auto"/>
+      </w:pPr>
+      <w:r>
+        <w:rPr/>
+        <w:t xml:space="preserve">Un parent qui tenterait de payer pour un enfant qui n'est pas le sien se voit automatiquement refuser l'opération par le système.</w:t>
+      </w:r>
+    </w:p>
+    <w:p>
+      <w:pPr>
+        <w:ind w:left="284"/>
+        <w:jc w:val="both"/>
+        <w:spacing w:lineRule="auto"/>
+      </w:pPr>
+      <w:r>
+        <w:rPr/>
+        <w:t xml:space="preserve">ℹ️ Le paiement en ligne est réellement connecté à un service de paiement Mobile Money, mais </w:t>
+      </w:r>
+      <w:r>
+        <w:rPr>
+          <w:b/>
+        </w:rPr>
+        <w:t xml:space="preserve">aucun compte marchand réel n'est encore branché</w:t>
+      </w:r>
+      <w:r>
+        <w:rPr/>
+        <w:t xml:space="preserve"> — tant que ce n'est pas fait, une tentative de paiement affiche un message clair (« service de paiement indisponible ou mal configuré ») plutôt qu'un lien de paiement fonctionnel.</w:t>
       </w:r>
     </w:p>
     <w:p>
@@ -4350,7 +4265,7 @@
       </w:pPr>
       <w:r>
         <w:rPr/>
-        <w:t xml:space="preserve">11. Historique des passages</w:t>
+        <w:t xml:space="preserve">10. Contrôle d'accès à la cantine</w:t>
       </w:r>
     </w:p>
     <w:p>
@@ -4363,12 +4278,12 @@
           <wp:inline distB="0" distL="0" distR="0" distT="0">
             <wp:extent cx="5715000" cy="3571875"/>
             <wp:effectExtent b="0" l="0" r="0" t="0"/>
-            <wp:docPr id="23" name="image-1AI_mRgrm4OB-YxIiHKIA.png"/>
+            <wp:docPr id="23" name="image-rcTwEvEw0oe6JvZG23muF.png"/>
             <a:graphic>
               <a:graphicData uri="http://schemas.openxmlformats.org/drawingml/2006/picture">
                 <pic:pic>
                   <pic:nvPicPr>
-                    <pic:cNvPr id="23" name="image-1AI_mRgrm4OB-YxIiHKIA.png" descr="Historique des passages"/>
+                    <pic:cNvPr id="23" name="image-rcTwEvEw0oe6JvZG23muF.png" descr="Écran de contrôle d'accès"/>
                     <pic:cNvPicPr/>
                   </pic:nvPicPr>
                   <pic:blipFill>
@@ -4396,38 +4311,75 @@
       <w:pPr>
         <w:numPr>
           <w:ilvl w:val="0"/>
-          <w:numId w:val="15"/>
-        </w:numPr>
-        <w:spacing w:lineRule="auto"/>
-      </w:pPr>
+          <w:numId w:val="14"/>
+        </w:numPr>
+        <w:spacing w:lineRule="auto"/>
+      </w:pPr>
+      <w:r>
+        <w:rPr/>
+        <w:t xml:space="preserve">La lecture du QR Code d'un élève à l'entrée de la cantine confirme l'accès en moins d'une seconde : ✓ accès accordé ou ✗ accès refusé (avec le motif affiché).</w:t>
+      </w:r>
+    </w:p>
+    <w:p>
+      <w:pPr>
+        <w:numPr>
+          <w:ilvl w:val="0"/>
+          <w:numId w:val="14"/>
+        </w:numPr>
+        <w:spacing w:lineRule="auto"/>
+      </w:pPr>
+      <w:r>
+        <w:rPr/>
+        <w:t xml:space="preserve">Fonctionne même </w:t>
+      </w:r>
       <w:r>
         <w:rPr>
           <w:b/>
         </w:rPr>
-        <w:t xml:space="preserve">Administrateur / gestionnaire / caissier</w:t>
-      </w:r>
-      <w:r>
-        <w:rPr/>
-        <w:t xml:space="preserve"> : historique complet, filtrable par date, établissement et résultat, avec recherche d'élève ; export au format tableau (CSV) ; la modification ou la suppression d'un passage sont réservées à l'administrateur.</w:t>
+        <w:t xml:space="preserve">sans connexion internet</w:t>
+      </w:r>
+      <w:r>
+        <w:rPr/>
+        <w:t xml:space="preserve"> : l'appareil garde en mémoire, pendant 24 heures, la liste des élèves et leur statut d'accès, et se remet à jour automatiquement dès que la connexion revient.</w:t>
       </w:r>
     </w:p>
     <w:p>
       <w:pPr>
         <w:numPr>
           <w:ilvl w:val="0"/>
-          <w:numId w:val="15"/>
-        </w:numPr>
-        <w:spacing w:lineRule="auto"/>
-      </w:pPr>
-      <w:r>
-        <w:rPr>
-          <w:b/>
-        </w:rPr>
-        <w:t xml:space="preserve">Parent</w:t>
-      </w:r>
-      <w:r>
-        <w:rPr/>
-        <w:t xml:space="preserve"> : ne voit que les passages de ses propres enfants ; le filtre par établissement et la colonne « Établissement » du tableau sont masqués (non utiles pour un parent).</w:t>
+          <w:numId w:val="14"/>
+        </w:numPr>
+        <w:spacing w:lineRule="auto"/>
+      </w:pPr>
+      <w:r>
+        <w:rPr/>
+        <w:t xml:space="preserve">Une barre d'état indique si l'appareil est « En ligne » ou « Hors ligne », l'état de ces informations enregistrées à l'avance (absentes, ou datées avec le nombre d'élèves couverts), et propose un bouton pour forcer la mise à jour manuellement.</w:t>
+      </w:r>
+    </w:p>
+    <w:p>
+      <w:pPr>
+        <w:numPr>
+          <w:ilvl w:val="0"/>
+          <w:numId w:val="14"/>
+        </w:numPr>
+        <w:spacing w:lineRule="auto"/>
+      </w:pPr>
+      <w:r>
+        <w:rPr/>
+        <w:t xml:space="preserve">Par défaut, ces informations se mettent à jour automatiquement en arrière-plan dès l'ouverture de l'écran, si une connexion est disponible — ce comportement peut être désactivé dans les Paramètres (§16) pour ne garder que la mise à jour manuelle.</w:t>
+      </w:r>
+    </w:p>
+    <w:p>
+      <w:pPr>
+        <w:numPr>
+          <w:ilvl w:val="0"/>
+          <w:numId w:val="14"/>
+        </w:numPr>
+        <w:spacing w:lineRule="auto"/>
+      </w:pPr>
+      <w:r>
+        <w:rPr/>
+        <w:t xml:space="preserve">Non accessible à un parent.</w:t>
       </w:r>
     </w:p>
     <w:p>
@@ -4437,172 +4389,7 @@
       </w:pPr>
       <w:r>
         <w:rPr/>
-        <w:t xml:space="preserve">12. Rapports (administrateur / gestionnaire / caissier) — première version</w:t>
-      </w:r>
-    </w:p>
-    <w:p>
-      <w:pPr>
-        <w:ind w:left="284"/>
-        <w:jc w:val="both"/>
-        <w:spacing w:lineRule="auto"/>
-      </w:pPr>
-      <w:r>
-        <w:rPr/>
-        <w:t xml:space="preserve">Première version de ce module, mise à disposition pour recueillir des retours avant amélioration. Non accessible à un parent.</w:t>
-      </w:r>
-    </w:p>
-    <w:p>
-      <w:pPr>
-        <w:numPr>
-          <w:ilvl w:val="0"/>
-          <w:numId w:val="16"/>
-        </w:numPr>
-        <w:spacing w:lineRule="auto"/>
-      </w:pPr>
-      <w:r>
-        <w:rPr/>
-        <w:t xml:space="preserve">On choisit une période (date de début/fin) et, si besoin, un établissement (ce filtre ne s'applique qu'aux passages à la cantine), puis on clique sur </w:t>
-      </w:r>
-      <w:r>
-        <w:rPr>
-          <w:b/>
-        </w:rPr>
-        <w:t xml:space="preserve">« Générer le rapport »</w:t>
-      </w:r>
-      <w:r>
-        <w:rPr/>
-        <w:t xml:space="preserve">.</w:t>
-      </w:r>
-    </w:p>
-    <w:p>
-      <w:pPr>
-        <w:numPr>
-          <w:ilvl w:val="0"/>
-          <w:numId w:val="16"/>
-        </w:numPr>
-        <w:spacing w:lineRule="auto"/>
-      </w:pPr>
-      <w:r>
-        <w:rPr/>
-        <w:t xml:space="preserve">Trois onglets s'affichent une fois le rapport généré :</w:t>
-      </w:r>
-    </w:p>
-    <w:p>
-      <w:pPr>
-        <w:numPr>
-          <w:ilvl w:val="1"/>
-          <w:numId w:val="17"/>
-        </w:numPr>
-        <w:spacing w:lineRule="auto"/>
-      </w:pPr>
-      <w:r>
-        <w:rPr>
-          <w:b/>
-        </w:rPr>
-        <w:t xml:space="preserve">Résumé</w:t>
-      </w:r>
-      <w:r>
-        <w:rPr/>
-        <w:t xml:space="preserve"> : montant total encaissé, répartition des paiements par statut, répartition des passages par résultat, taux d'accès.</w:t>
-      </w:r>
-    </w:p>
-    <w:p>
-      <w:pPr>
-        <w:numPr>
-          <w:ilvl w:val="1"/>
-          <w:numId w:val="17"/>
-        </w:numPr>
-        <w:spacing w:lineRule="auto"/>
-      </w:pPr>
-      <w:r>
-        <w:rPr>
-          <w:b/>
-        </w:rPr>
-        <w:t xml:space="preserve">Paiements</w:t>
-      </w:r>
-      <w:r>
-        <w:rPr/>
-        <w:t xml:space="preserve"> : liste détaillée des transactions de la période.</w:t>
-      </w:r>
-    </w:p>
-    <w:p>
-      <w:pPr>
-        <w:numPr>
-          <w:ilvl w:val="1"/>
-          <w:numId w:val="17"/>
-        </w:numPr>
-        <w:spacing w:lineRule="auto"/>
-      </w:pPr>
-      <w:r>
-        <w:rPr>
-          <w:b/>
-        </w:rPr>
-        <w:t xml:space="preserve">Passages</w:t>
-      </w:r>
-      <w:r>
-        <w:rPr/>
-        <w:t xml:space="preserve"> : liste détaillée des passages à la cantine sur la période.</w:t>
-      </w:r>
-    </w:p>
-    <w:p>
-      <w:pPr>
-        <w:numPr>
-          <w:ilvl w:val="0"/>
-          <w:numId w:val="16"/>
-        </w:numPr>
-        <w:spacing w:lineRule="auto"/>
-      </w:pPr>
-      <w:r>
-        <w:rPr>
-          <w:b/>
-        </w:rPr>
-        <w:t xml:space="preserve">Exporter en Excel</w:t>
-      </w:r>
-      <w:r>
-        <w:rPr/>
-        <w:t xml:space="preserve"> : télécharge un fichier avec 3 feuilles (Résumé / Paiements / Passages) couvrant toute la période choisie.</w:t>
-      </w:r>
-    </w:p>
-    <w:p>
-      <w:pPr>
-        <w:numPr>
-          <w:ilvl w:val="0"/>
-          <w:numId w:val="16"/>
-        </w:numPr>
-        <w:spacing w:lineRule="auto"/>
-      </w:pPr>
-      <w:r>
-        <w:rPr>
-          <w:b/>
-        </w:rPr>
-        <w:t xml:space="preserve">Imprimer / PDF</w:t>
-      </w:r>
-      <w:r>
-        <w:rPr/>
-        <w:t xml:space="preserve"> (par onglet) : ouvre la fenêtre d'impression du navigateur, limitée au contenu de l'onglet affiché — choisir « Enregistrer au format PDF » pour obtenir un fichier PDF.</w:t>
-      </w:r>
-    </w:p>
-    <w:p>
-      <w:pPr>
-        <w:numPr>
-          <w:ilvl w:val="0"/>
-          <w:numId w:val="16"/>
-        </w:numPr>
-        <w:spacing w:lineRule="auto"/>
-      </w:pPr>
-      <w:r>
-        <w:rPr/>
-        <w:t xml:space="preserve">Sur une période avec beaucoup de données, un message avertit si le rapport a dû être limité (au delà de 10 000 lignes) : il suffit alors de réduire la période choisie.</w:t>
-      </w:r>
-    </w:p>
-    <w:p>
-      <w:pPr>
-        <w:pStyle w:val="Heading2"/>
-        <w:spacing w:lineRule="auto"/>
-      </w:pPr>
-      <w:r>
-        <w:rPr/>
-        <w:t xml:space="preserve">13. Comptes utilisateurs (administrateur uniquement)</w:t>
+        <w:t xml:space="preserve">11. Historique des passages</w:t>
       </w:r>
     </w:p>
     <w:p>
@@ -4615,12 +4402,12 @@
           <wp:inline distB="0" distL="0" distR="0" distT="0">
             <wp:extent cx="5715000" cy="3571875"/>
             <wp:effectExtent b="0" l="0" r="0" t="0"/>
-            <wp:docPr id="24" name="image-OAwzvhAIOU6XTFjABe04m.png"/>
+            <wp:docPr id="24" name="image-Ala7V7Wnb8F9KtgZwUs-M.png"/>
             <a:graphic>
               <a:graphicData uri="http://schemas.openxmlformats.org/drawingml/2006/picture">
                 <pic:pic>
                   <pic:nvPicPr>
-                    <pic:cNvPr id="24" name="image-OAwzvhAIOU6XTFjABe04m.png" descr="Liste des comptes utilisateurs"/>
+                    <pic:cNvPr id="24" name="image-Ala7V7Wnb8F9KtgZwUs-M.png" descr="Historique des passages"/>
                     <pic:cNvPicPr/>
                   </pic:nvPicPr>
                   <pic:blipFill>
@@ -4648,69 +4435,26 @@
       <w:pPr>
         <w:numPr>
           <w:ilvl w:val="0"/>
-          <w:numId w:val="18"/>
-        </w:numPr>
-        <w:spacing w:lineRule="auto"/>
-      </w:pPr>
-      <w:r>
-        <w:rPr/>
-        <w:t xml:space="preserve">Création d'un compte : nom, prénom, email, </w:t>
-      </w:r>
+          <w:numId w:val="15"/>
+        </w:numPr>
+        <w:spacing w:lineRule="auto"/>
+      </w:pPr>
       <w:r>
         <w:rPr>
           <w:b/>
         </w:rPr>
-        <w:t xml:space="preserve">numéro de téléphone (obligatoire, unique)</w:t>
-      </w:r>
-      <w:r>
-        <w:rPr/>
-        <w:t xml:space="preserve">, mot de passe, rôle (Administrateur, Gestionnaire, Caissier ou Parent).</w:t>
+        <w:t xml:space="preserve">Administrateur / gestionnaire / caissier</w:t>
+      </w:r>
+      <w:r>
+        <w:rPr/>
+        <w:t xml:space="preserve"> : historique complet, filtrable par date, établissement et résultat, avec recherche d'élève ; export au format tableau (CSV) ; la modification ou la suppression d'un passage sont réservées à l'administrateur.</w:t>
       </w:r>
     </w:p>
     <w:p>
       <w:pPr>
         <w:numPr>
           <w:ilvl w:val="0"/>
-          <w:numId w:val="18"/>
-        </w:numPr>
-        <w:spacing w:lineRule="auto"/>
-      </w:pPr>
-      <w:r>
-        <w:rPr/>
-        <w:t xml:space="preserve">Modification, changement de rôle directement dans le tableau, désactivation/réactivation, suppression définitive.</w:t>
-      </w:r>
-    </w:p>
-    <w:p>
-      <w:pPr>
-        <w:numPr>
-          <w:ilvl w:val="0"/>
-          <w:numId w:val="18"/>
-        </w:numPr>
-        <w:spacing w:lineRule="auto"/>
-      </w:pPr>
-      <w:r>
-        <w:rPr/>
-        <w:t xml:space="preserve">Impossible de désactiver ou de supprimer le tout dernier compte administrateur du système.</w:t>
-      </w:r>
-    </w:p>
-    <w:p>
-      <w:pPr>
-        <w:numPr>
-          <w:ilvl w:val="0"/>
-          <w:numId w:val="18"/>
-        </w:numPr>
-        <w:spacing w:lineRule="auto"/>
-      </w:pPr>
-      <w:r>
-        <w:rPr/>
-        <w:t xml:space="preserve">Impossible de désactiver ou de supprimer son propre compte.</w:t>
-      </w:r>
-    </w:p>
-    <w:p>
-      <w:pPr>
-        <w:numPr>
-          <w:ilvl w:val="0"/>
-          <w:numId w:val="18"/>
+          <w:numId w:val="15"/>
         </w:numPr>
         <w:spacing w:lineRule="auto"/>
       </w:pPr>
@@ -4718,11 +4462,11 @@
         <w:rPr>
           <w:b/>
         </w:rPr>
-        <w:t xml:space="preserve">Recherche</w:t>
-      </w:r>
-      <w:r>
-        <w:rPr/>
-        <w:t xml:space="preserve"> par email, nom, prénom ou téléphone ; filtres par rôle, par statut (actif ou inactif) et par période de création — tous combinables.</w:t>
+        <w:t xml:space="preserve">Parent</w:t>
+      </w:r>
+      <w:r>
+        <w:rPr/>
+        <w:t xml:space="preserve"> : ne voit que les passages de ses propres enfants ; le filtre par établissement et la colonne « Établissement » du tableau sont masqués (non utiles pour un parent).</w:t>
       </w:r>
     </w:p>
     <w:p>
@@ -4732,46 +4476,61 @@
       </w:pPr>
       <w:r>
         <w:rPr/>
-        <w:t xml:space="preserve">14. Parents (rattacher des enfants — administrateur uniquement)</w:t>
+        <w:t xml:space="preserve">12. Rapports (administrateur / gestionnaire / caissier) — première version</w:t>
+      </w:r>
+    </w:p>
+    <w:p>
+      <w:pPr>
+        <w:ind w:left="284"/>
+        <w:jc w:val="both"/>
+        <w:spacing w:lineRule="auto"/>
+      </w:pPr>
+      <w:r>
+        <w:rPr/>
+        <w:t xml:space="preserve">Première version de ce module, mise à disposition pour recueillir des retours avant amélioration. Non accessible à un parent.</w:t>
       </w:r>
     </w:p>
     <w:p>
       <w:pPr>
         <w:numPr>
           <w:ilvl w:val="0"/>
-          <w:numId w:val="19"/>
-        </w:numPr>
-        <w:spacing w:lineRule="auto"/>
-      </w:pPr>
-      <w:r>
-        <w:rPr/>
-        <w:t xml:space="preserve">Permet de rattacher un compte parent à un ou plusieurs élèves.</w:t>
-      </w:r>
-    </w:p>
-    <w:p>
-      <w:pPr>
-        <w:numPr>
-          <w:ilvl w:val="0"/>
-          <w:numId w:val="19"/>
-        </w:numPr>
-        <w:spacing w:lineRule="auto"/>
-      </w:pPr>
+          <w:numId w:val="16"/>
+        </w:numPr>
+        <w:spacing w:lineRule="auto"/>
+      </w:pPr>
+      <w:r>
+        <w:rPr/>
+        <w:t xml:space="preserve">On choisit une période (date de début/fin) et, si besoin, un établissement (ce filtre ne s'applique qu'aux passages à la cantine), puis on clique sur </w:t>
+      </w:r>
       <w:r>
         <w:rPr>
           <w:b/>
         </w:rPr>
-        <w:t xml:space="preserve">Choix du compte parent</w:t>
-      </w:r>
-      <w:r>
-        <w:rPr/>
-        <w:t xml:space="preserve"> : recherche par numéro de téléphone, nom ou prénom (le compte doit déjà exister — le créer d'abord dans « Comptes utilisateurs », ou passer par une demande d'accès validée, §15).</w:t>
+        <w:t xml:space="preserve">« Générer le rapport »</w:t>
+      </w:r>
+      <w:r>
+        <w:rPr/>
+        <w:t xml:space="preserve">.</w:t>
       </w:r>
     </w:p>
     <w:p>
       <w:pPr>
         <w:numPr>
           <w:ilvl w:val="0"/>
-          <w:numId w:val="19"/>
+          <w:numId w:val="16"/>
+        </w:numPr>
+        <w:spacing w:lineRule="auto"/>
+      </w:pPr>
+      <w:r>
+        <w:rPr/>
+        <w:t xml:space="preserve">Trois onglets s'affichent une fois le rapport généré :</w:t>
+      </w:r>
+    </w:p>
+    <w:p>
+      <w:pPr>
+        <w:numPr>
+          <w:ilvl w:val="1"/>
+          <w:numId w:val="17"/>
         </w:numPr>
         <w:spacing w:lineRule="auto"/>
       </w:pPr>
@@ -4779,31 +4538,18 @@
         <w:rPr>
           <w:b/>
         </w:rPr>
-        <w:t xml:space="preserve">Choix des enfants</w:t>
-      </w:r>
-      <w:r>
-        <w:rPr/>
-        <w:t xml:space="preserve"> : recherche par matricule, nom ou prénom, plusieurs enfants peuvent être sélectionnés à la fois.</w:t>
-      </w:r>
-    </w:p>
-    <w:p>
-      <w:pPr>
-        <w:numPr>
-          <w:ilvl w:val="0"/>
-          <w:numId w:val="19"/>
-        </w:numPr>
-        <w:spacing w:lineRule="auto"/>
-      </w:pPr>
-      <w:r>
-        <w:rPr/>
-        <w:t xml:space="preserve">Modification des enfants rattachés, suppression du lien (les fiches des élèves ne sont pas supprimées pour autant).</w:t>
-      </w:r>
-    </w:p>
-    <w:p>
-      <w:pPr>
-        <w:numPr>
-          <w:ilvl w:val="0"/>
-          <w:numId w:val="19"/>
+        <w:t xml:space="preserve">Résumé</w:t>
+      </w:r>
+      <w:r>
+        <w:rPr/>
+        <w:t xml:space="preserve"> : montant total encaissé, répartition des paiements par statut, répartition des passages par résultat, taux d'accès.</w:t>
+      </w:r>
+    </w:p>
+    <w:p>
+      <w:pPr>
+        <w:numPr>
+          <w:ilvl w:val="1"/>
+          <w:numId w:val="17"/>
         </w:numPr>
         <w:spacing w:lineRule="auto"/>
       </w:pPr>
@@ -4811,57 +4557,56 @@
         <w:rPr>
           <w:b/>
         </w:rPr>
-        <w:t xml:space="preserve">Recherche</w:t>
-      </w:r>
-      <w:r>
-        <w:rPr/>
-        <w:t xml:space="preserve"> sur la liste principale par </w:t>
-      </w:r>
+        <w:t xml:space="preserve">Paiements</w:t>
+      </w:r>
+      <w:r>
+        <w:rPr/>
+        <w:t xml:space="preserve"> : liste détaillée des transactions de la période.</w:t>
+      </w:r>
+    </w:p>
+    <w:p>
+      <w:pPr>
+        <w:numPr>
+          <w:ilvl w:val="1"/>
+          <w:numId w:val="17"/>
+        </w:numPr>
+        <w:spacing w:lineRule="auto"/>
+      </w:pPr>
       <w:r>
         <w:rPr>
           <w:b/>
         </w:rPr>
-        <w:t xml:space="preserve">email ou numéro de téléphone</w:t>
-      </w:r>
-      <w:r>
-        <w:rPr/>
-        <w:t xml:space="preserve"> du compte parent.</w:t>
-      </w:r>
-    </w:p>
-    <w:p>
-      <w:pPr>
-        <w:pStyle w:val="Heading2"/>
-        <w:spacing w:lineRule="auto"/>
-      </w:pPr>
-      <w:r>
-        <w:rPr/>
-        <w:t xml:space="preserve">15. Demandes d'accès (validation par l'administrateur)</w:t>
-      </w:r>
-    </w:p>
-    <w:p>
-      <w:pPr>
-        <w:spacing w:lineRule="auto"/>
-      </w:pPr>
-      <w:r>
-        <w:rPr/>
-        <w:t xml:space="preserve">Sur l'écran « Demandes d'accès » (réservé à l'administrateur), on retrouve la liste des demandes soumises depuis la page publique (§3), que l'on peut filtrer par statut (En attente / Validées / Rejetées). Chaque ligne a un bouton « Voir détails » qui ouvre une fiche complète du demandeur (identité, tous les numéros de téléphone, email, résidence, historique du traitement) — pour une demande en attente, c'est depuis cette fiche que l'on </w:t>
-      </w:r>
+        <w:t xml:space="preserve">Passages</w:t>
+      </w:r>
+      <w:r>
+        <w:rPr/>
+        <w:t xml:space="preserve"> : liste détaillée des passages à la cantine sur la période.</w:t>
+      </w:r>
+    </w:p>
+    <w:p>
+      <w:pPr>
+        <w:numPr>
+          <w:ilvl w:val="0"/>
+          <w:numId w:val="16"/>
+        </w:numPr>
+        <w:spacing w:lineRule="auto"/>
+      </w:pPr>
       <w:r>
         <w:rPr>
           <w:b/>
         </w:rPr>
-        <w:t xml:space="preserve">valide ou rejette</w:t>
-      </w:r>
-      <w:r>
-        <w:rPr/>
-        <w:t xml:space="preserve">, afin de toujours vérifier les informations avant de créer un compte.</w:t>
+        <w:t xml:space="preserve">Exporter en Excel</w:t>
+      </w:r>
+      <w:r>
+        <w:rPr/>
+        <w:t xml:space="preserve"> : télécharge un fichier avec 3 feuilles (Résumé / Paiements / Passages) couvrant toute la période choisie.</w:t>
       </w:r>
     </w:p>
     <w:p>
       <w:pPr>
         <w:numPr>
           <w:ilvl w:val="0"/>
-          <w:numId w:val="20"/>
+          <w:numId w:val="16"/>
         </w:numPr>
         <w:spacing w:lineRule="auto"/>
       </w:pPr>
@@ -4869,92 +4614,24 @@
         <w:rPr>
           <w:b/>
         </w:rPr>
-        <w:t xml:space="preserve">Valider</w:t>
-      </w:r>
-      <w:r>
-        <w:rPr/>
-        <w:t xml:space="preserve"> : crée le compte du parent, avec un identifiant de connexion et un mot de passe provisoire générés automatiquement. Si les notifications par email et SMS sont activées (voir §16 Paramètres), le parent les reçoit automatiquement ; </w:t>
-      </w:r>
-      <w:r>
-        <w:rPr>
-          <w:b/>
-        </w:rPr>
-        <w:t xml:space="preserve">dans tous les cas</w:t>
-      </w:r>
-      <w:r>
-        <w:rPr/>
-        <w:t xml:space="preserve">, une fenêtre affiche l'identifiant et le mot de passe à l'écran, pour pouvoir les communiquer manuellement si besoin.</w:t>
-      </w:r>
-    </w:p>
-    <w:p>
-      <w:pPr>
-        <w:numPr>
-          <w:ilvl w:val="1"/>
-          <w:numId w:val="21"/>
-        </w:numPr>
-        <w:spacing w:lineRule="auto"/>
-      </w:pPr>
-      <w:r>
-        <w:rPr/>
-        <w:t xml:space="preserve">Si le parent n'a donné </w:t>
-      </w:r>
-      <w:r>
-        <w:rPr>
-          <w:b/>
-        </w:rPr>
-        <w:t xml:space="preserve">aucun email</w:t>
-      </w:r>
-      <w:r>
-        <w:rPr/>
-        <w:t xml:space="preserve">, un identifiant de connexion est créé automatiquement à partir de son numéro de téléphone — ce n'est pas une adresse email utilisable, seulement un identifiant de connexion.</w:t>
+        <w:t xml:space="preserve">Imprimer / PDF</w:t>
+      </w:r>
+      <w:r>
+        <w:rPr/>
+        <w:t xml:space="preserve"> (par onglet) : ouvre la fenêtre d'impression du navigateur, limitée au contenu de l'onglet affiché — choisir « Enregistrer au format PDF » pour obtenir un fichier PDF.</w:t>
       </w:r>
     </w:p>
     <w:p>
       <w:pPr>
         <w:numPr>
           <w:ilvl w:val="0"/>
-          <w:numId w:val="20"/>
-        </w:numPr>
-        <w:spacing w:lineRule="auto"/>
-      </w:pPr>
-      <w:r>
-        <w:rPr>
-          <w:b/>
-        </w:rPr>
-        <w:t xml:space="preserve">Rejeter</w:t>
-      </w:r>
-      <w:r>
-        <w:rPr/>
-        <w:t xml:space="preserve"> : un motif est obligatoire ; la demande reste visible avec son statut et le motif, pour garder une trace.</w:t>
-      </w:r>
-    </w:p>
-    <w:p>
-      <w:pPr>
-        <w:pStyle w:val="Heading3"/>
-        <w:spacing w:lineRule="auto"/>
-      </w:pPr>
-      <w:r>
-        <w:rPr/>
-        <w:t xml:space="preserve">Première connexion du parent</w:t>
-      </w:r>
-    </w:p>
-    <w:p>
-      <w:pPr>
-        <w:spacing w:lineRule="auto"/>
-      </w:pPr>
-      <w:r>
-        <w:rPr/>
-        <w:t xml:space="preserve">Un parent dont le compte vient d'être créé </w:t>
-      </w:r>
-      <w:r>
-        <w:rPr>
-          <w:b/>
-        </w:rPr>
-        <w:t xml:space="preserve">doit changer son mot de passe provisoire</w:t>
-      </w:r>
-      <w:r>
-        <w:rPr/>
-        <w:t xml:space="preserve"> dès sa première connexion — l'application l'amène automatiquement sur cet écran et ne laisse pas accéder au reste du site tant que ce n'est pas fait.</w:t>
+          <w:numId w:val="16"/>
+        </w:numPr>
+        <w:spacing w:lineRule="auto"/>
+      </w:pPr>
+      <w:r>
+        <w:rPr/>
+        <w:t xml:space="preserve">Sur une période avec beaucoup de données, un message avertit si le rapport a dû être limité (au delà de 10 000 lignes) : il suffit alors de réduire la période choisie.</w:t>
       </w:r>
     </w:p>
     <w:p>
@@ -4964,7 +4641,7 @@
       </w:pPr>
       <w:r>
         <w:rPr/>
-        <w:t xml:space="preserve">16. Paramètres (administrateur uniquement)</w:t>
+        <w:t xml:space="preserve">13. Comptes utilisateurs (administrateur uniquement)</w:t>
       </w:r>
     </w:p>
     <w:p>
@@ -4977,12 +4654,12 @@
           <wp:inline distB="0" distL="0" distR="0" distT="0">
             <wp:extent cx="5715000" cy="3571875"/>
             <wp:effectExtent b="0" l="0" r="0" t="0"/>
-            <wp:docPr id="25" name="image-DcgoTkULsVUHBgty2NU2z.png"/>
+            <wp:docPr id="25" name="image-B5VWXi4z7MZGAMyrNeDlk.png"/>
             <a:graphic>
               <a:graphicData uri="http://schemas.openxmlformats.org/drawingml/2006/picture">
                 <pic:pic>
                   <pic:nvPicPr>
-                    <pic:cNvPr id="25" name="image-DcgoTkULsVUHBgty2NU2z.png" descr="Écran des paramètres"/>
+                    <pic:cNvPr id="25" name="image-B5VWXi4z7MZGAMyrNeDlk.png" descr="Liste des comptes utilisateurs"/>
                     <pic:cNvPicPr/>
                   </pic:nvPicPr>
                   <pic:blipFill>
@@ -5008,135 +4685,113 @@
     </w:p>
     <w:p>
       <w:pPr>
-        <w:spacing w:lineRule="auto"/>
-      </w:pPr>
-      <w:r>
-        <w:rPr/>
-        <w:t xml:space="preserve">Les réglages sont regroupés par thème dans des blocs dépliables (Contrôle d'accès cantine, Notifications, Paiements, Apparence, Organisation) — cliquer sur l'intitulé d'un bloc l'ouvre ou le referme.</w:t>
-      </w:r>
-    </w:p>
-    <w:p>
-      <w:pPr>
         <w:numPr>
           <w:ilvl w:val="0"/>
-          <w:numId w:val="22"/>
-        </w:numPr>
-        <w:spacing w:lineRule="auto"/>
-      </w:pPr>
-      <w:r>
-        <w:rPr/>
-        <w:t xml:space="preserve">Activer ou désactiver les notifications par email et par SMS.</w:t>
-      </w:r>
-    </w:p>
-    <w:p>
-      <w:pPr>
-        <w:numPr>
-          <w:ilvl w:val="0"/>
-          <w:numId w:val="22"/>
-        </w:numPr>
-        <w:spacing w:lineRule="auto"/>
-      </w:pPr>
-      <w:r>
-        <w:rPr/>
-        <w:t xml:space="preserve">Activer ou désactiver la mise à jour automatique des informations hors-ligne du contrôle d'accès (§10) — activée par défaut.</w:t>
-      </w:r>
-    </w:p>
-    <w:p>
-      <w:pPr>
-        <w:numPr>
-          <w:ilvl w:val="0"/>
-          <w:numId w:val="22"/>
-        </w:numPr>
-        <w:spacing w:lineRule="auto"/>
-      </w:pPr>
-      <w:r>
-        <w:rPr/>
-        <w:t xml:space="preserve">Mode de paiement : par </w:t>
+          <w:numId w:val="18"/>
+        </w:numPr>
+        <w:spacing w:lineRule="auto"/>
+      </w:pPr>
+      <w:r>
+        <w:rPr/>
+        <w:t xml:space="preserve">Création d'un compte : nom, prénom, email, </w:t>
       </w:r>
       <w:r>
         <w:rPr>
           <w:b/>
         </w:rPr>
-        <w:t xml:space="preserve">abonnement</w:t>
-      </w:r>
-      <w:r>
-        <w:rPr/>
-        <w:t xml:space="preserve"> (accès pour tout le trimestre ou l'année) ou par </w:t>
-      </w:r>
+        <w:t xml:space="preserve">numéro de téléphone (obligatoire, unique)</w:t>
+      </w:r>
+      <w:r>
+        <w:rPr/>
+        <w:t xml:space="preserve">, mot de passe, rôle (Administrateur, Gestionnaire, Caissier ou Parent).</w:t>
+      </w:r>
+    </w:p>
+    <w:p>
+      <w:pPr>
+        <w:numPr>
+          <w:ilvl w:val="0"/>
+          <w:numId w:val="18"/>
+        </w:numPr>
+        <w:spacing w:lineRule="auto"/>
+      </w:pPr>
+      <w:r>
+        <w:rPr/>
+        <w:t xml:space="preserve">Modification, changement de rôle directement dans le tableau, désactivation/réactivation, suppression définitive.</w:t>
+      </w:r>
+    </w:p>
+    <w:p>
+      <w:pPr>
+        <w:numPr>
+          <w:ilvl w:val="0"/>
+          <w:numId w:val="18"/>
+        </w:numPr>
+        <w:spacing w:lineRule="auto"/>
+      </w:pPr>
+      <w:r>
+        <w:rPr/>
+        <w:t xml:space="preserve">Impossible de désactiver ou de supprimer le tout dernier compte administrateur du système.</w:t>
+      </w:r>
+    </w:p>
+    <w:p>
+      <w:pPr>
+        <w:numPr>
+          <w:ilvl w:val="0"/>
+          <w:numId w:val="18"/>
+        </w:numPr>
+        <w:spacing w:lineRule="auto"/>
+      </w:pPr>
+      <w:r>
+        <w:rPr/>
+        <w:t xml:space="preserve">Impossible de désactiver ou de supprimer son propre compte.</w:t>
+      </w:r>
+    </w:p>
+    <w:p>
+      <w:pPr>
+        <w:numPr>
+          <w:ilvl w:val="0"/>
+          <w:numId w:val="18"/>
+        </w:numPr>
+        <w:spacing w:lineRule="auto"/>
+      </w:pPr>
       <w:r>
         <w:rPr>
           <w:b/>
         </w:rPr>
-        <w:t xml:space="preserve">crédits</w:t>
-      </w:r>
-      <w:r>
-        <w:rPr/>
-        <w:t xml:space="preserve"> (montant débité à chaque repas, avec un tarif réglable) — les deux modes peuvent coexister, chaque élève utilisant l'un ou l'autre.</w:t>
+        <w:t xml:space="preserve">Recherche</w:t>
+      </w:r>
+      <w:r>
+        <w:rPr/>
+        <w:t xml:space="preserve"> par email, nom, prénom ou téléphone ; filtres par rôle, par statut (actif ou inactif) et par période de création — tous combinables.</w:t>
+      </w:r>
+    </w:p>
+    <w:p>
+      <w:pPr>
+        <w:pStyle w:val="Heading2"/>
+        <w:spacing w:lineRule="auto"/>
+      </w:pPr>
+      <w:r>
+        <w:rPr/>
+        <w:t xml:space="preserve">14. Parents (rattacher des enfants — administrateur uniquement)</w:t>
       </w:r>
     </w:p>
     <w:p>
       <w:pPr>
         <w:numPr>
           <w:ilvl w:val="0"/>
-          <w:numId w:val="22"/>
-        </w:numPr>
-        <w:spacing w:lineRule="auto"/>
-      </w:pPr>
-      <w:r>
-        <w:rPr/>
-        <w:t xml:space="preserve">Délai de grâce par défaut (7 jours), qui peut être ajusté établissement par établissement (§6).</w:t>
+          <w:numId w:val="19"/>
+        </w:numPr>
+        <w:spacing w:lineRule="auto"/>
+      </w:pPr>
+      <w:r>
+        <w:rPr/>
+        <w:t xml:space="preserve">Permet de rattacher un compte parent à un ou plusieurs élèves.</w:t>
       </w:r>
     </w:p>
     <w:p>
       <w:pPr>
         <w:numPr>
           <w:ilvl w:val="0"/>
-          <w:numId w:val="22"/>
-        </w:numPr>
-        <w:spacing w:lineRule="auto"/>
-      </w:pPr>
-      <w:r>
-        <w:rPr/>
-        <w:t xml:space="preserve">Service de paiement actif.</w:t>
-      </w:r>
-    </w:p>
-    <w:p>
-      <w:pPr>
-        <w:numPr>
-          <w:ilvl w:val="0"/>
-          <w:numId w:val="22"/>
-        </w:numPr>
-        <w:spacing w:lineRule="auto"/>
-      </w:pPr>
-      <w:r>
-        <w:rPr/>
-        <w:t xml:space="preserve">Image de fond personnalisée pour l'écran de connexion.</w:t>
-      </w:r>
-    </w:p>
-    <w:p>
-      <w:pPr>
-        <w:pStyle w:val="Heading3"/>
-        <w:spacing w:lineRule="auto"/>
-      </w:pPr>
-      <w:r>
-        <w:rPr/>
-        <w:t xml:space="preserve">Personnalisation par établissement (image, nom, coordonnées)</w:t>
-      </w:r>
-    </w:p>
-    <w:p>
-      <w:pPr>
-        <w:spacing w:lineRule="auto"/>
-      </w:pPr>
-      <w:r>
-        <w:rPr/>
-        <w:t xml:space="preserve">Une section « Organisation » permet d'adapter l'application à l'identité du client :</w:t>
-      </w:r>
-    </w:p>
-    <w:p>
-      <w:pPr>
-        <w:numPr>
-          <w:ilvl w:val="0"/>
-          <w:numId w:val="23"/>
+          <w:numId w:val="19"/>
         </w:numPr>
         <w:spacing w:lineRule="auto"/>
       </w:pPr>
@@ -5144,18 +4799,18 @@
         <w:rPr>
           <w:b/>
         </w:rPr>
-        <w:t xml:space="preserve">Logo</w:t>
-      </w:r>
-      <w:r>
-        <w:rPr/>
-        <w:t xml:space="preserve"> : à téléverser directement depuis cet écran — il remplace l'icône par défaut en haut de chaque page de l'application.</w:t>
+        <w:t xml:space="preserve">Choix du compte parent</w:t>
+      </w:r>
+      <w:r>
+        <w:rPr/>
+        <w:t xml:space="preserve"> : recherche par numéro de téléphone, nom ou prénom (le compte doit déjà exister — le créer d'abord dans « Comptes utilisateurs », ou passer par une demande d'accès validée, §15).</w:t>
       </w:r>
     </w:p>
     <w:p>
       <w:pPr>
         <w:numPr>
           <w:ilvl w:val="0"/>
-          <w:numId w:val="23"/>
+          <w:numId w:val="19"/>
         </w:numPr>
         <w:spacing w:lineRule="auto"/>
       </w:pPr>
@@ -5163,18 +4818,31 @@
         <w:rPr>
           <w:b/>
         </w:rPr>
-        <w:t xml:space="preserve">Nom du client</w:t>
-      </w:r>
-      <w:r>
-        <w:rPr/>
-        <w:t xml:space="preserve"> : remplace « Cantine Connect » dans l'en-tête de l'application.</w:t>
+        <w:t xml:space="preserve">Choix des enfants</w:t>
+      </w:r>
+      <w:r>
+        <w:rPr/>
+        <w:t xml:space="preserve"> : recherche par matricule, nom ou prénom, plusieurs enfants peuvent être sélectionnés à la fois.</w:t>
       </w:r>
     </w:p>
     <w:p>
       <w:pPr>
         <w:numPr>
           <w:ilvl w:val="0"/>
-          <w:numId w:val="23"/>
+          <w:numId w:val="19"/>
+        </w:numPr>
+        <w:spacing w:lineRule="auto"/>
+      </w:pPr>
+      <w:r>
+        <w:rPr/>
+        <w:t xml:space="preserve">Modification des enfants rattachés, suppression du lien (les fiches des élèves ne sont pas supprimées pour autant).</w:t>
+      </w:r>
+    </w:p>
+    <w:p>
+      <w:pPr>
+        <w:numPr>
+          <w:ilvl w:val="0"/>
+          <w:numId w:val="19"/>
         </w:numPr>
         <w:spacing w:lineRule="auto"/>
       </w:pPr>
@@ -5182,38 +4850,57 @@
         <w:rPr>
           <w:b/>
         </w:rPr>
-        <w:t xml:space="preserve">Adresse / lieu</w:t>
-      </w:r>
-      <w:r>
-        <w:rPr/>
-        <w:t xml:space="preserve">, </w:t>
+        <w:t xml:space="preserve">Recherche</w:t>
+      </w:r>
+      <w:r>
+        <w:rPr/>
+        <w:t xml:space="preserve"> sur la liste principale par </w:t>
       </w:r>
       <w:r>
         <w:rPr>
           <w:b/>
         </w:rPr>
-        <w:t xml:space="preserve">téléphone</w:t>
-      </w:r>
-      <w:r>
-        <w:rPr/>
-        <w:t xml:space="preserve">, </w:t>
+        <w:t xml:space="preserve">email ou numéro de téléphone</w:t>
+      </w:r>
+      <w:r>
+        <w:rPr/>
+        <w:t xml:space="preserve"> du compte parent.</w:t>
+      </w:r>
+    </w:p>
+    <w:p>
+      <w:pPr>
+        <w:pStyle w:val="Heading2"/>
+        <w:spacing w:lineRule="auto"/>
+      </w:pPr>
+      <w:r>
+        <w:rPr/>
+        <w:t xml:space="preserve">15. Demandes d'accès (validation par l'administrateur)</w:t>
+      </w:r>
+    </w:p>
+    <w:p>
+      <w:pPr>
+        <w:spacing w:lineRule="auto"/>
+      </w:pPr>
+      <w:r>
+        <w:rPr/>
+        <w:t xml:space="preserve">Sur l'écran « Demandes d'accès » (réservé à l'administrateur), on retrouve la liste des demandes soumises depuis la page publique (§3), que l'on peut filtrer par statut (En attente / Validées / Rejetées). Chaque ligne a un bouton « Voir détails » qui ouvre une fiche complète du demandeur (identité, tous les numéros de téléphone, email, résidence, historique du traitement) — pour une demande en attente, c'est depuis cette fiche que l'on </w:t>
       </w:r>
       <w:r>
         <w:rPr>
           <w:b/>
         </w:rPr>
-        <w:t xml:space="preserve">email</w:t>
-      </w:r>
-      <w:r>
-        <w:rPr/>
-        <w:t xml:space="preserve"> : coordonnées de contact affichées comme référence.</w:t>
+        <w:t xml:space="preserve">valide ou rejette</w:t>
+      </w:r>
+      <w:r>
+        <w:rPr/>
+        <w:t xml:space="preserve">, afin de toujours vérifier les informations avant de créer un compte.</w:t>
       </w:r>
     </w:p>
     <w:p>
       <w:pPr>
         <w:numPr>
           <w:ilvl w:val="0"/>
-          <w:numId w:val="23"/>
+          <w:numId w:val="20"/>
         </w:numPr>
         <w:spacing w:lineRule="auto"/>
       </w:pPr>
@@ -5221,75 +4908,51 @@
         <w:rPr>
           <w:b/>
         </w:rPr>
-        <w:t xml:space="preserve">Numéro Mobile Money</w:t>
-      </w:r>
-      <w:r>
-        <w:rPr/>
-        <w:t xml:space="preserve"> : numéro communiqué aux parents pour un envoi manuel d'argent — c'est une information affichée aux parents, elle ne change rien au fonctionnement des paiements en ligne (§9).</w:t>
-      </w:r>
-    </w:p>
-    <w:p>
-      <w:pPr>
-        <w:spacing w:lineRule="auto"/>
-      </w:pPr>
-      <w:r>
-        <w:rPr/>
-        <w:t xml:space="preserve">Tant qu'aucune de ces informations n'est renseignée, l'application garde son apparence par défaut (icône par défaut et nom « Cantine Connect »).</w:t>
-      </w:r>
-    </w:p>
-    <w:p>
-      <w:pPr>
-        <w:pStyle w:val="Heading2"/>
-        <w:spacing w:lineRule="auto"/>
-      </w:pPr>
-      <w:r>
-        <w:rPr/>
-        <w:t xml:space="preserve">17. Paiement et notifications — état de la mise en service</w:t>
-      </w:r>
-    </w:p>
-    <w:p>
-      <w:pPr>
-        <w:numPr>
-          <w:ilvl w:val="0"/>
-          <w:numId w:val="24"/>
-        </w:numPr>
-        <w:spacing w:lineRule="auto"/>
-      </w:pPr>
+        <w:t xml:space="preserve">Valider</w:t>
+      </w:r>
+      <w:r>
+        <w:rPr/>
+        <w:t xml:space="preserve"> : crée le compte du parent, avec un identifiant de connexion et un mot de passe provisoire générés automatiquement. Si les notifications par email et SMS sont activées (voir §16 Paramètres), le parent les reçoit automatiquement ; </w:t>
+      </w:r>
       <w:r>
         <w:rPr>
           <w:b/>
         </w:rPr>
-        <w:t xml:space="preserve">Paiement</w:t>
-      </w:r>
-      <w:r>
-        <w:rPr/>
-        <w:t xml:space="preserve"> : la connexion avec le service de paiement Mobile Money est réelle, pas une simulation — dès que le client fournit ses identifiants marchands réels, le paiement fonctionne sans développement supplémentaire. Sans ces identifiants, une tentative de paiement échoue avec un message clair plutôt qu'un lien qui ne fonctionne pas.</w:t>
-      </w:r>
-    </w:p>
-    <w:p>
-      <w:pPr>
-        <w:numPr>
-          <w:ilvl w:val="0"/>
-          <w:numId w:val="24"/>
-        </w:numPr>
-        <w:spacing w:lineRule="auto"/>
-      </w:pPr>
+        <w:t xml:space="preserve">dans tous les cas</w:t>
+      </w:r>
+      <w:r>
+        <w:rPr/>
+        <w:t xml:space="preserve">, une fenêtre affiche l'identifiant et le mot de passe à l'écran, pour pouvoir les communiquer manuellement si besoin.</w:t>
+      </w:r>
+    </w:p>
+    <w:p>
+      <w:pPr>
+        <w:numPr>
+          <w:ilvl w:val="1"/>
+          <w:numId w:val="21"/>
+        </w:numPr>
+        <w:spacing w:lineRule="auto"/>
+      </w:pPr>
+      <w:r>
+        <w:rPr/>
+        <w:t xml:space="preserve">Si le parent n'a donné </w:t>
+      </w:r>
       <w:r>
         <w:rPr>
           <w:b/>
         </w:rPr>
-        <w:t xml:space="preserve">SMS</w:t>
-      </w:r>
-      <w:r>
-        <w:rPr/>
-        <w:t xml:space="preserve"> : la connexion avec le fournisseur de SMS est réelle. Tant qu'aucun compte n'est configuré, les SMS sont simplement enregistrés dans les journaux techniques (aucun envoi réel, et cela ne bloque rien pour l'utilisateur).</w:t>
+        <w:t xml:space="preserve">aucun email</w:t>
+      </w:r>
+      <w:r>
+        <w:rPr/>
+        <w:t xml:space="preserve">, un identifiant de connexion est créé automatiquement à partir de son numéro de téléphone — ce n'est pas une adresse email utilisable, seulement un identifiant de connexion.</w:t>
       </w:r>
     </w:p>
     <w:p>
       <w:pPr>
         <w:numPr>
           <w:ilvl w:val="0"/>
-          <w:numId w:val="24"/>
+          <w:numId w:val="20"/>
         </w:numPr>
         <w:spacing w:lineRule="auto"/>
       </w:pPr>
@@ -5297,11 +4960,40 @@
         <w:rPr>
           <w:b/>
         </w:rPr>
-        <w:t xml:space="preserve">Email</w:t>
-      </w:r>
-      <w:r>
-        <w:rPr/>
-        <w:t xml:space="preserve"> : fonctionne dès que les paramètres techniques d'envoi (compte email dédié) sont renseignés.</w:t>
+        <w:t xml:space="preserve">Rejeter</w:t>
+      </w:r>
+      <w:r>
+        <w:rPr/>
+        <w:t xml:space="preserve"> : un motif est obligatoire ; la demande reste visible avec son statut et le motif, pour garder une trace.</w:t>
+      </w:r>
+    </w:p>
+    <w:p>
+      <w:pPr>
+        <w:pStyle w:val="Heading3"/>
+        <w:spacing w:lineRule="auto"/>
+      </w:pPr>
+      <w:r>
+        <w:rPr/>
+        <w:t xml:space="preserve">Première connexion du parent</w:t>
+      </w:r>
+    </w:p>
+    <w:p>
+      <w:pPr>
+        <w:spacing w:lineRule="auto"/>
+      </w:pPr>
+      <w:r>
+        <w:rPr/>
+        <w:t xml:space="preserve">Un parent dont le compte vient d'être créé </w:t>
+      </w:r>
+      <w:r>
+        <w:rPr>
+          <w:b/>
+        </w:rPr>
+        <w:t xml:space="preserve">doit changer son mot de passe provisoire</w:t>
+      </w:r>
+      <w:r>
+        <w:rPr/>
+        <w:t xml:space="preserve"> dès sa première connexion — l'application l'amène automatiquement sur cet écran et ne laisse pas accéder au reste du site tant que ce n'est pas fait.</w:t>
       </w:r>
     </w:p>
     <w:p>
@@ -5311,7 +5003,7 @@
       </w:pPr>
       <w:r>
         <w:rPr/>
-        <w:t xml:space="preserve">18. Support et à propos</w:t>
+        <w:t xml:space="preserve">16. Paramètres (administrateur uniquement)</w:t>
       </w:r>
     </w:p>
     <w:p>
@@ -5324,12 +5016,12 @@
           <wp:inline distB="0" distL="0" distR="0" distT="0">
             <wp:extent cx="5715000" cy="3571875"/>
             <wp:effectExtent b="0" l="0" r="0" t="0"/>
-            <wp:docPr id="26" name="image-MbJdcxR4Uv0EQMmjQUatF.png"/>
+            <wp:docPr id="26" name="image-JE8mnaUs55-ucbEPtfoMT.png"/>
             <a:graphic>
               <a:graphicData uri="http://schemas.openxmlformats.org/drawingml/2006/picture">
                 <pic:pic>
                   <pic:nvPicPr>
-                    <pic:cNvPr id="26" name="image-MbJdcxR4Uv0EQMmjQUatF.png" descr="Fenêtre « À propos »"/>
+                    <pic:cNvPr id="26" name="image-JE8mnaUs55-ucbEPtfoMT.png" descr="Écran des paramètres"/>
                     <pic:cNvPicPr/>
                   </pic:nvPicPr>
                   <pic:blipFill>
@@ -5359,6 +5051,353 @@
       </w:pPr>
       <w:r>
         <w:rPr/>
+        <w:t xml:space="preserve">Les réglages sont regroupés par thème dans des blocs dépliables (Contrôle d'accès cantine, Notifications, Paiements, Apparence, Organisation) — cliquer sur l'intitulé d'un bloc l'ouvre ou le referme.</w:t>
+      </w:r>
+    </w:p>
+    <w:p>
+      <w:pPr>
+        <w:numPr>
+          <w:ilvl w:val="0"/>
+          <w:numId w:val="22"/>
+        </w:numPr>
+        <w:spacing w:lineRule="auto"/>
+      </w:pPr>
+      <w:r>
+        <w:rPr/>
+        <w:t xml:space="preserve">Activer ou désactiver les notifications par email et par SMS.</w:t>
+      </w:r>
+    </w:p>
+    <w:p>
+      <w:pPr>
+        <w:numPr>
+          <w:ilvl w:val="0"/>
+          <w:numId w:val="22"/>
+        </w:numPr>
+        <w:spacing w:lineRule="auto"/>
+      </w:pPr>
+      <w:r>
+        <w:rPr/>
+        <w:t xml:space="preserve">Activer ou désactiver la mise à jour automatique des informations hors-ligne du contrôle d'accès (§10) — activée par défaut.</w:t>
+      </w:r>
+    </w:p>
+    <w:p>
+      <w:pPr>
+        <w:numPr>
+          <w:ilvl w:val="0"/>
+          <w:numId w:val="22"/>
+        </w:numPr>
+        <w:spacing w:lineRule="auto"/>
+      </w:pPr>
+      <w:r>
+        <w:rPr/>
+        <w:t xml:space="preserve">Mode de paiement : par </w:t>
+      </w:r>
+      <w:r>
+        <w:rPr>
+          <w:b/>
+        </w:rPr>
+        <w:t xml:space="preserve">abonnement</w:t>
+      </w:r>
+      <w:r>
+        <w:rPr/>
+        <w:t xml:space="preserve"> (accès pour tout le trimestre ou l'année) ou par </w:t>
+      </w:r>
+      <w:r>
+        <w:rPr>
+          <w:b/>
+        </w:rPr>
+        <w:t xml:space="preserve">crédits</w:t>
+      </w:r>
+      <w:r>
+        <w:rPr/>
+        <w:t xml:space="preserve"> (montant débité à chaque repas, avec un tarif réglable) — les deux modes peuvent coexister, chaque élève utilisant l'un ou l'autre.</w:t>
+      </w:r>
+    </w:p>
+    <w:p>
+      <w:pPr>
+        <w:numPr>
+          <w:ilvl w:val="0"/>
+          <w:numId w:val="22"/>
+        </w:numPr>
+        <w:spacing w:lineRule="auto"/>
+      </w:pPr>
+      <w:r>
+        <w:rPr/>
+        <w:t xml:space="preserve">Délai de grâce par défaut (7 jours), qui peut être ajusté établissement par établissement (§6).</w:t>
+      </w:r>
+    </w:p>
+    <w:p>
+      <w:pPr>
+        <w:numPr>
+          <w:ilvl w:val="0"/>
+          <w:numId w:val="22"/>
+        </w:numPr>
+        <w:spacing w:lineRule="auto"/>
+      </w:pPr>
+      <w:r>
+        <w:rPr/>
+        <w:t xml:space="preserve">Service de paiement actif.</w:t>
+      </w:r>
+    </w:p>
+    <w:p>
+      <w:pPr>
+        <w:numPr>
+          <w:ilvl w:val="0"/>
+          <w:numId w:val="22"/>
+        </w:numPr>
+        <w:spacing w:lineRule="auto"/>
+      </w:pPr>
+      <w:r>
+        <w:rPr/>
+        <w:t xml:space="preserve">Image de fond personnalisée pour l'écran de connexion.</w:t>
+      </w:r>
+    </w:p>
+    <w:p>
+      <w:pPr>
+        <w:pStyle w:val="Heading3"/>
+        <w:spacing w:lineRule="auto"/>
+      </w:pPr>
+      <w:r>
+        <w:rPr/>
+        <w:t xml:space="preserve">Personnalisation par établissement (image, nom, coordonnées)</w:t>
+      </w:r>
+    </w:p>
+    <w:p>
+      <w:pPr>
+        <w:spacing w:lineRule="auto"/>
+      </w:pPr>
+      <w:r>
+        <w:rPr/>
+        <w:t xml:space="preserve">Une section « Organisation » permet d'adapter l'application à l'identité du client :</w:t>
+      </w:r>
+    </w:p>
+    <w:p>
+      <w:pPr>
+        <w:numPr>
+          <w:ilvl w:val="0"/>
+          <w:numId w:val="23"/>
+        </w:numPr>
+        <w:spacing w:lineRule="auto"/>
+      </w:pPr>
+      <w:r>
+        <w:rPr>
+          <w:b/>
+        </w:rPr>
+        <w:t xml:space="preserve">Logo</w:t>
+      </w:r>
+      <w:r>
+        <w:rPr/>
+        <w:t xml:space="preserve"> : à téléverser directement depuis cet écran — il remplace l'icône par défaut en haut de chaque page de l'application.</w:t>
+      </w:r>
+    </w:p>
+    <w:p>
+      <w:pPr>
+        <w:numPr>
+          <w:ilvl w:val="0"/>
+          <w:numId w:val="23"/>
+        </w:numPr>
+        <w:spacing w:lineRule="auto"/>
+      </w:pPr>
+      <w:r>
+        <w:rPr>
+          <w:b/>
+        </w:rPr>
+        <w:t xml:space="preserve">Nom du client</w:t>
+      </w:r>
+      <w:r>
+        <w:rPr/>
+        <w:t xml:space="preserve"> : remplace « Cantine Connect » dans l'en-tête de l'application.</w:t>
+      </w:r>
+    </w:p>
+    <w:p>
+      <w:pPr>
+        <w:numPr>
+          <w:ilvl w:val="0"/>
+          <w:numId w:val="23"/>
+        </w:numPr>
+        <w:spacing w:lineRule="auto"/>
+      </w:pPr>
+      <w:r>
+        <w:rPr>
+          <w:b/>
+        </w:rPr>
+        <w:t xml:space="preserve">Adresse / lieu</w:t>
+      </w:r>
+      <w:r>
+        <w:rPr/>
+        <w:t xml:space="preserve">, </w:t>
+      </w:r>
+      <w:r>
+        <w:rPr>
+          <w:b/>
+        </w:rPr>
+        <w:t xml:space="preserve">téléphone</w:t>
+      </w:r>
+      <w:r>
+        <w:rPr/>
+        <w:t xml:space="preserve">, </w:t>
+      </w:r>
+      <w:r>
+        <w:rPr>
+          <w:b/>
+        </w:rPr>
+        <w:t xml:space="preserve">email</w:t>
+      </w:r>
+      <w:r>
+        <w:rPr/>
+        <w:t xml:space="preserve"> : coordonnées de contact affichées comme référence.</w:t>
+      </w:r>
+    </w:p>
+    <w:p>
+      <w:pPr>
+        <w:numPr>
+          <w:ilvl w:val="0"/>
+          <w:numId w:val="23"/>
+        </w:numPr>
+        <w:spacing w:lineRule="auto"/>
+      </w:pPr>
+      <w:r>
+        <w:rPr>
+          <w:b/>
+        </w:rPr>
+        <w:t xml:space="preserve">Numéro Mobile Money</w:t>
+      </w:r>
+      <w:r>
+        <w:rPr/>
+        <w:t xml:space="preserve"> : numéro communiqué aux parents pour un envoi manuel d'argent — c'est une information affichée aux parents, elle ne change rien au fonctionnement des paiements en ligne (§9).</w:t>
+      </w:r>
+    </w:p>
+    <w:p>
+      <w:pPr>
+        <w:spacing w:lineRule="auto"/>
+      </w:pPr>
+      <w:r>
+        <w:rPr/>
+        <w:t xml:space="preserve">Tant qu'aucune de ces informations n'est renseignée, l'application garde son apparence par défaut (icône par défaut et nom « Cantine Connect »).</w:t>
+      </w:r>
+    </w:p>
+    <w:p>
+      <w:pPr>
+        <w:pStyle w:val="Heading2"/>
+        <w:spacing w:lineRule="auto"/>
+      </w:pPr>
+      <w:r>
+        <w:rPr/>
+        <w:t xml:space="preserve">17. Paiement et notifications — état de la mise en service</w:t>
+      </w:r>
+    </w:p>
+    <w:p>
+      <w:pPr>
+        <w:numPr>
+          <w:ilvl w:val="0"/>
+          <w:numId w:val="24"/>
+        </w:numPr>
+        <w:spacing w:lineRule="auto"/>
+      </w:pPr>
+      <w:r>
+        <w:rPr>
+          <w:b/>
+        </w:rPr>
+        <w:t xml:space="preserve">Paiement</w:t>
+      </w:r>
+      <w:r>
+        <w:rPr/>
+        <w:t xml:space="preserve"> : la connexion avec le service de paiement Mobile Money est réelle, pas une simulation — dès que le client fournit ses identifiants marchands réels, le paiement fonctionne sans développement supplémentaire. Sans ces identifiants, une tentative de paiement échoue avec un message clair plutôt qu'un lien qui ne fonctionne pas.</w:t>
+      </w:r>
+    </w:p>
+    <w:p>
+      <w:pPr>
+        <w:numPr>
+          <w:ilvl w:val="0"/>
+          <w:numId w:val="24"/>
+        </w:numPr>
+        <w:spacing w:lineRule="auto"/>
+      </w:pPr>
+      <w:r>
+        <w:rPr>
+          <w:b/>
+        </w:rPr>
+        <w:t xml:space="preserve">SMS</w:t>
+      </w:r>
+      <w:r>
+        <w:rPr/>
+        <w:t xml:space="preserve"> : la connexion avec le fournisseur de SMS est réelle. Tant qu'aucun compte n'est configuré, les SMS sont simplement enregistrés dans les journaux techniques (aucun envoi réel, et cela ne bloque rien pour l'utilisateur).</w:t>
+      </w:r>
+    </w:p>
+    <w:p>
+      <w:pPr>
+        <w:numPr>
+          <w:ilvl w:val="0"/>
+          <w:numId w:val="24"/>
+        </w:numPr>
+        <w:spacing w:lineRule="auto"/>
+      </w:pPr>
+      <w:r>
+        <w:rPr>
+          <w:b/>
+        </w:rPr>
+        <w:t xml:space="preserve">Email</w:t>
+      </w:r>
+      <w:r>
+        <w:rPr/>
+        <w:t xml:space="preserve"> : fonctionne dès que les paramètres techniques d'envoi (compte email dédié) sont renseignés.</w:t>
+      </w:r>
+    </w:p>
+    <w:p>
+      <w:pPr>
+        <w:pStyle w:val="Heading2"/>
+        <w:spacing w:lineRule="auto"/>
+      </w:pPr>
+      <w:r>
+        <w:rPr/>
+        <w:t xml:space="preserve">18. Support et à propos</w:t>
+      </w:r>
+    </w:p>
+    <w:p>
+      <w:pPr>
+        <w:spacing w:lineRule="auto"/>
+      </w:pPr>
+      <w:r>
+        <w:rPr/>
+        <w:drawing>
+          <wp:inline distB="0" distL="0" distR="0" distT="0">
+            <wp:extent cx="5715000" cy="3571875"/>
+            <wp:effectExtent b="0" l="0" r="0" t="0"/>
+            <wp:docPr id="27" name="image-4IcBG0Pw1jR1JBjNI7mty.png"/>
+            <a:graphic>
+              <a:graphicData uri="http://schemas.openxmlformats.org/drawingml/2006/picture">
+                <pic:pic>
+                  <pic:nvPicPr>
+                    <pic:cNvPr id="27" name="image-4IcBG0Pw1jR1JBjNI7mty.png" descr="Fenêtre « À propos »"/>
+                    <pic:cNvPicPr/>
+                  </pic:nvPicPr>
+                  <pic:blipFill>
+                    <a:blip r:embed="rId32" cstate="print"/>
+                    <a:srcRect b="0" l="0" r="0" t="0"/>
+                    <a:stretch>
+                      <a:fillRect/>
+                    </a:stretch>
+                  </pic:blipFill>
+                  <pic:spPr>
+                    <a:xfrm>
+                      <a:off x="0" y="0"/>
+                      <a:ext cx="5715000" cy="3571875"/>
+                    </a:xfrm>
+                    <a:prstGeom prst="rect"/>
+                  </pic:spPr>
+                </pic:pic>
+              </a:graphicData>
+            </a:graphic>
+          </wp:inline>
+        </w:drawing>
+      </w:r>
+    </w:p>
+    <w:p>
+      <w:pPr>
+        <w:spacing w:lineRule="auto"/>
+      </w:pPr>
+      <w:r>
+        <w:rPr/>
         <w:t xml:space="preserve">Une fenêtre « À propos », accessible depuis le menu de l'application, rappelle les coordonnées de contact de l'éditeur :</w:t>
       </w:r>
     </w:p>
@@ -5376,7 +5415,7 @@
         <w:rPr/>
         <w:t xml:space="preserve"> — Téléphone : +225 07 58 89 24 77 · Email : </w:t>
       </w:r>
-      <w:hyperlink r:id="rId32">
+      <w:hyperlink r:id="rId33">
         <w:r>
           <w:rPr>
             <w:rStyle w:val="Hyperlink"/>

</xml_diff>